<commit_message>
Add FileStream, Date and Time classes; test, manual and README updates
Co-Authored-By: Claude Sonnet 5.5 <noreply@anthropic.com>
Claude-Session: https://claude.ai/code/session_013PfZHD8os4FWhvmVG9Tf7M
</commit_message>
<xml_diff>
--- a/docs/Smalltalk-CREXX-Guide.docx
+++ b/docs/Smalltalk-CREXX-Guide.docx
@@ -1173,18 +1173,18 @@
         <w:tabs>
           <w:tab w:val="right" w:pos="9638" w:leader="dot"/>
         </w:tabs>
-        <w:spacing w:after="20" w:before="100"/>
-        <w:ind w:left="0"/>
-      </w:pPr>
-      <w:r>
-        <w:rPr>
-          <w:rFonts w:ascii="Arial" w:cs="Arial" w:eastAsia="Arial" w:hAnsi="Arial"/>
-          <w:b/>
-          <w:bCs/>
-          <w:sz w:val="19"/>
-          <w:szCs w:val="19"/>
-        </w:rPr>
-        <w:t xml:space="preserve">Chapter 9. Exceptions	20</w:t>
+        <w:spacing w:after="0" w:before="0"/>
+        <w:ind w:left="360"/>
+      </w:pPr>
+      <w:r>
+        <w:rPr>
+          <w:rFonts w:ascii="Arial" w:cs="Arial" w:eastAsia="Arial" w:hAnsi="Arial"/>
+          <w:b w:val="false"/>
+          <w:bCs w:val="false"/>
+          <w:sz w:val="18"/>
+          <w:szCs w:val="18"/>
+        </w:rPr>
+        <w:t xml:space="preserve">Files	20</w:t>
       </w:r>
     </w:p>
     <w:p>
@@ -1203,7 +1203,26 @@
           <w:sz w:val="18"/>
           <w:szCs w:val="18"/>
         </w:rPr>
-        <w:t xml:space="preserve">Handling	20</w:t>
+        <w:t xml:space="preserve">Date and Time	20</w:t>
+      </w:r>
+    </w:p>
+    <w:p>
+      <w:pPr>
+        <w:tabs>
+          <w:tab w:val="right" w:pos="9638" w:leader="dot"/>
+        </w:tabs>
+        <w:spacing w:after="20" w:before="100"/>
+        <w:ind w:left="0"/>
+      </w:pPr>
+      <w:r>
+        <w:rPr>
+          <w:rFonts w:ascii="Arial" w:cs="Arial" w:eastAsia="Arial" w:hAnsi="Arial"/>
+          <w:b/>
+          <w:bCs/>
+          <w:sz w:val="19"/>
+          <w:szCs w:val="19"/>
+        </w:rPr>
+        <w:t xml:space="preserve">Chapter 9. Exceptions	21</w:t>
       </w:r>
     </w:p>
     <w:p>
@@ -1222,7 +1241,7 @@
           <w:sz w:val="18"/>
           <w:szCs w:val="18"/>
         </w:rPr>
-        <w:t xml:space="preserve">Messages understood by an exception	20</w:t>
+        <w:t xml:space="preserve">Handling	21</w:t>
       </w:r>
     </w:p>
     <w:p>
@@ -1241,7 +1260,7 @@
           <w:sz w:val="18"/>
           <w:szCs w:val="18"/>
         </w:rPr>
-        <w:t xml:space="preserve">Signaling	20</w:t>
+        <w:t xml:space="preserve">Messages understood by an exception	21</w:t>
       </w:r>
     </w:p>
     <w:p>
@@ -1260,7 +1279,7 @@
           <w:sz w:val="18"/>
           <w:szCs w:val="18"/>
         </w:rPr>
-        <w:t xml:space="preserve">Cleaning up	21</w:t>
+        <w:t xml:space="preserve">Signaling	21</w:t>
       </w:r>
     </w:p>
     <w:p>
@@ -1279,7 +1298,26 @@
           <w:sz w:val="18"/>
           <w:szCs w:val="18"/>
         </w:rPr>
-        <w:t xml:space="preserve">Your own exceptions	21</w:t>
+        <w:t xml:space="preserve">Cleaning up	22</w:t>
+      </w:r>
+    </w:p>
+    <w:p>
+      <w:pPr>
+        <w:tabs>
+          <w:tab w:val="right" w:pos="9638" w:leader="dot"/>
+        </w:tabs>
+        <w:spacing w:after="0" w:before="0"/>
+        <w:ind w:left="360"/>
+      </w:pPr>
+      <w:r>
+        <w:rPr>
+          <w:rFonts w:ascii="Arial" w:cs="Arial" w:eastAsia="Arial" w:hAnsi="Arial"/>
+          <w:b w:val="false"/>
+          <w:bCs w:val="false"/>
+          <w:sz w:val="18"/>
+          <w:szCs w:val="18"/>
+        </w:rPr>
+        <w:t xml:space="preserve">Your own exceptions	22</w:t>
       </w:r>
     </w:p>
     <w:p>
@@ -1298,7 +1336,7 @@
           <w:sz w:val="19"/>
           <w:szCs w:val="19"/>
         </w:rPr>
-        <w:t xml:space="preserve">Chapter 10. Reflection and the System	22</w:t>
+        <w:t xml:space="preserve">Chapter 10. Reflection and the System	23</w:t>
       </w:r>
     </w:p>
     <w:p>
@@ -1317,7 +1355,7 @@
           <w:sz w:val="18"/>
           <w:szCs w:val="18"/>
         </w:rPr>
-        <w:t xml:space="preserve">Asking about objects	22</w:t>
+        <w:t xml:space="preserve">Asking about objects	23</w:t>
       </w:r>
     </w:p>
     <w:p>
@@ -1336,7 +1374,7 @@
           <w:sz w:val="18"/>
           <w:szCs w:val="18"/>
         </w:rPr>
-        <w:t xml:space="preserve">Asking about classes	22</w:t>
+        <w:t xml:space="preserve">Asking about classes	23</w:t>
       </w:r>
     </w:p>
     <w:p>
@@ -1355,7 +1393,7 @@
           <w:sz w:val="18"/>
           <w:szCs w:val="18"/>
         </w:rPr>
-        <w:t xml:space="preserve">The Smalltalk dictionary	22</w:t>
+        <w:t xml:space="preserve">The Smalltalk dictionary	23</w:t>
       </w:r>
     </w:p>
     <w:p>
@@ -1374,7 +1412,7 @@
           <w:sz w:val="19"/>
           <w:szCs w:val="19"/>
         </w:rPr>
-        <w:t xml:space="preserve">Chapter 11. Errors and Traces	24</w:t>
+        <w:t xml:space="preserve">Chapter 11. Errors and Traces	25</w:t>
       </w:r>
     </w:p>
     <w:p>
@@ -1393,7 +1431,7 @@
           <w:sz w:val="18"/>
           <w:szCs w:val="18"/>
         </w:rPr>
-        <w:t xml:space="preserve">Unhandled errors	24</w:t>
+        <w:t xml:space="preserve">Unhandled errors	25</w:t>
       </w:r>
     </w:p>
     <w:p>
@@ -1412,7 +1450,7 @@
           <w:sz w:val="18"/>
           <w:szCs w:val="18"/>
         </w:rPr>
-        <w:t xml:space="preserve">Common messages	24</w:t>
+        <w:t xml:space="preserve">Common messages	25</w:t>
       </w:r>
     </w:p>
     <w:p>
@@ -1431,7 +1469,7 @@
           <w:sz w:val="18"/>
           <w:szCs w:val="18"/>
         </w:rPr>
-        <w:t xml:space="preserve">Parse errors	24</w:t>
+        <w:t xml:space="preserve">Parse errors	25</w:t>
       </w:r>
     </w:p>
     <w:p>
@@ -1450,7 +1488,7 @@
           <w:sz w:val="19"/>
           <w:szCs w:val="19"/>
         </w:rPr>
-        <w:t xml:space="preserve">Chapter 12. How Smalltalk/CREXX Works	25</w:t>
+        <w:t xml:space="preserve">Chapter 12. How Smalltalk/CREXX Works	26</w:t>
       </w:r>
     </w:p>
     <w:p>
@@ -1469,7 +1507,7 @@
           <w:sz w:val="18"/>
           <w:szCs w:val="18"/>
         </w:rPr>
-        <w:t xml:space="preserve">Objects	25</w:t>
+        <w:t xml:space="preserve">Objects	26</w:t>
       </w:r>
     </w:p>
     <w:p>
@@ -1488,7 +1526,7 @@
           <w:sz w:val="18"/>
           <w:szCs w:val="18"/>
         </w:rPr>
-        <w:t xml:space="preserve">Classes and methods	25</w:t>
+        <w:t xml:space="preserve">Classes and methods	26</w:t>
       </w:r>
     </w:p>
     <w:p>
@@ -1507,7 +1545,7 @@
           <w:sz w:val="18"/>
           <w:szCs w:val="18"/>
         </w:rPr>
-        <w:t xml:space="preserve">The resolver	25</w:t>
+        <w:t xml:space="preserve">The resolver	26</w:t>
       </w:r>
     </w:p>
     <w:p>
@@ -1526,7 +1564,7 @@
           <w:sz w:val="18"/>
           <w:szCs w:val="18"/>
         </w:rPr>
-        <w:t xml:space="preserve">The evaluator	25</w:t>
+        <w:t xml:space="preserve">The evaluator	26</w:t>
       </w:r>
     </w:p>
     <w:p>
@@ -1545,7 +1583,7 @@
           <w:sz w:val="18"/>
           <w:szCs w:val="18"/>
         </w:rPr>
-        <w:t xml:space="preserve">Primitives	25</w:t>
+        <w:t xml:space="preserve">Primitives	26</w:t>
       </w:r>
     </w:p>
     <w:p>
@@ -1564,7 +1602,7 @@
           <w:sz w:val="18"/>
           <w:szCs w:val="18"/>
         </w:rPr>
-        <w:t xml:space="preserve">Adding a primitive	25</w:t>
+        <w:t xml:space="preserve">Adding a primitive	26</w:t>
       </w:r>
     </w:p>
     <w:p>
@@ -1583,7 +1621,7 @@
           <w:sz w:val="18"/>
           <w:szCs w:val="18"/>
         </w:rPr>
-        <w:t xml:space="preserve">The build	26</w:t>
+        <w:t xml:space="preserve">The build	27</w:t>
       </w:r>
     </w:p>
     <w:p>
@@ -1602,7 +1640,7 @@
           <w:sz w:val="19"/>
           <w:szCs w:val="19"/>
         </w:rPr>
-        <w:t xml:space="preserve">Chapter 13. Restrictions and Known Problems	27</w:t>
+        <w:t xml:space="preserve">Chapter 13. Restrictions and Known Problems	28</w:t>
       </w:r>
     </w:p>
     <w:p>
@@ -1621,7 +1659,7 @@
           <w:sz w:val="19"/>
           <w:szCs w:val="19"/>
         </w:rPr>
-        <w:t xml:space="preserve">Appendix A. Command Summary	28</w:t>
+        <w:t xml:space="preserve">Appendix A. Command Summary	29</w:t>
       </w:r>
     </w:p>
     <w:p>
@@ -1640,7 +1678,7 @@
           <w:sz w:val="19"/>
           <w:szCs w:val="19"/>
         </w:rPr>
-        <w:t xml:space="preserve">Appendix B. Contents of the Repository	29</w:t>
+        <w:t xml:space="preserve">Appendix B. Contents of the Repository	30</w:t>
       </w:r>
     </w:p>
     <w:p>
@@ -1659,7 +1697,7 @@
           <w:sz w:val="19"/>
           <w:szCs w:val="19"/>
         </w:rPr>
-        <w:t xml:space="preserve">Appendix C. Class Hierarchy	30</w:t>
+        <w:t xml:space="preserve">Appendix C. Class Hierarchy	31</w:t>
       </w:r>
     </w:p>
     <w:p>
@@ -1678,7 +1716,7 @@
           <w:sz w:val="19"/>
           <w:szCs w:val="19"/>
         </w:rPr>
-        <w:t xml:space="preserve">Appendix D. Sample Programs	31</w:t>
+        <w:t xml:space="preserve">Appendix D. Sample Programs	32</w:t>
       </w:r>
     </w:p>
     <w:p>
@@ -3340,7 +3378,7 @@
                 <w:sz w:val="17"/>
                 <w:szCs w:val="17"/>
               </w:rPr>
-              <w:t xml:space="preserve">ReadStream, WriteStream, ReadWriteStream, Transcript</w:t>
+              <w:t xml:space="preserve">ReadStream, WriteStream, ReadWriteStream, FileStream, Transcript</w:t>
             </w:r>
           </w:p>
         </w:tc>
@@ -3373,6 +3411,108 @@
                 <w:szCs w:val="17"/>
               </w:rPr>
               <w:t xml:space="preserve">complete</w:t>
+            </w:r>
+          </w:p>
+        </w:tc>
+      </w:tr>
+      <w:tr>
+        <w:trPr>
+          <w:cantSplit/>
+          <w:tblHeader w:val="false"/>
+        </w:trPr>
+        <w:tc>
+          <w:tcPr>
+            <w:tcW w:type="dxa" w:w="1900"/>
+            <w:tcBorders>
+              <w:top w:val="single" w:color="808080" w:sz="4"/>
+              <w:left w:val="single" w:color="808080" w:sz="4"/>
+              <w:bottom w:val="single" w:color="808080" w:sz="4"/>
+              <w:right w:val="single" w:color="808080" w:sz="4"/>
+            </w:tcBorders>
+            <w:tcMar>
+              <w:top w:type="dxa" w:w="50"/>
+              <w:left w:type="dxa" w:w="90"/>
+              <w:bottom w:type="dxa" w:w="50"/>
+              <w:right w:type="dxa" w:w="90"/>
+            </w:tcMar>
+          </w:tcPr>
+          <w:p>
+            <w:pPr>
+              <w:spacing w:after="0"/>
+            </w:pPr>
+            <w:r>
+              <w:rPr>
+                <w:rFonts w:ascii="Arial" w:cs="Arial" w:eastAsia="Arial" w:hAnsi="Arial"/>
+                <w:b w:val="false"/>
+                <w:bCs w:val="false"/>
+                <w:sz w:val="17"/>
+                <w:szCs w:val="17"/>
+              </w:rPr>
+              <w:t xml:space="preserve">Date and Time</w:t>
+            </w:r>
+          </w:p>
+        </w:tc>
+        <w:tc>
+          <w:tcPr>
+            <w:tcW w:type="dxa" w:w="5500"/>
+            <w:tcBorders>
+              <w:top w:val="single" w:color="808080" w:sz="4"/>
+              <w:left w:val="single" w:color="808080" w:sz="4"/>
+              <w:bottom w:val="single" w:color="808080" w:sz="4"/>
+              <w:right w:val="single" w:color="808080" w:sz="4"/>
+            </w:tcBorders>
+            <w:tcMar>
+              <w:top w:type="dxa" w:w="50"/>
+              <w:left w:type="dxa" w:w="90"/>
+              <w:bottom w:type="dxa" w:w="50"/>
+              <w:right w:type="dxa" w:w="90"/>
+            </w:tcMar>
+          </w:tcPr>
+          <w:p>
+            <w:pPr>
+              <w:spacing w:after="0"/>
+            </w:pPr>
+            <w:r>
+              <w:rPr>
+                <w:rFonts w:ascii="Arial" w:cs="Arial" w:eastAsia="Arial" w:hAnsi="Arial"/>
+                <w:b w:val="false"/>
+                <w:bCs w:val="false"/>
+                <w:sz w:val="17"/>
+                <w:szCs w:val="17"/>
+              </w:rPr>
+              <w:t xml:space="preserve">Date, Time, Time millisecondClock</w:t>
+            </w:r>
+          </w:p>
+        </w:tc>
+        <w:tc>
+          <w:tcPr>
+            <w:tcW w:type="dxa" w:w="2238"/>
+            <w:tcBorders>
+              <w:top w:val="single" w:color="808080" w:sz="4"/>
+              <w:left w:val="single" w:color="808080" w:sz="4"/>
+              <w:bottom w:val="single" w:color="808080" w:sz="4"/>
+              <w:right w:val="single" w:color="808080" w:sz="4"/>
+            </w:tcBorders>
+            <w:tcMar>
+              <w:top w:type="dxa" w:w="50"/>
+              <w:left w:type="dxa" w:w="90"/>
+              <w:bottom w:type="dxa" w:w="50"/>
+              <w:right w:type="dxa" w:w="90"/>
+            </w:tcMar>
+          </w:tcPr>
+          <w:p>
+            <w:pPr>
+              <w:spacing w:after="0"/>
+            </w:pPr>
+            <w:r>
+              <w:rPr>
+                <w:rFonts w:ascii="Arial" w:cs="Arial" w:eastAsia="Arial" w:hAnsi="Arial"/>
+                <w:b w:val="false"/>
+                <w:bCs w:val="false"/>
+                <w:sz w:val="17"/>
+                <w:szCs w:val="17"/>
+              </w:rPr>
+              <w:t xml:space="preserve">basic</w:t>
             </w:r>
           </w:p>
         </w:tc>
@@ -19610,6 +19750,320 @@
     </w:p>
     <w:p>
       <w:pPr>
+        <w:pStyle w:val="Heading2"/>
+        <w:keepNext/>
+      </w:pPr>
+      <w:r>
+        <w:rPr>
+          <w:rFonts w:ascii="Arial" w:cs="Arial" w:eastAsia="Arial" w:hAnsi="Arial"/>
+          <w:b/>
+          <w:bCs/>
+          <w:sz w:val="24"/>
+          <w:szCs w:val="24"/>
+        </w:rPr>
+        <w:t xml:space="preserve">Files</w:t>
+      </w:r>
+    </w:p>
+    <w:p>
+      <w:pPr>
+        <w:spacing w:after="120" w:line="264"/>
+      </w:pPr>
+      <w:r>
+        <w:rPr>
+          <w:rFonts w:ascii="Arial" w:cs="Arial" w:eastAsia="Arial" w:hAnsi="Arial"/>
+          <w:sz w:val="20"/>
+          <w:szCs w:val="20"/>
+        </w:rPr>
+        <w:t xml:space="preserve">FileStream read: path, write: path and append: path open a file. A read stream holds the whole file; nextLine, next, atEnd, upTo: and upToEnd read it. A write stream collects what is written and sends it to the file on flush or close, so always close it. FileStream exists: path tests for a file and FileStream contentsOf: path answers its text, or nil. Opening a missing file for reading is an error of class NotFound.</w:t>
+      </w:r>
+    </w:p>
+    <w:p>
+      <w:pPr>
+        <w:keepNext/>
+        <w:keepLines/>
+        <w:pBdr>
+          <w:top w:val="single" w:color="808080" w:sz="4"/>
+          <w:left w:val="single" w:color="808080" w:sz="4"/>
+          <w:right w:val="single" w:color="808080" w:sz="4"/>
+        </w:pBdr>
+        <w:shd w:fill="F2F2F2" w:color="auto" w:val="clear"/>
+        <w:spacing w:after="0" w:line="240"/>
+        <w:ind w:left="100" w:right="100"/>
+      </w:pPr>
+      <w:r>
+        <w:rPr>
+          <w:rFonts w:ascii="Courier New" w:cs="Courier New" w:eastAsia="Courier New" w:hAnsi="Courier New"/>
+          <w:sz w:val="17"/>
+          <w:szCs w:val="17"/>
+        </w:rPr>
+        <w:t xml:space="preserve">| f |</w:t>
+      </w:r>
+    </w:p>
+    <w:p>
+      <w:pPr>
+        <w:keepNext/>
+        <w:keepLines/>
+        <w:pBdr>
+          <w:left w:val="single" w:color="808080" w:sz="4"/>
+          <w:right w:val="single" w:color="808080" w:sz="4"/>
+        </w:pBdr>
+        <w:shd w:fill="F2F2F2" w:color="auto" w:val="clear"/>
+        <w:spacing w:after="0" w:line="240"/>
+        <w:ind w:left="100" w:right="100"/>
+      </w:pPr>
+      <w:r>
+        <w:rPr>
+          <w:rFonts w:ascii="Courier New" w:cs="Courier New" w:eastAsia="Courier New" w:hAnsi="Courier New"/>
+          <w:sz w:val="17"/>
+          <w:szCs w:val="17"/>
+        </w:rPr>
+        <w:t xml:space="preserve">f := FileStream write: '/tmp/demo.txt'.</w:t>
+      </w:r>
+    </w:p>
+    <w:p>
+      <w:pPr>
+        <w:keepNext/>
+        <w:keepLines/>
+        <w:pBdr>
+          <w:left w:val="single" w:color="808080" w:sz="4"/>
+          <w:right w:val="single" w:color="808080" w:sz="4"/>
+        </w:pBdr>
+        <w:shd w:fill="F2F2F2" w:color="auto" w:val="clear"/>
+        <w:spacing w:after="0" w:line="240"/>
+        <w:ind w:left="100" w:right="100"/>
+      </w:pPr>
+      <w:r>
+        <w:rPr>
+          <w:rFonts w:ascii="Courier New" w:cs="Courier New" w:eastAsia="Courier New" w:hAnsi="Courier New"/>
+          <w:sz w:val="17"/>
+          <w:szCs w:val="17"/>
+        </w:rPr>
+        <w:t xml:space="preserve">f nextPutAll: 'line one'; nl; nextPutAll: 'line two'; nl.</w:t>
+      </w:r>
+    </w:p>
+    <w:p>
+      <w:pPr>
+        <w:keepNext/>
+        <w:keepLines/>
+        <w:pBdr>
+          <w:left w:val="single" w:color="808080" w:sz="4"/>
+          <w:right w:val="single" w:color="808080" w:sz="4"/>
+        </w:pBdr>
+        <w:shd w:fill="F2F2F2" w:color="auto" w:val="clear"/>
+        <w:spacing w:after="0" w:line="240"/>
+        <w:ind w:left="100" w:right="100"/>
+      </w:pPr>
+      <w:r>
+        <w:rPr>
+          <w:rFonts w:ascii="Courier New" w:cs="Courier New" w:eastAsia="Courier New" w:hAnsi="Courier New"/>
+          <w:sz w:val="17"/>
+          <w:szCs w:val="17"/>
+        </w:rPr>
+        <w:t xml:space="preserve">f close.</w:t>
+      </w:r>
+    </w:p>
+    <w:p>
+      <w:pPr>
+        <w:keepNext/>
+        <w:keepLines/>
+        <w:pBdr>
+          <w:left w:val="single" w:color="808080" w:sz="4"/>
+          <w:right w:val="single" w:color="808080" w:sz="4"/>
+        </w:pBdr>
+        <w:shd w:fill="F2F2F2" w:color="auto" w:val="clear"/>
+        <w:spacing w:after="0" w:line="240"/>
+        <w:ind w:left="100" w:right="100"/>
+      </w:pPr>
+      <w:r>
+        <w:rPr>
+          <w:rFonts w:ascii="Courier New" w:cs="Courier New" w:eastAsia="Courier New" w:hAnsi="Courier New"/>
+          <w:sz w:val="17"/>
+          <w:szCs w:val="17"/>
+        </w:rPr>
+        <w:t xml:space="preserve">f := FileStream read: '/tmp/demo.txt'.</w:t>
+      </w:r>
+    </w:p>
+    <w:p>
+      <w:pPr>
+        <w:keepNext/>
+        <w:keepLines/>
+        <w:pBdr>
+          <w:left w:val="single" w:color="808080" w:sz="4"/>
+          <w:right w:val="single" w:color="808080" w:sz="4"/>
+        </w:pBdr>
+        <w:shd w:fill="F2F2F2" w:color="auto" w:val="clear"/>
+        <w:spacing w:after="0" w:line="240"/>
+        <w:ind w:left="100" w:right="100"/>
+      </w:pPr>
+      <w:r>
+        <w:rPr>
+          <w:rFonts w:ascii="Courier New" w:cs="Courier New" w:eastAsia="Courier New" w:hAnsi="Courier New"/>
+          <w:sz w:val="17"/>
+          <w:szCs w:val="17"/>
+        </w:rPr>
+        <w:t xml:space="preserve">[f atEnd] whileFalse: [f nextLine displayNl].</w:t>
+      </w:r>
+    </w:p>
+    <w:p>
+      <w:pPr>
+        <w:keepNext/>
+        <w:keepLines/>
+        <w:pBdr>
+          <w:left w:val="single" w:color="808080" w:sz="4"/>
+          <w:right w:val="single" w:color="808080" w:sz="4"/>
+        </w:pBdr>
+        <w:shd w:fill="F2F2F2" w:color="auto" w:val="clear"/>
+        <w:spacing w:after="0" w:line="240"/>
+        <w:ind w:left="100" w:right="100"/>
+      </w:pPr>
+      <w:r>
+        <w:rPr>
+          <w:rFonts w:ascii="Courier New" w:cs="Courier New" w:eastAsia="Courier New" w:hAnsi="Courier New"/>
+          <w:sz w:val="17"/>
+          <w:szCs w:val="17"/>
+        </w:rPr>
+        <w:t xml:space="preserve">(FileStream exists: '/tmp/nope') printNl.</w:t>
+      </w:r>
+    </w:p>
+    <w:p>
+      <w:pPr>
+        <w:keepNext/>
+        <w:keepLines/>
+        <w:pBdr>
+          <w:left w:val="single" w:color="808080" w:sz="4"/>
+          <w:right w:val="single" w:color="808080" w:sz="4"/>
+        </w:pBdr>
+        <w:shd w:fill="F2F2F2" w:color="auto" w:val="clear"/>
+        <w:spacing w:after="0" w:line="240"/>
+        <w:ind w:left="100" w:right="100"/>
+      </w:pPr>
+      <w:r>
+        <w:rPr>
+          <w:rFonts w:ascii="Courier New" w:cs="Courier New" w:eastAsia="Courier New" w:hAnsi="Courier New"/>
+          <w:sz w:val="17"/>
+          <w:szCs w:val="17"/>
+        </w:rPr>
+        <w:t xml:space="preserve"> </w:t>
+      </w:r>
+    </w:p>
+    <w:p>
+      <w:pPr>
+        <w:keepNext/>
+        <w:keepLines/>
+        <w:pBdr>
+          <w:left w:val="single" w:color="808080" w:sz="4"/>
+          <w:right w:val="single" w:color="808080" w:sz="4"/>
+        </w:pBdr>
+        <w:shd w:fill="F2F2F2" w:color="auto" w:val="clear"/>
+        <w:spacing w:after="0" w:line="240"/>
+        <w:ind w:left="100" w:right="100"/>
+      </w:pPr>
+      <w:r>
+        <w:rPr>
+          <w:rFonts w:ascii="Courier New" w:cs="Courier New" w:eastAsia="Courier New" w:hAnsi="Courier New"/>
+          <w:sz w:val="17"/>
+          <w:szCs w:val="17"/>
+        </w:rPr>
+        <w:t xml:space="preserve">line one</w:t>
+      </w:r>
+    </w:p>
+    <w:p>
+      <w:pPr>
+        <w:keepNext/>
+        <w:keepLines/>
+        <w:pBdr>
+          <w:left w:val="single" w:color="808080" w:sz="4"/>
+          <w:right w:val="single" w:color="808080" w:sz="4"/>
+        </w:pBdr>
+        <w:shd w:fill="F2F2F2" w:color="auto" w:val="clear"/>
+        <w:spacing w:after="0" w:line="240"/>
+        <w:ind w:left="100" w:right="100"/>
+      </w:pPr>
+      <w:r>
+        <w:rPr>
+          <w:rFonts w:ascii="Courier New" w:cs="Courier New" w:eastAsia="Courier New" w:hAnsi="Courier New"/>
+          <w:sz w:val="17"/>
+          <w:szCs w:val="17"/>
+        </w:rPr>
+        <w:t xml:space="preserve">line two</w:t>
+      </w:r>
+    </w:p>
+    <w:p>
+      <w:pPr>
+        <w:keepNext w:val="false"/>
+        <w:keepLines/>
+        <w:pBdr>
+          <w:bottom w:val="single" w:color="808080" w:sz="4"/>
+          <w:left w:val="single" w:color="808080" w:sz="4"/>
+          <w:right w:val="single" w:color="808080" w:sz="4"/>
+        </w:pBdr>
+        <w:shd w:fill="F2F2F2" w:color="auto" w:val="clear"/>
+        <w:spacing w:after="0" w:line="240"/>
+        <w:ind w:left="100" w:right="100"/>
+      </w:pPr>
+      <w:r>
+        <w:rPr>
+          <w:rFonts w:ascii="Courier New" w:cs="Courier New" w:eastAsia="Courier New" w:hAnsi="Courier New"/>
+          <w:sz w:val="17"/>
+          <w:szCs w:val="17"/>
+        </w:rPr>
+        <w:t xml:space="preserve">false</w:t>
+      </w:r>
+    </w:p>
+    <w:p>
+      <w:pPr>
+        <w:spacing w:after="200" w:before="60"/>
+      </w:pPr>
+      <w:r>
+        <w:rPr>
+          <w:rFonts w:ascii="Arial" w:cs="Arial" w:eastAsia="Arial" w:hAnsi="Arial"/>
+          <w:b/>
+          <w:bCs/>
+          <w:sz w:val="18"/>
+          <w:szCs w:val="18"/>
+        </w:rPr>
+        <w:t xml:space="preserve">Figure 34. </w:t>
+      </w:r>
+      <w:r>
+        <w:rPr>
+          <w:rFonts w:ascii="Arial" w:cs="Arial" w:eastAsia="Arial" w:hAnsi="Arial"/>
+          <w:sz w:val="18"/>
+          <w:szCs w:val="18"/>
+        </w:rPr>
+        <w:t xml:space="preserve">Writing and reading a file</w:t>
+      </w:r>
+    </w:p>
+    <w:p>
+      <w:pPr>
+        <w:pStyle w:val="Heading2"/>
+        <w:keepNext/>
+      </w:pPr>
+      <w:r>
+        <w:rPr>
+          <w:rFonts w:ascii="Arial" w:cs="Arial" w:eastAsia="Arial" w:hAnsi="Arial"/>
+          <w:b/>
+          <w:bCs/>
+          <w:sz w:val="24"/>
+          <w:szCs w:val="24"/>
+        </w:rPr>
+        <w:t xml:space="preserve">Date and Time</w:t>
+      </w:r>
+    </w:p>
+    <w:p>
+      <w:pPr>
+        <w:spacing w:after="120" w:line="264"/>
+      </w:pPr>
+      <w:r>
+        <w:rPr>
+          <w:rFonts w:ascii="Arial" w:cs="Arial" w:eastAsia="Arial" w:hAnsi="Arial"/>
+          <w:sz w:val="20"/>
+          <w:szCs w:val="20"/>
+        </w:rPr>
+        <w:t xml:space="preserve">Date today and Time now answer the current date and time. A Date answers year, month and day and prints as 2026-10-10; a Time answers hours, minutes and seconds and prints as 14:05:09. Date year:month:day: and Time hours:minutes:seconds: make particular values, and both compare with &lt; and =. Time millisecondClock and Time millisecondsToRun: measure elapsed time.</w:t>
+      </w:r>
+    </w:p>
+    <w:p>
+      <w:pPr>
         <w:pStyle w:val="Heading1"/>
         <w:pageBreakBefore/>
         <w:pBdr>
@@ -19923,7 +20377,7 @@
           <w:sz w:val="18"/>
           <w:szCs w:val="18"/>
         </w:rPr>
-        <w:t xml:space="preserve">Figure 34. </w:t>
+        <w:t xml:space="preserve">Figure 35. </w:t>
       </w:r>
       <w:r>
         <w:rPr>
@@ -20471,7 +20925,7 @@
           <w:sz w:val="18"/>
           <w:szCs w:val="18"/>
         </w:rPr>
-        <w:t xml:space="preserve">Figure 35. </w:t>
+        <w:t xml:space="preserve">Figure 36. </w:t>
       </w:r>
       <w:r>
         <w:rPr>
@@ -20777,7 +21231,7 @@
           <w:sz w:val="18"/>
           <w:szCs w:val="18"/>
         </w:rPr>
-        <w:t xml:space="preserve">Figure 36. </w:t>
+        <w:t xml:space="preserve">Figure 37. </w:t>
       </w:r>
       <w:r>
         <w:rPr>
@@ -21159,7 +21613,7 @@
           <w:sz w:val="18"/>
           <w:szCs w:val="18"/>
         </w:rPr>
-        <w:t xml:space="preserve">Figure 37. </w:t>
+        <w:t xml:space="preserve">Figure 38. </w:t>
       </w:r>
       <w:r>
         <w:rPr>
@@ -21486,7 +21940,7 @@
           <w:sz w:val="18"/>
           <w:szCs w:val="18"/>
         </w:rPr>
-        <w:t xml:space="preserve">Figure 38. </w:t>
+        <w:t xml:space="preserve">Figure 39. </w:t>
       </w:r>
       <w:r>
         <w:rPr>
@@ -22194,7 +22648,7 @@
           <w:sz w:val="18"/>
           <w:szCs w:val="18"/>
         </w:rPr>
-        <w:t xml:space="preserve">Figure 39. </w:t>
+        <w:t xml:space="preserve">Figure 40. </w:t>
       </w:r>
       <w:r>
         <w:rPr>
@@ -22812,7 +23266,7 @@
           <w:sz w:val="18"/>
           <w:szCs w:val="18"/>
         </w:rPr>
-        <w:t xml:space="preserve">Figure 40. </w:t>
+        <w:t xml:space="preserve">Figure 41. </w:t>
       </w:r>
       <w:r>
         <w:rPr>
@@ -23173,7 +23627,7 @@
           <w:sz w:val="18"/>
           <w:szCs w:val="18"/>
         </w:rPr>
-        <w:t xml:space="preserve">Figure 41. </w:t>
+        <w:t xml:space="preserve">Figure 42. </w:t>
       </w:r>
       <w:r>
         <w:rPr>
@@ -23570,7 +24024,7 @@
           <w:sz w:val="18"/>
           <w:szCs w:val="18"/>
         </w:rPr>
-        <w:t xml:space="preserve">Figure 42. </w:t>
+        <w:t xml:space="preserve">Figure 43. </w:t>
       </w:r>
       <w:r>
         <w:rPr>
@@ -24341,7 +24795,7 @@
           <w:sz w:val="18"/>
           <w:szCs w:val="18"/>
         </w:rPr>
-        <w:t xml:space="preserve">Figure 43. </w:t>
+        <w:t xml:space="preserve">Figure 44. </w:t>
       </w:r>
       <w:r>
         <w:rPr>
@@ -24902,7 +25356,7 @@
           <w:sz w:val="20"/>
           <w:szCs w:val="20"/>
         </w:rPr>
-        <w:t xml:space="preserve"> (fork, Semaphore, Process), no Date and Time classes beyond Time millisecondClock and millisecondsToRun:, no file streams, no thisContext.</w:t>
+        <w:t xml:space="preserve"> (fork, Semaphore, Process) and no thisContext. Date and Time have no arithmetic, and file streams read and write whole files.</w:t>
       </w:r>
     </w:p>
     <w:p>
@@ -25156,7 +25610,7 @@
           <w:sz w:val="18"/>
           <w:szCs w:val="18"/>
         </w:rPr>
-        <w:t xml:space="preserve">Figure 44. </w:t>
+        <w:t xml:space="preserve">Figure 45. </w:t>
       </w:r>
       <w:r>
         <w:rPr>
@@ -25931,7 +26385,7 @@
           <w:sz w:val="18"/>
           <w:szCs w:val="18"/>
         </w:rPr>
-        <w:t xml:space="preserve">Figure 45. </w:t>
+        <w:t xml:space="preserve">Figure 46. </w:t>
       </w:r>
       <w:r>
         <w:rPr>
@@ -26905,6 +27359,27 @@
           <w:sz w:val="17"/>
           <w:szCs w:val="17"/>
         </w:rPr>
+        <w:t xml:space="preserve">          FileStream</w:t>
+      </w:r>
+    </w:p>
+    <w:p>
+      <w:pPr>
+        <w:keepNext/>
+        <w:keepLines/>
+        <w:pBdr>
+          <w:left w:val="single" w:color="808080" w:sz="4"/>
+          <w:right w:val="single" w:color="808080" w:sz="4"/>
+        </w:pBdr>
+        <w:shd w:fill="F2F2F2" w:color="auto" w:val="clear"/>
+        <w:spacing w:after="0" w:line="240"/>
+        <w:ind w:left="100" w:right="100"/>
+      </w:pPr>
+      <w:r>
+        <w:rPr>
+          <w:rFonts w:ascii="Courier New" w:cs="Courier New" w:eastAsia="Courier New" w:hAnsi="Courier New"/>
+          <w:sz w:val="17"/>
+          <w:szCs w:val="17"/>
+        </w:rPr>
         <w:t xml:space="preserve">    TextCollector</w:t>
       </w:r>
     </w:p>
@@ -27005,7 +27480,7 @@
           <w:sz w:val="18"/>
           <w:szCs w:val="18"/>
         </w:rPr>
-        <w:t xml:space="preserve">Figure 46. </w:t>
+        <w:t xml:space="preserve">Figure 47. </w:t>
       </w:r>
       <w:r>
         <w:rPr>
@@ -27723,7 +28198,7 @@
           <w:sz w:val="18"/>
           <w:szCs w:val="18"/>
         </w:rPr>
-        <w:t xml:space="preserve">Figure 47. </w:t>
+        <w:t xml:space="preserve">Figure 48. </w:t>
       </w:r>
       <w:r>
         <w:rPr>

</xml_diff>

<commit_message>
Add Date and Time arithmetic (addDays:, subtractDate:, dayName, addSeconds: ...)
Co-Authored-By: Claude Sonnet 5.5 <noreply@anthropic.com>
Claude-Session: https://claude.ai/code/session_013PfZHD8os4FWhvmVG9Tf7M
</commit_message>
<xml_diff>
--- a/docs/Smalltalk-CREXX-Guide.docx
+++ b/docs/Smalltalk-CREXX-Guide.docx
@@ -3480,7 +3480,7 @@
                 <w:sz w:val="17"/>
                 <w:szCs w:val="17"/>
               </w:rPr>
-              <w:t xml:space="preserve">Date, Time, Time millisecondClock</w:t>
+              <w:t xml:space="preserve">Date, Time, day and second arithmetic, Time millisecondClock</w:t>
             </w:r>
           </w:p>
         </w:tc>
@@ -3512,7 +3512,7 @@
                 <w:sz w:val="17"/>
                 <w:szCs w:val="17"/>
               </w:rPr>
-              <w:t xml:space="preserve">basic</w:t>
+              <w:t xml:space="preserve">complete</w:t>
             </w:r>
           </w:p>
         </w:tc>
@@ -20064,6 +20064,275 @@
     </w:p>
     <w:p>
       <w:pPr>
+        <w:spacing w:after="120" w:line="264"/>
+      </w:pPr>
+      <w:r>
+        <w:rPr>
+          <w:rFonts w:ascii="Arial" w:cs="Arial" w:eastAsia="Arial" w:hAnsi="Arial"/>
+          <w:sz w:val="20"/>
+          <w:szCs w:val="20"/>
+        </w:rPr>
+        <w:t xml:space="preserve">Dates support arithmetic. addDays: answers a new Date, subtractDate: answers the number of days between two dates, and dayOfWeek, dayName, monthName, isLeapYear and daysInMonth describe a date. A Time offers addSeconds: (wrapping at midnight) and subtractTime:, which answers seconds.</w:t>
+      </w:r>
+    </w:p>
+    <w:p>
+      <w:pPr>
+        <w:keepNext/>
+        <w:keepLines/>
+        <w:pBdr>
+          <w:top w:val="single" w:color="808080" w:sz="4"/>
+          <w:left w:val="single" w:color="808080" w:sz="4"/>
+          <w:right w:val="single" w:color="808080" w:sz="4"/>
+        </w:pBdr>
+        <w:shd w:fill="F2F2F2" w:color="auto" w:val="clear"/>
+        <w:spacing w:after="0" w:line="240"/>
+        <w:ind w:left="100" w:right="100"/>
+      </w:pPr>
+      <w:r>
+        <w:rPr>
+          <w:rFonts w:ascii="Courier New" w:cs="Courier New" w:eastAsia="Courier New" w:hAnsi="Courier New"/>
+          <w:sz w:val="17"/>
+          <w:szCs w:val="17"/>
+        </w:rPr>
+        <w:t xml:space="preserve">| d |</w:t>
+      </w:r>
+    </w:p>
+    <w:p>
+      <w:pPr>
+        <w:keepNext/>
+        <w:keepLines/>
+        <w:pBdr>
+          <w:left w:val="single" w:color="808080" w:sz="4"/>
+          <w:right w:val="single" w:color="808080" w:sz="4"/>
+        </w:pBdr>
+        <w:shd w:fill="F2F2F2" w:color="auto" w:val="clear"/>
+        <w:spacing w:after="0" w:line="240"/>
+        <w:ind w:left="100" w:right="100"/>
+      </w:pPr>
+      <w:r>
+        <w:rPr>
+          <w:rFonts w:ascii="Courier New" w:cs="Courier New" w:eastAsia="Courier New" w:hAnsi="Courier New"/>
+          <w:sz w:val="17"/>
+          <w:szCs w:val="17"/>
+        </w:rPr>
+        <w:t xml:space="preserve">d := Date year: 2026 month: 10 day: 10.</w:t>
+      </w:r>
+    </w:p>
+    <w:p>
+      <w:pPr>
+        <w:keepNext/>
+        <w:keepLines/>
+        <w:pBdr>
+          <w:left w:val="single" w:color="808080" w:sz="4"/>
+          <w:right w:val="single" w:color="808080" w:sz="4"/>
+        </w:pBdr>
+        <w:shd w:fill="F2F2F2" w:color="auto" w:val="clear"/>
+        <w:spacing w:after="0" w:line="240"/>
+        <w:ind w:left="100" w:right="100"/>
+      </w:pPr>
+      <w:r>
+        <w:rPr>
+          <w:rFonts w:ascii="Courier New" w:cs="Courier New" w:eastAsia="Courier New" w:hAnsi="Courier New"/>
+          <w:sz w:val="17"/>
+          <w:szCs w:val="17"/>
+        </w:rPr>
+        <w:t xml:space="preserve">d dayName printNl.</w:t>
+      </w:r>
+    </w:p>
+    <w:p>
+      <w:pPr>
+        <w:keepNext/>
+        <w:keepLines/>
+        <w:pBdr>
+          <w:left w:val="single" w:color="808080" w:sz="4"/>
+          <w:right w:val="single" w:color="808080" w:sz="4"/>
+        </w:pBdr>
+        <w:shd w:fill="F2F2F2" w:color="auto" w:val="clear"/>
+        <w:spacing w:after="0" w:line="240"/>
+        <w:ind w:left="100" w:right="100"/>
+      </w:pPr>
+      <w:r>
+        <w:rPr>
+          <w:rFonts w:ascii="Courier New" w:cs="Courier New" w:eastAsia="Courier New" w:hAnsi="Courier New"/>
+          <w:sz w:val="17"/>
+          <w:szCs w:val="17"/>
+        </w:rPr>
+        <w:t xml:space="preserve">(d addDays: 30) printNl.</w:t>
+      </w:r>
+    </w:p>
+    <w:p>
+      <w:pPr>
+        <w:keepNext/>
+        <w:keepLines/>
+        <w:pBdr>
+          <w:left w:val="single" w:color="808080" w:sz="4"/>
+          <w:right w:val="single" w:color="808080" w:sz="4"/>
+        </w:pBdr>
+        <w:shd w:fill="F2F2F2" w:color="auto" w:val="clear"/>
+        <w:spacing w:after="0" w:line="240"/>
+        <w:ind w:left="100" w:right="100"/>
+      </w:pPr>
+      <w:r>
+        <w:rPr>
+          <w:rFonts w:ascii="Courier New" w:cs="Courier New" w:eastAsia="Courier New" w:hAnsi="Courier New"/>
+          <w:sz w:val="17"/>
+          <w:szCs w:val="17"/>
+        </w:rPr>
+        <w:t xml:space="preserve">((Date year: 2028 month: 3 day: 1) subtractDate: (Date year: 2028 month: 2 day: 1)) printNl.</w:t>
+      </w:r>
+    </w:p>
+    <w:p>
+      <w:pPr>
+        <w:keepNext/>
+        <w:keepLines/>
+        <w:pBdr>
+          <w:left w:val="single" w:color="808080" w:sz="4"/>
+          <w:right w:val="single" w:color="808080" w:sz="4"/>
+        </w:pBdr>
+        <w:shd w:fill="F2F2F2" w:color="auto" w:val="clear"/>
+        <w:spacing w:after="0" w:line="240"/>
+        <w:ind w:left="100" w:right="100"/>
+      </w:pPr>
+      <w:r>
+        <w:rPr>
+          <w:rFonts w:ascii="Courier New" w:cs="Courier New" w:eastAsia="Courier New" w:hAnsi="Courier New"/>
+          <w:sz w:val="17"/>
+          <w:szCs w:val="17"/>
+        </w:rPr>
+        <w:t xml:space="preserve">((Time hours: 23 minutes: 59 seconds: 30) addSeconds: 45) printNl.</w:t>
+      </w:r>
+    </w:p>
+    <w:p>
+      <w:pPr>
+        <w:keepNext/>
+        <w:keepLines/>
+        <w:pBdr>
+          <w:left w:val="single" w:color="808080" w:sz="4"/>
+          <w:right w:val="single" w:color="808080" w:sz="4"/>
+        </w:pBdr>
+        <w:shd w:fill="F2F2F2" w:color="auto" w:val="clear"/>
+        <w:spacing w:after="0" w:line="240"/>
+        <w:ind w:left="100" w:right="100"/>
+      </w:pPr>
+      <w:r>
+        <w:rPr>
+          <w:rFonts w:ascii="Courier New" w:cs="Courier New" w:eastAsia="Courier New" w:hAnsi="Courier New"/>
+          <w:sz w:val="17"/>
+          <w:szCs w:val="17"/>
+        </w:rPr>
+        <w:t xml:space="preserve"> </w:t>
+      </w:r>
+    </w:p>
+    <w:p>
+      <w:pPr>
+        <w:keepNext/>
+        <w:keepLines/>
+        <w:pBdr>
+          <w:left w:val="single" w:color="808080" w:sz="4"/>
+          <w:right w:val="single" w:color="808080" w:sz="4"/>
+        </w:pBdr>
+        <w:shd w:fill="F2F2F2" w:color="auto" w:val="clear"/>
+        <w:spacing w:after="0" w:line="240"/>
+        <w:ind w:left="100" w:right="100"/>
+      </w:pPr>
+      <w:r>
+        <w:rPr>
+          <w:rFonts w:ascii="Courier New" w:cs="Courier New" w:eastAsia="Courier New" w:hAnsi="Courier New"/>
+          <w:sz w:val="17"/>
+          <w:szCs w:val="17"/>
+        </w:rPr>
+        <w:t xml:space="preserve">#Saturday</w:t>
+      </w:r>
+    </w:p>
+    <w:p>
+      <w:pPr>
+        <w:keepNext/>
+        <w:keepLines/>
+        <w:pBdr>
+          <w:left w:val="single" w:color="808080" w:sz="4"/>
+          <w:right w:val="single" w:color="808080" w:sz="4"/>
+        </w:pBdr>
+        <w:shd w:fill="F2F2F2" w:color="auto" w:val="clear"/>
+        <w:spacing w:after="0" w:line="240"/>
+        <w:ind w:left="100" w:right="100"/>
+      </w:pPr>
+      <w:r>
+        <w:rPr>
+          <w:rFonts w:ascii="Courier New" w:cs="Courier New" w:eastAsia="Courier New" w:hAnsi="Courier New"/>
+          <w:sz w:val="17"/>
+          <w:szCs w:val="17"/>
+        </w:rPr>
+        <w:t xml:space="preserve">2026-11-09</w:t>
+      </w:r>
+    </w:p>
+    <w:p>
+      <w:pPr>
+        <w:keepNext/>
+        <w:keepLines/>
+        <w:pBdr>
+          <w:left w:val="single" w:color="808080" w:sz="4"/>
+          <w:right w:val="single" w:color="808080" w:sz="4"/>
+        </w:pBdr>
+        <w:shd w:fill="F2F2F2" w:color="auto" w:val="clear"/>
+        <w:spacing w:after="0" w:line="240"/>
+        <w:ind w:left="100" w:right="100"/>
+      </w:pPr>
+      <w:r>
+        <w:rPr>
+          <w:rFonts w:ascii="Courier New" w:cs="Courier New" w:eastAsia="Courier New" w:hAnsi="Courier New"/>
+          <w:sz w:val="17"/>
+          <w:szCs w:val="17"/>
+        </w:rPr>
+        <w:t xml:space="preserve">29</w:t>
+      </w:r>
+    </w:p>
+    <w:p>
+      <w:pPr>
+        <w:keepNext w:val="false"/>
+        <w:keepLines/>
+        <w:pBdr>
+          <w:bottom w:val="single" w:color="808080" w:sz="4"/>
+          <w:left w:val="single" w:color="808080" w:sz="4"/>
+          <w:right w:val="single" w:color="808080" w:sz="4"/>
+        </w:pBdr>
+        <w:shd w:fill="F2F2F2" w:color="auto" w:val="clear"/>
+        <w:spacing w:after="0" w:line="240"/>
+        <w:ind w:left="100" w:right="100"/>
+      </w:pPr>
+      <w:r>
+        <w:rPr>
+          <w:rFonts w:ascii="Courier New" w:cs="Courier New" w:eastAsia="Courier New" w:hAnsi="Courier New"/>
+          <w:sz w:val="17"/>
+          <w:szCs w:val="17"/>
+        </w:rPr>
+        <w:t xml:space="preserve">00:00:15</w:t>
+      </w:r>
+    </w:p>
+    <w:p>
+      <w:pPr>
+        <w:spacing w:after="200" w:before="60"/>
+      </w:pPr>
+      <w:r>
+        <w:rPr>
+          <w:rFonts w:ascii="Arial" w:cs="Arial" w:eastAsia="Arial" w:hAnsi="Arial"/>
+          <w:b/>
+          <w:bCs/>
+          <w:sz w:val="18"/>
+          <w:szCs w:val="18"/>
+        </w:rPr>
+        <w:t xml:space="preserve">Figure 35. </w:t>
+      </w:r>
+      <w:r>
+        <w:rPr>
+          <w:rFonts w:ascii="Arial" w:cs="Arial" w:eastAsia="Arial" w:hAnsi="Arial"/>
+          <w:sz w:val="18"/>
+          <w:szCs w:val="18"/>
+        </w:rPr>
+        <w:t xml:space="preserve">Date and Time arithmetic</w:t>
+      </w:r>
+    </w:p>
+    <w:p>
+      <w:pPr>
         <w:pStyle w:val="Heading1"/>
         <w:pageBreakBefore/>
         <w:pBdr>
@@ -20377,7 +20646,7 @@
           <w:sz w:val="18"/>
           <w:szCs w:val="18"/>
         </w:rPr>
-        <w:t xml:space="preserve">Figure 35. </w:t>
+        <w:t xml:space="preserve">Figure 36. </w:t>
       </w:r>
       <w:r>
         <w:rPr>
@@ -20925,7 +21194,7 @@
           <w:sz w:val="18"/>
           <w:szCs w:val="18"/>
         </w:rPr>
-        <w:t xml:space="preserve">Figure 36. </w:t>
+        <w:t xml:space="preserve">Figure 37. </w:t>
       </w:r>
       <w:r>
         <w:rPr>
@@ -21231,7 +21500,7 @@
           <w:sz w:val="18"/>
           <w:szCs w:val="18"/>
         </w:rPr>
-        <w:t xml:space="preserve">Figure 37. </w:t>
+        <w:t xml:space="preserve">Figure 38. </w:t>
       </w:r>
       <w:r>
         <w:rPr>
@@ -21613,7 +21882,7 @@
           <w:sz w:val="18"/>
           <w:szCs w:val="18"/>
         </w:rPr>
-        <w:t xml:space="preserve">Figure 38. </w:t>
+        <w:t xml:space="preserve">Figure 39. </w:t>
       </w:r>
       <w:r>
         <w:rPr>
@@ -21940,7 +22209,7 @@
           <w:sz w:val="18"/>
           <w:szCs w:val="18"/>
         </w:rPr>
-        <w:t xml:space="preserve">Figure 39. </w:t>
+        <w:t xml:space="preserve">Figure 40. </w:t>
       </w:r>
       <w:r>
         <w:rPr>
@@ -22648,7 +22917,7 @@
           <w:sz w:val="18"/>
           <w:szCs w:val="18"/>
         </w:rPr>
-        <w:t xml:space="preserve">Figure 40. </w:t>
+        <w:t xml:space="preserve">Figure 41. </w:t>
       </w:r>
       <w:r>
         <w:rPr>
@@ -23266,7 +23535,7 @@
           <w:sz w:val="18"/>
           <w:szCs w:val="18"/>
         </w:rPr>
-        <w:t xml:space="preserve">Figure 41. </w:t>
+        <w:t xml:space="preserve">Figure 42. </w:t>
       </w:r>
       <w:r>
         <w:rPr>
@@ -23627,7 +23896,7 @@
           <w:sz w:val="18"/>
           <w:szCs w:val="18"/>
         </w:rPr>
-        <w:t xml:space="preserve">Figure 42. </w:t>
+        <w:t xml:space="preserve">Figure 43. </w:t>
       </w:r>
       <w:r>
         <w:rPr>
@@ -24024,7 +24293,7 @@
           <w:sz w:val="18"/>
           <w:szCs w:val="18"/>
         </w:rPr>
-        <w:t xml:space="preserve">Figure 43. </w:t>
+        <w:t xml:space="preserve">Figure 44. </w:t>
       </w:r>
       <w:r>
         <w:rPr>
@@ -24795,7 +25064,7 @@
           <w:sz w:val="18"/>
           <w:szCs w:val="18"/>
         </w:rPr>
-        <w:t xml:space="preserve">Figure 44. </w:t>
+        <w:t xml:space="preserve">Figure 45. </w:t>
       </w:r>
       <w:r>
         <w:rPr>
@@ -25356,7 +25625,7 @@
           <w:sz w:val="20"/>
           <w:szCs w:val="20"/>
         </w:rPr>
-        <w:t xml:space="preserve"> (fork, Semaphore, Process) and no thisContext. Date and Time have no arithmetic, and file streams read and write whole files.</w:t>
+        <w:t xml:space="preserve"> (fork, Semaphore, Process) and no thisContext. file streams read and write whole files.</w:t>
       </w:r>
     </w:p>
     <w:p>
@@ -25610,7 +25879,7 @@
           <w:sz w:val="18"/>
           <w:szCs w:val="18"/>
         </w:rPr>
-        <w:t xml:space="preserve">Figure 45. </w:t>
+        <w:t xml:space="preserve">Figure 46. </w:t>
       </w:r>
       <w:r>
         <w:rPr>
@@ -26385,7 +26654,7 @@
           <w:sz w:val="18"/>
           <w:szCs w:val="18"/>
         </w:rPr>
-        <w:t xml:space="preserve">Figure 46. </w:t>
+        <w:t xml:space="preserve">Figure 47. </w:t>
       </w:r>
       <w:r>
         <w:rPr>
@@ -27480,7 +27749,7 @@
           <w:sz w:val="18"/>
           <w:szCs w:val="18"/>
         </w:rPr>
-        <w:t xml:space="preserve">Figure 47. </w:t>
+        <w:t xml:space="preserve">Figure 48. </w:t>
       </w:r>
       <w:r>
         <w:rPr>
@@ -28198,7 +28467,7 @@
           <w:sz w:val="18"/>
           <w:szCs w:val="18"/>
         </w:rPr>
-        <w:t xml:space="preserve">Figure 48. </w:t>
+        <w:t xml:space="preserve">Figure 49. </w:t>
       </w:r>
       <w:r>
         <w:rPr>

</xml_diff>

<commit_message>
Add DateTime, Date addMonths:, longPrintString, dayOfYear, isWeekend
Co-Authored-By: Claude Sonnet 5.5 <noreply@anthropic.com>
Claude-Session: https://claude.ai/code/session_013PfZHD8os4FWhvmVG9Tf7M
</commit_message>
<xml_diff>
--- a/docs/Smalltalk-CREXX-Guide.docx
+++ b/docs/Smalltalk-CREXX-Guide.docx
@@ -1222,7 +1222,7 @@
           <w:sz w:val="19"/>
           <w:szCs w:val="19"/>
         </w:rPr>
-        <w:t xml:space="preserve">Chapter 9. Exceptions	21</w:t>
+        <w:t xml:space="preserve">Chapter 9. Exceptions	22</w:t>
       </w:r>
     </w:p>
     <w:p>
@@ -1241,7 +1241,7 @@
           <w:sz w:val="18"/>
           <w:szCs w:val="18"/>
         </w:rPr>
-        <w:t xml:space="preserve">Handling	21</w:t>
+        <w:t xml:space="preserve">Handling	22</w:t>
       </w:r>
     </w:p>
     <w:p>
@@ -1260,7 +1260,7 @@
           <w:sz w:val="18"/>
           <w:szCs w:val="18"/>
         </w:rPr>
-        <w:t xml:space="preserve">Messages understood by an exception	21</w:t>
+        <w:t xml:space="preserve">Messages understood by an exception	22</w:t>
       </w:r>
     </w:p>
     <w:p>
@@ -1279,7 +1279,7 @@
           <w:sz w:val="18"/>
           <w:szCs w:val="18"/>
         </w:rPr>
-        <w:t xml:space="preserve">Signaling	21</w:t>
+        <w:t xml:space="preserve">Signaling	22</w:t>
       </w:r>
     </w:p>
     <w:p>
@@ -1298,7 +1298,7 @@
           <w:sz w:val="18"/>
           <w:szCs w:val="18"/>
         </w:rPr>
-        <w:t xml:space="preserve">Cleaning up	22</w:t>
+        <w:t xml:space="preserve">Cleaning up	23</w:t>
       </w:r>
     </w:p>
     <w:p>
@@ -1317,7 +1317,7 @@
           <w:sz w:val="18"/>
           <w:szCs w:val="18"/>
         </w:rPr>
-        <w:t xml:space="preserve">Your own exceptions	22</w:t>
+        <w:t xml:space="preserve">Your own exceptions	23</w:t>
       </w:r>
     </w:p>
     <w:p>
@@ -1336,7 +1336,7 @@
           <w:sz w:val="19"/>
           <w:szCs w:val="19"/>
         </w:rPr>
-        <w:t xml:space="preserve">Chapter 10. Reflection and the System	23</w:t>
+        <w:t xml:space="preserve">Chapter 10. Reflection and the System	24</w:t>
       </w:r>
     </w:p>
     <w:p>
@@ -1355,7 +1355,7 @@
           <w:sz w:val="18"/>
           <w:szCs w:val="18"/>
         </w:rPr>
-        <w:t xml:space="preserve">Asking about objects	23</w:t>
+        <w:t xml:space="preserve">Asking about objects	24</w:t>
       </w:r>
     </w:p>
     <w:p>
@@ -1374,7 +1374,7 @@
           <w:sz w:val="18"/>
           <w:szCs w:val="18"/>
         </w:rPr>
-        <w:t xml:space="preserve">Asking about classes	23</w:t>
+        <w:t xml:space="preserve">Asking about classes	24</w:t>
       </w:r>
     </w:p>
     <w:p>
@@ -1393,7 +1393,7 @@
           <w:sz w:val="18"/>
           <w:szCs w:val="18"/>
         </w:rPr>
-        <w:t xml:space="preserve">The Smalltalk dictionary	23</w:t>
+        <w:t xml:space="preserve">The Smalltalk dictionary	24</w:t>
       </w:r>
     </w:p>
     <w:p>
@@ -1412,7 +1412,7 @@
           <w:sz w:val="19"/>
           <w:szCs w:val="19"/>
         </w:rPr>
-        <w:t xml:space="preserve">Chapter 11. Errors and Traces	25</w:t>
+        <w:t xml:space="preserve">Chapter 11. Errors and Traces	26</w:t>
       </w:r>
     </w:p>
     <w:p>
@@ -1431,7 +1431,7 @@
           <w:sz w:val="18"/>
           <w:szCs w:val="18"/>
         </w:rPr>
-        <w:t xml:space="preserve">Unhandled errors	25</w:t>
+        <w:t xml:space="preserve">Unhandled errors	26</w:t>
       </w:r>
     </w:p>
     <w:p>
@@ -1450,7 +1450,7 @@
           <w:sz w:val="18"/>
           <w:szCs w:val="18"/>
         </w:rPr>
-        <w:t xml:space="preserve">Common messages	25</w:t>
+        <w:t xml:space="preserve">Common messages	26</w:t>
       </w:r>
     </w:p>
     <w:p>
@@ -1469,7 +1469,7 @@
           <w:sz w:val="18"/>
           <w:szCs w:val="18"/>
         </w:rPr>
-        <w:t xml:space="preserve">Parse errors	25</w:t>
+        <w:t xml:space="preserve">Parse errors	26</w:t>
       </w:r>
     </w:p>
     <w:p>
@@ -1488,7 +1488,7 @@
           <w:sz w:val="19"/>
           <w:szCs w:val="19"/>
         </w:rPr>
-        <w:t xml:space="preserve">Chapter 12. How Smalltalk/CREXX Works	26</w:t>
+        <w:t xml:space="preserve">Chapter 12. How Smalltalk/CREXX Works	27</w:t>
       </w:r>
     </w:p>
     <w:p>
@@ -1507,7 +1507,7 @@
           <w:sz w:val="18"/>
           <w:szCs w:val="18"/>
         </w:rPr>
-        <w:t xml:space="preserve">Objects	26</w:t>
+        <w:t xml:space="preserve">Objects	27</w:t>
       </w:r>
     </w:p>
     <w:p>
@@ -1526,7 +1526,7 @@
           <w:sz w:val="18"/>
           <w:szCs w:val="18"/>
         </w:rPr>
-        <w:t xml:space="preserve">Classes and methods	26</w:t>
+        <w:t xml:space="preserve">Classes and methods	27</w:t>
       </w:r>
     </w:p>
     <w:p>
@@ -1545,7 +1545,7 @@
           <w:sz w:val="18"/>
           <w:szCs w:val="18"/>
         </w:rPr>
-        <w:t xml:space="preserve">The resolver	26</w:t>
+        <w:t xml:space="preserve">The resolver	27</w:t>
       </w:r>
     </w:p>
     <w:p>
@@ -1564,7 +1564,7 @@
           <w:sz w:val="18"/>
           <w:szCs w:val="18"/>
         </w:rPr>
-        <w:t xml:space="preserve">The evaluator	26</w:t>
+        <w:t xml:space="preserve">The evaluator	27</w:t>
       </w:r>
     </w:p>
     <w:p>
@@ -1583,7 +1583,7 @@
           <w:sz w:val="18"/>
           <w:szCs w:val="18"/>
         </w:rPr>
-        <w:t xml:space="preserve">Primitives	26</w:t>
+        <w:t xml:space="preserve">Primitives	27</w:t>
       </w:r>
     </w:p>
     <w:p>
@@ -1602,7 +1602,7 @@
           <w:sz w:val="18"/>
           <w:szCs w:val="18"/>
         </w:rPr>
-        <w:t xml:space="preserve">Adding a primitive	26</w:t>
+        <w:t xml:space="preserve">Adding a primitive	27</w:t>
       </w:r>
     </w:p>
     <w:p>
@@ -1621,7 +1621,7 @@
           <w:sz w:val="18"/>
           <w:szCs w:val="18"/>
         </w:rPr>
-        <w:t xml:space="preserve">The build	27</w:t>
+        <w:t xml:space="preserve">The build	28</w:t>
       </w:r>
     </w:p>
     <w:p>
@@ -1640,7 +1640,7 @@
           <w:sz w:val="19"/>
           <w:szCs w:val="19"/>
         </w:rPr>
-        <w:t xml:space="preserve">Chapter 13. Restrictions and Known Problems	28</w:t>
+        <w:t xml:space="preserve">Chapter 13. Restrictions and Known Problems	29</w:t>
       </w:r>
     </w:p>
     <w:p>
@@ -1659,7 +1659,7 @@
           <w:sz w:val="19"/>
           <w:szCs w:val="19"/>
         </w:rPr>
-        <w:t xml:space="preserve">Appendix A. Command Summary	29</w:t>
+        <w:t xml:space="preserve">Appendix A. Command Summary	30</w:t>
       </w:r>
     </w:p>
     <w:p>
@@ -1678,7 +1678,7 @@
           <w:sz w:val="19"/>
           <w:szCs w:val="19"/>
         </w:rPr>
-        <w:t xml:space="preserve">Appendix B. Contents of the Repository	30</w:t>
+        <w:t xml:space="preserve">Appendix B. Contents of the Repository	31</w:t>
       </w:r>
     </w:p>
     <w:p>
@@ -1697,7 +1697,7 @@
           <w:sz w:val="19"/>
           <w:szCs w:val="19"/>
         </w:rPr>
-        <w:t xml:space="preserve">Appendix C. Class Hierarchy	31</w:t>
+        <w:t xml:space="preserve">Appendix C. Class Hierarchy	32</w:t>
       </w:r>
     </w:p>
     <w:p>
@@ -1716,7 +1716,7 @@
           <w:sz w:val="19"/>
           <w:szCs w:val="19"/>
         </w:rPr>
-        <w:t xml:space="preserve">Appendix D. Sample Programs	32</w:t>
+        <w:t xml:space="preserve">Appendix D. Sample Programs	33</w:t>
       </w:r>
     </w:p>
     <w:p>
@@ -3480,7 +3480,7 @@
                 <w:sz w:val="17"/>
                 <w:szCs w:val="17"/>
               </w:rPr>
-              <w:t xml:space="preserve">Date, Time, day and second arithmetic, Time millisecondClock</w:t>
+              <w:t xml:space="preserve">Date, Time, DateTime, calendar arithmetic, Time millisecondClock</w:t>
             </w:r>
           </w:p>
         </w:tc>
@@ -20333,6 +20333,275 @@
     </w:p>
     <w:p>
       <w:pPr>
+        <w:spacing w:after="120" w:line="264"/>
+      </w:pPr>
+      <w:r>
+        <w:rPr>
+          <w:rFonts w:ascii="Arial" w:cs="Arial" w:eastAsia="Arial" w:hAnsi="Arial"/>
+          <w:sz w:val="20"/>
+          <w:szCs w:val="20"/>
+        </w:rPr>
+        <w:t xml:space="preserve">addMonths: moves a date by calendar months and shortens the day when the target month is too short. longPrintString gives text such as Saturday, 10 October 2026, and dayOfYear and isWeekend answer as their names say. A DateTime joins a Date and a Time: DateTime now, or DateTime year:month:day:hour:minute:second:. It prints as 2026-12-31T23:59:00, compares with &lt; and =, and supports addSeconds:, addDays: and subtractDateTime:, which answers seconds.</w:t>
+      </w:r>
+    </w:p>
+    <w:p>
+      <w:pPr>
+        <w:keepNext/>
+        <w:keepLines/>
+        <w:pBdr>
+          <w:top w:val="single" w:color="808080" w:sz="4"/>
+          <w:left w:val="single" w:color="808080" w:sz="4"/>
+          <w:right w:val="single" w:color="808080" w:sz="4"/>
+        </w:pBdr>
+        <w:shd w:fill="F2F2F2" w:color="auto" w:val="clear"/>
+        <w:spacing w:after="0" w:line="240"/>
+        <w:ind w:left="100" w:right="100"/>
+      </w:pPr>
+      <w:r>
+        <w:rPr>
+          <w:rFonts w:ascii="Courier New" w:cs="Courier New" w:eastAsia="Courier New" w:hAnsi="Courier New"/>
+          <w:sz w:val="17"/>
+          <w:szCs w:val="17"/>
+        </w:rPr>
+        <w:t xml:space="preserve">| a |</w:t>
+      </w:r>
+    </w:p>
+    <w:p>
+      <w:pPr>
+        <w:keepNext/>
+        <w:keepLines/>
+        <w:pBdr>
+          <w:left w:val="single" w:color="808080" w:sz="4"/>
+          <w:right w:val="single" w:color="808080" w:sz="4"/>
+        </w:pBdr>
+        <w:shd w:fill="F2F2F2" w:color="auto" w:val="clear"/>
+        <w:spacing w:after="0" w:line="240"/>
+        <w:ind w:left="100" w:right="100"/>
+      </w:pPr>
+      <w:r>
+        <w:rPr>
+          <w:rFonts w:ascii="Courier New" w:cs="Courier New" w:eastAsia="Courier New" w:hAnsi="Courier New"/>
+          <w:sz w:val="17"/>
+          <w:szCs w:val="17"/>
+        </w:rPr>
+        <w:t xml:space="preserve">a := DateTime year: 2026 month: 12 day: 31 hour: 23 minute: 59 second: 0.</w:t>
+      </w:r>
+    </w:p>
+    <w:p>
+      <w:pPr>
+        <w:keepNext/>
+        <w:keepLines/>
+        <w:pBdr>
+          <w:left w:val="single" w:color="808080" w:sz="4"/>
+          <w:right w:val="single" w:color="808080" w:sz="4"/>
+        </w:pBdr>
+        <w:shd w:fill="F2F2F2" w:color="auto" w:val="clear"/>
+        <w:spacing w:after="0" w:line="240"/>
+        <w:ind w:left="100" w:right="100"/>
+      </w:pPr>
+      <w:r>
+        <w:rPr>
+          <w:rFonts w:ascii="Courier New" w:cs="Courier New" w:eastAsia="Courier New" w:hAnsi="Courier New"/>
+          <w:sz w:val="17"/>
+          <w:szCs w:val="17"/>
+        </w:rPr>
+        <w:t xml:space="preserve">(a addSeconds: 120) printNl.</w:t>
+      </w:r>
+    </w:p>
+    <w:p>
+      <w:pPr>
+        <w:keepNext/>
+        <w:keepLines/>
+        <w:pBdr>
+          <w:left w:val="single" w:color="808080" w:sz="4"/>
+          <w:right w:val="single" w:color="808080" w:sz="4"/>
+        </w:pBdr>
+        <w:shd w:fill="F2F2F2" w:color="auto" w:val="clear"/>
+        <w:spacing w:after="0" w:line="240"/>
+        <w:ind w:left="100" w:right="100"/>
+      </w:pPr>
+      <w:r>
+        <w:rPr>
+          <w:rFonts w:ascii="Courier New" w:cs="Courier New" w:eastAsia="Courier New" w:hAnsi="Courier New"/>
+          <w:sz w:val="17"/>
+          <w:szCs w:val="17"/>
+        </w:rPr>
+        <w:t xml:space="preserve">((a addSeconds: 3600) subtractDateTime: a) printNl.</w:t>
+      </w:r>
+    </w:p>
+    <w:p>
+      <w:pPr>
+        <w:keepNext/>
+        <w:keepLines/>
+        <w:pBdr>
+          <w:left w:val="single" w:color="808080" w:sz="4"/>
+          <w:right w:val="single" w:color="808080" w:sz="4"/>
+        </w:pBdr>
+        <w:shd w:fill="F2F2F2" w:color="auto" w:val="clear"/>
+        <w:spacing w:after="0" w:line="240"/>
+        <w:ind w:left="100" w:right="100"/>
+      </w:pPr>
+      <w:r>
+        <w:rPr>
+          <w:rFonts w:ascii="Courier New" w:cs="Courier New" w:eastAsia="Courier New" w:hAnsi="Courier New"/>
+          <w:sz w:val="17"/>
+          <w:szCs w:val="17"/>
+        </w:rPr>
+        <w:t xml:space="preserve">(Date year: 2026 month: 10 day: 10) longPrintString displayNl.</w:t>
+      </w:r>
+    </w:p>
+    <w:p>
+      <w:pPr>
+        <w:keepNext/>
+        <w:keepLines/>
+        <w:pBdr>
+          <w:left w:val="single" w:color="808080" w:sz="4"/>
+          <w:right w:val="single" w:color="808080" w:sz="4"/>
+        </w:pBdr>
+        <w:shd w:fill="F2F2F2" w:color="auto" w:val="clear"/>
+        <w:spacing w:after="0" w:line="240"/>
+        <w:ind w:left="100" w:right="100"/>
+      </w:pPr>
+      <w:r>
+        <w:rPr>
+          <w:rFonts w:ascii="Courier New" w:cs="Courier New" w:eastAsia="Courier New" w:hAnsi="Courier New"/>
+          <w:sz w:val="17"/>
+          <w:szCs w:val="17"/>
+        </w:rPr>
+        <w:t xml:space="preserve">((Date year: 2026 month: 1 day: 31) addMonths: 1) printNl.</w:t>
+      </w:r>
+    </w:p>
+    <w:p>
+      <w:pPr>
+        <w:keepNext/>
+        <w:keepLines/>
+        <w:pBdr>
+          <w:left w:val="single" w:color="808080" w:sz="4"/>
+          <w:right w:val="single" w:color="808080" w:sz="4"/>
+        </w:pBdr>
+        <w:shd w:fill="F2F2F2" w:color="auto" w:val="clear"/>
+        <w:spacing w:after="0" w:line="240"/>
+        <w:ind w:left="100" w:right="100"/>
+      </w:pPr>
+      <w:r>
+        <w:rPr>
+          <w:rFonts w:ascii="Courier New" w:cs="Courier New" w:eastAsia="Courier New" w:hAnsi="Courier New"/>
+          <w:sz w:val="17"/>
+          <w:szCs w:val="17"/>
+        </w:rPr>
+        <w:t xml:space="preserve"> </w:t>
+      </w:r>
+    </w:p>
+    <w:p>
+      <w:pPr>
+        <w:keepNext/>
+        <w:keepLines/>
+        <w:pBdr>
+          <w:left w:val="single" w:color="808080" w:sz="4"/>
+          <w:right w:val="single" w:color="808080" w:sz="4"/>
+        </w:pBdr>
+        <w:shd w:fill="F2F2F2" w:color="auto" w:val="clear"/>
+        <w:spacing w:after="0" w:line="240"/>
+        <w:ind w:left="100" w:right="100"/>
+      </w:pPr>
+      <w:r>
+        <w:rPr>
+          <w:rFonts w:ascii="Courier New" w:cs="Courier New" w:eastAsia="Courier New" w:hAnsi="Courier New"/>
+          <w:sz w:val="17"/>
+          <w:szCs w:val="17"/>
+        </w:rPr>
+        <w:t xml:space="preserve">2027-01-01T00:01:00</w:t>
+      </w:r>
+    </w:p>
+    <w:p>
+      <w:pPr>
+        <w:keepNext/>
+        <w:keepLines/>
+        <w:pBdr>
+          <w:left w:val="single" w:color="808080" w:sz="4"/>
+          <w:right w:val="single" w:color="808080" w:sz="4"/>
+        </w:pBdr>
+        <w:shd w:fill="F2F2F2" w:color="auto" w:val="clear"/>
+        <w:spacing w:after="0" w:line="240"/>
+        <w:ind w:left="100" w:right="100"/>
+      </w:pPr>
+      <w:r>
+        <w:rPr>
+          <w:rFonts w:ascii="Courier New" w:cs="Courier New" w:eastAsia="Courier New" w:hAnsi="Courier New"/>
+          <w:sz w:val="17"/>
+          <w:szCs w:val="17"/>
+        </w:rPr>
+        <w:t xml:space="preserve">3600</w:t>
+      </w:r>
+    </w:p>
+    <w:p>
+      <w:pPr>
+        <w:keepNext/>
+        <w:keepLines/>
+        <w:pBdr>
+          <w:left w:val="single" w:color="808080" w:sz="4"/>
+          <w:right w:val="single" w:color="808080" w:sz="4"/>
+        </w:pBdr>
+        <w:shd w:fill="F2F2F2" w:color="auto" w:val="clear"/>
+        <w:spacing w:after="0" w:line="240"/>
+        <w:ind w:left="100" w:right="100"/>
+      </w:pPr>
+      <w:r>
+        <w:rPr>
+          <w:rFonts w:ascii="Courier New" w:cs="Courier New" w:eastAsia="Courier New" w:hAnsi="Courier New"/>
+          <w:sz w:val="17"/>
+          <w:szCs w:val="17"/>
+        </w:rPr>
+        <w:t xml:space="preserve">Saturday, 10 October 2026</w:t>
+      </w:r>
+    </w:p>
+    <w:p>
+      <w:pPr>
+        <w:keepNext w:val="false"/>
+        <w:keepLines/>
+        <w:pBdr>
+          <w:bottom w:val="single" w:color="808080" w:sz="4"/>
+          <w:left w:val="single" w:color="808080" w:sz="4"/>
+          <w:right w:val="single" w:color="808080" w:sz="4"/>
+        </w:pBdr>
+        <w:shd w:fill="F2F2F2" w:color="auto" w:val="clear"/>
+        <w:spacing w:after="0" w:line="240"/>
+        <w:ind w:left="100" w:right="100"/>
+      </w:pPr>
+      <w:r>
+        <w:rPr>
+          <w:rFonts w:ascii="Courier New" w:cs="Courier New" w:eastAsia="Courier New" w:hAnsi="Courier New"/>
+          <w:sz w:val="17"/>
+          <w:szCs w:val="17"/>
+        </w:rPr>
+        <w:t xml:space="preserve">2026-02-28</w:t>
+      </w:r>
+    </w:p>
+    <w:p>
+      <w:pPr>
+        <w:spacing w:after="200" w:before="60"/>
+      </w:pPr>
+      <w:r>
+        <w:rPr>
+          <w:rFonts w:ascii="Arial" w:cs="Arial" w:eastAsia="Arial" w:hAnsi="Arial"/>
+          <w:b/>
+          <w:bCs/>
+          <w:sz w:val="18"/>
+          <w:szCs w:val="18"/>
+        </w:rPr>
+        <w:t xml:space="preserve">Figure 36. </w:t>
+      </w:r>
+      <w:r>
+        <w:rPr>
+          <w:rFonts w:ascii="Arial" w:cs="Arial" w:eastAsia="Arial" w:hAnsi="Arial"/>
+          <w:sz w:val="18"/>
+          <w:szCs w:val="18"/>
+        </w:rPr>
+        <w:t xml:space="preserve">DateTime</w:t>
+      </w:r>
+    </w:p>
+    <w:p>
+      <w:pPr>
         <w:pStyle w:val="Heading1"/>
         <w:pageBreakBefore/>
         <w:pBdr>
@@ -20646,7 +20915,7 @@
           <w:sz w:val="18"/>
           <w:szCs w:val="18"/>
         </w:rPr>
-        <w:t xml:space="preserve">Figure 36. </w:t>
+        <w:t xml:space="preserve">Figure 37. </w:t>
       </w:r>
       <w:r>
         <w:rPr>
@@ -21194,7 +21463,7 @@
           <w:sz w:val="18"/>
           <w:szCs w:val="18"/>
         </w:rPr>
-        <w:t xml:space="preserve">Figure 37. </w:t>
+        <w:t xml:space="preserve">Figure 38. </w:t>
       </w:r>
       <w:r>
         <w:rPr>
@@ -21500,7 +21769,7 @@
           <w:sz w:val="18"/>
           <w:szCs w:val="18"/>
         </w:rPr>
-        <w:t xml:space="preserve">Figure 38. </w:t>
+        <w:t xml:space="preserve">Figure 39. </w:t>
       </w:r>
       <w:r>
         <w:rPr>
@@ -21882,7 +22151,7 @@
           <w:sz w:val="18"/>
           <w:szCs w:val="18"/>
         </w:rPr>
-        <w:t xml:space="preserve">Figure 39. </w:t>
+        <w:t xml:space="preserve">Figure 40. </w:t>
       </w:r>
       <w:r>
         <w:rPr>
@@ -22209,7 +22478,7 @@
           <w:sz w:val="18"/>
           <w:szCs w:val="18"/>
         </w:rPr>
-        <w:t xml:space="preserve">Figure 40. </w:t>
+        <w:t xml:space="preserve">Figure 41. </w:t>
       </w:r>
       <w:r>
         <w:rPr>
@@ -22917,7 +23186,7 @@
           <w:sz w:val="18"/>
           <w:szCs w:val="18"/>
         </w:rPr>
-        <w:t xml:space="preserve">Figure 41. </w:t>
+        <w:t xml:space="preserve">Figure 42. </w:t>
       </w:r>
       <w:r>
         <w:rPr>
@@ -23535,7 +23804,7 @@
           <w:sz w:val="18"/>
           <w:szCs w:val="18"/>
         </w:rPr>
-        <w:t xml:space="preserve">Figure 42. </w:t>
+        <w:t xml:space="preserve">Figure 43. </w:t>
       </w:r>
       <w:r>
         <w:rPr>
@@ -23896,7 +24165,7 @@
           <w:sz w:val="18"/>
           <w:szCs w:val="18"/>
         </w:rPr>
-        <w:t xml:space="preserve">Figure 43. </w:t>
+        <w:t xml:space="preserve">Figure 44. </w:t>
       </w:r>
       <w:r>
         <w:rPr>
@@ -24293,7 +24562,7 @@
           <w:sz w:val="18"/>
           <w:szCs w:val="18"/>
         </w:rPr>
-        <w:t xml:space="preserve">Figure 44. </w:t>
+        <w:t xml:space="preserve">Figure 45. </w:t>
       </w:r>
       <w:r>
         <w:rPr>
@@ -25064,7 +25333,7 @@
           <w:sz w:val="18"/>
           <w:szCs w:val="18"/>
         </w:rPr>
-        <w:t xml:space="preserve">Figure 45. </w:t>
+        <w:t xml:space="preserve">Figure 46. </w:t>
       </w:r>
       <w:r>
         <w:rPr>
@@ -25879,7 +26148,7 @@
           <w:sz w:val="18"/>
           <w:szCs w:val="18"/>
         </w:rPr>
-        <w:t xml:space="preserve">Figure 46. </w:t>
+        <w:t xml:space="preserve">Figure 47. </w:t>
       </w:r>
       <w:r>
         <w:rPr>
@@ -26654,7 +26923,7 @@
           <w:sz w:val="18"/>
           <w:szCs w:val="18"/>
         </w:rPr>
-        <w:t xml:space="preserve">Figure 47. </w:t>
+        <w:t xml:space="preserve">Figure 48. </w:t>
       </w:r>
       <w:r>
         <w:rPr>
@@ -27166,7 +27435,7 @@
           <w:sz w:val="17"/>
           <w:szCs w:val="17"/>
         </w:rPr>
-        <w:t xml:space="preserve">    Date, Time</w:t>
+        <w:t xml:space="preserve">    Date, Time, DateTime</w:t>
       </w:r>
     </w:p>
     <w:p>
@@ -27749,7 +28018,7 @@
           <w:sz w:val="18"/>
           <w:szCs w:val="18"/>
         </w:rPr>
-        <w:t xml:space="preserve">Figure 48. </w:t>
+        <w:t xml:space="preserve">Figure 49. </w:t>
       </w:r>
       <w:r>
         <w:rPr>
@@ -28467,7 +28736,7 @@
           <w:sz w:val="18"/>
           <w:szCs w:val="18"/>
         </w:rPr>
-        <w:t xml:space="preserve">Figure 49. </w:t>
+        <w:t xml:space="preserve">Figure 50. </w:t>
       </w:r>
       <w:r>
         <w:rPr>

</xml_diff>

<commit_message>
Add extras.st: about 120 more methods (strings, collections, sets, numbers, streams, reflection)
Co-Authored-By: Claude Sonnet 5.5 <noreply@anthropic.com>
Claude-Session: https://claude.ai/code/session_013PfZHD8os4FWhvmVG9Tf7M
</commit_message>
<xml_diff>
--- a/docs/Smalltalk-CREXX-Guide.docx
+++ b/docs/Smalltalk-CREXX-Guide.docx
@@ -869,6 +869,25 @@
         <w:tabs>
           <w:tab w:val="right" w:pos="9638" w:leader="dot"/>
         </w:tabs>
+        <w:spacing w:after="0" w:before="0"/>
+        <w:ind w:left="360"/>
+      </w:pPr>
+      <w:r>
+        <w:rPr>
+          <w:rFonts w:ascii="Arial" w:cs="Arial" w:eastAsia="Arial" w:hAnsi="Arial"/>
+          <w:b w:val="false"/>
+          <w:bCs w:val="false"/>
+          <w:sz w:val="18"/>
+          <w:szCs w:val="18"/>
+        </w:rPr>
+        <w:t xml:space="preserve">More number methods	13</w:t>
+      </w:r>
+    </w:p>
+    <w:p>
+      <w:pPr>
+        <w:tabs>
+          <w:tab w:val="right" w:pos="9638" w:leader="dot"/>
+        </w:tabs>
         <w:spacing w:after="20" w:before="100"/>
         <w:ind w:left="0"/>
       </w:pPr>
@@ -880,7 +899,7 @@
           <w:sz w:val="19"/>
           <w:szCs w:val="19"/>
         </w:rPr>
-        <w:t xml:space="preserve">Chapter 6. Collections	14</w:t>
+        <w:t xml:space="preserve">Chapter 6. Collections	15</w:t>
       </w:r>
     </w:p>
     <w:p>
@@ -899,7 +918,7 @@
           <w:sz w:val="18"/>
           <w:szCs w:val="18"/>
         </w:rPr>
-        <w:t xml:space="preserve">The collection classes	14</w:t>
+        <w:t xml:space="preserve">The collection classes	15</w:t>
       </w:r>
     </w:p>
     <w:p>
@@ -918,7 +937,7 @@
           <w:sz w:val="18"/>
           <w:szCs w:val="18"/>
         </w:rPr>
-        <w:t xml:space="preserve">Protocol common to all collections	14</w:t>
+        <w:t xml:space="preserve">Protocol common to all collections	15</w:t>
       </w:r>
     </w:p>
     <w:p>
@@ -937,7 +956,7 @@
           <w:sz w:val="18"/>
           <w:szCs w:val="18"/>
         </w:rPr>
-        <w:t xml:space="preserve">Arrays and OrderedCollections	15</w:t>
+        <w:t xml:space="preserve">Arrays and OrderedCollections	16</w:t>
       </w:r>
     </w:p>
     <w:p>
@@ -956,7 +975,7 @@
           <w:sz w:val="18"/>
           <w:szCs w:val="18"/>
         </w:rPr>
-        <w:t xml:space="preserve">Dictionaries	15</w:t>
+        <w:t xml:space="preserve">Dictionaries	16</w:t>
       </w:r>
     </w:p>
     <w:p>
@@ -975,7 +994,7 @@
           <w:sz w:val="18"/>
           <w:szCs w:val="18"/>
         </w:rPr>
-        <w:t xml:space="preserve">Sets and Bags	16</w:t>
+        <w:t xml:space="preserve">Sets and Bags	17</w:t>
       </w:r>
     </w:p>
     <w:p>
@@ -994,7 +1013,26 @@
           <w:sz w:val="18"/>
           <w:szCs w:val="18"/>
         </w:rPr>
-        <w:t xml:space="preserve">Intervals	16</w:t>
+        <w:t xml:space="preserve">Intervals	17</w:t>
+      </w:r>
+    </w:p>
+    <w:p>
+      <w:pPr>
+        <w:tabs>
+          <w:tab w:val="right" w:pos="9638" w:leader="dot"/>
+        </w:tabs>
+        <w:spacing w:after="0" w:before="0"/>
+        <w:ind w:left="360"/>
+      </w:pPr>
+      <w:r>
+        <w:rPr>
+          <w:rFonts w:ascii="Arial" w:cs="Arial" w:eastAsia="Arial" w:hAnsi="Arial"/>
+          <w:b w:val="false"/>
+          <w:bCs w:val="false"/>
+          <w:sz w:val="18"/>
+          <w:szCs w:val="18"/>
+        </w:rPr>
+        <w:t xml:space="preserve">More collection methods	17</w:t>
       </w:r>
     </w:p>
     <w:p>
@@ -1013,7 +1051,7 @@
           <w:sz w:val="19"/>
           <w:szCs w:val="19"/>
         </w:rPr>
-        <w:t xml:space="preserve">Chapter 7. Strings, Symbols and Characters	17</w:t>
+        <w:t xml:space="preserve">Chapter 7. Strings, Symbols and Characters	19</w:t>
       </w:r>
     </w:p>
     <w:p>
@@ -1032,7 +1070,7 @@
           <w:sz w:val="18"/>
           <w:szCs w:val="18"/>
         </w:rPr>
-        <w:t xml:space="preserve">Strings	17</w:t>
+        <w:t xml:space="preserve">Strings	19</w:t>
       </w:r>
     </w:p>
     <w:p>
@@ -1051,7 +1089,7 @@
           <w:sz w:val="18"/>
           <w:szCs w:val="18"/>
         </w:rPr>
-        <w:t xml:space="preserve">Symbols	17</w:t>
+        <w:t xml:space="preserve">Symbols	19</w:t>
       </w:r>
     </w:p>
     <w:p>
@@ -1070,7 +1108,26 @@
           <w:sz w:val="18"/>
           <w:szCs w:val="18"/>
         </w:rPr>
-        <w:t xml:space="preserve">Characters	18</w:t>
+        <w:t xml:space="preserve">Characters	20</w:t>
+      </w:r>
+    </w:p>
+    <w:p>
+      <w:pPr>
+        <w:tabs>
+          <w:tab w:val="right" w:pos="9638" w:leader="dot"/>
+        </w:tabs>
+        <w:spacing w:after="0" w:before="0"/>
+        <w:ind w:left="360"/>
+      </w:pPr>
+      <w:r>
+        <w:rPr>
+          <w:rFonts w:ascii="Arial" w:cs="Arial" w:eastAsia="Arial" w:hAnsi="Arial"/>
+          <w:b w:val="false"/>
+          <w:bCs w:val="false"/>
+          <w:sz w:val="18"/>
+          <w:szCs w:val="18"/>
+        </w:rPr>
+        <w:t xml:space="preserve">More string methods	20</w:t>
       </w:r>
     </w:p>
     <w:p>
@@ -1089,7 +1146,7 @@
           <w:sz w:val="19"/>
           <w:szCs w:val="19"/>
         </w:rPr>
-        <w:t xml:space="preserve">Chapter 8. Streams and the Transcript	19</w:t>
+        <w:t xml:space="preserve">Chapter 8. Streams and the Transcript	21</w:t>
       </w:r>
     </w:p>
     <w:p>
@@ -1108,7 +1165,7 @@
           <w:sz w:val="18"/>
           <w:szCs w:val="18"/>
         </w:rPr>
-        <w:t xml:space="preserve">The Transcript	19</w:t>
+        <w:t xml:space="preserve">The Transcript	21</w:t>
       </w:r>
     </w:p>
     <w:p>
@@ -1127,7 +1184,7 @@
           <w:sz w:val="18"/>
           <w:szCs w:val="18"/>
         </w:rPr>
-        <w:t xml:space="preserve">Read streams	19</w:t>
+        <w:t xml:space="preserve">Read streams	21</w:t>
       </w:r>
     </w:p>
     <w:p>
@@ -1146,7 +1203,7 @@
           <w:sz w:val="18"/>
           <w:szCs w:val="18"/>
         </w:rPr>
-        <w:t xml:space="preserve">Write streams	19</w:t>
+        <w:t xml:space="preserve">Write streams	21</w:t>
       </w:r>
     </w:p>
     <w:p>
@@ -1165,7 +1222,7 @@
           <w:sz w:val="18"/>
           <w:szCs w:val="18"/>
         </w:rPr>
-        <w:t xml:space="preserve">Standard input	19</w:t>
+        <w:t xml:space="preserve">Standard input	21</w:t>
       </w:r>
     </w:p>
     <w:p>
@@ -1184,7 +1241,7 @@
           <w:sz w:val="18"/>
           <w:szCs w:val="18"/>
         </w:rPr>
-        <w:t xml:space="preserve">Files	20</w:t>
+        <w:t xml:space="preserve">Files	22</w:t>
       </w:r>
     </w:p>
     <w:p>
@@ -1203,7 +1260,26 @@
           <w:sz w:val="18"/>
           <w:szCs w:val="18"/>
         </w:rPr>
-        <w:t xml:space="preserve">Date and Time	20</w:t>
+        <w:t xml:space="preserve">Date and Time	22</w:t>
+      </w:r>
+    </w:p>
+    <w:p>
+      <w:pPr>
+        <w:tabs>
+          <w:tab w:val="right" w:pos="9638" w:leader="dot"/>
+        </w:tabs>
+        <w:spacing w:after="0" w:before="0"/>
+        <w:ind w:left="360"/>
+      </w:pPr>
+      <w:r>
+        <w:rPr>
+          <w:rFonts w:ascii="Arial" w:cs="Arial" w:eastAsia="Arial" w:hAnsi="Arial"/>
+          <w:b w:val="false"/>
+          <w:bCs w:val="false"/>
+          <w:sz w:val="18"/>
+          <w:szCs w:val="18"/>
+        </w:rPr>
+        <w:t xml:space="preserve">More stream methods	23</w:t>
       </w:r>
     </w:p>
     <w:p>
@@ -1222,7 +1298,7 @@
           <w:sz w:val="19"/>
           <w:szCs w:val="19"/>
         </w:rPr>
-        <w:t xml:space="preserve">Chapter 9. Exceptions	22</w:t>
+        <w:t xml:space="preserve">Chapter 9. Exceptions	24</w:t>
       </w:r>
     </w:p>
     <w:p>
@@ -1241,7 +1317,7 @@
           <w:sz w:val="18"/>
           <w:szCs w:val="18"/>
         </w:rPr>
-        <w:t xml:space="preserve">Handling	22</w:t>
+        <w:t xml:space="preserve">Handling	24</w:t>
       </w:r>
     </w:p>
     <w:p>
@@ -1260,7 +1336,7 @@
           <w:sz w:val="18"/>
           <w:szCs w:val="18"/>
         </w:rPr>
-        <w:t xml:space="preserve">Messages understood by an exception	22</w:t>
+        <w:t xml:space="preserve">Messages understood by an exception	24</w:t>
       </w:r>
     </w:p>
     <w:p>
@@ -1279,7 +1355,7 @@
           <w:sz w:val="18"/>
           <w:szCs w:val="18"/>
         </w:rPr>
-        <w:t xml:space="preserve">Signaling	22</w:t>
+        <w:t xml:space="preserve">Signaling	24</w:t>
       </w:r>
     </w:p>
     <w:p>
@@ -1298,7 +1374,7 @@
           <w:sz w:val="18"/>
           <w:szCs w:val="18"/>
         </w:rPr>
-        <w:t xml:space="preserve">Cleaning up	23</w:t>
+        <w:t xml:space="preserve">Cleaning up	25</w:t>
       </w:r>
     </w:p>
     <w:p>
@@ -1317,7 +1393,7 @@
           <w:sz w:val="18"/>
           <w:szCs w:val="18"/>
         </w:rPr>
-        <w:t xml:space="preserve">Your own exceptions	23</w:t>
+        <w:t xml:space="preserve">Your own exceptions	25</w:t>
       </w:r>
     </w:p>
     <w:p>
@@ -1336,7 +1412,7 @@
           <w:sz w:val="19"/>
           <w:szCs w:val="19"/>
         </w:rPr>
-        <w:t xml:space="preserve">Chapter 10. Reflection and the System	24</w:t>
+        <w:t xml:space="preserve">Chapter 10. Reflection and the System	26</w:t>
       </w:r>
     </w:p>
     <w:p>
@@ -1355,7 +1431,7 @@
           <w:sz w:val="18"/>
           <w:szCs w:val="18"/>
         </w:rPr>
-        <w:t xml:space="preserve">Asking about objects	24</w:t>
+        <w:t xml:space="preserve">Asking about objects	26</w:t>
       </w:r>
     </w:p>
     <w:p>
@@ -1374,7 +1450,7 @@
           <w:sz w:val="18"/>
           <w:szCs w:val="18"/>
         </w:rPr>
-        <w:t xml:space="preserve">Asking about classes	24</w:t>
+        <w:t xml:space="preserve">Asking about classes	26</w:t>
       </w:r>
     </w:p>
     <w:p>
@@ -1393,7 +1469,7 @@
           <w:sz w:val="18"/>
           <w:szCs w:val="18"/>
         </w:rPr>
-        <w:t xml:space="preserve">The Smalltalk dictionary	24</w:t>
+        <w:t xml:space="preserve">The Smalltalk dictionary	26</w:t>
       </w:r>
     </w:p>
     <w:p>
@@ -1412,7 +1488,7 @@
           <w:sz w:val="19"/>
           <w:szCs w:val="19"/>
         </w:rPr>
-        <w:t xml:space="preserve">Chapter 11. Errors and Traces	26</w:t>
+        <w:t xml:space="preserve">Chapter 11. Errors and Traces	28</w:t>
       </w:r>
     </w:p>
     <w:p>
@@ -1431,7 +1507,7 @@
           <w:sz w:val="18"/>
           <w:szCs w:val="18"/>
         </w:rPr>
-        <w:t xml:space="preserve">Unhandled errors	26</w:t>
+        <w:t xml:space="preserve">Unhandled errors	28</w:t>
       </w:r>
     </w:p>
     <w:p>
@@ -1450,7 +1526,7 @@
           <w:sz w:val="18"/>
           <w:szCs w:val="18"/>
         </w:rPr>
-        <w:t xml:space="preserve">Common messages	26</w:t>
+        <w:t xml:space="preserve">Common messages	28</w:t>
       </w:r>
     </w:p>
     <w:p>
@@ -1469,7 +1545,7 @@
           <w:sz w:val="18"/>
           <w:szCs w:val="18"/>
         </w:rPr>
-        <w:t xml:space="preserve">Parse errors	26</w:t>
+        <w:t xml:space="preserve">Parse errors	28</w:t>
       </w:r>
     </w:p>
     <w:p>
@@ -1488,7 +1564,7 @@
           <w:sz w:val="19"/>
           <w:szCs w:val="19"/>
         </w:rPr>
-        <w:t xml:space="preserve">Chapter 12. How Smalltalk/CREXX Works	27</w:t>
+        <w:t xml:space="preserve">Chapter 12. How Smalltalk/CREXX Works	29</w:t>
       </w:r>
     </w:p>
     <w:p>
@@ -1507,7 +1583,7 @@
           <w:sz w:val="18"/>
           <w:szCs w:val="18"/>
         </w:rPr>
-        <w:t xml:space="preserve">Objects	27</w:t>
+        <w:t xml:space="preserve">Objects	29</w:t>
       </w:r>
     </w:p>
     <w:p>
@@ -1526,7 +1602,7 @@
           <w:sz w:val="18"/>
           <w:szCs w:val="18"/>
         </w:rPr>
-        <w:t xml:space="preserve">Classes and methods	27</w:t>
+        <w:t xml:space="preserve">Classes and methods	29</w:t>
       </w:r>
     </w:p>
     <w:p>
@@ -1545,7 +1621,7 @@
           <w:sz w:val="18"/>
           <w:szCs w:val="18"/>
         </w:rPr>
-        <w:t xml:space="preserve">The resolver	27</w:t>
+        <w:t xml:space="preserve">The resolver	29</w:t>
       </w:r>
     </w:p>
     <w:p>
@@ -1564,7 +1640,7 @@
           <w:sz w:val="18"/>
           <w:szCs w:val="18"/>
         </w:rPr>
-        <w:t xml:space="preserve">The evaluator	27</w:t>
+        <w:t xml:space="preserve">The evaluator	29</w:t>
       </w:r>
     </w:p>
     <w:p>
@@ -1583,7 +1659,7 @@
           <w:sz w:val="18"/>
           <w:szCs w:val="18"/>
         </w:rPr>
-        <w:t xml:space="preserve">Primitives	27</w:t>
+        <w:t xml:space="preserve">Primitives	29</w:t>
       </w:r>
     </w:p>
     <w:p>
@@ -1602,7 +1678,7 @@
           <w:sz w:val="18"/>
           <w:szCs w:val="18"/>
         </w:rPr>
-        <w:t xml:space="preserve">Adding a primitive	27</w:t>
+        <w:t xml:space="preserve">Adding a primitive	29</w:t>
       </w:r>
     </w:p>
     <w:p>
@@ -1621,7 +1697,7 @@
           <w:sz w:val="18"/>
           <w:szCs w:val="18"/>
         </w:rPr>
-        <w:t xml:space="preserve">The build	28</w:t>
+        <w:t xml:space="preserve">The build	30</w:t>
       </w:r>
     </w:p>
     <w:p>
@@ -1640,7 +1716,7 @@
           <w:sz w:val="19"/>
           <w:szCs w:val="19"/>
         </w:rPr>
-        <w:t xml:space="preserve">Chapter 13. Restrictions and Known Problems	29</w:t>
+        <w:t xml:space="preserve">Chapter 13. Restrictions and Known Problems	31</w:t>
       </w:r>
     </w:p>
     <w:p>
@@ -1659,7 +1735,7 @@
           <w:sz w:val="19"/>
           <w:szCs w:val="19"/>
         </w:rPr>
-        <w:t xml:space="preserve">Appendix A. Command Summary	30</w:t>
+        <w:t xml:space="preserve">Appendix A. Command Summary	32</w:t>
       </w:r>
     </w:p>
     <w:p>
@@ -1678,7 +1754,7 @@
           <w:sz w:val="19"/>
           <w:szCs w:val="19"/>
         </w:rPr>
-        <w:t xml:space="preserve">Appendix B. Contents of the Repository	31</w:t>
+        <w:t xml:space="preserve">Appendix B. Contents of the Repository	33</w:t>
       </w:r>
     </w:p>
     <w:p>
@@ -1697,7 +1773,7 @@
           <w:sz w:val="19"/>
           <w:szCs w:val="19"/>
         </w:rPr>
-        <w:t xml:space="preserve">Appendix C. Class Hierarchy	32</w:t>
+        <w:t xml:space="preserve">Appendix C. Class Hierarchy	34</w:t>
       </w:r>
     </w:p>
     <w:p>
@@ -1716,7 +1792,7 @@
           <w:sz w:val="19"/>
           <w:szCs w:val="19"/>
         </w:rPr>
-        <w:t xml:space="preserve">Appendix D. Sample Programs	33</w:t>
+        <w:t xml:space="preserve">Appendix D. Sample Programs	35</w:t>
       </w:r>
     </w:p>
     <w:p>
@@ -13141,6 +13217,375 @@
     </w:p>
     <w:p>
       <w:pPr>
+        <w:pStyle w:val="Heading2"/>
+        <w:keepNext/>
+      </w:pPr>
+      <w:r>
+        <w:rPr>
+          <w:rFonts w:ascii="Arial" w:cs="Arial" w:eastAsia="Arial" w:hAnsi="Arial"/>
+          <w:b/>
+          <w:bCs/>
+          <w:sz w:val="24"/>
+          <w:szCs w:val="24"/>
+        </w:rPr>
+        <w:t xml:space="preserve">More number methods</w:t>
+      </w:r>
+    </w:p>
+    <w:p>
+      <w:pPr>
+        <w:spacing w:after="120" w:line="264"/>
+      </w:pPr>
+      <w:r>
+        <w:rPr>
+          <w:rFonts w:ascii="Arial" w:cs="Arial" w:eastAsia="Arial" w:hAnsi="Arial"/>
+          <w:sz w:val="20"/>
+          <w:szCs w:val="20"/>
+        </w:rPr>
+        <w:t xml:space="preserve">Integers understand binomial:, fibonacci, floorLog:, isPerfect, isSquare, isPowerOfTwo, highBit, lowBit, bitInvert, noMask: and anyMask:. digits answers the decimal digits as an Array and sumOfDigits adds them. romanNumeral (also printRoman) answers a Roman numeral as a String. Any number understands degreesToRadians, radiansToDegrees and min:max:. to:collect: is a short form of collecting over an Interval.</w:t>
+      </w:r>
+    </w:p>
+    <w:p>
+      <w:pPr>
+        <w:keepNext/>
+        <w:keepLines/>
+        <w:pBdr>
+          <w:top w:val="single" w:color="808080" w:sz="4"/>
+          <w:left w:val="single" w:color="808080" w:sz="4"/>
+          <w:right w:val="single" w:color="808080" w:sz="4"/>
+        </w:pBdr>
+        <w:shd w:fill="F2F2F2" w:color="auto" w:val="clear"/>
+        <w:spacing w:after="0" w:line="240"/>
+        <w:ind w:left="100" w:right="100"/>
+      </w:pPr>
+      <w:r>
+        <w:rPr>
+          <w:rFonts w:ascii="Courier New" w:cs="Courier New" w:eastAsia="Courier New" w:hAnsi="Courier New"/>
+          <w:sz w:val="17"/>
+          <w:szCs w:val="17"/>
+        </w:rPr>
+        <w:t xml:space="preserve">10 fibonacci printNl.</w:t>
+      </w:r>
+    </w:p>
+    <w:p>
+      <w:pPr>
+        <w:keepNext/>
+        <w:keepLines/>
+        <w:pBdr>
+          <w:left w:val="single" w:color="808080" w:sz="4"/>
+          <w:right w:val="single" w:color="808080" w:sz="4"/>
+        </w:pBdr>
+        <w:shd w:fill="F2F2F2" w:color="auto" w:val="clear"/>
+        <w:spacing w:after="0" w:line="240"/>
+        <w:ind w:left="100" w:right="100"/>
+      </w:pPr>
+      <w:r>
+        <w:rPr>
+          <w:rFonts w:ascii="Courier New" w:cs="Courier New" w:eastAsia="Courier New" w:hAnsi="Courier New"/>
+          <w:sz w:val="17"/>
+          <w:szCs w:val="17"/>
+        </w:rPr>
+        <w:t xml:space="preserve">(5 binomial: 2) printNl.</w:t>
+      </w:r>
+    </w:p>
+    <w:p>
+      <w:pPr>
+        <w:keepNext/>
+        <w:keepLines/>
+        <w:pBdr>
+          <w:left w:val="single" w:color="808080" w:sz="4"/>
+          <w:right w:val="single" w:color="808080" w:sz="4"/>
+        </w:pBdr>
+        <w:shd w:fill="F2F2F2" w:color="auto" w:val="clear"/>
+        <w:spacing w:after="0" w:line="240"/>
+        <w:ind w:left="100" w:right="100"/>
+      </w:pPr>
+      <w:r>
+        <w:rPr>
+          <w:rFonts w:ascii="Courier New" w:cs="Courier New" w:eastAsia="Courier New" w:hAnsi="Courier New"/>
+          <w:sz w:val="17"/>
+          <w:szCs w:val="17"/>
+        </w:rPr>
+        <w:t xml:space="preserve">1994 romanNumeral printNl.</w:t>
+      </w:r>
+    </w:p>
+    <w:p>
+      <w:pPr>
+        <w:keepNext/>
+        <w:keepLines/>
+        <w:pBdr>
+          <w:left w:val="single" w:color="808080" w:sz="4"/>
+          <w:right w:val="single" w:color="808080" w:sz="4"/>
+        </w:pBdr>
+        <w:shd w:fill="F2F2F2" w:color="auto" w:val="clear"/>
+        <w:spacing w:after="0" w:line="240"/>
+        <w:ind w:left="100" w:right="100"/>
+      </w:pPr>
+      <w:r>
+        <w:rPr>
+          <w:rFonts w:ascii="Courier New" w:cs="Courier New" w:eastAsia="Courier New" w:hAnsi="Courier New"/>
+          <w:sz w:val="17"/>
+          <w:szCs w:val="17"/>
+        </w:rPr>
+        <w:t xml:space="preserve">28 isPerfect printNl.</w:t>
+      </w:r>
+    </w:p>
+    <w:p>
+      <w:pPr>
+        <w:keepNext/>
+        <w:keepLines/>
+        <w:pBdr>
+          <w:left w:val="single" w:color="808080" w:sz="4"/>
+          <w:right w:val="single" w:color="808080" w:sz="4"/>
+        </w:pBdr>
+        <w:shd w:fill="F2F2F2" w:color="auto" w:val="clear"/>
+        <w:spacing w:after="0" w:line="240"/>
+        <w:ind w:left="100" w:right="100"/>
+      </w:pPr>
+      <w:r>
+        <w:rPr>
+          <w:rFonts w:ascii="Courier New" w:cs="Courier New" w:eastAsia="Courier New" w:hAnsi="Courier New"/>
+          <w:sz w:val="17"/>
+          <w:szCs w:val="17"/>
+        </w:rPr>
+        <w:t xml:space="preserve">12345 digits printNl.</w:t>
+      </w:r>
+    </w:p>
+    <w:p>
+      <w:pPr>
+        <w:keepNext/>
+        <w:keepLines/>
+        <w:pBdr>
+          <w:left w:val="single" w:color="808080" w:sz="4"/>
+          <w:right w:val="single" w:color="808080" w:sz="4"/>
+        </w:pBdr>
+        <w:shd w:fill="F2F2F2" w:color="auto" w:val="clear"/>
+        <w:spacing w:after="0" w:line="240"/>
+        <w:ind w:left="100" w:right="100"/>
+      </w:pPr>
+      <w:r>
+        <w:rPr>
+          <w:rFonts w:ascii="Courier New" w:cs="Courier New" w:eastAsia="Courier New" w:hAnsi="Courier New"/>
+          <w:sz w:val="17"/>
+          <w:szCs w:val="17"/>
+        </w:rPr>
+        <w:t xml:space="preserve">64 isPowerOfTwo printNl.</w:t>
+      </w:r>
+    </w:p>
+    <w:p>
+      <w:pPr>
+        <w:keepNext/>
+        <w:keepLines/>
+        <w:pBdr>
+          <w:left w:val="single" w:color="808080" w:sz="4"/>
+          <w:right w:val="single" w:color="808080" w:sz="4"/>
+        </w:pBdr>
+        <w:shd w:fill="F2F2F2" w:color="auto" w:val="clear"/>
+        <w:spacing w:after="0" w:line="240"/>
+        <w:ind w:left="100" w:right="100"/>
+      </w:pPr>
+      <w:r>
+        <w:rPr>
+          <w:rFonts w:ascii="Courier New" w:cs="Courier New" w:eastAsia="Courier New" w:hAnsi="Courier New"/>
+          <w:sz w:val="17"/>
+          <w:szCs w:val="17"/>
+        </w:rPr>
+        <w:t xml:space="preserve">(15 min: 1 max: 10) printNl.</w:t>
+      </w:r>
+    </w:p>
+    <w:p>
+      <w:pPr>
+        <w:keepNext/>
+        <w:keepLines/>
+        <w:pBdr>
+          <w:left w:val="single" w:color="808080" w:sz="4"/>
+          <w:right w:val="single" w:color="808080" w:sz="4"/>
+        </w:pBdr>
+        <w:shd w:fill="F2F2F2" w:color="auto" w:val="clear"/>
+        <w:spacing w:after="0" w:line="240"/>
+        <w:ind w:left="100" w:right="100"/>
+      </w:pPr>
+      <w:r>
+        <w:rPr>
+          <w:rFonts w:ascii="Courier New" w:cs="Courier New" w:eastAsia="Courier New" w:hAnsi="Courier New"/>
+          <w:sz w:val="17"/>
+          <w:szCs w:val="17"/>
+        </w:rPr>
+        <w:t xml:space="preserve"> </w:t>
+      </w:r>
+    </w:p>
+    <w:p>
+      <w:pPr>
+        <w:keepNext/>
+        <w:keepLines/>
+        <w:pBdr>
+          <w:left w:val="single" w:color="808080" w:sz="4"/>
+          <w:right w:val="single" w:color="808080" w:sz="4"/>
+        </w:pBdr>
+        <w:shd w:fill="F2F2F2" w:color="auto" w:val="clear"/>
+        <w:spacing w:after="0" w:line="240"/>
+        <w:ind w:left="100" w:right="100"/>
+      </w:pPr>
+      <w:r>
+        <w:rPr>
+          <w:rFonts w:ascii="Courier New" w:cs="Courier New" w:eastAsia="Courier New" w:hAnsi="Courier New"/>
+          <w:sz w:val="17"/>
+          <w:szCs w:val="17"/>
+        </w:rPr>
+        <w:t xml:space="preserve">55</w:t>
+      </w:r>
+    </w:p>
+    <w:p>
+      <w:pPr>
+        <w:keepNext/>
+        <w:keepLines/>
+        <w:pBdr>
+          <w:left w:val="single" w:color="808080" w:sz="4"/>
+          <w:right w:val="single" w:color="808080" w:sz="4"/>
+        </w:pBdr>
+        <w:shd w:fill="F2F2F2" w:color="auto" w:val="clear"/>
+        <w:spacing w:after="0" w:line="240"/>
+        <w:ind w:left="100" w:right="100"/>
+      </w:pPr>
+      <w:r>
+        <w:rPr>
+          <w:rFonts w:ascii="Courier New" w:cs="Courier New" w:eastAsia="Courier New" w:hAnsi="Courier New"/>
+          <w:sz w:val="17"/>
+          <w:szCs w:val="17"/>
+        </w:rPr>
+        <w:t xml:space="preserve">10</w:t>
+      </w:r>
+    </w:p>
+    <w:p>
+      <w:pPr>
+        <w:keepNext/>
+        <w:keepLines/>
+        <w:pBdr>
+          <w:left w:val="single" w:color="808080" w:sz="4"/>
+          <w:right w:val="single" w:color="808080" w:sz="4"/>
+        </w:pBdr>
+        <w:shd w:fill="F2F2F2" w:color="auto" w:val="clear"/>
+        <w:spacing w:after="0" w:line="240"/>
+        <w:ind w:left="100" w:right="100"/>
+      </w:pPr>
+      <w:r>
+        <w:rPr>
+          <w:rFonts w:ascii="Courier New" w:cs="Courier New" w:eastAsia="Courier New" w:hAnsi="Courier New"/>
+          <w:sz w:val="17"/>
+          <w:szCs w:val="17"/>
+        </w:rPr>
+        <w:t xml:space="preserve">'MCMXCIV'</w:t>
+      </w:r>
+    </w:p>
+    <w:p>
+      <w:pPr>
+        <w:keepNext/>
+        <w:keepLines/>
+        <w:pBdr>
+          <w:left w:val="single" w:color="808080" w:sz="4"/>
+          <w:right w:val="single" w:color="808080" w:sz="4"/>
+        </w:pBdr>
+        <w:shd w:fill="F2F2F2" w:color="auto" w:val="clear"/>
+        <w:spacing w:after="0" w:line="240"/>
+        <w:ind w:left="100" w:right="100"/>
+      </w:pPr>
+      <w:r>
+        <w:rPr>
+          <w:rFonts w:ascii="Courier New" w:cs="Courier New" w:eastAsia="Courier New" w:hAnsi="Courier New"/>
+          <w:sz w:val="17"/>
+          <w:szCs w:val="17"/>
+        </w:rPr>
+        <w:t xml:space="preserve">true</w:t>
+      </w:r>
+    </w:p>
+    <w:p>
+      <w:pPr>
+        <w:keepNext/>
+        <w:keepLines/>
+        <w:pBdr>
+          <w:left w:val="single" w:color="808080" w:sz="4"/>
+          <w:right w:val="single" w:color="808080" w:sz="4"/>
+        </w:pBdr>
+        <w:shd w:fill="F2F2F2" w:color="auto" w:val="clear"/>
+        <w:spacing w:after="0" w:line="240"/>
+        <w:ind w:left="100" w:right="100"/>
+      </w:pPr>
+      <w:r>
+        <w:rPr>
+          <w:rFonts w:ascii="Courier New" w:cs="Courier New" w:eastAsia="Courier New" w:hAnsi="Courier New"/>
+          <w:sz w:val="17"/>
+          <w:szCs w:val="17"/>
+        </w:rPr>
+        <w:t xml:space="preserve">(1 2 3 4 5 )</w:t>
+      </w:r>
+    </w:p>
+    <w:p>
+      <w:pPr>
+        <w:keepNext/>
+        <w:keepLines/>
+        <w:pBdr>
+          <w:left w:val="single" w:color="808080" w:sz="4"/>
+          <w:right w:val="single" w:color="808080" w:sz="4"/>
+        </w:pBdr>
+        <w:shd w:fill="F2F2F2" w:color="auto" w:val="clear"/>
+        <w:spacing w:after="0" w:line="240"/>
+        <w:ind w:left="100" w:right="100"/>
+      </w:pPr>
+      <w:r>
+        <w:rPr>
+          <w:rFonts w:ascii="Courier New" w:cs="Courier New" w:eastAsia="Courier New" w:hAnsi="Courier New"/>
+          <w:sz w:val="17"/>
+          <w:szCs w:val="17"/>
+        </w:rPr>
+        <w:t xml:space="preserve">true</w:t>
+      </w:r>
+    </w:p>
+    <w:p>
+      <w:pPr>
+        <w:keepNext w:val="false"/>
+        <w:keepLines/>
+        <w:pBdr>
+          <w:bottom w:val="single" w:color="808080" w:sz="4"/>
+          <w:left w:val="single" w:color="808080" w:sz="4"/>
+          <w:right w:val="single" w:color="808080" w:sz="4"/>
+        </w:pBdr>
+        <w:shd w:fill="F2F2F2" w:color="auto" w:val="clear"/>
+        <w:spacing w:after="0" w:line="240"/>
+        <w:ind w:left="100" w:right="100"/>
+      </w:pPr>
+      <w:r>
+        <w:rPr>
+          <w:rFonts w:ascii="Courier New" w:cs="Courier New" w:eastAsia="Courier New" w:hAnsi="Courier New"/>
+          <w:sz w:val="17"/>
+          <w:szCs w:val="17"/>
+        </w:rPr>
+        <w:t xml:space="preserve">10</w:t>
+      </w:r>
+    </w:p>
+    <w:p>
+      <w:pPr>
+        <w:spacing w:after="200" w:before="60"/>
+      </w:pPr>
+      <w:r>
+        <w:rPr>
+          <w:rFonts w:ascii="Arial" w:cs="Arial" w:eastAsia="Arial" w:hAnsi="Arial"/>
+          <w:b/>
+          <w:bCs/>
+          <w:sz w:val="18"/>
+          <w:szCs w:val="18"/>
+        </w:rPr>
+        <w:t xml:space="preserve">Figure 21. </w:t>
+      </w:r>
+      <w:r>
+        <w:rPr>
+          <w:rFonts w:ascii="Arial" w:cs="Arial" w:eastAsia="Arial" w:hAnsi="Arial"/>
+          <w:sz w:val="18"/>
+          <w:szCs w:val="18"/>
+        </w:rPr>
+        <w:t xml:space="preserve">More number methods</w:t>
+      </w:r>
+    </w:p>
+    <w:p>
+      <w:pPr>
         <w:pStyle w:val="Heading1"/>
         <w:pageBreakBefore/>
         <w:pBdr>
@@ -13849,7 +14294,7 @@
           <w:sz w:val="18"/>
           <w:szCs w:val="18"/>
         </w:rPr>
-        <w:t xml:space="preserve">Figure 21. </w:t>
+        <w:t xml:space="preserve">Figure 22. </w:t>
       </w:r>
       <w:r>
         <w:rPr>
@@ -14607,7 +15052,7 @@
           <w:sz w:val="18"/>
           <w:szCs w:val="18"/>
         </w:rPr>
-        <w:t xml:space="preserve">Figure 22. </w:t>
+        <w:t xml:space="preserve">Figure 23. </w:t>
       </w:r>
       <w:r>
         <w:rPr>
@@ -14947,7 +15392,7 @@
           <w:sz w:val="18"/>
           <w:szCs w:val="18"/>
         </w:rPr>
-        <w:t xml:space="preserve">Figure 23. </w:t>
+        <w:t xml:space="preserve">Figure 24. </w:t>
       </w:r>
       <w:r>
         <w:rPr>
@@ -15350,7 +15795,7 @@
           <w:sz w:val="18"/>
           <w:szCs w:val="18"/>
         </w:rPr>
-        <w:t xml:space="preserve">Figure 24. </w:t>
+        <w:t xml:space="preserve">Figure 25. </w:t>
       </w:r>
       <w:r>
         <w:rPr>
@@ -16051,7 +16496,7 @@
           <w:sz w:val="18"/>
           <w:szCs w:val="18"/>
         </w:rPr>
-        <w:t xml:space="preserve">Figure 25. </w:t>
+        <w:t xml:space="preserve">Figure 26. </w:t>
       </w:r>
       <w:r>
         <w:rPr>
@@ -16475,7 +16920,7 @@
           <w:sz w:val="18"/>
           <w:szCs w:val="18"/>
         </w:rPr>
-        <w:t xml:space="preserve">Figure 26. </w:t>
+        <w:t xml:space="preserve">Figure 27. </w:t>
       </w:r>
       <w:r>
         <w:rPr>
@@ -16831,7 +17276,7 @@
           <w:sz w:val="18"/>
           <w:szCs w:val="18"/>
         </w:rPr>
-        <w:t xml:space="preserve">Figure 27. </w:t>
+        <w:t xml:space="preserve">Figure 28. </w:t>
       </w:r>
       <w:r>
         <w:rPr>
@@ -16869,6 +17314,543 @@
           <w:szCs w:val="20"/>
         </w:rPr>
         <w:t xml:space="preserve">1 to: 5 and 10 to: 1 by: -3 create Intervals. An Interval is a collection: it understands do:, collect:, select:, inject:into:, reverse, asArray and the rest. It prints like an Array.</w:t>
+      </w:r>
+    </w:p>
+    <w:p>
+      <w:pPr>
+        <w:pStyle w:val="Heading2"/>
+        <w:keepNext/>
+      </w:pPr>
+      <w:r>
+        <w:rPr>
+          <w:rFonts w:ascii="Arial" w:cs="Arial" w:eastAsia="Arial" w:hAnsi="Arial"/>
+          <w:b/>
+          <w:bCs/>
+          <w:sz w:val="24"/>
+          <w:szCs w:val="24"/>
+        </w:rPr>
+        <w:t xml:space="preserve">More collection methods</w:t>
+      </w:r>
+    </w:p>
+    <w:p>
+      <w:pPr>
+        <w:spacing w:after="120" w:line="264"/>
+      </w:pPr>
+      <w:r>
+        <w:rPr>
+          <w:rFonts w:ascii="Arial" w:cs="Arial" w:eastAsia="Arial" w:hAnsi="Arial"/>
+          <w:sz w:val="20"/>
+          <w:szCs w:val="20"/>
+        </w:rPr>
+        <w:t xml:space="preserve">Sequenceable collections add copyUpTo:, copyAfter:, copyUpToLast:, copyAfterLast:, lastIndexOf:, take:, drop:, fourth, middle, withIndexDo:, withIndexCollect:, pairsDo:, isSorted, atRandom, shuffled, zip:, cumulative, flatten, transpose, cartesianProduct:, combinations: and permutations. Every collection understands partition:, groupBy:, flatCollect:, detectSum:, detect:ifFound:, isSubsetOf:, product, range, variance, stdev, mode, median and asDictionary. An OrderedCollection answers removeFirst: and removeLast: for several elements at once. A Set offers union:, intersect:, difference: and symmetricDifference:, written also as |, &amp; and -. A Dictionary offers keysSorted, merge:, invert, removeKeys: and associationAt:.</w:t>
+      </w:r>
+    </w:p>
+    <w:p>
+      <w:pPr>
+        <w:keepNext/>
+        <w:keepLines/>
+        <w:pBdr>
+          <w:top w:val="single" w:color="808080" w:sz="4"/>
+          <w:left w:val="single" w:color="808080" w:sz="4"/>
+          <w:right w:val="single" w:color="808080" w:sz="4"/>
+        </w:pBdr>
+        <w:shd w:fill="F2F2F2" w:color="auto" w:val="clear"/>
+        <w:spacing w:after="0" w:line="240"/>
+        <w:ind w:left="100" w:right="100"/>
+      </w:pPr>
+      <w:r>
+        <w:rPr>
+          <w:rFonts w:ascii="Courier New" w:cs="Courier New" w:eastAsia="Courier New" w:hAnsi="Courier New"/>
+          <w:sz w:val="17"/>
+          <w:szCs w:val="17"/>
+        </w:rPr>
+        <w:t xml:space="preserve">(#(1 2 3 4 5) take: 2) printNl.</w:t>
+      </w:r>
+    </w:p>
+    <w:p>
+      <w:pPr>
+        <w:keepNext/>
+        <w:keepLines/>
+        <w:pBdr>
+          <w:left w:val="single" w:color="808080" w:sz="4"/>
+          <w:right w:val="single" w:color="808080" w:sz="4"/>
+        </w:pBdr>
+        <w:shd w:fill="F2F2F2" w:color="auto" w:val="clear"/>
+        <w:spacing w:after="0" w:line="240"/>
+        <w:ind w:left="100" w:right="100"/>
+      </w:pPr>
+      <w:r>
+        <w:rPr>
+          <w:rFonts w:ascii="Courier New" w:cs="Courier New" w:eastAsia="Courier New" w:hAnsi="Courier New"/>
+          <w:sz w:val="17"/>
+          <w:szCs w:val="17"/>
+        </w:rPr>
+        <w:t xml:space="preserve">(#(1 2 3 4 5) partition: [:x | x even]) printNl.</w:t>
+      </w:r>
+    </w:p>
+    <w:p>
+      <w:pPr>
+        <w:keepNext/>
+        <w:keepLines/>
+        <w:pBdr>
+          <w:left w:val="single" w:color="808080" w:sz="4"/>
+          <w:right w:val="single" w:color="808080" w:sz="4"/>
+        </w:pBdr>
+        <w:shd w:fill="F2F2F2" w:color="auto" w:val="clear"/>
+        <w:spacing w:after="0" w:line="240"/>
+        <w:ind w:left="100" w:right="100"/>
+      </w:pPr>
+      <w:r>
+        <w:rPr>
+          <w:rFonts w:ascii="Courier New" w:cs="Courier New" w:eastAsia="Courier New" w:hAnsi="Courier New"/>
+          <w:sz w:val="17"/>
+          <w:szCs w:val="17"/>
+        </w:rPr>
+        <w:t xml:space="preserve">(#(1 2 3) zip: #(4 5 6)) printNl.</w:t>
+      </w:r>
+    </w:p>
+    <w:p>
+      <w:pPr>
+        <w:keepNext/>
+        <w:keepLines/>
+        <w:pBdr>
+          <w:left w:val="single" w:color="808080" w:sz="4"/>
+          <w:right w:val="single" w:color="808080" w:sz="4"/>
+        </w:pBdr>
+        <w:shd w:fill="F2F2F2" w:color="auto" w:val="clear"/>
+        <w:spacing w:after="0" w:line="240"/>
+        <w:ind w:left="100" w:right="100"/>
+      </w:pPr>
+      <w:r>
+        <w:rPr>
+          <w:rFonts w:ascii="Courier New" w:cs="Courier New" w:eastAsia="Courier New" w:hAnsi="Courier New"/>
+          <w:sz w:val="17"/>
+          <w:szCs w:val="17"/>
+        </w:rPr>
+        <w:t xml:space="preserve">#(1 2 3 4) cumulative printNl.</w:t>
+      </w:r>
+    </w:p>
+    <w:p>
+      <w:pPr>
+        <w:keepNext/>
+        <w:keepLines/>
+        <w:pBdr>
+          <w:left w:val="single" w:color="808080" w:sz="4"/>
+          <w:right w:val="single" w:color="808080" w:sz="4"/>
+        </w:pBdr>
+        <w:shd w:fill="F2F2F2" w:color="auto" w:val="clear"/>
+        <w:spacing w:after="0" w:line="240"/>
+        <w:ind w:left="100" w:right="100"/>
+      </w:pPr>
+      <w:r>
+        <w:rPr>
+          <w:rFonts w:ascii="Courier New" w:cs="Courier New" w:eastAsia="Courier New" w:hAnsi="Courier New"/>
+          <w:sz w:val="17"/>
+          <w:szCs w:val="17"/>
+        </w:rPr>
+        <w:t xml:space="preserve">(#(1 2 3 4) combinations: 2) printNl.</w:t>
+      </w:r>
+    </w:p>
+    <w:p>
+      <w:pPr>
+        <w:keepNext/>
+        <w:keepLines/>
+        <w:pBdr>
+          <w:left w:val="single" w:color="808080" w:sz="4"/>
+          <w:right w:val="single" w:color="808080" w:sz="4"/>
+        </w:pBdr>
+        <w:shd w:fill="F2F2F2" w:color="auto" w:val="clear"/>
+        <w:spacing w:after="0" w:line="240"/>
+        <w:ind w:left="100" w:right="100"/>
+      </w:pPr>
+      <w:r>
+        <w:rPr>
+          <w:rFonts w:ascii="Courier New" w:cs="Courier New" w:eastAsia="Courier New" w:hAnsi="Courier New"/>
+          <w:sz w:val="17"/>
+          <w:szCs w:val="17"/>
+        </w:rPr>
+        <w:t xml:space="preserve">#(1 2 3) permutations size printNl.</w:t>
+      </w:r>
+    </w:p>
+    <w:p>
+      <w:pPr>
+        <w:keepNext/>
+        <w:keepLines/>
+        <w:pBdr>
+          <w:left w:val="single" w:color="808080" w:sz="4"/>
+          <w:right w:val="single" w:color="808080" w:sz="4"/>
+        </w:pBdr>
+        <w:shd w:fill="F2F2F2" w:color="auto" w:val="clear"/>
+        <w:spacing w:after="0" w:line="240"/>
+        <w:ind w:left="100" w:right="100"/>
+      </w:pPr>
+      <w:r>
+        <w:rPr>
+          <w:rFonts w:ascii="Courier New" w:cs="Courier New" w:eastAsia="Courier New" w:hAnsi="Courier New"/>
+          <w:sz w:val="17"/>
+          <w:szCs w:val="17"/>
+        </w:rPr>
+        <w:t xml:space="preserve">#(3 1 2) median printNl.</w:t>
+      </w:r>
+    </w:p>
+    <w:p>
+      <w:pPr>
+        <w:keepNext/>
+        <w:keepLines/>
+        <w:pBdr>
+          <w:left w:val="single" w:color="808080" w:sz="4"/>
+          <w:right w:val="single" w:color="808080" w:sz="4"/>
+        </w:pBdr>
+        <w:shd w:fill="F2F2F2" w:color="auto" w:val="clear"/>
+        <w:spacing w:after="0" w:line="240"/>
+        <w:ind w:left="100" w:right="100"/>
+      </w:pPr>
+      <w:r>
+        <w:rPr>
+          <w:rFonts w:ascii="Courier New" w:cs="Courier New" w:eastAsia="Courier New" w:hAnsi="Courier New"/>
+          <w:sz w:val="17"/>
+          <w:szCs w:val="17"/>
+        </w:rPr>
+        <w:t xml:space="preserve">#(1 #(2 #(3)) 4) flatten printNl.</w:t>
+      </w:r>
+    </w:p>
+    <w:p>
+      <w:pPr>
+        <w:keepNext/>
+        <w:keepLines/>
+        <w:pBdr>
+          <w:left w:val="single" w:color="808080" w:sz="4"/>
+          <w:right w:val="single" w:color="808080" w:sz="4"/>
+        </w:pBdr>
+        <w:shd w:fill="F2F2F2" w:color="auto" w:val="clear"/>
+        <w:spacing w:after="0" w:line="240"/>
+        <w:ind w:left="100" w:right="100"/>
+      </w:pPr>
+      <w:r>
+        <w:rPr>
+          <w:rFonts w:ascii="Courier New" w:cs="Courier New" w:eastAsia="Courier New" w:hAnsi="Courier New"/>
+          <w:sz w:val="17"/>
+          <w:szCs w:val="17"/>
+        </w:rPr>
+        <w:t xml:space="preserve">| a b |</w:t>
+      </w:r>
+    </w:p>
+    <w:p>
+      <w:pPr>
+        <w:keepNext/>
+        <w:keepLines/>
+        <w:pBdr>
+          <w:left w:val="single" w:color="808080" w:sz="4"/>
+          <w:right w:val="single" w:color="808080" w:sz="4"/>
+        </w:pBdr>
+        <w:shd w:fill="F2F2F2" w:color="auto" w:val="clear"/>
+        <w:spacing w:after="0" w:line="240"/>
+        <w:ind w:left="100" w:right="100"/>
+      </w:pPr>
+      <w:r>
+        <w:rPr>
+          <w:rFonts w:ascii="Courier New" w:cs="Courier New" w:eastAsia="Courier New" w:hAnsi="Courier New"/>
+          <w:sz w:val="17"/>
+          <w:szCs w:val="17"/>
+        </w:rPr>
+        <w:t xml:space="preserve">a := Set withAll: #(1 2 3). b := Set withAll: #(2 3 4).</w:t>
+      </w:r>
+    </w:p>
+    <w:p>
+      <w:pPr>
+        <w:keepNext/>
+        <w:keepLines/>
+        <w:pBdr>
+          <w:left w:val="single" w:color="808080" w:sz="4"/>
+          <w:right w:val="single" w:color="808080" w:sz="4"/>
+        </w:pBdr>
+        <w:shd w:fill="F2F2F2" w:color="auto" w:val="clear"/>
+        <w:spacing w:after="0" w:line="240"/>
+        <w:ind w:left="100" w:right="100"/>
+      </w:pPr>
+      <w:r>
+        <w:rPr>
+          <w:rFonts w:ascii="Courier New" w:cs="Courier New" w:eastAsia="Courier New" w:hAnsi="Courier New"/>
+          <w:sz w:val="17"/>
+          <w:szCs w:val="17"/>
+        </w:rPr>
+        <w:t xml:space="preserve">(a &amp; b) size printNl.</w:t>
+      </w:r>
+    </w:p>
+    <w:p>
+      <w:pPr>
+        <w:keepNext/>
+        <w:keepLines/>
+        <w:pBdr>
+          <w:left w:val="single" w:color="808080" w:sz="4"/>
+          <w:right w:val="single" w:color="808080" w:sz="4"/>
+        </w:pBdr>
+        <w:shd w:fill="F2F2F2" w:color="auto" w:val="clear"/>
+        <w:spacing w:after="0" w:line="240"/>
+        <w:ind w:left="100" w:right="100"/>
+      </w:pPr>
+      <w:r>
+        <w:rPr>
+          <w:rFonts w:ascii="Courier New" w:cs="Courier New" w:eastAsia="Courier New" w:hAnsi="Courier New"/>
+          <w:sz w:val="17"/>
+          <w:szCs w:val="17"/>
+        </w:rPr>
+        <w:t xml:space="preserve">(a - b) printNl.</w:t>
+      </w:r>
+    </w:p>
+    <w:p>
+      <w:pPr>
+        <w:keepNext/>
+        <w:keepLines/>
+        <w:pBdr>
+          <w:left w:val="single" w:color="808080" w:sz="4"/>
+          <w:right w:val="single" w:color="808080" w:sz="4"/>
+        </w:pBdr>
+        <w:shd w:fill="F2F2F2" w:color="auto" w:val="clear"/>
+        <w:spacing w:after="0" w:line="240"/>
+        <w:ind w:left="100" w:right="100"/>
+      </w:pPr>
+      <w:r>
+        <w:rPr>
+          <w:rFonts w:ascii="Courier New" w:cs="Courier New" w:eastAsia="Courier New" w:hAnsi="Courier New"/>
+          <w:sz w:val="17"/>
+          <w:szCs w:val="17"/>
+        </w:rPr>
+        <w:t xml:space="preserve"> </w:t>
+      </w:r>
+    </w:p>
+    <w:p>
+      <w:pPr>
+        <w:keepNext/>
+        <w:keepLines/>
+        <w:pBdr>
+          <w:left w:val="single" w:color="808080" w:sz="4"/>
+          <w:right w:val="single" w:color="808080" w:sz="4"/>
+        </w:pBdr>
+        <w:shd w:fill="F2F2F2" w:color="auto" w:val="clear"/>
+        <w:spacing w:after="0" w:line="240"/>
+        <w:ind w:left="100" w:right="100"/>
+      </w:pPr>
+      <w:r>
+        <w:rPr>
+          <w:rFonts w:ascii="Courier New" w:cs="Courier New" w:eastAsia="Courier New" w:hAnsi="Courier New"/>
+          <w:sz w:val="17"/>
+          <w:szCs w:val="17"/>
+        </w:rPr>
+        <w:t xml:space="preserve">(1 2 )</w:t>
+      </w:r>
+    </w:p>
+    <w:p>
+      <w:pPr>
+        <w:keepNext/>
+        <w:keepLines/>
+        <w:pBdr>
+          <w:left w:val="single" w:color="808080" w:sz="4"/>
+          <w:right w:val="single" w:color="808080" w:sz="4"/>
+        </w:pBdr>
+        <w:shd w:fill="F2F2F2" w:color="auto" w:val="clear"/>
+        <w:spacing w:after="0" w:line="240"/>
+        <w:ind w:left="100" w:right="100"/>
+      </w:pPr>
+      <w:r>
+        <w:rPr>
+          <w:rFonts w:ascii="Courier New" w:cs="Courier New" w:eastAsia="Courier New" w:hAnsi="Courier New"/>
+          <w:sz w:val="17"/>
+          <w:szCs w:val="17"/>
+        </w:rPr>
+        <w:t xml:space="preserve">((2 4 ) (1 3 5 ) )</w:t>
+      </w:r>
+    </w:p>
+    <w:p>
+      <w:pPr>
+        <w:keepNext/>
+        <w:keepLines/>
+        <w:pBdr>
+          <w:left w:val="single" w:color="808080" w:sz="4"/>
+          <w:right w:val="single" w:color="808080" w:sz="4"/>
+        </w:pBdr>
+        <w:shd w:fill="F2F2F2" w:color="auto" w:val="clear"/>
+        <w:spacing w:after="0" w:line="240"/>
+        <w:ind w:left="100" w:right="100"/>
+      </w:pPr>
+      <w:r>
+        <w:rPr>
+          <w:rFonts w:ascii="Courier New" w:cs="Courier New" w:eastAsia="Courier New" w:hAnsi="Courier New"/>
+          <w:sz w:val="17"/>
+          <w:szCs w:val="17"/>
+        </w:rPr>
+        <w:t xml:space="preserve">((1 4 ) (2 5 ) (3 6 ) )</w:t>
+      </w:r>
+    </w:p>
+    <w:p>
+      <w:pPr>
+        <w:keepNext/>
+        <w:keepLines/>
+        <w:pBdr>
+          <w:left w:val="single" w:color="808080" w:sz="4"/>
+          <w:right w:val="single" w:color="808080" w:sz="4"/>
+        </w:pBdr>
+        <w:shd w:fill="F2F2F2" w:color="auto" w:val="clear"/>
+        <w:spacing w:after="0" w:line="240"/>
+        <w:ind w:left="100" w:right="100"/>
+      </w:pPr>
+      <w:r>
+        <w:rPr>
+          <w:rFonts w:ascii="Courier New" w:cs="Courier New" w:eastAsia="Courier New" w:hAnsi="Courier New"/>
+          <w:sz w:val="17"/>
+          <w:szCs w:val="17"/>
+        </w:rPr>
+        <w:t xml:space="preserve">(1 3 6 10 )</w:t>
+      </w:r>
+    </w:p>
+    <w:p>
+      <w:pPr>
+        <w:keepNext/>
+        <w:keepLines/>
+        <w:pBdr>
+          <w:left w:val="single" w:color="808080" w:sz="4"/>
+          <w:right w:val="single" w:color="808080" w:sz="4"/>
+        </w:pBdr>
+        <w:shd w:fill="F2F2F2" w:color="auto" w:val="clear"/>
+        <w:spacing w:after="0" w:line="240"/>
+        <w:ind w:left="100" w:right="100"/>
+      </w:pPr>
+      <w:r>
+        <w:rPr>
+          <w:rFonts w:ascii="Courier New" w:cs="Courier New" w:eastAsia="Courier New" w:hAnsi="Courier New"/>
+          <w:sz w:val="17"/>
+          <w:szCs w:val="17"/>
+        </w:rPr>
+        <w:t xml:space="preserve">((1 2 ) (1 3 ) (1 4 ) (2 3 ) (2 4 ) (3 4 ) )</w:t>
+      </w:r>
+    </w:p>
+    <w:p>
+      <w:pPr>
+        <w:keepNext/>
+        <w:keepLines/>
+        <w:pBdr>
+          <w:left w:val="single" w:color="808080" w:sz="4"/>
+          <w:right w:val="single" w:color="808080" w:sz="4"/>
+        </w:pBdr>
+        <w:shd w:fill="F2F2F2" w:color="auto" w:val="clear"/>
+        <w:spacing w:after="0" w:line="240"/>
+        <w:ind w:left="100" w:right="100"/>
+      </w:pPr>
+      <w:r>
+        <w:rPr>
+          <w:rFonts w:ascii="Courier New" w:cs="Courier New" w:eastAsia="Courier New" w:hAnsi="Courier New"/>
+          <w:sz w:val="17"/>
+          <w:szCs w:val="17"/>
+        </w:rPr>
+        <w:t xml:space="preserve">6</w:t>
+      </w:r>
+    </w:p>
+    <w:p>
+      <w:pPr>
+        <w:keepNext/>
+        <w:keepLines/>
+        <w:pBdr>
+          <w:left w:val="single" w:color="808080" w:sz="4"/>
+          <w:right w:val="single" w:color="808080" w:sz="4"/>
+        </w:pBdr>
+        <w:shd w:fill="F2F2F2" w:color="auto" w:val="clear"/>
+        <w:spacing w:after="0" w:line="240"/>
+        <w:ind w:left="100" w:right="100"/>
+      </w:pPr>
+      <w:r>
+        <w:rPr>
+          <w:rFonts w:ascii="Courier New" w:cs="Courier New" w:eastAsia="Courier New" w:hAnsi="Courier New"/>
+          <w:sz w:val="17"/>
+          <w:szCs w:val="17"/>
+        </w:rPr>
+        <w:t xml:space="preserve">2</w:t>
+      </w:r>
+    </w:p>
+    <w:p>
+      <w:pPr>
+        <w:keepNext/>
+        <w:keepLines/>
+        <w:pBdr>
+          <w:left w:val="single" w:color="808080" w:sz="4"/>
+          <w:right w:val="single" w:color="808080" w:sz="4"/>
+        </w:pBdr>
+        <w:shd w:fill="F2F2F2" w:color="auto" w:val="clear"/>
+        <w:spacing w:after="0" w:line="240"/>
+        <w:ind w:left="100" w:right="100"/>
+      </w:pPr>
+      <w:r>
+        <w:rPr>
+          <w:rFonts w:ascii="Courier New" w:cs="Courier New" w:eastAsia="Courier New" w:hAnsi="Courier New"/>
+          <w:sz w:val="17"/>
+          <w:szCs w:val="17"/>
+        </w:rPr>
+        <w:t xml:space="preserve">(1 2 3 4 )</w:t>
+      </w:r>
+    </w:p>
+    <w:p>
+      <w:pPr>
+        <w:keepNext/>
+        <w:keepLines/>
+        <w:pBdr>
+          <w:left w:val="single" w:color="808080" w:sz="4"/>
+          <w:right w:val="single" w:color="808080" w:sz="4"/>
+        </w:pBdr>
+        <w:shd w:fill="F2F2F2" w:color="auto" w:val="clear"/>
+        <w:spacing w:after="0" w:line="240"/>
+        <w:ind w:left="100" w:right="100"/>
+      </w:pPr>
+      <w:r>
+        <w:rPr>
+          <w:rFonts w:ascii="Courier New" w:cs="Courier New" w:eastAsia="Courier New" w:hAnsi="Courier New"/>
+          <w:sz w:val="17"/>
+          <w:szCs w:val="17"/>
+        </w:rPr>
+        <w:t xml:space="preserve">2</w:t>
+      </w:r>
+    </w:p>
+    <w:p>
+      <w:pPr>
+        <w:keepNext w:val="false"/>
+        <w:keepLines/>
+        <w:pBdr>
+          <w:bottom w:val="single" w:color="808080" w:sz="4"/>
+          <w:left w:val="single" w:color="808080" w:sz="4"/>
+          <w:right w:val="single" w:color="808080" w:sz="4"/>
+        </w:pBdr>
+        <w:shd w:fill="F2F2F2" w:color="auto" w:val="clear"/>
+        <w:spacing w:after="0" w:line="240"/>
+        <w:ind w:left="100" w:right="100"/>
+      </w:pPr>
+      <w:r>
+        <w:rPr>
+          <w:rFonts w:ascii="Courier New" w:cs="Courier New" w:eastAsia="Courier New" w:hAnsi="Courier New"/>
+          <w:sz w:val="17"/>
+          <w:szCs w:val="17"/>
+        </w:rPr>
+        <w:t xml:space="preserve">Set (1 )</w:t>
+      </w:r>
+    </w:p>
+    <w:p>
+      <w:pPr>
+        <w:spacing w:after="200" w:before="60"/>
+      </w:pPr>
+      <w:r>
+        <w:rPr>
+          <w:rFonts w:ascii="Arial" w:cs="Arial" w:eastAsia="Arial" w:hAnsi="Arial"/>
+          <w:b/>
+          <w:bCs/>
+          <w:sz w:val="18"/>
+          <w:szCs w:val="18"/>
+        </w:rPr>
+        <w:t xml:space="preserve">Figure 29. </w:t>
+      </w:r>
+      <w:r>
+        <w:rPr>
+          <w:rFonts w:ascii="Arial" w:cs="Arial" w:eastAsia="Arial" w:hAnsi="Arial"/>
+          <w:sz w:val="18"/>
+          <w:szCs w:val="18"/>
+        </w:rPr>
+        <w:t xml:space="preserve">Working with groups of elements</w:t>
       </w:r>
     </w:p>
     <w:p>
@@ -17721,7 +18703,7 @@
           <w:sz w:val="18"/>
           <w:szCs w:val="18"/>
         </w:rPr>
-        <w:t xml:space="preserve">Figure 28. </w:t>
+        <w:t xml:space="preserve">Figure 30. </w:t>
       </w:r>
       <w:r>
         <w:rPr>
@@ -18229,7 +19211,7 @@
           <w:sz w:val="18"/>
           <w:szCs w:val="18"/>
         </w:rPr>
-        <w:t xml:space="preserve">Figure 29. </w:t>
+        <w:t xml:space="preserve">Figure 31. </w:t>
       </w:r>
       <w:r>
         <w:rPr>
@@ -18627,7 +19609,7 @@
           <w:sz w:val="18"/>
           <w:szCs w:val="18"/>
         </w:rPr>
-        <w:t xml:space="preserve">Figure 30. </w:t>
+        <w:t xml:space="preserve">Figure 32. </w:t>
       </w:r>
       <w:r>
         <w:rPr>
@@ -18636,6 +19618,291 @@
           <w:szCs w:val="18"/>
         </w:rPr>
         <w:t xml:space="preserve">Characters</w:t>
+      </w:r>
+    </w:p>
+    <w:p>
+      <w:pPr>
+        <w:pStyle w:val="Heading2"/>
+        <w:keepNext/>
+      </w:pPr>
+      <w:r>
+        <w:rPr>
+          <w:rFonts w:ascii="Arial" w:cs="Arial" w:eastAsia="Arial" w:hAnsi="Arial"/>
+          <w:b/>
+          <w:bCs/>
+          <w:sz w:val="24"/>
+          <w:szCs w:val="24"/>
+        </w:rPr>
+        <w:t xml:space="preserve">More string methods</w:t>
+      </w:r>
+    </w:p>
+    <w:p>
+      <w:pPr>
+        <w:spacing w:after="120" w:line="264"/>
+      </w:pPr>
+      <w:r>
+        <w:rPr>
+          <w:rFonts w:ascii="Arial" w:cs="Arial" w:eastAsia="Arial" w:hAnsi="Arial"/>
+          <w:sz w:val="20"/>
+          <w:szCs w:val="20"/>
+        </w:rPr>
+        <w:t xml:space="preserve">copyUpTo:, copyAfter:, copyUpToLast: and copyAfterLast: cut a string at a character. asUppercaseFirst (also capitalized) raises the first letter. padLeft:to: and padRight:to: pad with a given character, and padLeftTo: and padRightTo: pad with spaces. format: replaces {1}, {2} and so on with the elements of an Array, or {name} with the values of a Dictionary keyed by Symbols.</w:t>
+      </w:r>
+    </w:p>
+    <w:p>
+      <w:pPr>
+        <w:keepNext/>
+        <w:keepLines/>
+        <w:pBdr>
+          <w:top w:val="single" w:color="808080" w:sz="4"/>
+          <w:left w:val="single" w:color="808080" w:sz="4"/>
+          <w:right w:val="single" w:color="808080" w:sz="4"/>
+        </w:pBdr>
+        <w:shd w:fill="F2F2F2" w:color="auto" w:val="clear"/>
+        <w:spacing w:after="0" w:line="240"/>
+        <w:ind w:left="100" w:right="100"/>
+      </w:pPr>
+      <w:r>
+        <w:rPr>
+          <w:rFonts w:ascii="Courier New" w:cs="Courier New" w:eastAsia="Courier New" w:hAnsi="Courier New"/>
+          <w:sz w:val="17"/>
+          <w:szCs w:val="17"/>
+        </w:rPr>
+        <w:t xml:space="preserve">('a:b:c' copyUpTo: $:) printNl.</w:t>
+      </w:r>
+    </w:p>
+    <w:p>
+      <w:pPr>
+        <w:keepNext/>
+        <w:keepLines/>
+        <w:pBdr>
+          <w:left w:val="single" w:color="808080" w:sz="4"/>
+          <w:right w:val="single" w:color="808080" w:sz="4"/>
+        </w:pBdr>
+        <w:shd w:fill="F2F2F2" w:color="auto" w:val="clear"/>
+        <w:spacing w:after="0" w:line="240"/>
+        <w:ind w:left="100" w:right="100"/>
+      </w:pPr>
+      <w:r>
+        <w:rPr>
+          <w:rFonts w:ascii="Courier New" w:cs="Courier New" w:eastAsia="Courier New" w:hAnsi="Courier New"/>
+          <w:sz w:val="17"/>
+          <w:szCs w:val="17"/>
+        </w:rPr>
+        <w:t xml:space="preserve">('a:b:c' copyAfterLast: $:) printNl.</w:t>
+      </w:r>
+    </w:p>
+    <w:p>
+      <w:pPr>
+        <w:keepNext/>
+        <w:keepLines/>
+        <w:pBdr>
+          <w:left w:val="single" w:color="808080" w:sz="4"/>
+          <w:right w:val="single" w:color="808080" w:sz="4"/>
+        </w:pBdr>
+        <w:shd w:fill="F2F2F2" w:color="auto" w:val="clear"/>
+        <w:spacing w:after="0" w:line="240"/>
+        <w:ind w:left="100" w:right="100"/>
+      </w:pPr>
+      <w:r>
+        <w:rPr>
+          <w:rFonts w:ascii="Courier New" w:cs="Courier New" w:eastAsia="Courier New" w:hAnsi="Courier New"/>
+          <w:sz w:val="17"/>
+          <w:szCs w:val="17"/>
+        </w:rPr>
+        <w:t xml:space="preserve">'hello' capitalized printNl.</w:t>
+      </w:r>
+    </w:p>
+    <w:p>
+      <w:pPr>
+        <w:keepNext/>
+        <w:keepLines/>
+        <w:pBdr>
+          <w:left w:val="single" w:color="808080" w:sz="4"/>
+          <w:right w:val="single" w:color="808080" w:sz="4"/>
+        </w:pBdr>
+        <w:shd w:fill="F2F2F2" w:color="auto" w:val="clear"/>
+        <w:spacing w:after="0" w:line="240"/>
+        <w:ind w:left="100" w:right="100"/>
+      </w:pPr>
+      <w:r>
+        <w:rPr>
+          <w:rFonts w:ascii="Courier New" w:cs="Courier New" w:eastAsia="Courier New" w:hAnsi="Courier New"/>
+          <w:sz w:val="17"/>
+          <w:szCs w:val="17"/>
+        </w:rPr>
+        <w:t xml:space="preserve">('7' padLeft: $0 to: 3) printNl.</w:t>
+      </w:r>
+    </w:p>
+    <w:p>
+      <w:pPr>
+        <w:keepNext/>
+        <w:keepLines/>
+        <w:pBdr>
+          <w:left w:val="single" w:color="808080" w:sz="4"/>
+          <w:right w:val="single" w:color="808080" w:sz="4"/>
+        </w:pBdr>
+        <w:shd w:fill="F2F2F2" w:color="auto" w:val="clear"/>
+        <w:spacing w:after="0" w:line="240"/>
+        <w:ind w:left="100" w:right="100"/>
+      </w:pPr>
+      <w:r>
+        <w:rPr>
+          <w:rFonts w:ascii="Courier New" w:cs="Courier New" w:eastAsia="Courier New" w:hAnsi="Courier New"/>
+          <w:sz w:val="17"/>
+          <w:szCs w:val="17"/>
+        </w:rPr>
+        <w:t xml:space="preserve">('{1} is {2}' format: #('x' 42)) printNl.</w:t>
+      </w:r>
+    </w:p>
+    <w:p>
+      <w:pPr>
+        <w:keepNext/>
+        <w:keepLines/>
+        <w:pBdr>
+          <w:left w:val="single" w:color="808080" w:sz="4"/>
+          <w:right w:val="single" w:color="808080" w:sz="4"/>
+        </w:pBdr>
+        <w:shd w:fill="F2F2F2" w:color="auto" w:val="clear"/>
+        <w:spacing w:after="0" w:line="240"/>
+        <w:ind w:left="100" w:right="100"/>
+      </w:pPr>
+      <w:r>
+        <w:rPr>
+          <w:rFonts w:ascii="Courier New" w:cs="Courier New" w:eastAsia="Courier New" w:hAnsi="Courier New"/>
+          <w:sz w:val="17"/>
+          <w:szCs w:val="17"/>
+        </w:rPr>
+        <w:t xml:space="preserve"> </w:t>
+      </w:r>
+    </w:p>
+    <w:p>
+      <w:pPr>
+        <w:keepNext/>
+        <w:keepLines/>
+        <w:pBdr>
+          <w:left w:val="single" w:color="808080" w:sz="4"/>
+          <w:right w:val="single" w:color="808080" w:sz="4"/>
+        </w:pBdr>
+        <w:shd w:fill="F2F2F2" w:color="auto" w:val="clear"/>
+        <w:spacing w:after="0" w:line="240"/>
+        <w:ind w:left="100" w:right="100"/>
+      </w:pPr>
+      <w:r>
+        <w:rPr>
+          <w:rFonts w:ascii="Courier New" w:cs="Courier New" w:eastAsia="Courier New" w:hAnsi="Courier New"/>
+          <w:sz w:val="17"/>
+          <w:szCs w:val="17"/>
+        </w:rPr>
+        <w:t xml:space="preserve">'a'</w:t>
+      </w:r>
+    </w:p>
+    <w:p>
+      <w:pPr>
+        <w:keepNext/>
+        <w:keepLines/>
+        <w:pBdr>
+          <w:left w:val="single" w:color="808080" w:sz="4"/>
+          <w:right w:val="single" w:color="808080" w:sz="4"/>
+        </w:pBdr>
+        <w:shd w:fill="F2F2F2" w:color="auto" w:val="clear"/>
+        <w:spacing w:after="0" w:line="240"/>
+        <w:ind w:left="100" w:right="100"/>
+      </w:pPr>
+      <w:r>
+        <w:rPr>
+          <w:rFonts w:ascii="Courier New" w:cs="Courier New" w:eastAsia="Courier New" w:hAnsi="Courier New"/>
+          <w:sz w:val="17"/>
+          <w:szCs w:val="17"/>
+        </w:rPr>
+        <w:t xml:space="preserve">'c'</w:t>
+      </w:r>
+    </w:p>
+    <w:p>
+      <w:pPr>
+        <w:keepNext/>
+        <w:keepLines/>
+        <w:pBdr>
+          <w:left w:val="single" w:color="808080" w:sz="4"/>
+          <w:right w:val="single" w:color="808080" w:sz="4"/>
+        </w:pBdr>
+        <w:shd w:fill="F2F2F2" w:color="auto" w:val="clear"/>
+        <w:spacing w:after="0" w:line="240"/>
+        <w:ind w:left="100" w:right="100"/>
+      </w:pPr>
+      <w:r>
+        <w:rPr>
+          <w:rFonts w:ascii="Courier New" w:cs="Courier New" w:eastAsia="Courier New" w:hAnsi="Courier New"/>
+          <w:sz w:val="17"/>
+          <w:szCs w:val="17"/>
+        </w:rPr>
+        <w:t xml:space="preserve">'Hello'</w:t>
+      </w:r>
+    </w:p>
+    <w:p>
+      <w:pPr>
+        <w:keepNext/>
+        <w:keepLines/>
+        <w:pBdr>
+          <w:left w:val="single" w:color="808080" w:sz="4"/>
+          <w:right w:val="single" w:color="808080" w:sz="4"/>
+        </w:pBdr>
+        <w:shd w:fill="F2F2F2" w:color="auto" w:val="clear"/>
+        <w:spacing w:after="0" w:line="240"/>
+        <w:ind w:left="100" w:right="100"/>
+      </w:pPr>
+      <w:r>
+        <w:rPr>
+          <w:rFonts w:ascii="Courier New" w:cs="Courier New" w:eastAsia="Courier New" w:hAnsi="Courier New"/>
+          <w:sz w:val="17"/>
+          <w:szCs w:val="17"/>
+        </w:rPr>
+        <w:t xml:space="preserve">'007'</w:t>
+      </w:r>
+    </w:p>
+    <w:p>
+      <w:pPr>
+        <w:keepNext w:val="false"/>
+        <w:keepLines/>
+        <w:pBdr>
+          <w:bottom w:val="single" w:color="808080" w:sz="4"/>
+          <w:left w:val="single" w:color="808080" w:sz="4"/>
+          <w:right w:val="single" w:color="808080" w:sz="4"/>
+        </w:pBdr>
+        <w:shd w:fill="F2F2F2" w:color="auto" w:val="clear"/>
+        <w:spacing w:after="0" w:line="240"/>
+        <w:ind w:left="100" w:right="100"/>
+      </w:pPr>
+      <w:r>
+        <w:rPr>
+          <w:rFonts w:ascii="Courier New" w:cs="Courier New" w:eastAsia="Courier New" w:hAnsi="Courier New"/>
+          <w:sz w:val="17"/>
+          <w:szCs w:val="17"/>
+        </w:rPr>
+        <w:t xml:space="preserve">'x is 42'</w:t>
+      </w:r>
+    </w:p>
+    <w:p>
+      <w:pPr>
+        <w:spacing w:after="200" w:before="60"/>
+      </w:pPr>
+      <w:r>
+        <w:rPr>
+          <w:rFonts w:ascii="Arial" w:cs="Arial" w:eastAsia="Arial" w:hAnsi="Arial"/>
+          <w:b/>
+          <w:bCs/>
+          <w:sz w:val="18"/>
+          <w:szCs w:val="18"/>
+        </w:rPr>
+        <w:t xml:space="preserve">Figure 33. </w:t>
+      </w:r>
+      <w:r>
+        <w:rPr>
+          <w:rFonts w:ascii="Arial" w:cs="Arial" w:eastAsia="Arial" w:hAnsi="Arial"/>
+          <w:sz w:val="18"/>
+          <w:szCs w:val="18"/>
+        </w:rPr>
+        <w:t xml:space="preserve">Cutting, padding and formatting</w:t>
       </w:r>
     </w:p>
     <w:p>
@@ -18848,7 +20115,7 @@
           <w:sz w:val="18"/>
           <w:szCs w:val="18"/>
         </w:rPr>
-        <w:t xml:space="preserve">Figure 31. </w:t>
+        <w:t xml:space="preserve">Figure 34. </w:t>
       </w:r>
       <w:r>
         <w:rPr>
@@ -19339,7 +20606,7 @@
           <w:sz w:val="18"/>
           <w:szCs w:val="18"/>
         </w:rPr>
-        <w:t xml:space="preserve">Figure 32. </w:t>
+        <w:t xml:space="preserve">Figure 35. </w:t>
       </w:r>
       <w:r>
         <w:rPr>
@@ -19708,7 +20975,7 @@
           <w:sz w:val="18"/>
           <w:szCs w:val="18"/>
         </w:rPr>
-        <w:t xml:space="preserve">Figure 33. </w:t>
+        <w:t xml:space="preserve">Figure 36. </w:t>
       </w:r>
       <w:r>
         <w:rPr>
@@ -20022,7 +21289,7 @@
           <w:sz w:val="18"/>
           <w:szCs w:val="18"/>
         </w:rPr>
-        <w:t xml:space="preserve">Figure 34. </w:t>
+        <w:t xml:space="preserve">Figure 37. </w:t>
       </w:r>
       <w:r>
         <w:rPr>
@@ -20320,7 +21587,7 @@
           <w:sz w:val="18"/>
           <w:szCs w:val="18"/>
         </w:rPr>
-        <w:t xml:space="preserve">Figure 35. </w:t>
+        <w:t xml:space="preserve">Figure 38. </w:t>
       </w:r>
       <w:r>
         <w:rPr>
@@ -20589,7 +21856,7 @@
           <w:sz w:val="18"/>
           <w:szCs w:val="18"/>
         </w:rPr>
-        <w:t xml:space="preserve">Figure 36. </w:t>
+        <w:t xml:space="preserve">Figure 39. </w:t>
       </w:r>
       <w:r>
         <w:rPr>
@@ -20598,6 +21865,35 @@
           <w:szCs w:val="18"/>
         </w:rPr>
         <w:t xml:space="preserve">DateTime</w:t>
+      </w:r>
+    </w:p>
+    <w:p>
+      <w:pPr>
+        <w:pStyle w:val="Heading2"/>
+        <w:keepNext/>
+      </w:pPr>
+      <w:r>
+        <w:rPr>
+          <w:rFonts w:ascii="Arial" w:cs="Arial" w:eastAsia="Arial" w:hAnsi="Arial"/>
+          <w:b/>
+          <w:bCs/>
+          <w:sz w:val="24"/>
+          <w:szCs w:val="24"/>
+        </w:rPr>
+        <w:t xml:space="preserve">More stream methods</w:t>
+      </w:r>
+    </w:p>
+    <w:p>
+      <w:pPr>
+        <w:spacing w:after="120" w:line="264"/>
+      </w:pPr>
+      <w:r>
+        <w:rPr>
+          <w:rFonts w:ascii="Arial" w:cs="Arial" w:eastAsia="Arial" w:hAnsi="Arial"/>
+          <w:sz w:val="20"/>
+          <w:szCs w:val="20"/>
+        </w:rPr>
+        <w:t xml:space="preserve">A read stream understands skipTo:, detect:, notEmpty, back, lines and linesDo:. A write stream understands crtab, lf, newLine, flush, close and print:paddedWith:to:. Blocks understand cull:, timeToRun and ifError:, and every object understands in:, displayOn:, instVarNamed: and deny:.</w:t>
       </w:r>
     </w:p>
     <w:p>
@@ -20915,7 +22211,7 @@
           <w:sz w:val="18"/>
           <w:szCs w:val="18"/>
         </w:rPr>
-        <w:t xml:space="preserve">Figure 37. </w:t>
+        <w:t xml:space="preserve">Figure 40. </w:t>
       </w:r>
       <w:r>
         <w:rPr>
@@ -21463,7 +22759,7 @@
           <w:sz w:val="18"/>
           <w:szCs w:val="18"/>
         </w:rPr>
-        <w:t xml:space="preserve">Figure 38. </w:t>
+        <w:t xml:space="preserve">Figure 41. </w:t>
       </w:r>
       <w:r>
         <w:rPr>
@@ -21769,7 +23065,7 @@
           <w:sz w:val="18"/>
           <w:szCs w:val="18"/>
         </w:rPr>
-        <w:t xml:space="preserve">Figure 39. </w:t>
+        <w:t xml:space="preserve">Figure 42. </w:t>
       </w:r>
       <w:r>
         <w:rPr>
@@ -22151,7 +23447,7 @@
           <w:sz w:val="18"/>
           <w:szCs w:val="18"/>
         </w:rPr>
-        <w:t xml:space="preserve">Figure 40. </w:t>
+        <w:t xml:space="preserve">Figure 43. </w:t>
       </w:r>
       <w:r>
         <w:rPr>
@@ -22478,7 +23774,7 @@
           <w:sz w:val="18"/>
           <w:szCs w:val="18"/>
         </w:rPr>
-        <w:t xml:space="preserve">Figure 41. </w:t>
+        <w:t xml:space="preserve">Figure 44. </w:t>
       </w:r>
       <w:r>
         <w:rPr>
@@ -23186,7 +24482,7 @@
           <w:sz w:val="18"/>
           <w:szCs w:val="18"/>
         </w:rPr>
-        <w:t xml:space="preserve">Figure 42. </w:t>
+        <w:t xml:space="preserve">Figure 45. </w:t>
       </w:r>
       <w:r>
         <w:rPr>
@@ -23804,7 +25100,7 @@
           <w:sz w:val="18"/>
           <w:szCs w:val="18"/>
         </w:rPr>
-        <w:t xml:space="preserve">Figure 43. </w:t>
+        <w:t xml:space="preserve">Figure 46. </w:t>
       </w:r>
       <w:r>
         <w:rPr>
@@ -24165,7 +25461,7 @@
           <w:sz w:val="18"/>
           <w:szCs w:val="18"/>
         </w:rPr>
-        <w:t xml:space="preserve">Figure 44. </w:t>
+        <w:t xml:space="preserve">Figure 47. </w:t>
       </w:r>
       <w:r>
         <w:rPr>
@@ -24562,7 +25858,7 @@
           <w:sz w:val="18"/>
           <w:szCs w:val="18"/>
         </w:rPr>
-        <w:t xml:space="preserve">Figure 45. </w:t>
+        <w:t xml:space="preserve">Figure 48. </w:t>
       </w:r>
       <w:r>
         <w:rPr>
@@ -25333,7 +26629,7 @@
           <w:sz w:val="18"/>
           <w:szCs w:val="18"/>
         </w:rPr>
-        <w:t xml:space="preserve">Figure 46. </w:t>
+        <w:t xml:space="preserve">Figure 49. </w:t>
       </w:r>
       <w:r>
         <w:rPr>
@@ -26148,7 +27444,7 @@
           <w:sz w:val="18"/>
           <w:szCs w:val="18"/>
         </w:rPr>
-        <w:t xml:space="preserve">Figure 47. </w:t>
+        <w:t xml:space="preserve">Figure 50. </w:t>
       </w:r>
       <w:r>
         <w:rPr>
@@ -26923,7 +28219,7 @@
           <w:sz w:val="18"/>
           <w:szCs w:val="18"/>
         </w:rPr>
-        <w:t xml:space="preserve">Figure 48. </w:t>
+        <w:t xml:space="preserve">Figure 51. </w:t>
       </w:r>
       <w:r>
         <w:rPr>
@@ -28018,7 +29314,7 @@
           <w:sz w:val="18"/>
           <w:szCs w:val="18"/>
         </w:rPr>
-        <w:t xml:space="preserve">Figure 49. </w:t>
+        <w:t xml:space="preserve">Figure 52. </w:t>
       </w:r>
       <w:r>
         <w:rPr>
@@ -28736,7 +30032,7 @@
           <w:sz w:val="18"/>
           <w:szCs w:val="18"/>
         </w:rPr>
-        <w:t xml:space="preserve">Figure 50. </w:t>
+        <w:t xml:space="preserve">Figure 53. </w:t>
       </w:r>
       <w:r>
         <w:rPr>

</xml_diff>

<commit_message>
Add structures.st: Complex, Stack, Queue, Matrix, number formatting
Co-Authored-By: Claude Sonnet 5.5 <noreply@anthropic.com>
Claude-Session: https://claude.ai/code/session_013PfZHD8os4FWhvmVG9Tf7M
</commit_message>
<xml_diff>
--- a/docs/Smalltalk-CREXX-Guide.docx
+++ b/docs/Smalltalk-CREXX-Guide.docx
@@ -888,18 +888,18 @@
         <w:tabs>
           <w:tab w:val="right" w:pos="9638" w:leader="dot"/>
         </w:tabs>
-        <w:spacing w:after="20" w:before="100"/>
-        <w:ind w:left="0"/>
-      </w:pPr>
-      <w:r>
-        <w:rPr>
-          <w:rFonts w:ascii="Arial" w:cs="Arial" w:eastAsia="Arial" w:hAnsi="Arial"/>
-          <w:b/>
-          <w:bCs/>
-          <w:sz w:val="19"/>
-          <w:szCs w:val="19"/>
-        </w:rPr>
-        <w:t xml:space="preserve">Chapter 6. Collections	15</w:t>
+        <w:spacing w:after="0" w:before="0"/>
+        <w:ind w:left="360"/>
+      </w:pPr>
+      <w:r>
+        <w:rPr>
+          <w:rFonts w:ascii="Arial" w:cs="Arial" w:eastAsia="Arial" w:hAnsi="Arial"/>
+          <w:b w:val="false"/>
+          <w:bCs w:val="false"/>
+          <w:sz w:val="18"/>
+          <w:szCs w:val="18"/>
+        </w:rPr>
+        <w:t xml:space="preserve">Formatting numbers	14</w:t>
       </w:r>
     </w:p>
     <w:p>
@@ -918,7 +918,26 @@
           <w:sz w:val="18"/>
           <w:szCs w:val="18"/>
         </w:rPr>
-        <w:t xml:space="preserve">The collection classes	15</w:t>
+        <w:t xml:space="preserve">Complex numbers	14</w:t>
+      </w:r>
+    </w:p>
+    <w:p>
+      <w:pPr>
+        <w:tabs>
+          <w:tab w:val="right" w:pos="9638" w:leader="dot"/>
+        </w:tabs>
+        <w:spacing w:after="20" w:before="100"/>
+        <w:ind w:left="0"/>
+      </w:pPr>
+      <w:r>
+        <w:rPr>
+          <w:rFonts w:ascii="Arial" w:cs="Arial" w:eastAsia="Arial" w:hAnsi="Arial"/>
+          <w:b/>
+          <w:bCs/>
+          <w:sz w:val="19"/>
+          <w:szCs w:val="19"/>
+        </w:rPr>
+        <w:t xml:space="preserve">Chapter 6. Collections	15</w:t>
       </w:r>
     </w:p>
     <w:p>
@@ -937,7 +956,7 @@
           <w:sz w:val="18"/>
           <w:szCs w:val="18"/>
         </w:rPr>
-        <w:t xml:space="preserve">Protocol common to all collections	15</w:t>
+        <w:t xml:space="preserve">The collection classes	15</w:t>
       </w:r>
     </w:p>
     <w:p>
@@ -956,7 +975,7 @@
           <w:sz w:val="18"/>
           <w:szCs w:val="18"/>
         </w:rPr>
-        <w:t xml:space="preserve">Arrays and OrderedCollections	16</w:t>
+        <w:t xml:space="preserve">Protocol common to all collections	15</w:t>
       </w:r>
     </w:p>
     <w:p>
@@ -975,7 +994,7 @@
           <w:sz w:val="18"/>
           <w:szCs w:val="18"/>
         </w:rPr>
-        <w:t xml:space="preserve">Dictionaries	16</w:t>
+        <w:t xml:space="preserve">Arrays and OrderedCollections	16</w:t>
       </w:r>
     </w:p>
     <w:p>
@@ -994,7 +1013,7 @@
           <w:sz w:val="18"/>
           <w:szCs w:val="18"/>
         </w:rPr>
-        <w:t xml:space="preserve">Sets and Bags	17</w:t>
+        <w:t xml:space="preserve">Dictionaries	16</w:t>
       </w:r>
     </w:p>
     <w:p>
@@ -1013,7 +1032,7 @@
           <w:sz w:val="18"/>
           <w:szCs w:val="18"/>
         </w:rPr>
-        <w:t xml:space="preserve">Intervals	17</w:t>
+        <w:t xml:space="preserve">Sets and Bags	17</w:t>
       </w:r>
     </w:p>
     <w:p>
@@ -1032,7 +1051,45 @@
           <w:sz w:val="18"/>
           <w:szCs w:val="18"/>
         </w:rPr>
+        <w:t xml:space="preserve">Intervals	17</w:t>
+      </w:r>
+    </w:p>
+    <w:p>
+      <w:pPr>
+        <w:tabs>
+          <w:tab w:val="right" w:pos="9638" w:leader="dot"/>
+        </w:tabs>
+        <w:spacing w:after="0" w:before="0"/>
+        <w:ind w:left="360"/>
+      </w:pPr>
+      <w:r>
+        <w:rPr>
+          <w:rFonts w:ascii="Arial" w:cs="Arial" w:eastAsia="Arial" w:hAnsi="Arial"/>
+          <w:b w:val="false"/>
+          <w:bCs w:val="false"/>
+          <w:sz w:val="18"/>
+          <w:szCs w:val="18"/>
+        </w:rPr>
         <w:t xml:space="preserve">More collection methods	17</w:t>
+      </w:r>
+    </w:p>
+    <w:p>
+      <w:pPr>
+        <w:tabs>
+          <w:tab w:val="right" w:pos="9638" w:leader="dot"/>
+        </w:tabs>
+        <w:spacing w:after="0" w:before="0"/>
+        <w:ind w:left="360"/>
+      </w:pPr>
+      <w:r>
+        <w:rPr>
+          <w:rFonts w:ascii="Arial" w:cs="Arial" w:eastAsia="Arial" w:hAnsi="Arial"/>
+          <w:b w:val="false"/>
+          <w:bCs w:val="false"/>
+          <w:sz w:val="18"/>
+          <w:szCs w:val="18"/>
+        </w:rPr>
+        <w:t xml:space="preserve">Stack, Queue and Matrix	18</w:t>
       </w:r>
     </w:p>
     <w:p>
@@ -13586,6 +13643,450 @@
     </w:p>
     <w:p>
       <w:pPr>
+        <w:pStyle w:val="Heading2"/>
+        <w:keepNext/>
+      </w:pPr>
+      <w:r>
+        <w:rPr>
+          <w:rFonts w:ascii="Arial" w:cs="Arial" w:eastAsia="Arial" w:hAnsi="Arial"/>
+          <w:b/>
+          <w:bCs/>
+          <w:sz w:val="24"/>
+          <w:szCs w:val="24"/>
+        </w:rPr>
+        <w:t xml:space="preserve">Formatting numbers</w:t>
+      </w:r>
+    </w:p>
+    <w:p>
+      <w:pPr>
+        <w:spacing w:after="120" w:line="264"/>
+      </w:pPr>
+      <w:r>
+        <w:rPr>
+          <w:rFonts w:ascii="Arial" w:cs="Arial" w:eastAsia="Arial" w:hAnsi="Arial"/>
+          <w:sz w:val="20"/>
+          <w:szCs w:val="20"/>
+        </w:rPr>
+        <w:t xml:space="preserve">printShowingDecimalPlaces: n answers a number rounded to n decimal places as a String, and asStringWithCommas groups the digits of an Integer in threes. raisedTo: accepts a Fraction or a Float exponent.</w:t>
+      </w:r>
+    </w:p>
+    <w:p>
+      <w:pPr>
+        <w:keepNext/>
+        <w:keepLines/>
+        <w:pBdr>
+          <w:top w:val="single" w:color="808080" w:sz="4"/>
+          <w:left w:val="single" w:color="808080" w:sz="4"/>
+          <w:right w:val="single" w:color="808080" w:sz="4"/>
+        </w:pBdr>
+        <w:shd w:fill="F2F2F2" w:color="auto" w:val="clear"/>
+        <w:spacing w:after="0" w:line="240"/>
+        <w:ind w:left="100" w:right="100"/>
+      </w:pPr>
+      <w:r>
+        <w:rPr>
+          <w:rFonts w:ascii="Courier New" w:cs="Courier New" w:eastAsia="Courier New" w:hAnsi="Courier New"/>
+          <w:sz w:val="17"/>
+          <w:szCs w:val="17"/>
+        </w:rPr>
+        <w:t xml:space="preserve">(3.14159 printShowingDecimalPlaces: 2) printNl.</w:t>
+      </w:r>
+    </w:p>
+    <w:p>
+      <w:pPr>
+        <w:keepNext/>
+        <w:keepLines/>
+        <w:pBdr>
+          <w:left w:val="single" w:color="808080" w:sz="4"/>
+          <w:right w:val="single" w:color="808080" w:sz="4"/>
+        </w:pBdr>
+        <w:shd w:fill="F2F2F2" w:color="auto" w:val="clear"/>
+        <w:spacing w:after="0" w:line="240"/>
+        <w:ind w:left="100" w:right="100"/>
+      </w:pPr>
+      <w:r>
+        <w:rPr>
+          <w:rFonts w:ascii="Courier New" w:cs="Courier New" w:eastAsia="Courier New" w:hAnsi="Courier New"/>
+          <w:sz w:val="17"/>
+          <w:szCs w:val="17"/>
+        </w:rPr>
+        <w:t xml:space="preserve">(2 printShowingDecimalPlaces: 2) printNl.</w:t>
+      </w:r>
+    </w:p>
+    <w:p>
+      <w:pPr>
+        <w:keepNext/>
+        <w:keepLines/>
+        <w:pBdr>
+          <w:left w:val="single" w:color="808080" w:sz="4"/>
+          <w:right w:val="single" w:color="808080" w:sz="4"/>
+        </w:pBdr>
+        <w:shd w:fill="F2F2F2" w:color="auto" w:val="clear"/>
+        <w:spacing w:after="0" w:line="240"/>
+        <w:ind w:left="100" w:right="100"/>
+      </w:pPr>
+      <w:r>
+        <w:rPr>
+          <w:rFonts w:ascii="Courier New" w:cs="Courier New" w:eastAsia="Courier New" w:hAnsi="Courier New"/>
+          <w:sz w:val="17"/>
+          <w:szCs w:val="17"/>
+        </w:rPr>
+        <w:t xml:space="preserve">1234567 asStringWithCommas printNl.</w:t>
+      </w:r>
+    </w:p>
+    <w:p>
+      <w:pPr>
+        <w:keepNext/>
+        <w:keepLines/>
+        <w:pBdr>
+          <w:left w:val="single" w:color="808080" w:sz="4"/>
+          <w:right w:val="single" w:color="808080" w:sz="4"/>
+        </w:pBdr>
+        <w:shd w:fill="F2F2F2" w:color="auto" w:val="clear"/>
+        <w:spacing w:after="0" w:line="240"/>
+        <w:ind w:left="100" w:right="100"/>
+      </w:pPr>
+      <w:r>
+        <w:rPr>
+          <w:rFonts w:ascii="Courier New" w:cs="Courier New" w:eastAsia="Courier New" w:hAnsi="Courier New"/>
+          <w:sz w:val="17"/>
+          <w:szCs w:val="17"/>
+        </w:rPr>
+        <w:t xml:space="preserve"> </w:t>
+      </w:r>
+    </w:p>
+    <w:p>
+      <w:pPr>
+        <w:keepNext/>
+        <w:keepLines/>
+        <w:pBdr>
+          <w:left w:val="single" w:color="808080" w:sz="4"/>
+          <w:right w:val="single" w:color="808080" w:sz="4"/>
+        </w:pBdr>
+        <w:shd w:fill="F2F2F2" w:color="auto" w:val="clear"/>
+        <w:spacing w:after="0" w:line="240"/>
+        <w:ind w:left="100" w:right="100"/>
+      </w:pPr>
+      <w:r>
+        <w:rPr>
+          <w:rFonts w:ascii="Courier New" w:cs="Courier New" w:eastAsia="Courier New" w:hAnsi="Courier New"/>
+          <w:sz w:val="17"/>
+          <w:szCs w:val="17"/>
+        </w:rPr>
+        <w:t xml:space="preserve">'3.14'</w:t>
+      </w:r>
+    </w:p>
+    <w:p>
+      <w:pPr>
+        <w:keepNext/>
+        <w:keepLines/>
+        <w:pBdr>
+          <w:left w:val="single" w:color="808080" w:sz="4"/>
+          <w:right w:val="single" w:color="808080" w:sz="4"/>
+        </w:pBdr>
+        <w:shd w:fill="F2F2F2" w:color="auto" w:val="clear"/>
+        <w:spacing w:after="0" w:line="240"/>
+        <w:ind w:left="100" w:right="100"/>
+      </w:pPr>
+      <w:r>
+        <w:rPr>
+          <w:rFonts w:ascii="Courier New" w:cs="Courier New" w:eastAsia="Courier New" w:hAnsi="Courier New"/>
+          <w:sz w:val="17"/>
+          <w:szCs w:val="17"/>
+        </w:rPr>
+        <w:t xml:space="preserve">'2.00'</w:t>
+      </w:r>
+    </w:p>
+    <w:p>
+      <w:pPr>
+        <w:keepNext w:val="false"/>
+        <w:keepLines/>
+        <w:pBdr>
+          <w:bottom w:val="single" w:color="808080" w:sz="4"/>
+          <w:left w:val="single" w:color="808080" w:sz="4"/>
+          <w:right w:val="single" w:color="808080" w:sz="4"/>
+        </w:pBdr>
+        <w:shd w:fill="F2F2F2" w:color="auto" w:val="clear"/>
+        <w:spacing w:after="0" w:line="240"/>
+        <w:ind w:left="100" w:right="100"/>
+      </w:pPr>
+      <w:r>
+        <w:rPr>
+          <w:rFonts w:ascii="Courier New" w:cs="Courier New" w:eastAsia="Courier New" w:hAnsi="Courier New"/>
+          <w:sz w:val="17"/>
+          <w:szCs w:val="17"/>
+        </w:rPr>
+        <w:t xml:space="preserve">'1,234,567'</w:t>
+      </w:r>
+    </w:p>
+    <w:p>
+      <w:pPr>
+        <w:spacing w:after="200" w:before="60"/>
+      </w:pPr>
+      <w:r>
+        <w:rPr>
+          <w:rFonts w:ascii="Arial" w:cs="Arial" w:eastAsia="Arial" w:hAnsi="Arial"/>
+          <w:b/>
+          <w:bCs/>
+          <w:sz w:val="18"/>
+          <w:szCs w:val="18"/>
+        </w:rPr>
+        <w:t xml:space="preserve">Figure 22. </w:t>
+      </w:r>
+      <w:r>
+        <w:rPr>
+          <w:rFonts w:ascii="Arial" w:cs="Arial" w:eastAsia="Arial" w:hAnsi="Arial"/>
+          <w:sz w:val="18"/>
+          <w:szCs w:val="18"/>
+        </w:rPr>
+        <w:t xml:space="preserve">Formatting numbers</w:t>
+      </w:r>
+    </w:p>
+    <w:p>
+      <w:pPr>
+        <w:pStyle w:val="Heading2"/>
+        <w:keepNext/>
+      </w:pPr>
+      <w:r>
+        <w:rPr>
+          <w:rFonts w:ascii="Arial" w:cs="Arial" w:eastAsia="Arial" w:hAnsi="Arial"/>
+          <w:b/>
+          <w:bCs/>
+          <w:sz w:val="24"/>
+          <w:szCs w:val="24"/>
+        </w:rPr>
+        <w:t xml:space="preserve">Complex numbers</w:t>
+      </w:r>
+    </w:p>
+    <w:p>
+      <w:pPr>
+        <w:spacing w:after="120" w:line="264"/>
+      </w:pPr>
+      <w:r>
+        <w:rPr>
+          <w:rFonts w:ascii="Arial" w:cs="Arial" w:eastAsia="Arial" w:hAnsi="Arial"/>
+          <w:sz w:val="20"/>
+          <w:szCs w:val="20"/>
+        </w:rPr>
+        <w:t xml:space="preserve">n i makes the imaginary number n times i, so 3 + 4 i is a Complex number. Complex numbers support + - * / and =, and answer real, imaginary, abs, conjugate and negated. They print as 3+4i and mix freely with integers, fractions and floats.</w:t>
+      </w:r>
+    </w:p>
+    <w:p>
+      <w:pPr>
+        <w:keepNext/>
+        <w:keepLines/>
+        <w:pBdr>
+          <w:top w:val="single" w:color="808080" w:sz="4"/>
+          <w:left w:val="single" w:color="808080" w:sz="4"/>
+          <w:right w:val="single" w:color="808080" w:sz="4"/>
+        </w:pBdr>
+        <w:shd w:fill="F2F2F2" w:color="auto" w:val="clear"/>
+        <w:spacing w:after="0" w:line="240"/>
+        <w:ind w:left="100" w:right="100"/>
+      </w:pPr>
+      <w:r>
+        <w:rPr>
+          <w:rFonts w:ascii="Courier New" w:cs="Courier New" w:eastAsia="Courier New" w:hAnsi="Courier New"/>
+          <w:sz w:val="17"/>
+          <w:szCs w:val="17"/>
+        </w:rPr>
+        <w:t xml:space="preserve">(3 + 4 i) printNl.</w:t>
+      </w:r>
+    </w:p>
+    <w:p>
+      <w:pPr>
+        <w:keepNext/>
+        <w:keepLines/>
+        <w:pBdr>
+          <w:left w:val="single" w:color="808080" w:sz="4"/>
+          <w:right w:val="single" w:color="808080" w:sz="4"/>
+        </w:pBdr>
+        <w:shd w:fill="F2F2F2" w:color="auto" w:val="clear"/>
+        <w:spacing w:after="0" w:line="240"/>
+        <w:ind w:left="100" w:right="100"/>
+      </w:pPr>
+      <w:r>
+        <w:rPr>
+          <w:rFonts w:ascii="Courier New" w:cs="Courier New" w:eastAsia="Courier New" w:hAnsi="Courier New"/>
+          <w:sz w:val="17"/>
+          <w:szCs w:val="17"/>
+        </w:rPr>
+        <w:t xml:space="preserve">((3 + 4 i) * (1 - 2 i)) printNl.</w:t>
+      </w:r>
+    </w:p>
+    <w:p>
+      <w:pPr>
+        <w:keepNext/>
+        <w:keepLines/>
+        <w:pBdr>
+          <w:left w:val="single" w:color="808080" w:sz="4"/>
+          <w:right w:val="single" w:color="808080" w:sz="4"/>
+        </w:pBdr>
+        <w:shd w:fill="F2F2F2" w:color="auto" w:val="clear"/>
+        <w:spacing w:after="0" w:line="240"/>
+        <w:ind w:left="100" w:right="100"/>
+      </w:pPr>
+      <w:r>
+        <w:rPr>
+          <w:rFonts w:ascii="Courier New" w:cs="Courier New" w:eastAsia="Courier New" w:hAnsi="Courier New"/>
+          <w:sz w:val="17"/>
+          <w:szCs w:val="17"/>
+        </w:rPr>
+        <w:t xml:space="preserve">(3 + 4 i) abs printNl.</w:t>
+      </w:r>
+    </w:p>
+    <w:p>
+      <w:pPr>
+        <w:keepNext/>
+        <w:keepLines/>
+        <w:pBdr>
+          <w:left w:val="single" w:color="808080" w:sz="4"/>
+          <w:right w:val="single" w:color="808080" w:sz="4"/>
+        </w:pBdr>
+        <w:shd w:fill="F2F2F2" w:color="auto" w:val="clear"/>
+        <w:spacing w:after="0" w:line="240"/>
+        <w:ind w:left="100" w:right="100"/>
+      </w:pPr>
+      <w:r>
+        <w:rPr>
+          <w:rFonts w:ascii="Courier New" w:cs="Courier New" w:eastAsia="Courier New" w:hAnsi="Courier New"/>
+          <w:sz w:val="17"/>
+          <w:szCs w:val="17"/>
+        </w:rPr>
+        <w:t xml:space="preserve">(3 + 4 i) conjugate printNl.</w:t>
+      </w:r>
+    </w:p>
+    <w:p>
+      <w:pPr>
+        <w:keepNext/>
+        <w:keepLines/>
+        <w:pBdr>
+          <w:left w:val="single" w:color="808080" w:sz="4"/>
+          <w:right w:val="single" w:color="808080" w:sz="4"/>
+        </w:pBdr>
+        <w:shd w:fill="F2F2F2" w:color="auto" w:val="clear"/>
+        <w:spacing w:after="0" w:line="240"/>
+        <w:ind w:left="100" w:right="100"/>
+      </w:pPr>
+      <w:r>
+        <w:rPr>
+          <w:rFonts w:ascii="Courier New" w:cs="Courier New" w:eastAsia="Courier New" w:hAnsi="Courier New"/>
+          <w:sz w:val="17"/>
+          <w:szCs w:val="17"/>
+        </w:rPr>
+        <w:t xml:space="preserve"> </w:t>
+      </w:r>
+    </w:p>
+    <w:p>
+      <w:pPr>
+        <w:keepNext/>
+        <w:keepLines/>
+        <w:pBdr>
+          <w:left w:val="single" w:color="808080" w:sz="4"/>
+          <w:right w:val="single" w:color="808080" w:sz="4"/>
+        </w:pBdr>
+        <w:shd w:fill="F2F2F2" w:color="auto" w:val="clear"/>
+        <w:spacing w:after="0" w:line="240"/>
+        <w:ind w:left="100" w:right="100"/>
+      </w:pPr>
+      <w:r>
+        <w:rPr>
+          <w:rFonts w:ascii="Courier New" w:cs="Courier New" w:eastAsia="Courier New" w:hAnsi="Courier New"/>
+          <w:sz w:val="17"/>
+          <w:szCs w:val="17"/>
+        </w:rPr>
+        <w:t xml:space="preserve">3+4i</w:t>
+      </w:r>
+    </w:p>
+    <w:p>
+      <w:pPr>
+        <w:keepNext/>
+        <w:keepLines/>
+        <w:pBdr>
+          <w:left w:val="single" w:color="808080" w:sz="4"/>
+          <w:right w:val="single" w:color="808080" w:sz="4"/>
+        </w:pBdr>
+        <w:shd w:fill="F2F2F2" w:color="auto" w:val="clear"/>
+        <w:spacing w:after="0" w:line="240"/>
+        <w:ind w:left="100" w:right="100"/>
+      </w:pPr>
+      <w:r>
+        <w:rPr>
+          <w:rFonts w:ascii="Courier New" w:cs="Courier New" w:eastAsia="Courier New" w:hAnsi="Courier New"/>
+          <w:sz w:val="17"/>
+          <w:szCs w:val="17"/>
+        </w:rPr>
+        <w:t xml:space="preserve">11-2i</w:t>
+      </w:r>
+    </w:p>
+    <w:p>
+      <w:pPr>
+        <w:keepNext/>
+        <w:keepLines/>
+        <w:pBdr>
+          <w:left w:val="single" w:color="808080" w:sz="4"/>
+          <w:right w:val="single" w:color="808080" w:sz="4"/>
+        </w:pBdr>
+        <w:shd w:fill="F2F2F2" w:color="auto" w:val="clear"/>
+        <w:spacing w:after="0" w:line="240"/>
+        <w:ind w:left="100" w:right="100"/>
+      </w:pPr>
+      <w:r>
+        <w:rPr>
+          <w:rFonts w:ascii="Courier New" w:cs="Courier New" w:eastAsia="Courier New" w:hAnsi="Courier New"/>
+          <w:sz w:val="17"/>
+          <w:szCs w:val="17"/>
+        </w:rPr>
+        <w:t xml:space="preserve">5.0</w:t>
+      </w:r>
+    </w:p>
+    <w:p>
+      <w:pPr>
+        <w:keepNext w:val="false"/>
+        <w:keepLines/>
+        <w:pBdr>
+          <w:bottom w:val="single" w:color="808080" w:sz="4"/>
+          <w:left w:val="single" w:color="808080" w:sz="4"/>
+          <w:right w:val="single" w:color="808080" w:sz="4"/>
+        </w:pBdr>
+        <w:shd w:fill="F2F2F2" w:color="auto" w:val="clear"/>
+        <w:spacing w:after="0" w:line="240"/>
+        <w:ind w:left="100" w:right="100"/>
+      </w:pPr>
+      <w:r>
+        <w:rPr>
+          <w:rFonts w:ascii="Courier New" w:cs="Courier New" w:eastAsia="Courier New" w:hAnsi="Courier New"/>
+          <w:sz w:val="17"/>
+          <w:szCs w:val="17"/>
+        </w:rPr>
+        <w:t xml:space="preserve">3-4i</w:t>
+      </w:r>
+    </w:p>
+    <w:p>
+      <w:pPr>
+        <w:spacing w:after="200" w:before="60"/>
+      </w:pPr>
+      <w:r>
+        <w:rPr>
+          <w:rFonts w:ascii="Arial" w:cs="Arial" w:eastAsia="Arial" w:hAnsi="Arial"/>
+          <w:b/>
+          <w:bCs/>
+          <w:sz w:val="18"/>
+          <w:szCs w:val="18"/>
+        </w:rPr>
+        <w:t xml:space="preserve">Figure 23. </w:t>
+      </w:r>
+      <w:r>
+        <w:rPr>
+          <w:rFonts w:ascii="Arial" w:cs="Arial" w:eastAsia="Arial" w:hAnsi="Arial"/>
+          <w:sz w:val="18"/>
+          <w:szCs w:val="18"/>
+        </w:rPr>
+        <w:t xml:space="preserve">Complex arithmetic</w:t>
+      </w:r>
+    </w:p>
+    <w:p>
+      <w:pPr>
         <w:pStyle w:val="Heading1"/>
         <w:pageBreakBefore/>
         <w:pBdr>
@@ -14294,7 +14795,7 @@
           <w:sz w:val="18"/>
           <w:szCs w:val="18"/>
         </w:rPr>
-        <w:t xml:space="preserve">Figure 22. </w:t>
+        <w:t xml:space="preserve">Figure 24. </w:t>
       </w:r>
       <w:r>
         <w:rPr>
@@ -15052,7 +15553,7 @@
           <w:sz w:val="18"/>
           <w:szCs w:val="18"/>
         </w:rPr>
-        <w:t xml:space="preserve">Figure 23. </w:t>
+        <w:t xml:space="preserve">Figure 25. </w:t>
       </w:r>
       <w:r>
         <w:rPr>
@@ -15392,7 +15893,7 @@
           <w:sz w:val="18"/>
           <w:szCs w:val="18"/>
         </w:rPr>
-        <w:t xml:space="preserve">Figure 24. </w:t>
+        <w:t xml:space="preserve">Figure 26. </w:t>
       </w:r>
       <w:r>
         <w:rPr>
@@ -15795,7 +16296,7 @@
           <w:sz w:val="18"/>
           <w:szCs w:val="18"/>
         </w:rPr>
-        <w:t xml:space="preserve">Figure 25. </w:t>
+        <w:t xml:space="preserve">Figure 27. </w:t>
       </w:r>
       <w:r>
         <w:rPr>
@@ -16496,7 +16997,7 @@
           <w:sz w:val="18"/>
           <w:szCs w:val="18"/>
         </w:rPr>
-        <w:t xml:space="preserve">Figure 26. </w:t>
+        <w:t xml:space="preserve">Figure 28. </w:t>
       </w:r>
       <w:r>
         <w:rPr>
@@ -16920,7 +17421,7 @@
           <w:sz w:val="18"/>
           <w:szCs w:val="18"/>
         </w:rPr>
-        <w:t xml:space="preserve">Figure 27. </w:t>
+        <w:t xml:space="preserve">Figure 29. </w:t>
       </w:r>
       <w:r>
         <w:rPr>
@@ -17276,7 +17777,7 @@
           <w:sz w:val="18"/>
           <w:szCs w:val="18"/>
         </w:rPr>
-        <w:t xml:space="preserve">Figure 28. </w:t>
+        <w:t xml:space="preserve">Figure 30. </w:t>
       </w:r>
       <w:r>
         <w:rPr>
@@ -17842,7 +18343,7 @@
           <w:sz w:val="18"/>
           <w:szCs w:val="18"/>
         </w:rPr>
-        <w:t xml:space="preserve">Figure 29. </w:t>
+        <w:t xml:space="preserve">Figure 31. </w:t>
       </w:r>
       <w:r>
         <w:rPr>
@@ -17851,6 +18352,396 @@
           <w:szCs w:val="18"/>
         </w:rPr>
         <w:t xml:space="preserve">Working with groups of elements</w:t>
+      </w:r>
+    </w:p>
+    <w:p>
+      <w:pPr>
+        <w:pStyle w:val="Heading2"/>
+        <w:keepNext/>
+      </w:pPr>
+      <w:r>
+        <w:rPr>
+          <w:rFonts w:ascii="Arial" w:cs="Arial" w:eastAsia="Arial" w:hAnsi="Arial"/>
+          <w:b/>
+          <w:bCs/>
+          <w:sz w:val="24"/>
+          <w:szCs w:val="24"/>
+        </w:rPr>
+        <w:t xml:space="preserve">Stack, Queue and Matrix</w:t>
+      </w:r>
+    </w:p>
+    <w:p>
+      <w:pPr>
+        <w:spacing w:after="120" w:line="264"/>
+      </w:pPr>
+      <w:r>
+        <w:rPr>
+          <w:rFonts w:ascii="Arial" w:cs="Arial" w:eastAsia="Arial" w:hAnsi="Arial"/>
+          <w:sz w:val="20"/>
+          <w:szCs w:val="20"/>
+        </w:rPr>
+        <w:t xml:space="preserve">Three small classes are written in Smalltalk. A Stack answers push:, pop, top, isEmpty, size and do: (from the top down). A Queue answers enqueue:, dequeue, front, isEmpty and size. Taking from an empty Stack or Queue is an error. A Matrix is made with rows:columns:, rows:columns:withAll:, identity: or fromRows:, and understands at:at:, at:at:put:, row:, column:, +, -, * (with a number or another Matrix), transposed, trace and determinant. It prints one row per line.</w:t>
+      </w:r>
+    </w:p>
+    <w:p>
+      <w:pPr>
+        <w:keepNext/>
+        <w:keepLines/>
+        <w:pBdr>
+          <w:top w:val="single" w:color="808080" w:sz="4"/>
+          <w:left w:val="single" w:color="808080" w:sz="4"/>
+          <w:right w:val="single" w:color="808080" w:sz="4"/>
+        </w:pBdr>
+        <w:shd w:fill="F2F2F2" w:color="auto" w:val="clear"/>
+        <w:spacing w:after="0" w:line="240"/>
+        <w:ind w:left="100" w:right="100"/>
+      </w:pPr>
+      <w:r>
+        <w:rPr>
+          <w:rFonts w:ascii="Courier New" w:cs="Courier New" w:eastAsia="Courier New" w:hAnsi="Courier New"/>
+          <w:sz w:val="17"/>
+          <w:szCs w:val="17"/>
+        </w:rPr>
+        <w:t xml:space="preserve">| s q m |</w:t>
+      </w:r>
+    </w:p>
+    <w:p>
+      <w:pPr>
+        <w:keepNext/>
+        <w:keepLines/>
+        <w:pBdr>
+          <w:left w:val="single" w:color="808080" w:sz="4"/>
+          <w:right w:val="single" w:color="808080" w:sz="4"/>
+        </w:pBdr>
+        <w:shd w:fill="F2F2F2" w:color="auto" w:val="clear"/>
+        <w:spacing w:after="0" w:line="240"/>
+        <w:ind w:left="100" w:right="100"/>
+      </w:pPr>
+      <w:r>
+        <w:rPr>
+          <w:rFonts w:ascii="Courier New" w:cs="Courier New" w:eastAsia="Courier New" w:hAnsi="Courier New"/>
+          <w:sz w:val="17"/>
+          <w:szCs w:val="17"/>
+        </w:rPr>
+        <w:t xml:space="preserve">s := Stack new. s push: 1; push: 2; push: 3.</w:t>
+      </w:r>
+    </w:p>
+    <w:p>
+      <w:pPr>
+        <w:keepNext/>
+        <w:keepLines/>
+        <w:pBdr>
+          <w:left w:val="single" w:color="808080" w:sz="4"/>
+          <w:right w:val="single" w:color="808080" w:sz="4"/>
+        </w:pBdr>
+        <w:shd w:fill="F2F2F2" w:color="auto" w:val="clear"/>
+        <w:spacing w:after="0" w:line="240"/>
+        <w:ind w:left="100" w:right="100"/>
+      </w:pPr>
+      <w:r>
+        <w:rPr>
+          <w:rFonts w:ascii="Courier New" w:cs="Courier New" w:eastAsia="Courier New" w:hAnsi="Courier New"/>
+          <w:sz w:val="17"/>
+          <w:szCs w:val="17"/>
+        </w:rPr>
+        <w:t xml:space="preserve">s pop printNl.</w:t>
+      </w:r>
+    </w:p>
+    <w:p>
+      <w:pPr>
+        <w:keepNext/>
+        <w:keepLines/>
+        <w:pBdr>
+          <w:left w:val="single" w:color="808080" w:sz="4"/>
+          <w:right w:val="single" w:color="808080" w:sz="4"/>
+        </w:pBdr>
+        <w:shd w:fill="F2F2F2" w:color="auto" w:val="clear"/>
+        <w:spacing w:after="0" w:line="240"/>
+        <w:ind w:left="100" w:right="100"/>
+      </w:pPr>
+      <w:r>
+        <w:rPr>
+          <w:rFonts w:ascii="Courier New" w:cs="Courier New" w:eastAsia="Courier New" w:hAnsi="Courier New"/>
+          <w:sz w:val="17"/>
+          <w:szCs w:val="17"/>
+        </w:rPr>
+        <w:t xml:space="preserve">s printNl.</w:t>
+      </w:r>
+    </w:p>
+    <w:p>
+      <w:pPr>
+        <w:keepNext/>
+        <w:keepLines/>
+        <w:pBdr>
+          <w:left w:val="single" w:color="808080" w:sz="4"/>
+          <w:right w:val="single" w:color="808080" w:sz="4"/>
+        </w:pBdr>
+        <w:shd w:fill="F2F2F2" w:color="auto" w:val="clear"/>
+        <w:spacing w:after="0" w:line="240"/>
+        <w:ind w:left="100" w:right="100"/>
+      </w:pPr>
+      <w:r>
+        <w:rPr>
+          <w:rFonts w:ascii="Courier New" w:cs="Courier New" w:eastAsia="Courier New" w:hAnsi="Courier New"/>
+          <w:sz w:val="17"/>
+          <w:szCs w:val="17"/>
+        </w:rPr>
+        <w:t xml:space="preserve">q := Queue new. q enqueue: 1; enqueue: 2.</w:t>
+      </w:r>
+    </w:p>
+    <w:p>
+      <w:pPr>
+        <w:keepNext/>
+        <w:keepLines/>
+        <w:pBdr>
+          <w:left w:val="single" w:color="808080" w:sz="4"/>
+          <w:right w:val="single" w:color="808080" w:sz="4"/>
+        </w:pBdr>
+        <w:shd w:fill="F2F2F2" w:color="auto" w:val="clear"/>
+        <w:spacing w:after="0" w:line="240"/>
+        <w:ind w:left="100" w:right="100"/>
+      </w:pPr>
+      <w:r>
+        <w:rPr>
+          <w:rFonts w:ascii="Courier New" w:cs="Courier New" w:eastAsia="Courier New" w:hAnsi="Courier New"/>
+          <w:sz w:val="17"/>
+          <w:szCs w:val="17"/>
+        </w:rPr>
+        <w:t xml:space="preserve">q dequeue printNl.</w:t>
+      </w:r>
+    </w:p>
+    <w:p>
+      <w:pPr>
+        <w:keepNext/>
+        <w:keepLines/>
+        <w:pBdr>
+          <w:left w:val="single" w:color="808080" w:sz="4"/>
+          <w:right w:val="single" w:color="808080" w:sz="4"/>
+        </w:pBdr>
+        <w:shd w:fill="F2F2F2" w:color="auto" w:val="clear"/>
+        <w:spacing w:after="0" w:line="240"/>
+        <w:ind w:left="100" w:right="100"/>
+      </w:pPr>
+      <w:r>
+        <w:rPr>
+          <w:rFonts w:ascii="Courier New" w:cs="Courier New" w:eastAsia="Courier New" w:hAnsi="Courier New"/>
+          <w:sz w:val="17"/>
+          <w:szCs w:val="17"/>
+        </w:rPr>
+        <w:t xml:space="preserve">m := Matrix fromRows: #(#(1 2) #(3 4)).</w:t>
+      </w:r>
+    </w:p>
+    <w:p>
+      <w:pPr>
+        <w:keepNext/>
+        <w:keepLines/>
+        <w:pBdr>
+          <w:left w:val="single" w:color="808080" w:sz="4"/>
+          <w:right w:val="single" w:color="808080" w:sz="4"/>
+        </w:pBdr>
+        <w:shd w:fill="F2F2F2" w:color="auto" w:val="clear"/>
+        <w:spacing w:after="0" w:line="240"/>
+        <w:ind w:left="100" w:right="100"/>
+      </w:pPr>
+      <w:r>
+        <w:rPr>
+          <w:rFonts w:ascii="Courier New" w:cs="Courier New" w:eastAsia="Courier New" w:hAnsi="Courier New"/>
+          <w:sz w:val="17"/>
+          <w:szCs w:val="17"/>
+        </w:rPr>
+        <w:t xml:space="preserve">(m * m) printNl.</w:t>
+      </w:r>
+    </w:p>
+    <w:p>
+      <w:pPr>
+        <w:keepNext/>
+        <w:keepLines/>
+        <w:pBdr>
+          <w:left w:val="single" w:color="808080" w:sz="4"/>
+          <w:right w:val="single" w:color="808080" w:sz="4"/>
+        </w:pBdr>
+        <w:shd w:fill="F2F2F2" w:color="auto" w:val="clear"/>
+        <w:spacing w:after="0" w:line="240"/>
+        <w:ind w:left="100" w:right="100"/>
+      </w:pPr>
+      <w:r>
+        <w:rPr>
+          <w:rFonts w:ascii="Courier New" w:cs="Courier New" w:eastAsia="Courier New" w:hAnsi="Courier New"/>
+          <w:sz w:val="17"/>
+          <w:szCs w:val="17"/>
+        </w:rPr>
+        <w:t xml:space="preserve">m determinant printNl.</w:t>
+      </w:r>
+    </w:p>
+    <w:p>
+      <w:pPr>
+        <w:keepNext/>
+        <w:keepLines/>
+        <w:pBdr>
+          <w:left w:val="single" w:color="808080" w:sz="4"/>
+          <w:right w:val="single" w:color="808080" w:sz="4"/>
+        </w:pBdr>
+        <w:shd w:fill="F2F2F2" w:color="auto" w:val="clear"/>
+        <w:spacing w:after="0" w:line="240"/>
+        <w:ind w:left="100" w:right="100"/>
+      </w:pPr>
+      <w:r>
+        <w:rPr>
+          <w:rFonts w:ascii="Courier New" w:cs="Courier New" w:eastAsia="Courier New" w:hAnsi="Courier New"/>
+          <w:sz w:val="17"/>
+          <w:szCs w:val="17"/>
+        </w:rPr>
+        <w:t xml:space="preserve"> </w:t>
+      </w:r>
+    </w:p>
+    <w:p>
+      <w:pPr>
+        <w:keepNext/>
+        <w:keepLines/>
+        <w:pBdr>
+          <w:left w:val="single" w:color="808080" w:sz="4"/>
+          <w:right w:val="single" w:color="808080" w:sz="4"/>
+        </w:pBdr>
+        <w:shd w:fill="F2F2F2" w:color="auto" w:val="clear"/>
+        <w:spacing w:after="0" w:line="240"/>
+        <w:ind w:left="100" w:right="100"/>
+      </w:pPr>
+      <w:r>
+        <w:rPr>
+          <w:rFonts w:ascii="Courier New" w:cs="Courier New" w:eastAsia="Courier New" w:hAnsi="Courier New"/>
+          <w:sz w:val="17"/>
+          <w:szCs w:val="17"/>
+        </w:rPr>
+        <w:t xml:space="preserve">3</w:t>
+      </w:r>
+    </w:p>
+    <w:p>
+      <w:pPr>
+        <w:keepNext/>
+        <w:keepLines/>
+        <w:pBdr>
+          <w:left w:val="single" w:color="808080" w:sz="4"/>
+          <w:right w:val="single" w:color="808080" w:sz="4"/>
+        </w:pBdr>
+        <w:shd w:fill="F2F2F2" w:color="auto" w:val="clear"/>
+        <w:spacing w:after="0" w:line="240"/>
+        <w:ind w:left="100" w:right="100"/>
+      </w:pPr>
+      <w:r>
+        <w:rPr>
+          <w:rFonts w:ascii="Courier New" w:cs="Courier New" w:eastAsia="Courier New" w:hAnsi="Courier New"/>
+          <w:sz w:val="17"/>
+          <w:szCs w:val="17"/>
+        </w:rPr>
+        <w:t xml:space="preserve">Stack(1 2 )</w:t>
+      </w:r>
+    </w:p>
+    <w:p>
+      <w:pPr>
+        <w:keepNext/>
+        <w:keepLines/>
+        <w:pBdr>
+          <w:left w:val="single" w:color="808080" w:sz="4"/>
+          <w:right w:val="single" w:color="808080" w:sz="4"/>
+        </w:pBdr>
+        <w:shd w:fill="F2F2F2" w:color="auto" w:val="clear"/>
+        <w:spacing w:after="0" w:line="240"/>
+        <w:ind w:left="100" w:right="100"/>
+      </w:pPr>
+      <w:r>
+        <w:rPr>
+          <w:rFonts w:ascii="Courier New" w:cs="Courier New" w:eastAsia="Courier New" w:hAnsi="Courier New"/>
+          <w:sz w:val="17"/>
+          <w:szCs w:val="17"/>
+        </w:rPr>
+        <w:t xml:space="preserve">1</w:t>
+      </w:r>
+    </w:p>
+    <w:p>
+      <w:pPr>
+        <w:keepNext/>
+        <w:keepLines/>
+        <w:pBdr>
+          <w:left w:val="single" w:color="808080" w:sz="4"/>
+          <w:right w:val="single" w:color="808080" w:sz="4"/>
+        </w:pBdr>
+        <w:shd w:fill="F2F2F2" w:color="auto" w:val="clear"/>
+        <w:spacing w:after="0" w:line="240"/>
+        <w:ind w:left="100" w:right="100"/>
+      </w:pPr>
+      <w:r>
+        <w:rPr>
+          <w:rFonts w:ascii="Courier New" w:cs="Courier New" w:eastAsia="Courier New" w:hAnsi="Courier New"/>
+          <w:sz w:val="17"/>
+          <w:szCs w:val="17"/>
+        </w:rPr>
+        <w:t xml:space="preserve">[7 10]</w:t>
+      </w:r>
+    </w:p>
+    <w:p>
+      <w:pPr>
+        <w:keepNext/>
+        <w:keepLines/>
+        <w:pBdr>
+          <w:left w:val="single" w:color="808080" w:sz="4"/>
+          <w:right w:val="single" w:color="808080" w:sz="4"/>
+        </w:pBdr>
+        <w:shd w:fill="F2F2F2" w:color="auto" w:val="clear"/>
+        <w:spacing w:after="0" w:line="240"/>
+        <w:ind w:left="100" w:right="100"/>
+      </w:pPr>
+      <w:r>
+        <w:rPr>
+          <w:rFonts w:ascii="Courier New" w:cs="Courier New" w:eastAsia="Courier New" w:hAnsi="Courier New"/>
+          <w:sz w:val="17"/>
+          <w:szCs w:val="17"/>
+        </w:rPr>
+        <w:t xml:space="preserve">[15 22]</w:t>
+      </w:r>
+    </w:p>
+    <w:p>
+      <w:pPr>
+        <w:keepNext w:val="false"/>
+        <w:keepLines/>
+        <w:pBdr>
+          <w:bottom w:val="single" w:color="808080" w:sz="4"/>
+          <w:left w:val="single" w:color="808080" w:sz="4"/>
+          <w:right w:val="single" w:color="808080" w:sz="4"/>
+        </w:pBdr>
+        <w:shd w:fill="F2F2F2" w:color="auto" w:val="clear"/>
+        <w:spacing w:after="0" w:line="240"/>
+        <w:ind w:left="100" w:right="100"/>
+      </w:pPr>
+      <w:r>
+        <w:rPr>
+          <w:rFonts w:ascii="Courier New" w:cs="Courier New" w:eastAsia="Courier New" w:hAnsi="Courier New"/>
+          <w:sz w:val="17"/>
+          <w:szCs w:val="17"/>
+        </w:rPr>
+        <w:t xml:space="preserve">-2</w:t>
+      </w:r>
+    </w:p>
+    <w:p>
+      <w:pPr>
+        <w:spacing w:after="200" w:before="60"/>
+      </w:pPr>
+      <w:r>
+        <w:rPr>
+          <w:rFonts w:ascii="Arial" w:cs="Arial" w:eastAsia="Arial" w:hAnsi="Arial"/>
+          <w:b/>
+          <w:bCs/>
+          <w:sz w:val="18"/>
+          <w:szCs w:val="18"/>
+        </w:rPr>
+        <w:t xml:space="preserve">Figure 32. </w:t>
+      </w:r>
+      <w:r>
+        <w:rPr>
+          <w:rFonts w:ascii="Arial" w:cs="Arial" w:eastAsia="Arial" w:hAnsi="Arial"/>
+          <w:sz w:val="18"/>
+          <w:szCs w:val="18"/>
+        </w:rPr>
+        <w:t xml:space="preserve">Stack, Queue and Matrix</w:t>
       </w:r>
     </w:p>
     <w:p>
@@ -18703,7 +19594,7 @@
           <w:sz w:val="18"/>
           <w:szCs w:val="18"/>
         </w:rPr>
-        <w:t xml:space="preserve">Figure 30. </w:t>
+        <w:t xml:space="preserve">Figure 33. </w:t>
       </w:r>
       <w:r>
         <w:rPr>
@@ -19211,7 +20102,7 @@
           <w:sz w:val="18"/>
           <w:szCs w:val="18"/>
         </w:rPr>
-        <w:t xml:space="preserve">Figure 31. </w:t>
+        <w:t xml:space="preserve">Figure 34. </w:t>
       </w:r>
       <w:r>
         <w:rPr>
@@ -19609,7 +20500,7 @@
           <w:sz w:val="18"/>
           <w:szCs w:val="18"/>
         </w:rPr>
-        <w:t xml:space="preserve">Figure 32. </w:t>
+        <w:t xml:space="preserve">Figure 35. </w:t>
       </w:r>
       <w:r>
         <w:rPr>
@@ -19894,7 +20785,7 @@
           <w:sz w:val="18"/>
           <w:szCs w:val="18"/>
         </w:rPr>
-        <w:t xml:space="preserve">Figure 33. </w:t>
+        <w:t xml:space="preserve">Figure 36. </w:t>
       </w:r>
       <w:r>
         <w:rPr>
@@ -20115,7 +21006,7 @@
           <w:sz w:val="18"/>
           <w:szCs w:val="18"/>
         </w:rPr>
-        <w:t xml:space="preserve">Figure 34. </w:t>
+        <w:t xml:space="preserve">Figure 37. </w:t>
       </w:r>
       <w:r>
         <w:rPr>
@@ -20606,7 +21497,7 @@
           <w:sz w:val="18"/>
           <w:szCs w:val="18"/>
         </w:rPr>
-        <w:t xml:space="preserve">Figure 35. </w:t>
+        <w:t xml:space="preserve">Figure 38. </w:t>
       </w:r>
       <w:r>
         <w:rPr>
@@ -20975,7 +21866,7 @@
           <w:sz w:val="18"/>
           <w:szCs w:val="18"/>
         </w:rPr>
-        <w:t xml:space="preserve">Figure 36. </w:t>
+        <w:t xml:space="preserve">Figure 39. </w:t>
       </w:r>
       <w:r>
         <w:rPr>
@@ -21289,7 +22180,7 @@
           <w:sz w:val="18"/>
           <w:szCs w:val="18"/>
         </w:rPr>
-        <w:t xml:space="preserve">Figure 37. </w:t>
+        <w:t xml:space="preserve">Figure 40. </w:t>
       </w:r>
       <w:r>
         <w:rPr>
@@ -21587,7 +22478,7 @@
           <w:sz w:val="18"/>
           <w:szCs w:val="18"/>
         </w:rPr>
-        <w:t xml:space="preserve">Figure 38. </w:t>
+        <w:t xml:space="preserve">Figure 41. </w:t>
       </w:r>
       <w:r>
         <w:rPr>
@@ -21856,7 +22747,7 @@
           <w:sz w:val="18"/>
           <w:szCs w:val="18"/>
         </w:rPr>
-        <w:t xml:space="preserve">Figure 39. </w:t>
+        <w:t xml:space="preserve">Figure 42. </w:t>
       </w:r>
       <w:r>
         <w:rPr>
@@ -22211,7 +23102,7 @@
           <w:sz w:val="18"/>
           <w:szCs w:val="18"/>
         </w:rPr>
-        <w:t xml:space="preserve">Figure 40. </w:t>
+        <w:t xml:space="preserve">Figure 43. </w:t>
       </w:r>
       <w:r>
         <w:rPr>
@@ -22759,7 +23650,7 @@
           <w:sz w:val="18"/>
           <w:szCs w:val="18"/>
         </w:rPr>
-        <w:t xml:space="preserve">Figure 41. </w:t>
+        <w:t xml:space="preserve">Figure 44. </w:t>
       </w:r>
       <w:r>
         <w:rPr>
@@ -23065,7 +23956,7 @@
           <w:sz w:val="18"/>
           <w:szCs w:val="18"/>
         </w:rPr>
-        <w:t xml:space="preserve">Figure 42. </w:t>
+        <w:t xml:space="preserve">Figure 45. </w:t>
       </w:r>
       <w:r>
         <w:rPr>
@@ -23447,7 +24338,7 @@
           <w:sz w:val="18"/>
           <w:szCs w:val="18"/>
         </w:rPr>
-        <w:t xml:space="preserve">Figure 43. </w:t>
+        <w:t xml:space="preserve">Figure 46. </w:t>
       </w:r>
       <w:r>
         <w:rPr>
@@ -23774,7 +24665,7 @@
           <w:sz w:val="18"/>
           <w:szCs w:val="18"/>
         </w:rPr>
-        <w:t xml:space="preserve">Figure 44. </w:t>
+        <w:t xml:space="preserve">Figure 47. </w:t>
       </w:r>
       <w:r>
         <w:rPr>
@@ -24482,7 +25373,7 @@
           <w:sz w:val="18"/>
           <w:szCs w:val="18"/>
         </w:rPr>
-        <w:t xml:space="preserve">Figure 45. </w:t>
+        <w:t xml:space="preserve">Figure 48. </w:t>
       </w:r>
       <w:r>
         <w:rPr>
@@ -25100,7 +25991,7 @@
           <w:sz w:val="18"/>
           <w:szCs w:val="18"/>
         </w:rPr>
-        <w:t xml:space="preserve">Figure 46. </w:t>
+        <w:t xml:space="preserve">Figure 49. </w:t>
       </w:r>
       <w:r>
         <w:rPr>
@@ -25461,7 +26352,7 @@
           <w:sz w:val="18"/>
           <w:szCs w:val="18"/>
         </w:rPr>
-        <w:t xml:space="preserve">Figure 47. </w:t>
+        <w:t xml:space="preserve">Figure 50. </w:t>
       </w:r>
       <w:r>
         <w:rPr>
@@ -25858,7 +26749,7 @@
           <w:sz w:val="18"/>
           <w:szCs w:val="18"/>
         </w:rPr>
-        <w:t xml:space="preserve">Figure 48. </w:t>
+        <w:t xml:space="preserve">Figure 51. </w:t>
       </w:r>
       <w:r>
         <w:rPr>
@@ -26629,7 +27520,7 @@
           <w:sz w:val="18"/>
           <w:szCs w:val="18"/>
         </w:rPr>
-        <w:t xml:space="preserve">Figure 49. </w:t>
+        <w:t xml:space="preserve">Figure 52. </w:t>
       </w:r>
       <w:r>
         <w:rPr>
@@ -27444,7 +28335,7 @@
           <w:sz w:val="18"/>
           <w:szCs w:val="18"/>
         </w:rPr>
-        <w:t xml:space="preserve">Figure 50. </w:t>
+        <w:t xml:space="preserve">Figure 53. </w:t>
       </w:r>
       <w:r>
         <w:rPr>
@@ -28219,7 +29110,7 @@
           <w:sz w:val="18"/>
           <w:szCs w:val="18"/>
         </w:rPr>
-        <w:t xml:space="preserve">Figure 51. </w:t>
+        <w:t xml:space="preserve">Figure 54. </w:t>
       </w:r>
       <w:r>
         <w:rPr>
@@ -28689,6 +29580,27 @@
           <w:sz w:val="17"/>
           <w:szCs w:val="17"/>
         </w:rPr>
+        <w:t xml:space="preserve">      Complex</w:t>
+      </w:r>
+    </w:p>
+    <w:p>
+      <w:pPr>
+        <w:keepNext/>
+        <w:keepLines/>
+        <w:pBdr>
+          <w:left w:val="single" w:color="808080" w:sz="4"/>
+          <w:right w:val="single" w:color="808080" w:sz="4"/>
+        </w:pBdr>
+        <w:shd w:fill="F2F2F2" w:color="auto" w:val="clear"/>
+        <w:spacing w:after="0" w:line="240"/>
+        <w:ind w:left="100" w:right="100"/>
+      </w:pPr>
+      <w:r>
+        <w:rPr>
+          <w:rFonts w:ascii="Courier New" w:cs="Courier New" w:eastAsia="Courier New" w:hAnsi="Courier New"/>
+          <w:sz w:val="17"/>
+          <w:szCs w:val="17"/>
+        </w:rPr>
         <w:t xml:space="preserve">    LookupKey</w:t>
       </w:r>
     </w:p>
@@ -29068,6 +29980,27 @@
           <w:szCs w:val="17"/>
         </w:rPr>
         <w:t xml:space="preserve">      Bag</w:t>
+      </w:r>
+    </w:p>
+    <w:p>
+      <w:pPr>
+        <w:keepNext/>
+        <w:keepLines/>
+        <w:pBdr>
+          <w:left w:val="single" w:color="808080" w:sz="4"/>
+          <w:right w:val="single" w:color="808080" w:sz="4"/>
+        </w:pBdr>
+        <w:shd w:fill="F2F2F2" w:color="auto" w:val="clear"/>
+        <w:spacing w:after="0" w:line="240"/>
+        <w:ind w:left="100" w:right="100"/>
+      </w:pPr>
+      <w:r>
+        <w:rPr>
+          <w:rFonts w:ascii="Courier New" w:cs="Courier New" w:eastAsia="Courier New" w:hAnsi="Courier New"/>
+          <w:sz w:val="17"/>
+          <w:szCs w:val="17"/>
+        </w:rPr>
+        <w:t xml:space="preserve">  Stack, Queue, Matrix</w:t>
       </w:r>
     </w:p>
     <w:p>
@@ -29314,7 +30247,7 @@
           <w:sz w:val="18"/>
           <w:szCs w:val="18"/>
         </w:rPr>
-        <w:t xml:space="preserve">Figure 52. </w:t>
+        <w:t xml:space="preserve">Figure 55. </w:t>
       </w:r>
       <w:r>
         <w:rPr>
@@ -30032,7 +30965,7 @@
           <w:sz w:val="18"/>
           <w:szCs w:val="18"/>
         </w:rPr>
-        <w:t xml:space="preserve">Figure 53. </w:t>
+        <w:t xml:space="preserve">Figure 56. </w:t>
       </w:r>
       <w:r>
         <w:rPr>

</xml_diff>

<commit_message>
Redefining a library class replaces it (fixes Stack clash); manual note
Co-Authored-By: Claude Sonnet 5.5 <noreply@anthropic.com>
Claude-Session: https://claude.ai/code/session_013PfZHD8os4FWhvmVG9Tf7M
</commit_message>
<xml_diff>
--- a/docs/Smalltalk-CREXX-Guide.docx
+++ b/docs/Smalltalk-CREXX-Guide.docx
@@ -8743,6 +8743,19 @@
           <w:szCs w:val="20"/>
         </w:rPr>
         <w:t xml:space="preserve">A class is declared with the message subclass: in bracket form. The body of the brackets holds instance-variable declarations, class-variable declarations and methods.</w:t>
+      </w:r>
+    </w:p>
+    <w:p>
+      <w:pPr>
+        <w:spacing w:after="120" w:line="264"/>
+      </w:pPr>
+      <w:r>
+        <w:rPr>
+          <w:rFonts w:ascii="Arial" w:cs="Arial" w:eastAsia="Arial" w:hAnsi="Arial"/>
+          <w:sz w:val="20"/>
+          <w:szCs w:val="20"/>
+        </w:rPr>
+        <w:t xml:space="preserve">If the name is already used by a class of the class library, for example Stack, Queue, Matrix or Complex, the declaration replaces that class: its methods and variables are discarded and the program's own definition applies. To add to a library class instead, use extend.</w:t>
       </w:r>
     </w:p>
     <w:p>

</xml_diff>

<commit_message>
Add LinkedList, Stopwatch, wildcard match:, JSON asJson/fromJson
Co-Authored-By: Claude Sonnet 5.5 <noreply@anthropic.com>
Claude-Session: https://claude.ai/code/session_013PfZHD8os4FWhvmVG9Tf7M
</commit_message>
<xml_diff>
--- a/docs/Smalltalk-CREXX-Guide.docx
+++ b/docs/Smalltalk-CREXX-Guide.docx
@@ -1097,6 +1097,25 @@
         <w:tabs>
           <w:tab w:val="right" w:pos="9638" w:leader="dot"/>
         </w:tabs>
+        <w:spacing w:after="0" w:before="0"/>
+        <w:ind w:left="360"/>
+      </w:pPr>
+      <w:r>
+        <w:rPr>
+          <w:rFonts w:ascii="Arial" w:cs="Arial" w:eastAsia="Arial" w:hAnsi="Arial"/>
+          <w:b w:val="false"/>
+          <w:bCs w:val="false"/>
+          <w:sz w:val="18"/>
+          <w:szCs w:val="18"/>
+        </w:rPr>
+        <w:t xml:space="preserve">LinkedList	18</w:t>
+      </w:r>
+    </w:p>
+    <w:p>
+      <w:pPr>
+        <w:tabs>
+          <w:tab w:val="right" w:pos="9638" w:leader="dot"/>
+        </w:tabs>
         <w:spacing w:after="20" w:before="100"/>
         <w:ind w:left="0"/>
       </w:pPr>
@@ -1108,7 +1127,7 @@
           <w:sz w:val="19"/>
           <w:szCs w:val="19"/>
         </w:rPr>
-        <w:t xml:space="preserve">Chapter 7. Strings, Symbols and Characters	19</w:t>
+        <w:t xml:space="preserve">Chapter 7. Strings, Symbols and Characters	20</w:t>
       </w:r>
     </w:p>
     <w:p>
@@ -1127,7 +1146,7 @@
           <w:sz w:val="18"/>
           <w:szCs w:val="18"/>
         </w:rPr>
-        <w:t xml:space="preserve">Strings	19</w:t>
+        <w:t xml:space="preserve">Strings	20</w:t>
       </w:r>
     </w:p>
     <w:p>
@@ -1146,7 +1165,7 @@
           <w:sz w:val="18"/>
           <w:szCs w:val="18"/>
         </w:rPr>
-        <w:t xml:space="preserve">Symbols	19</w:t>
+        <w:t xml:space="preserve">Symbols	20</w:t>
       </w:r>
     </w:p>
     <w:p>
@@ -1165,7 +1184,7 @@
           <w:sz w:val="18"/>
           <w:szCs w:val="18"/>
         </w:rPr>
-        <w:t xml:space="preserve">Characters	20</w:t>
+        <w:t xml:space="preserve">Characters	21</w:t>
       </w:r>
     </w:p>
     <w:p>
@@ -1184,7 +1203,45 @@
           <w:sz w:val="18"/>
           <w:szCs w:val="18"/>
         </w:rPr>
-        <w:t xml:space="preserve">More string methods	20</w:t>
+        <w:t xml:space="preserve">More string methods	21</w:t>
+      </w:r>
+    </w:p>
+    <w:p>
+      <w:pPr>
+        <w:tabs>
+          <w:tab w:val="right" w:pos="9638" w:leader="dot"/>
+        </w:tabs>
+        <w:spacing w:after="0" w:before="0"/>
+        <w:ind w:left="360"/>
+      </w:pPr>
+      <w:r>
+        <w:rPr>
+          <w:rFonts w:ascii="Arial" w:cs="Arial" w:eastAsia="Arial" w:hAnsi="Arial"/>
+          <w:b w:val="false"/>
+          <w:bCs w:val="false"/>
+          <w:sz w:val="18"/>
+          <w:szCs w:val="18"/>
+        </w:rPr>
+        <w:t xml:space="preserve">Wildcard matching	21</w:t>
+      </w:r>
+    </w:p>
+    <w:p>
+      <w:pPr>
+        <w:tabs>
+          <w:tab w:val="right" w:pos="9638" w:leader="dot"/>
+        </w:tabs>
+        <w:spacing w:after="0" w:before="0"/>
+        <w:ind w:left="360"/>
+      </w:pPr>
+      <w:r>
+        <w:rPr>
+          <w:rFonts w:ascii="Arial" w:cs="Arial" w:eastAsia="Arial" w:hAnsi="Arial"/>
+          <w:b w:val="false"/>
+          <w:bCs w:val="false"/>
+          <w:sz w:val="18"/>
+          <w:szCs w:val="18"/>
+        </w:rPr>
+        <w:t xml:space="preserve">JSON	22</w:t>
       </w:r>
     </w:p>
     <w:p>
@@ -1203,7 +1260,7 @@
           <w:sz w:val="19"/>
           <w:szCs w:val="19"/>
         </w:rPr>
-        <w:t xml:space="preserve">Chapter 8. Streams and the Transcript	21</w:t>
+        <w:t xml:space="preserve">Chapter 8. Streams and the Transcript	23</w:t>
       </w:r>
     </w:p>
     <w:p>
@@ -1222,7 +1279,7 @@
           <w:sz w:val="18"/>
           <w:szCs w:val="18"/>
         </w:rPr>
-        <w:t xml:space="preserve">The Transcript	21</w:t>
+        <w:t xml:space="preserve">The Transcript	23</w:t>
       </w:r>
     </w:p>
     <w:p>
@@ -1241,7 +1298,7 @@
           <w:sz w:val="18"/>
           <w:szCs w:val="18"/>
         </w:rPr>
-        <w:t xml:space="preserve">Read streams	21</w:t>
+        <w:t xml:space="preserve">Read streams	23</w:t>
       </w:r>
     </w:p>
     <w:p>
@@ -1260,7 +1317,7 @@
           <w:sz w:val="18"/>
           <w:szCs w:val="18"/>
         </w:rPr>
-        <w:t xml:space="preserve">Write streams	21</w:t>
+        <w:t xml:space="preserve">Write streams	23</w:t>
       </w:r>
     </w:p>
     <w:p>
@@ -1279,7 +1336,7 @@
           <w:sz w:val="18"/>
           <w:szCs w:val="18"/>
         </w:rPr>
-        <w:t xml:space="preserve">Standard input	21</w:t>
+        <w:t xml:space="preserve">Standard input	23</w:t>
       </w:r>
     </w:p>
     <w:p>
@@ -1298,7 +1355,7 @@
           <w:sz w:val="18"/>
           <w:szCs w:val="18"/>
         </w:rPr>
-        <w:t xml:space="preserve">Files	22</w:t>
+        <w:t xml:space="preserve">Files	24</w:t>
       </w:r>
     </w:p>
     <w:p>
@@ -1317,7 +1374,7 @@
           <w:sz w:val="18"/>
           <w:szCs w:val="18"/>
         </w:rPr>
-        <w:t xml:space="preserve">Date and Time	22</w:t>
+        <w:t xml:space="preserve">Date and Time	24</w:t>
       </w:r>
     </w:p>
     <w:p>
@@ -1336,7 +1393,26 @@
           <w:sz w:val="18"/>
           <w:szCs w:val="18"/>
         </w:rPr>
-        <w:t xml:space="preserve">More stream methods	23</w:t>
+        <w:t xml:space="preserve">More stream methods	25</w:t>
+      </w:r>
+    </w:p>
+    <w:p>
+      <w:pPr>
+        <w:tabs>
+          <w:tab w:val="right" w:pos="9638" w:leader="dot"/>
+        </w:tabs>
+        <w:spacing w:after="0" w:before="0"/>
+        <w:ind w:left="360"/>
+      </w:pPr>
+      <w:r>
+        <w:rPr>
+          <w:rFonts w:ascii="Arial" w:cs="Arial" w:eastAsia="Arial" w:hAnsi="Arial"/>
+          <w:b w:val="false"/>
+          <w:bCs w:val="false"/>
+          <w:sz w:val="18"/>
+          <w:szCs w:val="18"/>
+        </w:rPr>
+        <w:t xml:space="preserve">Stopwatch	25</w:t>
       </w:r>
     </w:p>
     <w:p>
@@ -1355,7 +1431,7 @@
           <w:sz w:val="19"/>
           <w:szCs w:val="19"/>
         </w:rPr>
-        <w:t xml:space="preserve">Chapter 9. Exceptions	24</w:t>
+        <w:t xml:space="preserve">Chapter 9. Exceptions	26</w:t>
       </w:r>
     </w:p>
     <w:p>
@@ -1374,7 +1450,7 @@
           <w:sz w:val="18"/>
           <w:szCs w:val="18"/>
         </w:rPr>
-        <w:t xml:space="preserve">Handling	24</w:t>
+        <w:t xml:space="preserve">Handling	26</w:t>
       </w:r>
     </w:p>
     <w:p>
@@ -1393,7 +1469,7 @@
           <w:sz w:val="18"/>
           <w:szCs w:val="18"/>
         </w:rPr>
-        <w:t xml:space="preserve">Messages understood by an exception	24</w:t>
+        <w:t xml:space="preserve">Messages understood by an exception	26</w:t>
       </w:r>
     </w:p>
     <w:p>
@@ -1412,7 +1488,7 @@
           <w:sz w:val="18"/>
           <w:szCs w:val="18"/>
         </w:rPr>
-        <w:t xml:space="preserve">Signaling	24</w:t>
+        <w:t xml:space="preserve">Signaling	26</w:t>
       </w:r>
     </w:p>
     <w:p>
@@ -1431,7 +1507,7 @@
           <w:sz w:val="18"/>
           <w:szCs w:val="18"/>
         </w:rPr>
-        <w:t xml:space="preserve">Cleaning up	25</w:t>
+        <w:t xml:space="preserve">Cleaning up	27</w:t>
       </w:r>
     </w:p>
     <w:p>
@@ -1450,7 +1526,7 @@
           <w:sz w:val="18"/>
           <w:szCs w:val="18"/>
         </w:rPr>
-        <w:t xml:space="preserve">Your own exceptions	25</w:t>
+        <w:t xml:space="preserve">Your own exceptions	27</w:t>
       </w:r>
     </w:p>
     <w:p>
@@ -1469,7 +1545,7 @@
           <w:sz w:val="19"/>
           <w:szCs w:val="19"/>
         </w:rPr>
-        <w:t xml:space="preserve">Chapter 10. Reflection and the System	26</w:t>
+        <w:t xml:space="preserve">Chapter 10. Reflection and the System	28</w:t>
       </w:r>
     </w:p>
     <w:p>
@@ -1488,7 +1564,7 @@
           <w:sz w:val="18"/>
           <w:szCs w:val="18"/>
         </w:rPr>
-        <w:t xml:space="preserve">Asking about objects	26</w:t>
+        <w:t xml:space="preserve">Asking about objects	28</w:t>
       </w:r>
     </w:p>
     <w:p>
@@ -1507,7 +1583,7 @@
           <w:sz w:val="18"/>
           <w:szCs w:val="18"/>
         </w:rPr>
-        <w:t xml:space="preserve">Asking about classes	26</w:t>
+        <w:t xml:space="preserve">Asking about classes	28</w:t>
       </w:r>
     </w:p>
     <w:p>
@@ -1526,7 +1602,7 @@
           <w:sz w:val="18"/>
           <w:szCs w:val="18"/>
         </w:rPr>
-        <w:t xml:space="preserve">The Smalltalk dictionary	26</w:t>
+        <w:t xml:space="preserve">The Smalltalk dictionary	28</w:t>
       </w:r>
     </w:p>
     <w:p>
@@ -1545,7 +1621,7 @@
           <w:sz w:val="19"/>
           <w:szCs w:val="19"/>
         </w:rPr>
-        <w:t xml:space="preserve">Chapter 11. Errors and Traces	28</w:t>
+        <w:t xml:space="preserve">Chapter 11. Errors and Traces	30</w:t>
       </w:r>
     </w:p>
     <w:p>
@@ -1564,7 +1640,7 @@
           <w:sz w:val="18"/>
           <w:szCs w:val="18"/>
         </w:rPr>
-        <w:t xml:space="preserve">Unhandled errors	28</w:t>
+        <w:t xml:space="preserve">Unhandled errors	30</w:t>
       </w:r>
     </w:p>
     <w:p>
@@ -1583,7 +1659,7 @@
           <w:sz w:val="18"/>
           <w:szCs w:val="18"/>
         </w:rPr>
-        <w:t xml:space="preserve">Common messages	28</w:t>
+        <w:t xml:space="preserve">Common messages	30</w:t>
       </w:r>
     </w:p>
     <w:p>
@@ -1602,7 +1678,7 @@
           <w:sz w:val="18"/>
           <w:szCs w:val="18"/>
         </w:rPr>
-        <w:t xml:space="preserve">Parse errors	28</w:t>
+        <w:t xml:space="preserve">Parse errors	30</w:t>
       </w:r>
     </w:p>
     <w:p>
@@ -1621,7 +1697,7 @@
           <w:sz w:val="19"/>
           <w:szCs w:val="19"/>
         </w:rPr>
-        <w:t xml:space="preserve">Chapter 12. How Smalltalk/CREXX Works	29</w:t>
+        <w:t xml:space="preserve">Chapter 12. How Smalltalk/CREXX Works	31</w:t>
       </w:r>
     </w:p>
     <w:p>
@@ -1640,7 +1716,7 @@
           <w:sz w:val="18"/>
           <w:szCs w:val="18"/>
         </w:rPr>
-        <w:t xml:space="preserve">Objects	29</w:t>
+        <w:t xml:space="preserve">Objects	31</w:t>
       </w:r>
     </w:p>
     <w:p>
@@ -1659,7 +1735,7 @@
           <w:sz w:val="18"/>
           <w:szCs w:val="18"/>
         </w:rPr>
-        <w:t xml:space="preserve">Classes and methods	29</w:t>
+        <w:t xml:space="preserve">Classes and methods	31</w:t>
       </w:r>
     </w:p>
     <w:p>
@@ -1678,7 +1754,7 @@
           <w:sz w:val="18"/>
           <w:szCs w:val="18"/>
         </w:rPr>
-        <w:t xml:space="preserve">The resolver	29</w:t>
+        <w:t xml:space="preserve">The resolver	31</w:t>
       </w:r>
     </w:p>
     <w:p>
@@ -1697,7 +1773,7 @@
           <w:sz w:val="18"/>
           <w:szCs w:val="18"/>
         </w:rPr>
-        <w:t xml:space="preserve">The evaluator	29</w:t>
+        <w:t xml:space="preserve">The evaluator	31</w:t>
       </w:r>
     </w:p>
     <w:p>
@@ -1716,7 +1792,7 @@
           <w:sz w:val="18"/>
           <w:szCs w:val="18"/>
         </w:rPr>
-        <w:t xml:space="preserve">Primitives	29</w:t>
+        <w:t xml:space="preserve">Primitives	31</w:t>
       </w:r>
     </w:p>
     <w:p>
@@ -1735,7 +1811,7 @@
           <w:sz w:val="18"/>
           <w:szCs w:val="18"/>
         </w:rPr>
-        <w:t xml:space="preserve">Adding a primitive	29</w:t>
+        <w:t xml:space="preserve">Adding a primitive	31</w:t>
       </w:r>
     </w:p>
     <w:p>
@@ -1754,7 +1830,7 @@
           <w:sz w:val="18"/>
           <w:szCs w:val="18"/>
         </w:rPr>
-        <w:t xml:space="preserve">The build	30</w:t>
+        <w:t xml:space="preserve">The build	32</w:t>
       </w:r>
     </w:p>
     <w:p>
@@ -1773,7 +1849,7 @@
           <w:sz w:val="19"/>
           <w:szCs w:val="19"/>
         </w:rPr>
-        <w:t xml:space="preserve">Chapter 13. Restrictions and Known Problems	31</w:t>
+        <w:t xml:space="preserve">Chapter 13. Restrictions and Known Problems	33</w:t>
       </w:r>
     </w:p>
     <w:p>
@@ -1792,7 +1868,7 @@
           <w:sz w:val="19"/>
           <w:szCs w:val="19"/>
         </w:rPr>
-        <w:t xml:space="preserve">Appendix A. Command Summary	32</w:t>
+        <w:t xml:space="preserve">Appendix A. Command Summary	34</w:t>
       </w:r>
     </w:p>
     <w:p>
@@ -1811,7 +1887,7 @@
           <w:sz w:val="19"/>
           <w:szCs w:val="19"/>
         </w:rPr>
-        <w:t xml:space="preserve">Appendix B. Contents of the Repository	33</w:t>
+        <w:t xml:space="preserve">Appendix B. Contents of the Repository	35</w:t>
       </w:r>
     </w:p>
     <w:p>
@@ -1830,7 +1906,7 @@
           <w:sz w:val="19"/>
           <w:szCs w:val="19"/>
         </w:rPr>
-        <w:t xml:space="preserve">Appendix C. Class Hierarchy	34</w:t>
+        <w:t xml:space="preserve">Appendix C. Class Hierarchy	36</w:t>
       </w:r>
     </w:p>
     <w:p>
@@ -1849,7 +1925,7 @@
           <w:sz w:val="19"/>
           <w:szCs w:val="19"/>
         </w:rPr>
-        <w:t xml:space="preserve">Appendix D. Sample Programs	35</w:t>
+        <w:t xml:space="preserve">Appendix D. Sample Programs	37</w:t>
       </w:r>
     </w:p>
     <w:p>
@@ -18759,6 +18835,249 @@
     </w:p>
     <w:p>
       <w:pPr>
+        <w:pStyle w:val="Heading2"/>
+        <w:keepNext/>
+      </w:pPr>
+      <w:r>
+        <w:rPr>
+          <w:rFonts w:ascii="Arial" w:cs="Arial" w:eastAsia="Arial" w:hAnsi="Arial"/>
+          <w:b/>
+          <w:bCs/>
+          <w:sz w:val="24"/>
+          <w:szCs w:val="24"/>
+        </w:rPr>
+        <w:t xml:space="preserve">LinkedList</w:t>
+      </w:r>
+    </w:p>
+    <w:p>
+      <w:pPr>
+        <w:spacing w:after="120" w:line="264"/>
+      </w:pPr>
+      <w:r>
+        <w:rPr>
+          <w:rFonts w:ascii="Arial" w:cs="Arial" w:eastAsia="Arial" w:hAnsi="Arial"/>
+          <w:sz w:val="20"/>
+          <w:szCs w:val="20"/>
+        </w:rPr>
+        <w:t xml:space="preserve">A LinkedList is a doubly linked collection with fast addFirst:, addLast:, removeFirst and removeLast. It is a Collection, so do:, collect:, inject:into: and the rest work, and it also answers first, last, reverse, reverseDo: and remove:ifAbsent:.</w:t>
+      </w:r>
+    </w:p>
+    <w:p>
+      <w:pPr>
+        <w:keepNext/>
+        <w:keepLines/>
+        <w:pBdr>
+          <w:top w:val="single" w:color="808080" w:sz="4"/>
+          <w:left w:val="single" w:color="808080" w:sz="4"/>
+          <w:right w:val="single" w:color="808080" w:sz="4"/>
+        </w:pBdr>
+        <w:shd w:fill="F2F2F2" w:color="auto" w:val="clear"/>
+        <w:spacing w:after="0" w:line="240"/>
+        <w:ind w:left="100" w:right="100"/>
+      </w:pPr>
+      <w:r>
+        <w:rPr>
+          <w:rFonts w:ascii="Courier New" w:cs="Courier New" w:eastAsia="Courier New" w:hAnsi="Courier New"/>
+          <w:sz w:val="17"/>
+          <w:szCs w:val="17"/>
+        </w:rPr>
+        <w:t xml:space="preserve">| l |</w:t>
+      </w:r>
+    </w:p>
+    <w:p>
+      <w:pPr>
+        <w:keepNext/>
+        <w:keepLines/>
+        <w:pBdr>
+          <w:left w:val="single" w:color="808080" w:sz="4"/>
+          <w:right w:val="single" w:color="808080" w:sz="4"/>
+        </w:pBdr>
+        <w:shd w:fill="F2F2F2" w:color="auto" w:val="clear"/>
+        <w:spacing w:after="0" w:line="240"/>
+        <w:ind w:left="100" w:right="100"/>
+      </w:pPr>
+      <w:r>
+        <w:rPr>
+          <w:rFonts w:ascii="Courier New" w:cs="Courier New" w:eastAsia="Courier New" w:hAnsi="Courier New"/>
+          <w:sz w:val="17"/>
+          <w:szCs w:val="17"/>
+        </w:rPr>
+        <w:t xml:space="preserve">l := LinkedList new. l add: 1; add: 2; addFirst: 0.</w:t>
+      </w:r>
+    </w:p>
+    <w:p>
+      <w:pPr>
+        <w:keepNext/>
+        <w:keepLines/>
+        <w:pBdr>
+          <w:left w:val="single" w:color="808080" w:sz="4"/>
+          <w:right w:val="single" w:color="808080" w:sz="4"/>
+        </w:pBdr>
+        <w:shd w:fill="F2F2F2" w:color="auto" w:val="clear"/>
+        <w:spacing w:after="0" w:line="240"/>
+        <w:ind w:left="100" w:right="100"/>
+      </w:pPr>
+      <w:r>
+        <w:rPr>
+          <w:rFonts w:ascii="Courier New" w:cs="Courier New" w:eastAsia="Courier New" w:hAnsi="Courier New"/>
+          <w:sz w:val="17"/>
+          <w:szCs w:val="17"/>
+        </w:rPr>
+        <w:t xml:space="preserve">l printNl.</w:t>
+      </w:r>
+    </w:p>
+    <w:p>
+      <w:pPr>
+        <w:keepNext/>
+        <w:keepLines/>
+        <w:pBdr>
+          <w:left w:val="single" w:color="808080" w:sz="4"/>
+          <w:right w:val="single" w:color="808080" w:sz="4"/>
+        </w:pBdr>
+        <w:shd w:fill="F2F2F2" w:color="auto" w:val="clear"/>
+        <w:spacing w:after="0" w:line="240"/>
+        <w:ind w:left="100" w:right="100"/>
+      </w:pPr>
+      <w:r>
+        <w:rPr>
+          <w:rFonts w:ascii="Courier New" w:cs="Courier New" w:eastAsia="Courier New" w:hAnsi="Courier New"/>
+          <w:sz w:val="17"/>
+          <w:szCs w:val="17"/>
+        </w:rPr>
+        <w:t xml:space="preserve">l removeFirst printNl.</w:t>
+      </w:r>
+    </w:p>
+    <w:p>
+      <w:pPr>
+        <w:keepNext/>
+        <w:keepLines/>
+        <w:pBdr>
+          <w:left w:val="single" w:color="808080" w:sz="4"/>
+          <w:right w:val="single" w:color="808080" w:sz="4"/>
+        </w:pBdr>
+        <w:shd w:fill="F2F2F2" w:color="auto" w:val="clear"/>
+        <w:spacing w:after="0" w:line="240"/>
+        <w:ind w:left="100" w:right="100"/>
+      </w:pPr>
+      <w:r>
+        <w:rPr>
+          <w:rFonts w:ascii="Courier New" w:cs="Courier New" w:eastAsia="Courier New" w:hAnsi="Courier New"/>
+          <w:sz w:val="17"/>
+          <w:szCs w:val="17"/>
+        </w:rPr>
+        <w:t xml:space="preserve">l reverse printNl.</w:t>
+      </w:r>
+    </w:p>
+    <w:p>
+      <w:pPr>
+        <w:keepNext/>
+        <w:keepLines/>
+        <w:pBdr>
+          <w:left w:val="single" w:color="808080" w:sz="4"/>
+          <w:right w:val="single" w:color="808080" w:sz="4"/>
+        </w:pBdr>
+        <w:shd w:fill="F2F2F2" w:color="auto" w:val="clear"/>
+        <w:spacing w:after="0" w:line="240"/>
+        <w:ind w:left="100" w:right="100"/>
+      </w:pPr>
+      <w:r>
+        <w:rPr>
+          <w:rFonts w:ascii="Courier New" w:cs="Courier New" w:eastAsia="Courier New" w:hAnsi="Courier New"/>
+          <w:sz w:val="17"/>
+          <w:szCs w:val="17"/>
+        </w:rPr>
+        <w:t xml:space="preserve"> </w:t>
+      </w:r>
+    </w:p>
+    <w:p>
+      <w:pPr>
+        <w:keepNext/>
+        <w:keepLines/>
+        <w:pBdr>
+          <w:left w:val="single" w:color="808080" w:sz="4"/>
+          <w:right w:val="single" w:color="808080" w:sz="4"/>
+        </w:pBdr>
+        <w:shd w:fill="F2F2F2" w:color="auto" w:val="clear"/>
+        <w:spacing w:after="0" w:line="240"/>
+        <w:ind w:left="100" w:right="100"/>
+      </w:pPr>
+      <w:r>
+        <w:rPr>
+          <w:rFonts w:ascii="Courier New" w:cs="Courier New" w:eastAsia="Courier New" w:hAnsi="Courier New"/>
+          <w:sz w:val="17"/>
+          <w:szCs w:val="17"/>
+        </w:rPr>
+        <w:t xml:space="preserve">LinkedList(0 1 2 )</w:t>
+      </w:r>
+    </w:p>
+    <w:p>
+      <w:pPr>
+        <w:keepNext/>
+        <w:keepLines/>
+        <w:pBdr>
+          <w:left w:val="single" w:color="808080" w:sz="4"/>
+          <w:right w:val="single" w:color="808080" w:sz="4"/>
+        </w:pBdr>
+        <w:shd w:fill="F2F2F2" w:color="auto" w:val="clear"/>
+        <w:spacing w:after="0" w:line="240"/>
+        <w:ind w:left="100" w:right="100"/>
+      </w:pPr>
+      <w:r>
+        <w:rPr>
+          <w:rFonts w:ascii="Courier New" w:cs="Courier New" w:eastAsia="Courier New" w:hAnsi="Courier New"/>
+          <w:sz w:val="17"/>
+          <w:szCs w:val="17"/>
+        </w:rPr>
+        <w:t xml:space="preserve">0</w:t>
+      </w:r>
+    </w:p>
+    <w:p>
+      <w:pPr>
+        <w:keepNext w:val="false"/>
+        <w:keepLines/>
+        <w:pBdr>
+          <w:bottom w:val="single" w:color="808080" w:sz="4"/>
+          <w:left w:val="single" w:color="808080" w:sz="4"/>
+          <w:right w:val="single" w:color="808080" w:sz="4"/>
+        </w:pBdr>
+        <w:shd w:fill="F2F2F2" w:color="auto" w:val="clear"/>
+        <w:spacing w:after="0" w:line="240"/>
+        <w:ind w:left="100" w:right="100"/>
+      </w:pPr>
+      <w:r>
+        <w:rPr>
+          <w:rFonts w:ascii="Courier New" w:cs="Courier New" w:eastAsia="Courier New" w:hAnsi="Courier New"/>
+          <w:sz w:val="17"/>
+          <w:szCs w:val="17"/>
+        </w:rPr>
+        <w:t xml:space="preserve">LinkedList(2 1 )</w:t>
+      </w:r>
+    </w:p>
+    <w:p>
+      <w:pPr>
+        <w:spacing w:after="200" w:before="60"/>
+      </w:pPr>
+      <w:r>
+        <w:rPr>
+          <w:rFonts w:ascii="Arial" w:cs="Arial" w:eastAsia="Arial" w:hAnsi="Arial"/>
+          <w:b/>
+          <w:bCs/>
+          <w:sz w:val="18"/>
+          <w:szCs w:val="18"/>
+        </w:rPr>
+        <w:t xml:space="preserve">Figure 33. </w:t>
+      </w:r>
+      <w:r>
+        <w:rPr>
+          <w:rFonts w:ascii="Arial" w:cs="Arial" w:eastAsia="Arial" w:hAnsi="Arial"/>
+          <w:sz w:val="18"/>
+          <w:szCs w:val="18"/>
+        </w:rPr>
+        <w:t xml:space="preserve">A LinkedList</w:t>
+      </w:r>
+    </w:p>
+    <w:p>
+      <w:pPr>
         <w:pStyle w:val="Heading1"/>
         <w:pageBreakBefore/>
         <w:pBdr>
@@ -19607,7 +19926,7 @@
           <w:sz w:val="18"/>
           <w:szCs w:val="18"/>
         </w:rPr>
-        <w:t xml:space="preserve">Figure 33. </w:t>
+        <w:t xml:space="preserve">Figure 34. </w:t>
       </w:r>
       <w:r>
         <w:rPr>
@@ -20115,7 +20434,7 @@
           <w:sz w:val="18"/>
           <w:szCs w:val="18"/>
         </w:rPr>
-        <w:t xml:space="preserve">Figure 34. </w:t>
+        <w:t xml:space="preserve">Figure 35. </w:t>
       </w:r>
       <w:r>
         <w:rPr>
@@ -20513,7 +20832,7 @@
           <w:sz w:val="18"/>
           <w:szCs w:val="18"/>
         </w:rPr>
-        <w:t xml:space="preserve">Figure 35. </w:t>
+        <w:t xml:space="preserve">Figure 36. </w:t>
       </w:r>
       <w:r>
         <w:rPr>
@@ -20798,7 +21117,7 @@
           <w:sz w:val="18"/>
           <w:szCs w:val="18"/>
         </w:rPr>
-        <w:t xml:space="preserve">Figure 36. </w:t>
+        <w:t xml:space="preserve">Figure 37. </w:t>
       </w:r>
       <w:r>
         <w:rPr>
@@ -20807,6 +21126,492 @@
           <w:szCs w:val="18"/>
         </w:rPr>
         <w:t xml:space="preserve">Cutting, padding and formatting</w:t>
+      </w:r>
+    </w:p>
+    <w:p>
+      <w:pPr>
+        <w:pStyle w:val="Heading2"/>
+        <w:keepNext/>
+      </w:pPr>
+      <w:r>
+        <w:rPr>
+          <w:rFonts w:ascii="Arial" w:cs="Arial" w:eastAsia="Arial" w:hAnsi="Arial"/>
+          <w:b/>
+          <w:bCs/>
+          <w:sz w:val="24"/>
+          <w:szCs w:val="24"/>
+        </w:rPr>
+        <w:t xml:space="preserve">Wildcard matching</w:t>
+      </w:r>
+    </w:p>
+    <w:p>
+      <w:pPr>
+        <w:spacing w:after="120" w:line="264"/>
+      </w:pPr>
+      <w:r>
+        <w:rPr>
+          <w:rFonts w:ascii="Arial" w:cs="Arial" w:eastAsia="Arial" w:hAnsi="Arial"/>
+          <w:sz w:val="20"/>
+          <w:szCs w:val="20"/>
+        </w:rPr>
+        <w:t xml:space="preserve">pattern match: text compares a string against a pattern in which * stands for any run of characters and # for any one character. The comparison ignores case.</w:t>
+      </w:r>
+    </w:p>
+    <w:p>
+      <w:pPr>
+        <w:keepNext/>
+        <w:keepLines/>
+        <w:pBdr>
+          <w:top w:val="single" w:color="808080" w:sz="4"/>
+          <w:left w:val="single" w:color="808080" w:sz="4"/>
+          <w:right w:val="single" w:color="808080" w:sz="4"/>
+        </w:pBdr>
+        <w:shd w:fill="F2F2F2" w:color="auto" w:val="clear"/>
+        <w:spacing w:after="0" w:line="240"/>
+        <w:ind w:left="100" w:right="100"/>
+      </w:pPr>
+      <w:r>
+        <w:rPr>
+          <w:rFonts w:ascii="Courier New" w:cs="Courier New" w:eastAsia="Courier New" w:hAnsi="Courier New"/>
+          <w:sz w:val="17"/>
+          <w:szCs w:val="17"/>
+        </w:rPr>
+        <w:t xml:space="preserve">('h*o' match: 'hello') printNl.</w:t>
+      </w:r>
+    </w:p>
+    <w:p>
+      <w:pPr>
+        <w:keepNext/>
+        <w:keepLines/>
+        <w:pBdr>
+          <w:left w:val="single" w:color="808080" w:sz="4"/>
+          <w:right w:val="single" w:color="808080" w:sz="4"/>
+        </w:pBdr>
+        <w:shd w:fill="F2F2F2" w:color="auto" w:val="clear"/>
+        <w:spacing w:after="0" w:line="240"/>
+        <w:ind w:left="100" w:right="100"/>
+      </w:pPr>
+      <w:r>
+        <w:rPr>
+          <w:rFonts w:ascii="Courier New" w:cs="Courier New" w:eastAsia="Courier New" w:hAnsi="Courier New"/>
+          <w:sz w:val="17"/>
+          <w:szCs w:val="17"/>
+        </w:rPr>
+        <w:t xml:space="preserve">('h#llo' match: 'hello') printNl.</w:t>
+      </w:r>
+    </w:p>
+    <w:p>
+      <w:pPr>
+        <w:keepNext/>
+        <w:keepLines/>
+        <w:pBdr>
+          <w:left w:val="single" w:color="808080" w:sz="4"/>
+          <w:right w:val="single" w:color="808080" w:sz="4"/>
+        </w:pBdr>
+        <w:shd w:fill="F2F2F2" w:color="auto" w:val="clear"/>
+        <w:spacing w:after="0" w:line="240"/>
+        <w:ind w:left="100" w:right="100"/>
+      </w:pPr>
+      <w:r>
+        <w:rPr>
+          <w:rFonts w:ascii="Courier New" w:cs="Courier New" w:eastAsia="Courier New" w:hAnsi="Courier New"/>
+          <w:sz w:val="17"/>
+          <w:szCs w:val="17"/>
+        </w:rPr>
+        <w:t xml:space="preserve">('h*x' match: 'hello') printNl.</w:t>
+      </w:r>
+    </w:p>
+    <w:p>
+      <w:pPr>
+        <w:keepNext/>
+        <w:keepLines/>
+        <w:pBdr>
+          <w:left w:val="single" w:color="808080" w:sz="4"/>
+          <w:right w:val="single" w:color="808080" w:sz="4"/>
+        </w:pBdr>
+        <w:shd w:fill="F2F2F2" w:color="auto" w:val="clear"/>
+        <w:spacing w:after="0" w:line="240"/>
+        <w:ind w:left="100" w:right="100"/>
+      </w:pPr>
+      <w:r>
+        <w:rPr>
+          <w:rFonts w:ascii="Courier New" w:cs="Courier New" w:eastAsia="Courier New" w:hAnsi="Courier New"/>
+          <w:sz w:val="17"/>
+          <w:szCs w:val="17"/>
+        </w:rPr>
+        <w:t xml:space="preserve"> </w:t>
+      </w:r>
+    </w:p>
+    <w:p>
+      <w:pPr>
+        <w:keepNext/>
+        <w:keepLines/>
+        <w:pBdr>
+          <w:left w:val="single" w:color="808080" w:sz="4"/>
+          <w:right w:val="single" w:color="808080" w:sz="4"/>
+        </w:pBdr>
+        <w:shd w:fill="F2F2F2" w:color="auto" w:val="clear"/>
+        <w:spacing w:after="0" w:line="240"/>
+        <w:ind w:left="100" w:right="100"/>
+      </w:pPr>
+      <w:r>
+        <w:rPr>
+          <w:rFonts w:ascii="Courier New" w:cs="Courier New" w:eastAsia="Courier New" w:hAnsi="Courier New"/>
+          <w:sz w:val="17"/>
+          <w:szCs w:val="17"/>
+        </w:rPr>
+        <w:t xml:space="preserve">true</w:t>
+      </w:r>
+    </w:p>
+    <w:p>
+      <w:pPr>
+        <w:keepNext/>
+        <w:keepLines/>
+        <w:pBdr>
+          <w:left w:val="single" w:color="808080" w:sz="4"/>
+          <w:right w:val="single" w:color="808080" w:sz="4"/>
+        </w:pBdr>
+        <w:shd w:fill="F2F2F2" w:color="auto" w:val="clear"/>
+        <w:spacing w:after="0" w:line="240"/>
+        <w:ind w:left="100" w:right="100"/>
+      </w:pPr>
+      <w:r>
+        <w:rPr>
+          <w:rFonts w:ascii="Courier New" w:cs="Courier New" w:eastAsia="Courier New" w:hAnsi="Courier New"/>
+          <w:sz w:val="17"/>
+          <w:szCs w:val="17"/>
+        </w:rPr>
+        <w:t xml:space="preserve">true</w:t>
+      </w:r>
+    </w:p>
+    <w:p>
+      <w:pPr>
+        <w:keepNext w:val="false"/>
+        <w:keepLines/>
+        <w:pBdr>
+          <w:bottom w:val="single" w:color="808080" w:sz="4"/>
+          <w:left w:val="single" w:color="808080" w:sz="4"/>
+          <w:right w:val="single" w:color="808080" w:sz="4"/>
+        </w:pBdr>
+        <w:shd w:fill="F2F2F2" w:color="auto" w:val="clear"/>
+        <w:spacing w:after="0" w:line="240"/>
+        <w:ind w:left="100" w:right="100"/>
+      </w:pPr>
+      <w:r>
+        <w:rPr>
+          <w:rFonts w:ascii="Courier New" w:cs="Courier New" w:eastAsia="Courier New" w:hAnsi="Courier New"/>
+          <w:sz w:val="17"/>
+          <w:szCs w:val="17"/>
+        </w:rPr>
+        <w:t xml:space="preserve">false</w:t>
+      </w:r>
+    </w:p>
+    <w:p>
+      <w:pPr>
+        <w:spacing w:after="200" w:before="60"/>
+      </w:pPr>
+      <w:r>
+        <w:rPr>
+          <w:rFonts w:ascii="Arial" w:cs="Arial" w:eastAsia="Arial" w:hAnsi="Arial"/>
+          <w:b/>
+          <w:bCs/>
+          <w:sz w:val="18"/>
+          <w:szCs w:val="18"/>
+        </w:rPr>
+        <w:t xml:space="preserve">Figure 38. </w:t>
+      </w:r>
+      <w:r>
+        <w:rPr>
+          <w:rFonts w:ascii="Arial" w:cs="Arial" w:eastAsia="Arial" w:hAnsi="Arial"/>
+          <w:sz w:val="18"/>
+          <w:szCs w:val="18"/>
+        </w:rPr>
+        <w:t xml:space="preserve">Matching</w:t>
+      </w:r>
+    </w:p>
+    <w:p>
+      <w:pPr>
+        <w:pStyle w:val="Heading2"/>
+        <w:keepNext/>
+      </w:pPr>
+      <w:r>
+        <w:rPr>
+          <w:rFonts w:ascii="Arial" w:cs="Arial" w:eastAsia="Arial" w:hAnsi="Arial"/>
+          <w:b/>
+          <w:bCs/>
+          <w:sz w:val="24"/>
+          <w:szCs w:val="24"/>
+        </w:rPr>
+        <w:t xml:space="preserve">JSON</w:t>
+      </w:r>
+    </w:p>
+    <w:p>
+      <w:pPr>
+        <w:spacing w:after="120" w:line="264"/>
+      </w:pPr>
+      <w:r>
+        <w:rPr>
+          <w:rFonts w:ascii="Arial" w:cs="Arial" w:eastAsia="Arial" w:hAnsi="Arial"/>
+          <w:sz w:val="20"/>
+          <w:szCs w:val="20"/>
+        </w:rPr>
+        <w:t xml:space="preserve">asJson answers the JSON text for nil, Booleans, numbers, Strings, Symbols, collections and Dictionaries, with Dictionary keys in sorted order. fromJson reads JSON text and answers Dictionaries, Arrays, Strings, numbers, Booleans and nil. Malformed text is an error.</w:t>
+      </w:r>
+    </w:p>
+    <w:p>
+      <w:pPr>
+        <w:keepNext/>
+        <w:keepLines/>
+        <w:pBdr>
+          <w:top w:val="single" w:color="808080" w:sz="4"/>
+          <w:left w:val="single" w:color="808080" w:sz="4"/>
+          <w:right w:val="single" w:color="808080" w:sz="4"/>
+        </w:pBdr>
+        <w:shd w:fill="F2F2F2" w:color="auto" w:val="clear"/>
+        <w:spacing w:after="0" w:line="240"/>
+        <w:ind w:left="100" w:right="100"/>
+      </w:pPr>
+      <w:r>
+        <w:rPr>
+          <w:rFonts w:ascii="Courier New" w:cs="Courier New" w:eastAsia="Courier New" w:hAnsi="Courier New"/>
+          <w:sz w:val="17"/>
+          <w:szCs w:val="17"/>
+        </w:rPr>
+        <w:t xml:space="preserve">| d j |</w:t>
+      </w:r>
+    </w:p>
+    <w:p>
+      <w:pPr>
+        <w:keepNext/>
+        <w:keepLines/>
+        <w:pBdr>
+          <w:left w:val="single" w:color="808080" w:sz="4"/>
+          <w:right w:val="single" w:color="808080" w:sz="4"/>
+        </w:pBdr>
+        <w:shd w:fill="F2F2F2" w:color="auto" w:val="clear"/>
+        <w:spacing w:after="0" w:line="240"/>
+        <w:ind w:left="100" w:right="100"/>
+      </w:pPr>
+      <w:r>
+        <w:rPr>
+          <w:rFonts w:ascii="Courier New" w:cs="Courier New" w:eastAsia="Courier New" w:hAnsi="Courier New"/>
+          <w:sz w:val="17"/>
+          <w:szCs w:val="17"/>
+        </w:rPr>
+        <w:t xml:space="preserve">d := Dictionary new.</w:t>
+      </w:r>
+    </w:p>
+    <w:p>
+      <w:pPr>
+        <w:keepNext/>
+        <w:keepLines/>
+        <w:pBdr>
+          <w:left w:val="single" w:color="808080" w:sz="4"/>
+          <w:right w:val="single" w:color="808080" w:sz="4"/>
+        </w:pBdr>
+        <w:shd w:fill="F2F2F2" w:color="auto" w:val="clear"/>
+        <w:spacing w:after="0" w:line="240"/>
+        <w:ind w:left="100" w:right="100"/>
+      </w:pPr>
+      <w:r>
+        <w:rPr>
+          <w:rFonts w:ascii="Courier New" w:cs="Courier New" w:eastAsia="Courier New" w:hAnsi="Courier New"/>
+          <w:sz w:val="17"/>
+          <w:szCs w:val="17"/>
+        </w:rPr>
+        <w:t xml:space="preserve">d at: 'name' put: 'Ann'; at: 'tags' put: #('a' 'b'); at: 'ok' put: true.</w:t>
+      </w:r>
+    </w:p>
+    <w:p>
+      <w:pPr>
+        <w:keepNext/>
+        <w:keepLines/>
+        <w:pBdr>
+          <w:left w:val="single" w:color="808080" w:sz="4"/>
+          <w:right w:val="single" w:color="808080" w:sz="4"/>
+        </w:pBdr>
+        <w:shd w:fill="F2F2F2" w:color="auto" w:val="clear"/>
+        <w:spacing w:after="0" w:line="240"/>
+        <w:ind w:left="100" w:right="100"/>
+      </w:pPr>
+      <w:r>
+        <w:rPr>
+          <w:rFonts w:ascii="Courier New" w:cs="Courier New" w:eastAsia="Courier New" w:hAnsi="Courier New"/>
+          <w:sz w:val="17"/>
+          <w:szCs w:val="17"/>
+        </w:rPr>
+        <w:t xml:space="preserve">d asJson displayNl.</w:t>
+      </w:r>
+    </w:p>
+    <w:p>
+      <w:pPr>
+        <w:keepNext/>
+        <w:keepLines/>
+        <w:pBdr>
+          <w:left w:val="single" w:color="808080" w:sz="4"/>
+          <w:right w:val="single" w:color="808080" w:sz="4"/>
+        </w:pBdr>
+        <w:shd w:fill="F2F2F2" w:color="auto" w:val="clear"/>
+        <w:spacing w:after="0" w:line="240"/>
+        <w:ind w:left="100" w:right="100"/>
+      </w:pPr>
+      <w:r>
+        <w:rPr>
+          <w:rFonts w:ascii="Courier New" w:cs="Courier New" w:eastAsia="Courier New" w:hAnsi="Courier New"/>
+          <w:sz w:val="17"/>
+          <w:szCs w:val="17"/>
+        </w:rPr>
+        <w:t xml:space="preserve">j := '{"a": [1, 2.5, null], "b": {"c": -3}}' fromJson.</w:t>
+      </w:r>
+    </w:p>
+    <w:p>
+      <w:pPr>
+        <w:keepNext/>
+        <w:keepLines/>
+        <w:pBdr>
+          <w:left w:val="single" w:color="808080" w:sz="4"/>
+          <w:right w:val="single" w:color="808080" w:sz="4"/>
+        </w:pBdr>
+        <w:shd w:fill="F2F2F2" w:color="auto" w:val="clear"/>
+        <w:spacing w:after="0" w:line="240"/>
+        <w:ind w:left="100" w:right="100"/>
+      </w:pPr>
+      <w:r>
+        <w:rPr>
+          <w:rFonts w:ascii="Courier New" w:cs="Courier New" w:eastAsia="Courier New" w:hAnsi="Courier New"/>
+          <w:sz w:val="17"/>
+          <w:szCs w:val="17"/>
+        </w:rPr>
+        <w:t xml:space="preserve">(j at: 'a') printNl.</w:t>
+      </w:r>
+    </w:p>
+    <w:p>
+      <w:pPr>
+        <w:keepNext/>
+        <w:keepLines/>
+        <w:pBdr>
+          <w:left w:val="single" w:color="808080" w:sz="4"/>
+          <w:right w:val="single" w:color="808080" w:sz="4"/>
+        </w:pBdr>
+        <w:shd w:fill="F2F2F2" w:color="auto" w:val="clear"/>
+        <w:spacing w:after="0" w:line="240"/>
+        <w:ind w:left="100" w:right="100"/>
+      </w:pPr>
+      <w:r>
+        <w:rPr>
+          <w:rFonts w:ascii="Courier New" w:cs="Courier New" w:eastAsia="Courier New" w:hAnsi="Courier New"/>
+          <w:sz w:val="17"/>
+          <w:szCs w:val="17"/>
+        </w:rPr>
+        <w:t xml:space="preserve">((j at: 'b') at: 'c') printNl.</w:t>
+      </w:r>
+    </w:p>
+    <w:p>
+      <w:pPr>
+        <w:keepNext/>
+        <w:keepLines/>
+        <w:pBdr>
+          <w:left w:val="single" w:color="808080" w:sz="4"/>
+          <w:right w:val="single" w:color="808080" w:sz="4"/>
+        </w:pBdr>
+        <w:shd w:fill="F2F2F2" w:color="auto" w:val="clear"/>
+        <w:spacing w:after="0" w:line="240"/>
+        <w:ind w:left="100" w:right="100"/>
+      </w:pPr>
+      <w:r>
+        <w:rPr>
+          <w:rFonts w:ascii="Courier New" w:cs="Courier New" w:eastAsia="Courier New" w:hAnsi="Courier New"/>
+          <w:sz w:val="17"/>
+          <w:szCs w:val="17"/>
+        </w:rPr>
+        <w:t xml:space="preserve"> </w:t>
+      </w:r>
+    </w:p>
+    <w:p>
+      <w:pPr>
+        <w:keepNext/>
+        <w:keepLines/>
+        <w:pBdr>
+          <w:left w:val="single" w:color="808080" w:sz="4"/>
+          <w:right w:val="single" w:color="808080" w:sz="4"/>
+        </w:pBdr>
+        <w:shd w:fill="F2F2F2" w:color="auto" w:val="clear"/>
+        <w:spacing w:after="0" w:line="240"/>
+        <w:ind w:left="100" w:right="100"/>
+      </w:pPr>
+      <w:r>
+        <w:rPr>
+          <w:rFonts w:ascii="Courier New" w:cs="Courier New" w:eastAsia="Courier New" w:hAnsi="Courier New"/>
+          <w:sz w:val="17"/>
+          <w:szCs w:val="17"/>
+        </w:rPr>
+        <w:t xml:space="preserve">{"name":"Ann","ok":true,"tags":["a","b"]}</w:t>
+      </w:r>
+    </w:p>
+    <w:p>
+      <w:pPr>
+        <w:keepNext/>
+        <w:keepLines/>
+        <w:pBdr>
+          <w:left w:val="single" w:color="808080" w:sz="4"/>
+          <w:right w:val="single" w:color="808080" w:sz="4"/>
+        </w:pBdr>
+        <w:shd w:fill="F2F2F2" w:color="auto" w:val="clear"/>
+        <w:spacing w:after="0" w:line="240"/>
+        <w:ind w:left="100" w:right="100"/>
+      </w:pPr>
+      <w:r>
+        <w:rPr>
+          <w:rFonts w:ascii="Courier New" w:cs="Courier New" w:eastAsia="Courier New" w:hAnsi="Courier New"/>
+          <w:sz w:val="17"/>
+          <w:szCs w:val="17"/>
+        </w:rPr>
+        <w:t xml:space="preserve">(1 2.5 nil )</w:t>
+      </w:r>
+    </w:p>
+    <w:p>
+      <w:pPr>
+        <w:keepNext w:val="false"/>
+        <w:keepLines/>
+        <w:pBdr>
+          <w:bottom w:val="single" w:color="808080" w:sz="4"/>
+          <w:left w:val="single" w:color="808080" w:sz="4"/>
+          <w:right w:val="single" w:color="808080" w:sz="4"/>
+        </w:pBdr>
+        <w:shd w:fill="F2F2F2" w:color="auto" w:val="clear"/>
+        <w:spacing w:after="0" w:line="240"/>
+        <w:ind w:left="100" w:right="100"/>
+      </w:pPr>
+      <w:r>
+        <w:rPr>
+          <w:rFonts w:ascii="Courier New" w:cs="Courier New" w:eastAsia="Courier New" w:hAnsi="Courier New"/>
+          <w:sz w:val="17"/>
+          <w:szCs w:val="17"/>
+        </w:rPr>
+        <w:t xml:space="preserve">-3</w:t>
+      </w:r>
+    </w:p>
+    <w:p>
+      <w:pPr>
+        <w:spacing w:after="200" w:before="60"/>
+      </w:pPr>
+      <w:r>
+        <w:rPr>
+          <w:rFonts w:ascii="Arial" w:cs="Arial" w:eastAsia="Arial" w:hAnsi="Arial"/>
+          <w:b/>
+          <w:bCs/>
+          <w:sz w:val="18"/>
+          <w:szCs w:val="18"/>
+        </w:rPr>
+        <w:t xml:space="preserve">Figure 39. </w:t>
+      </w:r>
+      <w:r>
+        <w:rPr>
+          <w:rFonts w:ascii="Arial" w:cs="Arial" w:eastAsia="Arial" w:hAnsi="Arial"/>
+          <w:sz w:val="18"/>
+          <w:szCs w:val="18"/>
+        </w:rPr>
+        <w:t xml:space="preserve">JSON</w:t>
       </w:r>
     </w:p>
     <w:p>
@@ -21019,7 +21824,7 @@
           <w:sz w:val="18"/>
           <w:szCs w:val="18"/>
         </w:rPr>
-        <w:t xml:space="preserve">Figure 37. </w:t>
+        <w:t xml:space="preserve">Figure 40. </w:t>
       </w:r>
       <w:r>
         <w:rPr>
@@ -21510,7 +22315,7 @@
           <w:sz w:val="18"/>
           <w:szCs w:val="18"/>
         </w:rPr>
-        <w:t xml:space="preserve">Figure 38. </w:t>
+        <w:t xml:space="preserve">Figure 41. </w:t>
       </w:r>
       <w:r>
         <w:rPr>
@@ -21879,7 +22684,7 @@
           <w:sz w:val="18"/>
           <w:szCs w:val="18"/>
         </w:rPr>
-        <w:t xml:space="preserve">Figure 39. </w:t>
+        <w:t xml:space="preserve">Figure 42. </w:t>
       </w:r>
       <w:r>
         <w:rPr>
@@ -22193,7 +22998,7 @@
           <w:sz w:val="18"/>
           <w:szCs w:val="18"/>
         </w:rPr>
-        <w:t xml:space="preserve">Figure 40. </w:t>
+        <w:t xml:space="preserve">Figure 43. </w:t>
       </w:r>
       <w:r>
         <w:rPr>
@@ -22491,7 +23296,7 @@
           <w:sz w:val="18"/>
           <w:szCs w:val="18"/>
         </w:rPr>
-        <w:t xml:space="preserve">Figure 41. </w:t>
+        <w:t xml:space="preserve">Figure 44. </w:t>
       </w:r>
       <w:r>
         <w:rPr>
@@ -22760,7 +23565,7 @@
           <w:sz w:val="18"/>
           <w:szCs w:val="18"/>
         </w:rPr>
-        <w:t xml:space="preserve">Figure 42. </w:t>
+        <w:t xml:space="preserve">Figure 45. </w:t>
       </w:r>
       <w:r>
         <w:rPr>
@@ -22802,6 +23607,35 @@
     </w:p>
     <w:p>
       <w:pPr>
+        <w:pStyle w:val="Heading2"/>
+        <w:keepNext/>
+      </w:pPr>
+      <w:r>
+        <w:rPr>
+          <w:rFonts w:ascii="Arial" w:cs="Arial" w:eastAsia="Arial" w:hAnsi="Arial"/>
+          <w:b/>
+          <w:bCs/>
+          <w:sz w:val="24"/>
+          <w:szCs w:val="24"/>
+        </w:rPr>
+        <w:t xml:space="preserve">Stopwatch</w:t>
+      </w:r>
+    </w:p>
+    <w:p>
+      <w:pPr>
+        <w:spacing w:after="120" w:line="264"/>
+      </w:pPr>
+      <w:r>
+        <w:rPr>
+          <w:rFonts w:ascii="Arial" w:cs="Arial" w:eastAsia="Arial" w:hAnsi="Arial"/>
+          <w:sz w:val="20"/>
+          <w:szCs w:val="20"/>
+        </w:rPr>
+        <w:t xml:space="preserve">Stopwatch new answers a timer with start, stop, reset, isRunning and elapsed (milliseconds). Stopwatch time: aBlock runs the block and answers the elapsed milliseconds.</w:t>
+      </w:r>
+    </w:p>
+    <w:p>
+      <w:pPr>
         <w:pStyle w:val="Heading1"/>
         <w:pageBreakBefore/>
         <w:pBdr>
@@ -23115,7 +23949,7 @@
           <w:sz w:val="18"/>
           <w:szCs w:val="18"/>
         </w:rPr>
-        <w:t xml:space="preserve">Figure 43. </w:t>
+        <w:t xml:space="preserve">Figure 46. </w:t>
       </w:r>
       <w:r>
         <w:rPr>
@@ -23663,7 +24497,7 @@
           <w:sz w:val="18"/>
           <w:szCs w:val="18"/>
         </w:rPr>
-        <w:t xml:space="preserve">Figure 44. </w:t>
+        <w:t xml:space="preserve">Figure 47. </w:t>
       </w:r>
       <w:r>
         <w:rPr>
@@ -23969,7 +24803,7 @@
           <w:sz w:val="18"/>
           <w:szCs w:val="18"/>
         </w:rPr>
-        <w:t xml:space="preserve">Figure 45. </w:t>
+        <w:t xml:space="preserve">Figure 48. </w:t>
       </w:r>
       <w:r>
         <w:rPr>
@@ -24351,7 +25185,7 @@
           <w:sz w:val="18"/>
           <w:szCs w:val="18"/>
         </w:rPr>
-        <w:t xml:space="preserve">Figure 46. </w:t>
+        <w:t xml:space="preserve">Figure 49. </w:t>
       </w:r>
       <w:r>
         <w:rPr>
@@ -24678,7 +25512,7 @@
           <w:sz w:val="18"/>
           <w:szCs w:val="18"/>
         </w:rPr>
-        <w:t xml:space="preserve">Figure 47. </w:t>
+        <w:t xml:space="preserve">Figure 50. </w:t>
       </w:r>
       <w:r>
         <w:rPr>
@@ -25386,7 +26220,7 @@
           <w:sz w:val="18"/>
           <w:szCs w:val="18"/>
         </w:rPr>
-        <w:t xml:space="preserve">Figure 48. </w:t>
+        <w:t xml:space="preserve">Figure 51. </w:t>
       </w:r>
       <w:r>
         <w:rPr>
@@ -26004,7 +26838,7 @@
           <w:sz w:val="18"/>
           <w:szCs w:val="18"/>
         </w:rPr>
-        <w:t xml:space="preserve">Figure 49. </w:t>
+        <w:t xml:space="preserve">Figure 52. </w:t>
       </w:r>
       <w:r>
         <w:rPr>
@@ -26365,7 +27199,7 @@
           <w:sz w:val="18"/>
           <w:szCs w:val="18"/>
         </w:rPr>
-        <w:t xml:space="preserve">Figure 50. </w:t>
+        <w:t xml:space="preserve">Figure 53. </w:t>
       </w:r>
       <w:r>
         <w:rPr>
@@ -26762,7 +27596,7 @@
           <w:sz w:val="18"/>
           <w:szCs w:val="18"/>
         </w:rPr>
-        <w:t xml:space="preserve">Figure 51. </w:t>
+        <w:t xml:space="preserve">Figure 54. </w:t>
       </w:r>
       <w:r>
         <w:rPr>
@@ -27533,7 +28367,7 @@
           <w:sz w:val="18"/>
           <w:szCs w:val="18"/>
         </w:rPr>
-        <w:t xml:space="preserve">Figure 52. </w:t>
+        <w:t xml:space="preserve">Figure 55. </w:t>
       </w:r>
       <w:r>
         <w:rPr>
@@ -28348,7 +29182,7 @@
           <w:sz w:val="18"/>
           <w:szCs w:val="18"/>
         </w:rPr>
-        <w:t xml:space="preserve">Figure 53. </w:t>
+        <w:t xml:space="preserve">Figure 56. </w:t>
       </w:r>
       <w:r>
         <w:rPr>
@@ -29123,7 +29957,7 @@
           <w:sz w:val="18"/>
           <w:szCs w:val="18"/>
         </w:rPr>
-        <w:t xml:space="preserve">Figure 54. </w:t>
+        <w:t xml:space="preserve">Figure 57. </w:t>
       </w:r>
       <w:r>
         <w:rPr>
@@ -30013,7 +30847,28 @@
           <w:sz w:val="17"/>
           <w:szCs w:val="17"/>
         </w:rPr>
-        <w:t xml:space="preserve">  Stack, Queue, Matrix</w:t>
+        <w:t xml:space="preserve">    LinkedList</w:t>
+      </w:r>
+    </w:p>
+    <w:p>
+      <w:pPr>
+        <w:keepNext/>
+        <w:keepLines/>
+        <w:pBdr>
+          <w:left w:val="single" w:color="808080" w:sz="4"/>
+          <w:right w:val="single" w:color="808080" w:sz="4"/>
+        </w:pBdr>
+        <w:shd w:fill="F2F2F2" w:color="auto" w:val="clear"/>
+        <w:spacing w:after="0" w:line="240"/>
+        <w:ind w:left="100" w:right="100"/>
+      </w:pPr>
+      <w:r>
+        <w:rPr>
+          <w:rFonts w:ascii="Courier New" w:cs="Courier New" w:eastAsia="Courier New" w:hAnsi="Courier New"/>
+          <w:sz w:val="17"/>
+          <w:szCs w:val="17"/>
+        </w:rPr>
+        <w:t xml:space="preserve">  Stack, Queue, Matrix, LinkNode, JsonParser, Stopwatch</w:t>
       </w:r>
     </w:p>
     <w:p>
@@ -30260,7 +31115,7 @@
           <w:sz w:val="18"/>
           <w:szCs w:val="18"/>
         </w:rPr>
-        <w:t xml:space="preserve">Figure 55. </w:t>
+        <w:t xml:space="preserve">Figure 58. </w:t>
       </w:r>
       <w:r>
         <w:rPr>
@@ -30978,7 +31833,7 @@
           <w:sz w:val="18"/>
           <w:szCs w:val="18"/>
         </w:rPr>
-        <w:t xml:space="preserve">Figure 56. </w:t>
+        <w:t xml:space="preserve">Figure 59. </w:t>
       </w:r>
       <w:r>
         <w:rPr>

</xml_diff>

<commit_message>
Add date/time parsing and formatting, Smalltalk getenv:/exit, Random seed:
Co-Authored-By: Claude Sonnet 5.5 <noreply@anthropic.com>
Claude-Session: https://claude.ai/code/session_013PfZHD8os4FWhvmVG9Tf7M
</commit_message>
<xml_diff>
--- a/docs/Smalltalk-CREXX-Guide.docx
+++ b/docs/Smalltalk-CREXX-Guide.docx
@@ -1413,6 +1413,25 @@
           <w:szCs w:val="18"/>
         </w:rPr>
         <w:t xml:space="preserve">Stopwatch	25</w:t>
+      </w:r>
+    </w:p>
+    <w:p>
+      <w:pPr>
+        <w:tabs>
+          <w:tab w:val="right" w:pos="9638" w:leader="dot"/>
+        </w:tabs>
+        <w:spacing w:after="0" w:before="0"/>
+        <w:ind w:left="360"/>
+      </w:pPr>
+      <w:r>
+        <w:rPr>
+          <w:rFonts w:ascii="Arial" w:cs="Arial" w:eastAsia="Arial" w:hAnsi="Arial"/>
+          <w:b w:val="false"/>
+          <w:bCs w:val="false"/>
+          <w:sz w:val="18"/>
+          <w:szCs w:val="18"/>
+        </w:rPr>
+        <w:t xml:space="preserve">Parsing and formatting dates	25</w:t>
       </w:r>
     </w:p>
     <w:p>
@@ -23636,6 +23655,249 @@
     </w:p>
     <w:p>
       <w:pPr>
+        <w:pStyle w:val="Heading2"/>
+        <w:keepNext/>
+      </w:pPr>
+      <w:r>
+        <w:rPr>
+          <w:rFonts w:ascii="Arial" w:cs="Arial" w:eastAsia="Arial" w:hAnsi="Arial"/>
+          <w:b/>
+          <w:bCs/>
+          <w:sz w:val="24"/>
+          <w:szCs w:val="24"/>
+        </w:rPr>
+        <w:t xml:space="preserve">Parsing and formatting dates</w:t>
+      </w:r>
+    </w:p>
+    <w:p>
+      <w:pPr>
+        <w:spacing w:after="120" w:line="264"/>
+      </w:pPr>
+      <w:r>
+        <w:rPr>
+          <w:rFonts w:ascii="Arial" w:cs="Arial" w:eastAsia="Arial" w:hAnsi="Arial"/>
+          <w:sz w:val="20"/>
+          <w:szCs w:val="20"/>
+        </w:rPr>
+        <w:t xml:space="preserve">asDate, asTime and asDateTime read the forms 2026-10-10, 14:05:09 and 2026-10-10T14:05:09; the date separator may also be a slash and the seconds may be left out of a time. Date formatted: and Time formatted: fill in a pattern: yyyy, yy, mm, dd, mon, month and day for a date, and hh, mm and ss for a time.</w:t>
+      </w:r>
+    </w:p>
+    <w:p>
+      <w:pPr>
+        <w:keepNext/>
+        <w:keepLines/>
+        <w:pBdr>
+          <w:top w:val="single" w:color="808080" w:sz="4"/>
+          <w:left w:val="single" w:color="808080" w:sz="4"/>
+          <w:right w:val="single" w:color="808080" w:sz="4"/>
+        </w:pBdr>
+        <w:shd w:fill="F2F2F2" w:color="auto" w:val="clear"/>
+        <w:spacing w:after="0" w:line="240"/>
+        <w:ind w:left="100" w:right="100"/>
+      </w:pPr>
+      <w:r>
+        <w:rPr>
+          <w:rFonts w:ascii="Courier New" w:cs="Courier New" w:eastAsia="Courier New" w:hAnsi="Courier New"/>
+          <w:sz w:val="17"/>
+          <w:szCs w:val="17"/>
+        </w:rPr>
+        <w:t xml:space="preserve">'2026-10-10' asDate printNl.</w:t>
+      </w:r>
+    </w:p>
+    <w:p>
+      <w:pPr>
+        <w:keepNext/>
+        <w:keepLines/>
+        <w:pBdr>
+          <w:left w:val="single" w:color="808080" w:sz="4"/>
+          <w:right w:val="single" w:color="808080" w:sz="4"/>
+        </w:pBdr>
+        <w:shd w:fill="F2F2F2" w:color="auto" w:val="clear"/>
+        <w:spacing w:after="0" w:line="240"/>
+        <w:ind w:left="100" w:right="100"/>
+      </w:pPr>
+      <w:r>
+        <w:rPr>
+          <w:rFonts w:ascii="Courier New" w:cs="Courier New" w:eastAsia="Courier New" w:hAnsi="Courier New"/>
+          <w:sz w:val="17"/>
+          <w:szCs w:val="17"/>
+        </w:rPr>
+        <w:t xml:space="preserve">'14:05' asTime printNl.</w:t>
+      </w:r>
+    </w:p>
+    <w:p>
+      <w:pPr>
+        <w:keepNext/>
+        <w:keepLines/>
+        <w:pBdr>
+          <w:left w:val="single" w:color="808080" w:sz="4"/>
+          <w:right w:val="single" w:color="808080" w:sz="4"/>
+        </w:pBdr>
+        <w:shd w:fill="F2F2F2" w:color="auto" w:val="clear"/>
+        <w:spacing w:after="0" w:line="240"/>
+        <w:ind w:left="100" w:right="100"/>
+      </w:pPr>
+      <w:r>
+        <w:rPr>
+          <w:rFonts w:ascii="Courier New" w:cs="Courier New" w:eastAsia="Courier New" w:hAnsi="Courier New"/>
+          <w:sz w:val="17"/>
+          <w:szCs w:val="17"/>
+        </w:rPr>
+        <w:t xml:space="preserve">('2026-10-10' asDate formatted: 'day, dd mon yyyy') displayNl.</w:t>
+      </w:r>
+    </w:p>
+    <w:p>
+      <w:pPr>
+        <w:keepNext/>
+        <w:keepLines/>
+        <w:pBdr>
+          <w:left w:val="single" w:color="808080" w:sz="4"/>
+          <w:right w:val="single" w:color="808080" w:sz="4"/>
+        </w:pBdr>
+        <w:shd w:fill="F2F2F2" w:color="auto" w:val="clear"/>
+        <w:spacing w:after="0" w:line="240"/>
+        <w:ind w:left="100" w:right="100"/>
+      </w:pPr>
+      <w:r>
+        <w:rPr>
+          <w:rFonts w:ascii="Courier New" w:cs="Courier New" w:eastAsia="Courier New" w:hAnsi="Courier New"/>
+          <w:sz w:val="17"/>
+          <w:szCs w:val="17"/>
+        </w:rPr>
+        <w:t xml:space="preserve">('14:05:09' asTime formatted: 'hh.mm') displayNl.</w:t>
+      </w:r>
+    </w:p>
+    <w:p>
+      <w:pPr>
+        <w:keepNext/>
+        <w:keepLines/>
+        <w:pBdr>
+          <w:left w:val="single" w:color="808080" w:sz="4"/>
+          <w:right w:val="single" w:color="808080" w:sz="4"/>
+        </w:pBdr>
+        <w:shd w:fill="F2F2F2" w:color="auto" w:val="clear"/>
+        <w:spacing w:after="0" w:line="240"/>
+        <w:ind w:left="100" w:right="100"/>
+      </w:pPr>
+      <w:r>
+        <w:rPr>
+          <w:rFonts w:ascii="Courier New" w:cs="Courier New" w:eastAsia="Courier New" w:hAnsi="Courier New"/>
+          <w:sz w:val="17"/>
+          <w:szCs w:val="17"/>
+        </w:rPr>
+        <w:t xml:space="preserve"> </w:t>
+      </w:r>
+    </w:p>
+    <w:p>
+      <w:pPr>
+        <w:keepNext/>
+        <w:keepLines/>
+        <w:pBdr>
+          <w:left w:val="single" w:color="808080" w:sz="4"/>
+          <w:right w:val="single" w:color="808080" w:sz="4"/>
+        </w:pBdr>
+        <w:shd w:fill="F2F2F2" w:color="auto" w:val="clear"/>
+        <w:spacing w:after="0" w:line="240"/>
+        <w:ind w:left="100" w:right="100"/>
+      </w:pPr>
+      <w:r>
+        <w:rPr>
+          <w:rFonts w:ascii="Courier New" w:cs="Courier New" w:eastAsia="Courier New" w:hAnsi="Courier New"/>
+          <w:sz w:val="17"/>
+          <w:szCs w:val="17"/>
+        </w:rPr>
+        <w:t xml:space="preserve">2026-10-10</w:t>
+      </w:r>
+    </w:p>
+    <w:p>
+      <w:pPr>
+        <w:keepNext/>
+        <w:keepLines/>
+        <w:pBdr>
+          <w:left w:val="single" w:color="808080" w:sz="4"/>
+          <w:right w:val="single" w:color="808080" w:sz="4"/>
+        </w:pBdr>
+        <w:shd w:fill="F2F2F2" w:color="auto" w:val="clear"/>
+        <w:spacing w:after="0" w:line="240"/>
+        <w:ind w:left="100" w:right="100"/>
+      </w:pPr>
+      <w:r>
+        <w:rPr>
+          <w:rFonts w:ascii="Courier New" w:cs="Courier New" w:eastAsia="Courier New" w:hAnsi="Courier New"/>
+          <w:sz w:val="17"/>
+          <w:szCs w:val="17"/>
+        </w:rPr>
+        <w:t xml:space="preserve">14:05:00</w:t>
+      </w:r>
+    </w:p>
+    <w:p>
+      <w:pPr>
+        <w:keepNext/>
+        <w:keepLines/>
+        <w:pBdr>
+          <w:left w:val="single" w:color="808080" w:sz="4"/>
+          <w:right w:val="single" w:color="808080" w:sz="4"/>
+        </w:pBdr>
+        <w:shd w:fill="F2F2F2" w:color="auto" w:val="clear"/>
+        <w:spacing w:after="0" w:line="240"/>
+        <w:ind w:left="100" w:right="100"/>
+      </w:pPr>
+      <w:r>
+        <w:rPr>
+          <w:rFonts w:ascii="Courier New" w:cs="Courier New" w:eastAsia="Courier New" w:hAnsi="Courier New"/>
+          <w:sz w:val="17"/>
+          <w:szCs w:val="17"/>
+        </w:rPr>
+        <w:t xml:space="preserve">Saturday, 10 Oct 2026</w:t>
+      </w:r>
+    </w:p>
+    <w:p>
+      <w:pPr>
+        <w:keepNext w:val="false"/>
+        <w:keepLines/>
+        <w:pBdr>
+          <w:bottom w:val="single" w:color="808080" w:sz="4"/>
+          <w:left w:val="single" w:color="808080" w:sz="4"/>
+          <w:right w:val="single" w:color="808080" w:sz="4"/>
+        </w:pBdr>
+        <w:shd w:fill="F2F2F2" w:color="auto" w:val="clear"/>
+        <w:spacing w:after="0" w:line="240"/>
+        <w:ind w:left="100" w:right="100"/>
+      </w:pPr>
+      <w:r>
+        <w:rPr>
+          <w:rFonts w:ascii="Courier New" w:cs="Courier New" w:eastAsia="Courier New" w:hAnsi="Courier New"/>
+          <w:sz w:val="17"/>
+          <w:szCs w:val="17"/>
+        </w:rPr>
+        <w:t xml:space="preserve">14.05</w:t>
+      </w:r>
+    </w:p>
+    <w:p>
+      <w:pPr>
+        <w:spacing w:after="200" w:before="60"/>
+      </w:pPr>
+      <w:r>
+        <w:rPr>
+          <w:rFonts w:ascii="Arial" w:cs="Arial" w:eastAsia="Arial" w:hAnsi="Arial"/>
+          <w:b/>
+          <w:bCs/>
+          <w:sz w:val="18"/>
+          <w:szCs w:val="18"/>
+        </w:rPr>
+        <w:t xml:space="preserve">Figure 46. </w:t>
+      </w:r>
+      <w:r>
+        <w:rPr>
+          <w:rFonts w:ascii="Arial" w:cs="Arial" w:eastAsia="Arial" w:hAnsi="Arial"/>
+          <w:sz w:val="18"/>
+          <w:szCs w:val="18"/>
+        </w:rPr>
+        <w:t xml:space="preserve">Parsing and formatting</w:t>
+      </w:r>
+    </w:p>
+    <w:p>
+      <w:pPr>
         <w:pStyle w:val="Heading1"/>
         <w:pageBreakBefore/>
         <w:pBdr>
@@ -23949,7 +24211,7 @@
           <w:sz w:val="18"/>
           <w:szCs w:val="18"/>
         </w:rPr>
-        <w:t xml:space="preserve">Figure 46. </w:t>
+        <w:t xml:space="preserve">Figure 47. </w:t>
       </w:r>
       <w:r>
         <w:rPr>
@@ -24497,7 +24759,7 @@
           <w:sz w:val="18"/>
           <w:szCs w:val="18"/>
         </w:rPr>
-        <w:t xml:space="preserve">Figure 47. </w:t>
+        <w:t xml:space="preserve">Figure 48. </w:t>
       </w:r>
       <w:r>
         <w:rPr>
@@ -24803,7 +25065,7 @@
           <w:sz w:val="18"/>
           <w:szCs w:val="18"/>
         </w:rPr>
-        <w:t xml:space="preserve">Figure 48. </w:t>
+        <w:t xml:space="preserve">Figure 49. </w:t>
       </w:r>
       <w:r>
         <w:rPr>
@@ -25185,7 +25447,7 @@
           <w:sz w:val="18"/>
           <w:szCs w:val="18"/>
         </w:rPr>
-        <w:t xml:space="preserve">Figure 49. </w:t>
+        <w:t xml:space="preserve">Figure 50. </w:t>
       </w:r>
       <w:r>
         <w:rPr>
@@ -25512,7 +25774,7 @@
           <w:sz w:val="18"/>
           <w:szCs w:val="18"/>
         </w:rPr>
-        <w:t xml:space="preserve">Figure 50. </w:t>
+        <w:t xml:space="preserve">Figure 51. </w:t>
       </w:r>
       <w:r>
         <w:rPr>
@@ -26220,7 +26482,7 @@
           <w:sz w:val="18"/>
           <w:szCs w:val="18"/>
         </w:rPr>
-        <w:t xml:space="preserve">Figure 51. </w:t>
+        <w:t xml:space="preserve">Figure 52. </w:t>
       </w:r>
       <w:r>
         <w:rPr>
@@ -26838,7 +27100,7 @@
           <w:sz w:val="18"/>
           <w:szCs w:val="18"/>
         </w:rPr>
-        <w:t xml:space="preserve">Figure 52. </w:t>
+        <w:t xml:space="preserve">Figure 53. </w:t>
       </w:r>
       <w:r>
         <w:rPr>
@@ -27199,7 +27461,7 @@
           <w:sz w:val="18"/>
           <w:szCs w:val="18"/>
         </w:rPr>
-        <w:t xml:space="preserve">Figure 53. </w:t>
+        <w:t xml:space="preserve">Figure 54. </w:t>
       </w:r>
       <w:r>
         <w:rPr>
@@ -27241,6 +27503,19 @@
     </w:p>
     <w:p>
       <w:pPr>
+        <w:spacing w:after="120" w:line="264"/>
+      </w:pPr>
+      <w:r>
+        <w:rPr>
+          <w:rFonts w:ascii="Arial" w:cs="Arial" w:eastAsia="Arial" w:hAnsi="Arial"/>
+          <w:sz w:val="20"/>
+          <w:szCs w:val="20"/>
+        </w:rPr>
+        <w:t xml:space="preserve">Smalltalk getenv: name answers the value of an environment variable, or an empty String when it is not set. Smalltalk exit and Smalltalk exit: n end the program with a status. Random seed: n restarts the random sequence from a given seed, so that a program can repeat its numbers exactly.</w:t>
+      </w:r>
+    </w:p>
+    <w:p>
+      <w:pPr>
         <w:pStyle w:val="Heading1"/>
         <w:pageBreakBefore/>
         <w:pBdr>
@@ -27596,7 +27871,7 @@
           <w:sz w:val="18"/>
           <w:szCs w:val="18"/>
         </w:rPr>
-        <w:t xml:space="preserve">Figure 54. </w:t>
+        <w:t xml:space="preserve">Figure 55. </w:t>
       </w:r>
       <w:r>
         <w:rPr>
@@ -28367,7 +28642,7 @@
           <w:sz w:val="18"/>
           <w:szCs w:val="18"/>
         </w:rPr>
-        <w:t xml:space="preserve">Figure 55. </w:t>
+        <w:t xml:space="preserve">Figure 56. </w:t>
       </w:r>
       <w:r>
         <w:rPr>
@@ -29182,7 +29457,7 @@
           <w:sz w:val="18"/>
           <w:szCs w:val="18"/>
         </w:rPr>
-        <w:t xml:space="preserve">Figure 56. </w:t>
+        <w:t xml:space="preserve">Figure 57. </w:t>
       </w:r>
       <w:r>
         <w:rPr>
@@ -29957,7 +30232,7 @@
           <w:sz w:val="18"/>
           <w:szCs w:val="18"/>
         </w:rPr>
-        <w:t xml:space="preserve">Figure 57. </w:t>
+        <w:t xml:space="preserve">Figure 58. </w:t>
       </w:r>
       <w:r>
         <w:rPr>
@@ -31115,7 +31390,7 @@
           <w:sz w:val="18"/>
           <w:szCs w:val="18"/>
         </w:rPr>
-        <w:t xml:space="preserve">Figure 58. </w:t>
+        <w:t xml:space="preserve">Figure 59. </w:t>
       </w:r>
       <w:r>
         <w:rPr>
@@ -31833,7 +32108,7 @@
           <w:sz w:val="18"/>
           <w:szCs w:val="18"/>
         </w:rPr>
-        <w:t xml:space="preserve">Figure 59. </w:t>
+        <w:t xml:space="preserve">Figure 60. </w:t>
       </w:r>
       <w:r>
         <w:rPr>

</xml_diff>

<commit_message>
Add regular expression engine (matchesRegex:, searchRegex:, allRegexMatches:, copyReplacingRegex:with:, splitOnRegex:)
Co-Authored-By: Claude Sonnet 5.5 <noreply@anthropic.com>
Claude-Session: https://claude.ai/code/session_013PfZHD8os4FWhvmVG9Tf7M
</commit_message>
<xml_diff>
--- a/docs/Smalltalk-CREXX-Guide.docx
+++ b/docs/Smalltalk-CREXX-Guide.docx
@@ -1242,6 +1242,25 @@
           <w:szCs w:val="18"/>
         </w:rPr>
         <w:t xml:space="preserve">JSON	22</w:t>
+      </w:r>
+    </w:p>
+    <w:p>
+      <w:pPr>
+        <w:tabs>
+          <w:tab w:val="right" w:pos="9638" w:leader="dot"/>
+        </w:tabs>
+        <w:spacing w:after="0" w:before="0"/>
+        <w:ind w:left="360"/>
+      </w:pPr>
+      <w:r>
+        <w:rPr>
+          <w:rFonts w:ascii="Arial" w:cs="Arial" w:eastAsia="Arial" w:hAnsi="Arial"/>
+          <w:b w:val="false"/>
+          <w:bCs w:val="false"/>
+          <w:sz w:val="18"/>
+          <w:szCs w:val="18"/>
+        </w:rPr>
+        <w:t xml:space="preserve">Regular expressions	22</w:t>
       </w:r>
     </w:p>
     <w:p>
@@ -21635,6 +21654,346 @@
     </w:p>
     <w:p>
       <w:pPr>
+        <w:pStyle w:val="Heading2"/>
+        <w:keepNext/>
+      </w:pPr>
+      <w:r>
+        <w:rPr>
+          <w:rFonts w:ascii="Arial" w:cs="Arial" w:eastAsia="Arial" w:hAnsi="Arial"/>
+          <w:b/>
+          <w:bCs/>
+          <w:sz w:val="24"/>
+          <w:szCs w:val="24"/>
+        </w:rPr>
+        <w:t xml:space="preserve">Regular expressions</w:t>
+      </w:r>
+    </w:p>
+    <w:p>
+      <w:pPr>
+        <w:spacing w:after="120" w:line="264"/>
+      </w:pPr>
+      <w:r>
+        <w:rPr>
+          <w:rFonts w:ascii="Arial" w:cs="Arial" w:eastAsia="Arial" w:hAnsi="Arial"/>
+          <w:sz w:val="20"/>
+          <w:szCs w:val="20"/>
+        </w:rPr>
+        <w:t xml:space="preserve">A regular expression engine is written in Smalltalk. A pattern may use literal characters, . (any character but a newline), character classes such as [a-z0-9_] and [^x], the escapes \d \w \s and their capital forms for the complements, \b for a word boundary, the anchors ^ and $, groups ( ) and (?: ), alternation |, and the repetitions * + ? {n} {n,} {n,m}, each of which becomes lazy when followed by ?. To use a metacharacter literally, put a backslash before it.</w:t>
+      </w:r>
+    </w:p>
+    <w:p>
+      <w:pPr>
+        <w:spacing w:after="120" w:line="264"/>
+      </w:pPr>
+      <w:r>
+        <w:rPr>
+          <w:rFonts w:ascii="Arial" w:cs="Arial" w:eastAsia="Arial" w:hAnsi="Arial"/>
+          <w:sz w:val="20"/>
+          <w:szCs w:val="20"/>
+        </w:rPr>
+        <w:t xml:space="preserve">matchesRegex: tests the whole string. searchRegex: answers a RegexMatch for the first match, or nil; the match answers matched, start, stop and group: n. regexMatch: answers the first matching text, allRegexMatches: answers all of them as an Array, and occurrencesOfRegex: counts them. copyReplacingRegex:with: replaces every match, where \1 to \9 in the replacement stand for the groups, and splitOnRegex: cuts a string at each match. A pattern with a missing ) or ] is an error. The matcher is recursive, so very long texts matched by a repetition such as .* use a deep stack.</w:t>
+      </w:r>
+    </w:p>
+    <w:p>
+      <w:pPr>
+        <w:keepNext/>
+        <w:keepLines/>
+        <w:pBdr>
+          <w:top w:val="single" w:color="808080" w:sz="4"/>
+          <w:left w:val="single" w:color="808080" w:sz="4"/>
+          <w:right w:val="single" w:color="808080" w:sz="4"/>
+        </w:pBdr>
+        <w:shd w:fill="F2F2F2" w:color="auto" w:val="clear"/>
+        <w:spacing w:after="0" w:line="240"/>
+        <w:ind w:left="100" w:right="100"/>
+      </w:pPr>
+      <w:r>
+        <w:rPr>
+          <w:rFonts w:ascii="Courier New" w:cs="Courier New" w:eastAsia="Courier New" w:hAnsi="Courier New"/>
+          <w:sz w:val="17"/>
+          <w:szCs w:val="17"/>
+        </w:rPr>
+        <w:t xml:space="preserve">('abc123' matchesRegex: '[a-z]+\d+') printNl.</w:t>
+      </w:r>
+    </w:p>
+    <w:p>
+      <w:pPr>
+        <w:keepNext/>
+        <w:keepLines/>
+        <w:pBdr>
+          <w:left w:val="single" w:color="808080" w:sz="4"/>
+          <w:right w:val="single" w:color="808080" w:sz="4"/>
+        </w:pBdr>
+        <w:shd w:fill="F2F2F2" w:color="auto" w:val="clear"/>
+        <w:spacing w:after="0" w:line="240"/>
+        <w:ind w:left="100" w:right="100"/>
+      </w:pPr>
+      <w:r>
+        <w:rPr>
+          <w:rFonts w:ascii="Courier New" w:cs="Courier New" w:eastAsia="Courier New" w:hAnsi="Courier New"/>
+          <w:sz w:val="17"/>
+          <w:szCs w:val="17"/>
+        </w:rPr>
+        <w:t xml:space="preserve">('foo 12 bar 345' allRegexMatches: '\d+') printNl.</w:t>
+      </w:r>
+    </w:p>
+    <w:p>
+      <w:pPr>
+        <w:keepNext/>
+        <w:keepLines/>
+        <w:pBdr>
+          <w:left w:val="single" w:color="808080" w:sz="4"/>
+          <w:right w:val="single" w:color="808080" w:sz="4"/>
+        </w:pBdr>
+        <w:shd w:fill="F2F2F2" w:color="auto" w:val="clear"/>
+        <w:spacing w:after="0" w:line="240"/>
+        <w:ind w:left="100" w:right="100"/>
+      </w:pPr>
+      <w:r>
+        <w:rPr>
+          <w:rFonts w:ascii="Courier New" w:cs="Courier New" w:eastAsia="Courier New" w:hAnsi="Courier New"/>
+          <w:sz w:val="17"/>
+          <w:szCs w:val="17"/>
+        </w:rPr>
+        <w:t xml:space="preserve">(('2026-10-10' searchRegex: '(\d+)-(\d+)-(\d+)') group: 2) printNl.</w:t>
+      </w:r>
+    </w:p>
+    <w:p>
+      <w:pPr>
+        <w:keepNext/>
+        <w:keepLines/>
+        <w:pBdr>
+          <w:left w:val="single" w:color="808080" w:sz="4"/>
+          <w:right w:val="single" w:color="808080" w:sz="4"/>
+        </w:pBdr>
+        <w:shd w:fill="F2F2F2" w:color="auto" w:val="clear"/>
+        <w:spacing w:after="0" w:line="240"/>
+        <w:ind w:left="100" w:right="100"/>
+      </w:pPr>
+      <w:r>
+        <w:rPr>
+          <w:rFonts w:ascii="Courier New" w:cs="Courier New" w:eastAsia="Courier New" w:hAnsi="Courier New"/>
+          <w:sz w:val="17"/>
+          <w:szCs w:val="17"/>
+        </w:rPr>
+        <w:t xml:space="preserve">('John Smith' copyReplacingRegex: '(\w+) (\w+)' with: '\2, \1') printNl.</w:t>
+      </w:r>
+    </w:p>
+    <w:p>
+      <w:pPr>
+        <w:keepNext/>
+        <w:keepLines/>
+        <w:pBdr>
+          <w:left w:val="single" w:color="808080" w:sz="4"/>
+          <w:right w:val="single" w:color="808080" w:sz="4"/>
+        </w:pBdr>
+        <w:shd w:fill="F2F2F2" w:color="auto" w:val="clear"/>
+        <w:spacing w:after="0" w:line="240"/>
+        <w:ind w:left="100" w:right="100"/>
+      </w:pPr>
+      <w:r>
+        <w:rPr>
+          <w:rFonts w:ascii="Courier New" w:cs="Courier New" w:eastAsia="Courier New" w:hAnsi="Courier New"/>
+          <w:sz w:val="17"/>
+          <w:szCs w:val="17"/>
+        </w:rPr>
+        <w:t xml:space="preserve">('a1b22c' splitOnRegex: '\d+') printNl.</w:t>
+      </w:r>
+    </w:p>
+    <w:p>
+      <w:pPr>
+        <w:keepNext/>
+        <w:keepLines/>
+        <w:pBdr>
+          <w:left w:val="single" w:color="808080" w:sz="4"/>
+          <w:right w:val="single" w:color="808080" w:sz="4"/>
+        </w:pBdr>
+        <w:shd w:fill="F2F2F2" w:color="auto" w:val="clear"/>
+        <w:spacing w:after="0" w:line="240"/>
+        <w:ind w:left="100" w:right="100"/>
+      </w:pPr>
+      <w:r>
+        <w:rPr>
+          <w:rFonts w:ascii="Courier New" w:cs="Courier New" w:eastAsia="Courier New" w:hAnsi="Courier New"/>
+          <w:sz w:val="17"/>
+          <w:szCs w:val="17"/>
+        </w:rPr>
+        <w:t xml:space="preserve">('&lt;a&gt;&lt;b&gt;' regexMatch: '&lt;.+?&gt;') printNl.</w:t>
+      </w:r>
+    </w:p>
+    <w:p>
+      <w:pPr>
+        <w:keepNext/>
+        <w:keepLines/>
+        <w:pBdr>
+          <w:left w:val="single" w:color="808080" w:sz="4"/>
+          <w:right w:val="single" w:color="808080" w:sz="4"/>
+        </w:pBdr>
+        <w:shd w:fill="F2F2F2" w:color="auto" w:val="clear"/>
+        <w:spacing w:after="0" w:line="240"/>
+        <w:ind w:left="100" w:right="100"/>
+      </w:pPr>
+      <w:r>
+        <w:rPr>
+          <w:rFonts w:ascii="Courier New" w:cs="Courier New" w:eastAsia="Courier New" w:hAnsi="Courier New"/>
+          <w:sz w:val="17"/>
+          <w:szCs w:val="17"/>
+        </w:rPr>
+        <w:t xml:space="preserve"> </w:t>
+      </w:r>
+    </w:p>
+    <w:p>
+      <w:pPr>
+        <w:keepNext/>
+        <w:keepLines/>
+        <w:pBdr>
+          <w:left w:val="single" w:color="808080" w:sz="4"/>
+          <w:right w:val="single" w:color="808080" w:sz="4"/>
+        </w:pBdr>
+        <w:shd w:fill="F2F2F2" w:color="auto" w:val="clear"/>
+        <w:spacing w:after="0" w:line="240"/>
+        <w:ind w:left="100" w:right="100"/>
+      </w:pPr>
+      <w:r>
+        <w:rPr>
+          <w:rFonts w:ascii="Courier New" w:cs="Courier New" w:eastAsia="Courier New" w:hAnsi="Courier New"/>
+          <w:sz w:val="17"/>
+          <w:szCs w:val="17"/>
+        </w:rPr>
+        <w:t xml:space="preserve">true</w:t>
+      </w:r>
+    </w:p>
+    <w:p>
+      <w:pPr>
+        <w:keepNext/>
+        <w:keepLines/>
+        <w:pBdr>
+          <w:left w:val="single" w:color="808080" w:sz="4"/>
+          <w:right w:val="single" w:color="808080" w:sz="4"/>
+        </w:pBdr>
+        <w:shd w:fill="F2F2F2" w:color="auto" w:val="clear"/>
+        <w:spacing w:after="0" w:line="240"/>
+        <w:ind w:left="100" w:right="100"/>
+      </w:pPr>
+      <w:r>
+        <w:rPr>
+          <w:rFonts w:ascii="Courier New" w:cs="Courier New" w:eastAsia="Courier New" w:hAnsi="Courier New"/>
+          <w:sz w:val="17"/>
+          <w:szCs w:val="17"/>
+        </w:rPr>
+        <w:t xml:space="preserve">('12' '345' )</w:t>
+      </w:r>
+    </w:p>
+    <w:p>
+      <w:pPr>
+        <w:keepNext/>
+        <w:keepLines/>
+        <w:pBdr>
+          <w:left w:val="single" w:color="808080" w:sz="4"/>
+          <w:right w:val="single" w:color="808080" w:sz="4"/>
+        </w:pBdr>
+        <w:shd w:fill="F2F2F2" w:color="auto" w:val="clear"/>
+        <w:spacing w:after="0" w:line="240"/>
+        <w:ind w:left="100" w:right="100"/>
+      </w:pPr>
+      <w:r>
+        <w:rPr>
+          <w:rFonts w:ascii="Courier New" w:cs="Courier New" w:eastAsia="Courier New" w:hAnsi="Courier New"/>
+          <w:sz w:val="17"/>
+          <w:szCs w:val="17"/>
+        </w:rPr>
+        <w:t xml:space="preserve">'10'</w:t>
+      </w:r>
+    </w:p>
+    <w:p>
+      <w:pPr>
+        <w:keepNext/>
+        <w:keepLines/>
+        <w:pBdr>
+          <w:left w:val="single" w:color="808080" w:sz="4"/>
+          <w:right w:val="single" w:color="808080" w:sz="4"/>
+        </w:pBdr>
+        <w:shd w:fill="F2F2F2" w:color="auto" w:val="clear"/>
+        <w:spacing w:after="0" w:line="240"/>
+        <w:ind w:left="100" w:right="100"/>
+      </w:pPr>
+      <w:r>
+        <w:rPr>
+          <w:rFonts w:ascii="Courier New" w:cs="Courier New" w:eastAsia="Courier New" w:hAnsi="Courier New"/>
+          <w:sz w:val="17"/>
+          <w:szCs w:val="17"/>
+        </w:rPr>
+        <w:t xml:space="preserve">'Smith, John'</w:t>
+      </w:r>
+    </w:p>
+    <w:p>
+      <w:pPr>
+        <w:keepNext/>
+        <w:keepLines/>
+        <w:pBdr>
+          <w:left w:val="single" w:color="808080" w:sz="4"/>
+          <w:right w:val="single" w:color="808080" w:sz="4"/>
+        </w:pBdr>
+        <w:shd w:fill="F2F2F2" w:color="auto" w:val="clear"/>
+        <w:spacing w:after="0" w:line="240"/>
+        <w:ind w:left="100" w:right="100"/>
+      </w:pPr>
+      <w:r>
+        <w:rPr>
+          <w:rFonts w:ascii="Courier New" w:cs="Courier New" w:eastAsia="Courier New" w:hAnsi="Courier New"/>
+          <w:sz w:val="17"/>
+          <w:szCs w:val="17"/>
+        </w:rPr>
+        <w:t xml:space="preserve">('a' 'b' 'c' )</w:t>
+      </w:r>
+    </w:p>
+    <w:p>
+      <w:pPr>
+        <w:keepNext w:val="false"/>
+        <w:keepLines/>
+        <w:pBdr>
+          <w:bottom w:val="single" w:color="808080" w:sz="4"/>
+          <w:left w:val="single" w:color="808080" w:sz="4"/>
+          <w:right w:val="single" w:color="808080" w:sz="4"/>
+        </w:pBdr>
+        <w:shd w:fill="F2F2F2" w:color="auto" w:val="clear"/>
+        <w:spacing w:after="0" w:line="240"/>
+        <w:ind w:left="100" w:right="100"/>
+      </w:pPr>
+      <w:r>
+        <w:rPr>
+          <w:rFonts w:ascii="Courier New" w:cs="Courier New" w:eastAsia="Courier New" w:hAnsi="Courier New"/>
+          <w:sz w:val="17"/>
+          <w:szCs w:val="17"/>
+        </w:rPr>
+        <w:t xml:space="preserve">'&lt;a&gt;'</w:t>
+      </w:r>
+    </w:p>
+    <w:p>
+      <w:pPr>
+        <w:spacing w:after="200" w:before="60"/>
+      </w:pPr>
+      <w:r>
+        <w:rPr>
+          <w:rFonts w:ascii="Arial" w:cs="Arial" w:eastAsia="Arial" w:hAnsi="Arial"/>
+          <w:b/>
+          <w:bCs/>
+          <w:sz w:val="18"/>
+          <w:szCs w:val="18"/>
+        </w:rPr>
+        <w:t xml:space="preserve">Figure 40. </w:t>
+      </w:r>
+      <w:r>
+        <w:rPr>
+          <w:rFonts w:ascii="Arial" w:cs="Arial" w:eastAsia="Arial" w:hAnsi="Arial"/>
+          <w:sz w:val="18"/>
+          <w:szCs w:val="18"/>
+        </w:rPr>
+        <w:t xml:space="preserve">Regular expressions</w:t>
+      </w:r>
+    </w:p>
+    <w:p>
+      <w:pPr>
         <w:pStyle w:val="Heading1"/>
         <w:pageBreakBefore/>
         <w:pBdr>
@@ -21843,7 +22202,7 @@
           <w:sz w:val="18"/>
           <w:szCs w:val="18"/>
         </w:rPr>
-        <w:t xml:space="preserve">Figure 40. </w:t>
+        <w:t xml:space="preserve">Figure 41. </w:t>
       </w:r>
       <w:r>
         <w:rPr>
@@ -22334,7 +22693,7 @@
           <w:sz w:val="18"/>
           <w:szCs w:val="18"/>
         </w:rPr>
-        <w:t xml:space="preserve">Figure 41. </w:t>
+        <w:t xml:space="preserve">Figure 42. </w:t>
       </w:r>
       <w:r>
         <w:rPr>
@@ -22703,7 +23062,7 @@
           <w:sz w:val="18"/>
           <w:szCs w:val="18"/>
         </w:rPr>
-        <w:t xml:space="preserve">Figure 42. </w:t>
+        <w:t xml:space="preserve">Figure 43. </w:t>
       </w:r>
       <w:r>
         <w:rPr>
@@ -23017,7 +23376,7 @@
           <w:sz w:val="18"/>
           <w:szCs w:val="18"/>
         </w:rPr>
-        <w:t xml:space="preserve">Figure 43. </w:t>
+        <w:t xml:space="preserve">Figure 44. </w:t>
       </w:r>
       <w:r>
         <w:rPr>
@@ -23315,7 +23674,7 @@
           <w:sz w:val="18"/>
           <w:szCs w:val="18"/>
         </w:rPr>
-        <w:t xml:space="preserve">Figure 44. </w:t>
+        <w:t xml:space="preserve">Figure 45. </w:t>
       </w:r>
       <w:r>
         <w:rPr>
@@ -23584,7 +23943,7 @@
           <w:sz w:val="18"/>
           <w:szCs w:val="18"/>
         </w:rPr>
-        <w:t xml:space="preserve">Figure 45. </w:t>
+        <w:t xml:space="preserve">Figure 46. </w:t>
       </w:r>
       <w:r>
         <w:rPr>
@@ -23885,7 +24244,7 @@
           <w:sz w:val="18"/>
           <w:szCs w:val="18"/>
         </w:rPr>
-        <w:t xml:space="preserve">Figure 46. </w:t>
+        <w:t xml:space="preserve">Figure 47. </w:t>
       </w:r>
       <w:r>
         <w:rPr>
@@ -24211,7 +24570,7 @@
           <w:sz w:val="18"/>
           <w:szCs w:val="18"/>
         </w:rPr>
-        <w:t xml:space="preserve">Figure 47. </w:t>
+        <w:t xml:space="preserve">Figure 48. </w:t>
       </w:r>
       <w:r>
         <w:rPr>
@@ -24759,7 +25118,7 @@
           <w:sz w:val="18"/>
           <w:szCs w:val="18"/>
         </w:rPr>
-        <w:t xml:space="preserve">Figure 48. </w:t>
+        <w:t xml:space="preserve">Figure 49. </w:t>
       </w:r>
       <w:r>
         <w:rPr>
@@ -25065,7 +25424,7 @@
           <w:sz w:val="18"/>
           <w:szCs w:val="18"/>
         </w:rPr>
-        <w:t xml:space="preserve">Figure 49. </w:t>
+        <w:t xml:space="preserve">Figure 50. </w:t>
       </w:r>
       <w:r>
         <w:rPr>
@@ -25447,7 +25806,7 @@
           <w:sz w:val="18"/>
           <w:szCs w:val="18"/>
         </w:rPr>
-        <w:t xml:space="preserve">Figure 50. </w:t>
+        <w:t xml:space="preserve">Figure 51. </w:t>
       </w:r>
       <w:r>
         <w:rPr>
@@ -25774,7 +26133,7 @@
           <w:sz w:val="18"/>
           <w:szCs w:val="18"/>
         </w:rPr>
-        <w:t xml:space="preserve">Figure 51. </w:t>
+        <w:t xml:space="preserve">Figure 52. </w:t>
       </w:r>
       <w:r>
         <w:rPr>
@@ -26482,7 +26841,7 @@
           <w:sz w:val="18"/>
           <w:szCs w:val="18"/>
         </w:rPr>
-        <w:t xml:space="preserve">Figure 52. </w:t>
+        <w:t xml:space="preserve">Figure 53. </w:t>
       </w:r>
       <w:r>
         <w:rPr>
@@ -27100,7 +27459,7 @@
           <w:sz w:val="18"/>
           <w:szCs w:val="18"/>
         </w:rPr>
-        <w:t xml:space="preserve">Figure 53. </w:t>
+        <w:t xml:space="preserve">Figure 54. </w:t>
       </w:r>
       <w:r>
         <w:rPr>
@@ -27461,7 +27820,7 @@
           <w:sz w:val="18"/>
           <w:szCs w:val="18"/>
         </w:rPr>
-        <w:t xml:space="preserve">Figure 54. </w:t>
+        <w:t xml:space="preserve">Figure 55. </w:t>
       </w:r>
       <w:r>
         <w:rPr>
@@ -27871,7 +28230,7 @@
           <w:sz w:val="18"/>
           <w:szCs w:val="18"/>
         </w:rPr>
-        <w:t xml:space="preserve">Figure 55. </w:t>
+        <w:t xml:space="preserve">Figure 56. </w:t>
       </w:r>
       <w:r>
         <w:rPr>
@@ -28642,7 +29001,7 @@
           <w:sz w:val="18"/>
           <w:szCs w:val="18"/>
         </w:rPr>
-        <w:t xml:space="preserve">Figure 56. </w:t>
+        <w:t xml:space="preserve">Figure 57. </w:t>
       </w:r>
       <w:r>
         <w:rPr>
@@ -29457,7 +29816,7 @@
           <w:sz w:val="18"/>
           <w:szCs w:val="18"/>
         </w:rPr>
-        <w:t xml:space="preserve">Figure 57. </w:t>
+        <w:t xml:space="preserve">Figure 58. </w:t>
       </w:r>
       <w:r>
         <w:rPr>
@@ -30232,7 +30591,7 @@
           <w:sz w:val="18"/>
           <w:szCs w:val="18"/>
         </w:rPr>
-        <w:t xml:space="preserve">Figure 58. </w:t>
+        <w:t xml:space="preserve">Figure 59. </w:t>
       </w:r>
       <w:r>
         <w:rPr>
@@ -31390,7 +31749,7 @@
           <w:sz w:val="18"/>
           <w:szCs w:val="18"/>
         </w:rPr>
-        <w:t xml:space="preserve">Figure 59. </w:t>
+        <w:t xml:space="preserve">Figure 60. </w:t>
       </w:r>
       <w:r>
         <w:rPr>
@@ -32108,7 +32467,7 @@
           <w:sz w:val="18"/>
           <w:szCs w:val="18"/>
         </w:rPr>
-        <w:t xml:space="preserve">Figure 60. </w:t>
+        <w:t xml:space="preserve">Figure 61. </w:t>
       </w:r>
       <w:r>
         <w:rPr>

</xml_diff>

<commit_message>
Add interactive prompt, program arguments, file/directory/system access, CSV, sorted collection printing, NaN/infinity, real millisecond clock
Co-Authored-By: Claude Sonnet 5.5 <noreply@anthropic.com>
Claude-Session: https://claude.ai/code/session_013PfZHD8os4FWhvmVG9Tf7M
</commit_message>
<xml_diff>
--- a/docs/Smalltalk-CREXX-Guide.docx
+++ b/docs/Smalltalk-CREXX-Guide.docx
@@ -367,7 +367,7 @@
           <w:sz w:val="18"/>
           <w:szCs w:val="18"/>
         </w:rPr>
-        <w:t xml:space="preserve">Starting the interpreter	4</w:t>
+        <w:t xml:space="preserve">The interactive prompt	4</w:t>
       </w:r>
     </w:p>
     <w:p>
@@ -386,7 +386,45 @@
           <w:sz w:val="18"/>
           <w:szCs w:val="18"/>
         </w:rPr>
-        <w:t xml:space="preserve">The regression tests	4</w:t>
+        <w:t xml:space="preserve">Program arguments	5</w:t>
+      </w:r>
+    </w:p>
+    <w:p>
+      <w:pPr>
+        <w:tabs>
+          <w:tab w:val="right" w:pos="9638" w:leader="dot"/>
+        </w:tabs>
+        <w:spacing w:after="0" w:before="0"/>
+        <w:ind w:left="360"/>
+      </w:pPr>
+      <w:r>
+        <w:rPr>
+          <w:rFonts w:ascii="Arial" w:cs="Arial" w:eastAsia="Arial" w:hAnsi="Arial"/>
+          <w:b w:val="false"/>
+          <w:bCs w:val="false"/>
+          <w:sz w:val="18"/>
+          <w:szCs w:val="18"/>
+        </w:rPr>
+        <w:t xml:space="preserve">Starting the interpreter	5</w:t>
+      </w:r>
+    </w:p>
+    <w:p>
+      <w:pPr>
+        <w:tabs>
+          <w:tab w:val="right" w:pos="9638" w:leader="dot"/>
+        </w:tabs>
+        <w:spacing w:after="0" w:before="0"/>
+        <w:ind w:left="360"/>
+      </w:pPr>
+      <w:r>
+        <w:rPr>
+          <w:rFonts w:ascii="Arial" w:cs="Arial" w:eastAsia="Arial" w:hAnsi="Arial"/>
+          <w:b w:val="false"/>
+          <w:bCs w:val="false"/>
+          <w:sz w:val="18"/>
+          <w:szCs w:val="18"/>
+        </w:rPr>
+        <w:t xml:space="preserve">The regression tests	5</w:t>
       </w:r>
     </w:p>
     <w:p>
@@ -405,7 +443,7 @@
           <w:sz w:val="19"/>
           <w:szCs w:val="19"/>
         </w:rPr>
-        <w:t xml:space="preserve">Chapter 3. The Smalltalk Language	5</w:t>
+        <w:t xml:space="preserve">Chapter 3. The Smalltalk Language	6</w:t>
       </w:r>
     </w:p>
     <w:p>
@@ -424,7 +462,7 @@
           <w:sz w:val="18"/>
           <w:szCs w:val="18"/>
         </w:rPr>
-        <w:t xml:space="preserve">Comments and literals	5</w:t>
+        <w:t xml:space="preserve">Comments and literals	6</w:t>
       </w:r>
     </w:p>
     <w:p>
@@ -443,7 +481,7 @@
           <w:sz w:val="18"/>
           <w:szCs w:val="18"/>
         </w:rPr>
-        <w:t xml:space="preserve">Variables	5</w:t>
+        <w:t xml:space="preserve">Variables	6</w:t>
       </w:r>
     </w:p>
     <w:p>
@@ -462,7 +500,7 @@
           <w:sz w:val="18"/>
           <w:szCs w:val="18"/>
         </w:rPr>
-        <w:t xml:space="preserve">Messages	5</w:t>
+        <w:t xml:space="preserve">Messages	6</w:t>
       </w:r>
     </w:p>
     <w:p>
@@ -481,7 +519,7 @@
           <w:sz w:val="18"/>
           <w:szCs w:val="18"/>
         </w:rPr>
-        <w:t xml:space="preserve">Cascades	6</w:t>
+        <w:t xml:space="preserve">Cascades	7</w:t>
       </w:r>
     </w:p>
     <w:p>
@@ -500,7 +538,7 @@
           <w:sz w:val="18"/>
           <w:szCs w:val="18"/>
         </w:rPr>
-        <w:t xml:space="preserve">Assignment and statements	6</w:t>
+        <w:t xml:space="preserve">Assignment and statements	7</w:t>
       </w:r>
     </w:p>
     <w:p>
@@ -519,7 +557,7 @@
           <w:sz w:val="18"/>
           <w:szCs w:val="18"/>
         </w:rPr>
-        <w:t xml:space="preserve">Blocks	6</w:t>
+        <w:t xml:space="preserve">Blocks	7</w:t>
       </w:r>
     </w:p>
     <w:p>
@@ -538,7 +576,7 @@
           <w:sz w:val="18"/>
           <w:szCs w:val="18"/>
         </w:rPr>
-        <w:t xml:space="preserve">Non-local return	6</w:t>
+        <w:t xml:space="preserve">Non-local return	7</w:t>
       </w:r>
     </w:p>
     <w:p>
@@ -557,7 +595,7 @@
           <w:sz w:val="18"/>
           <w:szCs w:val="18"/>
         </w:rPr>
-        <w:t xml:space="preserve">Control flow	7</w:t>
+        <w:t xml:space="preserve">Control flow	8</w:t>
       </w:r>
     </w:p>
     <w:p>
@@ -576,7 +614,7 @@
           <w:sz w:val="18"/>
           <w:szCs w:val="18"/>
         </w:rPr>
-        <w:t xml:space="preserve">Top-level programs	7</w:t>
+        <w:t xml:space="preserve">Top-level programs	8</w:t>
       </w:r>
     </w:p>
     <w:p>
@@ -595,7 +633,7 @@
           <w:sz w:val="19"/>
           <w:szCs w:val="19"/>
         </w:rPr>
-        <w:t xml:space="preserve">Chapter 4. Classes and Objects	8</w:t>
+        <w:t xml:space="preserve">Chapter 4. Classes and Objects	9</w:t>
       </w:r>
     </w:p>
     <w:p>
@@ -614,7 +652,7 @@
           <w:sz w:val="18"/>
           <w:szCs w:val="18"/>
         </w:rPr>
-        <w:t xml:space="preserve">Defining a class	8</w:t>
+        <w:t xml:space="preserve">Defining a class	9</w:t>
       </w:r>
     </w:p>
     <w:p>
@@ -633,7 +671,7 @@
           <w:sz w:val="18"/>
           <w:szCs w:val="18"/>
         </w:rPr>
-        <w:t xml:space="preserve">Reopening and extending classes	8</w:t>
+        <w:t xml:space="preserve">Reopening and extending classes	9</w:t>
       </w:r>
     </w:p>
     <w:p>
@@ -652,7 +690,7 @@
           <w:sz w:val="18"/>
           <w:szCs w:val="18"/>
         </w:rPr>
-        <w:t xml:space="preserve">Creating a class with messages	9</w:t>
+        <w:t xml:space="preserve">Creating a class with messages	10</w:t>
       </w:r>
     </w:p>
     <w:p>
@@ -671,7 +709,7 @@
           <w:sz w:val="18"/>
           <w:szCs w:val="18"/>
         </w:rPr>
-        <w:t xml:space="preserve">Creating instances	9</w:t>
+        <w:t xml:space="preserve">Creating instances	10</w:t>
       </w:r>
     </w:p>
     <w:p>
@@ -690,7 +728,7 @@
           <w:sz w:val="18"/>
           <w:szCs w:val="18"/>
         </w:rPr>
-        <w:t xml:space="preserve">Inheritance and super	9</w:t>
+        <w:t xml:space="preserve">Inheritance and super	10</w:t>
       </w:r>
     </w:p>
     <w:p>
@@ -709,7 +747,7 @@
           <w:sz w:val="18"/>
           <w:szCs w:val="18"/>
         </w:rPr>
-        <w:t xml:space="preserve">Printing objects	10</w:t>
+        <w:t xml:space="preserve">Printing objects	11</w:t>
       </w:r>
     </w:p>
     <w:p>
@@ -728,7 +766,7 @@
           <w:sz w:val="18"/>
           <w:szCs w:val="18"/>
         </w:rPr>
-        <w:t xml:space="preserve">Metaclasses	10</w:t>
+        <w:t xml:space="preserve">Metaclasses	11</w:t>
       </w:r>
     </w:p>
     <w:p>
@@ -747,7 +785,7 @@
           <w:sz w:val="18"/>
           <w:szCs w:val="18"/>
         </w:rPr>
-        <w:t xml:space="preserve">Class-side instance variables	11</w:t>
+        <w:t xml:space="preserve">Class-side instance variables	12</w:t>
       </w:r>
     </w:p>
     <w:p>
@@ -766,7 +804,7 @@
           <w:sz w:val="19"/>
           <w:szCs w:val="19"/>
         </w:rPr>
-        <w:t xml:space="preserve">Chapter 5. Numbers	12</w:t>
+        <w:t xml:space="preserve">Chapter 5. Numbers	13</w:t>
       </w:r>
     </w:p>
     <w:p>
@@ -785,7 +823,7 @@
           <w:sz w:val="18"/>
           <w:szCs w:val="18"/>
         </w:rPr>
-        <w:t xml:space="preserve">The number classes	12</w:t>
+        <w:t xml:space="preserve">The number classes	13</w:t>
       </w:r>
     </w:p>
     <w:p>
@@ -804,7 +842,7 @@
           <w:sz w:val="18"/>
           <w:szCs w:val="18"/>
         </w:rPr>
-        <w:t xml:space="preserve">Arithmetic	12</w:t>
+        <w:t xml:space="preserve">Arithmetic	13</w:t>
       </w:r>
     </w:p>
     <w:p>
@@ -823,7 +861,7 @@
           <w:sz w:val="18"/>
           <w:szCs w:val="18"/>
         </w:rPr>
-        <w:t xml:space="preserve">Large integers	12</w:t>
+        <w:t xml:space="preserve">Large integers	13</w:t>
       </w:r>
     </w:p>
     <w:p>
@@ -842,7 +880,7 @@
           <w:sz w:val="18"/>
           <w:szCs w:val="18"/>
         </w:rPr>
-        <w:t xml:space="preserve">Floating-point numbers	13</w:t>
+        <w:t xml:space="preserve">Floating-point numbers	14</w:t>
       </w:r>
     </w:p>
     <w:p>
@@ -861,7 +899,7 @@
           <w:sz w:val="18"/>
           <w:szCs w:val="18"/>
         </w:rPr>
-        <w:t xml:space="preserve">Reference	13</w:t>
+        <w:t xml:space="preserve">Reference	14</w:t>
       </w:r>
     </w:p>
     <w:p>
@@ -880,7 +918,7 @@
           <w:sz w:val="18"/>
           <w:szCs w:val="18"/>
         </w:rPr>
-        <w:t xml:space="preserve">More number methods	13</w:t>
+        <w:t xml:space="preserve">More number methods	14</w:t>
       </w:r>
     </w:p>
     <w:p>
@@ -899,7 +937,7 @@
           <w:sz w:val="18"/>
           <w:szCs w:val="18"/>
         </w:rPr>
-        <w:t xml:space="preserve">Formatting numbers	14</w:t>
+        <w:t xml:space="preserve">Formatting numbers	15</w:t>
       </w:r>
     </w:p>
     <w:p>
@@ -918,7 +956,26 @@
           <w:sz w:val="18"/>
           <w:szCs w:val="18"/>
         </w:rPr>
-        <w:t xml:space="preserve">Complex numbers	14</w:t>
+        <w:t xml:space="preserve">Complex numbers	15</w:t>
+      </w:r>
+    </w:p>
+    <w:p>
+      <w:pPr>
+        <w:tabs>
+          <w:tab w:val="right" w:pos="9638" w:leader="dot"/>
+        </w:tabs>
+        <w:spacing w:after="0" w:before="0"/>
+        <w:ind w:left="360"/>
+      </w:pPr>
+      <w:r>
+        <w:rPr>
+          <w:rFonts w:ascii="Arial" w:cs="Arial" w:eastAsia="Arial" w:hAnsi="Arial"/>
+          <w:b w:val="false"/>
+          <w:bCs w:val="false"/>
+          <w:sz w:val="18"/>
+          <w:szCs w:val="18"/>
+        </w:rPr>
+        <w:t xml:space="preserve">Infinity and NaN	15</w:t>
       </w:r>
     </w:p>
     <w:p>
@@ -937,7 +994,7 @@
           <w:sz w:val="19"/>
           <w:szCs w:val="19"/>
         </w:rPr>
-        <w:t xml:space="preserve">Chapter 6. Collections	15</w:t>
+        <w:t xml:space="preserve">Chapter 6. Collections	17</w:t>
       </w:r>
     </w:p>
     <w:p>
@@ -956,7 +1013,7 @@
           <w:sz w:val="18"/>
           <w:szCs w:val="18"/>
         </w:rPr>
-        <w:t xml:space="preserve">The collection classes	15</w:t>
+        <w:t xml:space="preserve">The collection classes	17</w:t>
       </w:r>
     </w:p>
     <w:p>
@@ -975,7 +1032,7 @@
           <w:sz w:val="18"/>
           <w:szCs w:val="18"/>
         </w:rPr>
-        <w:t xml:space="preserve">Protocol common to all collections	15</w:t>
+        <w:t xml:space="preserve">Protocol common to all collections	17</w:t>
       </w:r>
     </w:p>
     <w:p>
@@ -994,7 +1051,7 @@
           <w:sz w:val="18"/>
           <w:szCs w:val="18"/>
         </w:rPr>
-        <w:t xml:space="preserve">Arrays and OrderedCollections	16</w:t>
+        <w:t xml:space="preserve">Arrays and OrderedCollections	18</w:t>
       </w:r>
     </w:p>
     <w:p>
@@ -1013,7 +1070,7 @@
           <w:sz w:val="18"/>
           <w:szCs w:val="18"/>
         </w:rPr>
-        <w:t xml:space="preserve">Dictionaries	16</w:t>
+        <w:t xml:space="preserve">Dictionaries	18</w:t>
       </w:r>
     </w:p>
     <w:p>
@@ -1032,7 +1089,7 @@
           <w:sz w:val="18"/>
           <w:szCs w:val="18"/>
         </w:rPr>
-        <w:t xml:space="preserve">Sets and Bags	17</w:t>
+        <w:t xml:space="preserve">Sets and Bags	19</w:t>
       </w:r>
     </w:p>
     <w:p>
@@ -1051,7 +1108,7 @@
           <w:sz w:val="18"/>
           <w:szCs w:val="18"/>
         </w:rPr>
-        <w:t xml:space="preserve">Intervals	17</w:t>
+        <w:t xml:space="preserve">Intervals	19</w:t>
       </w:r>
     </w:p>
     <w:p>
@@ -1070,7 +1127,7 @@
           <w:sz w:val="18"/>
           <w:szCs w:val="18"/>
         </w:rPr>
-        <w:t xml:space="preserve">More collection methods	17</w:t>
+        <w:t xml:space="preserve">More collection methods	19</w:t>
       </w:r>
     </w:p>
     <w:p>
@@ -1089,7 +1146,7 @@
           <w:sz w:val="18"/>
           <w:szCs w:val="18"/>
         </w:rPr>
-        <w:t xml:space="preserve">Stack, Queue and Matrix	18</w:t>
+        <w:t xml:space="preserve">Stack, Queue and Matrix	20</w:t>
       </w:r>
     </w:p>
     <w:p>
@@ -1108,7 +1165,26 @@
           <w:sz w:val="18"/>
           <w:szCs w:val="18"/>
         </w:rPr>
-        <w:t xml:space="preserve">LinkedList	18</w:t>
+        <w:t xml:space="preserve">LinkedList	20</w:t>
+      </w:r>
+    </w:p>
+    <w:p>
+      <w:pPr>
+        <w:tabs>
+          <w:tab w:val="right" w:pos="9638" w:leader="dot"/>
+        </w:tabs>
+        <w:spacing w:after="0" w:before="0"/>
+        <w:ind w:left="360"/>
+      </w:pPr>
+      <w:r>
+        <w:rPr>
+          <w:rFonts w:ascii="Arial" w:cs="Arial" w:eastAsia="Arial" w:hAnsi="Arial"/>
+          <w:b w:val="false"/>
+          <w:bCs w:val="false"/>
+          <w:sz w:val="18"/>
+          <w:szCs w:val="18"/>
+        </w:rPr>
+        <w:t xml:space="preserve">Printing order	21</w:t>
       </w:r>
     </w:p>
     <w:p>
@@ -1127,7 +1203,7 @@
           <w:sz w:val="19"/>
           <w:szCs w:val="19"/>
         </w:rPr>
-        <w:t xml:space="preserve">Chapter 7. Strings, Symbols and Characters	20</w:t>
+        <w:t xml:space="preserve">Chapter 7. Strings, Symbols and Characters	22</w:t>
       </w:r>
     </w:p>
     <w:p>
@@ -1146,7 +1222,7 @@
           <w:sz w:val="18"/>
           <w:szCs w:val="18"/>
         </w:rPr>
-        <w:t xml:space="preserve">Strings	20</w:t>
+        <w:t xml:space="preserve">Strings	22</w:t>
       </w:r>
     </w:p>
     <w:p>
@@ -1165,7 +1241,7 @@
           <w:sz w:val="18"/>
           <w:szCs w:val="18"/>
         </w:rPr>
-        <w:t xml:space="preserve">Symbols	20</w:t>
+        <w:t xml:space="preserve">Symbols	22</w:t>
       </w:r>
     </w:p>
     <w:p>
@@ -1184,7 +1260,7 @@
           <w:sz w:val="18"/>
           <w:szCs w:val="18"/>
         </w:rPr>
-        <w:t xml:space="preserve">Characters	21</w:t>
+        <w:t xml:space="preserve">Characters	23</w:t>
       </w:r>
     </w:p>
     <w:p>
@@ -1203,7 +1279,7 @@
           <w:sz w:val="18"/>
           <w:szCs w:val="18"/>
         </w:rPr>
-        <w:t xml:space="preserve">More string methods	21</w:t>
+        <w:t xml:space="preserve">More string methods	23</w:t>
       </w:r>
     </w:p>
     <w:p>
@@ -1222,7 +1298,7 @@
           <w:sz w:val="18"/>
           <w:szCs w:val="18"/>
         </w:rPr>
-        <w:t xml:space="preserve">Wildcard matching	21</w:t>
+        <w:t xml:space="preserve">Wildcard matching	23</w:t>
       </w:r>
     </w:p>
     <w:p>
@@ -1241,7 +1317,7 @@
           <w:sz w:val="18"/>
           <w:szCs w:val="18"/>
         </w:rPr>
-        <w:t xml:space="preserve">JSON	22</w:t>
+        <w:t xml:space="preserve">JSON	24</w:t>
       </w:r>
     </w:p>
     <w:p>
@@ -1260,7 +1336,7 @@
           <w:sz w:val="18"/>
           <w:szCs w:val="18"/>
         </w:rPr>
-        <w:t xml:space="preserve">Regular expressions	22</w:t>
+        <w:t xml:space="preserve">Regular expressions	24</w:t>
       </w:r>
     </w:p>
     <w:p>
@@ -1279,7 +1355,7 @@
           <w:sz w:val="19"/>
           <w:szCs w:val="19"/>
         </w:rPr>
-        <w:t xml:space="preserve">Chapter 8. Streams and the Transcript	23</w:t>
+        <w:t xml:space="preserve">Chapter 8. Streams and the Transcript	25</w:t>
       </w:r>
     </w:p>
     <w:p>
@@ -1298,7 +1374,7 @@
           <w:sz w:val="18"/>
           <w:szCs w:val="18"/>
         </w:rPr>
-        <w:t xml:space="preserve">The Transcript	23</w:t>
+        <w:t xml:space="preserve">The Transcript	25</w:t>
       </w:r>
     </w:p>
     <w:p>
@@ -1317,7 +1393,7 @@
           <w:sz w:val="18"/>
           <w:szCs w:val="18"/>
         </w:rPr>
-        <w:t xml:space="preserve">Read streams	23</w:t>
+        <w:t xml:space="preserve">Read streams	25</w:t>
       </w:r>
     </w:p>
     <w:p>
@@ -1336,7 +1412,7 @@
           <w:sz w:val="18"/>
           <w:szCs w:val="18"/>
         </w:rPr>
-        <w:t xml:space="preserve">Write streams	23</w:t>
+        <w:t xml:space="preserve">Write streams	25</w:t>
       </w:r>
     </w:p>
     <w:p>
@@ -1355,7 +1431,7 @@
           <w:sz w:val="18"/>
           <w:szCs w:val="18"/>
         </w:rPr>
-        <w:t xml:space="preserve">Standard input	23</w:t>
+        <w:t xml:space="preserve">Standard input	25</w:t>
       </w:r>
     </w:p>
     <w:p>
@@ -1374,7 +1450,7 @@
           <w:sz w:val="18"/>
           <w:szCs w:val="18"/>
         </w:rPr>
-        <w:t xml:space="preserve">Files	24</w:t>
+        <w:t xml:space="preserve">Files	26</w:t>
       </w:r>
     </w:p>
     <w:p>
@@ -1393,7 +1469,7 @@
           <w:sz w:val="18"/>
           <w:szCs w:val="18"/>
         </w:rPr>
-        <w:t xml:space="preserve">Date and Time	24</w:t>
+        <w:t xml:space="preserve">Date and Time	26</w:t>
       </w:r>
     </w:p>
     <w:p>
@@ -1412,7 +1488,7 @@
           <w:sz w:val="18"/>
           <w:szCs w:val="18"/>
         </w:rPr>
-        <w:t xml:space="preserve">More stream methods	25</w:t>
+        <w:t xml:space="preserve">More stream methods	27</w:t>
       </w:r>
     </w:p>
     <w:p>
@@ -1431,7 +1507,7 @@
           <w:sz w:val="18"/>
           <w:szCs w:val="18"/>
         </w:rPr>
-        <w:t xml:space="preserve">Stopwatch	25</w:t>
+        <w:t xml:space="preserve">Stopwatch	27</w:t>
       </w:r>
     </w:p>
     <w:p>
@@ -1450,7 +1526,83 @@
           <w:sz w:val="18"/>
           <w:szCs w:val="18"/>
         </w:rPr>
-        <w:t xml:space="preserve">Parsing and formatting dates	25</w:t>
+        <w:t xml:space="preserve">Parsing and formatting dates	27</w:t>
+      </w:r>
+    </w:p>
+    <w:p>
+      <w:pPr>
+        <w:tabs>
+          <w:tab w:val="right" w:pos="9638" w:leader="dot"/>
+        </w:tabs>
+        <w:spacing w:after="0" w:before="0"/>
+        <w:ind w:left="360"/>
+      </w:pPr>
+      <w:r>
+        <w:rPr>
+          <w:rFonts w:ascii="Arial" w:cs="Arial" w:eastAsia="Arial" w:hAnsi="Arial"/>
+          <w:b w:val="false"/>
+          <w:bCs w:val="false"/>
+          <w:sz w:val="18"/>
+          <w:szCs w:val="18"/>
+        </w:rPr>
+        <w:t xml:space="preserve">ReadWriteStream	27</w:t>
+      </w:r>
+    </w:p>
+    <w:p>
+      <w:pPr>
+        <w:tabs>
+          <w:tab w:val="right" w:pos="9638" w:leader="dot"/>
+        </w:tabs>
+        <w:spacing w:after="0" w:before="0"/>
+        <w:ind w:left="360"/>
+      </w:pPr>
+      <w:r>
+        <w:rPr>
+          <w:rFonts w:ascii="Arial" w:cs="Arial" w:eastAsia="Arial" w:hAnsi="Arial"/>
+          <w:b w:val="false"/>
+          <w:bCs w:val="false"/>
+          <w:sz w:val="18"/>
+          <w:szCs w:val="18"/>
+        </w:rPr>
+        <w:t xml:space="preserve">Managing files and directories	28</w:t>
+      </w:r>
+    </w:p>
+    <w:p>
+      <w:pPr>
+        <w:tabs>
+          <w:tab w:val="right" w:pos="9638" w:leader="dot"/>
+        </w:tabs>
+        <w:spacing w:after="0" w:before="0"/>
+        <w:ind w:left="360"/>
+      </w:pPr>
+      <w:r>
+        <w:rPr>
+          <w:rFonts w:ascii="Arial" w:cs="Arial" w:eastAsia="Arial" w:hAnsi="Arial"/>
+          <w:b w:val="false"/>
+          <w:bCs w:val="false"/>
+          <w:sz w:val="18"/>
+          <w:szCs w:val="18"/>
+        </w:rPr>
+        <w:t xml:space="preserve">Running programs	28</w:t>
+      </w:r>
+    </w:p>
+    <w:p>
+      <w:pPr>
+        <w:tabs>
+          <w:tab w:val="right" w:pos="9638" w:leader="dot"/>
+        </w:tabs>
+        <w:spacing w:after="0" w:before="0"/>
+        <w:ind w:left="360"/>
+      </w:pPr>
+      <w:r>
+        <w:rPr>
+          <w:rFonts w:ascii="Arial" w:cs="Arial" w:eastAsia="Arial" w:hAnsi="Arial"/>
+          <w:b w:val="false"/>
+          <w:bCs w:val="false"/>
+          <w:sz w:val="18"/>
+          <w:szCs w:val="18"/>
+        </w:rPr>
+        <w:t xml:space="preserve">CSV	28</w:t>
       </w:r>
     </w:p>
     <w:p>
@@ -1469,7 +1621,7 @@
           <w:sz w:val="19"/>
           <w:szCs w:val="19"/>
         </w:rPr>
-        <w:t xml:space="preserve">Chapter 9. Exceptions	26</w:t>
+        <w:t xml:space="preserve">Chapter 9. Exceptions	30</w:t>
       </w:r>
     </w:p>
     <w:p>
@@ -1488,7 +1640,7 @@
           <w:sz w:val="18"/>
           <w:szCs w:val="18"/>
         </w:rPr>
-        <w:t xml:space="preserve">Handling	26</w:t>
+        <w:t xml:space="preserve">Handling	30</w:t>
       </w:r>
     </w:p>
     <w:p>
@@ -1507,7 +1659,7 @@
           <w:sz w:val="18"/>
           <w:szCs w:val="18"/>
         </w:rPr>
-        <w:t xml:space="preserve">Messages understood by an exception	26</w:t>
+        <w:t xml:space="preserve">Messages understood by an exception	30</w:t>
       </w:r>
     </w:p>
     <w:p>
@@ -1526,7 +1678,7 @@
           <w:sz w:val="18"/>
           <w:szCs w:val="18"/>
         </w:rPr>
-        <w:t xml:space="preserve">Signaling	26</w:t>
+        <w:t xml:space="preserve">Signaling	30</w:t>
       </w:r>
     </w:p>
     <w:p>
@@ -1545,7 +1697,7 @@
           <w:sz w:val="18"/>
           <w:szCs w:val="18"/>
         </w:rPr>
-        <w:t xml:space="preserve">Cleaning up	27</w:t>
+        <w:t xml:space="preserve">Cleaning up	31</w:t>
       </w:r>
     </w:p>
     <w:p>
@@ -1564,7 +1716,7 @@
           <w:sz w:val="18"/>
           <w:szCs w:val="18"/>
         </w:rPr>
-        <w:t xml:space="preserve">Your own exceptions	27</w:t>
+        <w:t xml:space="preserve">Your own exceptions	31</w:t>
       </w:r>
     </w:p>
     <w:p>
@@ -1583,7 +1735,7 @@
           <w:sz w:val="19"/>
           <w:szCs w:val="19"/>
         </w:rPr>
-        <w:t xml:space="preserve">Chapter 10. Reflection and the System	28</w:t>
+        <w:t xml:space="preserve">Chapter 10. Reflection and the System	32</w:t>
       </w:r>
     </w:p>
     <w:p>
@@ -1602,7 +1754,7 @@
           <w:sz w:val="18"/>
           <w:szCs w:val="18"/>
         </w:rPr>
-        <w:t xml:space="preserve">Asking about objects	28</w:t>
+        <w:t xml:space="preserve">Asking about objects	32</w:t>
       </w:r>
     </w:p>
     <w:p>
@@ -1621,7 +1773,7 @@
           <w:sz w:val="18"/>
           <w:szCs w:val="18"/>
         </w:rPr>
-        <w:t xml:space="preserve">Asking about classes	28</w:t>
+        <w:t xml:space="preserve">Asking about classes	32</w:t>
       </w:r>
     </w:p>
     <w:p>
@@ -1640,7 +1792,7 @@
           <w:sz w:val="18"/>
           <w:szCs w:val="18"/>
         </w:rPr>
-        <w:t xml:space="preserve">The Smalltalk dictionary	28</w:t>
+        <w:t xml:space="preserve">The Smalltalk dictionary	32</w:t>
       </w:r>
     </w:p>
     <w:p>
@@ -1659,7 +1811,7 @@
           <w:sz w:val="19"/>
           <w:szCs w:val="19"/>
         </w:rPr>
-        <w:t xml:space="preserve">Chapter 11. Errors and Traces	30</w:t>
+        <w:t xml:space="preserve">Chapter 11. Errors and Traces	34</w:t>
       </w:r>
     </w:p>
     <w:p>
@@ -1678,7 +1830,7 @@
           <w:sz w:val="18"/>
           <w:szCs w:val="18"/>
         </w:rPr>
-        <w:t xml:space="preserve">Unhandled errors	30</w:t>
+        <w:t xml:space="preserve">Unhandled errors	34</w:t>
       </w:r>
     </w:p>
     <w:p>
@@ -1697,7 +1849,7 @@
           <w:sz w:val="18"/>
           <w:szCs w:val="18"/>
         </w:rPr>
-        <w:t xml:space="preserve">Common messages	30</w:t>
+        <w:t xml:space="preserve">Common messages	34</w:t>
       </w:r>
     </w:p>
     <w:p>
@@ -1716,7 +1868,7 @@
           <w:sz w:val="18"/>
           <w:szCs w:val="18"/>
         </w:rPr>
-        <w:t xml:space="preserve">Parse errors	30</w:t>
+        <w:t xml:space="preserve">Parse errors	34</w:t>
       </w:r>
     </w:p>
     <w:p>
@@ -1735,7 +1887,7 @@
           <w:sz w:val="19"/>
           <w:szCs w:val="19"/>
         </w:rPr>
-        <w:t xml:space="preserve">Chapter 12. How Smalltalk/CREXX Works	31</w:t>
+        <w:t xml:space="preserve">Chapter 12. How Smalltalk/CREXX Works	35</w:t>
       </w:r>
     </w:p>
     <w:p>
@@ -1754,7 +1906,7 @@
           <w:sz w:val="18"/>
           <w:szCs w:val="18"/>
         </w:rPr>
-        <w:t xml:space="preserve">Objects	31</w:t>
+        <w:t xml:space="preserve">Objects	35</w:t>
       </w:r>
     </w:p>
     <w:p>
@@ -1773,7 +1925,7 @@
           <w:sz w:val="18"/>
           <w:szCs w:val="18"/>
         </w:rPr>
-        <w:t xml:space="preserve">Classes and methods	31</w:t>
+        <w:t xml:space="preserve">Classes and methods	35</w:t>
       </w:r>
     </w:p>
     <w:p>
@@ -1792,7 +1944,7 @@
           <w:sz w:val="18"/>
           <w:szCs w:val="18"/>
         </w:rPr>
-        <w:t xml:space="preserve">The resolver	31</w:t>
+        <w:t xml:space="preserve">The resolver	35</w:t>
       </w:r>
     </w:p>
     <w:p>
@@ -1811,7 +1963,7 @@
           <w:sz w:val="18"/>
           <w:szCs w:val="18"/>
         </w:rPr>
-        <w:t xml:space="preserve">The evaluator	31</w:t>
+        <w:t xml:space="preserve">The evaluator	35</w:t>
       </w:r>
     </w:p>
     <w:p>
@@ -1830,7 +1982,7 @@
           <w:sz w:val="18"/>
           <w:szCs w:val="18"/>
         </w:rPr>
-        <w:t xml:space="preserve">Primitives	31</w:t>
+        <w:t xml:space="preserve">Primitives	35</w:t>
       </w:r>
     </w:p>
     <w:p>
@@ -1849,7 +2001,7 @@
           <w:sz w:val="18"/>
           <w:szCs w:val="18"/>
         </w:rPr>
-        <w:t xml:space="preserve">Adding a primitive	31</w:t>
+        <w:t xml:space="preserve">Adding a primitive	35</w:t>
       </w:r>
     </w:p>
     <w:p>
@@ -1868,7 +2020,7 @@
           <w:sz w:val="18"/>
           <w:szCs w:val="18"/>
         </w:rPr>
-        <w:t xml:space="preserve">The build	32</w:t>
+        <w:t xml:space="preserve">The build	36</w:t>
       </w:r>
     </w:p>
     <w:p>
@@ -1887,7 +2039,7 @@
           <w:sz w:val="19"/>
           <w:szCs w:val="19"/>
         </w:rPr>
-        <w:t xml:space="preserve">Chapter 13. Restrictions and Known Problems	33</w:t>
+        <w:t xml:space="preserve">Chapter 13. Restrictions and Known Problems	37</w:t>
       </w:r>
     </w:p>
     <w:p>
@@ -1906,7 +2058,7 @@
           <w:sz w:val="19"/>
           <w:szCs w:val="19"/>
         </w:rPr>
-        <w:t xml:space="preserve">Appendix A. Command Summary	34</w:t>
+        <w:t xml:space="preserve">Appendix A. Command Summary	38</w:t>
       </w:r>
     </w:p>
     <w:p>
@@ -1925,7 +2077,7 @@
           <w:sz w:val="19"/>
           <w:szCs w:val="19"/>
         </w:rPr>
-        <w:t xml:space="preserve">Appendix B. Contents of the Repository	35</w:t>
+        <w:t xml:space="preserve">Appendix B. Contents of the Repository	39</w:t>
       </w:r>
     </w:p>
     <w:p>
@@ -1944,7 +2096,7 @@
           <w:sz w:val="19"/>
           <w:szCs w:val="19"/>
         </w:rPr>
-        <w:t xml:space="preserve">Appendix C. Class Hierarchy	36</w:t>
+        <w:t xml:space="preserve">Appendix C. Class Hierarchy	40</w:t>
       </w:r>
     </w:p>
     <w:p>
@@ -1963,7 +2115,7 @@
           <w:sz w:val="19"/>
           <w:szCs w:val="19"/>
         </w:rPr>
-        <w:t xml:space="preserve">Appendix D. Sample Programs	37</w:t>
+        <w:t xml:space="preserve">Appendix D. Sample Programs	41</w:t>
       </w:r>
     </w:p>
     <w:p>
@@ -4696,7 +4848,7 @@
           <w:sz w:val="24"/>
           <w:szCs w:val="24"/>
         </w:rPr>
-        <w:t xml:space="preserve">Starting the interpreter</w:t>
+        <w:t xml:space="preserve">The interactive prompt</w:t>
       </w:r>
     </w:p>
     <w:p>
@@ -4709,7 +4861,237 @@
           <w:sz w:val="20"/>
           <w:szCs w:val="20"/>
         </w:rPr>
-        <w:t xml:space="preserve">When it starts, the interpreter creates the kernel classes, then reads the library files lib/kernel.st, lib/numbers.st, lib/collections.st, lib/streams.st and lib/exceptions.st, and only then reads your program. The library directory is found by the launcher; with the driver you pass it as -L directory.</w:t>
+        <w:t xml:space="preserve">With the option -i the interpreter reads the named files, if any, and then shows a prompt st&gt; on which it reads statements from standard input. The value of each expression is printed after it is evaluated; values that are nil or the Transcript are not shown. A statement that has an open bracket, parenthesis or quote continues on the next line, shown with the prompt ... . Type exit, quit or bye, or end the input, to leave. Temporary variables declared with | x | and classes defined at the prompt stay until the end of the session.</w:t>
+      </w:r>
+    </w:p>
+    <w:p>
+      <w:pPr>
+        <w:keepNext/>
+        <w:keepLines/>
+        <w:pBdr>
+          <w:top w:val="single" w:color="808080" w:sz="4"/>
+          <w:left w:val="single" w:color="808080" w:sz="4"/>
+          <w:right w:val="single" w:color="808080" w:sz="4"/>
+        </w:pBdr>
+        <w:shd w:fill="F2F2F2" w:color="auto" w:val="clear"/>
+        <w:spacing w:after="0" w:line="240"/>
+        <w:ind w:left="100" w:right="100"/>
+      </w:pPr>
+      <w:r>
+        <w:rPr>
+          <w:rFonts w:ascii="Courier New" w:cs="Courier New" w:eastAsia="Courier New" w:hAnsi="Courier New"/>
+          <w:sz w:val="17"/>
+          <w:szCs w:val="17"/>
+        </w:rPr>
+        <w:t xml:space="preserve">$ ./smalltalk -i</w:t>
+      </w:r>
+    </w:p>
+    <w:p>
+      <w:pPr>
+        <w:keepNext/>
+        <w:keepLines/>
+        <w:pBdr>
+          <w:left w:val="single" w:color="808080" w:sz="4"/>
+          <w:right w:val="single" w:color="808080" w:sz="4"/>
+        </w:pBdr>
+        <w:shd w:fill="F2F2F2" w:color="auto" w:val="clear"/>
+        <w:spacing w:after="0" w:line="240"/>
+        <w:ind w:left="100" w:right="100"/>
+      </w:pPr>
+      <w:r>
+        <w:rPr>
+          <w:rFonts w:ascii="Courier New" w:cs="Courier New" w:eastAsia="Courier New" w:hAnsi="Courier New"/>
+          <w:sz w:val="17"/>
+          <w:szCs w:val="17"/>
+        </w:rPr>
+        <w:t xml:space="preserve">CREXX Smalltalk - type exit to leave</w:t>
+      </w:r>
+    </w:p>
+    <w:p>
+      <w:pPr>
+        <w:keepNext/>
+        <w:keepLines/>
+        <w:pBdr>
+          <w:left w:val="single" w:color="808080" w:sz="4"/>
+          <w:right w:val="single" w:color="808080" w:sz="4"/>
+        </w:pBdr>
+        <w:shd w:fill="F2F2F2" w:color="auto" w:val="clear"/>
+        <w:spacing w:after="0" w:line="240"/>
+        <w:ind w:left="100" w:right="100"/>
+      </w:pPr>
+      <w:r>
+        <w:rPr>
+          <w:rFonts w:ascii="Courier New" w:cs="Courier New" w:eastAsia="Courier New" w:hAnsi="Courier New"/>
+          <w:sz w:val="17"/>
+          <w:szCs w:val="17"/>
+        </w:rPr>
+        <w:t xml:space="preserve">st&gt; 3 + 4</w:t>
+      </w:r>
+    </w:p>
+    <w:p>
+      <w:pPr>
+        <w:keepNext/>
+        <w:keepLines/>
+        <w:pBdr>
+          <w:left w:val="single" w:color="808080" w:sz="4"/>
+          <w:right w:val="single" w:color="808080" w:sz="4"/>
+        </w:pBdr>
+        <w:shd w:fill="F2F2F2" w:color="auto" w:val="clear"/>
+        <w:spacing w:after="0" w:line="240"/>
+        <w:ind w:left="100" w:right="100"/>
+      </w:pPr>
+      <w:r>
+        <w:rPr>
+          <w:rFonts w:ascii="Courier New" w:cs="Courier New" w:eastAsia="Courier New" w:hAnsi="Courier New"/>
+          <w:sz w:val="17"/>
+          <w:szCs w:val="17"/>
+        </w:rPr>
+        <w:t xml:space="preserve">7</w:t>
+      </w:r>
+    </w:p>
+    <w:p>
+      <w:pPr>
+        <w:keepNext/>
+        <w:keepLines/>
+        <w:pBdr>
+          <w:left w:val="single" w:color="808080" w:sz="4"/>
+          <w:right w:val="single" w:color="808080" w:sz="4"/>
+        </w:pBdr>
+        <w:shd w:fill="F2F2F2" w:color="auto" w:val="clear"/>
+        <w:spacing w:after="0" w:line="240"/>
+        <w:ind w:left="100" w:right="100"/>
+      </w:pPr>
+      <w:r>
+        <w:rPr>
+          <w:rFonts w:ascii="Courier New" w:cs="Courier New" w:eastAsia="Courier New" w:hAnsi="Courier New"/>
+          <w:sz w:val="17"/>
+          <w:szCs w:val="17"/>
+        </w:rPr>
+        <w:t xml:space="preserve">st&gt; (1 to: 3) collect: [:i | i * i]</w:t>
+      </w:r>
+    </w:p>
+    <w:p>
+      <w:pPr>
+        <w:keepNext/>
+        <w:keepLines/>
+        <w:pBdr>
+          <w:left w:val="single" w:color="808080" w:sz="4"/>
+          <w:right w:val="single" w:color="808080" w:sz="4"/>
+        </w:pBdr>
+        <w:shd w:fill="F2F2F2" w:color="auto" w:val="clear"/>
+        <w:spacing w:after="0" w:line="240"/>
+        <w:ind w:left="100" w:right="100"/>
+      </w:pPr>
+      <w:r>
+        <w:rPr>
+          <w:rFonts w:ascii="Courier New" w:cs="Courier New" w:eastAsia="Courier New" w:hAnsi="Courier New"/>
+          <w:sz w:val="17"/>
+          <w:szCs w:val="17"/>
+        </w:rPr>
+        <w:t xml:space="preserve">(1 4 9 )</w:t>
+      </w:r>
+    </w:p>
+    <w:p>
+      <w:pPr>
+        <w:keepNext w:val="false"/>
+        <w:keepLines/>
+        <w:pBdr>
+          <w:bottom w:val="single" w:color="808080" w:sz="4"/>
+          <w:left w:val="single" w:color="808080" w:sz="4"/>
+          <w:right w:val="single" w:color="808080" w:sz="4"/>
+        </w:pBdr>
+        <w:shd w:fill="F2F2F2" w:color="auto" w:val="clear"/>
+        <w:spacing w:after="0" w:line="240"/>
+        <w:ind w:left="100" w:right="100"/>
+      </w:pPr>
+      <w:r>
+        <w:rPr>
+          <w:rFonts w:ascii="Courier New" w:cs="Courier New" w:eastAsia="Courier New" w:hAnsi="Courier New"/>
+          <w:sz w:val="17"/>
+          <w:szCs w:val="17"/>
+        </w:rPr>
+        <w:t xml:space="preserve">st&gt; exit</w:t>
+      </w:r>
+    </w:p>
+    <w:p>
+      <w:pPr>
+        <w:spacing w:after="200" w:before="60"/>
+      </w:pPr>
+      <w:r>
+        <w:rPr>
+          <w:rFonts w:ascii="Arial" w:cs="Arial" w:eastAsia="Arial" w:hAnsi="Arial"/>
+          <w:b/>
+          <w:bCs/>
+          <w:sz w:val="18"/>
+          <w:szCs w:val="18"/>
+        </w:rPr>
+        <w:t xml:space="preserve">Figure 3. </w:t>
+      </w:r>
+      <w:r>
+        <w:rPr>
+          <w:rFonts w:ascii="Arial" w:cs="Arial" w:eastAsia="Arial" w:hAnsi="Arial"/>
+          <w:sz w:val="18"/>
+          <w:szCs w:val="18"/>
+        </w:rPr>
+        <w:t xml:space="preserve">An interactive session</w:t>
+      </w:r>
+    </w:p>
+    <w:p>
+      <w:pPr>
+        <w:pStyle w:val="Heading2"/>
+        <w:keepNext/>
+      </w:pPr>
+      <w:r>
+        <w:rPr>
+          <w:rFonts w:ascii="Arial" w:cs="Arial" w:eastAsia="Arial" w:hAnsi="Arial"/>
+          <w:b/>
+          <w:bCs/>
+          <w:sz w:val="24"/>
+          <w:szCs w:val="24"/>
+        </w:rPr>
+        <w:t xml:space="preserve">Program arguments</w:t>
+      </w:r>
+    </w:p>
+    <w:p>
+      <w:pPr>
+        <w:spacing w:after="120" w:line="264"/>
+      </w:pPr>
+      <w:r>
+        <w:rPr>
+          <w:rFonts w:ascii="Arial" w:cs="Arial" w:eastAsia="Arial" w:hAnsi="Arial"/>
+          <w:sz w:val="20"/>
+          <w:szCs w:val="20"/>
+        </w:rPr>
+        <w:t xml:space="preserve">Words after -- on the command line are not file names: they are handed to the program and answered by Smalltalk arguments as an Array of Strings. For example ./smalltalk report.st -- 2026 north runs report.st with the arguments ('2026' 'north').</w:t>
+      </w:r>
+    </w:p>
+    <w:p>
+      <w:pPr>
+        <w:pStyle w:val="Heading2"/>
+        <w:keepNext/>
+      </w:pPr>
+      <w:r>
+        <w:rPr>
+          <w:rFonts w:ascii="Arial" w:cs="Arial" w:eastAsia="Arial" w:hAnsi="Arial"/>
+          <w:b/>
+          <w:bCs/>
+          <w:sz w:val="24"/>
+          <w:szCs w:val="24"/>
+        </w:rPr>
+        <w:t xml:space="preserve">Starting the interpreter</w:t>
+      </w:r>
+    </w:p>
+    <w:p>
+      <w:pPr>
+        <w:spacing w:after="120" w:line="264"/>
+      </w:pPr>
+      <w:r>
+        <w:rPr>
+          <w:rFonts w:ascii="Arial" w:cs="Arial" w:eastAsia="Arial" w:hAnsi="Arial"/>
+          <w:sz w:val="20"/>
+          <w:szCs w:val="20"/>
+        </w:rPr>
+        <w:t xml:space="preserve">When it starts, the interpreter creates the kernel classes, then reads the library files lib/kernel.st, lib/numbers.st, lib/collections.st, lib/streams.st, lib/exceptions.st, lib/extras.st, lib/structures.st, lib/regex.st and lib/system.st, and only then reads your program. The library directory is found by the launcher; with the driver you pass it as -L directory.</w:t>
       </w:r>
     </w:p>
     <w:p>
@@ -5843,7 +6225,7 @@
           <w:sz w:val="18"/>
           <w:szCs w:val="18"/>
         </w:rPr>
-        <w:t xml:space="preserve">Figure 3. </w:t>
+        <w:t xml:space="preserve">Figure 4. </w:t>
       </w:r>
       <w:r>
         <w:rPr>
@@ -6491,7 +6873,7 @@
           <w:sz w:val="18"/>
           <w:szCs w:val="18"/>
         </w:rPr>
-        <w:t xml:space="preserve">Figure 4. </w:t>
+        <w:t xml:space="preserve">Figure 5. </w:t>
       </w:r>
       <w:r>
         <w:rPr>
@@ -6705,7 +7087,7 @@
           <w:sz w:val="18"/>
           <w:szCs w:val="18"/>
         </w:rPr>
-        <w:t xml:space="preserve">Figure 5. </w:t>
+        <w:t xml:space="preserve">Figure 6. </w:t>
       </w:r>
       <w:r>
         <w:rPr>
@@ -6898,7 +7280,7 @@
           <w:sz w:val="18"/>
           <w:szCs w:val="18"/>
         </w:rPr>
-        <w:t xml:space="preserve">Figure 6. </w:t>
+        <w:t xml:space="preserve">Figure 7. </w:t>
       </w:r>
       <w:r>
         <w:rPr>
@@ -7204,7 +7586,7 @@
           <w:sz w:val="18"/>
           <w:szCs w:val="18"/>
         </w:rPr>
-        <w:t xml:space="preserve">Figure 7. </w:t>
+        <w:t xml:space="preserve">Figure 8. </w:t>
       </w:r>
       <w:r>
         <w:rPr>
@@ -7489,7 +7871,7 @@
           <w:sz w:val="18"/>
           <w:szCs w:val="18"/>
         </w:rPr>
-        <w:t xml:space="preserve">Figure 8. </w:t>
+        <w:t xml:space="preserve">Figure 9. </w:t>
       </w:r>
       <w:r>
         <w:rPr>
@@ -8493,7 +8875,7 @@
           <w:sz w:val="18"/>
           <w:szCs w:val="18"/>
         </w:rPr>
-        <w:t xml:space="preserve">Figure 9. </w:t>
+        <w:t xml:space="preserve">Figure 10. </w:t>
       </w:r>
       <w:r>
         <w:rPr>
@@ -8770,7 +9152,7 @@
           <w:sz w:val="18"/>
           <w:szCs w:val="18"/>
         </w:rPr>
-        <w:t xml:space="preserve">Figure 10. </w:t>
+        <w:t xml:space="preserve">Figure 11. </w:t>
       </w:r>
       <w:r>
         <w:rPr>
@@ -9432,7 +9814,7 @@
           <w:sz w:val="18"/>
           <w:szCs w:val="18"/>
         </w:rPr>
-        <w:t xml:space="preserve">Figure 11. </w:t>
+        <w:t xml:space="preserve">Figure 12. </w:t>
       </w:r>
       <w:r>
         <w:rPr>
@@ -9914,7 +10296,7 @@
           <w:sz w:val="18"/>
           <w:szCs w:val="18"/>
         </w:rPr>
-        <w:t xml:space="preserve">Figure 12. </w:t>
+        <w:t xml:space="preserve">Figure 13. </w:t>
       </w:r>
       <w:r>
         <w:rPr>
@@ -10212,7 +10594,7 @@
           <w:sz w:val="18"/>
           <w:szCs w:val="18"/>
         </w:rPr>
-        <w:t xml:space="preserve">Figure 13. </w:t>
+        <w:t xml:space="preserve">Figure 14. </w:t>
       </w:r>
       <w:r>
         <w:rPr>
@@ -10652,7 +11034,7 @@
           <w:sz w:val="18"/>
           <w:szCs w:val="18"/>
         </w:rPr>
-        <w:t xml:space="preserve">Figure 14. </w:t>
+        <w:t xml:space="preserve">Figure 15. </w:t>
       </w:r>
       <w:r>
         <w:rPr>
@@ -10979,7 +11361,7 @@
           <w:sz w:val="18"/>
           <w:szCs w:val="18"/>
         </w:rPr>
-        <w:t xml:space="preserve">Figure 15. </w:t>
+        <w:t xml:space="preserve">Figure 16. </w:t>
       </w:r>
       <w:r>
         <w:rPr>
@@ -11306,7 +11688,7 @@
           <w:sz w:val="18"/>
           <w:szCs w:val="18"/>
         </w:rPr>
-        <w:t xml:space="preserve">Figure 16. </w:t>
+        <w:t xml:space="preserve">Figure 17. </w:t>
       </w:r>
       <w:r>
         <w:rPr>
@@ -11682,7 +12064,7 @@
           <w:sz w:val="18"/>
           <w:szCs w:val="18"/>
         </w:rPr>
-        <w:t xml:space="preserve">Figure 17. </w:t>
+        <w:t xml:space="preserve">Figure 18. </w:t>
       </w:r>
       <w:r>
         <w:rPr>
@@ -12135,7 +12517,7 @@
           <w:sz w:val="18"/>
           <w:szCs w:val="18"/>
         </w:rPr>
-        <w:t xml:space="preserve">Figure 18. </w:t>
+        <w:t xml:space="preserve">Figure 19. </w:t>
       </w:r>
       <w:r>
         <w:rPr>
@@ -12391,7 +12773,7 @@
           <w:sz w:val="18"/>
           <w:szCs w:val="18"/>
         </w:rPr>
-        <w:t xml:space="preserve">Figure 19. </w:t>
+        <w:t xml:space="preserve">Figure 20. </w:t>
       </w:r>
       <w:r>
         <w:rPr>
@@ -13388,7 +13770,7 @@
           <w:sz w:val="18"/>
           <w:szCs w:val="18"/>
         </w:rPr>
-        <w:t xml:space="preserve">Figure 20. </w:t>
+        <w:t xml:space="preserve">Figure 21. </w:t>
       </w:r>
       <w:r>
         <w:rPr>
@@ -13757,7 +14139,7 @@
           <w:sz w:val="18"/>
           <w:szCs w:val="18"/>
         </w:rPr>
-        <w:t xml:space="preserve">Figure 21. </w:t>
+        <w:t xml:space="preserve">Figure 22. </w:t>
       </w:r>
       <w:r>
         <w:rPr>
@@ -13958,7 +14340,7 @@
           <w:sz w:val="18"/>
           <w:szCs w:val="18"/>
         </w:rPr>
-        <w:t xml:space="preserve">Figure 22. </w:t>
+        <w:t xml:space="preserve">Figure 23. </w:t>
       </w:r>
       <w:r>
         <w:rPr>
@@ -14201,7 +14583,7 @@
           <w:sz w:val="18"/>
           <w:szCs w:val="18"/>
         </w:rPr>
-        <w:t xml:space="preserve">Figure 23. </w:t>
+        <w:t xml:space="preserve">Figure 24. </w:t>
       </w:r>
       <w:r>
         <w:rPr>
@@ -14210,6 +14592,291 @@
           <w:szCs w:val="18"/>
         </w:rPr>
         <w:t xml:space="preserve">Complex arithmetic</w:t>
+      </w:r>
+    </w:p>
+    <w:p>
+      <w:pPr>
+        <w:pStyle w:val="Heading2"/>
+        <w:keepNext/>
+      </w:pPr>
+      <w:r>
+        <w:rPr>
+          <w:rFonts w:ascii="Arial" w:cs="Arial" w:eastAsia="Arial" w:hAnsi="Arial"/>
+          <w:b/>
+          <w:bCs/>
+          <w:sz w:val="24"/>
+          <w:szCs w:val="24"/>
+        </w:rPr>
+        <w:t xml:space="preserve">Infinity and NaN</w:t>
+      </w:r>
+    </w:p>
+    <w:p>
+      <w:pPr>
+        <w:spacing w:after="120" w:line="264"/>
+      </w:pPr>
+      <w:r>
+        <w:rPr>
+          <w:rFonts w:ascii="Arial" w:cs="Arial" w:eastAsia="Arial" w:hAnsi="Arial"/>
+          <w:sz w:val="20"/>
+          <w:szCs w:val="20"/>
+        </w:rPr>
+        <w:t xml:space="preserve">Float infinity, Float negativeInfinity and Float nan answer the special floating-point values; isInfinite and isNaN test for them. The square root of a negative number and the logarithm of a negative number answer NaN, and the logarithm of zero answers negative infinity. Float division by zero is still an error. truncated, floor, ceiling and rounded of an infinite or NaN value are errors.</w:t>
+      </w:r>
+    </w:p>
+    <w:p>
+      <w:pPr>
+        <w:keepNext/>
+        <w:keepLines/>
+        <w:pBdr>
+          <w:top w:val="single" w:color="808080" w:sz="4"/>
+          <w:left w:val="single" w:color="808080" w:sz="4"/>
+          <w:right w:val="single" w:color="808080" w:sz="4"/>
+        </w:pBdr>
+        <w:shd w:fill="F2F2F2" w:color="auto" w:val="clear"/>
+        <w:spacing w:after="0" w:line="240"/>
+        <w:ind w:left="100" w:right="100"/>
+      </w:pPr>
+      <w:r>
+        <w:rPr>
+          <w:rFonts w:ascii="Courier New" w:cs="Courier New" w:eastAsia="Courier New" w:hAnsi="Courier New"/>
+          <w:sz w:val="17"/>
+          <w:szCs w:val="17"/>
+        </w:rPr>
+        <w:t xml:space="preserve">-1 sqrt printNl.</w:t>
+      </w:r>
+    </w:p>
+    <w:p>
+      <w:pPr>
+        <w:keepNext/>
+        <w:keepLines/>
+        <w:pBdr>
+          <w:left w:val="single" w:color="808080" w:sz="4"/>
+          <w:right w:val="single" w:color="808080" w:sz="4"/>
+        </w:pBdr>
+        <w:shd w:fill="F2F2F2" w:color="auto" w:val="clear"/>
+        <w:spacing w:after="0" w:line="240"/>
+        <w:ind w:left="100" w:right="100"/>
+      </w:pPr>
+      <w:r>
+        <w:rPr>
+          <w:rFonts w:ascii="Courier New" w:cs="Courier New" w:eastAsia="Courier New" w:hAnsi="Courier New"/>
+          <w:sz w:val="17"/>
+          <w:szCs w:val="17"/>
+        </w:rPr>
+        <w:t xml:space="preserve">Float infinity printNl.</w:t>
+      </w:r>
+    </w:p>
+    <w:p>
+      <w:pPr>
+        <w:keepNext/>
+        <w:keepLines/>
+        <w:pBdr>
+          <w:left w:val="single" w:color="808080" w:sz="4"/>
+          <w:right w:val="single" w:color="808080" w:sz="4"/>
+        </w:pBdr>
+        <w:shd w:fill="F2F2F2" w:color="auto" w:val="clear"/>
+        <w:spacing w:after="0" w:line="240"/>
+        <w:ind w:left="100" w:right="100"/>
+      </w:pPr>
+      <w:r>
+        <w:rPr>
+          <w:rFonts w:ascii="Courier New" w:cs="Courier New" w:eastAsia="Courier New" w:hAnsi="Courier New"/>
+          <w:sz w:val="17"/>
+          <w:szCs w:val="17"/>
+        </w:rPr>
+        <w:t xml:space="preserve">Float negativeInfinity printNl.</w:t>
+      </w:r>
+    </w:p>
+    <w:p>
+      <w:pPr>
+        <w:keepNext/>
+        <w:keepLines/>
+        <w:pBdr>
+          <w:left w:val="single" w:color="808080" w:sz="4"/>
+          <w:right w:val="single" w:color="808080" w:sz="4"/>
+        </w:pBdr>
+        <w:shd w:fill="F2F2F2" w:color="auto" w:val="clear"/>
+        <w:spacing w:after="0" w:line="240"/>
+        <w:ind w:left="100" w:right="100"/>
+      </w:pPr>
+      <w:r>
+        <w:rPr>
+          <w:rFonts w:ascii="Courier New" w:cs="Courier New" w:eastAsia="Courier New" w:hAnsi="Courier New"/>
+          <w:sz w:val="17"/>
+          <w:szCs w:val="17"/>
+        </w:rPr>
+        <w:t xml:space="preserve">0 ln printNl.</w:t>
+      </w:r>
+    </w:p>
+    <w:p>
+      <w:pPr>
+        <w:keepNext/>
+        <w:keepLines/>
+        <w:pBdr>
+          <w:left w:val="single" w:color="808080" w:sz="4"/>
+          <w:right w:val="single" w:color="808080" w:sz="4"/>
+        </w:pBdr>
+        <w:shd w:fill="F2F2F2" w:color="auto" w:val="clear"/>
+        <w:spacing w:after="0" w:line="240"/>
+        <w:ind w:left="100" w:right="100"/>
+      </w:pPr>
+      <w:r>
+        <w:rPr>
+          <w:rFonts w:ascii="Courier New" w:cs="Courier New" w:eastAsia="Courier New" w:hAnsi="Courier New"/>
+          <w:sz w:val="17"/>
+          <w:szCs w:val="17"/>
+        </w:rPr>
+        <w:t xml:space="preserve">-1 sqrt isNaN printNl.</w:t>
+      </w:r>
+    </w:p>
+    <w:p>
+      <w:pPr>
+        <w:keepNext/>
+        <w:keepLines/>
+        <w:pBdr>
+          <w:left w:val="single" w:color="808080" w:sz="4"/>
+          <w:right w:val="single" w:color="808080" w:sz="4"/>
+        </w:pBdr>
+        <w:shd w:fill="F2F2F2" w:color="auto" w:val="clear"/>
+        <w:spacing w:after="0" w:line="240"/>
+        <w:ind w:left="100" w:right="100"/>
+      </w:pPr>
+      <w:r>
+        <w:rPr>
+          <w:rFonts w:ascii="Courier New" w:cs="Courier New" w:eastAsia="Courier New" w:hAnsi="Courier New"/>
+          <w:sz w:val="17"/>
+          <w:szCs w:val="17"/>
+        </w:rPr>
+        <w:t xml:space="preserve"> </w:t>
+      </w:r>
+    </w:p>
+    <w:p>
+      <w:pPr>
+        <w:keepNext/>
+        <w:keepLines/>
+        <w:pBdr>
+          <w:left w:val="single" w:color="808080" w:sz="4"/>
+          <w:right w:val="single" w:color="808080" w:sz="4"/>
+        </w:pBdr>
+        <w:shd w:fill="F2F2F2" w:color="auto" w:val="clear"/>
+        <w:spacing w:after="0" w:line="240"/>
+        <w:ind w:left="100" w:right="100"/>
+      </w:pPr>
+      <w:r>
+        <w:rPr>
+          <w:rFonts w:ascii="Courier New" w:cs="Courier New" w:eastAsia="Courier New" w:hAnsi="Courier New"/>
+          <w:sz w:val="17"/>
+          <w:szCs w:val="17"/>
+        </w:rPr>
+        <w:t xml:space="preserve">nan</w:t>
+      </w:r>
+    </w:p>
+    <w:p>
+      <w:pPr>
+        <w:keepNext/>
+        <w:keepLines/>
+        <w:pBdr>
+          <w:left w:val="single" w:color="808080" w:sz="4"/>
+          <w:right w:val="single" w:color="808080" w:sz="4"/>
+        </w:pBdr>
+        <w:shd w:fill="F2F2F2" w:color="auto" w:val="clear"/>
+        <w:spacing w:after="0" w:line="240"/>
+        <w:ind w:left="100" w:right="100"/>
+      </w:pPr>
+      <w:r>
+        <w:rPr>
+          <w:rFonts w:ascii="Courier New" w:cs="Courier New" w:eastAsia="Courier New" w:hAnsi="Courier New"/>
+          <w:sz w:val="17"/>
+          <w:szCs w:val="17"/>
+        </w:rPr>
+        <w:t xml:space="preserve">inf</w:t>
+      </w:r>
+    </w:p>
+    <w:p>
+      <w:pPr>
+        <w:keepNext/>
+        <w:keepLines/>
+        <w:pBdr>
+          <w:left w:val="single" w:color="808080" w:sz="4"/>
+          <w:right w:val="single" w:color="808080" w:sz="4"/>
+        </w:pBdr>
+        <w:shd w:fill="F2F2F2" w:color="auto" w:val="clear"/>
+        <w:spacing w:after="0" w:line="240"/>
+        <w:ind w:left="100" w:right="100"/>
+      </w:pPr>
+      <w:r>
+        <w:rPr>
+          <w:rFonts w:ascii="Courier New" w:cs="Courier New" w:eastAsia="Courier New" w:hAnsi="Courier New"/>
+          <w:sz w:val="17"/>
+          <w:szCs w:val="17"/>
+        </w:rPr>
+        <w:t xml:space="preserve">-inf</w:t>
+      </w:r>
+    </w:p>
+    <w:p>
+      <w:pPr>
+        <w:keepNext/>
+        <w:keepLines/>
+        <w:pBdr>
+          <w:left w:val="single" w:color="808080" w:sz="4"/>
+          <w:right w:val="single" w:color="808080" w:sz="4"/>
+        </w:pBdr>
+        <w:shd w:fill="F2F2F2" w:color="auto" w:val="clear"/>
+        <w:spacing w:after="0" w:line="240"/>
+        <w:ind w:left="100" w:right="100"/>
+      </w:pPr>
+      <w:r>
+        <w:rPr>
+          <w:rFonts w:ascii="Courier New" w:cs="Courier New" w:eastAsia="Courier New" w:hAnsi="Courier New"/>
+          <w:sz w:val="17"/>
+          <w:szCs w:val="17"/>
+        </w:rPr>
+        <w:t xml:space="preserve">-inf</w:t>
+      </w:r>
+    </w:p>
+    <w:p>
+      <w:pPr>
+        <w:keepNext w:val="false"/>
+        <w:keepLines/>
+        <w:pBdr>
+          <w:bottom w:val="single" w:color="808080" w:sz="4"/>
+          <w:left w:val="single" w:color="808080" w:sz="4"/>
+          <w:right w:val="single" w:color="808080" w:sz="4"/>
+        </w:pBdr>
+        <w:shd w:fill="F2F2F2" w:color="auto" w:val="clear"/>
+        <w:spacing w:after="0" w:line="240"/>
+        <w:ind w:left="100" w:right="100"/>
+      </w:pPr>
+      <w:r>
+        <w:rPr>
+          <w:rFonts w:ascii="Courier New" w:cs="Courier New" w:eastAsia="Courier New" w:hAnsi="Courier New"/>
+          <w:sz w:val="17"/>
+          <w:szCs w:val="17"/>
+        </w:rPr>
+        <w:t xml:space="preserve">true</w:t>
+      </w:r>
+    </w:p>
+    <w:p>
+      <w:pPr>
+        <w:spacing w:after="200" w:before="60"/>
+      </w:pPr>
+      <w:r>
+        <w:rPr>
+          <w:rFonts w:ascii="Arial" w:cs="Arial" w:eastAsia="Arial" w:hAnsi="Arial"/>
+          <w:b/>
+          <w:bCs/>
+          <w:sz w:val="18"/>
+          <w:szCs w:val="18"/>
+        </w:rPr>
+        <w:t xml:space="preserve">Figure 25. </w:t>
+      </w:r>
+      <w:r>
+        <w:rPr>
+          <w:rFonts w:ascii="Arial" w:cs="Arial" w:eastAsia="Arial" w:hAnsi="Arial"/>
+          <w:sz w:val="18"/>
+          <w:szCs w:val="18"/>
+        </w:rPr>
+        <w:t xml:space="preserve">Special values</w:t>
       </w:r>
     </w:p>
     <w:p>
@@ -14922,7 +15589,7 @@
           <w:sz w:val="18"/>
           <w:szCs w:val="18"/>
         </w:rPr>
-        <w:t xml:space="preserve">Figure 24. </w:t>
+        <w:t xml:space="preserve">Figure 26. </w:t>
       </w:r>
       <w:r>
         <w:rPr>
@@ -15680,7 +16347,7 @@
           <w:sz w:val="18"/>
           <w:szCs w:val="18"/>
         </w:rPr>
-        <w:t xml:space="preserve">Figure 25. </w:t>
+        <w:t xml:space="preserve">Figure 27. </w:t>
       </w:r>
       <w:r>
         <w:rPr>
@@ -16020,7 +16687,7 @@
           <w:sz w:val="18"/>
           <w:szCs w:val="18"/>
         </w:rPr>
-        <w:t xml:space="preserve">Figure 26. </w:t>
+        <w:t xml:space="preserve">Figure 28. </w:t>
       </w:r>
       <w:r>
         <w:rPr>
@@ -16423,7 +17090,7 @@
           <w:sz w:val="18"/>
           <w:szCs w:val="18"/>
         </w:rPr>
-        <w:t xml:space="preserve">Figure 27. </w:t>
+        <w:t xml:space="preserve">Figure 29. </w:t>
       </w:r>
       <w:r>
         <w:rPr>
@@ -17124,7 +17791,7 @@
           <w:sz w:val="18"/>
           <w:szCs w:val="18"/>
         </w:rPr>
-        <w:t xml:space="preserve">Figure 28. </w:t>
+        <w:t xml:space="preserve">Figure 30. </w:t>
       </w:r>
       <w:r>
         <w:rPr>
@@ -17385,7 +18052,7 @@
           <w:sz w:val="17"/>
           <w:szCs w:val="17"/>
         </w:rPr>
-        <w:t xml:space="preserve">a Dictionary ('one'-&gt;1 'two'-&gt;2 'three'-&gt;3 )</w:t>
+        <w:t xml:space="preserve">a Dictionary ('one'-&gt;1 'three'-&gt;3 'two'-&gt;2 )</w:t>
       </w:r>
     </w:p>
     <w:p>
@@ -17548,7 +18215,7 @@
           <w:sz w:val="18"/>
           <w:szCs w:val="18"/>
         </w:rPr>
-        <w:t xml:space="preserve">Figure 29. </w:t>
+        <w:t xml:space="preserve">Figure 31. </w:t>
       </w:r>
       <w:r>
         <w:rPr>
@@ -17904,7 +18571,7 @@
           <w:sz w:val="18"/>
           <w:szCs w:val="18"/>
         </w:rPr>
-        <w:t xml:space="preserve">Figure 30. </w:t>
+        <w:t xml:space="preserve">Figure 32. </w:t>
       </w:r>
       <w:r>
         <w:rPr>
@@ -18470,7 +19137,7 @@
           <w:sz w:val="18"/>
           <w:szCs w:val="18"/>
         </w:rPr>
-        <w:t xml:space="preserve">Figure 31. </w:t>
+        <w:t xml:space="preserve">Figure 33. </w:t>
       </w:r>
       <w:r>
         <w:rPr>
@@ -18860,7 +19527,7 @@
           <w:sz w:val="18"/>
           <w:szCs w:val="18"/>
         </w:rPr>
-        <w:t xml:space="preserve">Figure 32. </w:t>
+        <w:t xml:space="preserve">Figure 34. </w:t>
       </w:r>
       <w:r>
         <w:rPr>
@@ -19103,7 +19770,7 @@
           <w:sz w:val="18"/>
           <w:szCs w:val="18"/>
         </w:rPr>
-        <w:t xml:space="preserve">Figure 33. </w:t>
+        <w:t xml:space="preserve">Figure 35. </w:t>
       </w:r>
       <w:r>
         <w:rPr>
@@ -19112,6 +19779,35 @@
           <w:szCs w:val="18"/>
         </w:rPr>
         <w:t xml:space="preserve">A LinkedList</w:t>
+      </w:r>
+    </w:p>
+    <w:p>
+      <w:pPr>
+        <w:pStyle w:val="Heading2"/>
+        <w:keepNext/>
+      </w:pPr>
+      <w:r>
+        <w:rPr>
+          <w:rFonts w:ascii="Arial" w:cs="Arial" w:eastAsia="Arial" w:hAnsi="Arial"/>
+          <w:b/>
+          <w:bCs/>
+          <w:sz w:val="24"/>
+          <w:szCs w:val="24"/>
+        </w:rPr>
+        <w:t xml:space="preserve">Printing order</w:t>
+      </w:r>
+    </w:p>
+    <w:p>
+      <w:pPr>
+        <w:spacing w:after="120" w:line="264"/>
+      </w:pPr>
+      <w:r>
+        <w:rPr>
+          <w:rFonts w:ascii="Arial" w:cs="Arial" w:eastAsia="Arial" w:hAnsi="Arial"/>
+          <w:sz w:val="20"/>
+          <w:szCs w:val="20"/>
+        </w:rPr>
+        <w:t xml:space="preserve">A Set, a Bag or a Dictionary has no order of its own, but it prints in sorted order whenever its elements (for a Dictionary, its keys) can be compared with &lt;=, so the same program always prints the same text. do: and the other enumerators still visit the elements in the internal order. Elements that cannot be compared, such as mixed Strings and numbers, print in the internal order.</w:t>
       </w:r>
     </w:p>
     <w:p>
@@ -19964,7 +20660,7 @@
           <w:sz w:val="18"/>
           <w:szCs w:val="18"/>
         </w:rPr>
-        <w:t xml:space="preserve">Figure 34. </w:t>
+        <w:t xml:space="preserve">Figure 36. </w:t>
       </w:r>
       <w:r>
         <w:rPr>
@@ -20472,7 +21168,7 @@
           <w:sz w:val="18"/>
           <w:szCs w:val="18"/>
         </w:rPr>
-        <w:t xml:space="preserve">Figure 35. </w:t>
+        <w:t xml:space="preserve">Figure 37. </w:t>
       </w:r>
       <w:r>
         <w:rPr>
@@ -20870,7 +21566,7 @@
           <w:sz w:val="18"/>
           <w:szCs w:val="18"/>
         </w:rPr>
-        <w:t xml:space="preserve">Figure 36. </w:t>
+        <w:t xml:space="preserve">Figure 38. </w:t>
       </w:r>
       <w:r>
         <w:rPr>
@@ -21155,7 +21851,7 @@
           <w:sz w:val="18"/>
           <w:szCs w:val="18"/>
         </w:rPr>
-        <w:t xml:space="preserve">Figure 37. </w:t>
+        <w:t xml:space="preserve">Figure 39. </w:t>
       </w:r>
       <w:r>
         <w:rPr>
@@ -21356,7 +22052,7 @@
           <w:sz w:val="18"/>
           <w:szCs w:val="18"/>
         </w:rPr>
-        <w:t xml:space="preserve">Figure 38. </w:t>
+        <w:t xml:space="preserve">Figure 40. </w:t>
       </w:r>
       <w:r>
         <w:rPr>
@@ -21641,7 +22337,7 @@
           <w:sz w:val="18"/>
           <w:szCs w:val="18"/>
         </w:rPr>
-        <w:t xml:space="preserve">Figure 39. </w:t>
+        <w:t xml:space="preserve">Figure 41. </w:t>
       </w:r>
       <w:r>
         <w:rPr>
@@ -21981,7 +22677,7 @@
           <w:sz w:val="18"/>
           <w:szCs w:val="18"/>
         </w:rPr>
-        <w:t xml:space="preserve">Figure 40. </w:t>
+        <w:t xml:space="preserve">Figure 42. </w:t>
       </w:r>
       <w:r>
         <w:rPr>
@@ -22202,7 +22898,7 @@
           <w:sz w:val="18"/>
           <w:szCs w:val="18"/>
         </w:rPr>
-        <w:t xml:space="preserve">Figure 41. </w:t>
+        <w:t xml:space="preserve">Figure 43. </w:t>
       </w:r>
       <w:r>
         <w:rPr>
@@ -22693,7 +23389,7 @@
           <w:sz w:val="18"/>
           <w:szCs w:val="18"/>
         </w:rPr>
-        <w:t xml:space="preserve">Figure 42. </w:t>
+        <w:t xml:space="preserve">Figure 44. </w:t>
       </w:r>
       <w:r>
         <w:rPr>
@@ -23062,7 +23758,7 @@
           <w:sz w:val="18"/>
           <w:szCs w:val="18"/>
         </w:rPr>
-        <w:t xml:space="preserve">Figure 43. </w:t>
+        <w:t xml:space="preserve">Figure 45. </w:t>
       </w:r>
       <w:r>
         <w:rPr>
@@ -23376,7 +24072,7 @@
           <w:sz w:val="18"/>
           <w:szCs w:val="18"/>
         </w:rPr>
-        <w:t xml:space="preserve">Figure 44. </w:t>
+        <w:t xml:space="preserve">Figure 46. </w:t>
       </w:r>
       <w:r>
         <w:rPr>
@@ -23413,7 +24109,7 @@
           <w:sz w:val="20"/>
           <w:szCs w:val="20"/>
         </w:rPr>
-        <w:t xml:space="preserve">Date today and Time now answer the current date and time. A Date answers year, month and day and prints as 2026-10-10; a Time answers hours, minutes and seconds and prints as 14:05:09. Date year:month:day: and Time hours:minutes:seconds: make particular values, and both compare with &lt; and =. Time millisecondClock and Time millisecondsToRun: measure elapsed time.</w:t>
+        <w:t xml:space="preserve">Date today and Time now answer the current date and time. A Date answers year, month and day and prints as 2026-10-10; a Time answers hours, minutes and seconds and prints as 14:05:09. Date year:month:day: and Time hours:minutes:seconds: make particular values, and both compare with &lt; and =. Time millisecondClock answers the local time in milliseconds since 1970-01-01, and Time millisecondsToRun: answers the milliseconds a block takes.</w:t>
       </w:r>
     </w:p>
     <w:p>
@@ -23674,7 +24370,7 @@
           <w:sz w:val="18"/>
           <w:szCs w:val="18"/>
         </w:rPr>
-        <w:t xml:space="preserve">Figure 45. </w:t>
+        <w:t xml:space="preserve">Figure 47. </w:t>
       </w:r>
       <w:r>
         <w:rPr>
@@ -23943,7 +24639,7 @@
           <w:sz w:val="18"/>
           <w:szCs w:val="18"/>
         </w:rPr>
-        <w:t xml:space="preserve">Figure 46. </w:t>
+        <w:t xml:space="preserve">Figure 48. </w:t>
       </w:r>
       <w:r>
         <w:rPr>
@@ -24244,7 +24940,7 @@
           <w:sz w:val="18"/>
           <w:szCs w:val="18"/>
         </w:rPr>
-        <w:t xml:space="preserve">Figure 47. </w:t>
+        <w:t xml:space="preserve">Figure 49. </w:t>
       </w:r>
       <w:r>
         <w:rPr>
@@ -24253,6 +24949,1033 @@
           <w:szCs w:val="18"/>
         </w:rPr>
         <w:t xml:space="preserve">Parsing and formatting</w:t>
+      </w:r>
+    </w:p>
+    <w:p>
+      <w:pPr>
+        <w:pStyle w:val="Heading2"/>
+        <w:keepNext/>
+      </w:pPr>
+      <w:r>
+        <w:rPr>
+          <w:rFonts w:ascii="Arial" w:cs="Arial" w:eastAsia="Arial" w:hAnsi="Arial"/>
+          <w:b/>
+          <w:bCs/>
+          <w:sz w:val="24"/>
+          <w:szCs w:val="24"/>
+        </w:rPr>
+        <w:t xml:space="preserve">ReadWriteStream</w:t>
+      </w:r>
+    </w:p>
+    <w:p>
+      <w:pPr>
+        <w:spacing w:after="120" w:line="264"/>
+      </w:pPr>
+      <w:r>
+        <w:rPr>
+          <w:rFonts w:ascii="Arial" w:cs="Arial" w:eastAsia="Arial" w:hAnsi="Arial"/>
+          <w:sz w:val="20"/>
+          <w:szCs w:val="20"/>
+        </w:rPr>
+        <w:t xml:space="preserve">A ReadWriteStream is written with nextPut: and nextPutAll: and read with next, next:, peek, upTo:, upToEnd and nextLine. reset moves the read position back to the start and setToEnd moves it to the end; contents answers everything written.</w:t>
+      </w:r>
+    </w:p>
+    <w:p>
+      <w:pPr>
+        <w:keepNext/>
+        <w:keepLines/>
+        <w:pBdr>
+          <w:top w:val="single" w:color="808080" w:sz="4"/>
+          <w:left w:val="single" w:color="808080" w:sz="4"/>
+          <w:right w:val="single" w:color="808080" w:sz="4"/>
+        </w:pBdr>
+        <w:shd w:fill="F2F2F2" w:color="auto" w:val="clear"/>
+        <w:spacing w:after="0" w:line="240"/>
+        <w:ind w:left="100" w:right="100"/>
+      </w:pPr>
+      <w:r>
+        <w:rPr>
+          <w:rFonts w:ascii="Courier New" w:cs="Courier New" w:eastAsia="Courier New" w:hAnsi="Courier New"/>
+          <w:sz w:val="17"/>
+          <w:szCs w:val="17"/>
+        </w:rPr>
+        <w:t xml:space="preserve">| rw |</w:t>
+      </w:r>
+    </w:p>
+    <w:p>
+      <w:pPr>
+        <w:keepNext/>
+        <w:keepLines/>
+        <w:pBdr>
+          <w:left w:val="single" w:color="808080" w:sz="4"/>
+          <w:right w:val="single" w:color="808080" w:sz="4"/>
+        </w:pBdr>
+        <w:shd w:fill="F2F2F2" w:color="auto" w:val="clear"/>
+        <w:spacing w:after="0" w:line="240"/>
+        <w:ind w:left="100" w:right="100"/>
+      </w:pPr>
+      <w:r>
+        <w:rPr>
+          <w:rFonts w:ascii="Courier New" w:cs="Courier New" w:eastAsia="Courier New" w:hAnsi="Courier New"/>
+          <w:sz w:val="17"/>
+          <w:szCs w:val="17"/>
+        </w:rPr>
+        <w:t xml:space="preserve">rw := ReadWriteStream on: String new.</w:t>
+      </w:r>
+    </w:p>
+    <w:p>
+      <w:pPr>
+        <w:keepNext/>
+        <w:keepLines/>
+        <w:pBdr>
+          <w:left w:val="single" w:color="808080" w:sz="4"/>
+          <w:right w:val="single" w:color="808080" w:sz="4"/>
+        </w:pBdr>
+        <w:shd w:fill="F2F2F2" w:color="auto" w:val="clear"/>
+        <w:spacing w:after="0" w:line="240"/>
+        <w:ind w:left="100" w:right="100"/>
+      </w:pPr>
+      <w:r>
+        <w:rPr>
+          <w:rFonts w:ascii="Courier New" w:cs="Courier New" w:eastAsia="Courier New" w:hAnsi="Courier New"/>
+          <w:sz w:val="17"/>
+          <w:szCs w:val="17"/>
+        </w:rPr>
+        <w:t xml:space="preserve">rw nextPutAll: 'hello world'.</w:t>
+      </w:r>
+    </w:p>
+    <w:p>
+      <w:pPr>
+        <w:keepNext/>
+        <w:keepLines/>
+        <w:pBdr>
+          <w:left w:val="single" w:color="808080" w:sz="4"/>
+          <w:right w:val="single" w:color="808080" w:sz="4"/>
+        </w:pBdr>
+        <w:shd w:fill="F2F2F2" w:color="auto" w:val="clear"/>
+        <w:spacing w:after="0" w:line="240"/>
+        <w:ind w:left="100" w:right="100"/>
+      </w:pPr>
+      <w:r>
+        <w:rPr>
+          <w:rFonts w:ascii="Courier New" w:cs="Courier New" w:eastAsia="Courier New" w:hAnsi="Courier New"/>
+          <w:sz w:val="17"/>
+          <w:szCs w:val="17"/>
+        </w:rPr>
+        <w:t xml:space="preserve">rw reset.</w:t>
+      </w:r>
+    </w:p>
+    <w:p>
+      <w:pPr>
+        <w:keepNext/>
+        <w:keepLines/>
+        <w:pBdr>
+          <w:left w:val="single" w:color="808080" w:sz="4"/>
+          <w:right w:val="single" w:color="808080" w:sz="4"/>
+        </w:pBdr>
+        <w:shd w:fill="F2F2F2" w:color="auto" w:val="clear"/>
+        <w:spacing w:after="0" w:line="240"/>
+        <w:ind w:left="100" w:right="100"/>
+      </w:pPr>
+      <w:r>
+        <w:rPr>
+          <w:rFonts w:ascii="Courier New" w:cs="Courier New" w:eastAsia="Courier New" w:hAnsi="Courier New"/>
+          <w:sz w:val="17"/>
+          <w:szCs w:val="17"/>
+        </w:rPr>
+        <w:t xml:space="preserve">(rw next: 5) printNl.</w:t>
+      </w:r>
+    </w:p>
+    <w:p>
+      <w:pPr>
+        <w:keepNext/>
+        <w:keepLines/>
+        <w:pBdr>
+          <w:left w:val="single" w:color="808080" w:sz="4"/>
+          <w:right w:val="single" w:color="808080" w:sz="4"/>
+        </w:pBdr>
+        <w:shd w:fill="F2F2F2" w:color="auto" w:val="clear"/>
+        <w:spacing w:after="0" w:line="240"/>
+        <w:ind w:left="100" w:right="100"/>
+      </w:pPr>
+      <w:r>
+        <w:rPr>
+          <w:rFonts w:ascii="Courier New" w:cs="Courier New" w:eastAsia="Courier New" w:hAnsi="Courier New"/>
+          <w:sz w:val="17"/>
+          <w:szCs w:val="17"/>
+        </w:rPr>
+        <w:t xml:space="preserve">rw upToEnd printNl.</w:t>
+      </w:r>
+    </w:p>
+    <w:p>
+      <w:pPr>
+        <w:keepNext/>
+        <w:keepLines/>
+        <w:pBdr>
+          <w:left w:val="single" w:color="808080" w:sz="4"/>
+          <w:right w:val="single" w:color="808080" w:sz="4"/>
+        </w:pBdr>
+        <w:shd w:fill="F2F2F2" w:color="auto" w:val="clear"/>
+        <w:spacing w:after="0" w:line="240"/>
+        <w:ind w:left="100" w:right="100"/>
+      </w:pPr>
+      <w:r>
+        <w:rPr>
+          <w:rFonts w:ascii="Courier New" w:cs="Courier New" w:eastAsia="Courier New" w:hAnsi="Courier New"/>
+          <w:sz w:val="17"/>
+          <w:szCs w:val="17"/>
+        </w:rPr>
+        <w:t xml:space="preserve"> </w:t>
+      </w:r>
+    </w:p>
+    <w:p>
+      <w:pPr>
+        <w:keepNext/>
+        <w:keepLines/>
+        <w:pBdr>
+          <w:left w:val="single" w:color="808080" w:sz="4"/>
+          <w:right w:val="single" w:color="808080" w:sz="4"/>
+        </w:pBdr>
+        <w:shd w:fill="F2F2F2" w:color="auto" w:val="clear"/>
+        <w:spacing w:after="0" w:line="240"/>
+        <w:ind w:left="100" w:right="100"/>
+      </w:pPr>
+      <w:r>
+        <w:rPr>
+          <w:rFonts w:ascii="Courier New" w:cs="Courier New" w:eastAsia="Courier New" w:hAnsi="Courier New"/>
+          <w:sz w:val="17"/>
+          <w:szCs w:val="17"/>
+        </w:rPr>
+        <w:t xml:space="preserve">'hello'</w:t>
+      </w:r>
+    </w:p>
+    <w:p>
+      <w:pPr>
+        <w:keepNext w:val="false"/>
+        <w:keepLines/>
+        <w:pBdr>
+          <w:bottom w:val="single" w:color="808080" w:sz="4"/>
+          <w:left w:val="single" w:color="808080" w:sz="4"/>
+          <w:right w:val="single" w:color="808080" w:sz="4"/>
+        </w:pBdr>
+        <w:shd w:fill="F2F2F2" w:color="auto" w:val="clear"/>
+        <w:spacing w:after="0" w:line="240"/>
+        <w:ind w:left="100" w:right="100"/>
+      </w:pPr>
+      <w:r>
+        <w:rPr>
+          <w:rFonts w:ascii="Courier New" w:cs="Courier New" w:eastAsia="Courier New" w:hAnsi="Courier New"/>
+          <w:sz w:val="17"/>
+          <w:szCs w:val="17"/>
+        </w:rPr>
+        <w:t xml:space="preserve">' world'</w:t>
+      </w:r>
+    </w:p>
+    <w:p>
+      <w:pPr>
+        <w:spacing w:after="200" w:before="60"/>
+      </w:pPr>
+      <w:r>
+        <w:rPr>
+          <w:rFonts w:ascii="Arial" w:cs="Arial" w:eastAsia="Arial" w:hAnsi="Arial"/>
+          <w:b/>
+          <w:bCs/>
+          <w:sz w:val="18"/>
+          <w:szCs w:val="18"/>
+        </w:rPr>
+        <w:t xml:space="preserve">Figure 50. </w:t>
+      </w:r>
+      <w:r>
+        <w:rPr>
+          <w:rFonts w:ascii="Arial" w:cs="Arial" w:eastAsia="Arial" w:hAnsi="Arial"/>
+          <w:sz w:val="18"/>
+          <w:szCs w:val="18"/>
+        </w:rPr>
+        <w:t xml:space="preserve">Writing, then reading</w:t>
+      </w:r>
+    </w:p>
+    <w:p>
+      <w:pPr>
+        <w:pStyle w:val="Heading2"/>
+        <w:keepNext/>
+      </w:pPr>
+      <w:r>
+        <w:rPr>
+          <w:rFonts w:ascii="Arial" w:cs="Arial" w:eastAsia="Arial" w:hAnsi="Arial"/>
+          <w:b/>
+          <w:bCs/>
+          <w:sz w:val="24"/>
+          <w:szCs w:val="24"/>
+        </w:rPr>
+        <w:t xml:space="preserve">Managing files and directories</w:t>
+      </w:r>
+    </w:p>
+    <w:p>
+      <w:pPr>
+        <w:spacing w:after="120" w:line="264"/>
+      </w:pPr>
+      <w:r>
+        <w:rPr>
+          <w:rFonts w:ascii="Arial" w:cs="Arial" w:eastAsia="Arial" w:hAnsi="Arial"/>
+          <w:sz w:val="20"/>
+          <w:szCs w:val="20"/>
+        </w:rPr>
+        <w:t xml:space="preserve">FileStream delete: path removes a file, FileStream rename: old to: new renames it and FileStream copy: old to: new copies it; each answers true on success. FileStream size: path answers the size in bytes, or nil if the file does not exist, and FileStream isFile: path tests for a file. FileStream write: path contents: text and FileStream append: path contents: text write or append a whole String in one step, and FileStream lines: path answers the lines of a file.</w:t>
+      </w:r>
+    </w:p>
+    <w:p>
+      <w:pPr>
+        <w:spacing w:after="120" w:line="264"/>
+      </w:pPr>
+      <w:r>
+        <w:rPr>
+          <w:rFonts w:ascii="Arial" w:cs="Arial" w:eastAsia="Arial" w:hAnsi="Arial"/>
+          <w:sz w:val="20"/>
+          <w:szCs w:val="20"/>
+        </w:rPr>
+        <w:t xml:space="preserve">The class Directory has only class-side messages. Directory exists: path tests for a directory, create: makes one and remove: deletes an empty one. entries: answers the sorted names inside a directory, fileNames: only the files and directoryNames: only the sub-directories; a directory that cannot be read is a NotFound error. Directory current answers the working directory and current: changes it.</w:t>
+      </w:r>
+    </w:p>
+    <w:p>
+      <w:pPr>
+        <w:keepNext/>
+        <w:keepLines/>
+        <w:pBdr>
+          <w:top w:val="single" w:color="808080" w:sz="4"/>
+          <w:left w:val="single" w:color="808080" w:sz="4"/>
+          <w:right w:val="single" w:color="808080" w:sz="4"/>
+        </w:pBdr>
+        <w:shd w:fill="F2F2F2" w:color="auto" w:val="clear"/>
+        <w:spacing w:after="0" w:line="240"/>
+        <w:ind w:left="100" w:right="100"/>
+      </w:pPr>
+      <w:r>
+        <w:rPr>
+          <w:rFonts w:ascii="Courier New" w:cs="Courier New" w:eastAsia="Courier New" w:hAnsi="Courier New"/>
+          <w:sz w:val="17"/>
+          <w:szCs w:val="17"/>
+        </w:rPr>
+        <w:t xml:space="preserve">(Directory create: '/tmp/demo_dir') printNl.</w:t>
+      </w:r>
+    </w:p>
+    <w:p>
+      <w:pPr>
+        <w:keepNext/>
+        <w:keepLines/>
+        <w:pBdr>
+          <w:left w:val="single" w:color="808080" w:sz="4"/>
+          <w:right w:val="single" w:color="808080" w:sz="4"/>
+        </w:pBdr>
+        <w:shd w:fill="F2F2F2" w:color="auto" w:val="clear"/>
+        <w:spacing w:after="0" w:line="240"/>
+        <w:ind w:left="100" w:right="100"/>
+      </w:pPr>
+      <w:r>
+        <w:rPr>
+          <w:rFonts w:ascii="Courier New" w:cs="Courier New" w:eastAsia="Courier New" w:hAnsi="Courier New"/>
+          <w:sz w:val="17"/>
+          <w:szCs w:val="17"/>
+        </w:rPr>
+        <w:t xml:space="preserve">(FileStream write: '/tmp/demo_dir/a.txt' contents: 'hello') printNl.</w:t>
+      </w:r>
+    </w:p>
+    <w:p>
+      <w:pPr>
+        <w:keepNext/>
+        <w:keepLines/>
+        <w:pBdr>
+          <w:left w:val="single" w:color="808080" w:sz="4"/>
+          <w:right w:val="single" w:color="808080" w:sz="4"/>
+        </w:pBdr>
+        <w:shd w:fill="F2F2F2" w:color="auto" w:val="clear"/>
+        <w:spacing w:after="0" w:line="240"/>
+        <w:ind w:left="100" w:right="100"/>
+      </w:pPr>
+      <w:r>
+        <w:rPr>
+          <w:rFonts w:ascii="Courier New" w:cs="Courier New" w:eastAsia="Courier New" w:hAnsi="Courier New"/>
+          <w:sz w:val="17"/>
+          <w:szCs w:val="17"/>
+        </w:rPr>
+        <w:t xml:space="preserve">(Directory entries: '/tmp/demo_dir') printNl.</w:t>
+      </w:r>
+    </w:p>
+    <w:p>
+      <w:pPr>
+        <w:keepNext/>
+        <w:keepLines/>
+        <w:pBdr>
+          <w:left w:val="single" w:color="808080" w:sz="4"/>
+          <w:right w:val="single" w:color="808080" w:sz="4"/>
+        </w:pBdr>
+        <w:shd w:fill="F2F2F2" w:color="auto" w:val="clear"/>
+        <w:spacing w:after="0" w:line="240"/>
+        <w:ind w:left="100" w:right="100"/>
+      </w:pPr>
+      <w:r>
+        <w:rPr>
+          <w:rFonts w:ascii="Courier New" w:cs="Courier New" w:eastAsia="Courier New" w:hAnsi="Courier New"/>
+          <w:sz w:val="17"/>
+          <w:szCs w:val="17"/>
+        </w:rPr>
+        <w:t xml:space="preserve">(FileStream size: '/tmp/demo_dir/a.txt') printNl.</w:t>
+      </w:r>
+    </w:p>
+    <w:p>
+      <w:pPr>
+        <w:keepNext/>
+        <w:keepLines/>
+        <w:pBdr>
+          <w:left w:val="single" w:color="808080" w:sz="4"/>
+          <w:right w:val="single" w:color="808080" w:sz="4"/>
+        </w:pBdr>
+        <w:shd w:fill="F2F2F2" w:color="auto" w:val="clear"/>
+        <w:spacing w:after="0" w:line="240"/>
+        <w:ind w:left="100" w:right="100"/>
+      </w:pPr>
+      <w:r>
+        <w:rPr>
+          <w:rFonts w:ascii="Courier New" w:cs="Courier New" w:eastAsia="Courier New" w:hAnsi="Courier New"/>
+          <w:sz w:val="17"/>
+          <w:szCs w:val="17"/>
+        </w:rPr>
+        <w:t xml:space="preserve">(FileStream delete: '/tmp/demo_dir/a.txt') printNl.</w:t>
+      </w:r>
+    </w:p>
+    <w:p>
+      <w:pPr>
+        <w:keepNext/>
+        <w:keepLines/>
+        <w:pBdr>
+          <w:left w:val="single" w:color="808080" w:sz="4"/>
+          <w:right w:val="single" w:color="808080" w:sz="4"/>
+        </w:pBdr>
+        <w:shd w:fill="F2F2F2" w:color="auto" w:val="clear"/>
+        <w:spacing w:after="0" w:line="240"/>
+        <w:ind w:left="100" w:right="100"/>
+      </w:pPr>
+      <w:r>
+        <w:rPr>
+          <w:rFonts w:ascii="Courier New" w:cs="Courier New" w:eastAsia="Courier New" w:hAnsi="Courier New"/>
+          <w:sz w:val="17"/>
+          <w:szCs w:val="17"/>
+        </w:rPr>
+        <w:t xml:space="preserve">(Directory remove: '/tmp/demo_dir') printNl.</w:t>
+      </w:r>
+    </w:p>
+    <w:p>
+      <w:pPr>
+        <w:keepNext/>
+        <w:keepLines/>
+        <w:pBdr>
+          <w:left w:val="single" w:color="808080" w:sz="4"/>
+          <w:right w:val="single" w:color="808080" w:sz="4"/>
+        </w:pBdr>
+        <w:shd w:fill="F2F2F2" w:color="auto" w:val="clear"/>
+        <w:spacing w:after="0" w:line="240"/>
+        <w:ind w:left="100" w:right="100"/>
+      </w:pPr>
+      <w:r>
+        <w:rPr>
+          <w:rFonts w:ascii="Courier New" w:cs="Courier New" w:eastAsia="Courier New" w:hAnsi="Courier New"/>
+          <w:sz w:val="17"/>
+          <w:szCs w:val="17"/>
+        </w:rPr>
+        <w:t xml:space="preserve"> </w:t>
+      </w:r>
+    </w:p>
+    <w:p>
+      <w:pPr>
+        <w:keepNext/>
+        <w:keepLines/>
+        <w:pBdr>
+          <w:left w:val="single" w:color="808080" w:sz="4"/>
+          <w:right w:val="single" w:color="808080" w:sz="4"/>
+        </w:pBdr>
+        <w:shd w:fill="F2F2F2" w:color="auto" w:val="clear"/>
+        <w:spacing w:after="0" w:line="240"/>
+        <w:ind w:left="100" w:right="100"/>
+      </w:pPr>
+      <w:r>
+        <w:rPr>
+          <w:rFonts w:ascii="Courier New" w:cs="Courier New" w:eastAsia="Courier New" w:hAnsi="Courier New"/>
+          <w:sz w:val="17"/>
+          <w:szCs w:val="17"/>
+        </w:rPr>
+        <w:t xml:space="preserve">true</w:t>
+      </w:r>
+    </w:p>
+    <w:p>
+      <w:pPr>
+        <w:keepNext/>
+        <w:keepLines/>
+        <w:pBdr>
+          <w:left w:val="single" w:color="808080" w:sz="4"/>
+          <w:right w:val="single" w:color="808080" w:sz="4"/>
+        </w:pBdr>
+        <w:shd w:fill="F2F2F2" w:color="auto" w:val="clear"/>
+        <w:spacing w:after="0" w:line="240"/>
+        <w:ind w:left="100" w:right="100"/>
+      </w:pPr>
+      <w:r>
+        <w:rPr>
+          <w:rFonts w:ascii="Courier New" w:cs="Courier New" w:eastAsia="Courier New" w:hAnsi="Courier New"/>
+          <w:sz w:val="17"/>
+          <w:szCs w:val="17"/>
+        </w:rPr>
+        <w:t xml:space="preserve">5</w:t>
+      </w:r>
+    </w:p>
+    <w:p>
+      <w:pPr>
+        <w:keepNext/>
+        <w:keepLines/>
+        <w:pBdr>
+          <w:left w:val="single" w:color="808080" w:sz="4"/>
+          <w:right w:val="single" w:color="808080" w:sz="4"/>
+        </w:pBdr>
+        <w:shd w:fill="F2F2F2" w:color="auto" w:val="clear"/>
+        <w:spacing w:after="0" w:line="240"/>
+        <w:ind w:left="100" w:right="100"/>
+      </w:pPr>
+      <w:r>
+        <w:rPr>
+          <w:rFonts w:ascii="Courier New" w:cs="Courier New" w:eastAsia="Courier New" w:hAnsi="Courier New"/>
+          <w:sz w:val="17"/>
+          <w:szCs w:val="17"/>
+        </w:rPr>
+        <w:t xml:space="preserve">('a.txt' )</w:t>
+      </w:r>
+    </w:p>
+    <w:p>
+      <w:pPr>
+        <w:keepNext/>
+        <w:keepLines/>
+        <w:pBdr>
+          <w:left w:val="single" w:color="808080" w:sz="4"/>
+          <w:right w:val="single" w:color="808080" w:sz="4"/>
+        </w:pBdr>
+        <w:shd w:fill="F2F2F2" w:color="auto" w:val="clear"/>
+        <w:spacing w:after="0" w:line="240"/>
+        <w:ind w:left="100" w:right="100"/>
+      </w:pPr>
+      <w:r>
+        <w:rPr>
+          <w:rFonts w:ascii="Courier New" w:cs="Courier New" w:eastAsia="Courier New" w:hAnsi="Courier New"/>
+          <w:sz w:val="17"/>
+          <w:szCs w:val="17"/>
+        </w:rPr>
+        <w:t xml:space="preserve">5</w:t>
+      </w:r>
+    </w:p>
+    <w:p>
+      <w:pPr>
+        <w:keepNext/>
+        <w:keepLines/>
+        <w:pBdr>
+          <w:left w:val="single" w:color="808080" w:sz="4"/>
+          <w:right w:val="single" w:color="808080" w:sz="4"/>
+        </w:pBdr>
+        <w:shd w:fill="F2F2F2" w:color="auto" w:val="clear"/>
+        <w:spacing w:after="0" w:line="240"/>
+        <w:ind w:left="100" w:right="100"/>
+      </w:pPr>
+      <w:r>
+        <w:rPr>
+          <w:rFonts w:ascii="Courier New" w:cs="Courier New" w:eastAsia="Courier New" w:hAnsi="Courier New"/>
+          <w:sz w:val="17"/>
+          <w:szCs w:val="17"/>
+        </w:rPr>
+        <w:t xml:space="preserve">true</w:t>
+      </w:r>
+    </w:p>
+    <w:p>
+      <w:pPr>
+        <w:keepNext w:val="false"/>
+        <w:keepLines/>
+        <w:pBdr>
+          <w:bottom w:val="single" w:color="808080" w:sz="4"/>
+          <w:left w:val="single" w:color="808080" w:sz="4"/>
+          <w:right w:val="single" w:color="808080" w:sz="4"/>
+        </w:pBdr>
+        <w:shd w:fill="F2F2F2" w:color="auto" w:val="clear"/>
+        <w:spacing w:after="0" w:line="240"/>
+        <w:ind w:left="100" w:right="100"/>
+      </w:pPr>
+      <w:r>
+        <w:rPr>
+          <w:rFonts w:ascii="Courier New" w:cs="Courier New" w:eastAsia="Courier New" w:hAnsi="Courier New"/>
+          <w:sz w:val="17"/>
+          <w:szCs w:val="17"/>
+        </w:rPr>
+        <w:t xml:space="preserve">true</w:t>
+      </w:r>
+    </w:p>
+    <w:p>
+      <w:pPr>
+        <w:spacing w:after="200" w:before="60"/>
+      </w:pPr>
+      <w:r>
+        <w:rPr>
+          <w:rFonts w:ascii="Arial" w:cs="Arial" w:eastAsia="Arial" w:hAnsi="Arial"/>
+          <w:b/>
+          <w:bCs/>
+          <w:sz w:val="18"/>
+          <w:szCs w:val="18"/>
+        </w:rPr>
+        <w:t xml:space="preserve">Figure 51. </w:t>
+      </w:r>
+      <w:r>
+        <w:rPr>
+          <w:rFonts w:ascii="Arial" w:cs="Arial" w:eastAsia="Arial" w:hAnsi="Arial"/>
+          <w:sz w:val="18"/>
+          <w:szCs w:val="18"/>
+        </w:rPr>
+        <w:t xml:space="preserve">Files and directories</w:t>
+      </w:r>
+    </w:p>
+    <w:p>
+      <w:pPr>
+        <w:pStyle w:val="Heading2"/>
+        <w:keepNext/>
+      </w:pPr>
+      <w:r>
+        <w:rPr>
+          <w:rFonts w:ascii="Arial" w:cs="Arial" w:eastAsia="Arial" w:hAnsi="Arial"/>
+          <w:b/>
+          <w:bCs/>
+          <w:sz w:val="24"/>
+          <w:szCs w:val="24"/>
+        </w:rPr>
+        <w:t xml:space="preserve">Running programs</w:t>
+      </w:r>
+    </w:p>
+    <w:p>
+      <w:pPr>
+        <w:spacing w:after="120" w:line="264"/>
+      </w:pPr>
+      <w:r>
+        <w:rPr>
+          <w:rFonts w:ascii="Arial" w:cs="Arial" w:eastAsia="Arial" w:hAnsi="Arial"/>
+          <w:sz w:val="20"/>
+          <w:szCs w:val="20"/>
+        </w:rPr>
+        <w:t xml:space="preserve">Smalltalk systemOutput: command runs a shell command and answers what it wrote to standard output as a String, without the final newline. Smalltalk system: command runs the command, shows its output on the Transcript and answers its exit status. lastExitCode answers the status of the latest command and systemError the text it wrote to standard error. Smalltalk getenv: and Smalltalk arguments read the environment and the command-line arguments.</w:t>
+      </w:r>
+    </w:p>
+    <w:p>
+      <w:pPr>
+        <w:keepNext/>
+        <w:keepLines/>
+        <w:pBdr>
+          <w:top w:val="single" w:color="808080" w:sz="4"/>
+          <w:left w:val="single" w:color="808080" w:sz="4"/>
+          <w:right w:val="single" w:color="808080" w:sz="4"/>
+        </w:pBdr>
+        <w:shd w:fill="F2F2F2" w:color="auto" w:val="clear"/>
+        <w:spacing w:after="0" w:line="240"/>
+        <w:ind w:left="100" w:right="100"/>
+      </w:pPr>
+      <w:r>
+        <w:rPr>
+          <w:rFonts w:ascii="Courier New" w:cs="Courier New" w:eastAsia="Courier New" w:hAnsi="Courier New"/>
+          <w:sz w:val="17"/>
+          <w:szCs w:val="17"/>
+        </w:rPr>
+        <w:t xml:space="preserve">(Smalltalk systemOutput: 'echo hi; echo there') printNl.</w:t>
+      </w:r>
+    </w:p>
+    <w:p>
+      <w:pPr>
+        <w:keepNext/>
+        <w:keepLines/>
+        <w:pBdr>
+          <w:left w:val="single" w:color="808080" w:sz="4"/>
+          <w:right w:val="single" w:color="808080" w:sz="4"/>
+        </w:pBdr>
+        <w:shd w:fill="F2F2F2" w:color="auto" w:val="clear"/>
+        <w:spacing w:after="0" w:line="240"/>
+        <w:ind w:left="100" w:right="100"/>
+      </w:pPr>
+      <w:r>
+        <w:rPr>
+          <w:rFonts w:ascii="Courier New" w:cs="Courier New" w:eastAsia="Courier New" w:hAnsi="Courier New"/>
+          <w:sz w:val="17"/>
+          <w:szCs w:val="17"/>
+        </w:rPr>
+        <w:t xml:space="preserve">Smalltalk lastExitCode printNl.</w:t>
+      </w:r>
+    </w:p>
+    <w:p>
+      <w:pPr>
+        <w:keepNext/>
+        <w:keepLines/>
+        <w:pBdr>
+          <w:left w:val="single" w:color="808080" w:sz="4"/>
+          <w:right w:val="single" w:color="808080" w:sz="4"/>
+        </w:pBdr>
+        <w:shd w:fill="F2F2F2" w:color="auto" w:val="clear"/>
+        <w:spacing w:after="0" w:line="240"/>
+        <w:ind w:left="100" w:right="100"/>
+      </w:pPr>
+      <w:r>
+        <w:rPr>
+          <w:rFonts w:ascii="Courier New" w:cs="Courier New" w:eastAsia="Courier New" w:hAnsi="Courier New"/>
+          <w:sz w:val="17"/>
+          <w:szCs w:val="17"/>
+        </w:rPr>
+        <w:t xml:space="preserve">(Smalltalk system: 'exit 3') printNl.</w:t>
+      </w:r>
+    </w:p>
+    <w:p>
+      <w:pPr>
+        <w:keepNext/>
+        <w:keepLines/>
+        <w:pBdr>
+          <w:left w:val="single" w:color="808080" w:sz="4"/>
+          <w:right w:val="single" w:color="808080" w:sz="4"/>
+        </w:pBdr>
+        <w:shd w:fill="F2F2F2" w:color="auto" w:val="clear"/>
+        <w:spacing w:after="0" w:line="240"/>
+        <w:ind w:left="100" w:right="100"/>
+      </w:pPr>
+      <w:r>
+        <w:rPr>
+          <w:rFonts w:ascii="Courier New" w:cs="Courier New" w:eastAsia="Courier New" w:hAnsi="Courier New"/>
+          <w:sz w:val="17"/>
+          <w:szCs w:val="17"/>
+        </w:rPr>
+        <w:t xml:space="preserve"> </w:t>
+      </w:r>
+    </w:p>
+    <w:p>
+      <w:pPr>
+        <w:keepNext/>
+        <w:keepLines/>
+        <w:pBdr>
+          <w:left w:val="single" w:color="808080" w:sz="4"/>
+          <w:right w:val="single" w:color="808080" w:sz="4"/>
+        </w:pBdr>
+        <w:shd w:fill="F2F2F2" w:color="auto" w:val="clear"/>
+        <w:spacing w:after="0" w:line="240"/>
+        <w:ind w:left="100" w:right="100"/>
+      </w:pPr>
+      <w:r>
+        <w:rPr>
+          <w:rFonts w:ascii="Courier New" w:cs="Courier New" w:eastAsia="Courier New" w:hAnsi="Courier New"/>
+          <w:sz w:val="17"/>
+          <w:szCs w:val="17"/>
+        </w:rPr>
+        <w:t xml:space="preserve">'hi</w:t>
+      </w:r>
+    </w:p>
+    <w:p>
+      <w:pPr>
+        <w:keepNext/>
+        <w:keepLines/>
+        <w:pBdr>
+          <w:left w:val="single" w:color="808080" w:sz="4"/>
+          <w:right w:val="single" w:color="808080" w:sz="4"/>
+        </w:pBdr>
+        <w:shd w:fill="F2F2F2" w:color="auto" w:val="clear"/>
+        <w:spacing w:after="0" w:line="240"/>
+        <w:ind w:left="100" w:right="100"/>
+      </w:pPr>
+      <w:r>
+        <w:rPr>
+          <w:rFonts w:ascii="Courier New" w:cs="Courier New" w:eastAsia="Courier New" w:hAnsi="Courier New"/>
+          <w:sz w:val="17"/>
+          <w:szCs w:val="17"/>
+        </w:rPr>
+        <w:t xml:space="preserve">there'</w:t>
+      </w:r>
+    </w:p>
+    <w:p>
+      <w:pPr>
+        <w:keepNext/>
+        <w:keepLines/>
+        <w:pBdr>
+          <w:left w:val="single" w:color="808080" w:sz="4"/>
+          <w:right w:val="single" w:color="808080" w:sz="4"/>
+        </w:pBdr>
+        <w:shd w:fill="F2F2F2" w:color="auto" w:val="clear"/>
+        <w:spacing w:after="0" w:line="240"/>
+        <w:ind w:left="100" w:right="100"/>
+      </w:pPr>
+      <w:r>
+        <w:rPr>
+          <w:rFonts w:ascii="Courier New" w:cs="Courier New" w:eastAsia="Courier New" w:hAnsi="Courier New"/>
+          <w:sz w:val="17"/>
+          <w:szCs w:val="17"/>
+        </w:rPr>
+        <w:t xml:space="preserve">0</w:t>
+      </w:r>
+    </w:p>
+    <w:p>
+      <w:pPr>
+        <w:keepNext w:val="false"/>
+        <w:keepLines/>
+        <w:pBdr>
+          <w:bottom w:val="single" w:color="808080" w:sz="4"/>
+          <w:left w:val="single" w:color="808080" w:sz="4"/>
+          <w:right w:val="single" w:color="808080" w:sz="4"/>
+        </w:pBdr>
+        <w:shd w:fill="F2F2F2" w:color="auto" w:val="clear"/>
+        <w:spacing w:after="0" w:line="240"/>
+        <w:ind w:left="100" w:right="100"/>
+      </w:pPr>
+      <w:r>
+        <w:rPr>
+          <w:rFonts w:ascii="Courier New" w:cs="Courier New" w:eastAsia="Courier New" w:hAnsi="Courier New"/>
+          <w:sz w:val="17"/>
+          <w:szCs w:val="17"/>
+        </w:rPr>
+        <w:t xml:space="preserve">3</w:t>
+      </w:r>
+    </w:p>
+    <w:p>
+      <w:pPr>
+        <w:spacing w:after="200" w:before="60"/>
+      </w:pPr>
+      <w:r>
+        <w:rPr>
+          <w:rFonts w:ascii="Arial" w:cs="Arial" w:eastAsia="Arial" w:hAnsi="Arial"/>
+          <w:b/>
+          <w:bCs/>
+          <w:sz w:val="18"/>
+          <w:szCs w:val="18"/>
+        </w:rPr>
+        <w:t xml:space="preserve">Figure 52. </w:t>
+      </w:r>
+      <w:r>
+        <w:rPr>
+          <w:rFonts w:ascii="Arial" w:cs="Arial" w:eastAsia="Arial" w:hAnsi="Arial"/>
+          <w:sz w:val="18"/>
+          <w:szCs w:val="18"/>
+        </w:rPr>
+        <w:t xml:space="preserve">Running a command</w:t>
+      </w:r>
+    </w:p>
+    <w:p>
+      <w:pPr>
+        <w:pStyle w:val="Heading2"/>
+        <w:keepNext/>
+      </w:pPr>
+      <w:r>
+        <w:rPr>
+          <w:rFonts w:ascii="Arial" w:cs="Arial" w:eastAsia="Arial" w:hAnsi="Arial"/>
+          <w:b/>
+          <w:bCs/>
+          <w:sz w:val="24"/>
+          <w:szCs w:val="24"/>
+        </w:rPr>
+        <w:t xml:space="preserve">CSV</w:t>
+      </w:r>
+    </w:p>
+    <w:p>
+      <w:pPr>
+        <w:spacing w:after="120" w:line="264"/>
+      </w:pPr>
+      <w:r>
+        <w:rPr>
+          <w:rFonts w:ascii="Arial" w:cs="Arial" w:eastAsia="Arial" w:hAnsi="Arial"/>
+          <w:sz w:val="20"/>
+          <w:szCs w:val="20"/>
+        </w:rPr>
+        <w:t xml:space="preserve">CSV parse: text answers an Array of rows, each an Array of Strings. Fields may be quoted with double quotes, a doubled quote stands for one quote, and a quoted field may contain commas and line ends. CSV parseFile: reads a file and CSV parseWithHeader: answers an Array of Dictionaries keyed by the first row. CSV format: rows answers CSV text, quoting fields where needed, and CSV write: rows to: path writes it to a file. asCsvRows and asCsv are the same operations as messages to a String and to a collection.</w:t>
+      </w:r>
+    </w:p>
+    <w:p>
+      <w:pPr>
+        <w:keepNext/>
+        <w:keepLines/>
+        <w:pBdr>
+          <w:top w:val="single" w:color="808080" w:sz="4"/>
+          <w:left w:val="single" w:color="808080" w:sz="4"/>
+          <w:right w:val="single" w:color="808080" w:sz="4"/>
+        </w:pBdr>
+        <w:shd w:fill="F2F2F2" w:color="auto" w:val="clear"/>
+        <w:spacing w:after="0" w:line="240"/>
+        <w:ind w:left="100" w:right="100"/>
+      </w:pPr>
+      <w:r>
+        <w:rPr>
+          <w:rFonts w:ascii="Courier New" w:cs="Courier New" w:eastAsia="Courier New" w:hAnsi="Courier New"/>
+          <w:sz w:val="17"/>
+          <w:szCs w:val="17"/>
+        </w:rPr>
+        <w:t xml:space="preserve">(CSV parse: 'a,b</w:t>
+      </w:r>
+    </w:p>
+    <w:p>
+      <w:pPr>
+        <w:keepNext/>
+        <w:keepLines/>
+        <w:pBdr>
+          <w:left w:val="single" w:color="808080" w:sz="4"/>
+          <w:right w:val="single" w:color="808080" w:sz="4"/>
+        </w:pBdr>
+        <w:shd w:fill="F2F2F2" w:color="auto" w:val="clear"/>
+        <w:spacing w:after="0" w:line="240"/>
+        <w:ind w:left="100" w:right="100"/>
+      </w:pPr>
+      <w:r>
+        <w:rPr>
+          <w:rFonts w:ascii="Courier New" w:cs="Courier New" w:eastAsia="Courier New" w:hAnsi="Courier New"/>
+          <w:sz w:val="17"/>
+          <w:szCs w:val="17"/>
+        </w:rPr>
+        <w:t xml:space="preserve">1,"x, y"') printNl.</w:t>
+      </w:r>
+    </w:p>
+    <w:p>
+      <w:pPr>
+        <w:keepNext/>
+        <w:keepLines/>
+        <w:pBdr>
+          <w:left w:val="single" w:color="808080" w:sz="4"/>
+          <w:right w:val="single" w:color="808080" w:sz="4"/>
+        </w:pBdr>
+        <w:shd w:fill="F2F2F2" w:color="auto" w:val="clear"/>
+        <w:spacing w:after="0" w:line="240"/>
+        <w:ind w:left="100" w:right="100"/>
+      </w:pPr>
+      <w:r>
+        <w:rPr>
+          <w:rFonts w:ascii="Courier New" w:cs="Courier New" w:eastAsia="Courier New" w:hAnsi="Courier New"/>
+          <w:sz w:val="17"/>
+          <w:szCs w:val="17"/>
+        </w:rPr>
+        <w:t xml:space="preserve">(CSV format: #(#('a' 'b c') #('x,y' 'say "hi"'))) displayString displayNl.</w:t>
+      </w:r>
+    </w:p>
+    <w:p>
+      <w:pPr>
+        <w:keepNext/>
+        <w:keepLines/>
+        <w:pBdr>
+          <w:left w:val="single" w:color="808080" w:sz="4"/>
+          <w:right w:val="single" w:color="808080" w:sz="4"/>
+        </w:pBdr>
+        <w:shd w:fill="F2F2F2" w:color="auto" w:val="clear"/>
+        <w:spacing w:after="0" w:line="240"/>
+        <w:ind w:left="100" w:right="100"/>
+      </w:pPr>
+      <w:r>
+        <w:rPr>
+          <w:rFonts w:ascii="Courier New" w:cs="Courier New" w:eastAsia="Courier New" w:hAnsi="Courier New"/>
+          <w:sz w:val="17"/>
+          <w:szCs w:val="17"/>
+        </w:rPr>
+        <w:t xml:space="preserve"> </w:t>
+      </w:r>
+    </w:p>
+    <w:p>
+      <w:pPr>
+        <w:keepNext/>
+        <w:keepLines/>
+        <w:pBdr>
+          <w:left w:val="single" w:color="808080" w:sz="4"/>
+          <w:right w:val="single" w:color="808080" w:sz="4"/>
+        </w:pBdr>
+        <w:shd w:fill="F2F2F2" w:color="auto" w:val="clear"/>
+        <w:spacing w:after="0" w:line="240"/>
+        <w:ind w:left="100" w:right="100"/>
+      </w:pPr>
+      <w:r>
+        <w:rPr>
+          <w:rFonts w:ascii="Courier New" w:cs="Courier New" w:eastAsia="Courier New" w:hAnsi="Courier New"/>
+          <w:sz w:val="17"/>
+          <w:szCs w:val="17"/>
+        </w:rPr>
+        <w:t xml:space="preserve">(('a' 'b' ) ('1' 'x, y' ) )</w:t>
+      </w:r>
+    </w:p>
+    <w:p>
+      <w:pPr>
+        <w:keepNext/>
+        <w:keepLines/>
+        <w:pBdr>
+          <w:left w:val="single" w:color="808080" w:sz="4"/>
+          <w:right w:val="single" w:color="808080" w:sz="4"/>
+        </w:pBdr>
+        <w:shd w:fill="F2F2F2" w:color="auto" w:val="clear"/>
+        <w:spacing w:after="0" w:line="240"/>
+        <w:ind w:left="100" w:right="100"/>
+      </w:pPr>
+      <w:r>
+        <w:rPr>
+          <w:rFonts w:ascii="Courier New" w:cs="Courier New" w:eastAsia="Courier New" w:hAnsi="Courier New"/>
+          <w:sz w:val="17"/>
+          <w:szCs w:val="17"/>
+        </w:rPr>
+        <w:t xml:space="preserve">a,b c</w:t>
+      </w:r>
+    </w:p>
+    <w:p>
+      <w:pPr>
+        <w:keepNext/>
+        <w:keepLines/>
+        <w:pBdr>
+          <w:left w:val="single" w:color="808080" w:sz="4"/>
+          <w:right w:val="single" w:color="808080" w:sz="4"/>
+        </w:pBdr>
+        <w:shd w:fill="F2F2F2" w:color="auto" w:val="clear"/>
+        <w:spacing w:after="0" w:line="240"/>
+        <w:ind w:left="100" w:right="100"/>
+      </w:pPr>
+      <w:r>
+        <w:rPr>
+          <w:rFonts w:ascii="Courier New" w:cs="Courier New" w:eastAsia="Courier New" w:hAnsi="Courier New"/>
+          <w:sz w:val="17"/>
+          <w:szCs w:val="17"/>
+        </w:rPr>
+        <w:t xml:space="preserve">"x,y","say ""hi"""</w:t>
+      </w:r>
+    </w:p>
+    <w:p>
+      <w:pPr>
+        <w:keepNext w:val="false"/>
+        <w:keepLines/>
+        <w:pBdr>
+          <w:bottom w:val="single" w:color="808080" w:sz="4"/>
+          <w:left w:val="single" w:color="808080" w:sz="4"/>
+          <w:right w:val="single" w:color="808080" w:sz="4"/>
+        </w:pBdr>
+        <w:shd w:fill="F2F2F2" w:color="auto" w:val="clear"/>
+        <w:spacing w:after="0" w:line="240"/>
+        <w:ind w:left="100" w:right="100"/>
+      </w:pPr>
+      <w:r>
+        <w:rPr>
+          <w:rFonts w:ascii="Courier New" w:cs="Courier New" w:eastAsia="Courier New" w:hAnsi="Courier New"/>
+          <w:sz w:val="17"/>
+          <w:szCs w:val="17"/>
+        </w:rPr>
+        <w:t xml:space="preserve"> </w:t>
+      </w:r>
+    </w:p>
+    <w:p>
+      <w:pPr>
+        <w:spacing w:after="200" w:before="60"/>
+      </w:pPr>
+      <w:r>
+        <w:rPr>
+          <w:rFonts w:ascii="Arial" w:cs="Arial" w:eastAsia="Arial" w:hAnsi="Arial"/>
+          <w:b/>
+          <w:bCs/>
+          <w:sz w:val="18"/>
+          <w:szCs w:val="18"/>
+        </w:rPr>
+        <w:t xml:space="preserve">Figure 53. </w:t>
+      </w:r>
+      <w:r>
+        <w:rPr>
+          <w:rFonts w:ascii="Arial" w:cs="Arial" w:eastAsia="Arial" w:hAnsi="Arial"/>
+          <w:sz w:val="18"/>
+          <w:szCs w:val="18"/>
+        </w:rPr>
+        <w:t xml:space="preserve">Reading and writing CSV</w:t>
       </w:r>
     </w:p>
     <w:p>
@@ -24570,7 +26293,7 @@
           <w:sz w:val="18"/>
           <w:szCs w:val="18"/>
         </w:rPr>
-        <w:t xml:space="preserve">Figure 48. </w:t>
+        <w:t xml:space="preserve">Figure 54. </w:t>
       </w:r>
       <w:r>
         <w:rPr>
@@ -25118,7 +26841,7 @@
           <w:sz w:val="18"/>
           <w:szCs w:val="18"/>
         </w:rPr>
-        <w:t xml:space="preserve">Figure 49. </w:t>
+        <w:t xml:space="preserve">Figure 55. </w:t>
       </w:r>
       <w:r>
         <w:rPr>
@@ -25424,7 +27147,7 @@
           <w:sz w:val="18"/>
           <w:szCs w:val="18"/>
         </w:rPr>
-        <w:t xml:space="preserve">Figure 50. </w:t>
+        <w:t xml:space="preserve">Figure 56. </w:t>
       </w:r>
       <w:r>
         <w:rPr>
@@ -25806,7 +27529,7 @@
           <w:sz w:val="18"/>
           <w:szCs w:val="18"/>
         </w:rPr>
-        <w:t xml:space="preserve">Figure 51. </w:t>
+        <w:t xml:space="preserve">Figure 57. </w:t>
       </w:r>
       <w:r>
         <w:rPr>
@@ -26133,7 +27856,7 @@
           <w:sz w:val="18"/>
           <w:szCs w:val="18"/>
         </w:rPr>
-        <w:t xml:space="preserve">Figure 52. </w:t>
+        <w:t xml:space="preserve">Figure 58. </w:t>
       </w:r>
       <w:r>
         <w:rPr>
@@ -26841,7 +28564,7 @@
           <w:sz w:val="18"/>
           <w:szCs w:val="18"/>
         </w:rPr>
-        <w:t xml:space="preserve">Figure 53. </w:t>
+        <w:t xml:space="preserve">Figure 59. </w:t>
       </w:r>
       <w:r>
         <w:rPr>
@@ -27459,7 +29182,7 @@
           <w:sz w:val="18"/>
           <w:szCs w:val="18"/>
         </w:rPr>
-        <w:t xml:space="preserve">Figure 54. </w:t>
+        <w:t xml:space="preserve">Figure 60. </w:t>
       </w:r>
       <w:r>
         <w:rPr>
@@ -27820,7 +29543,7 @@
           <w:sz w:val="18"/>
           <w:szCs w:val="18"/>
         </w:rPr>
-        <w:t xml:space="preserve">Figure 55. </w:t>
+        <w:t xml:space="preserve">Figure 61. </w:t>
       </w:r>
       <w:r>
         <w:rPr>
@@ -28230,7 +29953,7 @@
           <w:sz w:val="18"/>
           <w:szCs w:val="18"/>
         </w:rPr>
-        <w:t xml:space="preserve">Figure 56. </w:t>
+        <w:t xml:space="preserve">Figure 62. </w:t>
       </w:r>
       <w:r>
         <w:rPr>
@@ -28741,6 +30464,76 @@
                 <w:sz w:val="17"/>
                 <w:szCs w:val="17"/>
               </w:rPr>
+              <w:t xml:space="preserve">tried to access an empty collection</w:t>
+            </w:r>
+          </w:p>
+        </w:tc>
+        <w:tc>
+          <w:tcPr>
+            <w:tcW w:type="dxa" w:w="6038"/>
+            <w:tcBorders>
+              <w:top w:val="single" w:color="808080" w:sz="4"/>
+              <w:left w:val="single" w:color="808080" w:sz="4"/>
+              <w:bottom w:val="single" w:color="808080" w:sz="4"/>
+              <w:right w:val="single" w:color="808080" w:sz="4"/>
+            </w:tcBorders>
+            <w:tcMar>
+              <w:top w:type="dxa" w:w="50"/>
+              <w:left w:type="dxa" w:w="90"/>
+              <w:bottom w:type="dxa" w:w="50"/>
+              <w:right w:type="dxa" w:w="90"/>
+            </w:tcMar>
+          </w:tcPr>
+          <w:p>
+            <w:pPr>
+              <w:spacing w:after="0"/>
+            </w:pPr>
+            <w:r>
+              <w:rPr>
+                <w:rFonts w:ascii="Arial" w:cs="Arial" w:eastAsia="Arial" w:hAnsi="Arial"/>
+                <w:b w:val="false"/>
+                <w:bCs w:val="false"/>
+                <w:sz w:val="17"/>
+                <w:szCs w:val="17"/>
+              </w:rPr>
+              <w:t xml:space="preserve">first, last, anyOne or fold: on any other empty collection</w:t>
+            </w:r>
+          </w:p>
+        </w:tc>
+      </w:tr>
+      <w:tr>
+        <w:trPr>
+          <w:cantSplit/>
+          <w:tblHeader w:val="false"/>
+        </w:trPr>
+        <w:tc>
+          <w:tcPr>
+            <w:tcW w:type="dxa" w:w="3600"/>
+            <w:tcBorders>
+              <w:top w:val="single" w:color="808080" w:sz="4"/>
+              <w:left w:val="single" w:color="808080" w:sz="4"/>
+              <w:bottom w:val="single" w:color="808080" w:sz="4"/>
+              <w:right w:val="single" w:color="808080" w:sz="4"/>
+            </w:tcBorders>
+            <w:tcMar>
+              <w:top w:type="dxa" w:w="50"/>
+              <w:left w:type="dxa" w:w="90"/>
+              <w:bottom w:type="dxa" w:w="50"/>
+              <w:right w:type="dxa" w:w="90"/>
+            </w:tcMar>
+          </w:tcPr>
+          <w:p>
+            <w:pPr>
+              <w:spacing w:after="0"/>
+            </w:pPr>
+            <w:r>
+              <w:rPr>
+                <w:rFonts w:ascii="Arial" w:cs="Arial" w:eastAsia="Arial" w:hAnsi="Arial"/>
+                <w:b w:val="false"/>
+                <w:bCs w:val="false"/>
+                <w:sz w:val="17"/>
+                <w:szCs w:val="17"/>
+              </w:rPr>
               <w:t xml:space="preserve">This method is a subclass responsibility</w:t>
             </w:r>
           </w:p>
@@ -29001,7 +30794,7 @@
           <w:sz w:val="18"/>
           <w:szCs w:val="18"/>
         </w:rPr>
-        <w:t xml:space="preserve">Figure 57. </w:t>
+        <w:t xml:space="preserve">Figure 63. </w:t>
       </w:r>
       <w:r>
         <w:rPr>
@@ -29716,28 +31509,28 @@
           <w:sz w:val="17"/>
           <w:szCs w:val="17"/>
         </w:rPr>
-        <w:t xml:space="preserve">./smalltalk [file.st ...]</w:t>
-      </w:r>
-    </w:p>
-    <w:p>
-      <w:pPr>
-        <w:keepNext/>
-        <w:keepLines/>
-        <w:pBdr>
-          <w:left w:val="single" w:color="808080" w:sz="4"/>
-          <w:right w:val="single" w:color="808080" w:sz="4"/>
-        </w:pBdr>
-        <w:shd w:fill="F2F2F2" w:color="auto" w:val="clear"/>
-        <w:spacing w:after="0" w:line="240"/>
-        <w:ind w:left="100" w:right="100"/>
-      </w:pPr>
-      <w:r>
-        <w:rPr>
-          <w:rFonts w:ascii="Courier New" w:cs="Courier New" w:eastAsia="Courier New" w:hAnsi="Courier New"/>
-          <w:sz w:val="17"/>
-          <w:szCs w:val="17"/>
-        </w:rPr>
-        <w:t xml:space="preserve">crexx smalltalk.crexx -nocompile -args -L lib [file.st ...]</w:t>
+        <w:t xml:space="preserve">./smalltalk [-i] [file.st ...] [-- arg ...]</w:t>
+      </w:r>
+    </w:p>
+    <w:p>
+      <w:pPr>
+        <w:keepNext/>
+        <w:keepLines/>
+        <w:pBdr>
+          <w:left w:val="single" w:color="808080" w:sz="4"/>
+          <w:right w:val="single" w:color="808080" w:sz="4"/>
+        </w:pBdr>
+        <w:shd w:fill="F2F2F2" w:color="auto" w:val="clear"/>
+        <w:spacing w:after="0" w:line="240"/>
+        <w:ind w:left="100" w:right="100"/>
+      </w:pPr>
+      <w:r>
+        <w:rPr>
+          <w:rFonts w:ascii="Courier New" w:cs="Courier New" w:eastAsia="Courier New" w:hAnsi="Courier New"/>
+          <w:sz w:val="17"/>
+          <w:szCs w:val="17"/>
+        </w:rPr>
+        <w:t xml:space="preserve">crexx smalltalk.crexx -nocompile -args -L lib [-i] [file.st ...] [-- arg ...]</w:t>
       </w:r>
     </w:p>
     <w:p>
@@ -29780,6 +31573,48 @@
           <w:szCs w:val="17"/>
         </w:rPr>
         <w:t xml:space="preserve">-L dir   directory of the library files (the launcher supplies it)</w:t>
+      </w:r>
+    </w:p>
+    <w:p>
+      <w:pPr>
+        <w:keepNext/>
+        <w:keepLines/>
+        <w:pBdr>
+          <w:left w:val="single" w:color="808080" w:sz="4"/>
+          <w:right w:val="single" w:color="808080" w:sz="4"/>
+        </w:pBdr>
+        <w:shd w:fill="F2F2F2" w:color="auto" w:val="clear"/>
+        <w:spacing w:after="0" w:line="240"/>
+        <w:ind w:left="100" w:right="100"/>
+      </w:pPr>
+      <w:r>
+        <w:rPr>
+          <w:rFonts w:ascii="Courier New" w:cs="Courier New" w:eastAsia="Courier New" w:hAnsi="Courier New"/>
+          <w:sz w:val="17"/>
+          <w:szCs w:val="17"/>
+        </w:rPr>
+        <w:t xml:space="preserve">-i       run the files, then an interactive prompt</w:t>
+      </w:r>
+    </w:p>
+    <w:p>
+      <w:pPr>
+        <w:keepNext/>
+        <w:keepLines/>
+        <w:pBdr>
+          <w:left w:val="single" w:color="808080" w:sz="4"/>
+          <w:right w:val="single" w:color="808080" w:sz="4"/>
+        </w:pBdr>
+        <w:shd w:fill="F2F2F2" w:color="auto" w:val="clear"/>
+        <w:spacing w:after="0" w:line="240"/>
+        <w:ind w:left="100" w:right="100"/>
+      </w:pPr>
+      <w:r>
+        <w:rPr>
+          <w:rFonts w:ascii="Courier New" w:cs="Courier New" w:eastAsia="Courier New" w:hAnsi="Courier New"/>
+          <w:sz w:val="17"/>
+          <w:szCs w:val="17"/>
+        </w:rPr>
+        <w:t xml:space="preserve">--       the words that follow are program arguments</w:t>
       </w:r>
     </w:p>
     <w:p>
@@ -29816,7 +31651,7 @@
           <w:sz w:val="18"/>
           <w:szCs w:val="18"/>
         </w:rPr>
-        <w:t xml:space="preserve">Figure 58. </w:t>
+        <w:t xml:space="preserve">Figure 64. </w:t>
       </w:r>
       <w:r>
         <w:rPr>
@@ -30591,7 +32426,7 @@
           <w:sz w:val="18"/>
           <w:szCs w:val="18"/>
         </w:rPr>
-        <w:t xml:space="preserve">Figure 59. </w:t>
+        <w:t xml:space="preserve">Figure 65. </w:t>
       </w:r>
       <w:r>
         <w:rPr>
@@ -31749,7 +33584,7 @@
           <w:sz w:val="18"/>
           <w:szCs w:val="18"/>
         </w:rPr>
-        <w:t xml:space="preserve">Figure 60. </w:t>
+        <w:t xml:space="preserve">Figure 66. </w:t>
       </w:r>
       <w:r>
         <w:rPr>
@@ -32467,7 +34302,7 @@
           <w:sz w:val="18"/>
           <w:szCs w:val="18"/>
         </w:rPr>
-        <w:t xml:space="preserve">Figure 61. </w:t>
+        <w:t xml:space="preserve">Figure 67. </w:t>
       </w:r>
       <w:r>
         <w:rPr>

</xml_diff>

<commit_message>
Add networking: Socket, URL, HttpClient over rxsocket; manual chapter 9, test 16, README
Co-Authored-By: Claude Sonnet 5.5 <noreply@anthropic.com>
Claude-Session: https://claude.ai/code/session_013PfZHD8os4FWhvmVG9Tf7M
</commit_message>
<xml_diff>
--- a/docs/Smalltalk-CREXX-Guide.docx
+++ b/docs/Smalltalk-CREXX-Guide.docx
@@ -1621,7 +1621,7 @@
           <w:sz w:val="19"/>
           <w:szCs w:val="19"/>
         </w:rPr>
-        <w:t xml:space="preserve">Chapter 9. Exceptions	30</w:t>
+        <w:t xml:space="preserve">Chapter 9. Networking	30</w:t>
       </w:r>
     </w:p>
     <w:p>
@@ -1640,7 +1640,7 @@
           <w:sz w:val="18"/>
           <w:szCs w:val="18"/>
         </w:rPr>
-        <w:t xml:space="preserve">Handling	30</w:t>
+        <w:t xml:space="preserve">Sockets	30</w:t>
       </w:r>
     </w:p>
     <w:p>
@@ -1659,7 +1659,7 @@
           <w:sz w:val="18"/>
           <w:szCs w:val="18"/>
         </w:rPr>
-        <w:t xml:space="preserve">Messages understood by an exception	30</w:t>
+        <w:t xml:space="preserve">URLs	30</w:t>
       </w:r>
     </w:p>
     <w:p>
@@ -1678,7 +1678,26 @@
           <w:sz w:val="18"/>
           <w:szCs w:val="18"/>
         </w:rPr>
-        <w:t xml:space="preserve">Signaling	30</w:t>
+        <w:t xml:space="preserve">HTTP	30</w:t>
+      </w:r>
+    </w:p>
+    <w:p>
+      <w:pPr>
+        <w:tabs>
+          <w:tab w:val="right" w:pos="9638" w:leader="dot"/>
+        </w:tabs>
+        <w:spacing w:after="20" w:before="100"/>
+        <w:ind w:left="0"/>
+      </w:pPr>
+      <w:r>
+        <w:rPr>
+          <w:rFonts w:ascii="Arial" w:cs="Arial" w:eastAsia="Arial" w:hAnsi="Arial"/>
+          <w:b/>
+          <w:bCs/>
+          <w:sz w:val="19"/>
+          <w:szCs w:val="19"/>
+        </w:rPr>
+        <w:t xml:space="preserve">Chapter 10. Exceptions	32</w:t>
       </w:r>
     </w:p>
     <w:p>
@@ -1697,7 +1716,7 @@
           <w:sz w:val="18"/>
           <w:szCs w:val="18"/>
         </w:rPr>
-        <w:t xml:space="preserve">Cleaning up	31</w:t>
+        <w:t xml:space="preserve">Handling	32</w:t>
       </w:r>
     </w:p>
     <w:p>
@@ -1716,7 +1735,64 @@
           <w:sz w:val="18"/>
           <w:szCs w:val="18"/>
         </w:rPr>
-        <w:t xml:space="preserve">Your own exceptions	31</w:t>
+        <w:t xml:space="preserve">Messages understood by an exception	32</w:t>
+      </w:r>
+    </w:p>
+    <w:p>
+      <w:pPr>
+        <w:tabs>
+          <w:tab w:val="right" w:pos="9638" w:leader="dot"/>
+        </w:tabs>
+        <w:spacing w:after="0" w:before="0"/>
+        <w:ind w:left="360"/>
+      </w:pPr>
+      <w:r>
+        <w:rPr>
+          <w:rFonts w:ascii="Arial" w:cs="Arial" w:eastAsia="Arial" w:hAnsi="Arial"/>
+          <w:b w:val="false"/>
+          <w:bCs w:val="false"/>
+          <w:sz w:val="18"/>
+          <w:szCs w:val="18"/>
+        </w:rPr>
+        <w:t xml:space="preserve">Signaling	32</w:t>
+      </w:r>
+    </w:p>
+    <w:p>
+      <w:pPr>
+        <w:tabs>
+          <w:tab w:val="right" w:pos="9638" w:leader="dot"/>
+        </w:tabs>
+        <w:spacing w:after="0" w:before="0"/>
+        <w:ind w:left="360"/>
+      </w:pPr>
+      <w:r>
+        <w:rPr>
+          <w:rFonts w:ascii="Arial" w:cs="Arial" w:eastAsia="Arial" w:hAnsi="Arial"/>
+          <w:b w:val="false"/>
+          <w:bCs w:val="false"/>
+          <w:sz w:val="18"/>
+          <w:szCs w:val="18"/>
+        </w:rPr>
+        <w:t xml:space="preserve">Cleaning up	33</w:t>
+      </w:r>
+    </w:p>
+    <w:p>
+      <w:pPr>
+        <w:tabs>
+          <w:tab w:val="right" w:pos="9638" w:leader="dot"/>
+        </w:tabs>
+        <w:spacing w:after="0" w:before="0"/>
+        <w:ind w:left="360"/>
+      </w:pPr>
+      <w:r>
+        <w:rPr>
+          <w:rFonts w:ascii="Arial" w:cs="Arial" w:eastAsia="Arial" w:hAnsi="Arial"/>
+          <w:b w:val="false"/>
+          <w:bCs w:val="false"/>
+          <w:sz w:val="18"/>
+          <w:szCs w:val="18"/>
+        </w:rPr>
+        <w:t xml:space="preserve">Your own exceptions	33</w:t>
       </w:r>
     </w:p>
     <w:p>
@@ -1735,7 +1811,7 @@
           <w:sz w:val="19"/>
           <w:szCs w:val="19"/>
         </w:rPr>
-        <w:t xml:space="preserve">Chapter 10. Reflection and the System	32</w:t>
+        <w:t xml:space="preserve">Chapter 11. Reflection and the System	34</w:t>
       </w:r>
     </w:p>
     <w:p>
@@ -1754,7 +1830,7 @@
           <w:sz w:val="18"/>
           <w:szCs w:val="18"/>
         </w:rPr>
-        <w:t xml:space="preserve">Asking about objects	32</w:t>
+        <w:t xml:space="preserve">Asking about objects	34</w:t>
       </w:r>
     </w:p>
     <w:p>
@@ -1773,7 +1849,7 @@
           <w:sz w:val="18"/>
           <w:szCs w:val="18"/>
         </w:rPr>
-        <w:t xml:space="preserve">Asking about classes	32</w:t>
+        <w:t xml:space="preserve">Asking about classes	34</w:t>
       </w:r>
     </w:p>
     <w:p>
@@ -1792,7 +1868,7 @@
           <w:sz w:val="18"/>
           <w:szCs w:val="18"/>
         </w:rPr>
-        <w:t xml:space="preserve">The Smalltalk dictionary	32</w:t>
+        <w:t xml:space="preserve">The Smalltalk dictionary	34</w:t>
       </w:r>
     </w:p>
     <w:p>
@@ -1811,7 +1887,7 @@
           <w:sz w:val="19"/>
           <w:szCs w:val="19"/>
         </w:rPr>
-        <w:t xml:space="preserve">Chapter 11. Errors and Traces	34</w:t>
+        <w:t xml:space="preserve">Chapter 12. Errors and Traces	36</w:t>
       </w:r>
     </w:p>
     <w:p>
@@ -1830,7 +1906,7 @@
           <w:sz w:val="18"/>
           <w:szCs w:val="18"/>
         </w:rPr>
-        <w:t xml:space="preserve">Unhandled errors	34</w:t>
+        <w:t xml:space="preserve">Unhandled errors	36</w:t>
       </w:r>
     </w:p>
     <w:p>
@@ -1849,7 +1925,7 @@
           <w:sz w:val="18"/>
           <w:szCs w:val="18"/>
         </w:rPr>
-        <w:t xml:space="preserve">Common messages	34</w:t>
+        <w:t xml:space="preserve">Common messages	36</w:t>
       </w:r>
     </w:p>
     <w:p>
@@ -1868,7 +1944,7 @@
           <w:sz w:val="18"/>
           <w:szCs w:val="18"/>
         </w:rPr>
-        <w:t xml:space="preserve">Parse errors	34</w:t>
+        <w:t xml:space="preserve">Parse errors	36</w:t>
       </w:r>
     </w:p>
     <w:p>
@@ -1887,7 +1963,7 @@
           <w:sz w:val="19"/>
           <w:szCs w:val="19"/>
         </w:rPr>
-        <w:t xml:space="preserve">Chapter 12. How Smalltalk/CREXX Works	35</w:t>
+        <w:t xml:space="preserve">Chapter 13. How Smalltalk/CREXX Works	37</w:t>
       </w:r>
     </w:p>
     <w:p>
@@ -1906,7 +1982,7 @@
           <w:sz w:val="18"/>
           <w:szCs w:val="18"/>
         </w:rPr>
-        <w:t xml:space="preserve">Objects	35</w:t>
+        <w:t xml:space="preserve">Objects	37</w:t>
       </w:r>
     </w:p>
     <w:p>
@@ -1925,7 +2001,7 @@
           <w:sz w:val="18"/>
           <w:szCs w:val="18"/>
         </w:rPr>
-        <w:t xml:space="preserve">Classes and methods	35</w:t>
+        <w:t xml:space="preserve">Classes and methods	37</w:t>
       </w:r>
     </w:p>
     <w:p>
@@ -1944,7 +2020,7 @@
           <w:sz w:val="18"/>
           <w:szCs w:val="18"/>
         </w:rPr>
-        <w:t xml:space="preserve">The resolver	35</w:t>
+        <w:t xml:space="preserve">The resolver	37</w:t>
       </w:r>
     </w:p>
     <w:p>
@@ -1963,7 +2039,7 @@
           <w:sz w:val="18"/>
           <w:szCs w:val="18"/>
         </w:rPr>
-        <w:t xml:space="preserve">The evaluator	35</w:t>
+        <w:t xml:space="preserve">The evaluator	37</w:t>
       </w:r>
     </w:p>
     <w:p>
@@ -1982,7 +2058,7 @@
           <w:sz w:val="18"/>
           <w:szCs w:val="18"/>
         </w:rPr>
-        <w:t xml:space="preserve">Primitives	35</w:t>
+        <w:t xml:space="preserve">Primitives	37</w:t>
       </w:r>
     </w:p>
     <w:p>
@@ -2001,7 +2077,7 @@
           <w:sz w:val="18"/>
           <w:szCs w:val="18"/>
         </w:rPr>
-        <w:t xml:space="preserve">Adding a primitive	35</w:t>
+        <w:t xml:space="preserve">Adding a primitive	37</w:t>
       </w:r>
     </w:p>
     <w:p>
@@ -2020,7 +2096,7 @@
           <w:sz w:val="18"/>
           <w:szCs w:val="18"/>
         </w:rPr>
-        <w:t xml:space="preserve">The build	36</w:t>
+        <w:t xml:space="preserve">The build	38</w:t>
       </w:r>
     </w:p>
     <w:p>
@@ -2039,7 +2115,7 @@
           <w:sz w:val="19"/>
           <w:szCs w:val="19"/>
         </w:rPr>
-        <w:t xml:space="preserve">Chapter 13. Restrictions and Known Problems	37</w:t>
+        <w:t xml:space="preserve">Chapter 14. Restrictions and Known Problems	39</w:t>
       </w:r>
     </w:p>
     <w:p>
@@ -2058,7 +2134,7 @@
           <w:sz w:val="19"/>
           <w:szCs w:val="19"/>
         </w:rPr>
-        <w:t xml:space="preserve">Appendix A. Command Summary	38</w:t>
+        <w:t xml:space="preserve">Appendix A. Command Summary	40</w:t>
       </w:r>
     </w:p>
     <w:p>
@@ -2077,7 +2153,7 @@
           <w:sz w:val="19"/>
           <w:szCs w:val="19"/>
         </w:rPr>
-        <w:t xml:space="preserve">Appendix B. Contents of the Repository	39</w:t>
+        <w:t xml:space="preserve">Appendix B. Contents of the Repository	41</w:t>
       </w:r>
     </w:p>
     <w:p>
@@ -2096,7 +2172,7 @@
           <w:sz w:val="19"/>
           <w:szCs w:val="19"/>
         </w:rPr>
-        <w:t xml:space="preserve">Appendix C. Class Hierarchy	40</w:t>
+        <w:t xml:space="preserve">Appendix C. Class Hierarchy	42</w:t>
       </w:r>
     </w:p>
     <w:p>
@@ -2115,7 +2191,7 @@
           <w:sz w:val="19"/>
           <w:szCs w:val="19"/>
         </w:rPr>
-        <w:t xml:space="preserve">Appendix D. Sample Programs	41</w:t>
+        <w:t xml:space="preserve">Appendix D. Sample Programs	43</w:t>
       </w:r>
     </w:p>
     <w:p>
@@ -2433,7 +2509,7 @@
           <w:sz w:val="20"/>
           <w:szCs w:val="20"/>
         </w:rPr>
-        <w:t xml:space="preserve">Chapter 9, Exceptions</w:t>
+        <w:t xml:space="preserve">Chapter 9, Networking</w:t>
       </w:r>
       <w:r>
         <w:rPr>
@@ -2441,7 +2517,7 @@
           <w:sz w:val="20"/>
           <w:szCs w:val="20"/>
         </w:rPr>
-        <w:t xml:space="preserve">, describes on:do:, ensure:, signal, retry, resume and the exception classes.</w:t>
+        <w:t xml:space="preserve">, covers sockets, URLs and the HTTP client.</w:t>
       </w:r>
     </w:p>
     <w:p>
@@ -2461,7 +2537,7 @@
           <w:sz w:val="20"/>
           <w:szCs w:val="20"/>
         </w:rPr>
-        <w:t xml:space="preserve">Chapter 10, Reflection and the System</w:t>
+        <w:t xml:space="preserve">Chapter 10, Exceptions</w:t>
       </w:r>
       <w:r>
         <w:rPr>
@@ -2469,7 +2545,7 @@
           <w:sz w:val="20"/>
           <w:szCs w:val="20"/>
         </w:rPr>
-        <w:t xml:space="preserve">, covers the Smalltalk dictionary, perform: and the class protocol.</w:t>
+        <w:t xml:space="preserve">, describes on:do:, ensure:, signal, retry, resume and the exception classes.</w:t>
       </w:r>
     </w:p>
     <w:p>
@@ -2489,7 +2565,7 @@
           <w:sz w:val="20"/>
           <w:szCs w:val="20"/>
         </w:rPr>
-        <w:t xml:space="preserve">Chapter 11, Errors and Traces</w:t>
+        <w:t xml:space="preserve">Chapter 11, Reflection and the System</w:t>
       </w:r>
       <w:r>
         <w:rPr>
@@ -2497,7 +2573,7 @@
           <w:sz w:val="20"/>
           <w:szCs w:val="20"/>
         </w:rPr>
-        <w:t xml:space="preserve">, shows what the interpreter prints for an unhandled error.</w:t>
+        <w:t xml:space="preserve">, covers the Smalltalk dictionary, perform: and the class protocol.</w:t>
       </w:r>
     </w:p>
     <w:p>
@@ -2517,7 +2593,7 @@
           <w:sz w:val="20"/>
           <w:szCs w:val="20"/>
         </w:rPr>
-        <w:t xml:space="preserve">Chapter 12, How Smalltalk/CREXX Works</w:t>
+        <w:t xml:space="preserve">Chapter 12, Errors and Traces</w:t>
       </w:r>
       <w:r>
         <w:rPr>
@@ -2525,7 +2601,7 @@
           <w:sz w:val="20"/>
           <w:szCs w:val="20"/>
         </w:rPr>
-        <w:t xml:space="preserve">, describes the object table, the resolver, the evaluator and the primitives for those who wish to extend the interpreter.</w:t>
+        <w:t xml:space="preserve">, shows what the interpreter prints for an unhandled error.</w:t>
       </w:r>
     </w:p>
     <w:p>
@@ -2545,7 +2621,7 @@
           <w:sz w:val="20"/>
           <w:szCs w:val="20"/>
         </w:rPr>
-        <w:t xml:space="preserve">Chapter 13, Restrictions and Known Problems</w:t>
+        <w:t xml:space="preserve">Chapter 13, How Smalltalk/CREXX Works</w:t>
       </w:r>
       <w:r>
         <w:rPr>
@@ -2553,7 +2629,7 @@
           <w:sz w:val="20"/>
           <w:szCs w:val="20"/>
         </w:rPr>
-        <w:t xml:space="preserve">, lists what does not work yet.</w:t>
+        <w:t xml:space="preserve">, describes the object table, the resolver, the evaluator and the primitives for those who wish to extend the interpreter.</w:t>
       </w:r>
     </w:p>
     <w:p>
@@ -2573,7 +2649,7 @@
           <w:sz w:val="20"/>
           <w:szCs w:val="20"/>
         </w:rPr>
-        <w:t xml:space="preserve">Appendix A</w:t>
+        <w:t xml:space="preserve">Chapter 14, Restrictions and Known Problems</w:t>
       </w:r>
       <w:r>
         <w:rPr>
@@ -2581,149 +2657,7 @@
           <w:sz w:val="20"/>
           <w:szCs w:val="20"/>
         </w:rPr>
-        <w:t xml:space="preserve"> summarizes the command line, </w:t>
-      </w:r>
-      <w:r>
-        <w:rPr>
-          <w:rFonts w:ascii="Arial" w:cs="Arial" w:eastAsia="Arial" w:hAnsi="Arial"/>
-          <w:b/>
-          <w:bCs/>
-          <w:sz w:val="20"/>
-          <w:szCs w:val="20"/>
-        </w:rPr>
-        <w:t xml:space="preserve">Appendix B</w:t>
-      </w:r>
-      <w:r>
-        <w:rPr>
-          <w:rFonts w:ascii="Arial" w:cs="Arial" w:eastAsia="Arial" w:hAnsi="Arial"/>
-          <w:sz w:val="20"/>
-          <w:szCs w:val="20"/>
-        </w:rPr>
-        <w:t xml:space="preserve"> lists the files of the repository, </w:t>
-      </w:r>
-      <w:r>
-        <w:rPr>
-          <w:rFonts w:ascii="Arial" w:cs="Arial" w:eastAsia="Arial" w:hAnsi="Arial"/>
-          <w:b/>
-          <w:bCs/>
-          <w:sz w:val="20"/>
-          <w:szCs w:val="20"/>
-        </w:rPr>
-        <w:t xml:space="preserve">Appendix C</w:t>
-      </w:r>
-      <w:r>
-        <w:rPr>
-          <w:rFonts w:ascii="Arial" w:cs="Arial" w:eastAsia="Arial" w:hAnsi="Arial"/>
-          <w:sz w:val="20"/>
-          <w:szCs w:val="20"/>
-        </w:rPr>
-        <w:t xml:space="preserve"> shows the class hierarchy, </w:t>
-      </w:r>
-      <w:r>
-        <w:rPr>
-          <w:rFonts w:ascii="Arial" w:cs="Arial" w:eastAsia="Arial" w:hAnsi="Arial"/>
-          <w:b/>
-          <w:bCs/>
-          <w:sz w:val="20"/>
-          <w:szCs w:val="20"/>
-        </w:rPr>
-        <w:t xml:space="preserve">Appendix D</w:t>
-      </w:r>
-      <w:r>
-        <w:rPr>
-          <w:rFonts w:ascii="Arial" w:cs="Arial" w:eastAsia="Arial" w:hAnsi="Arial"/>
-          <w:sz w:val="20"/>
-          <w:szCs w:val="20"/>
-        </w:rPr>
-        <w:t xml:space="preserve"> lists the sample programs.</w:t>
-      </w:r>
-    </w:p>
-    <w:p>
-      <w:pPr>
-        <w:pStyle w:val="Heading2"/>
-        <w:keepNext/>
-      </w:pPr>
-      <w:r>
-        <w:rPr>
-          <w:rFonts w:ascii="Arial" w:cs="Arial" w:eastAsia="Arial" w:hAnsi="Arial"/>
-          <w:b/>
-          <w:bCs/>
-          <w:sz w:val="24"/>
-          <w:szCs w:val="24"/>
-        </w:rPr>
-        <w:t xml:space="preserve">Conventions</w:t>
-      </w:r>
-    </w:p>
-    <w:p>
-      <w:pPr>
-        <w:spacing w:after="120" w:line="264"/>
-      </w:pPr>
-      <w:r>
-        <w:rPr>
-          <w:rFonts w:ascii="Arial" w:cs="Arial" w:eastAsia="Arial" w:hAnsi="Arial"/>
-          <w:sz w:val="20"/>
-          <w:szCs w:val="20"/>
-        </w:rPr>
-        <w:t xml:space="preserve">Program text is shown in monospaced type. In syntax descriptions, words in italics stand for values you supply and items in square brackets [ ] are optional. Smalltalk names are case sensitive: Total and total are different variables. By convention class names begin with a capital letter and variable and message names with a lower-case letter.</w:t>
-      </w:r>
-    </w:p>
-    <w:p>
-      <w:pPr>
-        <w:spacing w:after="120" w:line="264"/>
-      </w:pPr>
-      <w:r>
-        <w:rPr>
-          <w:rFonts w:ascii="Arial" w:cs="Arial" w:eastAsia="Arial" w:hAnsi="Arial"/>
-          <w:sz w:val="20"/>
-          <w:szCs w:val="20"/>
-        </w:rPr>
-        <w:t xml:space="preserve">Examples of programs are shown in framed figures. In a figure that shows a run, the output of the interpreter follows the program text.</w:t>
-      </w:r>
-    </w:p>
-    <w:p>
-      <w:pPr>
-        <w:pStyle w:val="Heading1"/>
-        <w:pageBreakBefore/>
-        <w:pBdr>
-          <w:bottom w:val="single" w:color="000000" w:sz="12" w:space="4"/>
-        </w:pBdr>
-        <w:spacing w:after="240" w:before="0"/>
-      </w:pPr>
-      <w:r>
-        <w:rPr>
-          <w:rFonts w:ascii="Arial" w:cs="Arial" w:eastAsia="Arial" w:hAnsi="Arial"/>
-          <w:b/>
-          <w:bCs/>
-          <w:sz w:val="32"/>
-          <w:szCs w:val="32"/>
-        </w:rPr>
-        <w:t xml:space="preserve">Chapter 1. Introduction</w:t>
-      </w:r>
-    </w:p>
-    <w:p>
-      <w:pPr>
-        <w:spacing w:after="120" w:line="264"/>
-      </w:pPr>
-      <w:r>
-        <w:rPr>
-          <w:rFonts w:ascii="Arial" w:cs="Arial" w:eastAsia="Arial" w:hAnsi="Arial"/>
-          <w:sz w:val="20"/>
-          <w:szCs w:val="20"/>
-        </w:rPr>
-        <w:t xml:space="preserve">Smalltalk/CREXX is a Smalltalk-80 interpreter written in CREXX, the open-source REXX implementation. It runs programs written in the bracket syntax of GNU Smalltalk: classes are declared with Object subclass: Foo [ ... ], methods are written inside the class body, and statements at the top level are run one after the other. The interpreter is a single CREXX source file, smalltalk.crexx, written in CREXX Level B, the statically typed level of the language, and a class library written in Smalltalk itself.</w:t>
-      </w:r>
-    </w:p>
-    <w:p>
-      <w:pPr>
-        <w:spacing w:after="120" w:line="264"/>
-      </w:pPr>
-      <w:r>
-        <w:rPr>
-          <w:rFonts w:ascii="Arial" w:cs="Arial" w:eastAsia="Arial" w:hAnsi="Arial"/>
-          <w:sz w:val="20"/>
-          <w:szCs w:val="20"/>
-        </w:rPr>
-        <w:t xml:space="preserve">Smalltalk/CREXX gives its users:</w:t>
+        <w:t xml:space="preserve">, lists what does not work yet.</w:t>
       </w:r>
     </w:p>
     <w:p>
@@ -2743,7 +2677,7 @@
           <w:sz w:val="20"/>
           <w:szCs w:val="20"/>
         </w:rPr>
-        <w:t xml:space="preserve">A pure object model.</w:t>
+        <w:t xml:space="preserve">Appendix A</w:t>
       </w:r>
       <w:r>
         <w:rPr>
@@ -2751,7 +2685,149 @@
           <w:sz w:val="20"/>
           <w:szCs w:val="20"/>
         </w:rPr>
-        <w:t xml:space="preserve"> Everything is an object: integers, characters, classes and blocks. All computation is by sending messages, and the only control structures are messages to booleans, blocks and numbers.</w:t>
+        <w:t xml:space="preserve"> summarizes the command line, </w:t>
+      </w:r>
+      <w:r>
+        <w:rPr>
+          <w:rFonts w:ascii="Arial" w:cs="Arial" w:eastAsia="Arial" w:hAnsi="Arial"/>
+          <w:b/>
+          <w:bCs/>
+          <w:sz w:val="20"/>
+          <w:szCs w:val="20"/>
+        </w:rPr>
+        <w:t xml:space="preserve">Appendix B</w:t>
+      </w:r>
+      <w:r>
+        <w:rPr>
+          <w:rFonts w:ascii="Arial" w:cs="Arial" w:eastAsia="Arial" w:hAnsi="Arial"/>
+          <w:sz w:val="20"/>
+          <w:szCs w:val="20"/>
+        </w:rPr>
+        <w:t xml:space="preserve"> lists the files of the repository, </w:t>
+      </w:r>
+      <w:r>
+        <w:rPr>
+          <w:rFonts w:ascii="Arial" w:cs="Arial" w:eastAsia="Arial" w:hAnsi="Arial"/>
+          <w:b/>
+          <w:bCs/>
+          <w:sz w:val="20"/>
+          <w:szCs w:val="20"/>
+        </w:rPr>
+        <w:t xml:space="preserve">Appendix C</w:t>
+      </w:r>
+      <w:r>
+        <w:rPr>
+          <w:rFonts w:ascii="Arial" w:cs="Arial" w:eastAsia="Arial" w:hAnsi="Arial"/>
+          <w:sz w:val="20"/>
+          <w:szCs w:val="20"/>
+        </w:rPr>
+        <w:t xml:space="preserve"> shows the class hierarchy, </w:t>
+      </w:r>
+      <w:r>
+        <w:rPr>
+          <w:rFonts w:ascii="Arial" w:cs="Arial" w:eastAsia="Arial" w:hAnsi="Arial"/>
+          <w:b/>
+          <w:bCs/>
+          <w:sz w:val="20"/>
+          <w:szCs w:val="20"/>
+        </w:rPr>
+        <w:t xml:space="preserve">Appendix D</w:t>
+      </w:r>
+      <w:r>
+        <w:rPr>
+          <w:rFonts w:ascii="Arial" w:cs="Arial" w:eastAsia="Arial" w:hAnsi="Arial"/>
+          <w:sz w:val="20"/>
+          <w:szCs w:val="20"/>
+        </w:rPr>
+        <w:t xml:space="preserve"> lists the sample programs.</w:t>
+      </w:r>
+    </w:p>
+    <w:p>
+      <w:pPr>
+        <w:pStyle w:val="Heading2"/>
+        <w:keepNext/>
+      </w:pPr>
+      <w:r>
+        <w:rPr>
+          <w:rFonts w:ascii="Arial" w:cs="Arial" w:eastAsia="Arial" w:hAnsi="Arial"/>
+          <w:b/>
+          <w:bCs/>
+          <w:sz w:val="24"/>
+          <w:szCs w:val="24"/>
+        </w:rPr>
+        <w:t xml:space="preserve">Conventions</w:t>
+      </w:r>
+    </w:p>
+    <w:p>
+      <w:pPr>
+        <w:spacing w:after="120" w:line="264"/>
+      </w:pPr>
+      <w:r>
+        <w:rPr>
+          <w:rFonts w:ascii="Arial" w:cs="Arial" w:eastAsia="Arial" w:hAnsi="Arial"/>
+          <w:sz w:val="20"/>
+          <w:szCs w:val="20"/>
+        </w:rPr>
+        <w:t xml:space="preserve">Program text is shown in monospaced type. In syntax descriptions, words in italics stand for values you supply and items in square brackets [ ] are optional. Smalltalk names are case sensitive: Total and total are different variables. By convention class names begin with a capital letter and variable and message names with a lower-case letter.</w:t>
+      </w:r>
+    </w:p>
+    <w:p>
+      <w:pPr>
+        <w:spacing w:after="120" w:line="264"/>
+      </w:pPr>
+      <w:r>
+        <w:rPr>
+          <w:rFonts w:ascii="Arial" w:cs="Arial" w:eastAsia="Arial" w:hAnsi="Arial"/>
+          <w:sz w:val="20"/>
+          <w:szCs w:val="20"/>
+        </w:rPr>
+        <w:t xml:space="preserve">Examples of programs are shown in framed figures. In a figure that shows a run, the output of the interpreter follows the program text.</w:t>
+      </w:r>
+    </w:p>
+    <w:p>
+      <w:pPr>
+        <w:pStyle w:val="Heading1"/>
+        <w:pageBreakBefore/>
+        <w:pBdr>
+          <w:bottom w:val="single" w:color="000000" w:sz="12" w:space="4"/>
+        </w:pBdr>
+        <w:spacing w:after="240" w:before="0"/>
+      </w:pPr>
+      <w:r>
+        <w:rPr>
+          <w:rFonts w:ascii="Arial" w:cs="Arial" w:eastAsia="Arial" w:hAnsi="Arial"/>
+          <w:b/>
+          <w:bCs/>
+          <w:sz w:val="32"/>
+          <w:szCs w:val="32"/>
+        </w:rPr>
+        <w:t xml:space="preserve">Chapter 1. Introduction</w:t>
+      </w:r>
+    </w:p>
+    <w:p>
+      <w:pPr>
+        <w:spacing w:after="120" w:line="264"/>
+      </w:pPr>
+      <w:r>
+        <w:rPr>
+          <w:rFonts w:ascii="Arial" w:cs="Arial" w:eastAsia="Arial" w:hAnsi="Arial"/>
+          <w:sz w:val="20"/>
+          <w:szCs w:val="20"/>
+        </w:rPr>
+        <w:t xml:space="preserve">Smalltalk/CREXX is a Smalltalk-80 interpreter written in CREXX, the open-source REXX implementation. It runs programs written in the bracket syntax of GNU Smalltalk: classes are declared with Object subclass: Foo [ ... ], methods are written inside the class body, and statements at the top level are run one after the other. The interpreter is a single CREXX source file, smalltalk.crexx, written in CREXX Level B, the statically typed level of the language, and a class library written in Smalltalk itself.</w:t>
+      </w:r>
+    </w:p>
+    <w:p>
+      <w:pPr>
+        <w:spacing w:after="120" w:line="264"/>
+      </w:pPr>
+      <w:r>
+        <w:rPr>
+          <w:rFonts w:ascii="Arial" w:cs="Arial" w:eastAsia="Arial" w:hAnsi="Arial"/>
+          <w:sz w:val="20"/>
+          <w:szCs w:val="20"/>
+        </w:rPr>
+        <w:t xml:space="preserve">Smalltalk/CREXX gives its users:</w:t>
       </w:r>
     </w:p>
     <w:p>
@@ -2771,7 +2847,7 @@
           <w:sz w:val="20"/>
           <w:szCs w:val="20"/>
         </w:rPr>
-        <w:t xml:space="preserve">Classes and metaclasses.</w:t>
+        <w:t xml:space="preserve">A pure object model.</w:t>
       </w:r>
       <w:r>
         <w:rPr>
@@ -2779,7 +2855,7 @@
           <w:sz w:val="20"/>
           <w:szCs w:val="20"/>
         </w:rPr>
-        <w:t xml:space="preserve"> Every class is an instance of its metaclass; class-side methods, class variables and class-side instance variables are all supported.</w:t>
+        <w:t xml:space="preserve"> Everything is an object: integers, characters, classes and blocks. All computation is by sending messages, and the only control structures are messages to booleans, blocks and numbers.</w:t>
       </w:r>
     </w:p>
     <w:p>
@@ -2799,7 +2875,7 @@
           <w:sz w:val="20"/>
           <w:szCs w:val="20"/>
         </w:rPr>
-        <w:t xml:space="preserve">Blocks.</w:t>
+        <w:t xml:space="preserve">Classes and metaclasses.</w:t>
       </w:r>
       <w:r>
         <w:rPr>
@@ -2807,7 +2883,7 @@
           <w:sz w:val="20"/>
           <w:szCs w:val="20"/>
         </w:rPr>
-        <w:t xml:space="preserve"> Blocks are closures. They may be stored, passed, and returned from methods, and a ^ inside a block returns from the method that defined it, even through several levels of calls.</w:t>
+        <w:t xml:space="preserve"> Every class is an instance of its metaclass; class-side methods, class variables and class-side instance variables are all supported.</w:t>
       </w:r>
     </w:p>
     <w:p>
@@ -2827,7 +2903,7 @@
           <w:sz w:val="20"/>
           <w:szCs w:val="20"/>
         </w:rPr>
-        <w:t xml:space="preserve">Numbers without limits.</w:t>
+        <w:t xml:space="preserve">Blocks.</w:t>
       </w:r>
       <w:r>
         <w:rPr>
@@ -2835,7 +2911,7 @@
           <w:sz w:val="20"/>
           <w:szCs w:val="20"/>
         </w:rPr>
-        <w:t xml:space="preserve"> Integers grow to any size, division of integers gives exact fractions, and floating-point numbers are available for the rest.</w:t>
+        <w:t xml:space="preserve"> Blocks are closures. They may be stored, passed, and returned from methods, and a ^ inside a block returns from the method that defined it, even through several levels of calls.</w:t>
       </w:r>
     </w:p>
     <w:p>
@@ -2855,7 +2931,7 @@
           <w:sz w:val="20"/>
           <w:szCs w:val="20"/>
         </w:rPr>
-        <w:t xml:space="preserve">A class library.</w:t>
+        <w:t xml:space="preserve">Numbers without limits.</w:t>
       </w:r>
       <w:r>
         <w:rPr>
@@ -2863,7 +2939,7 @@
           <w:sz w:val="20"/>
           <w:szCs w:val="20"/>
         </w:rPr>
-        <w:t xml:space="preserve"> Collections, strings, symbols, streams and exceptions are provided by library classes written in Smalltalk, loaded when the interpreter starts.</w:t>
+        <w:t xml:space="preserve"> Integers grow to any size, division of integers gives exact fractions, and floating-point numbers are available for the rest.</w:t>
       </w:r>
     </w:p>
     <w:p>
@@ -2883,6 +2959,34 @@
           <w:sz w:val="20"/>
           <w:szCs w:val="20"/>
         </w:rPr>
+        <w:t xml:space="preserve">A class library.</w:t>
+      </w:r>
+      <w:r>
+        <w:rPr>
+          <w:rFonts w:ascii="Arial" w:cs="Arial" w:eastAsia="Arial" w:hAnsi="Arial"/>
+          <w:sz w:val="20"/>
+          <w:szCs w:val="20"/>
+        </w:rPr>
+        <w:t xml:space="preserve"> Collections, strings, symbols, streams and exceptions are provided by library classes written in Smalltalk, loaded when the interpreter starts.</w:t>
+      </w:r>
+    </w:p>
+    <w:p>
+      <w:pPr>
+        <w:pStyle w:val="ListParagraph"/>
+        <w:numPr>
+          <w:ilvl w:val="0"/>
+          <w:numId w:val="2"/>
+        </w:numPr>
+        <w:spacing w:after="80"/>
+      </w:pPr>
+      <w:r>
+        <w:rPr>
+          <w:rFonts w:ascii="Arial" w:cs="Arial" w:eastAsia="Arial" w:hAnsi="Arial"/>
+          <w:b/>
+          <w:bCs/>
+          <w:sz w:val="20"/>
+          <w:szCs w:val="20"/>
+        </w:rPr>
         <w:t xml:space="preserve">Exceptions.</w:t>
       </w:r>
       <w:r>
@@ -2933,7 +3037,7 @@
           <w:sz w:val="20"/>
           <w:szCs w:val="20"/>
         </w:rPr>
-        <w:t xml:space="preserve">Objects are entries in a table of parallel arrays. SmallIntegers are not objects in the table: they are encoded in the reference itself. Common operations on numbers, strings, arrays and dictionaries are implemented as primitives in CREXX; the class library calls them through the pragma &lt;primitive: name&gt; and falls back to Smalltalk code when a primitive fails. Chapter 12 describes the design.</w:t>
+        <w:t xml:space="preserve">Objects are entries in a table of parallel arrays. SmallIntegers are not objects in the table: they are encoded in the reference itself. Common operations on numbers, strings, arrays and dictionaries are implemented as primitives in CREXX; the class library calls them through the pragma &lt;primitive: name&gt; and falls back to Smalltalk code when a primitive fails. Chapter 13 describes the design.</w:t>
       </w:r>
     </w:p>
     <w:p>
@@ -5091,7 +5195,7 @@
           <w:sz w:val="20"/>
           <w:szCs w:val="20"/>
         </w:rPr>
-        <w:t xml:space="preserve">When it starts, the interpreter creates the kernel classes, then reads the library files lib/kernel.st, lib/numbers.st, lib/collections.st, lib/streams.st, lib/exceptions.st, lib/extras.st, lib/structures.st, lib/regex.st and lib/system.st, and only then reads your program. The library directory is found by the launcher; with the driver you pass it as -L directory.</w:t>
+        <w:t xml:space="preserve">When it starts, the interpreter creates the kernel classes, then reads the library files lib/kernel.st, lib/numbers.st, lib/collections.st, lib/streams.st, lib/exceptions.st, lib/extras.st, lib/structures.st, lib/regex.st, lib/system.st and lib/net.st, and only then reads your program. The library directory is found by the launcher; with the driver you pass it as -L directory.</w:t>
       </w:r>
     </w:p>
     <w:p>
@@ -9189,7 +9293,7 @@
           <w:sz w:val="20"/>
           <w:szCs w:val="20"/>
         </w:rPr>
-        <w:t xml:space="preserve">A program is a sequence of class definitions and statements. Variables declared at the top level with | a b | live until the end of the file. A statement that fails with an error prints a trace (Chapter 11) and the program continues with the next statement. The construct Eval [ statements ] groups statements; it is accepted for compatibility with GNU Smalltalk.</w:t>
+        <w:t xml:space="preserve">A program is a sequence of class definitions and statements. Variables declared at the top level with | a b | live until the end of the file. A statement that fails with an error prints a trace (Chapter 12) and the program continues with the next statement. The construct Eval [ statements ] groups statements; it is accepted for compatibility with GNU Smalltalk.</w:t>
       </w:r>
     </w:p>
     <w:p>
@@ -16737,7 +16841,7 @@
           <w:sz w:val="20"/>
           <w:szCs w:val="20"/>
         </w:rPr>
-        <w:t xml:space="preserve">Indexes start at 1. An index outside the collection is an error of class IndexOutOfRange (Chapter 9). OrderedCollection grows as needed and removes from either end in constant time; inserting or removing in the middle moves the elements after it.</w:t>
+        <w:t xml:space="preserve">Indexes start at 1. An index outside the collection is an error of class IndexOutOfRange (Chapter 10). OrderedCollection grows as needed and removes from either end in constant time; inserting or removing in the middle moves the elements after it.</w:t>
       </w:r>
     </w:p>
     <w:p>
@@ -25995,7 +26099,20 @@
           <w:sz w:val="32"/>
           <w:szCs w:val="32"/>
         </w:rPr>
-        <w:t xml:space="preserve">Chapter 9. Exceptions</w:t>
+        <w:t xml:space="preserve">Chapter 9. Networking</w:t>
+      </w:r>
+    </w:p>
+    <w:p>
+      <w:pPr>
+        <w:spacing w:after="120" w:line="264"/>
+      </w:pPr>
+      <w:r>
+        <w:rPr>
+          <w:rFonts w:ascii="Arial" w:cs="Arial" w:eastAsia="Arial" w:hAnsi="Arial"/>
+          <w:sz w:val="20"/>
+          <w:szCs w:val="20"/>
+        </w:rPr>
+        <w:t xml:space="preserve">Smalltalk/CREXX reaches the network through the rxsocket library of CREXX. The class Socket is a TCP socket, URL takes web addresses apart and HttpClient fetches pages. All of it is written for one process: a call waits until the network answers or the time-out (ten seconds for a Socket, fifteen for HttpClient) has passed.</w:t>
       </w:r>
     </w:p>
     <w:p>
@@ -26011,7 +26128,7 @@
           <w:sz w:val="24"/>
           <w:szCs w:val="24"/>
         </w:rPr>
-        <w:t xml:space="preserve">Handling</w:t>
+        <w:t xml:space="preserve">Sockets</w:t>
       </w:r>
     </w:p>
     <w:p>
@@ -26024,7 +26141,20 @@
           <w:sz w:val="20"/>
           <w:szCs w:val="20"/>
         </w:rPr>
-        <w:t xml:space="preserve">aBlock on: ExceptionClass do: [:e | ... ] evaluates the block. If an exception of that class (or a subclass) is signaled while it runs, the handler block is evaluated with the exception as its argument. The value of the handler block becomes the value of the on:do: expression. A handler for several classes uses a set: on: ZeroDivide, MessageNotUnderstood do: [...].</w:t>
+        <w:t xml:space="preserve">Socket connectTo: host port: n opens a connection and Socket secureConnectTo: host port: n opens a connection with TLS. Socket listenOn: n makes a server socket on the local host (127.0.0.1); accept waits for a client and answers a new Socket for it. send: writes a String and sendLine: writes it with a line end (carriage return and line feed). receive: n answers up to n characters, receiveLine answers the next line without its line end (nil at the end of the stream), receiveExactly: n waits for n characters and receiveAll reads until the other side closes. All of these first use characters already received. close ends the connection. timeout: sets the time-out in milliseconds; peer, localAddress, status and lastError describe the connection. A failure signals an Error whose text names the operation and the reason.</w:t>
+      </w:r>
+    </w:p>
+    <w:p>
+      <w:pPr>
+        <w:spacing w:after="120" w:line="264"/>
+      </w:pPr>
+      <w:r>
+        <w:rPr>
+          <w:rFonts w:ascii="Arial" w:cs="Arial" w:eastAsia="Arial" w:hAnsi="Arial"/>
+          <w:sz w:val="20"/>
+          <w:szCs w:val="20"/>
+        </w:rPr>
+        <w:t xml:space="preserve">A connection to the same machine completes as soon as the server is listening, so one program can play both roles: connect first, then accept.</w:t>
       </w:r>
     </w:p>
     <w:p>
@@ -26046,133 +26176,175 @@
           <w:sz w:val="17"/>
           <w:szCs w:val="17"/>
         </w:rPr>
-        <w:t xml:space="preserve">| r |</w:t>
-      </w:r>
-    </w:p>
-    <w:p>
-      <w:pPr>
-        <w:keepNext/>
-        <w:keepLines/>
-        <w:pBdr>
-          <w:left w:val="single" w:color="808080" w:sz="4"/>
-          <w:right w:val="single" w:color="808080" w:sz="4"/>
-        </w:pBdr>
-        <w:shd w:fill="F2F2F2" w:color="auto" w:val="clear"/>
-        <w:spacing w:after="0" w:line="240"/>
-        <w:ind w:left="100" w:right="100"/>
-      </w:pPr>
-      <w:r>
-        <w:rPr>
-          <w:rFonts w:ascii="Courier New" w:cs="Courier New" w:eastAsia="Courier New" w:hAnsi="Courier New"/>
-          <w:sz w:val="17"/>
-          <w:szCs w:val="17"/>
-        </w:rPr>
-        <w:t xml:space="preserve">r := [10 / 0] on: ZeroDivide do: [:e | e messageText displayNl. -1].</w:t>
-      </w:r>
-    </w:p>
-    <w:p>
-      <w:pPr>
-        <w:keepNext/>
-        <w:keepLines/>
-        <w:pBdr>
-          <w:left w:val="single" w:color="808080" w:sz="4"/>
-          <w:right w:val="single" w:color="808080" w:sz="4"/>
-        </w:pBdr>
-        <w:shd w:fill="F2F2F2" w:color="auto" w:val="clear"/>
-        <w:spacing w:after="0" w:line="240"/>
-        <w:ind w:left="100" w:right="100"/>
-      </w:pPr>
-      <w:r>
-        <w:rPr>
-          <w:rFonts w:ascii="Courier New" w:cs="Courier New" w:eastAsia="Courier New" w:hAnsi="Courier New"/>
-          <w:sz w:val="17"/>
-          <w:szCs w:val="17"/>
-        </w:rPr>
-        <w:t xml:space="preserve">r printNl.</w:t>
-      </w:r>
-    </w:p>
-    <w:p>
-      <w:pPr>
-        <w:keepNext/>
-        <w:keepLines/>
-        <w:pBdr>
-          <w:left w:val="single" w:color="808080" w:sz="4"/>
-          <w:right w:val="single" w:color="808080" w:sz="4"/>
-        </w:pBdr>
-        <w:shd w:fill="F2F2F2" w:color="auto" w:val="clear"/>
-        <w:spacing w:after="0" w:line="240"/>
-        <w:ind w:left="100" w:right="100"/>
-      </w:pPr>
-      <w:r>
-        <w:rPr>
-          <w:rFonts w:ascii="Courier New" w:cs="Courier New" w:eastAsia="Courier New" w:hAnsi="Courier New"/>
-          <w:sz w:val="17"/>
-          <w:szCs w:val="17"/>
-        </w:rPr>
-        <w:t xml:space="preserve">r := [nil foo] on: MessageNotUnderstood do: [:e | e return: 3].</w:t>
-      </w:r>
-    </w:p>
-    <w:p>
-      <w:pPr>
-        <w:keepNext/>
-        <w:keepLines/>
-        <w:pBdr>
-          <w:left w:val="single" w:color="808080" w:sz="4"/>
-          <w:right w:val="single" w:color="808080" w:sz="4"/>
-        </w:pBdr>
-        <w:shd w:fill="F2F2F2" w:color="auto" w:val="clear"/>
-        <w:spacing w:after="0" w:line="240"/>
-        <w:ind w:left="100" w:right="100"/>
-      </w:pPr>
-      <w:r>
-        <w:rPr>
-          <w:rFonts w:ascii="Courier New" w:cs="Courier New" w:eastAsia="Courier New" w:hAnsi="Courier New"/>
-          <w:sz w:val="17"/>
-          <w:szCs w:val="17"/>
-        </w:rPr>
-        <w:t xml:space="preserve">r printNl.</w:t>
-      </w:r>
-    </w:p>
-    <w:p>
-      <w:pPr>
-        <w:keepNext/>
-        <w:keepLines/>
-        <w:pBdr>
-          <w:left w:val="single" w:color="808080" w:sz="4"/>
-          <w:right w:val="single" w:color="808080" w:sz="4"/>
-        </w:pBdr>
-        <w:shd w:fill="F2F2F2" w:color="auto" w:val="clear"/>
-        <w:spacing w:after="0" w:line="240"/>
-        <w:ind w:left="100" w:right="100"/>
-      </w:pPr>
-      <w:r>
-        <w:rPr>
-          <w:rFonts w:ascii="Courier New" w:cs="Courier New" w:eastAsia="Courier New" w:hAnsi="Courier New"/>
-          <w:sz w:val="17"/>
-          <w:szCs w:val="17"/>
-        </w:rPr>
-        <w:t xml:space="preserve">r := [#(1 2) at: 5] on: Error do: [:e | e messageText].</w:t>
-      </w:r>
-    </w:p>
-    <w:p>
-      <w:pPr>
-        <w:keepNext/>
-        <w:keepLines/>
-        <w:pBdr>
-          <w:left w:val="single" w:color="808080" w:sz="4"/>
-          <w:right w:val="single" w:color="808080" w:sz="4"/>
-        </w:pBdr>
-        <w:shd w:fill="F2F2F2" w:color="auto" w:val="clear"/>
-        <w:spacing w:after="0" w:line="240"/>
-        <w:ind w:left="100" w:right="100"/>
-      </w:pPr>
-      <w:r>
-        <w:rPr>
-          <w:rFonts w:ascii="Courier New" w:cs="Courier New" w:eastAsia="Courier New" w:hAnsi="Courier New"/>
-          <w:sz w:val="17"/>
-          <w:szCs w:val="17"/>
-        </w:rPr>
-        <w:t xml:space="preserve">r displayNl.</w:t>
+        <w:t xml:space="preserve">| srv cli acc |</w:t>
+      </w:r>
+    </w:p>
+    <w:p>
+      <w:pPr>
+        <w:keepNext/>
+        <w:keepLines/>
+        <w:pBdr>
+          <w:left w:val="single" w:color="808080" w:sz="4"/>
+          <w:right w:val="single" w:color="808080" w:sz="4"/>
+        </w:pBdr>
+        <w:shd w:fill="F2F2F2" w:color="auto" w:val="clear"/>
+        <w:spacing w:after="0" w:line="240"/>
+        <w:ind w:left="100" w:right="100"/>
+      </w:pPr>
+      <w:r>
+        <w:rPr>
+          <w:rFonts w:ascii="Courier New" w:cs="Courier New" w:eastAsia="Courier New" w:hAnsi="Courier New"/>
+          <w:sz w:val="17"/>
+          <w:szCs w:val="17"/>
+        </w:rPr>
+        <w:t xml:space="preserve">srv := Socket listenOn: 19878.</w:t>
+      </w:r>
+    </w:p>
+    <w:p>
+      <w:pPr>
+        <w:keepNext/>
+        <w:keepLines/>
+        <w:pBdr>
+          <w:left w:val="single" w:color="808080" w:sz="4"/>
+          <w:right w:val="single" w:color="808080" w:sz="4"/>
+        </w:pBdr>
+        <w:shd w:fill="F2F2F2" w:color="auto" w:val="clear"/>
+        <w:spacing w:after="0" w:line="240"/>
+        <w:ind w:left="100" w:right="100"/>
+      </w:pPr>
+      <w:r>
+        <w:rPr>
+          <w:rFonts w:ascii="Courier New" w:cs="Courier New" w:eastAsia="Courier New" w:hAnsi="Courier New"/>
+          <w:sz w:val="17"/>
+          <w:szCs w:val="17"/>
+        </w:rPr>
+        <w:t xml:space="preserve">cli := Socket connectTo: '127.0.0.1' port: 19878.</w:t>
+      </w:r>
+    </w:p>
+    <w:p>
+      <w:pPr>
+        <w:keepNext/>
+        <w:keepLines/>
+        <w:pBdr>
+          <w:left w:val="single" w:color="808080" w:sz="4"/>
+          <w:right w:val="single" w:color="808080" w:sz="4"/>
+        </w:pBdr>
+        <w:shd w:fill="F2F2F2" w:color="auto" w:val="clear"/>
+        <w:spacing w:after="0" w:line="240"/>
+        <w:ind w:left="100" w:right="100"/>
+      </w:pPr>
+      <w:r>
+        <w:rPr>
+          <w:rFonts w:ascii="Courier New" w:cs="Courier New" w:eastAsia="Courier New" w:hAnsi="Courier New"/>
+          <w:sz w:val="17"/>
+          <w:szCs w:val="17"/>
+        </w:rPr>
+        <w:t xml:space="preserve">acc := srv accept.</w:t>
+      </w:r>
+    </w:p>
+    <w:p>
+      <w:pPr>
+        <w:keepNext/>
+        <w:keepLines/>
+        <w:pBdr>
+          <w:left w:val="single" w:color="808080" w:sz="4"/>
+          <w:right w:val="single" w:color="808080" w:sz="4"/>
+        </w:pBdr>
+        <w:shd w:fill="F2F2F2" w:color="auto" w:val="clear"/>
+        <w:spacing w:after="0" w:line="240"/>
+        <w:ind w:left="100" w:right="100"/>
+      </w:pPr>
+      <w:r>
+        <w:rPr>
+          <w:rFonts w:ascii="Courier New" w:cs="Courier New" w:eastAsia="Courier New" w:hAnsi="Courier New"/>
+          <w:sz w:val="17"/>
+          <w:szCs w:val="17"/>
+        </w:rPr>
+        <w:t xml:space="preserve">cli sendLine: 'ping'.</w:t>
+      </w:r>
+    </w:p>
+    <w:p>
+      <w:pPr>
+        <w:keepNext/>
+        <w:keepLines/>
+        <w:pBdr>
+          <w:left w:val="single" w:color="808080" w:sz="4"/>
+          <w:right w:val="single" w:color="808080" w:sz="4"/>
+        </w:pBdr>
+        <w:shd w:fill="F2F2F2" w:color="auto" w:val="clear"/>
+        <w:spacing w:after="0" w:line="240"/>
+        <w:ind w:left="100" w:right="100"/>
+      </w:pPr>
+      <w:r>
+        <w:rPr>
+          <w:rFonts w:ascii="Courier New" w:cs="Courier New" w:eastAsia="Courier New" w:hAnsi="Courier New"/>
+          <w:sz w:val="17"/>
+          <w:szCs w:val="17"/>
+        </w:rPr>
+        <w:t xml:space="preserve">acc receiveLine displayNl.</w:t>
+      </w:r>
+    </w:p>
+    <w:p>
+      <w:pPr>
+        <w:keepNext/>
+        <w:keepLines/>
+        <w:pBdr>
+          <w:left w:val="single" w:color="808080" w:sz="4"/>
+          <w:right w:val="single" w:color="808080" w:sz="4"/>
+        </w:pBdr>
+        <w:shd w:fill="F2F2F2" w:color="auto" w:val="clear"/>
+        <w:spacing w:after="0" w:line="240"/>
+        <w:ind w:left="100" w:right="100"/>
+      </w:pPr>
+      <w:r>
+        <w:rPr>
+          <w:rFonts w:ascii="Courier New" w:cs="Courier New" w:eastAsia="Courier New" w:hAnsi="Courier New"/>
+          <w:sz w:val="17"/>
+          <w:szCs w:val="17"/>
+        </w:rPr>
+        <w:t xml:space="preserve">acc sendLine: 'pong'.</w:t>
+      </w:r>
+    </w:p>
+    <w:p>
+      <w:pPr>
+        <w:keepNext/>
+        <w:keepLines/>
+        <w:pBdr>
+          <w:left w:val="single" w:color="808080" w:sz="4"/>
+          <w:right w:val="single" w:color="808080" w:sz="4"/>
+        </w:pBdr>
+        <w:shd w:fill="F2F2F2" w:color="auto" w:val="clear"/>
+        <w:spacing w:after="0" w:line="240"/>
+        <w:ind w:left="100" w:right="100"/>
+      </w:pPr>
+      <w:r>
+        <w:rPr>
+          <w:rFonts w:ascii="Courier New" w:cs="Courier New" w:eastAsia="Courier New" w:hAnsi="Courier New"/>
+          <w:sz w:val="17"/>
+          <w:szCs w:val="17"/>
+        </w:rPr>
+        <w:t xml:space="preserve">cli receiveLine displayNl.</w:t>
+      </w:r>
+    </w:p>
+    <w:p>
+      <w:pPr>
+        <w:keepNext/>
+        <w:keepLines/>
+        <w:pBdr>
+          <w:left w:val="single" w:color="808080" w:sz="4"/>
+          <w:right w:val="single" w:color="808080" w:sz="4"/>
+        </w:pBdr>
+        <w:shd w:fill="F2F2F2" w:color="auto" w:val="clear"/>
+        <w:spacing w:after="0" w:line="240"/>
+        <w:ind w:left="100" w:right="100"/>
+      </w:pPr>
+      <w:r>
+        <w:rPr>
+          <w:rFonts w:ascii="Courier New" w:cs="Courier New" w:eastAsia="Courier New" w:hAnsi="Courier New"/>
+          <w:sz w:val="17"/>
+          <w:szCs w:val="17"/>
+        </w:rPr>
+        <w:t xml:space="preserve">cli close. acc close. srv close.</w:t>
       </w:r>
     </w:p>
     <w:p>
@@ -26214,49 +26386,7 @@
           <w:sz w:val="17"/>
           <w:szCs w:val="17"/>
         </w:rPr>
-        <w:t xml:space="preserve">The program attempted to divide a number by zero</w:t>
-      </w:r>
-    </w:p>
-    <w:p>
-      <w:pPr>
-        <w:keepNext/>
-        <w:keepLines/>
-        <w:pBdr>
-          <w:left w:val="single" w:color="808080" w:sz="4"/>
-          <w:right w:val="single" w:color="808080" w:sz="4"/>
-        </w:pBdr>
-        <w:shd w:fill="F2F2F2" w:color="auto" w:val="clear"/>
-        <w:spacing w:after="0" w:line="240"/>
-        <w:ind w:left="100" w:right="100"/>
-      </w:pPr>
-      <w:r>
-        <w:rPr>
-          <w:rFonts w:ascii="Courier New" w:cs="Courier New" w:eastAsia="Courier New" w:hAnsi="Courier New"/>
-          <w:sz w:val="17"/>
-          <w:szCs w:val="17"/>
-        </w:rPr>
-        <w:t xml:space="preserve">-1</w:t>
-      </w:r>
-    </w:p>
-    <w:p>
-      <w:pPr>
-        <w:keepNext/>
-        <w:keepLines/>
-        <w:pBdr>
-          <w:left w:val="single" w:color="808080" w:sz="4"/>
-          <w:right w:val="single" w:color="808080" w:sz="4"/>
-        </w:pBdr>
-        <w:shd w:fill="F2F2F2" w:color="auto" w:val="clear"/>
-        <w:spacing w:after="0" w:line="240"/>
-        <w:ind w:left="100" w:right="100"/>
-      </w:pPr>
-      <w:r>
-        <w:rPr>
-          <w:rFonts w:ascii="Courier New" w:cs="Courier New" w:eastAsia="Courier New" w:hAnsi="Courier New"/>
-          <w:sz w:val="17"/>
-          <w:szCs w:val="17"/>
-        </w:rPr>
-        <w:t xml:space="preserve">3</w:t>
+        <w:t xml:space="preserve">ping</w:t>
       </w:r>
     </w:p>
     <w:p>
@@ -26278,7 +26408,7 @@
           <w:sz w:val="17"/>
           <w:szCs w:val="17"/>
         </w:rPr>
-        <w:t xml:space="preserve">Index value 5 out of range: only 2 elements</w:t>
+        <w:t xml:space="preserve">pong</w:t>
       </w:r>
     </w:p>
     <w:p>
@@ -26294,6 +26424,957 @@
           <w:szCs w:val="18"/>
         </w:rPr>
         <w:t xml:space="preserve">Figure 54. </w:t>
+      </w:r>
+      <w:r>
+        <w:rPr>
+          <w:rFonts w:ascii="Arial" w:cs="Arial" w:eastAsia="Arial" w:hAnsi="Arial"/>
+          <w:sz w:val="18"/>
+          <w:szCs w:val="18"/>
+        </w:rPr>
+        <w:t xml:space="preserve">A server and a client in one program</w:t>
+      </w:r>
+    </w:p>
+    <w:p>
+      <w:pPr>
+        <w:pStyle w:val="Heading2"/>
+        <w:keepNext/>
+      </w:pPr>
+      <w:r>
+        <w:rPr>
+          <w:rFonts w:ascii="Arial" w:cs="Arial" w:eastAsia="Arial" w:hAnsi="Arial"/>
+          <w:b/>
+          <w:bCs/>
+          <w:sz w:val="24"/>
+          <w:szCs w:val="24"/>
+        </w:rPr>
+        <w:t xml:space="preserve">URLs</w:t>
+      </w:r>
+    </w:p>
+    <w:p>
+      <w:pPr>
+        <w:spacing w:after="120" w:line="264"/>
+      </w:pPr>
+      <w:r>
+        <w:rPr>
+          <w:rFonts w:ascii="Arial" w:cs="Arial" w:eastAsia="Arial" w:hAnsi="Arial"/>
+          <w:sz w:val="20"/>
+          <w:szCs w:val="20"/>
+        </w:rPr>
+        <w:t xml:space="preserve">URL fromString: s answers an object that knows scheme, host, port, path and query. The port is that of the scheme (80 for http, 443 for https) unless the address gives one; the path is '/' if there is none. isSecure tests for https and requestTarget answers the path with the query.</w:t>
+      </w:r>
+    </w:p>
+    <w:p>
+      <w:pPr>
+        <w:keepNext/>
+        <w:keepLines/>
+        <w:pBdr>
+          <w:top w:val="single" w:color="808080" w:sz="4"/>
+          <w:left w:val="single" w:color="808080" w:sz="4"/>
+          <w:right w:val="single" w:color="808080" w:sz="4"/>
+        </w:pBdr>
+        <w:shd w:fill="F2F2F2" w:color="auto" w:val="clear"/>
+        <w:spacing w:after="0" w:line="240"/>
+        <w:ind w:left="100" w:right="100"/>
+      </w:pPr>
+      <w:r>
+        <w:rPr>
+          <w:rFonts w:ascii="Courier New" w:cs="Courier New" w:eastAsia="Courier New" w:hAnsi="Courier New"/>
+          <w:sz w:val="17"/>
+          <w:szCs w:val="17"/>
+        </w:rPr>
+        <w:t xml:space="preserve">| u |</w:t>
+      </w:r>
+    </w:p>
+    <w:p>
+      <w:pPr>
+        <w:keepNext/>
+        <w:keepLines/>
+        <w:pBdr>
+          <w:left w:val="single" w:color="808080" w:sz="4"/>
+          <w:right w:val="single" w:color="808080" w:sz="4"/>
+        </w:pBdr>
+        <w:shd w:fill="F2F2F2" w:color="auto" w:val="clear"/>
+        <w:spacing w:after="0" w:line="240"/>
+        <w:ind w:left="100" w:right="100"/>
+      </w:pPr>
+      <w:r>
+        <w:rPr>
+          <w:rFonts w:ascii="Courier New" w:cs="Courier New" w:eastAsia="Courier New" w:hAnsi="Courier New"/>
+          <w:sz w:val="17"/>
+          <w:szCs w:val="17"/>
+        </w:rPr>
+        <w:t xml:space="preserve">u := URL fromString: 'https://example.com/a/b?x=1'.</w:t>
+      </w:r>
+    </w:p>
+    <w:p>
+      <w:pPr>
+        <w:keepNext/>
+        <w:keepLines/>
+        <w:pBdr>
+          <w:left w:val="single" w:color="808080" w:sz="4"/>
+          <w:right w:val="single" w:color="808080" w:sz="4"/>
+        </w:pBdr>
+        <w:shd w:fill="F2F2F2" w:color="auto" w:val="clear"/>
+        <w:spacing w:after="0" w:line="240"/>
+        <w:ind w:left="100" w:right="100"/>
+      </w:pPr>
+      <w:r>
+        <w:rPr>
+          <w:rFonts w:ascii="Courier New" w:cs="Courier New" w:eastAsia="Courier New" w:hAnsi="Courier New"/>
+          <w:sz w:val="17"/>
+          <w:szCs w:val="17"/>
+        </w:rPr>
+        <w:t xml:space="preserve">u host printNl.</w:t>
+      </w:r>
+    </w:p>
+    <w:p>
+      <w:pPr>
+        <w:keepNext/>
+        <w:keepLines/>
+        <w:pBdr>
+          <w:left w:val="single" w:color="808080" w:sz="4"/>
+          <w:right w:val="single" w:color="808080" w:sz="4"/>
+        </w:pBdr>
+        <w:shd w:fill="F2F2F2" w:color="auto" w:val="clear"/>
+        <w:spacing w:after="0" w:line="240"/>
+        <w:ind w:left="100" w:right="100"/>
+      </w:pPr>
+      <w:r>
+        <w:rPr>
+          <w:rFonts w:ascii="Courier New" w:cs="Courier New" w:eastAsia="Courier New" w:hAnsi="Courier New"/>
+          <w:sz w:val="17"/>
+          <w:szCs w:val="17"/>
+        </w:rPr>
+        <w:t xml:space="preserve">u port printNl.</w:t>
+      </w:r>
+    </w:p>
+    <w:p>
+      <w:pPr>
+        <w:keepNext/>
+        <w:keepLines/>
+        <w:pBdr>
+          <w:left w:val="single" w:color="808080" w:sz="4"/>
+          <w:right w:val="single" w:color="808080" w:sz="4"/>
+        </w:pBdr>
+        <w:shd w:fill="F2F2F2" w:color="auto" w:val="clear"/>
+        <w:spacing w:after="0" w:line="240"/>
+        <w:ind w:left="100" w:right="100"/>
+      </w:pPr>
+      <w:r>
+        <w:rPr>
+          <w:rFonts w:ascii="Courier New" w:cs="Courier New" w:eastAsia="Courier New" w:hAnsi="Courier New"/>
+          <w:sz w:val="17"/>
+          <w:szCs w:val="17"/>
+        </w:rPr>
+        <w:t xml:space="preserve">u path printNl.</w:t>
+      </w:r>
+    </w:p>
+    <w:p>
+      <w:pPr>
+        <w:keepNext/>
+        <w:keepLines/>
+        <w:pBdr>
+          <w:left w:val="single" w:color="808080" w:sz="4"/>
+          <w:right w:val="single" w:color="808080" w:sz="4"/>
+        </w:pBdr>
+        <w:shd w:fill="F2F2F2" w:color="auto" w:val="clear"/>
+        <w:spacing w:after="0" w:line="240"/>
+        <w:ind w:left="100" w:right="100"/>
+      </w:pPr>
+      <w:r>
+        <w:rPr>
+          <w:rFonts w:ascii="Courier New" w:cs="Courier New" w:eastAsia="Courier New" w:hAnsi="Courier New"/>
+          <w:sz w:val="17"/>
+          <w:szCs w:val="17"/>
+        </w:rPr>
+        <w:t xml:space="preserve">u query printNl.</w:t>
+      </w:r>
+    </w:p>
+    <w:p>
+      <w:pPr>
+        <w:keepNext/>
+        <w:keepLines/>
+        <w:pBdr>
+          <w:left w:val="single" w:color="808080" w:sz="4"/>
+          <w:right w:val="single" w:color="808080" w:sz="4"/>
+        </w:pBdr>
+        <w:shd w:fill="F2F2F2" w:color="auto" w:val="clear"/>
+        <w:spacing w:after="0" w:line="240"/>
+        <w:ind w:left="100" w:right="100"/>
+      </w:pPr>
+      <w:r>
+        <w:rPr>
+          <w:rFonts w:ascii="Courier New" w:cs="Courier New" w:eastAsia="Courier New" w:hAnsi="Courier New"/>
+          <w:sz w:val="17"/>
+          <w:szCs w:val="17"/>
+        </w:rPr>
+        <w:t xml:space="preserve">(URL fromString: 'http://localhost:8080') port printNl.</w:t>
+      </w:r>
+    </w:p>
+    <w:p>
+      <w:pPr>
+        <w:keepNext/>
+        <w:keepLines/>
+        <w:pBdr>
+          <w:left w:val="single" w:color="808080" w:sz="4"/>
+          <w:right w:val="single" w:color="808080" w:sz="4"/>
+        </w:pBdr>
+        <w:shd w:fill="F2F2F2" w:color="auto" w:val="clear"/>
+        <w:spacing w:after="0" w:line="240"/>
+        <w:ind w:left="100" w:right="100"/>
+      </w:pPr>
+      <w:r>
+        <w:rPr>
+          <w:rFonts w:ascii="Courier New" w:cs="Courier New" w:eastAsia="Courier New" w:hAnsi="Courier New"/>
+          <w:sz w:val="17"/>
+          <w:szCs w:val="17"/>
+        </w:rPr>
+        <w:t xml:space="preserve"> </w:t>
+      </w:r>
+    </w:p>
+    <w:p>
+      <w:pPr>
+        <w:keepNext/>
+        <w:keepLines/>
+        <w:pBdr>
+          <w:left w:val="single" w:color="808080" w:sz="4"/>
+          <w:right w:val="single" w:color="808080" w:sz="4"/>
+        </w:pBdr>
+        <w:shd w:fill="F2F2F2" w:color="auto" w:val="clear"/>
+        <w:spacing w:after="0" w:line="240"/>
+        <w:ind w:left="100" w:right="100"/>
+      </w:pPr>
+      <w:r>
+        <w:rPr>
+          <w:rFonts w:ascii="Courier New" w:cs="Courier New" w:eastAsia="Courier New" w:hAnsi="Courier New"/>
+          <w:sz w:val="17"/>
+          <w:szCs w:val="17"/>
+        </w:rPr>
+        <w:t xml:space="preserve">'example.com'</w:t>
+      </w:r>
+    </w:p>
+    <w:p>
+      <w:pPr>
+        <w:keepNext/>
+        <w:keepLines/>
+        <w:pBdr>
+          <w:left w:val="single" w:color="808080" w:sz="4"/>
+          <w:right w:val="single" w:color="808080" w:sz="4"/>
+        </w:pBdr>
+        <w:shd w:fill="F2F2F2" w:color="auto" w:val="clear"/>
+        <w:spacing w:after="0" w:line="240"/>
+        <w:ind w:left="100" w:right="100"/>
+      </w:pPr>
+      <w:r>
+        <w:rPr>
+          <w:rFonts w:ascii="Courier New" w:cs="Courier New" w:eastAsia="Courier New" w:hAnsi="Courier New"/>
+          <w:sz w:val="17"/>
+          <w:szCs w:val="17"/>
+        </w:rPr>
+        <w:t xml:space="preserve">443</w:t>
+      </w:r>
+    </w:p>
+    <w:p>
+      <w:pPr>
+        <w:keepNext/>
+        <w:keepLines/>
+        <w:pBdr>
+          <w:left w:val="single" w:color="808080" w:sz="4"/>
+          <w:right w:val="single" w:color="808080" w:sz="4"/>
+        </w:pBdr>
+        <w:shd w:fill="F2F2F2" w:color="auto" w:val="clear"/>
+        <w:spacing w:after="0" w:line="240"/>
+        <w:ind w:left="100" w:right="100"/>
+      </w:pPr>
+      <w:r>
+        <w:rPr>
+          <w:rFonts w:ascii="Courier New" w:cs="Courier New" w:eastAsia="Courier New" w:hAnsi="Courier New"/>
+          <w:sz w:val="17"/>
+          <w:szCs w:val="17"/>
+        </w:rPr>
+        <w:t xml:space="preserve">'/a/b'</w:t>
+      </w:r>
+    </w:p>
+    <w:p>
+      <w:pPr>
+        <w:keepNext/>
+        <w:keepLines/>
+        <w:pBdr>
+          <w:left w:val="single" w:color="808080" w:sz="4"/>
+          <w:right w:val="single" w:color="808080" w:sz="4"/>
+        </w:pBdr>
+        <w:shd w:fill="F2F2F2" w:color="auto" w:val="clear"/>
+        <w:spacing w:after="0" w:line="240"/>
+        <w:ind w:left="100" w:right="100"/>
+      </w:pPr>
+      <w:r>
+        <w:rPr>
+          <w:rFonts w:ascii="Courier New" w:cs="Courier New" w:eastAsia="Courier New" w:hAnsi="Courier New"/>
+          <w:sz w:val="17"/>
+          <w:szCs w:val="17"/>
+        </w:rPr>
+        <w:t xml:space="preserve">'x=1'</w:t>
+      </w:r>
+    </w:p>
+    <w:p>
+      <w:pPr>
+        <w:keepNext w:val="false"/>
+        <w:keepLines/>
+        <w:pBdr>
+          <w:bottom w:val="single" w:color="808080" w:sz="4"/>
+          <w:left w:val="single" w:color="808080" w:sz="4"/>
+          <w:right w:val="single" w:color="808080" w:sz="4"/>
+        </w:pBdr>
+        <w:shd w:fill="F2F2F2" w:color="auto" w:val="clear"/>
+        <w:spacing w:after="0" w:line="240"/>
+        <w:ind w:left="100" w:right="100"/>
+      </w:pPr>
+      <w:r>
+        <w:rPr>
+          <w:rFonts w:ascii="Courier New" w:cs="Courier New" w:eastAsia="Courier New" w:hAnsi="Courier New"/>
+          <w:sz w:val="17"/>
+          <w:szCs w:val="17"/>
+        </w:rPr>
+        <w:t xml:space="preserve">8080</w:t>
+      </w:r>
+    </w:p>
+    <w:p>
+      <w:pPr>
+        <w:spacing w:after="200" w:before="60"/>
+      </w:pPr>
+      <w:r>
+        <w:rPr>
+          <w:rFonts w:ascii="Arial" w:cs="Arial" w:eastAsia="Arial" w:hAnsi="Arial"/>
+          <w:b/>
+          <w:bCs/>
+          <w:sz w:val="18"/>
+          <w:szCs w:val="18"/>
+        </w:rPr>
+        <w:t xml:space="preserve">Figure 55. </w:t>
+      </w:r>
+      <w:r>
+        <w:rPr>
+          <w:rFonts w:ascii="Arial" w:cs="Arial" w:eastAsia="Arial" w:hAnsi="Arial"/>
+          <w:sz w:val="18"/>
+          <w:szCs w:val="18"/>
+        </w:rPr>
+        <w:t xml:space="preserve">Taking an address apart</w:t>
+      </w:r>
+    </w:p>
+    <w:p>
+      <w:pPr>
+        <w:pStyle w:val="Heading2"/>
+        <w:keepNext/>
+      </w:pPr>
+      <w:r>
+        <w:rPr>
+          <w:rFonts w:ascii="Arial" w:cs="Arial" w:eastAsia="Arial" w:hAnsi="Arial"/>
+          <w:b/>
+          <w:bCs/>
+          <w:sz w:val="24"/>
+          <w:szCs w:val="24"/>
+        </w:rPr>
+        <w:t xml:space="preserve">HTTP</w:t>
+      </w:r>
+    </w:p>
+    <w:p>
+      <w:pPr>
+        <w:spacing w:after="120" w:line="264"/>
+      </w:pPr>
+      <w:r>
+        <w:rPr>
+          <w:rFonts w:ascii="Arial" w:cs="Arial" w:eastAsia="Arial" w:hAnsi="Arial"/>
+          <w:sz w:val="20"/>
+          <w:szCs w:val="20"/>
+        </w:rPr>
+        <w:t xml:space="preserve">HttpClient get: url and HttpClient post: url body: text answer an HttpResponse; HttpClient getString: url answers only the body. The client sends a HTTP/1.1 request with Connection: close, joins the chunks of a chunked answer and understands https. An HttpResponse answers status (an Integer), reason, body, headers (a Dictionary with lower case keys), header: name (nil if missing) and isSuccess for the codes 200 to 299. HttpClient parseResponse: text builds a response from the raw text of an answer, which is useful for tests.</w:t>
+      </w:r>
+    </w:p>
+    <w:p>
+      <w:pPr>
+        <w:keepNext/>
+        <w:keepLines/>
+        <w:pBdr>
+          <w:top w:val="single" w:color="808080" w:sz="4"/>
+          <w:left w:val="single" w:color="808080" w:sz="4"/>
+          <w:right w:val="single" w:color="808080" w:sz="4"/>
+        </w:pBdr>
+        <w:shd w:fill="F2F2F2" w:color="auto" w:val="clear"/>
+        <w:spacing w:after="0" w:line="240"/>
+        <w:ind w:left="100" w:right="100"/>
+      </w:pPr>
+      <w:r>
+        <w:rPr>
+          <w:rFonts w:ascii="Courier New" w:cs="Courier New" w:eastAsia="Courier New" w:hAnsi="Courier New"/>
+          <w:sz w:val="17"/>
+          <w:szCs w:val="17"/>
+        </w:rPr>
+        <w:t xml:space="preserve">| r |</w:t>
+      </w:r>
+    </w:p>
+    <w:p>
+      <w:pPr>
+        <w:keepNext/>
+        <w:keepLines/>
+        <w:pBdr>
+          <w:left w:val="single" w:color="808080" w:sz="4"/>
+          <w:right w:val="single" w:color="808080" w:sz="4"/>
+        </w:pBdr>
+        <w:shd w:fill="F2F2F2" w:color="auto" w:val="clear"/>
+        <w:spacing w:after="0" w:line="240"/>
+        <w:ind w:left="100" w:right="100"/>
+      </w:pPr>
+      <w:r>
+        <w:rPr>
+          <w:rFonts w:ascii="Courier New" w:cs="Courier New" w:eastAsia="Courier New" w:hAnsi="Courier New"/>
+          <w:sz w:val="17"/>
+          <w:szCs w:val="17"/>
+        </w:rPr>
+        <w:t xml:space="preserve">r := HttpClient parseResponse: 'HTTP/1.1 200 OK', HttpClient crlf, 'Content-Type: text/plain', HttpClient crlf, HttpClient crlf, 'hi'.</w:t>
+      </w:r>
+    </w:p>
+    <w:p>
+      <w:pPr>
+        <w:keepNext/>
+        <w:keepLines/>
+        <w:pBdr>
+          <w:left w:val="single" w:color="808080" w:sz="4"/>
+          <w:right w:val="single" w:color="808080" w:sz="4"/>
+        </w:pBdr>
+        <w:shd w:fill="F2F2F2" w:color="auto" w:val="clear"/>
+        <w:spacing w:after="0" w:line="240"/>
+        <w:ind w:left="100" w:right="100"/>
+      </w:pPr>
+      <w:r>
+        <w:rPr>
+          <w:rFonts w:ascii="Courier New" w:cs="Courier New" w:eastAsia="Courier New" w:hAnsi="Courier New"/>
+          <w:sz w:val="17"/>
+          <w:szCs w:val="17"/>
+        </w:rPr>
+        <w:t xml:space="preserve">r status printNl.</w:t>
+      </w:r>
+    </w:p>
+    <w:p>
+      <w:pPr>
+        <w:keepNext/>
+        <w:keepLines/>
+        <w:pBdr>
+          <w:left w:val="single" w:color="808080" w:sz="4"/>
+          <w:right w:val="single" w:color="808080" w:sz="4"/>
+        </w:pBdr>
+        <w:shd w:fill="F2F2F2" w:color="auto" w:val="clear"/>
+        <w:spacing w:after="0" w:line="240"/>
+        <w:ind w:left="100" w:right="100"/>
+      </w:pPr>
+      <w:r>
+        <w:rPr>
+          <w:rFonts w:ascii="Courier New" w:cs="Courier New" w:eastAsia="Courier New" w:hAnsi="Courier New"/>
+          <w:sz w:val="17"/>
+          <w:szCs w:val="17"/>
+        </w:rPr>
+        <w:t xml:space="preserve">r body printNl.</w:t>
+      </w:r>
+    </w:p>
+    <w:p>
+      <w:pPr>
+        <w:keepNext/>
+        <w:keepLines/>
+        <w:pBdr>
+          <w:left w:val="single" w:color="808080" w:sz="4"/>
+          <w:right w:val="single" w:color="808080" w:sz="4"/>
+        </w:pBdr>
+        <w:shd w:fill="F2F2F2" w:color="auto" w:val="clear"/>
+        <w:spacing w:after="0" w:line="240"/>
+        <w:ind w:left="100" w:right="100"/>
+      </w:pPr>
+      <w:r>
+        <w:rPr>
+          <w:rFonts w:ascii="Courier New" w:cs="Courier New" w:eastAsia="Courier New" w:hAnsi="Courier New"/>
+          <w:sz w:val="17"/>
+          <w:szCs w:val="17"/>
+        </w:rPr>
+        <w:t xml:space="preserve">(r header: 'content-type') printNl.</w:t>
+      </w:r>
+    </w:p>
+    <w:p>
+      <w:pPr>
+        <w:keepNext/>
+        <w:keepLines/>
+        <w:pBdr>
+          <w:left w:val="single" w:color="808080" w:sz="4"/>
+          <w:right w:val="single" w:color="808080" w:sz="4"/>
+        </w:pBdr>
+        <w:shd w:fill="F2F2F2" w:color="auto" w:val="clear"/>
+        <w:spacing w:after="0" w:line="240"/>
+        <w:ind w:left="100" w:right="100"/>
+      </w:pPr>
+      <w:r>
+        <w:rPr>
+          <w:rFonts w:ascii="Courier New" w:cs="Courier New" w:eastAsia="Courier New" w:hAnsi="Courier New"/>
+          <w:sz w:val="17"/>
+          <w:szCs w:val="17"/>
+        </w:rPr>
+        <w:t xml:space="preserve">r isSuccess printNl.</w:t>
+      </w:r>
+    </w:p>
+    <w:p>
+      <w:pPr>
+        <w:keepNext/>
+        <w:keepLines/>
+        <w:pBdr>
+          <w:left w:val="single" w:color="808080" w:sz="4"/>
+          <w:right w:val="single" w:color="808080" w:sz="4"/>
+        </w:pBdr>
+        <w:shd w:fill="F2F2F2" w:color="auto" w:val="clear"/>
+        <w:spacing w:after="0" w:line="240"/>
+        <w:ind w:left="100" w:right="100"/>
+      </w:pPr>
+      <w:r>
+        <w:rPr>
+          <w:rFonts w:ascii="Courier New" w:cs="Courier New" w:eastAsia="Courier New" w:hAnsi="Courier New"/>
+          <w:sz w:val="17"/>
+          <w:szCs w:val="17"/>
+        </w:rPr>
+        <w:t xml:space="preserve"> </w:t>
+      </w:r>
+    </w:p>
+    <w:p>
+      <w:pPr>
+        <w:keepNext/>
+        <w:keepLines/>
+        <w:pBdr>
+          <w:left w:val="single" w:color="808080" w:sz="4"/>
+          <w:right w:val="single" w:color="808080" w:sz="4"/>
+        </w:pBdr>
+        <w:shd w:fill="F2F2F2" w:color="auto" w:val="clear"/>
+        <w:spacing w:after="0" w:line="240"/>
+        <w:ind w:left="100" w:right="100"/>
+      </w:pPr>
+      <w:r>
+        <w:rPr>
+          <w:rFonts w:ascii="Courier New" w:cs="Courier New" w:eastAsia="Courier New" w:hAnsi="Courier New"/>
+          <w:sz w:val="17"/>
+          <w:szCs w:val="17"/>
+        </w:rPr>
+        <w:t xml:space="preserve">200</w:t>
+      </w:r>
+    </w:p>
+    <w:p>
+      <w:pPr>
+        <w:keepNext/>
+        <w:keepLines/>
+        <w:pBdr>
+          <w:left w:val="single" w:color="808080" w:sz="4"/>
+          <w:right w:val="single" w:color="808080" w:sz="4"/>
+        </w:pBdr>
+        <w:shd w:fill="F2F2F2" w:color="auto" w:val="clear"/>
+        <w:spacing w:after="0" w:line="240"/>
+        <w:ind w:left="100" w:right="100"/>
+      </w:pPr>
+      <w:r>
+        <w:rPr>
+          <w:rFonts w:ascii="Courier New" w:cs="Courier New" w:eastAsia="Courier New" w:hAnsi="Courier New"/>
+          <w:sz w:val="17"/>
+          <w:szCs w:val="17"/>
+        </w:rPr>
+        <w:t xml:space="preserve">'hi'</w:t>
+      </w:r>
+    </w:p>
+    <w:p>
+      <w:pPr>
+        <w:keepNext/>
+        <w:keepLines/>
+        <w:pBdr>
+          <w:left w:val="single" w:color="808080" w:sz="4"/>
+          <w:right w:val="single" w:color="808080" w:sz="4"/>
+        </w:pBdr>
+        <w:shd w:fill="F2F2F2" w:color="auto" w:val="clear"/>
+        <w:spacing w:after="0" w:line="240"/>
+        <w:ind w:left="100" w:right="100"/>
+      </w:pPr>
+      <w:r>
+        <w:rPr>
+          <w:rFonts w:ascii="Courier New" w:cs="Courier New" w:eastAsia="Courier New" w:hAnsi="Courier New"/>
+          <w:sz w:val="17"/>
+          <w:szCs w:val="17"/>
+        </w:rPr>
+        <w:t xml:space="preserve">'text/plain'</w:t>
+      </w:r>
+    </w:p>
+    <w:p>
+      <w:pPr>
+        <w:keepNext w:val="false"/>
+        <w:keepLines/>
+        <w:pBdr>
+          <w:bottom w:val="single" w:color="808080" w:sz="4"/>
+          <w:left w:val="single" w:color="808080" w:sz="4"/>
+          <w:right w:val="single" w:color="808080" w:sz="4"/>
+        </w:pBdr>
+        <w:shd w:fill="F2F2F2" w:color="auto" w:val="clear"/>
+        <w:spacing w:after="0" w:line="240"/>
+        <w:ind w:left="100" w:right="100"/>
+      </w:pPr>
+      <w:r>
+        <w:rPr>
+          <w:rFonts w:ascii="Courier New" w:cs="Courier New" w:eastAsia="Courier New" w:hAnsi="Courier New"/>
+          <w:sz w:val="17"/>
+          <w:szCs w:val="17"/>
+        </w:rPr>
+        <w:t xml:space="preserve">true</w:t>
+      </w:r>
+    </w:p>
+    <w:p>
+      <w:pPr>
+        <w:spacing w:after="200" w:before="60"/>
+      </w:pPr>
+      <w:r>
+        <w:rPr>
+          <w:rFonts w:ascii="Arial" w:cs="Arial" w:eastAsia="Arial" w:hAnsi="Arial"/>
+          <w:b/>
+          <w:bCs/>
+          <w:sz w:val="18"/>
+          <w:szCs w:val="18"/>
+        </w:rPr>
+        <w:t xml:space="preserve">Figure 56. </w:t>
+      </w:r>
+      <w:r>
+        <w:rPr>
+          <w:rFonts w:ascii="Arial" w:cs="Arial" w:eastAsia="Arial" w:hAnsi="Arial"/>
+          <w:sz w:val="18"/>
+          <w:szCs w:val="18"/>
+        </w:rPr>
+        <w:t xml:space="preserve">Reading a response</w:t>
+      </w:r>
+    </w:p>
+    <w:p>
+      <w:pPr>
+        <w:spacing w:after="120" w:line="264"/>
+      </w:pPr>
+      <w:r>
+        <w:rPr>
+          <w:rFonts w:ascii="Arial" w:cs="Arial" w:eastAsia="Arial" w:hAnsi="Arial"/>
+          <w:sz w:val="20"/>
+          <w:szCs w:val="20"/>
+        </w:rPr>
+        <w:t xml:space="preserve">The sqlite plugin of CREXX is not reachable from Smalltalk/CREXX; it is not part of every CREXX installation.</w:t>
+      </w:r>
+    </w:p>
+    <w:p>
+      <w:pPr>
+        <w:pStyle w:val="Heading1"/>
+        <w:pageBreakBefore/>
+        <w:pBdr>
+          <w:bottom w:val="single" w:color="000000" w:sz="12" w:space="4"/>
+        </w:pBdr>
+        <w:spacing w:after="240" w:before="0"/>
+      </w:pPr>
+      <w:r>
+        <w:rPr>
+          <w:rFonts w:ascii="Arial" w:cs="Arial" w:eastAsia="Arial" w:hAnsi="Arial"/>
+          <w:b/>
+          <w:bCs/>
+          <w:sz w:val="32"/>
+          <w:szCs w:val="32"/>
+        </w:rPr>
+        <w:t xml:space="preserve">Chapter 10. Exceptions</w:t>
+      </w:r>
+    </w:p>
+    <w:p>
+      <w:pPr>
+        <w:pStyle w:val="Heading2"/>
+        <w:keepNext/>
+      </w:pPr>
+      <w:r>
+        <w:rPr>
+          <w:rFonts w:ascii="Arial" w:cs="Arial" w:eastAsia="Arial" w:hAnsi="Arial"/>
+          <w:b/>
+          <w:bCs/>
+          <w:sz w:val="24"/>
+          <w:szCs w:val="24"/>
+        </w:rPr>
+        <w:t xml:space="preserve">Handling</w:t>
+      </w:r>
+    </w:p>
+    <w:p>
+      <w:pPr>
+        <w:spacing w:after="120" w:line="264"/>
+      </w:pPr>
+      <w:r>
+        <w:rPr>
+          <w:rFonts w:ascii="Arial" w:cs="Arial" w:eastAsia="Arial" w:hAnsi="Arial"/>
+          <w:sz w:val="20"/>
+          <w:szCs w:val="20"/>
+        </w:rPr>
+        <w:t xml:space="preserve">aBlock on: ExceptionClass do: [:e | ... ] evaluates the block. If an exception of that class (or a subclass) is signaled while it runs, the handler block is evaluated with the exception as its argument. The value of the handler block becomes the value of the on:do: expression. A handler for several classes uses a set: on: ZeroDivide, MessageNotUnderstood do: [...].</w:t>
+      </w:r>
+    </w:p>
+    <w:p>
+      <w:pPr>
+        <w:keepNext/>
+        <w:keepLines/>
+        <w:pBdr>
+          <w:top w:val="single" w:color="808080" w:sz="4"/>
+          <w:left w:val="single" w:color="808080" w:sz="4"/>
+          <w:right w:val="single" w:color="808080" w:sz="4"/>
+        </w:pBdr>
+        <w:shd w:fill="F2F2F2" w:color="auto" w:val="clear"/>
+        <w:spacing w:after="0" w:line="240"/>
+        <w:ind w:left="100" w:right="100"/>
+      </w:pPr>
+      <w:r>
+        <w:rPr>
+          <w:rFonts w:ascii="Courier New" w:cs="Courier New" w:eastAsia="Courier New" w:hAnsi="Courier New"/>
+          <w:sz w:val="17"/>
+          <w:szCs w:val="17"/>
+        </w:rPr>
+        <w:t xml:space="preserve">| r |</w:t>
+      </w:r>
+    </w:p>
+    <w:p>
+      <w:pPr>
+        <w:keepNext/>
+        <w:keepLines/>
+        <w:pBdr>
+          <w:left w:val="single" w:color="808080" w:sz="4"/>
+          <w:right w:val="single" w:color="808080" w:sz="4"/>
+        </w:pBdr>
+        <w:shd w:fill="F2F2F2" w:color="auto" w:val="clear"/>
+        <w:spacing w:after="0" w:line="240"/>
+        <w:ind w:left="100" w:right="100"/>
+      </w:pPr>
+      <w:r>
+        <w:rPr>
+          <w:rFonts w:ascii="Courier New" w:cs="Courier New" w:eastAsia="Courier New" w:hAnsi="Courier New"/>
+          <w:sz w:val="17"/>
+          <w:szCs w:val="17"/>
+        </w:rPr>
+        <w:t xml:space="preserve">r := [10 / 0] on: ZeroDivide do: [:e | e messageText displayNl. -1].</w:t>
+      </w:r>
+    </w:p>
+    <w:p>
+      <w:pPr>
+        <w:keepNext/>
+        <w:keepLines/>
+        <w:pBdr>
+          <w:left w:val="single" w:color="808080" w:sz="4"/>
+          <w:right w:val="single" w:color="808080" w:sz="4"/>
+        </w:pBdr>
+        <w:shd w:fill="F2F2F2" w:color="auto" w:val="clear"/>
+        <w:spacing w:after="0" w:line="240"/>
+        <w:ind w:left="100" w:right="100"/>
+      </w:pPr>
+      <w:r>
+        <w:rPr>
+          <w:rFonts w:ascii="Courier New" w:cs="Courier New" w:eastAsia="Courier New" w:hAnsi="Courier New"/>
+          <w:sz w:val="17"/>
+          <w:szCs w:val="17"/>
+        </w:rPr>
+        <w:t xml:space="preserve">r printNl.</w:t>
+      </w:r>
+    </w:p>
+    <w:p>
+      <w:pPr>
+        <w:keepNext/>
+        <w:keepLines/>
+        <w:pBdr>
+          <w:left w:val="single" w:color="808080" w:sz="4"/>
+          <w:right w:val="single" w:color="808080" w:sz="4"/>
+        </w:pBdr>
+        <w:shd w:fill="F2F2F2" w:color="auto" w:val="clear"/>
+        <w:spacing w:after="0" w:line="240"/>
+        <w:ind w:left="100" w:right="100"/>
+      </w:pPr>
+      <w:r>
+        <w:rPr>
+          <w:rFonts w:ascii="Courier New" w:cs="Courier New" w:eastAsia="Courier New" w:hAnsi="Courier New"/>
+          <w:sz w:val="17"/>
+          <w:szCs w:val="17"/>
+        </w:rPr>
+        <w:t xml:space="preserve">r := [nil foo] on: MessageNotUnderstood do: [:e | e return: 3].</w:t>
+      </w:r>
+    </w:p>
+    <w:p>
+      <w:pPr>
+        <w:keepNext/>
+        <w:keepLines/>
+        <w:pBdr>
+          <w:left w:val="single" w:color="808080" w:sz="4"/>
+          <w:right w:val="single" w:color="808080" w:sz="4"/>
+        </w:pBdr>
+        <w:shd w:fill="F2F2F2" w:color="auto" w:val="clear"/>
+        <w:spacing w:after="0" w:line="240"/>
+        <w:ind w:left="100" w:right="100"/>
+      </w:pPr>
+      <w:r>
+        <w:rPr>
+          <w:rFonts w:ascii="Courier New" w:cs="Courier New" w:eastAsia="Courier New" w:hAnsi="Courier New"/>
+          <w:sz w:val="17"/>
+          <w:szCs w:val="17"/>
+        </w:rPr>
+        <w:t xml:space="preserve">r printNl.</w:t>
+      </w:r>
+    </w:p>
+    <w:p>
+      <w:pPr>
+        <w:keepNext/>
+        <w:keepLines/>
+        <w:pBdr>
+          <w:left w:val="single" w:color="808080" w:sz="4"/>
+          <w:right w:val="single" w:color="808080" w:sz="4"/>
+        </w:pBdr>
+        <w:shd w:fill="F2F2F2" w:color="auto" w:val="clear"/>
+        <w:spacing w:after="0" w:line="240"/>
+        <w:ind w:left="100" w:right="100"/>
+      </w:pPr>
+      <w:r>
+        <w:rPr>
+          <w:rFonts w:ascii="Courier New" w:cs="Courier New" w:eastAsia="Courier New" w:hAnsi="Courier New"/>
+          <w:sz w:val="17"/>
+          <w:szCs w:val="17"/>
+        </w:rPr>
+        <w:t xml:space="preserve">r := [#(1 2) at: 5] on: Error do: [:e | e messageText].</w:t>
+      </w:r>
+    </w:p>
+    <w:p>
+      <w:pPr>
+        <w:keepNext/>
+        <w:keepLines/>
+        <w:pBdr>
+          <w:left w:val="single" w:color="808080" w:sz="4"/>
+          <w:right w:val="single" w:color="808080" w:sz="4"/>
+        </w:pBdr>
+        <w:shd w:fill="F2F2F2" w:color="auto" w:val="clear"/>
+        <w:spacing w:after="0" w:line="240"/>
+        <w:ind w:left="100" w:right="100"/>
+      </w:pPr>
+      <w:r>
+        <w:rPr>
+          <w:rFonts w:ascii="Courier New" w:cs="Courier New" w:eastAsia="Courier New" w:hAnsi="Courier New"/>
+          <w:sz w:val="17"/>
+          <w:szCs w:val="17"/>
+        </w:rPr>
+        <w:t xml:space="preserve">r displayNl.</w:t>
+      </w:r>
+    </w:p>
+    <w:p>
+      <w:pPr>
+        <w:keepNext/>
+        <w:keepLines/>
+        <w:pBdr>
+          <w:left w:val="single" w:color="808080" w:sz="4"/>
+          <w:right w:val="single" w:color="808080" w:sz="4"/>
+        </w:pBdr>
+        <w:shd w:fill="F2F2F2" w:color="auto" w:val="clear"/>
+        <w:spacing w:after="0" w:line="240"/>
+        <w:ind w:left="100" w:right="100"/>
+      </w:pPr>
+      <w:r>
+        <w:rPr>
+          <w:rFonts w:ascii="Courier New" w:cs="Courier New" w:eastAsia="Courier New" w:hAnsi="Courier New"/>
+          <w:sz w:val="17"/>
+          <w:szCs w:val="17"/>
+        </w:rPr>
+        <w:t xml:space="preserve"> </w:t>
+      </w:r>
+    </w:p>
+    <w:p>
+      <w:pPr>
+        <w:keepNext/>
+        <w:keepLines/>
+        <w:pBdr>
+          <w:left w:val="single" w:color="808080" w:sz="4"/>
+          <w:right w:val="single" w:color="808080" w:sz="4"/>
+        </w:pBdr>
+        <w:shd w:fill="F2F2F2" w:color="auto" w:val="clear"/>
+        <w:spacing w:after="0" w:line="240"/>
+        <w:ind w:left="100" w:right="100"/>
+      </w:pPr>
+      <w:r>
+        <w:rPr>
+          <w:rFonts w:ascii="Courier New" w:cs="Courier New" w:eastAsia="Courier New" w:hAnsi="Courier New"/>
+          <w:sz w:val="17"/>
+          <w:szCs w:val="17"/>
+        </w:rPr>
+        <w:t xml:space="preserve">The program attempted to divide a number by zero</w:t>
+      </w:r>
+    </w:p>
+    <w:p>
+      <w:pPr>
+        <w:keepNext/>
+        <w:keepLines/>
+        <w:pBdr>
+          <w:left w:val="single" w:color="808080" w:sz="4"/>
+          <w:right w:val="single" w:color="808080" w:sz="4"/>
+        </w:pBdr>
+        <w:shd w:fill="F2F2F2" w:color="auto" w:val="clear"/>
+        <w:spacing w:after="0" w:line="240"/>
+        <w:ind w:left="100" w:right="100"/>
+      </w:pPr>
+      <w:r>
+        <w:rPr>
+          <w:rFonts w:ascii="Courier New" w:cs="Courier New" w:eastAsia="Courier New" w:hAnsi="Courier New"/>
+          <w:sz w:val="17"/>
+          <w:szCs w:val="17"/>
+        </w:rPr>
+        <w:t xml:space="preserve">-1</w:t>
+      </w:r>
+    </w:p>
+    <w:p>
+      <w:pPr>
+        <w:keepNext/>
+        <w:keepLines/>
+        <w:pBdr>
+          <w:left w:val="single" w:color="808080" w:sz="4"/>
+          <w:right w:val="single" w:color="808080" w:sz="4"/>
+        </w:pBdr>
+        <w:shd w:fill="F2F2F2" w:color="auto" w:val="clear"/>
+        <w:spacing w:after="0" w:line="240"/>
+        <w:ind w:left="100" w:right="100"/>
+      </w:pPr>
+      <w:r>
+        <w:rPr>
+          <w:rFonts w:ascii="Courier New" w:cs="Courier New" w:eastAsia="Courier New" w:hAnsi="Courier New"/>
+          <w:sz w:val="17"/>
+          <w:szCs w:val="17"/>
+        </w:rPr>
+        <w:t xml:space="preserve">3</w:t>
+      </w:r>
+    </w:p>
+    <w:p>
+      <w:pPr>
+        <w:keepNext w:val="false"/>
+        <w:keepLines/>
+        <w:pBdr>
+          <w:bottom w:val="single" w:color="808080" w:sz="4"/>
+          <w:left w:val="single" w:color="808080" w:sz="4"/>
+          <w:right w:val="single" w:color="808080" w:sz="4"/>
+        </w:pBdr>
+        <w:shd w:fill="F2F2F2" w:color="auto" w:val="clear"/>
+        <w:spacing w:after="0" w:line="240"/>
+        <w:ind w:left="100" w:right="100"/>
+      </w:pPr>
+      <w:r>
+        <w:rPr>
+          <w:rFonts w:ascii="Courier New" w:cs="Courier New" w:eastAsia="Courier New" w:hAnsi="Courier New"/>
+          <w:sz w:val="17"/>
+          <w:szCs w:val="17"/>
+        </w:rPr>
+        <w:t xml:space="preserve">Index value 5 out of range: only 2 elements</w:t>
+      </w:r>
+    </w:p>
+    <w:p>
+      <w:pPr>
+        <w:spacing w:after="200" w:before="60"/>
+      </w:pPr>
+      <w:r>
+        <w:rPr>
+          <w:rFonts w:ascii="Arial" w:cs="Arial" w:eastAsia="Arial" w:hAnsi="Arial"/>
+          <w:b/>
+          <w:bCs/>
+          <w:sz w:val="18"/>
+          <w:szCs w:val="18"/>
+        </w:rPr>
+        <w:t xml:space="preserve">Figure 57. </w:t>
       </w:r>
       <w:r>
         <w:rPr>
@@ -26841,7 +27922,7 @@
           <w:sz w:val="18"/>
           <w:szCs w:val="18"/>
         </w:rPr>
-        <w:t xml:space="preserve">Figure 55. </w:t>
+        <w:t xml:space="preserve">Figure 58. </w:t>
       </w:r>
       <w:r>
         <w:rPr>
@@ -27147,7 +28228,7 @@
           <w:sz w:val="18"/>
           <w:szCs w:val="18"/>
         </w:rPr>
-        <w:t xml:space="preserve">Figure 56. </w:t>
+        <w:t xml:space="preserve">Figure 59. </w:t>
       </w:r>
       <w:r>
         <w:rPr>
@@ -27529,7 +28610,7 @@
           <w:sz w:val="18"/>
           <w:szCs w:val="18"/>
         </w:rPr>
-        <w:t xml:space="preserve">Figure 57. </w:t>
+        <w:t xml:space="preserve">Figure 60. </w:t>
       </w:r>
       <w:r>
         <w:rPr>
@@ -27856,7 +28937,7 @@
           <w:sz w:val="18"/>
           <w:szCs w:val="18"/>
         </w:rPr>
-        <w:t xml:space="preserve">Figure 58. </w:t>
+        <w:t xml:space="preserve">Figure 61. </w:t>
       </w:r>
       <w:r>
         <w:rPr>
@@ -27884,7 +28965,7 @@
           <w:sz w:val="32"/>
           <w:szCs w:val="32"/>
         </w:rPr>
-        <w:t xml:space="preserve">Chapter 10. Reflection and the System</w:t>
+        <w:t xml:space="preserve">Chapter 11. Reflection and the System</w:t>
       </w:r>
     </w:p>
     <w:p>
@@ -28564,7 +29645,7 @@
           <w:sz w:val="18"/>
           <w:szCs w:val="18"/>
         </w:rPr>
-        <w:t xml:space="preserve">Figure 59. </w:t>
+        <w:t xml:space="preserve">Figure 62. </w:t>
       </w:r>
       <w:r>
         <w:rPr>
@@ -29182,7 +30263,7 @@
           <w:sz w:val="18"/>
           <w:szCs w:val="18"/>
         </w:rPr>
-        <w:t xml:space="preserve">Figure 60. </w:t>
+        <w:t xml:space="preserve">Figure 63. </w:t>
       </w:r>
       <w:r>
         <w:rPr>
@@ -29543,7 +30624,7 @@
           <w:sz w:val="18"/>
           <w:szCs w:val="18"/>
         </w:rPr>
-        <w:t xml:space="preserve">Figure 61. </w:t>
+        <w:t xml:space="preserve">Figure 64. </w:t>
       </w:r>
       <w:r>
         <w:rPr>
@@ -29613,7 +30694,7 @@
           <w:sz w:val="32"/>
           <w:szCs w:val="32"/>
         </w:rPr>
-        <w:t xml:space="preserve">Chapter 11. Errors and Traces</w:t>
+        <w:t xml:space="preserve">Chapter 12. Errors and Traces</w:t>
       </w:r>
     </w:p>
     <w:p>
@@ -29953,7 +31034,7 @@
           <w:sz w:val="18"/>
           <w:szCs w:val="18"/>
         </w:rPr>
-        <w:t xml:space="preserve">Figure 62. </w:t>
+        <w:t xml:space="preserve">Figure 65. </w:t>
       </w:r>
       <w:r>
         <w:rPr>
@@ -30794,7 +31875,7 @@
           <w:sz w:val="18"/>
           <w:szCs w:val="18"/>
         </w:rPr>
-        <w:t xml:space="preserve">Figure 63. </w:t>
+        <w:t xml:space="preserve">Figure 66. </w:t>
       </w:r>
       <w:r>
         <w:rPr>
@@ -30851,7 +31932,7 @@
           <w:sz w:val="32"/>
           <w:szCs w:val="32"/>
         </w:rPr>
-        <w:t xml:space="preserve">Chapter 12. How Smalltalk/CREXX Works</w:t>
+        <w:t xml:space="preserve">Chapter 13. How Smalltalk/CREXX Works</w:t>
       </w:r>
     </w:p>
     <w:p>
@@ -31159,7 +32240,7 @@
           <w:sz w:val="32"/>
           <w:szCs w:val="32"/>
         </w:rPr>
-        <w:t xml:space="preserve">Chapter 13. Restrictions and Known Problems</w:t>
+        <w:t xml:space="preserve">Chapter 14. Restrictions and Known Problems</w:t>
       </w:r>
     </w:p>
     <w:p>
@@ -31271,7 +32352,7 @@
           <w:sz w:val="20"/>
           <w:szCs w:val="20"/>
         </w:rPr>
-        <w:t xml:space="preserve"> The interpreter is a program running on a virtual machine. About 300 thousand simple sends per second can be expected; a million-iteration loop takes a few seconds. Large-integer arithmetic works on decimal strings and is slow for numbers of thousands of digits.</w:t>
+        <w:t xml:space="preserve"> The interpreter is a program running on a virtual machine. About one million simple sends per second can be expected, and a million-iteration loop with a simple body takes about a second; the start-up, which reads the library, takes a second or two. The directory bench of the repository holds the benchmarks (bench/run_bench.sh) used to measure speed. Speed depends mostly on the number of global variables of the interpreter, because the CREXX virtual machine relinks all of them at every procedure call; build.py therefore packs the interpreter's arrays and variables into a few container arrays (src/pack.txt). Large-integer arithmetic works on decimal strings and is slow for numbers of thousands of digits.</w:t>
       </w:r>
     </w:p>
     <w:p>
@@ -31651,7 +32732,7 @@
           <w:sz w:val="18"/>
           <w:szCs w:val="18"/>
         </w:rPr>
-        <w:t xml:space="preserve">Figure 64. </w:t>
+        <w:t xml:space="preserve">Figure 67. </w:t>
       </w:r>
       <w:r>
         <w:rPr>
@@ -32426,7 +33507,7 @@
           <w:sz w:val="18"/>
           <w:szCs w:val="18"/>
         </w:rPr>
-        <w:t xml:space="preserve">Figure 65. </w:t>
+        <w:t xml:space="preserve">Figure 68. </w:t>
       </w:r>
       <w:r>
         <w:rPr>
@@ -33584,7 +34665,7 @@
           <w:sz w:val="18"/>
           <w:szCs w:val="18"/>
         </w:rPr>
-        <w:t xml:space="preserve">Figure 66. </w:t>
+        <w:t xml:space="preserve">Figure 69. </w:t>
       </w:r>
       <w:r>
         <w:rPr>
@@ -33605,7 +34686,7 @@
           <w:sz w:val="20"/>
           <w:szCs w:val="20"/>
         </w:rPr>
-        <w:t xml:space="preserve">Exception classes are shown in Chapter 9.</w:t>
+        <w:t xml:space="preserve">Exception classes are shown in Chapter 10.</w:t>
       </w:r>
     </w:p>
     <w:p>
@@ -34302,7 +35383,7 @@
           <w:sz w:val="18"/>
           <w:szCs w:val="18"/>
         </w:rPr>
-        <w:t xml:space="preserve">Figure 67. </w:t>
+        <w:t xml:space="preserve">Figure 70. </w:t>
       </w:r>
       <w:r>
         <w:rPr>

</xml_diff>

<commit_message>
Add cooperative processes (Process, Processor, Semaphore, SharedQueue, Delay), Eval scheduling, manual chapters for SUnit/processes/contexts
Co-Authored-By: Claude Sonnet 5.5 <noreply@anthropic.com>
Claude-Session: https://claude.ai/code/session_013PfZHD8os4FWhvmVG9Tf7M
</commit_message>
<xml_diff>
--- a/docs/Smalltalk-CREXX-Guide.docx
+++ b/docs/Smalltalk-CREXX-Guide.docx
@@ -1697,7 +1697,7 @@
           <w:sz w:val="19"/>
           <w:szCs w:val="19"/>
         </w:rPr>
-        <w:t xml:space="preserve">Chapter 10. Exceptions	32</w:t>
+        <w:t xml:space="preserve">Chapter 10. Testing with SUnit	32</w:t>
       </w:r>
     </w:p>
     <w:p>
@@ -1716,7 +1716,7 @@
           <w:sz w:val="18"/>
           <w:szCs w:val="18"/>
         </w:rPr>
-        <w:t xml:space="preserve">Handling	32</w:t>
+        <w:t xml:space="preserve">Writing tests	32</w:t>
       </w:r>
     </w:p>
     <w:p>
@@ -1735,7 +1735,26 @@
           <w:sz w:val="18"/>
           <w:szCs w:val="18"/>
         </w:rPr>
-        <w:t xml:space="preserve">Messages understood by an exception	32</w:t>
+        <w:t xml:space="preserve">Running tests	32</w:t>
+      </w:r>
+    </w:p>
+    <w:p>
+      <w:pPr>
+        <w:tabs>
+          <w:tab w:val="right" w:pos="9638" w:leader="dot"/>
+        </w:tabs>
+        <w:spacing w:after="20" w:before="100"/>
+        <w:ind w:left="0"/>
+      </w:pPr>
+      <w:r>
+        <w:rPr>
+          <w:rFonts w:ascii="Arial" w:cs="Arial" w:eastAsia="Arial" w:hAnsi="Arial"/>
+          <w:b/>
+          <w:bCs/>
+          <w:sz w:val="19"/>
+          <w:szCs w:val="19"/>
+        </w:rPr>
+        <w:t xml:space="preserve">Chapter 11. Processes	33</w:t>
       </w:r>
     </w:p>
     <w:p>
@@ -1754,7 +1773,7 @@
           <w:sz w:val="18"/>
           <w:szCs w:val="18"/>
         </w:rPr>
-        <w:t xml:space="preserve">Signaling	32</w:t>
+        <w:t xml:space="preserve">Starting processes	33</w:t>
       </w:r>
     </w:p>
     <w:p>
@@ -1773,7 +1792,26 @@
           <w:sz w:val="18"/>
           <w:szCs w:val="18"/>
         </w:rPr>
-        <w:t xml:space="preserve">Cleaning up	33</w:t>
+        <w:t xml:space="preserve">Semaphores, queues and delays	33</w:t>
+      </w:r>
+    </w:p>
+    <w:p>
+      <w:pPr>
+        <w:tabs>
+          <w:tab w:val="right" w:pos="9638" w:leader="dot"/>
+        </w:tabs>
+        <w:spacing w:after="20" w:before="100"/>
+        <w:ind w:left="0"/>
+      </w:pPr>
+      <w:r>
+        <w:rPr>
+          <w:rFonts w:ascii="Arial" w:cs="Arial" w:eastAsia="Arial" w:hAnsi="Arial"/>
+          <w:b/>
+          <w:bCs/>
+          <w:sz w:val="19"/>
+          <w:szCs w:val="19"/>
+        </w:rPr>
+        <w:t xml:space="preserve">Chapter 12. Exceptions	34</w:t>
       </w:r>
     </w:p>
     <w:p>
@@ -1792,7 +1830,83 @@
           <w:sz w:val="18"/>
           <w:szCs w:val="18"/>
         </w:rPr>
-        <w:t xml:space="preserve">Your own exceptions	33</w:t>
+        <w:t xml:space="preserve">Handling	34</w:t>
+      </w:r>
+    </w:p>
+    <w:p>
+      <w:pPr>
+        <w:tabs>
+          <w:tab w:val="right" w:pos="9638" w:leader="dot"/>
+        </w:tabs>
+        <w:spacing w:after="0" w:before="0"/>
+        <w:ind w:left="360"/>
+      </w:pPr>
+      <w:r>
+        <w:rPr>
+          <w:rFonts w:ascii="Arial" w:cs="Arial" w:eastAsia="Arial" w:hAnsi="Arial"/>
+          <w:b w:val="false"/>
+          <w:bCs w:val="false"/>
+          <w:sz w:val="18"/>
+          <w:szCs w:val="18"/>
+        </w:rPr>
+        <w:t xml:space="preserve">Messages understood by an exception	34</w:t>
+      </w:r>
+    </w:p>
+    <w:p>
+      <w:pPr>
+        <w:tabs>
+          <w:tab w:val="right" w:pos="9638" w:leader="dot"/>
+        </w:tabs>
+        <w:spacing w:after="0" w:before="0"/>
+        <w:ind w:left="360"/>
+      </w:pPr>
+      <w:r>
+        <w:rPr>
+          <w:rFonts w:ascii="Arial" w:cs="Arial" w:eastAsia="Arial" w:hAnsi="Arial"/>
+          <w:b w:val="false"/>
+          <w:bCs w:val="false"/>
+          <w:sz w:val="18"/>
+          <w:szCs w:val="18"/>
+        </w:rPr>
+        <w:t xml:space="preserve">Signaling	34</w:t>
+      </w:r>
+    </w:p>
+    <w:p>
+      <w:pPr>
+        <w:tabs>
+          <w:tab w:val="right" w:pos="9638" w:leader="dot"/>
+        </w:tabs>
+        <w:spacing w:after="0" w:before="0"/>
+        <w:ind w:left="360"/>
+      </w:pPr>
+      <w:r>
+        <w:rPr>
+          <w:rFonts w:ascii="Arial" w:cs="Arial" w:eastAsia="Arial" w:hAnsi="Arial"/>
+          <w:b w:val="false"/>
+          <w:bCs w:val="false"/>
+          <w:sz w:val="18"/>
+          <w:szCs w:val="18"/>
+        </w:rPr>
+        <w:t xml:space="preserve">Cleaning up	35</w:t>
+      </w:r>
+    </w:p>
+    <w:p>
+      <w:pPr>
+        <w:tabs>
+          <w:tab w:val="right" w:pos="9638" w:leader="dot"/>
+        </w:tabs>
+        <w:spacing w:after="0" w:before="0"/>
+        <w:ind w:left="360"/>
+      </w:pPr>
+      <w:r>
+        <w:rPr>
+          <w:rFonts w:ascii="Arial" w:cs="Arial" w:eastAsia="Arial" w:hAnsi="Arial"/>
+          <w:b w:val="false"/>
+          <w:bCs w:val="false"/>
+          <w:sz w:val="18"/>
+          <w:szCs w:val="18"/>
+        </w:rPr>
+        <w:t xml:space="preserve">Your own exceptions	35</w:t>
       </w:r>
     </w:p>
     <w:p>
@@ -1811,7 +1925,7 @@
           <w:sz w:val="19"/>
           <w:szCs w:val="19"/>
         </w:rPr>
-        <w:t xml:space="preserve">Chapter 11. Reflection and the System	34</w:t>
+        <w:t xml:space="preserve">Chapter 13. Reflection and the System	36</w:t>
       </w:r>
     </w:p>
     <w:p>
@@ -1830,7 +1944,7 @@
           <w:sz w:val="18"/>
           <w:szCs w:val="18"/>
         </w:rPr>
-        <w:t xml:space="preserve">Asking about objects	34</w:t>
+        <w:t xml:space="preserve">Asking about objects	36</w:t>
       </w:r>
     </w:p>
     <w:p>
@@ -1849,7 +1963,7 @@
           <w:sz w:val="18"/>
           <w:szCs w:val="18"/>
         </w:rPr>
-        <w:t xml:space="preserve">Asking about classes	34</w:t>
+        <w:t xml:space="preserve">Asking about classes	36</w:t>
       </w:r>
     </w:p>
     <w:p>
@@ -1868,7 +1982,26 @@
           <w:sz w:val="18"/>
           <w:szCs w:val="18"/>
         </w:rPr>
-        <w:t xml:space="preserve">The Smalltalk dictionary	34</w:t>
+        <w:t xml:space="preserve">The Smalltalk dictionary	36</w:t>
+      </w:r>
+    </w:p>
+    <w:p>
+      <w:pPr>
+        <w:tabs>
+          <w:tab w:val="right" w:pos="9638" w:leader="dot"/>
+        </w:tabs>
+        <w:spacing w:after="0" w:before="0"/>
+        <w:ind w:left="360"/>
+      </w:pPr>
+      <w:r>
+        <w:rPr>
+          <w:rFonts w:ascii="Arial" w:cs="Arial" w:eastAsia="Arial" w:hAnsi="Arial"/>
+          <w:b w:val="false"/>
+          <w:bCs w:val="false"/>
+          <w:sz w:val="18"/>
+          <w:szCs w:val="18"/>
+        </w:rPr>
+        <w:t xml:space="preserve">Contexts and compiling at run time	37</w:t>
       </w:r>
     </w:p>
     <w:p>
@@ -1887,7 +2020,7 @@
           <w:sz w:val="19"/>
           <w:szCs w:val="19"/>
         </w:rPr>
-        <w:t xml:space="preserve">Chapter 12. Errors and Traces	36</w:t>
+        <w:t xml:space="preserve">Chapter 14. Errors and Traces	38</w:t>
       </w:r>
     </w:p>
     <w:p>
@@ -1906,7 +2039,7 @@
           <w:sz w:val="18"/>
           <w:szCs w:val="18"/>
         </w:rPr>
-        <w:t xml:space="preserve">Unhandled errors	36</w:t>
+        <w:t xml:space="preserve">Unhandled errors	38</w:t>
       </w:r>
     </w:p>
     <w:p>
@@ -1925,7 +2058,7 @@
           <w:sz w:val="18"/>
           <w:szCs w:val="18"/>
         </w:rPr>
-        <w:t xml:space="preserve">Common messages	36</w:t>
+        <w:t xml:space="preserve">Common messages	38</w:t>
       </w:r>
     </w:p>
     <w:p>
@@ -1944,7 +2077,7 @@
           <w:sz w:val="18"/>
           <w:szCs w:val="18"/>
         </w:rPr>
-        <w:t xml:space="preserve">Parse errors	36</w:t>
+        <w:t xml:space="preserve">Parse errors	38</w:t>
       </w:r>
     </w:p>
     <w:p>
@@ -1963,7 +2096,7 @@
           <w:sz w:val="19"/>
           <w:szCs w:val="19"/>
         </w:rPr>
-        <w:t xml:space="preserve">Chapter 13. How Smalltalk/CREXX Works	37</w:t>
+        <w:t xml:space="preserve">Chapter 15. How Smalltalk/CREXX Works	39</w:t>
       </w:r>
     </w:p>
     <w:p>
@@ -1982,7 +2115,7 @@
           <w:sz w:val="18"/>
           <w:szCs w:val="18"/>
         </w:rPr>
-        <w:t xml:space="preserve">Objects	37</w:t>
+        <w:t xml:space="preserve">Objects	39</w:t>
       </w:r>
     </w:p>
     <w:p>
@@ -2001,7 +2134,7 @@
           <w:sz w:val="18"/>
           <w:szCs w:val="18"/>
         </w:rPr>
-        <w:t xml:space="preserve">Classes and methods	37</w:t>
+        <w:t xml:space="preserve">Classes and methods	39</w:t>
       </w:r>
     </w:p>
     <w:p>
@@ -2020,7 +2153,7 @@
           <w:sz w:val="18"/>
           <w:szCs w:val="18"/>
         </w:rPr>
-        <w:t xml:space="preserve">The resolver	37</w:t>
+        <w:t xml:space="preserve">The resolver	39</w:t>
       </w:r>
     </w:p>
     <w:p>
@@ -2039,7 +2172,7 @@
           <w:sz w:val="18"/>
           <w:szCs w:val="18"/>
         </w:rPr>
-        <w:t xml:space="preserve">The evaluator	37</w:t>
+        <w:t xml:space="preserve">The evaluator	39</w:t>
       </w:r>
     </w:p>
     <w:p>
@@ -2058,7 +2191,7 @@
           <w:sz w:val="18"/>
           <w:szCs w:val="18"/>
         </w:rPr>
-        <w:t xml:space="preserve">Primitives	37</w:t>
+        <w:t xml:space="preserve">Primitives	39</w:t>
       </w:r>
     </w:p>
     <w:p>
@@ -2077,7 +2210,7 @@
           <w:sz w:val="18"/>
           <w:szCs w:val="18"/>
         </w:rPr>
-        <w:t xml:space="preserve">Adding a primitive	37</w:t>
+        <w:t xml:space="preserve">Adding a primitive	39</w:t>
       </w:r>
     </w:p>
     <w:p>
@@ -2096,7 +2229,7 @@
           <w:sz w:val="18"/>
           <w:szCs w:val="18"/>
         </w:rPr>
-        <w:t xml:space="preserve">The build	38</w:t>
+        <w:t xml:space="preserve">The build	40</w:t>
       </w:r>
     </w:p>
     <w:p>
@@ -2115,7 +2248,7 @@
           <w:sz w:val="19"/>
           <w:szCs w:val="19"/>
         </w:rPr>
-        <w:t xml:space="preserve">Chapter 14. Restrictions and Known Problems	39</w:t>
+        <w:t xml:space="preserve">Chapter 16. Restrictions and Known Problems	41</w:t>
       </w:r>
     </w:p>
     <w:p>
@@ -2134,7 +2267,7 @@
           <w:sz w:val="19"/>
           <w:szCs w:val="19"/>
         </w:rPr>
-        <w:t xml:space="preserve">Appendix A. Command Summary	40</w:t>
+        <w:t xml:space="preserve">Appendix A. Command Summary	42</w:t>
       </w:r>
     </w:p>
     <w:p>
@@ -2153,7 +2286,7 @@
           <w:sz w:val="19"/>
           <w:szCs w:val="19"/>
         </w:rPr>
-        <w:t xml:space="preserve">Appendix B. Contents of the Repository	41</w:t>
+        <w:t xml:space="preserve">Appendix B. Contents of the Repository	43</w:t>
       </w:r>
     </w:p>
     <w:p>
@@ -2172,7 +2305,7 @@
           <w:sz w:val="19"/>
           <w:szCs w:val="19"/>
         </w:rPr>
-        <w:t xml:space="preserve">Appendix C. Class Hierarchy	42</w:t>
+        <w:t xml:space="preserve">Appendix C. Class Hierarchy	44</w:t>
       </w:r>
     </w:p>
     <w:p>
@@ -2191,7 +2324,7 @@
           <w:sz w:val="19"/>
           <w:szCs w:val="19"/>
         </w:rPr>
-        <w:t xml:space="preserve">Appendix D. Sample Programs	43</w:t>
+        <w:t xml:space="preserve">Appendix D. Sample Programs	45</w:t>
       </w:r>
     </w:p>
     <w:p>
@@ -2537,7 +2670,7 @@
           <w:sz w:val="20"/>
           <w:szCs w:val="20"/>
         </w:rPr>
-        <w:t xml:space="preserve">Chapter 10, Exceptions</w:t>
+        <w:t xml:space="preserve">Chapter 10, Testing with SUnit</w:t>
       </w:r>
       <w:r>
         <w:rPr>
@@ -2545,7 +2678,7 @@
           <w:sz w:val="20"/>
           <w:szCs w:val="20"/>
         </w:rPr>
-        <w:t xml:space="preserve">, describes on:do:, ensure:, signal, retry, resume and the exception classes.</w:t>
+        <w:t xml:space="preserve">, describes TestCase, TestSuite and TestResult.</w:t>
       </w:r>
     </w:p>
     <w:p>
@@ -2565,7 +2698,7 @@
           <w:sz w:val="20"/>
           <w:szCs w:val="20"/>
         </w:rPr>
-        <w:t xml:space="preserve">Chapter 11, Reflection and the System</w:t>
+        <w:t xml:space="preserve">Chapter 11, Processes</w:t>
       </w:r>
       <w:r>
         <w:rPr>
@@ -2573,7 +2706,7 @@
           <w:sz w:val="20"/>
           <w:szCs w:val="20"/>
         </w:rPr>
-        <w:t xml:space="preserve">, covers the Smalltalk dictionary, perform: and the class protocol.</w:t>
+        <w:t xml:space="preserve">, describes Process, Processor, Semaphore, SharedQueue and Delay.</w:t>
       </w:r>
     </w:p>
     <w:p>
@@ -2593,7 +2726,7 @@
           <w:sz w:val="20"/>
           <w:szCs w:val="20"/>
         </w:rPr>
-        <w:t xml:space="preserve">Chapter 12, Errors and Traces</w:t>
+        <w:t xml:space="preserve">Chapter 12, Exceptions</w:t>
       </w:r>
       <w:r>
         <w:rPr>
@@ -2601,7 +2734,7 @@
           <w:sz w:val="20"/>
           <w:szCs w:val="20"/>
         </w:rPr>
-        <w:t xml:space="preserve">, shows what the interpreter prints for an unhandled error.</w:t>
+        <w:t xml:space="preserve">, describes on:do:, ensure:, signal, retry, resume and the exception classes.</w:t>
       </w:r>
     </w:p>
     <w:p>
@@ -2621,7 +2754,7 @@
           <w:sz w:val="20"/>
           <w:szCs w:val="20"/>
         </w:rPr>
-        <w:t xml:space="preserve">Chapter 13, How Smalltalk/CREXX Works</w:t>
+        <w:t xml:space="preserve">Chapter 13, Reflection and the System</w:t>
       </w:r>
       <w:r>
         <w:rPr>
@@ -2629,7 +2762,7 @@
           <w:sz w:val="20"/>
           <w:szCs w:val="20"/>
         </w:rPr>
-        <w:t xml:space="preserve">, describes the object table, the resolver, the evaluator and the primitives for those who wish to extend the interpreter.</w:t>
+        <w:t xml:space="preserve">, covers the Smalltalk dictionary, perform: and the class protocol.</w:t>
       </w:r>
     </w:p>
     <w:p>
@@ -2649,7 +2782,7 @@
           <w:sz w:val="20"/>
           <w:szCs w:val="20"/>
         </w:rPr>
-        <w:t xml:space="preserve">Chapter 14, Restrictions and Known Problems</w:t>
+        <w:t xml:space="preserve">Chapter 14, Errors and Traces</w:t>
       </w:r>
       <w:r>
         <w:rPr>
@@ -2657,7 +2790,7 @@
           <w:sz w:val="20"/>
           <w:szCs w:val="20"/>
         </w:rPr>
-        <w:t xml:space="preserve">, lists what does not work yet.</w:t>
+        <w:t xml:space="preserve">, shows what the interpreter prints for an unhandled error.</w:t>
       </w:r>
     </w:p>
     <w:p>
@@ -2677,7 +2810,7 @@
           <w:sz w:val="20"/>
           <w:szCs w:val="20"/>
         </w:rPr>
-        <w:t xml:space="preserve">Appendix A</w:t>
+        <w:t xml:space="preserve">Chapter 15, How Smalltalk/CREXX Works</w:t>
       </w:r>
       <w:r>
         <w:rPr>
@@ -2685,149 +2818,7 @@
           <w:sz w:val="20"/>
           <w:szCs w:val="20"/>
         </w:rPr>
-        <w:t xml:space="preserve"> summarizes the command line, </w:t>
-      </w:r>
-      <w:r>
-        <w:rPr>
-          <w:rFonts w:ascii="Arial" w:cs="Arial" w:eastAsia="Arial" w:hAnsi="Arial"/>
-          <w:b/>
-          <w:bCs/>
-          <w:sz w:val="20"/>
-          <w:szCs w:val="20"/>
-        </w:rPr>
-        <w:t xml:space="preserve">Appendix B</w:t>
-      </w:r>
-      <w:r>
-        <w:rPr>
-          <w:rFonts w:ascii="Arial" w:cs="Arial" w:eastAsia="Arial" w:hAnsi="Arial"/>
-          <w:sz w:val="20"/>
-          <w:szCs w:val="20"/>
-        </w:rPr>
-        <w:t xml:space="preserve"> lists the files of the repository, </w:t>
-      </w:r>
-      <w:r>
-        <w:rPr>
-          <w:rFonts w:ascii="Arial" w:cs="Arial" w:eastAsia="Arial" w:hAnsi="Arial"/>
-          <w:b/>
-          <w:bCs/>
-          <w:sz w:val="20"/>
-          <w:szCs w:val="20"/>
-        </w:rPr>
-        <w:t xml:space="preserve">Appendix C</w:t>
-      </w:r>
-      <w:r>
-        <w:rPr>
-          <w:rFonts w:ascii="Arial" w:cs="Arial" w:eastAsia="Arial" w:hAnsi="Arial"/>
-          <w:sz w:val="20"/>
-          <w:szCs w:val="20"/>
-        </w:rPr>
-        <w:t xml:space="preserve"> shows the class hierarchy, </w:t>
-      </w:r>
-      <w:r>
-        <w:rPr>
-          <w:rFonts w:ascii="Arial" w:cs="Arial" w:eastAsia="Arial" w:hAnsi="Arial"/>
-          <w:b/>
-          <w:bCs/>
-          <w:sz w:val="20"/>
-          <w:szCs w:val="20"/>
-        </w:rPr>
-        <w:t xml:space="preserve">Appendix D</w:t>
-      </w:r>
-      <w:r>
-        <w:rPr>
-          <w:rFonts w:ascii="Arial" w:cs="Arial" w:eastAsia="Arial" w:hAnsi="Arial"/>
-          <w:sz w:val="20"/>
-          <w:szCs w:val="20"/>
-        </w:rPr>
-        <w:t xml:space="preserve"> lists the sample programs.</w:t>
-      </w:r>
-    </w:p>
-    <w:p>
-      <w:pPr>
-        <w:pStyle w:val="Heading2"/>
-        <w:keepNext/>
-      </w:pPr>
-      <w:r>
-        <w:rPr>
-          <w:rFonts w:ascii="Arial" w:cs="Arial" w:eastAsia="Arial" w:hAnsi="Arial"/>
-          <w:b/>
-          <w:bCs/>
-          <w:sz w:val="24"/>
-          <w:szCs w:val="24"/>
-        </w:rPr>
-        <w:t xml:space="preserve">Conventions</w:t>
-      </w:r>
-    </w:p>
-    <w:p>
-      <w:pPr>
-        <w:spacing w:after="120" w:line="264"/>
-      </w:pPr>
-      <w:r>
-        <w:rPr>
-          <w:rFonts w:ascii="Arial" w:cs="Arial" w:eastAsia="Arial" w:hAnsi="Arial"/>
-          <w:sz w:val="20"/>
-          <w:szCs w:val="20"/>
-        </w:rPr>
-        <w:t xml:space="preserve">Program text is shown in monospaced type. In syntax descriptions, words in italics stand for values you supply and items in square brackets [ ] are optional. Smalltalk names are case sensitive: Total and total are different variables. By convention class names begin with a capital letter and variable and message names with a lower-case letter.</w:t>
-      </w:r>
-    </w:p>
-    <w:p>
-      <w:pPr>
-        <w:spacing w:after="120" w:line="264"/>
-      </w:pPr>
-      <w:r>
-        <w:rPr>
-          <w:rFonts w:ascii="Arial" w:cs="Arial" w:eastAsia="Arial" w:hAnsi="Arial"/>
-          <w:sz w:val="20"/>
-          <w:szCs w:val="20"/>
-        </w:rPr>
-        <w:t xml:space="preserve">Examples of programs are shown in framed figures. In a figure that shows a run, the output of the interpreter follows the program text.</w:t>
-      </w:r>
-    </w:p>
-    <w:p>
-      <w:pPr>
-        <w:pStyle w:val="Heading1"/>
-        <w:pageBreakBefore/>
-        <w:pBdr>
-          <w:bottom w:val="single" w:color="000000" w:sz="12" w:space="4"/>
-        </w:pBdr>
-        <w:spacing w:after="240" w:before="0"/>
-      </w:pPr>
-      <w:r>
-        <w:rPr>
-          <w:rFonts w:ascii="Arial" w:cs="Arial" w:eastAsia="Arial" w:hAnsi="Arial"/>
-          <w:b/>
-          <w:bCs/>
-          <w:sz w:val="32"/>
-          <w:szCs w:val="32"/>
-        </w:rPr>
-        <w:t xml:space="preserve">Chapter 1. Introduction</w:t>
-      </w:r>
-    </w:p>
-    <w:p>
-      <w:pPr>
-        <w:spacing w:after="120" w:line="264"/>
-      </w:pPr>
-      <w:r>
-        <w:rPr>
-          <w:rFonts w:ascii="Arial" w:cs="Arial" w:eastAsia="Arial" w:hAnsi="Arial"/>
-          <w:sz w:val="20"/>
-          <w:szCs w:val="20"/>
-        </w:rPr>
-        <w:t xml:space="preserve">Smalltalk/CREXX is a Smalltalk-80 interpreter written in CREXX, the open-source REXX implementation. It runs programs written in the bracket syntax of GNU Smalltalk: classes are declared with Object subclass: Foo [ ... ], methods are written inside the class body, and statements at the top level are run one after the other. The interpreter is a single CREXX source file, smalltalk.crexx, written in CREXX Level B, the statically typed level of the language, and a class library written in Smalltalk itself.</w:t>
-      </w:r>
-    </w:p>
-    <w:p>
-      <w:pPr>
-        <w:spacing w:after="120" w:line="264"/>
-      </w:pPr>
-      <w:r>
-        <w:rPr>
-          <w:rFonts w:ascii="Arial" w:cs="Arial" w:eastAsia="Arial" w:hAnsi="Arial"/>
-          <w:sz w:val="20"/>
-          <w:szCs w:val="20"/>
-        </w:rPr>
-        <w:t xml:space="preserve">Smalltalk/CREXX gives its users:</w:t>
+        <w:t xml:space="preserve">, describes the object table, the resolver, the evaluator and the primitives for those who wish to extend the interpreter.</w:t>
       </w:r>
     </w:p>
     <w:p>
@@ -2847,7 +2838,7 @@
           <w:sz w:val="20"/>
           <w:szCs w:val="20"/>
         </w:rPr>
-        <w:t xml:space="preserve">A pure object model.</w:t>
+        <w:t xml:space="preserve">Chapter 16, Restrictions and Known Problems</w:t>
       </w:r>
       <w:r>
         <w:rPr>
@@ -2855,7 +2846,7 @@
           <w:sz w:val="20"/>
           <w:szCs w:val="20"/>
         </w:rPr>
-        <w:t xml:space="preserve"> Everything is an object: integers, characters, classes and blocks. All computation is by sending messages, and the only control structures are messages to booleans, blocks and numbers.</w:t>
+        <w:t xml:space="preserve">, lists what does not work yet.</w:t>
       </w:r>
     </w:p>
     <w:p>
@@ -2875,7 +2866,7 @@
           <w:sz w:val="20"/>
           <w:szCs w:val="20"/>
         </w:rPr>
-        <w:t xml:space="preserve">Classes and metaclasses.</w:t>
+        <w:t xml:space="preserve">Appendix A</w:t>
       </w:r>
       <w:r>
         <w:rPr>
@@ -2883,7 +2874,149 @@
           <w:sz w:val="20"/>
           <w:szCs w:val="20"/>
         </w:rPr>
-        <w:t xml:space="preserve"> Every class is an instance of its metaclass; class-side methods, class variables and class-side instance variables are all supported.</w:t>
+        <w:t xml:space="preserve"> summarizes the command line, </w:t>
+      </w:r>
+      <w:r>
+        <w:rPr>
+          <w:rFonts w:ascii="Arial" w:cs="Arial" w:eastAsia="Arial" w:hAnsi="Arial"/>
+          <w:b/>
+          <w:bCs/>
+          <w:sz w:val="20"/>
+          <w:szCs w:val="20"/>
+        </w:rPr>
+        <w:t xml:space="preserve">Appendix B</w:t>
+      </w:r>
+      <w:r>
+        <w:rPr>
+          <w:rFonts w:ascii="Arial" w:cs="Arial" w:eastAsia="Arial" w:hAnsi="Arial"/>
+          <w:sz w:val="20"/>
+          <w:szCs w:val="20"/>
+        </w:rPr>
+        <w:t xml:space="preserve"> lists the files of the repository, </w:t>
+      </w:r>
+      <w:r>
+        <w:rPr>
+          <w:rFonts w:ascii="Arial" w:cs="Arial" w:eastAsia="Arial" w:hAnsi="Arial"/>
+          <w:b/>
+          <w:bCs/>
+          <w:sz w:val="20"/>
+          <w:szCs w:val="20"/>
+        </w:rPr>
+        <w:t xml:space="preserve">Appendix C</w:t>
+      </w:r>
+      <w:r>
+        <w:rPr>
+          <w:rFonts w:ascii="Arial" w:cs="Arial" w:eastAsia="Arial" w:hAnsi="Arial"/>
+          <w:sz w:val="20"/>
+          <w:szCs w:val="20"/>
+        </w:rPr>
+        <w:t xml:space="preserve"> shows the class hierarchy, </w:t>
+      </w:r>
+      <w:r>
+        <w:rPr>
+          <w:rFonts w:ascii="Arial" w:cs="Arial" w:eastAsia="Arial" w:hAnsi="Arial"/>
+          <w:b/>
+          <w:bCs/>
+          <w:sz w:val="20"/>
+          <w:szCs w:val="20"/>
+        </w:rPr>
+        <w:t xml:space="preserve">Appendix D</w:t>
+      </w:r>
+      <w:r>
+        <w:rPr>
+          <w:rFonts w:ascii="Arial" w:cs="Arial" w:eastAsia="Arial" w:hAnsi="Arial"/>
+          <w:sz w:val="20"/>
+          <w:szCs w:val="20"/>
+        </w:rPr>
+        <w:t xml:space="preserve"> lists the sample programs.</w:t>
+      </w:r>
+    </w:p>
+    <w:p>
+      <w:pPr>
+        <w:pStyle w:val="Heading2"/>
+        <w:keepNext/>
+      </w:pPr>
+      <w:r>
+        <w:rPr>
+          <w:rFonts w:ascii="Arial" w:cs="Arial" w:eastAsia="Arial" w:hAnsi="Arial"/>
+          <w:b/>
+          <w:bCs/>
+          <w:sz w:val="24"/>
+          <w:szCs w:val="24"/>
+        </w:rPr>
+        <w:t xml:space="preserve">Conventions</w:t>
+      </w:r>
+    </w:p>
+    <w:p>
+      <w:pPr>
+        <w:spacing w:after="120" w:line="264"/>
+      </w:pPr>
+      <w:r>
+        <w:rPr>
+          <w:rFonts w:ascii="Arial" w:cs="Arial" w:eastAsia="Arial" w:hAnsi="Arial"/>
+          <w:sz w:val="20"/>
+          <w:szCs w:val="20"/>
+        </w:rPr>
+        <w:t xml:space="preserve">Program text is shown in monospaced type. In syntax descriptions, words in italics stand for values you supply and items in square brackets [ ] are optional. Smalltalk names are case sensitive: Total and total are different variables. By convention class names begin with a capital letter and variable and message names with a lower-case letter.</w:t>
+      </w:r>
+    </w:p>
+    <w:p>
+      <w:pPr>
+        <w:spacing w:after="120" w:line="264"/>
+      </w:pPr>
+      <w:r>
+        <w:rPr>
+          <w:rFonts w:ascii="Arial" w:cs="Arial" w:eastAsia="Arial" w:hAnsi="Arial"/>
+          <w:sz w:val="20"/>
+          <w:szCs w:val="20"/>
+        </w:rPr>
+        <w:t xml:space="preserve">Examples of programs are shown in framed figures. In a figure that shows a run, the output of the interpreter follows the program text.</w:t>
+      </w:r>
+    </w:p>
+    <w:p>
+      <w:pPr>
+        <w:pStyle w:val="Heading1"/>
+        <w:pageBreakBefore/>
+        <w:pBdr>
+          <w:bottom w:val="single" w:color="000000" w:sz="12" w:space="4"/>
+        </w:pBdr>
+        <w:spacing w:after="240" w:before="0"/>
+      </w:pPr>
+      <w:r>
+        <w:rPr>
+          <w:rFonts w:ascii="Arial" w:cs="Arial" w:eastAsia="Arial" w:hAnsi="Arial"/>
+          <w:b/>
+          <w:bCs/>
+          <w:sz w:val="32"/>
+          <w:szCs w:val="32"/>
+        </w:rPr>
+        <w:t xml:space="preserve">Chapter 1. Introduction</w:t>
+      </w:r>
+    </w:p>
+    <w:p>
+      <w:pPr>
+        <w:spacing w:after="120" w:line="264"/>
+      </w:pPr>
+      <w:r>
+        <w:rPr>
+          <w:rFonts w:ascii="Arial" w:cs="Arial" w:eastAsia="Arial" w:hAnsi="Arial"/>
+          <w:sz w:val="20"/>
+          <w:szCs w:val="20"/>
+        </w:rPr>
+        <w:t xml:space="preserve">Smalltalk/CREXX is a Smalltalk-80 interpreter written in CREXX, the open-source REXX implementation. It runs programs written in the bracket syntax of GNU Smalltalk: classes are declared with Object subclass: Foo [ ... ], methods are written inside the class body, and statements at the top level are run one after the other. The interpreter is a single CREXX source file, smalltalk.crexx, written in CREXX Level B, the statically typed level of the language, and a class library written in Smalltalk itself.</w:t>
+      </w:r>
+    </w:p>
+    <w:p>
+      <w:pPr>
+        <w:spacing w:after="120" w:line="264"/>
+      </w:pPr>
+      <w:r>
+        <w:rPr>
+          <w:rFonts w:ascii="Arial" w:cs="Arial" w:eastAsia="Arial" w:hAnsi="Arial"/>
+          <w:sz w:val="20"/>
+          <w:szCs w:val="20"/>
+        </w:rPr>
+        <w:t xml:space="preserve">Smalltalk/CREXX gives its users:</w:t>
       </w:r>
     </w:p>
     <w:p>
@@ -2903,7 +3036,7 @@
           <w:sz w:val="20"/>
           <w:szCs w:val="20"/>
         </w:rPr>
-        <w:t xml:space="preserve">Blocks.</w:t>
+        <w:t xml:space="preserve">A pure object model.</w:t>
       </w:r>
       <w:r>
         <w:rPr>
@@ -2911,7 +3044,7 @@
           <w:sz w:val="20"/>
           <w:szCs w:val="20"/>
         </w:rPr>
-        <w:t xml:space="preserve"> Blocks are closures. They may be stored, passed, and returned from methods, and a ^ inside a block returns from the method that defined it, even through several levels of calls.</w:t>
+        <w:t xml:space="preserve"> Everything is an object: integers, characters, classes and blocks. All computation is by sending messages, and the only control structures are messages to booleans, blocks and numbers.</w:t>
       </w:r>
     </w:p>
     <w:p>
@@ -2931,7 +3064,7 @@
           <w:sz w:val="20"/>
           <w:szCs w:val="20"/>
         </w:rPr>
-        <w:t xml:space="preserve">Numbers without limits.</w:t>
+        <w:t xml:space="preserve">Classes and metaclasses.</w:t>
       </w:r>
       <w:r>
         <w:rPr>
@@ -2939,7 +3072,7 @@
           <w:sz w:val="20"/>
           <w:szCs w:val="20"/>
         </w:rPr>
-        <w:t xml:space="preserve"> Integers grow to any size, division of integers gives exact fractions, and floating-point numbers are available for the rest.</w:t>
+        <w:t xml:space="preserve"> Every class is an instance of its metaclass; class-side methods, class variables and class-side instance variables are all supported.</w:t>
       </w:r>
     </w:p>
     <w:p>
@@ -2959,7 +3092,7 @@
           <w:sz w:val="20"/>
           <w:szCs w:val="20"/>
         </w:rPr>
-        <w:t xml:space="preserve">A class library.</w:t>
+        <w:t xml:space="preserve">Blocks.</w:t>
       </w:r>
       <w:r>
         <w:rPr>
@@ -2967,7 +3100,7 @@
           <w:sz w:val="20"/>
           <w:szCs w:val="20"/>
         </w:rPr>
-        <w:t xml:space="preserve"> Collections, strings, symbols, streams and exceptions are provided by library classes written in Smalltalk, loaded when the interpreter starts.</w:t>
+        <w:t xml:space="preserve"> Blocks are closures. They may be stored, passed, and returned from methods, and a ^ inside a block returns from the method that defined it, even through several levels of calls.</w:t>
       </w:r>
     </w:p>
     <w:p>
@@ -2987,6 +3120,62 @@
           <w:sz w:val="20"/>
           <w:szCs w:val="20"/>
         </w:rPr>
+        <w:t xml:space="preserve">Numbers without limits.</w:t>
+      </w:r>
+      <w:r>
+        <w:rPr>
+          <w:rFonts w:ascii="Arial" w:cs="Arial" w:eastAsia="Arial" w:hAnsi="Arial"/>
+          <w:sz w:val="20"/>
+          <w:szCs w:val="20"/>
+        </w:rPr>
+        <w:t xml:space="preserve"> Integers grow to any size, division of integers gives exact fractions, and floating-point numbers are available for the rest.</w:t>
+      </w:r>
+    </w:p>
+    <w:p>
+      <w:pPr>
+        <w:pStyle w:val="ListParagraph"/>
+        <w:numPr>
+          <w:ilvl w:val="0"/>
+          <w:numId w:val="2"/>
+        </w:numPr>
+        <w:spacing w:after="80"/>
+      </w:pPr>
+      <w:r>
+        <w:rPr>
+          <w:rFonts w:ascii="Arial" w:cs="Arial" w:eastAsia="Arial" w:hAnsi="Arial"/>
+          <w:b/>
+          <w:bCs/>
+          <w:sz w:val="20"/>
+          <w:szCs w:val="20"/>
+        </w:rPr>
+        <w:t xml:space="preserve">A class library.</w:t>
+      </w:r>
+      <w:r>
+        <w:rPr>
+          <w:rFonts w:ascii="Arial" w:cs="Arial" w:eastAsia="Arial" w:hAnsi="Arial"/>
+          <w:sz w:val="20"/>
+          <w:szCs w:val="20"/>
+        </w:rPr>
+        <w:t xml:space="preserve"> Collections, strings, symbols, streams and exceptions are provided by library classes written in Smalltalk, loaded when the interpreter starts.</w:t>
+      </w:r>
+    </w:p>
+    <w:p>
+      <w:pPr>
+        <w:pStyle w:val="ListParagraph"/>
+        <w:numPr>
+          <w:ilvl w:val="0"/>
+          <w:numId w:val="2"/>
+        </w:numPr>
+        <w:spacing w:after="80"/>
+      </w:pPr>
+      <w:r>
+        <w:rPr>
+          <w:rFonts w:ascii="Arial" w:cs="Arial" w:eastAsia="Arial" w:hAnsi="Arial"/>
+          <w:b/>
+          <w:bCs/>
+          <w:sz w:val="20"/>
+          <w:szCs w:val="20"/>
+        </w:rPr>
         <w:t xml:space="preserve">Exceptions.</w:t>
       </w:r>
       <w:r>
@@ -3037,7 +3226,7 @@
           <w:sz w:val="20"/>
           <w:szCs w:val="20"/>
         </w:rPr>
-        <w:t xml:space="preserve">Objects are entries in a table of parallel arrays. SmallIntegers are not objects in the table: they are encoded in the reference itself. Common operations on numbers, strings, arrays and dictionaries are implemented as primitives in CREXX; the class library calls them through the pragma &lt;primitive: name&gt; and falls back to Smalltalk code when a primitive fails. Chapter 13 describes the design.</w:t>
+        <w:t xml:space="preserve">Objects are entries in a table of parallel arrays. SmallIntegers are not objects in the table: they are encoded in the reference itself. Common operations on numbers, strings, arrays and dictionaries are implemented as primitives in CREXX; the class library calls them through the pragma &lt;primitive: name&gt; and falls back to Smalltalk code when a primitive fails. Chapter 15 describes the design.</w:t>
       </w:r>
     </w:p>
     <w:p>
@@ -5195,7 +5384,7 @@
           <w:sz w:val="20"/>
           <w:szCs w:val="20"/>
         </w:rPr>
-        <w:t xml:space="preserve">When it starts, the interpreter creates the kernel classes, then reads the library files lib/kernel.st, lib/numbers.st, lib/collections.st, lib/streams.st, lib/exceptions.st, lib/extras.st, lib/structures.st, lib/regex.st, lib/system.st and lib/net.st, and only then reads your program. The library directory is found by the launcher; with the driver you pass it as -L directory.</w:t>
+        <w:t xml:space="preserve">When it starts, the interpreter creates the kernel classes, then reads the library files lib/kernel.st, lib/numbers.st, lib/collections.st, lib/streams.st, lib/exceptions.st, lib/extras.st, lib/structures.st, lib/regex.st, lib/system.st, lib/net.st, lib/sunit.st and lib/process.st, and only then reads your program. The library directory is found by the launcher; with the driver you pass it as -L directory.</w:t>
       </w:r>
     </w:p>
     <w:p>
@@ -9293,7 +9482,7 @@
           <w:sz w:val="20"/>
           <w:szCs w:val="20"/>
         </w:rPr>
-        <w:t xml:space="preserve">A program is a sequence of class definitions and statements. Variables declared at the top level with | a b | live until the end of the file. A statement that fails with an error prints a trace (Chapter 12) and the program continues with the next statement. The construct Eval [ statements ] groups statements; it is accepted for compatibility with GNU Smalltalk.</w:t>
+        <w:t xml:space="preserve">A program is a sequence of class definitions and statements. Variables declared at the top level with | a b | live until the end of the file. A statement that fails with an error prints a trace (Chapter 14) and the program continues with the next statement. The construct Eval [ statements ] groups statements; it is accepted for compatibility with GNU Smalltalk.</w:t>
       </w:r>
     </w:p>
     <w:p>
@@ -16841,7 +17030,7 @@
           <w:sz w:val="20"/>
           <w:szCs w:val="20"/>
         </w:rPr>
-        <w:t xml:space="preserve">Indexes start at 1. An index outside the collection is an error of class IndexOutOfRange (Chapter 10). OrderedCollection grows as needed and removes from either end in constant time; inserting or removing in the middle moves the elements after it.</w:t>
+        <w:t xml:space="preserve">Indexes start at 1. An index outside the collection is an error of class IndexOutOfRange (Chapter 12). OrderedCollection grows as needed and removes from either end in constant time; inserting or removing in the middle moves the elements after it.</w:t>
       </w:r>
     </w:p>
     <w:p>
@@ -27076,7 +27265,20 @@
           <w:sz w:val="32"/>
           <w:szCs w:val="32"/>
         </w:rPr>
-        <w:t xml:space="preserve">Chapter 10. Exceptions</w:t>
+        <w:t xml:space="preserve">Chapter 10. Testing with SUnit</w:t>
+      </w:r>
+    </w:p>
+    <w:p>
+      <w:pPr>
+        <w:spacing w:after="120" w:line="264"/>
+      </w:pPr>
+      <w:r>
+        <w:rPr>
+          <w:rFonts w:ascii="Arial" w:cs="Arial" w:eastAsia="Arial" w:hAnsi="Arial"/>
+          <w:sz w:val="20"/>
+          <w:szCs w:val="20"/>
+        </w:rPr>
+        <w:t xml:space="preserve">The classes TestCase, TestSuite and TestResult are a small version of SUnit, the unit test framework of Smalltalk. A test is a method whose name begins with test in a subclass of TestCase. For each test the framework makes a new instance, sends setUp, runs the method and sends tearDown, even when the test failed.</w:t>
       </w:r>
     </w:p>
     <w:p>
@@ -27092,7 +27294,7 @@
           <w:sz w:val="24"/>
           <w:szCs w:val="24"/>
         </w:rPr>
-        <w:t xml:space="preserve">Handling</w:t>
+        <w:t xml:space="preserve">Writing tests</w:t>
       </w:r>
     </w:p>
     <w:p>
@@ -27105,7 +27307,36 @@
           <w:sz w:val="20"/>
           <w:szCs w:val="20"/>
         </w:rPr>
-        <w:t xml:space="preserve">aBlock on: ExceptionClass do: [:e | ... ] evaluates the block. If an exception of that class (or a subclass) is signaled while it runs, the handler block is evaluated with the exception as its argument. The value of the handler block becomes the value of the on:do: expression. A handler for several classes uses a set: on: ZeroDivide, MessageNotUnderstood do: [...].</w:t>
+        <w:t xml:space="preserve">Inside a test the following messages check results. assert: aBoolean fails if the argument is false and deny: if it is true; assert: a equals: b fails if a = b is false and says what was expected. should: aBlock raise: ExceptionClass fails if the block does not signal that exception, shouldnt:raise: fails if it does. fail and fail: text fail at once. A failure is an error of class TestFailure; any other error in a test is counted as an error, not a failure.</w:t>
+      </w:r>
+    </w:p>
+    <w:p>
+      <w:pPr>
+        <w:pStyle w:val="Heading2"/>
+        <w:keepNext/>
+      </w:pPr>
+      <w:r>
+        <w:rPr>
+          <w:rFonts w:ascii="Arial" w:cs="Arial" w:eastAsia="Arial" w:hAnsi="Arial"/>
+          <w:b/>
+          <w:bCs/>
+          <w:sz w:val="24"/>
+          <w:szCs w:val="24"/>
+        </w:rPr>
+        <w:t xml:space="preserve">Running tests</w:t>
+      </w:r>
+    </w:p>
+    <w:p>
+      <w:pPr>
+        <w:spacing w:after="120" w:line="264"/>
+      </w:pPr>
+      <w:r>
+        <w:rPr>
+          <w:rFonts w:ascii="Arial" w:cs="Arial" w:eastAsia="Arial" w:hAnsi="Arial"/>
+          <w:sz w:val="20"/>
+          <w:szCs w:val="20"/>
+        </w:rPr>
+        <w:t xml:space="preserve">MyTest run answers a TestResult with the counts and lists passed, failures and errors. MyTest runAndReport also writes a report on the Transcript with one line for each test that did not pass. MyTest suite answers a TestSuite of the tests, including those inherited from superclasses (below TestCase); MyTest run: #testName runs one test. A TestSuite is built with TestSuite named: and addTest:, and its run answers a TestResult.</w:t>
       </w:r>
     </w:p>
     <w:p>
@@ -27127,133 +27358,175 @@
           <w:sz w:val="17"/>
           <w:szCs w:val="17"/>
         </w:rPr>
-        <w:t xml:space="preserve">| r |</w:t>
-      </w:r>
-    </w:p>
-    <w:p>
-      <w:pPr>
-        <w:keepNext/>
-        <w:keepLines/>
-        <w:pBdr>
-          <w:left w:val="single" w:color="808080" w:sz="4"/>
-          <w:right w:val="single" w:color="808080" w:sz="4"/>
-        </w:pBdr>
-        <w:shd w:fill="F2F2F2" w:color="auto" w:val="clear"/>
-        <w:spacing w:after="0" w:line="240"/>
-        <w:ind w:left="100" w:right="100"/>
-      </w:pPr>
-      <w:r>
-        <w:rPr>
-          <w:rFonts w:ascii="Courier New" w:cs="Courier New" w:eastAsia="Courier New" w:hAnsi="Courier New"/>
-          <w:sz w:val="17"/>
-          <w:szCs w:val="17"/>
-        </w:rPr>
-        <w:t xml:space="preserve">r := [10 / 0] on: ZeroDivide do: [:e | e messageText displayNl. -1].</w:t>
-      </w:r>
-    </w:p>
-    <w:p>
-      <w:pPr>
-        <w:keepNext/>
-        <w:keepLines/>
-        <w:pBdr>
-          <w:left w:val="single" w:color="808080" w:sz="4"/>
-          <w:right w:val="single" w:color="808080" w:sz="4"/>
-        </w:pBdr>
-        <w:shd w:fill="F2F2F2" w:color="auto" w:val="clear"/>
-        <w:spacing w:after="0" w:line="240"/>
-        <w:ind w:left="100" w:right="100"/>
-      </w:pPr>
-      <w:r>
-        <w:rPr>
-          <w:rFonts w:ascii="Courier New" w:cs="Courier New" w:eastAsia="Courier New" w:hAnsi="Courier New"/>
-          <w:sz w:val="17"/>
-          <w:szCs w:val="17"/>
-        </w:rPr>
-        <w:t xml:space="preserve">r printNl.</w:t>
-      </w:r>
-    </w:p>
-    <w:p>
-      <w:pPr>
-        <w:keepNext/>
-        <w:keepLines/>
-        <w:pBdr>
-          <w:left w:val="single" w:color="808080" w:sz="4"/>
-          <w:right w:val="single" w:color="808080" w:sz="4"/>
-        </w:pBdr>
-        <w:shd w:fill="F2F2F2" w:color="auto" w:val="clear"/>
-        <w:spacing w:after="0" w:line="240"/>
-        <w:ind w:left="100" w:right="100"/>
-      </w:pPr>
-      <w:r>
-        <w:rPr>
-          <w:rFonts w:ascii="Courier New" w:cs="Courier New" w:eastAsia="Courier New" w:hAnsi="Courier New"/>
-          <w:sz w:val="17"/>
-          <w:szCs w:val="17"/>
-        </w:rPr>
-        <w:t xml:space="preserve">r := [nil foo] on: MessageNotUnderstood do: [:e | e return: 3].</w:t>
-      </w:r>
-    </w:p>
-    <w:p>
-      <w:pPr>
-        <w:keepNext/>
-        <w:keepLines/>
-        <w:pBdr>
-          <w:left w:val="single" w:color="808080" w:sz="4"/>
-          <w:right w:val="single" w:color="808080" w:sz="4"/>
-        </w:pBdr>
-        <w:shd w:fill="F2F2F2" w:color="auto" w:val="clear"/>
-        <w:spacing w:after="0" w:line="240"/>
-        <w:ind w:left="100" w:right="100"/>
-      </w:pPr>
-      <w:r>
-        <w:rPr>
-          <w:rFonts w:ascii="Courier New" w:cs="Courier New" w:eastAsia="Courier New" w:hAnsi="Courier New"/>
-          <w:sz w:val="17"/>
-          <w:szCs w:val="17"/>
-        </w:rPr>
-        <w:t xml:space="preserve">r printNl.</w:t>
-      </w:r>
-    </w:p>
-    <w:p>
-      <w:pPr>
-        <w:keepNext/>
-        <w:keepLines/>
-        <w:pBdr>
-          <w:left w:val="single" w:color="808080" w:sz="4"/>
-          <w:right w:val="single" w:color="808080" w:sz="4"/>
-        </w:pBdr>
-        <w:shd w:fill="F2F2F2" w:color="auto" w:val="clear"/>
-        <w:spacing w:after="0" w:line="240"/>
-        <w:ind w:left="100" w:right="100"/>
-      </w:pPr>
-      <w:r>
-        <w:rPr>
-          <w:rFonts w:ascii="Courier New" w:cs="Courier New" w:eastAsia="Courier New" w:hAnsi="Courier New"/>
-          <w:sz w:val="17"/>
-          <w:szCs w:val="17"/>
-        </w:rPr>
-        <w:t xml:space="preserve">r := [#(1 2) at: 5] on: Error do: [:e | e messageText].</w:t>
-      </w:r>
-    </w:p>
-    <w:p>
-      <w:pPr>
-        <w:keepNext/>
-        <w:keepLines/>
-        <w:pBdr>
-          <w:left w:val="single" w:color="808080" w:sz="4"/>
-          <w:right w:val="single" w:color="808080" w:sz="4"/>
-        </w:pBdr>
-        <w:shd w:fill="F2F2F2" w:color="auto" w:val="clear"/>
-        <w:spacing w:after="0" w:line="240"/>
-        <w:ind w:left="100" w:right="100"/>
-      </w:pPr>
-      <w:r>
-        <w:rPr>
-          <w:rFonts w:ascii="Courier New" w:cs="Courier New" w:eastAsia="Courier New" w:hAnsi="Courier New"/>
-          <w:sz w:val="17"/>
-          <w:szCs w:val="17"/>
-        </w:rPr>
-        <w:t xml:space="preserve">r displayNl.</w:t>
+        <w:t xml:space="preserve">TestCase subclass: StackTest [</w:t>
+      </w:r>
+    </w:p>
+    <w:p>
+      <w:pPr>
+        <w:keepNext/>
+        <w:keepLines/>
+        <w:pBdr>
+          <w:left w:val="single" w:color="808080" w:sz="4"/>
+          <w:right w:val="single" w:color="808080" w:sz="4"/>
+        </w:pBdr>
+        <w:shd w:fill="F2F2F2" w:color="auto" w:val="clear"/>
+        <w:spacing w:after="0" w:line="240"/>
+        <w:ind w:left="100" w:right="100"/>
+      </w:pPr>
+      <w:r>
+        <w:rPr>
+          <w:rFonts w:ascii="Courier New" w:cs="Courier New" w:eastAsia="Courier New" w:hAnsi="Courier New"/>
+          <w:sz w:val="17"/>
+          <w:szCs w:val="17"/>
+        </w:rPr>
+        <w:t xml:space="preserve">    | s |</w:t>
+      </w:r>
+    </w:p>
+    <w:p>
+      <w:pPr>
+        <w:keepNext/>
+        <w:keepLines/>
+        <w:pBdr>
+          <w:left w:val="single" w:color="808080" w:sz="4"/>
+          <w:right w:val="single" w:color="808080" w:sz="4"/>
+        </w:pBdr>
+        <w:shd w:fill="F2F2F2" w:color="auto" w:val="clear"/>
+        <w:spacing w:after="0" w:line="240"/>
+        <w:ind w:left="100" w:right="100"/>
+      </w:pPr>
+      <w:r>
+        <w:rPr>
+          <w:rFonts w:ascii="Courier New" w:cs="Courier New" w:eastAsia="Courier New" w:hAnsi="Courier New"/>
+          <w:sz w:val="17"/>
+          <w:szCs w:val="17"/>
+        </w:rPr>
+        <w:t xml:space="preserve">    setUp [ s := OrderedCollection new. s add: 1; add: 2 ]</w:t>
+      </w:r>
+    </w:p>
+    <w:p>
+      <w:pPr>
+        <w:keepNext/>
+        <w:keepLines/>
+        <w:pBdr>
+          <w:left w:val="single" w:color="808080" w:sz="4"/>
+          <w:right w:val="single" w:color="808080" w:sz="4"/>
+        </w:pBdr>
+        <w:shd w:fill="F2F2F2" w:color="auto" w:val="clear"/>
+        <w:spacing w:after="0" w:line="240"/>
+        <w:ind w:left="100" w:right="100"/>
+      </w:pPr>
+      <w:r>
+        <w:rPr>
+          <w:rFonts w:ascii="Courier New" w:cs="Courier New" w:eastAsia="Courier New" w:hAnsi="Courier New"/>
+          <w:sz w:val="17"/>
+          <w:szCs w:val="17"/>
+        </w:rPr>
+        <w:t xml:space="preserve">    testSize [ self assert: s size equals: 2 ]</w:t>
+      </w:r>
+    </w:p>
+    <w:p>
+      <w:pPr>
+        <w:keepNext/>
+        <w:keepLines/>
+        <w:pBdr>
+          <w:left w:val="single" w:color="808080" w:sz="4"/>
+          <w:right w:val="single" w:color="808080" w:sz="4"/>
+        </w:pBdr>
+        <w:shd w:fill="F2F2F2" w:color="auto" w:val="clear"/>
+        <w:spacing w:after="0" w:line="240"/>
+        <w:ind w:left="100" w:right="100"/>
+      </w:pPr>
+      <w:r>
+        <w:rPr>
+          <w:rFonts w:ascii="Courier New" w:cs="Courier New" w:eastAsia="Courier New" w:hAnsi="Courier New"/>
+          <w:sz w:val="17"/>
+          <w:szCs w:val="17"/>
+        </w:rPr>
+        <w:t xml:space="preserve">    testLast [ self assert: s last equals: 3 ]</w:t>
+      </w:r>
+    </w:p>
+    <w:p>
+      <w:pPr>
+        <w:keepNext/>
+        <w:keepLines/>
+        <w:pBdr>
+          <w:left w:val="single" w:color="808080" w:sz="4"/>
+          <w:right w:val="single" w:color="808080" w:sz="4"/>
+        </w:pBdr>
+        <w:shd w:fill="F2F2F2" w:color="auto" w:val="clear"/>
+        <w:spacing w:after="0" w:line="240"/>
+        <w:ind w:left="100" w:right="100"/>
+      </w:pPr>
+      <w:r>
+        <w:rPr>
+          <w:rFonts w:ascii="Courier New" w:cs="Courier New" w:eastAsia="Courier New" w:hAnsi="Courier New"/>
+          <w:sz w:val="17"/>
+          <w:szCs w:val="17"/>
+        </w:rPr>
+        <w:t xml:space="preserve">    testRaise [ self should: [1/0] raise: ZeroDivide ]</w:t>
+      </w:r>
+    </w:p>
+    <w:p>
+      <w:pPr>
+        <w:keepNext/>
+        <w:keepLines/>
+        <w:pBdr>
+          <w:left w:val="single" w:color="808080" w:sz="4"/>
+          <w:right w:val="single" w:color="808080" w:sz="4"/>
+        </w:pBdr>
+        <w:shd w:fill="F2F2F2" w:color="auto" w:val="clear"/>
+        <w:spacing w:after="0" w:line="240"/>
+        <w:ind w:left="100" w:right="100"/>
+      </w:pPr>
+      <w:r>
+        <w:rPr>
+          <w:rFonts w:ascii="Courier New" w:cs="Courier New" w:eastAsia="Courier New" w:hAnsi="Courier New"/>
+          <w:sz w:val="17"/>
+          <w:szCs w:val="17"/>
+        </w:rPr>
+        <w:t xml:space="preserve">    testError [ ^nil foo ]</w:t>
+      </w:r>
+    </w:p>
+    <w:p>
+      <w:pPr>
+        <w:keepNext/>
+        <w:keepLines/>
+        <w:pBdr>
+          <w:left w:val="single" w:color="808080" w:sz="4"/>
+          <w:right w:val="single" w:color="808080" w:sz="4"/>
+        </w:pBdr>
+        <w:shd w:fill="F2F2F2" w:color="auto" w:val="clear"/>
+        <w:spacing w:after="0" w:line="240"/>
+        <w:ind w:left="100" w:right="100"/>
+      </w:pPr>
+      <w:r>
+        <w:rPr>
+          <w:rFonts w:ascii="Courier New" w:cs="Courier New" w:eastAsia="Courier New" w:hAnsi="Courier New"/>
+          <w:sz w:val="17"/>
+          <w:szCs w:val="17"/>
+        </w:rPr>
+        <w:t xml:space="preserve">]</w:t>
+      </w:r>
+    </w:p>
+    <w:p>
+      <w:pPr>
+        <w:keepNext/>
+        <w:keepLines/>
+        <w:pBdr>
+          <w:left w:val="single" w:color="808080" w:sz="4"/>
+          <w:right w:val="single" w:color="808080" w:sz="4"/>
+        </w:pBdr>
+        <w:shd w:fill="F2F2F2" w:color="auto" w:val="clear"/>
+        <w:spacing w:after="0" w:line="240"/>
+        <w:ind w:left="100" w:right="100"/>
+      </w:pPr>
+      <w:r>
+        <w:rPr>
+          <w:rFonts w:ascii="Courier New" w:cs="Courier New" w:eastAsia="Courier New" w:hAnsi="Courier New"/>
+          <w:sz w:val="17"/>
+          <w:szCs w:val="17"/>
+        </w:rPr>
+        <w:t xml:space="preserve">StackTest runAndReport.</w:t>
       </w:r>
     </w:p>
     <w:p>
@@ -27295,49 +27568,28 @@
           <w:sz w:val="17"/>
           <w:szCs w:val="17"/>
         </w:rPr>
-        <w:t xml:space="preserve">The program attempted to divide a number by zero</w:t>
-      </w:r>
-    </w:p>
-    <w:p>
-      <w:pPr>
-        <w:keepNext/>
-        <w:keepLines/>
-        <w:pBdr>
-          <w:left w:val="single" w:color="808080" w:sz="4"/>
-          <w:right w:val="single" w:color="808080" w:sz="4"/>
-        </w:pBdr>
-        <w:shd w:fill="F2F2F2" w:color="auto" w:val="clear"/>
-        <w:spacing w:after="0" w:line="240"/>
-        <w:ind w:left="100" w:right="100"/>
-      </w:pPr>
-      <w:r>
-        <w:rPr>
-          <w:rFonts w:ascii="Courier New" w:cs="Courier New" w:eastAsia="Courier New" w:hAnsi="Courier New"/>
-          <w:sz w:val="17"/>
-          <w:szCs w:val="17"/>
-        </w:rPr>
-        <w:t xml:space="preserve">-1</w:t>
-      </w:r>
-    </w:p>
-    <w:p>
-      <w:pPr>
-        <w:keepNext/>
-        <w:keepLines/>
-        <w:pBdr>
-          <w:left w:val="single" w:color="808080" w:sz="4"/>
-          <w:right w:val="single" w:color="808080" w:sz="4"/>
-        </w:pBdr>
-        <w:shd w:fill="F2F2F2" w:color="auto" w:val="clear"/>
-        <w:spacing w:after="0" w:line="240"/>
-        <w:ind w:left="100" w:right="100"/>
-      </w:pPr>
-      <w:r>
-        <w:rPr>
-          <w:rFonts w:ascii="Courier New" w:cs="Courier New" w:eastAsia="Courier New" w:hAnsi="Courier New"/>
-          <w:sz w:val="17"/>
-          <w:szCs w:val="17"/>
-        </w:rPr>
-        <w:t xml:space="preserve">3</w:t>
+        <w:t xml:space="preserve">StackTest: 4 run, 2 passed, 1 failed, 1 errors</w:t>
+      </w:r>
+    </w:p>
+    <w:p>
+      <w:pPr>
+        <w:keepNext/>
+        <w:keepLines/>
+        <w:pBdr>
+          <w:left w:val="single" w:color="808080" w:sz="4"/>
+          <w:right w:val="single" w:color="808080" w:sz="4"/>
+        </w:pBdr>
+        <w:shd w:fill="F2F2F2" w:color="auto" w:val="clear"/>
+        <w:spacing w:after="0" w:line="240"/>
+        <w:ind w:left="100" w:right="100"/>
+      </w:pPr>
+      <w:r>
+        <w:rPr>
+          <w:rFonts w:ascii="Courier New" w:cs="Courier New" w:eastAsia="Courier New" w:hAnsi="Courier New"/>
+          <w:sz w:val="17"/>
+          <w:szCs w:val="17"/>
+        </w:rPr>
+        <w:t xml:space="preserve">  FAIL StackTest&gt;&gt;#testLast: Expected 3 but got 2</w:t>
       </w:r>
     </w:p>
     <w:p>
@@ -27359,7 +27611,7 @@
           <w:sz w:val="17"/>
           <w:szCs w:val="17"/>
         </w:rPr>
-        <w:t xml:space="preserve">Index value 5 out of range: only 2 elements</w:t>
+        <w:t xml:space="preserve">  ERROR StackTest&gt;&gt;#testError: did not understand #foo</w:t>
       </w:r>
     </w:p>
     <w:p>
@@ -27375,6 +27627,1467 @@
           <w:szCs w:val="18"/>
         </w:rPr>
         <w:t xml:space="preserve">Figure 57. </w:t>
+      </w:r>
+      <w:r>
+        <w:rPr>
+          <w:rFonts w:ascii="Arial" w:cs="Arial" w:eastAsia="Arial" w:hAnsi="Arial"/>
+          <w:sz w:val="18"/>
+          <w:szCs w:val="18"/>
+        </w:rPr>
+        <w:t xml:space="preserve">A test case</w:t>
+      </w:r>
+    </w:p>
+    <w:tbl>
+      <w:tblPr>
+        <w:tblW w:type="dxa" w:w="9638"/>
+        <w:tblBorders>
+          <w:top w:val="single" w:color="auto" w:sz="4"/>
+          <w:left w:val="single" w:color="auto" w:sz="4"/>
+          <w:bottom w:val="single" w:color="auto" w:sz="4"/>
+          <w:right w:val="single" w:color="auto" w:sz="4"/>
+          <w:insideH w:val="single" w:color="auto" w:sz="4"/>
+          <w:insideV w:val="single" w:color="auto" w:sz="4"/>
+        </w:tblBorders>
+      </w:tblPr>
+      <w:tblGrid>
+        <w:gridCol w:w="3000"/>
+        <w:gridCol w:w="6638"/>
+      </w:tblGrid>
+      <w:tr>
+        <w:trPr>
+          <w:cantSplit/>
+          <w:tblHeader/>
+        </w:trPr>
+        <w:tc>
+          <w:tcPr>
+            <w:tcW w:type="dxa" w:w="3000"/>
+            <w:tcBorders>
+              <w:top w:val="single" w:color="808080" w:sz="4"/>
+              <w:left w:val="single" w:color="808080" w:sz="4"/>
+              <w:bottom w:val="single" w:color="808080" w:sz="4"/>
+              <w:right w:val="single" w:color="808080" w:sz="4"/>
+            </w:tcBorders>
+            <w:shd w:fill="D9D9D9" w:color="auto" w:val="clear"/>
+            <w:tcMar>
+              <w:top w:type="dxa" w:w="50"/>
+              <w:left w:type="dxa" w:w="90"/>
+              <w:bottom w:type="dxa" w:w="50"/>
+              <w:right w:type="dxa" w:w="90"/>
+            </w:tcMar>
+          </w:tcPr>
+          <w:p>
+            <w:pPr>
+              <w:spacing w:after="0"/>
+            </w:pPr>
+            <w:r>
+              <w:rPr>
+                <w:rFonts w:ascii="Arial" w:cs="Arial" w:eastAsia="Arial" w:hAnsi="Arial"/>
+                <w:b/>
+                <w:bCs/>
+                <w:sz w:val="17"/>
+                <w:szCs w:val="17"/>
+              </w:rPr>
+              <w:t xml:space="preserve">Selector</w:t>
+            </w:r>
+          </w:p>
+        </w:tc>
+        <w:tc>
+          <w:tcPr>
+            <w:tcW w:type="dxa" w:w="6638"/>
+            <w:tcBorders>
+              <w:top w:val="single" w:color="808080" w:sz="4"/>
+              <w:left w:val="single" w:color="808080" w:sz="4"/>
+              <w:bottom w:val="single" w:color="808080" w:sz="4"/>
+              <w:right w:val="single" w:color="808080" w:sz="4"/>
+            </w:tcBorders>
+            <w:shd w:fill="D9D9D9" w:color="auto" w:val="clear"/>
+            <w:tcMar>
+              <w:top w:type="dxa" w:w="50"/>
+              <w:left w:type="dxa" w:w="90"/>
+              <w:bottom w:type="dxa" w:w="50"/>
+              <w:right w:type="dxa" w:w="90"/>
+            </w:tcMar>
+          </w:tcPr>
+          <w:p>
+            <w:pPr>
+              <w:spacing w:after="0"/>
+            </w:pPr>
+            <w:r>
+              <w:rPr>
+                <w:rFonts w:ascii="Arial" w:cs="Arial" w:eastAsia="Arial" w:hAnsi="Arial"/>
+                <w:b/>
+                <w:bCs/>
+                <w:sz w:val="17"/>
+                <w:szCs w:val="17"/>
+              </w:rPr>
+              <w:t xml:space="preserve">Meaning</w:t>
+            </w:r>
+          </w:p>
+        </w:tc>
+      </w:tr>
+      <w:tr>
+        <w:trPr>
+          <w:cantSplit/>
+          <w:tblHeader w:val="false"/>
+        </w:trPr>
+        <w:tc>
+          <w:tcPr>
+            <w:tcW w:type="dxa" w:w="3000"/>
+            <w:tcBorders>
+              <w:top w:val="single" w:color="808080" w:sz="4"/>
+              <w:left w:val="single" w:color="808080" w:sz="4"/>
+              <w:bottom w:val="single" w:color="808080" w:sz="4"/>
+              <w:right w:val="single" w:color="808080" w:sz="4"/>
+            </w:tcBorders>
+            <w:tcMar>
+              <w:top w:type="dxa" w:w="50"/>
+              <w:left w:type="dxa" w:w="90"/>
+              <w:bottom w:type="dxa" w:w="50"/>
+              <w:right w:type="dxa" w:w="90"/>
+            </w:tcMar>
+          </w:tcPr>
+          <w:p>
+            <w:pPr>
+              <w:spacing w:after="0"/>
+            </w:pPr>
+            <w:r>
+              <w:rPr>
+                <w:rFonts w:ascii="Arial" w:cs="Arial" w:eastAsia="Arial" w:hAnsi="Arial"/>
+                <w:b w:val="false"/>
+                <w:bCs w:val="false"/>
+                <w:sz w:val="17"/>
+                <w:szCs w:val="17"/>
+              </w:rPr>
+              <w:t xml:space="preserve">assert:  deny:</w:t>
+            </w:r>
+          </w:p>
+        </w:tc>
+        <w:tc>
+          <w:tcPr>
+            <w:tcW w:type="dxa" w:w="6638"/>
+            <w:tcBorders>
+              <w:top w:val="single" w:color="808080" w:sz="4"/>
+              <w:left w:val="single" w:color="808080" w:sz="4"/>
+              <w:bottom w:val="single" w:color="808080" w:sz="4"/>
+              <w:right w:val="single" w:color="808080" w:sz="4"/>
+            </w:tcBorders>
+            <w:tcMar>
+              <w:top w:type="dxa" w:w="50"/>
+              <w:left w:type="dxa" w:w="90"/>
+              <w:bottom w:type="dxa" w:w="50"/>
+              <w:right w:type="dxa" w:w="90"/>
+            </w:tcMar>
+          </w:tcPr>
+          <w:p>
+            <w:pPr>
+              <w:spacing w:after="0"/>
+            </w:pPr>
+            <w:r>
+              <w:rPr>
+                <w:rFonts w:ascii="Arial" w:cs="Arial" w:eastAsia="Arial" w:hAnsi="Arial"/>
+                <w:b w:val="false"/>
+                <w:bCs w:val="false"/>
+                <w:sz w:val="17"/>
+                <w:szCs w:val="17"/>
+              </w:rPr>
+              <w:t xml:space="preserve">Fail if the argument is false; fail if it is true</w:t>
+            </w:r>
+          </w:p>
+        </w:tc>
+      </w:tr>
+      <w:tr>
+        <w:trPr>
+          <w:cantSplit/>
+          <w:tblHeader w:val="false"/>
+        </w:trPr>
+        <w:tc>
+          <w:tcPr>
+            <w:tcW w:type="dxa" w:w="3000"/>
+            <w:tcBorders>
+              <w:top w:val="single" w:color="808080" w:sz="4"/>
+              <w:left w:val="single" w:color="808080" w:sz="4"/>
+              <w:bottom w:val="single" w:color="808080" w:sz="4"/>
+              <w:right w:val="single" w:color="808080" w:sz="4"/>
+            </w:tcBorders>
+            <w:tcMar>
+              <w:top w:type="dxa" w:w="50"/>
+              <w:left w:type="dxa" w:w="90"/>
+              <w:bottom w:type="dxa" w:w="50"/>
+              <w:right w:type="dxa" w:w="90"/>
+            </w:tcMar>
+          </w:tcPr>
+          <w:p>
+            <w:pPr>
+              <w:spacing w:after="0"/>
+            </w:pPr>
+            <w:r>
+              <w:rPr>
+                <w:rFonts w:ascii="Arial" w:cs="Arial" w:eastAsia="Arial" w:hAnsi="Arial"/>
+                <w:b w:val="false"/>
+                <w:bCs w:val="false"/>
+                <w:sz w:val="17"/>
+                <w:szCs w:val="17"/>
+              </w:rPr>
+              <w:t xml:space="preserve">assert:equals:</w:t>
+            </w:r>
+          </w:p>
+        </w:tc>
+        <w:tc>
+          <w:tcPr>
+            <w:tcW w:type="dxa" w:w="6638"/>
+            <w:tcBorders>
+              <w:top w:val="single" w:color="808080" w:sz="4"/>
+              <w:left w:val="single" w:color="808080" w:sz="4"/>
+              <w:bottom w:val="single" w:color="808080" w:sz="4"/>
+              <w:right w:val="single" w:color="808080" w:sz="4"/>
+            </w:tcBorders>
+            <w:tcMar>
+              <w:top w:type="dxa" w:w="50"/>
+              <w:left w:type="dxa" w:w="90"/>
+              <w:bottom w:type="dxa" w:w="50"/>
+              <w:right w:type="dxa" w:w="90"/>
+            </w:tcMar>
+          </w:tcPr>
+          <w:p>
+            <w:pPr>
+              <w:spacing w:after="0"/>
+            </w:pPr>
+            <w:r>
+              <w:rPr>
+                <w:rFonts w:ascii="Arial" w:cs="Arial" w:eastAsia="Arial" w:hAnsi="Arial"/>
+                <w:b w:val="false"/>
+                <w:bCs w:val="false"/>
+                <w:sz w:val="17"/>
+                <w:szCs w:val="17"/>
+              </w:rPr>
+              <w:t xml:space="preserve">Fail if the two objects are not equal</w:t>
+            </w:r>
+          </w:p>
+        </w:tc>
+      </w:tr>
+      <w:tr>
+        <w:trPr>
+          <w:cantSplit/>
+          <w:tblHeader w:val="false"/>
+        </w:trPr>
+        <w:tc>
+          <w:tcPr>
+            <w:tcW w:type="dxa" w:w="3000"/>
+            <w:tcBorders>
+              <w:top w:val="single" w:color="808080" w:sz="4"/>
+              <w:left w:val="single" w:color="808080" w:sz="4"/>
+              <w:bottom w:val="single" w:color="808080" w:sz="4"/>
+              <w:right w:val="single" w:color="808080" w:sz="4"/>
+            </w:tcBorders>
+            <w:tcMar>
+              <w:top w:type="dxa" w:w="50"/>
+              <w:left w:type="dxa" w:w="90"/>
+              <w:bottom w:type="dxa" w:w="50"/>
+              <w:right w:type="dxa" w:w="90"/>
+            </w:tcMar>
+          </w:tcPr>
+          <w:p>
+            <w:pPr>
+              <w:spacing w:after="0"/>
+            </w:pPr>
+            <w:r>
+              <w:rPr>
+                <w:rFonts w:ascii="Arial" w:cs="Arial" w:eastAsia="Arial" w:hAnsi="Arial"/>
+                <w:b w:val="false"/>
+                <w:bCs w:val="false"/>
+                <w:sz w:val="17"/>
+                <w:szCs w:val="17"/>
+              </w:rPr>
+              <w:t xml:space="preserve">should:raise:  shouldnt:raise:</w:t>
+            </w:r>
+          </w:p>
+        </w:tc>
+        <w:tc>
+          <w:tcPr>
+            <w:tcW w:type="dxa" w:w="6638"/>
+            <w:tcBorders>
+              <w:top w:val="single" w:color="808080" w:sz="4"/>
+              <w:left w:val="single" w:color="808080" w:sz="4"/>
+              <w:bottom w:val="single" w:color="808080" w:sz="4"/>
+              <w:right w:val="single" w:color="808080" w:sz="4"/>
+            </w:tcBorders>
+            <w:tcMar>
+              <w:top w:type="dxa" w:w="50"/>
+              <w:left w:type="dxa" w:w="90"/>
+              <w:bottom w:type="dxa" w:w="50"/>
+              <w:right w:type="dxa" w:w="90"/>
+            </w:tcMar>
+          </w:tcPr>
+          <w:p>
+            <w:pPr>
+              <w:spacing w:after="0"/>
+            </w:pPr>
+            <w:r>
+              <w:rPr>
+                <w:rFonts w:ascii="Arial" w:cs="Arial" w:eastAsia="Arial" w:hAnsi="Arial"/>
+                <w:b w:val="false"/>
+                <w:bCs w:val="false"/>
+                <w:sz w:val="17"/>
+                <w:szCs w:val="17"/>
+              </w:rPr>
+              <w:t xml:space="preserve">Check that a block does, or does not, signal an exception</w:t>
+            </w:r>
+          </w:p>
+        </w:tc>
+      </w:tr>
+      <w:tr>
+        <w:trPr>
+          <w:cantSplit/>
+          <w:tblHeader w:val="false"/>
+        </w:trPr>
+        <w:tc>
+          <w:tcPr>
+            <w:tcW w:type="dxa" w:w="3000"/>
+            <w:tcBorders>
+              <w:top w:val="single" w:color="808080" w:sz="4"/>
+              <w:left w:val="single" w:color="808080" w:sz="4"/>
+              <w:bottom w:val="single" w:color="808080" w:sz="4"/>
+              <w:right w:val="single" w:color="808080" w:sz="4"/>
+            </w:tcBorders>
+            <w:tcMar>
+              <w:top w:type="dxa" w:w="50"/>
+              <w:left w:type="dxa" w:w="90"/>
+              <w:bottom w:type="dxa" w:w="50"/>
+              <w:right w:type="dxa" w:w="90"/>
+            </w:tcMar>
+          </w:tcPr>
+          <w:p>
+            <w:pPr>
+              <w:spacing w:after="0"/>
+            </w:pPr>
+            <w:r>
+              <w:rPr>
+                <w:rFonts w:ascii="Arial" w:cs="Arial" w:eastAsia="Arial" w:hAnsi="Arial"/>
+                <w:b w:val="false"/>
+                <w:bCs w:val="false"/>
+                <w:sz w:val="17"/>
+                <w:szCs w:val="17"/>
+              </w:rPr>
+              <w:t xml:space="preserve">fail  fail:</w:t>
+            </w:r>
+          </w:p>
+        </w:tc>
+        <w:tc>
+          <w:tcPr>
+            <w:tcW w:type="dxa" w:w="6638"/>
+            <w:tcBorders>
+              <w:top w:val="single" w:color="808080" w:sz="4"/>
+              <w:left w:val="single" w:color="808080" w:sz="4"/>
+              <w:bottom w:val="single" w:color="808080" w:sz="4"/>
+              <w:right w:val="single" w:color="808080" w:sz="4"/>
+            </w:tcBorders>
+            <w:tcMar>
+              <w:top w:type="dxa" w:w="50"/>
+              <w:left w:type="dxa" w:w="90"/>
+              <w:bottom w:type="dxa" w:w="50"/>
+              <w:right w:type="dxa" w:w="90"/>
+            </w:tcMar>
+          </w:tcPr>
+          <w:p>
+            <w:pPr>
+              <w:spacing w:after="0"/>
+            </w:pPr>
+            <w:r>
+              <w:rPr>
+                <w:rFonts w:ascii="Arial" w:cs="Arial" w:eastAsia="Arial" w:hAnsi="Arial"/>
+                <w:b w:val="false"/>
+                <w:bCs w:val="false"/>
+                <w:sz w:val="17"/>
+                <w:szCs w:val="17"/>
+              </w:rPr>
+              <w:t xml:space="preserve">Fail the test</w:t>
+            </w:r>
+          </w:p>
+        </w:tc>
+      </w:tr>
+      <w:tr>
+        <w:trPr>
+          <w:cantSplit/>
+          <w:tblHeader w:val="false"/>
+        </w:trPr>
+        <w:tc>
+          <w:tcPr>
+            <w:tcW w:type="dxa" w:w="3000"/>
+            <w:tcBorders>
+              <w:top w:val="single" w:color="808080" w:sz="4"/>
+              <w:left w:val="single" w:color="808080" w:sz="4"/>
+              <w:bottom w:val="single" w:color="808080" w:sz="4"/>
+              <w:right w:val="single" w:color="808080" w:sz="4"/>
+            </w:tcBorders>
+            <w:tcMar>
+              <w:top w:type="dxa" w:w="50"/>
+              <w:left w:type="dxa" w:w="90"/>
+              <w:bottom w:type="dxa" w:w="50"/>
+              <w:right w:type="dxa" w:w="90"/>
+            </w:tcMar>
+          </w:tcPr>
+          <w:p>
+            <w:pPr>
+              <w:spacing w:after="0"/>
+            </w:pPr>
+            <w:r>
+              <w:rPr>
+                <w:rFonts w:ascii="Arial" w:cs="Arial" w:eastAsia="Arial" w:hAnsi="Arial"/>
+                <w:b w:val="false"/>
+                <w:bCs w:val="false"/>
+                <w:sz w:val="17"/>
+                <w:szCs w:val="17"/>
+              </w:rPr>
+              <w:t xml:space="preserve">setUp  tearDown</w:t>
+            </w:r>
+          </w:p>
+        </w:tc>
+        <w:tc>
+          <w:tcPr>
+            <w:tcW w:type="dxa" w:w="6638"/>
+            <w:tcBorders>
+              <w:top w:val="single" w:color="808080" w:sz="4"/>
+              <w:left w:val="single" w:color="808080" w:sz="4"/>
+              <w:bottom w:val="single" w:color="808080" w:sz="4"/>
+              <w:right w:val="single" w:color="808080" w:sz="4"/>
+            </w:tcBorders>
+            <w:tcMar>
+              <w:top w:type="dxa" w:w="50"/>
+              <w:left w:type="dxa" w:w="90"/>
+              <w:bottom w:type="dxa" w:w="50"/>
+              <w:right w:type="dxa" w:w="90"/>
+            </w:tcMar>
+          </w:tcPr>
+          <w:p>
+            <w:pPr>
+              <w:spacing w:after="0"/>
+            </w:pPr>
+            <w:r>
+              <w:rPr>
+                <w:rFonts w:ascii="Arial" w:cs="Arial" w:eastAsia="Arial" w:hAnsi="Arial"/>
+                <w:b w:val="false"/>
+                <w:bCs w:val="false"/>
+                <w:sz w:val="17"/>
+                <w:szCs w:val="17"/>
+              </w:rPr>
+              <w:t xml:space="preserve">Override to make and to release the fixture</w:t>
+            </w:r>
+          </w:p>
+        </w:tc>
+      </w:tr>
+      <w:tr>
+        <w:trPr>
+          <w:cantSplit/>
+          <w:tblHeader w:val="false"/>
+        </w:trPr>
+        <w:tc>
+          <w:tcPr>
+            <w:tcW w:type="dxa" w:w="3000"/>
+            <w:tcBorders>
+              <w:top w:val="single" w:color="808080" w:sz="4"/>
+              <w:left w:val="single" w:color="808080" w:sz="4"/>
+              <w:bottom w:val="single" w:color="808080" w:sz="4"/>
+              <w:right w:val="single" w:color="808080" w:sz="4"/>
+            </w:tcBorders>
+            <w:tcMar>
+              <w:top w:type="dxa" w:w="50"/>
+              <w:left w:type="dxa" w:w="90"/>
+              <w:bottom w:type="dxa" w:w="50"/>
+              <w:right w:type="dxa" w:w="90"/>
+            </w:tcMar>
+          </w:tcPr>
+          <w:p>
+            <w:pPr>
+              <w:spacing w:after="0"/>
+            </w:pPr>
+            <w:r>
+              <w:rPr>
+                <w:rFonts w:ascii="Arial" w:cs="Arial" w:eastAsia="Arial" w:hAnsi="Arial"/>
+                <w:b w:val="false"/>
+                <w:bCs w:val="false"/>
+                <w:sz w:val="17"/>
+                <w:szCs w:val="17"/>
+              </w:rPr>
+              <w:t xml:space="preserve">run  runAndReport  suite  run:</w:t>
+            </w:r>
+          </w:p>
+        </w:tc>
+        <w:tc>
+          <w:tcPr>
+            <w:tcW w:type="dxa" w:w="6638"/>
+            <w:tcBorders>
+              <w:top w:val="single" w:color="808080" w:sz="4"/>
+              <w:left w:val="single" w:color="808080" w:sz="4"/>
+              <w:bottom w:val="single" w:color="808080" w:sz="4"/>
+              <w:right w:val="single" w:color="808080" w:sz="4"/>
+            </w:tcBorders>
+            <w:tcMar>
+              <w:top w:type="dxa" w:w="50"/>
+              <w:left w:type="dxa" w:w="90"/>
+              <w:bottom w:type="dxa" w:w="50"/>
+              <w:right w:type="dxa" w:w="90"/>
+            </w:tcMar>
+          </w:tcPr>
+          <w:p>
+            <w:pPr>
+              <w:spacing w:after="0"/>
+            </w:pPr>
+            <w:r>
+              <w:rPr>
+                <w:rFonts w:ascii="Arial" w:cs="Arial" w:eastAsia="Arial" w:hAnsi="Arial"/>
+                <w:b w:val="false"/>
+                <w:bCs w:val="false"/>
+                <w:sz w:val="17"/>
+                <w:szCs w:val="17"/>
+              </w:rPr>
+              <w:t xml:space="preserve">Class side: run all tests, run and report, answer the suite, run one test</w:t>
+            </w:r>
+          </w:p>
+        </w:tc>
+      </w:tr>
+    </w:tbl>
+    <w:p>
+      <w:pPr>
+        <w:spacing w:after="200" w:before="60"/>
+      </w:pPr>
+      <w:r>
+        <w:rPr>
+          <w:rFonts w:ascii="Arial" w:cs="Arial" w:eastAsia="Arial" w:hAnsi="Arial"/>
+          <w:b/>
+          <w:bCs/>
+          <w:sz w:val="18"/>
+          <w:szCs w:val="18"/>
+        </w:rPr>
+        <w:t xml:space="preserve">Figure 58. </w:t>
+      </w:r>
+      <w:r>
+        <w:rPr>
+          <w:rFonts w:ascii="Arial" w:cs="Arial" w:eastAsia="Arial" w:hAnsi="Arial"/>
+          <w:sz w:val="18"/>
+          <w:szCs w:val="18"/>
+        </w:rPr>
+        <w:t xml:space="preserve">Messages of TestCase</w:t>
+      </w:r>
+    </w:p>
+    <w:p>
+      <w:pPr>
+        <w:pStyle w:val="Heading1"/>
+        <w:pageBreakBefore/>
+        <w:pBdr>
+          <w:bottom w:val="single" w:color="000000" w:sz="12" w:space="4"/>
+        </w:pBdr>
+        <w:spacing w:after="240" w:before="0"/>
+      </w:pPr>
+      <w:r>
+        <w:rPr>
+          <w:rFonts w:ascii="Arial" w:cs="Arial" w:eastAsia="Arial" w:hAnsi="Arial"/>
+          <w:b/>
+          <w:bCs/>
+          <w:sz w:val="32"/>
+          <w:szCs w:val="32"/>
+        </w:rPr>
+        <w:t xml:space="preserve">Chapter 11. Processes</w:t>
+      </w:r>
+    </w:p>
+    <w:p>
+      <w:pPr>
+        <w:spacing w:after="120" w:line="264"/>
+      </w:pPr>
+      <w:r>
+        <w:rPr>
+          <w:rFonts w:ascii="Arial" w:cs="Arial" w:eastAsia="Arial" w:hAnsi="Arial"/>
+          <w:sz w:val="20"/>
+          <w:szCs w:val="20"/>
+        </w:rPr>
+        <w:t xml:space="preserve">Smalltalk/CREXX has Process, Semaphore, SharedQueue and Delay and a global Processor, but there is only one real thread of control. Processes are cooperative: a process runs until it ends or has to wait. Waiting is done by running the other ready processes inside the wait, which suits programs where a process waits for another to produce something, and does not suit programs that switch back and forth between two processes with yield.</w:t>
+      </w:r>
+    </w:p>
+    <w:p>
+      <w:pPr>
+        <w:pStyle w:val="Heading2"/>
+        <w:keepNext/>
+      </w:pPr>
+      <w:r>
+        <w:rPr>
+          <w:rFonts w:ascii="Arial" w:cs="Arial" w:eastAsia="Arial" w:hAnsi="Arial"/>
+          <w:b/>
+          <w:bCs/>
+          <w:sz w:val="24"/>
+          <w:szCs w:val="24"/>
+        </w:rPr>
+        <w:t xml:space="preserve">Starting processes</w:t>
+      </w:r>
+    </w:p>
+    <w:p>
+      <w:pPr>
+        <w:spacing w:after="120" w:line="264"/>
+      </w:pPr>
+      <w:r>
+        <w:rPr>
+          <w:rFonts w:ascii="Arial" w:cs="Arial" w:eastAsia="Arial" w:hAnsi="Arial"/>
+          <w:sz w:val="20"/>
+          <w:szCs w:val="20"/>
+        </w:rPr>
+        <w:t xml:space="preserve">aBlock fork makes a process with the priority of the running process and puts it in the ready queue; it starts when the running process waits or yields, or when the current top-level statement (or Eval) ends. forkAt: priority gives a priority; a process with a higher priority than the running one starts at once. newProcess makes a suspended process which resume starts. Processor activeProcess answers the running process. The priorities are Processor idlePriority (1) to highestPriority (9); user programs run at userSchedulingPriority (4); userBackgroundPriority is 3 and userInterruptPriority is 5. A Process answers priority, name, name:, state, isTerminated, isSuspended, resume, suspend and terminate. terminate runs the ensure: blocks. An error that is not handled in a process is reported on the Transcript and ends that process only.</w:t>
+      </w:r>
+    </w:p>
+    <w:p>
+      <w:pPr>
+        <w:keepNext/>
+        <w:keepLines/>
+        <w:pBdr>
+          <w:top w:val="single" w:color="808080" w:sz="4"/>
+          <w:left w:val="single" w:color="808080" w:sz="4"/>
+          <w:right w:val="single" w:color="808080" w:sz="4"/>
+        </w:pBdr>
+        <w:shd w:fill="F2F2F2" w:color="auto" w:val="clear"/>
+        <w:spacing w:after="0" w:line="240"/>
+        <w:ind w:left="100" w:right="100"/>
+      </w:pPr>
+      <w:r>
+        <w:rPr>
+          <w:rFonts w:ascii="Courier New" w:cs="Courier New" w:eastAsia="Courier New" w:hAnsi="Courier New"/>
+          <w:sz w:val="17"/>
+          <w:szCs w:val="17"/>
+        </w:rPr>
+        <w:t xml:space="preserve">| log |</w:t>
+      </w:r>
+    </w:p>
+    <w:p>
+      <w:pPr>
+        <w:keepNext/>
+        <w:keepLines/>
+        <w:pBdr>
+          <w:left w:val="single" w:color="808080" w:sz="4"/>
+          <w:right w:val="single" w:color="808080" w:sz="4"/>
+        </w:pBdr>
+        <w:shd w:fill="F2F2F2" w:color="auto" w:val="clear"/>
+        <w:spacing w:after="0" w:line="240"/>
+        <w:ind w:left="100" w:right="100"/>
+      </w:pPr>
+      <w:r>
+        <w:rPr>
+          <w:rFonts w:ascii="Courier New" w:cs="Courier New" w:eastAsia="Courier New" w:hAnsi="Courier New"/>
+          <w:sz w:val="17"/>
+          <w:szCs w:val="17"/>
+        </w:rPr>
+        <w:t xml:space="preserve">log := OrderedCollection new.</w:t>
+      </w:r>
+    </w:p>
+    <w:p>
+      <w:pPr>
+        <w:keepNext/>
+        <w:keepLines/>
+        <w:pBdr>
+          <w:left w:val="single" w:color="808080" w:sz="4"/>
+          <w:right w:val="single" w:color="808080" w:sz="4"/>
+        </w:pBdr>
+        <w:shd w:fill="F2F2F2" w:color="auto" w:val="clear"/>
+        <w:spacing w:after="0" w:line="240"/>
+        <w:ind w:left="100" w:right="100"/>
+      </w:pPr>
+      <w:r>
+        <w:rPr>
+          <w:rFonts w:ascii="Courier New" w:cs="Courier New" w:eastAsia="Courier New" w:hAnsi="Courier New"/>
+          <w:sz w:val="17"/>
+          <w:szCs w:val="17"/>
+        </w:rPr>
+        <w:t xml:space="preserve">Eval [</w:t>
+      </w:r>
+    </w:p>
+    <w:p>
+      <w:pPr>
+        <w:keepNext/>
+        <w:keepLines/>
+        <w:pBdr>
+          <w:left w:val="single" w:color="808080" w:sz="4"/>
+          <w:right w:val="single" w:color="808080" w:sz="4"/>
+        </w:pBdr>
+        <w:shd w:fill="F2F2F2" w:color="auto" w:val="clear"/>
+        <w:spacing w:after="0" w:line="240"/>
+        <w:ind w:left="100" w:right="100"/>
+      </w:pPr>
+      <w:r>
+        <w:rPr>
+          <w:rFonts w:ascii="Courier New" w:cs="Courier New" w:eastAsia="Courier New" w:hAnsi="Courier New"/>
+          <w:sz w:val="17"/>
+          <w:szCs w:val="17"/>
+        </w:rPr>
+        <w:t xml:space="preserve">    [log add: 'low'] forkAt: Processor userBackgroundPriority.</w:t>
+      </w:r>
+    </w:p>
+    <w:p>
+      <w:pPr>
+        <w:keepNext/>
+        <w:keepLines/>
+        <w:pBdr>
+          <w:left w:val="single" w:color="808080" w:sz="4"/>
+          <w:right w:val="single" w:color="808080" w:sz="4"/>
+        </w:pBdr>
+        <w:shd w:fill="F2F2F2" w:color="auto" w:val="clear"/>
+        <w:spacing w:after="0" w:line="240"/>
+        <w:ind w:left="100" w:right="100"/>
+      </w:pPr>
+      <w:r>
+        <w:rPr>
+          <w:rFonts w:ascii="Courier New" w:cs="Courier New" w:eastAsia="Courier New" w:hAnsi="Courier New"/>
+          <w:sz w:val="17"/>
+          <w:szCs w:val="17"/>
+        </w:rPr>
+        <w:t xml:space="preserve">    [log add: 'same'] fork.</w:t>
+      </w:r>
+    </w:p>
+    <w:p>
+      <w:pPr>
+        <w:keepNext/>
+        <w:keepLines/>
+        <w:pBdr>
+          <w:left w:val="single" w:color="808080" w:sz="4"/>
+          <w:right w:val="single" w:color="808080" w:sz="4"/>
+        </w:pBdr>
+        <w:shd w:fill="F2F2F2" w:color="auto" w:val="clear"/>
+        <w:spacing w:after="0" w:line="240"/>
+        <w:ind w:left="100" w:right="100"/>
+      </w:pPr>
+      <w:r>
+        <w:rPr>
+          <w:rFonts w:ascii="Courier New" w:cs="Courier New" w:eastAsia="Courier New" w:hAnsi="Courier New"/>
+          <w:sz w:val="17"/>
+          <w:szCs w:val="17"/>
+        </w:rPr>
+        <w:t xml:space="preserve">    [log add: 'high'] forkAt: Processor userInterruptPriority.</w:t>
+      </w:r>
+    </w:p>
+    <w:p>
+      <w:pPr>
+        <w:keepNext/>
+        <w:keepLines/>
+        <w:pBdr>
+          <w:left w:val="single" w:color="808080" w:sz="4"/>
+          <w:right w:val="single" w:color="808080" w:sz="4"/>
+        </w:pBdr>
+        <w:shd w:fill="F2F2F2" w:color="auto" w:val="clear"/>
+        <w:spacing w:after="0" w:line="240"/>
+        <w:ind w:left="100" w:right="100"/>
+      </w:pPr>
+      <w:r>
+        <w:rPr>
+          <w:rFonts w:ascii="Courier New" w:cs="Courier New" w:eastAsia="Courier New" w:hAnsi="Courier New"/>
+          <w:sz w:val="17"/>
+          <w:szCs w:val="17"/>
+        </w:rPr>
+        <w:t xml:space="preserve">    log add: 'main'.</w:t>
+      </w:r>
+    </w:p>
+    <w:p>
+      <w:pPr>
+        <w:keepNext/>
+        <w:keepLines/>
+        <w:pBdr>
+          <w:left w:val="single" w:color="808080" w:sz="4"/>
+          <w:right w:val="single" w:color="808080" w:sz="4"/>
+        </w:pBdr>
+        <w:shd w:fill="F2F2F2" w:color="auto" w:val="clear"/>
+        <w:spacing w:after="0" w:line="240"/>
+        <w:ind w:left="100" w:right="100"/>
+      </w:pPr>
+      <w:r>
+        <w:rPr>
+          <w:rFonts w:ascii="Courier New" w:cs="Courier New" w:eastAsia="Courier New" w:hAnsi="Courier New"/>
+          <w:sz w:val="17"/>
+          <w:szCs w:val="17"/>
+        </w:rPr>
+        <w:t xml:space="preserve">    Processor yield.</w:t>
+      </w:r>
+    </w:p>
+    <w:p>
+      <w:pPr>
+        <w:keepNext/>
+        <w:keepLines/>
+        <w:pBdr>
+          <w:left w:val="single" w:color="808080" w:sz="4"/>
+          <w:right w:val="single" w:color="808080" w:sz="4"/>
+        </w:pBdr>
+        <w:shd w:fill="F2F2F2" w:color="auto" w:val="clear"/>
+        <w:spacing w:after="0" w:line="240"/>
+        <w:ind w:left="100" w:right="100"/>
+      </w:pPr>
+      <w:r>
+        <w:rPr>
+          <w:rFonts w:ascii="Courier New" w:cs="Courier New" w:eastAsia="Courier New" w:hAnsi="Courier New"/>
+          <w:sz w:val="17"/>
+          <w:szCs w:val="17"/>
+        </w:rPr>
+        <w:t xml:space="preserve">    log add: 'after yield'</w:t>
+      </w:r>
+    </w:p>
+    <w:p>
+      <w:pPr>
+        <w:keepNext/>
+        <w:keepLines/>
+        <w:pBdr>
+          <w:left w:val="single" w:color="808080" w:sz="4"/>
+          <w:right w:val="single" w:color="808080" w:sz="4"/>
+        </w:pBdr>
+        <w:shd w:fill="F2F2F2" w:color="auto" w:val="clear"/>
+        <w:spacing w:after="0" w:line="240"/>
+        <w:ind w:left="100" w:right="100"/>
+      </w:pPr>
+      <w:r>
+        <w:rPr>
+          <w:rFonts w:ascii="Courier New" w:cs="Courier New" w:eastAsia="Courier New" w:hAnsi="Courier New"/>
+          <w:sz w:val="17"/>
+          <w:szCs w:val="17"/>
+        </w:rPr>
+        <w:t xml:space="preserve">]</w:t>
+      </w:r>
+    </w:p>
+    <w:p>
+      <w:pPr>
+        <w:keepNext/>
+        <w:keepLines/>
+        <w:pBdr>
+          <w:left w:val="single" w:color="808080" w:sz="4"/>
+          <w:right w:val="single" w:color="808080" w:sz="4"/>
+        </w:pBdr>
+        <w:shd w:fill="F2F2F2" w:color="auto" w:val="clear"/>
+        <w:spacing w:after="0" w:line="240"/>
+        <w:ind w:left="100" w:right="100"/>
+      </w:pPr>
+      <w:r>
+        <w:rPr>
+          <w:rFonts w:ascii="Courier New" w:cs="Courier New" w:eastAsia="Courier New" w:hAnsi="Courier New"/>
+          <w:sz w:val="17"/>
+          <w:szCs w:val="17"/>
+        </w:rPr>
+        <w:t xml:space="preserve">log printNl.</w:t>
+      </w:r>
+    </w:p>
+    <w:p>
+      <w:pPr>
+        <w:keepNext/>
+        <w:keepLines/>
+        <w:pBdr>
+          <w:left w:val="single" w:color="808080" w:sz="4"/>
+          <w:right w:val="single" w:color="808080" w:sz="4"/>
+        </w:pBdr>
+        <w:shd w:fill="F2F2F2" w:color="auto" w:val="clear"/>
+        <w:spacing w:after="0" w:line="240"/>
+        <w:ind w:left="100" w:right="100"/>
+      </w:pPr>
+      <w:r>
+        <w:rPr>
+          <w:rFonts w:ascii="Courier New" w:cs="Courier New" w:eastAsia="Courier New" w:hAnsi="Courier New"/>
+          <w:sz w:val="17"/>
+          <w:szCs w:val="17"/>
+        </w:rPr>
+        <w:t xml:space="preserve"> </w:t>
+      </w:r>
+    </w:p>
+    <w:p>
+      <w:pPr>
+        <w:keepNext w:val="false"/>
+        <w:keepLines/>
+        <w:pBdr>
+          <w:bottom w:val="single" w:color="808080" w:sz="4"/>
+          <w:left w:val="single" w:color="808080" w:sz="4"/>
+          <w:right w:val="single" w:color="808080" w:sz="4"/>
+        </w:pBdr>
+        <w:shd w:fill="F2F2F2" w:color="auto" w:val="clear"/>
+        <w:spacing w:after="0" w:line="240"/>
+        <w:ind w:left="100" w:right="100"/>
+      </w:pPr>
+      <w:r>
+        <w:rPr>
+          <w:rFonts w:ascii="Courier New" w:cs="Courier New" w:eastAsia="Courier New" w:hAnsi="Courier New"/>
+          <w:sz w:val="17"/>
+          <w:szCs w:val="17"/>
+        </w:rPr>
+        <w:t xml:space="preserve">OrderedCollection ('high' 'main' 'same' 'after yield' 'low' )</w:t>
+      </w:r>
+    </w:p>
+    <w:p>
+      <w:pPr>
+        <w:spacing w:after="200" w:before="60"/>
+      </w:pPr>
+      <w:r>
+        <w:rPr>
+          <w:rFonts w:ascii="Arial" w:cs="Arial" w:eastAsia="Arial" w:hAnsi="Arial"/>
+          <w:b/>
+          <w:bCs/>
+          <w:sz w:val="18"/>
+          <w:szCs w:val="18"/>
+        </w:rPr>
+        <w:t xml:space="preserve">Figure 59. </w:t>
+      </w:r>
+      <w:r>
+        <w:rPr>
+          <w:rFonts w:ascii="Arial" w:cs="Arial" w:eastAsia="Arial" w:hAnsi="Arial"/>
+          <w:sz w:val="18"/>
+          <w:szCs w:val="18"/>
+        </w:rPr>
+        <w:t xml:space="preserve">Fork and priorities</w:t>
+      </w:r>
+    </w:p>
+    <w:p>
+      <w:pPr>
+        <w:pStyle w:val="Heading2"/>
+        <w:keepNext/>
+      </w:pPr>
+      <w:r>
+        <w:rPr>
+          <w:rFonts w:ascii="Arial" w:cs="Arial" w:eastAsia="Arial" w:hAnsi="Arial"/>
+          <w:b/>
+          <w:bCs/>
+          <w:sz w:val="24"/>
+          <w:szCs w:val="24"/>
+        </w:rPr>
+        <w:t xml:space="preserve">Semaphores, queues and delays</w:t>
+      </w:r>
+    </w:p>
+    <w:p>
+      <w:pPr>
+        <w:spacing w:after="120" w:line="264"/>
+      </w:pPr>
+      <w:r>
+        <w:rPr>
+          <w:rFonts w:ascii="Arial" w:cs="Arial" w:eastAsia="Arial" w:hAnsi="Arial"/>
+          <w:sz w:val="20"/>
+          <w:szCs w:val="20"/>
+        </w:rPr>
+        <w:t xml:space="preserve">A Semaphore counts signals. signal adds one; wait takes one and, if there is none, lets the other processes run until there is one. Semaphore forMutualExclusion makes a semaphore with one signal, and critical: aBlock runs the block with the semaphore held. A SharedQueue passes objects between processes: nextPut: adds one and next waits for one. Delay forMilliseconds: n and Delay forSeconds: n answer a delay whose wait lets other processes run for that time and then sleeps. A wait that no other process can end is a deadlock; it is reported as an Error and the statement is abandoned.</w:t>
+      </w:r>
+    </w:p>
+    <w:p>
+      <w:pPr>
+        <w:keepNext/>
+        <w:keepLines/>
+        <w:pBdr>
+          <w:top w:val="single" w:color="808080" w:sz="4"/>
+          <w:left w:val="single" w:color="808080" w:sz="4"/>
+          <w:right w:val="single" w:color="808080" w:sz="4"/>
+        </w:pBdr>
+        <w:shd w:fill="F2F2F2" w:color="auto" w:val="clear"/>
+        <w:spacing w:after="0" w:line="240"/>
+        <w:ind w:left="100" w:right="100"/>
+      </w:pPr>
+      <w:r>
+        <w:rPr>
+          <w:rFonts w:ascii="Courier New" w:cs="Courier New" w:eastAsia="Courier New" w:hAnsi="Courier New"/>
+          <w:sz w:val="17"/>
+          <w:szCs w:val="17"/>
+        </w:rPr>
+        <w:t xml:space="preserve">| q results |</w:t>
+      </w:r>
+    </w:p>
+    <w:p>
+      <w:pPr>
+        <w:keepNext/>
+        <w:keepLines/>
+        <w:pBdr>
+          <w:left w:val="single" w:color="808080" w:sz="4"/>
+          <w:right w:val="single" w:color="808080" w:sz="4"/>
+        </w:pBdr>
+        <w:shd w:fill="F2F2F2" w:color="auto" w:val="clear"/>
+        <w:spacing w:after="0" w:line="240"/>
+        <w:ind w:left="100" w:right="100"/>
+      </w:pPr>
+      <w:r>
+        <w:rPr>
+          <w:rFonts w:ascii="Courier New" w:cs="Courier New" w:eastAsia="Courier New" w:hAnsi="Courier New"/>
+          <w:sz w:val="17"/>
+          <w:szCs w:val="17"/>
+        </w:rPr>
+        <w:t xml:space="preserve">q := SharedQueue new.</w:t>
+      </w:r>
+    </w:p>
+    <w:p>
+      <w:pPr>
+        <w:keepNext/>
+        <w:keepLines/>
+        <w:pBdr>
+          <w:left w:val="single" w:color="808080" w:sz="4"/>
+          <w:right w:val="single" w:color="808080" w:sz="4"/>
+        </w:pBdr>
+        <w:shd w:fill="F2F2F2" w:color="auto" w:val="clear"/>
+        <w:spacing w:after="0" w:line="240"/>
+        <w:ind w:left="100" w:right="100"/>
+      </w:pPr>
+      <w:r>
+        <w:rPr>
+          <w:rFonts w:ascii="Courier New" w:cs="Courier New" w:eastAsia="Courier New" w:hAnsi="Courier New"/>
+          <w:sz w:val="17"/>
+          <w:szCs w:val="17"/>
+        </w:rPr>
+        <w:t xml:space="preserve">results := OrderedCollection new.</w:t>
+      </w:r>
+    </w:p>
+    <w:p>
+      <w:pPr>
+        <w:keepNext/>
+        <w:keepLines/>
+        <w:pBdr>
+          <w:left w:val="single" w:color="808080" w:sz="4"/>
+          <w:right w:val="single" w:color="808080" w:sz="4"/>
+        </w:pBdr>
+        <w:shd w:fill="F2F2F2" w:color="auto" w:val="clear"/>
+        <w:spacing w:after="0" w:line="240"/>
+        <w:ind w:left="100" w:right="100"/>
+      </w:pPr>
+      <w:r>
+        <w:rPr>
+          <w:rFonts w:ascii="Courier New" w:cs="Courier New" w:eastAsia="Courier New" w:hAnsi="Courier New"/>
+          <w:sz w:val="17"/>
+          <w:szCs w:val="17"/>
+        </w:rPr>
+        <w:t xml:space="preserve">[1 to: 5 do: [:i | q nextPut: i * i]. q nextPut: nil] fork.</w:t>
+      </w:r>
+    </w:p>
+    <w:p>
+      <w:pPr>
+        <w:keepNext/>
+        <w:keepLines/>
+        <w:pBdr>
+          <w:left w:val="single" w:color="808080" w:sz="4"/>
+          <w:right w:val="single" w:color="808080" w:sz="4"/>
+        </w:pBdr>
+        <w:shd w:fill="F2F2F2" w:color="auto" w:val="clear"/>
+        <w:spacing w:after="0" w:line="240"/>
+        <w:ind w:left="100" w:right="100"/>
+      </w:pPr>
+      <w:r>
+        <w:rPr>
+          <w:rFonts w:ascii="Courier New" w:cs="Courier New" w:eastAsia="Courier New" w:hAnsi="Courier New"/>
+          <w:sz w:val="17"/>
+          <w:szCs w:val="17"/>
+        </w:rPr>
+        <w:t xml:space="preserve">[| v | [(v := q next) notNil] whileTrue: [results add: v]] fork.</w:t>
+      </w:r>
+    </w:p>
+    <w:p>
+      <w:pPr>
+        <w:keepNext/>
+        <w:keepLines/>
+        <w:pBdr>
+          <w:left w:val="single" w:color="808080" w:sz="4"/>
+          <w:right w:val="single" w:color="808080" w:sz="4"/>
+        </w:pBdr>
+        <w:shd w:fill="F2F2F2" w:color="auto" w:val="clear"/>
+        <w:spacing w:after="0" w:line="240"/>
+        <w:ind w:left="100" w:right="100"/>
+      </w:pPr>
+      <w:r>
+        <w:rPr>
+          <w:rFonts w:ascii="Courier New" w:cs="Courier New" w:eastAsia="Courier New" w:hAnsi="Courier New"/>
+          <w:sz w:val="17"/>
+          <w:szCs w:val="17"/>
+        </w:rPr>
+        <w:t xml:space="preserve">Processor yield.</w:t>
+      </w:r>
+    </w:p>
+    <w:p>
+      <w:pPr>
+        <w:keepNext/>
+        <w:keepLines/>
+        <w:pBdr>
+          <w:left w:val="single" w:color="808080" w:sz="4"/>
+          <w:right w:val="single" w:color="808080" w:sz="4"/>
+        </w:pBdr>
+        <w:shd w:fill="F2F2F2" w:color="auto" w:val="clear"/>
+        <w:spacing w:after="0" w:line="240"/>
+        <w:ind w:left="100" w:right="100"/>
+      </w:pPr>
+      <w:r>
+        <w:rPr>
+          <w:rFonts w:ascii="Courier New" w:cs="Courier New" w:eastAsia="Courier New" w:hAnsi="Courier New"/>
+          <w:sz w:val="17"/>
+          <w:szCs w:val="17"/>
+        </w:rPr>
+        <w:t xml:space="preserve">results printNl.</w:t>
+      </w:r>
+    </w:p>
+    <w:p>
+      <w:pPr>
+        <w:keepNext/>
+        <w:keepLines/>
+        <w:pBdr>
+          <w:left w:val="single" w:color="808080" w:sz="4"/>
+          <w:right w:val="single" w:color="808080" w:sz="4"/>
+        </w:pBdr>
+        <w:shd w:fill="F2F2F2" w:color="auto" w:val="clear"/>
+        <w:spacing w:after="0" w:line="240"/>
+        <w:ind w:left="100" w:right="100"/>
+      </w:pPr>
+      <w:r>
+        <w:rPr>
+          <w:rFonts w:ascii="Courier New" w:cs="Courier New" w:eastAsia="Courier New" w:hAnsi="Courier New"/>
+          <w:sz w:val="17"/>
+          <w:szCs w:val="17"/>
+        </w:rPr>
+        <w:t xml:space="preserve"> </w:t>
+      </w:r>
+    </w:p>
+    <w:p>
+      <w:pPr>
+        <w:keepNext w:val="false"/>
+        <w:keepLines/>
+        <w:pBdr>
+          <w:bottom w:val="single" w:color="808080" w:sz="4"/>
+          <w:left w:val="single" w:color="808080" w:sz="4"/>
+          <w:right w:val="single" w:color="808080" w:sz="4"/>
+        </w:pBdr>
+        <w:shd w:fill="F2F2F2" w:color="auto" w:val="clear"/>
+        <w:spacing w:after="0" w:line="240"/>
+        <w:ind w:left="100" w:right="100"/>
+      </w:pPr>
+      <w:r>
+        <w:rPr>
+          <w:rFonts w:ascii="Courier New" w:cs="Courier New" w:eastAsia="Courier New" w:hAnsi="Courier New"/>
+          <w:sz w:val="17"/>
+          <w:szCs w:val="17"/>
+        </w:rPr>
+        <w:t xml:space="preserve">OrderedCollection (1 4 9 16 25 )</w:t>
+      </w:r>
+    </w:p>
+    <w:p>
+      <w:pPr>
+        <w:spacing w:after="200" w:before="60"/>
+      </w:pPr>
+      <w:r>
+        <w:rPr>
+          <w:rFonts w:ascii="Arial" w:cs="Arial" w:eastAsia="Arial" w:hAnsi="Arial"/>
+          <w:b/>
+          <w:bCs/>
+          <w:sz w:val="18"/>
+          <w:szCs w:val="18"/>
+        </w:rPr>
+        <w:t xml:space="preserve">Figure 60. </w:t>
+      </w:r>
+      <w:r>
+        <w:rPr>
+          <w:rFonts w:ascii="Arial" w:cs="Arial" w:eastAsia="Arial" w:hAnsi="Arial"/>
+          <w:sz w:val="18"/>
+          <w:szCs w:val="18"/>
+        </w:rPr>
+        <w:t xml:space="preserve">Producer and consumer</w:t>
+      </w:r>
+    </w:p>
+    <w:p>
+      <w:pPr>
+        <w:pStyle w:val="Heading1"/>
+        <w:pageBreakBefore/>
+        <w:pBdr>
+          <w:bottom w:val="single" w:color="000000" w:sz="12" w:space="4"/>
+        </w:pBdr>
+        <w:spacing w:after="240" w:before="0"/>
+      </w:pPr>
+      <w:r>
+        <w:rPr>
+          <w:rFonts w:ascii="Arial" w:cs="Arial" w:eastAsia="Arial" w:hAnsi="Arial"/>
+          <w:b/>
+          <w:bCs/>
+          <w:sz w:val="32"/>
+          <w:szCs w:val="32"/>
+        </w:rPr>
+        <w:t xml:space="preserve">Chapter 12. Exceptions</w:t>
+      </w:r>
+    </w:p>
+    <w:p>
+      <w:pPr>
+        <w:pStyle w:val="Heading2"/>
+        <w:keepNext/>
+      </w:pPr>
+      <w:r>
+        <w:rPr>
+          <w:rFonts w:ascii="Arial" w:cs="Arial" w:eastAsia="Arial" w:hAnsi="Arial"/>
+          <w:b/>
+          <w:bCs/>
+          <w:sz w:val="24"/>
+          <w:szCs w:val="24"/>
+        </w:rPr>
+        <w:t xml:space="preserve">Handling</w:t>
+      </w:r>
+    </w:p>
+    <w:p>
+      <w:pPr>
+        <w:spacing w:after="120" w:line="264"/>
+      </w:pPr>
+      <w:r>
+        <w:rPr>
+          <w:rFonts w:ascii="Arial" w:cs="Arial" w:eastAsia="Arial" w:hAnsi="Arial"/>
+          <w:sz w:val="20"/>
+          <w:szCs w:val="20"/>
+        </w:rPr>
+        <w:t xml:space="preserve">aBlock on: ExceptionClass do: [:e | ... ] evaluates the block. If an exception of that class (or a subclass) is signaled while it runs, the handler block is evaluated with the exception as its argument. The value of the handler block becomes the value of the on:do: expression. A handler for several classes uses a set: on: ZeroDivide, MessageNotUnderstood do: [...].</w:t>
+      </w:r>
+    </w:p>
+    <w:p>
+      <w:pPr>
+        <w:keepNext/>
+        <w:keepLines/>
+        <w:pBdr>
+          <w:top w:val="single" w:color="808080" w:sz="4"/>
+          <w:left w:val="single" w:color="808080" w:sz="4"/>
+          <w:right w:val="single" w:color="808080" w:sz="4"/>
+        </w:pBdr>
+        <w:shd w:fill="F2F2F2" w:color="auto" w:val="clear"/>
+        <w:spacing w:after="0" w:line="240"/>
+        <w:ind w:left="100" w:right="100"/>
+      </w:pPr>
+      <w:r>
+        <w:rPr>
+          <w:rFonts w:ascii="Courier New" w:cs="Courier New" w:eastAsia="Courier New" w:hAnsi="Courier New"/>
+          <w:sz w:val="17"/>
+          <w:szCs w:val="17"/>
+        </w:rPr>
+        <w:t xml:space="preserve">| r |</w:t>
+      </w:r>
+    </w:p>
+    <w:p>
+      <w:pPr>
+        <w:keepNext/>
+        <w:keepLines/>
+        <w:pBdr>
+          <w:left w:val="single" w:color="808080" w:sz="4"/>
+          <w:right w:val="single" w:color="808080" w:sz="4"/>
+        </w:pBdr>
+        <w:shd w:fill="F2F2F2" w:color="auto" w:val="clear"/>
+        <w:spacing w:after="0" w:line="240"/>
+        <w:ind w:left="100" w:right="100"/>
+      </w:pPr>
+      <w:r>
+        <w:rPr>
+          <w:rFonts w:ascii="Courier New" w:cs="Courier New" w:eastAsia="Courier New" w:hAnsi="Courier New"/>
+          <w:sz w:val="17"/>
+          <w:szCs w:val="17"/>
+        </w:rPr>
+        <w:t xml:space="preserve">r := [10 / 0] on: ZeroDivide do: [:e | e messageText displayNl. -1].</w:t>
+      </w:r>
+    </w:p>
+    <w:p>
+      <w:pPr>
+        <w:keepNext/>
+        <w:keepLines/>
+        <w:pBdr>
+          <w:left w:val="single" w:color="808080" w:sz="4"/>
+          <w:right w:val="single" w:color="808080" w:sz="4"/>
+        </w:pBdr>
+        <w:shd w:fill="F2F2F2" w:color="auto" w:val="clear"/>
+        <w:spacing w:after="0" w:line="240"/>
+        <w:ind w:left="100" w:right="100"/>
+      </w:pPr>
+      <w:r>
+        <w:rPr>
+          <w:rFonts w:ascii="Courier New" w:cs="Courier New" w:eastAsia="Courier New" w:hAnsi="Courier New"/>
+          <w:sz w:val="17"/>
+          <w:szCs w:val="17"/>
+        </w:rPr>
+        <w:t xml:space="preserve">r printNl.</w:t>
+      </w:r>
+    </w:p>
+    <w:p>
+      <w:pPr>
+        <w:keepNext/>
+        <w:keepLines/>
+        <w:pBdr>
+          <w:left w:val="single" w:color="808080" w:sz="4"/>
+          <w:right w:val="single" w:color="808080" w:sz="4"/>
+        </w:pBdr>
+        <w:shd w:fill="F2F2F2" w:color="auto" w:val="clear"/>
+        <w:spacing w:after="0" w:line="240"/>
+        <w:ind w:left="100" w:right="100"/>
+      </w:pPr>
+      <w:r>
+        <w:rPr>
+          <w:rFonts w:ascii="Courier New" w:cs="Courier New" w:eastAsia="Courier New" w:hAnsi="Courier New"/>
+          <w:sz w:val="17"/>
+          <w:szCs w:val="17"/>
+        </w:rPr>
+        <w:t xml:space="preserve">r := [nil foo] on: MessageNotUnderstood do: [:e | e return: 3].</w:t>
+      </w:r>
+    </w:p>
+    <w:p>
+      <w:pPr>
+        <w:keepNext/>
+        <w:keepLines/>
+        <w:pBdr>
+          <w:left w:val="single" w:color="808080" w:sz="4"/>
+          <w:right w:val="single" w:color="808080" w:sz="4"/>
+        </w:pBdr>
+        <w:shd w:fill="F2F2F2" w:color="auto" w:val="clear"/>
+        <w:spacing w:after="0" w:line="240"/>
+        <w:ind w:left="100" w:right="100"/>
+      </w:pPr>
+      <w:r>
+        <w:rPr>
+          <w:rFonts w:ascii="Courier New" w:cs="Courier New" w:eastAsia="Courier New" w:hAnsi="Courier New"/>
+          <w:sz w:val="17"/>
+          <w:szCs w:val="17"/>
+        </w:rPr>
+        <w:t xml:space="preserve">r printNl.</w:t>
+      </w:r>
+    </w:p>
+    <w:p>
+      <w:pPr>
+        <w:keepNext/>
+        <w:keepLines/>
+        <w:pBdr>
+          <w:left w:val="single" w:color="808080" w:sz="4"/>
+          <w:right w:val="single" w:color="808080" w:sz="4"/>
+        </w:pBdr>
+        <w:shd w:fill="F2F2F2" w:color="auto" w:val="clear"/>
+        <w:spacing w:after="0" w:line="240"/>
+        <w:ind w:left="100" w:right="100"/>
+      </w:pPr>
+      <w:r>
+        <w:rPr>
+          <w:rFonts w:ascii="Courier New" w:cs="Courier New" w:eastAsia="Courier New" w:hAnsi="Courier New"/>
+          <w:sz w:val="17"/>
+          <w:szCs w:val="17"/>
+        </w:rPr>
+        <w:t xml:space="preserve">r := [#(1 2) at: 5] on: Error do: [:e | e messageText].</w:t>
+      </w:r>
+    </w:p>
+    <w:p>
+      <w:pPr>
+        <w:keepNext/>
+        <w:keepLines/>
+        <w:pBdr>
+          <w:left w:val="single" w:color="808080" w:sz="4"/>
+          <w:right w:val="single" w:color="808080" w:sz="4"/>
+        </w:pBdr>
+        <w:shd w:fill="F2F2F2" w:color="auto" w:val="clear"/>
+        <w:spacing w:after="0" w:line="240"/>
+        <w:ind w:left="100" w:right="100"/>
+      </w:pPr>
+      <w:r>
+        <w:rPr>
+          <w:rFonts w:ascii="Courier New" w:cs="Courier New" w:eastAsia="Courier New" w:hAnsi="Courier New"/>
+          <w:sz w:val="17"/>
+          <w:szCs w:val="17"/>
+        </w:rPr>
+        <w:t xml:space="preserve">r displayNl.</w:t>
+      </w:r>
+    </w:p>
+    <w:p>
+      <w:pPr>
+        <w:keepNext/>
+        <w:keepLines/>
+        <w:pBdr>
+          <w:left w:val="single" w:color="808080" w:sz="4"/>
+          <w:right w:val="single" w:color="808080" w:sz="4"/>
+        </w:pBdr>
+        <w:shd w:fill="F2F2F2" w:color="auto" w:val="clear"/>
+        <w:spacing w:after="0" w:line="240"/>
+        <w:ind w:left="100" w:right="100"/>
+      </w:pPr>
+      <w:r>
+        <w:rPr>
+          <w:rFonts w:ascii="Courier New" w:cs="Courier New" w:eastAsia="Courier New" w:hAnsi="Courier New"/>
+          <w:sz w:val="17"/>
+          <w:szCs w:val="17"/>
+        </w:rPr>
+        <w:t xml:space="preserve"> </w:t>
+      </w:r>
+    </w:p>
+    <w:p>
+      <w:pPr>
+        <w:keepNext/>
+        <w:keepLines/>
+        <w:pBdr>
+          <w:left w:val="single" w:color="808080" w:sz="4"/>
+          <w:right w:val="single" w:color="808080" w:sz="4"/>
+        </w:pBdr>
+        <w:shd w:fill="F2F2F2" w:color="auto" w:val="clear"/>
+        <w:spacing w:after="0" w:line="240"/>
+        <w:ind w:left="100" w:right="100"/>
+      </w:pPr>
+      <w:r>
+        <w:rPr>
+          <w:rFonts w:ascii="Courier New" w:cs="Courier New" w:eastAsia="Courier New" w:hAnsi="Courier New"/>
+          <w:sz w:val="17"/>
+          <w:szCs w:val="17"/>
+        </w:rPr>
+        <w:t xml:space="preserve">The program attempted to divide a number by zero</w:t>
+      </w:r>
+    </w:p>
+    <w:p>
+      <w:pPr>
+        <w:keepNext/>
+        <w:keepLines/>
+        <w:pBdr>
+          <w:left w:val="single" w:color="808080" w:sz="4"/>
+          <w:right w:val="single" w:color="808080" w:sz="4"/>
+        </w:pBdr>
+        <w:shd w:fill="F2F2F2" w:color="auto" w:val="clear"/>
+        <w:spacing w:after="0" w:line="240"/>
+        <w:ind w:left="100" w:right="100"/>
+      </w:pPr>
+      <w:r>
+        <w:rPr>
+          <w:rFonts w:ascii="Courier New" w:cs="Courier New" w:eastAsia="Courier New" w:hAnsi="Courier New"/>
+          <w:sz w:val="17"/>
+          <w:szCs w:val="17"/>
+        </w:rPr>
+        <w:t xml:space="preserve">-1</w:t>
+      </w:r>
+    </w:p>
+    <w:p>
+      <w:pPr>
+        <w:keepNext/>
+        <w:keepLines/>
+        <w:pBdr>
+          <w:left w:val="single" w:color="808080" w:sz="4"/>
+          <w:right w:val="single" w:color="808080" w:sz="4"/>
+        </w:pBdr>
+        <w:shd w:fill="F2F2F2" w:color="auto" w:val="clear"/>
+        <w:spacing w:after="0" w:line="240"/>
+        <w:ind w:left="100" w:right="100"/>
+      </w:pPr>
+      <w:r>
+        <w:rPr>
+          <w:rFonts w:ascii="Courier New" w:cs="Courier New" w:eastAsia="Courier New" w:hAnsi="Courier New"/>
+          <w:sz w:val="17"/>
+          <w:szCs w:val="17"/>
+        </w:rPr>
+        <w:t xml:space="preserve">3</w:t>
+      </w:r>
+    </w:p>
+    <w:p>
+      <w:pPr>
+        <w:keepNext w:val="false"/>
+        <w:keepLines/>
+        <w:pBdr>
+          <w:bottom w:val="single" w:color="808080" w:sz="4"/>
+          <w:left w:val="single" w:color="808080" w:sz="4"/>
+          <w:right w:val="single" w:color="808080" w:sz="4"/>
+        </w:pBdr>
+        <w:shd w:fill="F2F2F2" w:color="auto" w:val="clear"/>
+        <w:spacing w:after="0" w:line="240"/>
+        <w:ind w:left="100" w:right="100"/>
+      </w:pPr>
+      <w:r>
+        <w:rPr>
+          <w:rFonts w:ascii="Courier New" w:cs="Courier New" w:eastAsia="Courier New" w:hAnsi="Courier New"/>
+          <w:sz w:val="17"/>
+          <w:szCs w:val="17"/>
+        </w:rPr>
+        <w:t xml:space="preserve">Index value 5 out of range: only 2 elements</w:t>
+      </w:r>
+    </w:p>
+    <w:p>
+      <w:pPr>
+        <w:spacing w:after="200" w:before="60"/>
+      </w:pPr>
+      <w:r>
+        <w:rPr>
+          <w:rFonts w:ascii="Arial" w:cs="Arial" w:eastAsia="Arial" w:hAnsi="Arial"/>
+          <w:b/>
+          <w:bCs/>
+          <w:sz w:val="18"/>
+          <w:szCs w:val="18"/>
+        </w:rPr>
+        <w:t xml:space="preserve">Figure 61. </w:t>
       </w:r>
       <w:r>
         <w:rPr>
@@ -27922,7 +29635,7 @@
           <w:sz w:val="18"/>
           <w:szCs w:val="18"/>
         </w:rPr>
-        <w:t xml:space="preserve">Figure 58. </w:t>
+        <w:t xml:space="preserve">Figure 62. </w:t>
       </w:r>
       <w:r>
         <w:rPr>
@@ -28228,7 +29941,7 @@
           <w:sz w:val="18"/>
           <w:szCs w:val="18"/>
         </w:rPr>
-        <w:t xml:space="preserve">Figure 59. </w:t>
+        <w:t xml:space="preserve">Figure 63. </w:t>
       </w:r>
       <w:r>
         <w:rPr>
@@ -28610,7 +30323,7 @@
           <w:sz w:val="18"/>
           <w:szCs w:val="18"/>
         </w:rPr>
-        <w:t xml:space="preserve">Figure 60. </w:t>
+        <w:t xml:space="preserve">Figure 64. </w:t>
       </w:r>
       <w:r>
         <w:rPr>
@@ -28937,7 +30650,7 @@
           <w:sz w:val="18"/>
           <w:szCs w:val="18"/>
         </w:rPr>
-        <w:t xml:space="preserve">Figure 61. </w:t>
+        <w:t xml:space="preserve">Figure 65. </w:t>
       </w:r>
       <w:r>
         <w:rPr>
@@ -28965,7 +30678,7 @@
           <w:sz w:val="32"/>
           <w:szCs w:val="32"/>
         </w:rPr>
-        <w:t xml:space="preserve">Chapter 11. Reflection and the System</w:t>
+        <w:t xml:space="preserve">Chapter 13. Reflection and the System</w:t>
       </w:r>
     </w:p>
     <w:p>
@@ -29645,7 +31358,7 @@
           <w:sz w:val="18"/>
           <w:szCs w:val="18"/>
         </w:rPr>
-        <w:t xml:space="preserve">Figure 62. </w:t>
+        <w:t xml:space="preserve">Figure 66. </w:t>
       </w:r>
       <w:r>
         <w:rPr>
@@ -30263,7 +31976,7 @@
           <w:sz w:val="18"/>
           <w:szCs w:val="18"/>
         </w:rPr>
-        <w:t xml:space="preserve">Figure 63. </w:t>
+        <w:t xml:space="preserve">Figure 67. </w:t>
       </w:r>
       <w:r>
         <w:rPr>
@@ -30624,7 +32337,7 @@
           <w:sz w:val="18"/>
           <w:szCs w:val="18"/>
         </w:rPr>
-        <w:t xml:space="preserve">Figure 64. </w:t>
+        <w:t xml:space="preserve">Figure 68. </w:t>
       </w:r>
       <w:r>
         <w:rPr>
@@ -30679,6 +32392,346 @@
     </w:p>
     <w:p>
       <w:pPr>
+        <w:pStyle w:val="Heading2"/>
+        <w:keepNext/>
+      </w:pPr>
+      <w:r>
+        <w:rPr>
+          <w:rFonts w:ascii="Arial" w:cs="Arial" w:eastAsia="Arial" w:hAnsi="Arial"/>
+          <w:b/>
+          <w:bCs/>
+          <w:sz w:val="24"/>
+          <w:szCs w:val="24"/>
+        </w:rPr>
+        <w:t xml:space="preserve">Contexts and compiling at run time</w:t>
+      </w:r>
+    </w:p>
+    <w:p>
+      <w:pPr>
+        <w:spacing w:after="120" w:line="264"/>
+      </w:pPr>
+      <w:r>
+        <w:rPr>
+          <w:rFonts w:ascii="Arial" w:cs="Arial" w:eastAsia="Arial" w:hAnsi="Arial"/>
+          <w:sz w:val="20"/>
+          <w:szCs w:val="20"/>
+        </w:rPr>
+        <w:t xml:space="preserve">thisContext answers a Context for the running method. A Context answers receiver, selector, methodClass, sender (the Context of the caller, nil at the top), depth, backtrace (which writes the stack on the Transcript) and backtraceString. It is a snapshot taken when thisContext is evaluated; it cannot be used to change the stack.</w:t>
+      </w:r>
+    </w:p>
+    <w:p>
+      <w:pPr>
+        <w:spacing w:after="120" w:line="264"/>
+      </w:pPr>
+      <w:r>
+        <w:rPr>
+          <w:rFonts w:ascii="Arial" w:cs="Arial" w:eastAsia="Arial" w:hAnsi="Arial"/>
+          <w:sz w:val="20"/>
+          <w:szCs w:val="20"/>
+        </w:rPr>
+        <w:t xml:space="preserve">Smalltalk evaluate: aString evaluates the statements in the String and answers the value of the last one. aClass compile: aString adds a method to the class: the String is a method in the syntax of a class body, such as 'double: x [ ^x * 2 ]', or the old form with the pattern on the first line and the body after it. A class-side method is compiled by sending compile: to the metaclass (A class compile: ...). Smalltalk fileIn: aString reads class definitions and statements from a String, as if they were a file.</w:t>
+      </w:r>
+    </w:p>
+    <w:p>
+      <w:pPr>
+        <w:keepNext/>
+        <w:keepLines/>
+        <w:pBdr>
+          <w:top w:val="single" w:color="808080" w:sz="4"/>
+          <w:left w:val="single" w:color="808080" w:sz="4"/>
+          <w:right w:val="single" w:color="808080" w:sz="4"/>
+        </w:pBdr>
+        <w:shd w:fill="F2F2F2" w:color="auto" w:val="clear"/>
+        <w:spacing w:after="0" w:line="240"/>
+        <w:ind w:left="100" w:right="100"/>
+      </w:pPr>
+      <w:r>
+        <w:rPr>
+          <w:rFonts w:ascii="Courier New" w:cs="Courier New" w:eastAsia="Courier New" w:hAnsi="Courier New"/>
+          <w:sz w:val="17"/>
+          <w:szCs w:val="17"/>
+        </w:rPr>
+        <w:t xml:space="preserve">Object subclass: A [ ]</w:t>
+      </w:r>
+    </w:p>
+    <w:p>
+      <w:pPr>
+        <w:keepNext/>
+        <w:keepLines/>
+        <w:pBdr>
+          <w:left w:val="single" w:color="808080" w:sz="4"/>
+          <w:right w:val="single" w:color="808080" w:sz="4"/>
+        </w:pBdr>
+        <w:shd w:fill="F2F2F2" w:color="auto" w:val="clear"/>
+        <w:spacing w:after="0" w:line="240"/>
+        <w:ind w:left="100" w:right="100"/>
+      </w:pPr>
+      <w:r>
+        <w:rPr>
+          <w:rFonts w:ascii="Courier New" w:cs="Courier New" w:eastAsia="Courier New" w:hAnsi="Courier New"/>
+          <w:sz w:val="17"/>
+          <w:szCs w:val="17"/>
+        </w:rPr>
+        <w:t xml:space="preserve">A compile: 'double: x [ ^x * 2 ]'.</w:t>
+      </w:r>
+    </w:p>
+    <w:p>
+      <w:pPr>
+        <w:keepNext/>
+        <w:keepLines/>
+        <w:pBdr>
+          <w:left w:val="single" w:color="808080" w:sz="4"/>
+          <w:right w:val="single" w:color="808080" w:sz="4"/>
+        </w:pBdr>
+        <w:shd w:fill="F2F2F2" w:color="auto" w:val="clear"/>
+        <w:spacing w:after="0" w:line="240"/>
+        <w:ind w:left="100" w:right="100"/>
+      </w:pPr>
+      <w:r>
+        <w:rPr>
+          <w:rFonts w:ascii="Courier New" w:cs="Courier New" w:eastAsia="Courier New" w:hAnsi="Courier New"/>
+          <w:sz w:val="17"/>
+          <w:szCs w:val="17"/>
+        </w:rPr>
+        <w:t xml:space="preserve">A class compile: 'make [ ^self new ]'.</w:t>
+      </w:r>
+    </w:p>
+    <w:p>
+      <w:pPr>
+        <w:keepNext/>
+        <w:keepLines/>
+        <w:pBdr>
+          <w:left w:val="single" w:color="808080" w:sz="4"/>
+          <w:right w:val="single" w:color="808080" w:sz="4"/>
+        </w:pBdr>
+        <w:shd w:fill="F2F2F2" w:color="auto" w:val="clear"/>
+        <w:spacing w:after="0" w:line="240"/>
+        <w:ind w:left="100" w:right="100"/>
+      </w:pPr>
+      <w:r>
+        <w:rPr>
+          <w:rFonts w:ascii="Courier New" w:cs="Courier New" w:eastAsia="Courier New" w:hAnsi="Courier New"/>
+          <w:sz w:val="17"/>
+          <w:szCs w:val="17"/>
+        </w:rPr>
+        <w:t xml:space="preserve">(A make double: 21) printNl.</w:t>
+      </w:r>
+    </w:p>
+    <w:p>
+      <w:pPr>
+        <w:keepNext/>
+        <w:keepLines/>
+        <w:pBdr>
+          <w:left w:val="single" w:color="808080" w:sz="4"/>
+          <w:right w:val="single" w:color="808080" w:sz="4"/>
+        </w:pBdr>
+        <w:shd w:fill="F2F2F2" w:color="auto" w:val="clear"/>
+        <w:spacing w:after="0" w:line="240"/>
+        <w:ind w:left="100" w:right="100"/>
+      </w:pPr>
+      <w:r>
+        <w:rPr>
+          <w:rFonts w:ascii="Courier New" w:cs="Courier New" w:eastAsia="Courier New" w:hAnsi="Courier New"/>
+          <w:sz w:val="17"/>
+          <w:szCs w:val="17"/>
+        </w:rPr>
+        <w:t xml:space="preserve">(Smalltalk evaluate: '3 + 4') printNl.</w:t>
+      </w:r>
+    </w:p>
+    <w:p>
+      <w:pPr>
+        <w:keepNext/>
+        <w:keepLines/>
+        <w:pBdr>
+          <w:left w:val="single" w:color="808080" w:sz="4"/>
+          <w:right w:val="single" w:color="808080" w:sz="4"/>
+        </w:pBdr>
+        <w:shd w:fill="F2F2F2" w:color="auto" w:val="clear"/>
+        <w:spacing w:after="0" w:line="240"/>
+        <w:ind w:left="100" w:right="100"/>
+      </w:pPr>
+      <w:r>
+        <w:rPr>
+          <w:rFonts w:ascii="Courier New" w:cs="Courier New" w:eastAsia="Courier New" w:hAnsi="Courier New"/>
+          <w:sz w:val="17"/>
+          <w:szCs w:val="17"/>
+        </w:rPr>
+        <w:t xml:space="preserve">Object subclass: B [ foo [ ^self bar ] bar [ ^thisContext ] ]</w:t>
+      </w:r>
+    </w:p>
+    <w:p>
+      <w:pPr>
+        <w:keepNext/>
+        <w:keepLines/>
+        <w:pBdr>
+          <w:left w:val="single" w:color="808080" w:sz="4"/>
+          <w:right w:val="single" w:color="808080" w:sz="4"/>
+        </w:pBdr>
+        <w:shd w:fill="F2F2F2" w:color="auto" w:val="clear"/>
+        <w:spacing w:after="0" w:line="240"/>
+        <w:ind w:left="100" w:right="100"/>
+      </w:pPr>
+      <w:r>
+        <w:rPr>
+          <w:rFonts w:ascii="Courier New" w:cs="Courier New" w:eastAsia="Courier New" w:hAnsi="Courier New"/>
+          <w:sz w:val="17"/>
+          <w:szCs w:val="17"/>
+        </w:rPr>
+        <w:t xml:space="preserve">B new foo printNl.</w:t>
+      </w:r>
+    </w:p>
+    <w:p>
+      <w:pPr>
+        <w:keepNext/>
+        <w:keepLines/>
+        <w:pBdr>
+          <w:left w:val="single" w:color="808080" w:sz="4"/>
+          <w:right w:val="single" w:color="808080" w:sz="4"/>
+        </w:pBdr>
+        <w:shd w:fill="F2F2F2" w:color="auto" w:val="clear"/>
+        <w:spacing w:after="0" w:line="240"/>
+        <w:ind w:left="100" w:right="100"/>
+      </w:pPr>
+      <w:r>
+        <w:rPr>
+          <w:rFonts w:ascii="Courier New" w:cs="Courier New" w:eastAsia="Courier New" w:hAnsi="Courier New"/>
+          <w:sz w:val="17"/>
+          <w:szCs w:val="17"/>
+        </w:rPr>
+        <w:t xml:space="preserve">B new foo sender printNl.</w:t>
+      </w:r>
+    </w:p>
+    <w:p>
+      <w:pPr>
+        <w:keepNext/>
+        <w:keepLines/>
+        <w:pBdr>
+          <w:left w:val="single" w:color="808080" w:sz="4"/>
+          <w:right w:val="single" w:color="808080" w:sz="4"/>
+        </w:pBdr>
+        <w:shd w:fill="F2F2F2" w:color="auto" w:val="clear"/>
+        <w:spacing w:after="0" w:line="240"/>
+        <w:ind w:left="100" w:right="100"/>
+      </w:pPr>
+      <w:r>
+        <w:rPr>
+          <w:rFonts w:ascii="Courier New" w:cs="Courier New" w:eastAsia="Courier New" w:hAnsi="Courier New"/>
+          <w:sz w:val="17"/>
+          <w:szCs w:val="17"/>
+        </w:rPr>
+        <w:t xml:space="preserve"> </w:t>
+      </w:r>
+    </w:p>
+    <w:p>
+      <w:pPr>
+        <w:keepNext/>
+        <w:keepLines/>
+        <w:pBdr>
+          <w:left w:val="single" w:color="808080" w:sz="4"/>
+          <w:right w:val="single" w:color="808080" w:sz="4"/>
+        </w:pBdr>
+        <w:shd w:fill="F2F2F2" w:color="auto" w:val="clear"/>
+        <w:spacing w:after="0" w:line="240"/>
+        <w:ind w:left="100" w:right="100"/>
+      </w:pPr>
+      <w:r>
+        <w:rPr>
+          <w:rFonts w:ascii="Courier New" w:cs="Courier New" w:eastAsia="Courier New" w:hAnsi="Courier New"/>
+          <w:sz w:val="17"/>
+          <w:szCs w:val="17"/>
+        </w:rPr>
+        <w:t xml:space="preserve">42</w:t>
+      </w:r>
+    </w:p>
+    <w:p>
+      <w:pPr>
+        <w:keepNext/>
+        <w:keepLines/>
+        <w:pBdr>
+          <w:left w:val="single" w:color="808080" w:sz="4"/>
+          <w:right w:val="single" w:color="808080" w:sz="4"/>
+        </w:pBdr>
+        <w:shd w:fill="F2F2F2" w:color="auto" w:val="clear"/>
+        <w:spacing w:after="0" w:line="240"/>
+        <w:ind w:left="100" w:right="100"/>
+      </w:pPr>
+      <w:r>
+        <w:rPr>
+          <w:rFonts w:ascii="Courier New" w:cs="Courier New" w:eastAsia="Courier New" w:hAnsi="Courier New"/>
+          <w:sz w:val="17"/>
+          <w:szCs w:val="17"/>
+        </w:rPr>
+        <w:t xml:space="preserve">7</w:t>
+      </w:r>
+    </w:p>
+    <w:p>
+      <w:pPr>
+        <w:keepNext/>
+        <w:keepLines/>
+        <w:pBdr>
+          <w:left w:val="single" w:color="808080" w:sz="4"/>
+          <w:right w:val="single" w:color="808080" w:sz="4"/>
+        </w:pBdr>
+        <w:shd w:fill="F2F2F2" w:color="auto" w:val="clear"/>
+        <w:spacing w:after="0" w:line="240"/>
+        <w:ind w:left="100" w:right="100"/>
+      </w:pPr>
+      <w:r>
+        <w:rPr>
+          <w:rFonts w:ascii="Courier New" w:cs="Courier New" w:eastAsia="Courier New" w:hAnsi="Courier New"/>
+          <w:sz w:val="17"/>
+          <w:szCs w:val="17"/>
+        </w:rPr>
+        <w:t xml:space="preserve">B&gt;&gt;bar</w:t>
+      </w:r>
+    </w:p>
+    <w:p>
+      <w:pPr>
+        <w:keepNext w:val="false"/>
+        <w:keepLines/>
+        <w:pBdr>
+          <w:bottom w:val="single" w:color="808080" w:sz="4"/>
+          <w:left w:val="single" w:color="808080" w:sz="4"/>
+          <w:right w:val="single" w:color="808080" w:sz="4"/>
+        </w:pBdr>
+        <w:shd w:fill="F2F2F2" w:color="auto" w:val="clear"/>
+        <w:spacing w:after="0" w:line="240"/>
+        <w:ind w:left="100" w:right="100"/>
+      </w:pPr>
+      <w:r>
+        <w:rPr>
+          <w:rFonts w:ascii="Courier New" w:cs="Courier New" w:eastAsia="Courier New" w:hAnsi="Courier New"/>
+          <w:sz w:val="17"/>
+          <w:szCs w:val="17"/>
+        </w:rPr>
+        <w:t xml:space="preserve">B&gt;&gt;foo</w:t>
+      </w:r>
+    </w:p>
+    <w:p>
+      <w:pPr>
+        <w:spacing w:after="200" w:before="60"/>
+      </w:pPr>
+      <w:r>
+        <w:rPr>
+          <w:rFonts w:ascii="Arial" w:cs="Arial" w:eastAsia="Arial" w:hAnsi="Arial"/>
+          <w:b/>
+          <w:bCs/>
+          <w:sz w:val="18"/>
+          <w:szCs w:val="18"/>
+        </w:rPr>
+        <w:t xml:space="preserve">Figure 69. </w:t>
+      </w:r>
+      <w:r>
+        <w:rPr>
+          <w:rFonts w:ascii="Arial" w:cs="Arial" w:eastAsia="Arial" w:hAnsi="Arial"/>
+          <w:sz w:val="18"/>
+          <w:szCs w:val="18"/>
+        </w:rPr>
+        <w:t xml:space="preserve">Compiling and evaluating</w:t>
+      </w:r>
+    </w:p>
+    <w:p>
+      <w:pPr>
         <w:pStyle w:val="Heading1"/>
         <w:pageBreakBefore/>
         <w:pBdr>
@@ -30694,7 +32747,7 @@
           <w:sz w:val="32"/>
           <w:szCs w:val="32"/>
         </w:rPr>
-        <w:t xml:space="preserve">Chapter 12. Errors and Traces</w:t>
+        <w:t xml:space="preserve">Chapter 14. Errors and Traces</w:t>
       </w:r>
     </w:p>
     <w:p>
@@ -31034,7 +33087,7 @@
           <w:sz w:val="18"/>
           <w:szCs w:val="18"/>
         </w:rPr>
-        <w:t xml:space="preserve">Figure 65. </w:t>
+        <w:t xml:space="preserve">Figure 70. </w:t>
       </w:r>
       <w:r>
         <w:rPr>
@@ -31875,7 +33928,7 @@
           <w:sz w:val="18"/>
           <w:szCs w:val="18"/>
         </w:rPr>
-        <w:t xml:space="preserve">Figure 66. </w:t>
+        <w:t xml:space="preserve">Figure 71. </w:t>
       </w:r>
       <w:r>
         <w:rPr>
@@ -31932,7 +33985,7 @@
           <w:sz w:val="32"/>
           <w:szCs w:val="32"/>
         </w:rPr>
-        <w:t xml:space="preserve">Chapter 13. How Smalltalk/CREXX Works</w:t>
+        <w:t xml:space="preserve">Chapter 15. How Smalltalk/CREXX Works</w:t>
       </w:r>
     </w:p>
     <w:p>
@@ -32240,7 +34293,7 @@
           <w:sz w:val="32"/>
           <w:szCs w:val="32"/>
         </w:rPr>
-        <w:t xml:space="preserve">Chapter 14. Restrictions and Known Problems</w:t>
+        <w:t xml:space="preserve">Chapter 16. Restrictions and Known Problems</w:t>
       </w:r>
     </w:p>
     <w:p>
@@ -32732,7 +34785,7 @@
           <w:sz w:val="18"/>
           <w:szCs w:val="18"/>
         </w:rPr>
-        <w:t xml:space="preserve">Figure 67. </w:t>
+        <w:t xml:space="preserve">Figure 72. </w:t>
       </w:r>
       <w:r>
         <w:rPr>
@@ -33507,7 +35560,7 @@
           <w:sz w:val="18"/>
           <w:szCs w:val="18"/>
         </w:rPr>
-        <w:t xml:space="preserve">Figure 68. </w:t>
+        <w:t xml:space="preserve">Figure 73. </w:t>
       </w:r>
       <w:r>
         <w:rPr>
@@ -34665,7 +36718,7 @@
           <w:sz w:val="18"/>
           <w:szCs w:val="18"/>
         </w:rPr>
-        <w:t xml:space="preserve">Figure 69. </w:t>
+        <w:t xml:space="preserve">Figure 74. </w:t>
       </w:r>
       <w:r>
         <w:rPr>
@@ -34686,7 +36739,7 @@
           <w:sz w:val="20"/>
           <w:szCs w:val="20"/>
         </w:rPr>
-        <w:t xml:space="preserve">Exception classes are shown in Chapter 10.</w:t>
+        <w:t xml:space="preserve">Exception classes are shown in Chapter 12.</w:t>
       </w:r>
     </w:p>
     <w:p>
@@ -35383,7 +37436,7 @@
           <w:sz w:val="18"/>
           <w:szCs w:val="18"/>
         </w:rPr>
-        <w:t xml:space="preserve">Figure 70. </w:t>
+        <w:t xml:space="preserve">Figure 75. </w:t>
       </w:r>
       <w:r>
         <w:rPr>

</xml_diff>

<commit_message>
Manual: ScaledDecimal, ByteArray, Duration, dependents, become:; README
Co-Authored-By: Claude Sonnet 5.5 <noreply@anthropic.com>
Claude-Session: https://claude.ai/code/session_013PfZHD8os4FWhvmVG9Tf7M
</commit_message>
<xml_diff>
--- a/docs/Smalltalk-CREXX-Guide.docx
+++ b/docs/Smalltalk-CREXX-Guide.docx
@@ -983,6 +983,25 @@
         <w:tabs>
           <w:tab w:val="right" w:pos="9638" w:leader="dot"/>
         </w:tabs>
+        <w:spacing w:after="0" w:before="0"/>
+        <w:ind w:left="360"/>
+      </w:pPr>
+      <w:r>
+        <w:rPr>
+          <w:rFonts w:ascii="Arial" w:cs="Arial" w:eastAsia="Arial" w:hAnsi="Arial"/>
+          <w:b w:val="false"/>
+          <w:bCs w:val="false"/>
+          <w:sz w:val="18"/>
+          <w:szCs w:val="18"/>
+        </w:rPr>
+        <w:t xml:space="preserve">ScaledDecimal	16</w:t>
+      </w:r>
+    </w:p>
+    <w:p>
+      <w:pPr>
+        <w:tabs>
+          <w:tab w:val="right" w:pos="9638" w:leader="dot"/>
+        </w:tabs>
         <w:spacing w:after="20" w:before="100"/>
         <w:ind w:left="0"/>
       </w:pPr>
@@ -1192,6 +1211,25 @@
         <w:tabs>
           <w:tab w:val="right" w:pos="9638" w:leader="dot"/>
         </w:tabs>
+        <w:spacing w:after="0" w:before="0"/>
+        <w:ind w:left="360"/>
+      </w:pPr>
+      <w:r>
+        <w:rPr>
+          <w:rFonts w:ascii="Arial" w:cs="Arial" w:eastAsia="Arial" w:hAnsi="Arial"/>
+          <w:b w:val="false"/>
+          <w:bCs w:val="false"/>
+          <w:sz w:val="18"/>
+          <w:szCs w:val="18"/>
+        </w:rPr>
+        <w:t xml:space="preserve">ByteArray	21</w:t>
+      </w:r>
+    </w:p>
+    <w:p>
+      <w:pPr>
+        <w:tabs>
+          <w:tab w:val="right" w:pos="9638" w:leader="dot"/>
+        </w:tabs>
         <w:spacing w:after="20" w:before="100"/>
         <w:ind w:left="0"/>
       </w:pPr>
@@ -1610,6 +1648,25 @@
         <w:tabs>
           <w:tab w:val="right" w:pos="9638" w:leader="dot"/>
         </w:tabs>
+        <w:spacing w:after="0" w:before="0"/>
+        <w:ind w:left="360"/>
+      </w:pPr>
+      <w:r>
+        <w:rPr>
+          <w:rFonts w:ascii="Arial" w:cs="Arial" w:eastAsia="Arial" w:hAnsi="Arial"/>
+          <w:b w:val="false"/>
+          <w:bCs w:val="false"/>
+          <w:sz w:val="18"/>
+          <w:szCs w:val="18"/>
+        </w:rPr>
+        <w:t xml:space="preserve">Durations	29</w:t>
+      </w:r>
+    </w:p>
+    <w:p>
+      <w:pPr>
+        <w:tabs>
+          <w:tab w:val="right" w:pos="9638" w:leader="dot"/>
+        </w:tabs>
         <w:spacing w:after="20" w:before="100"/>
         <w:ind w:left="0"/>
       </w:pPr>
@@ -2009,6 +2066,25 @@
         <w:tabs>
           <w:tab w:val="right" w:pos="9638" w:leader="dot"/>
         </w:tabs>
+        <w:spacing w:after="0" w:before="0"/>
+        <w:ind w:left="360"/>
+      </w:pPr>
+      <w:r>
+        <w:rPr>
+          <w:rFonts w:ascii="Arial" w:cs="Arial" w:eastAsia="Arial" w:hAnsi="Arial"/>
+          <w:b w:val="false"/>
+          <w:bCs w:val="false"/>
+          <w:sz w:val="18"/>
+          <w:szCs w:val="18"/>
+        </w:rPr>
+        <w:t xml:space="preserve">More about objects	37</w:t>
+      </w:r>
+    </w:p>
+    <w:p>
+      <w:pPr>
+        <w:tabs>
+          <w:tab w:val="right" w:pos="9638" w:leader="dot"/>
+        </w:tabs>
         <w:spacing w:after="20" w:before="100"/>
         <w:ind w:left="0"/>
       </w:pPr>
@@ -2020,7 +2096,7 @@
           <w:sz w:val="19"/>
           <w:szCs w:val="19"/>
         </w:rPr>
-        <w:t xml:space="preserve">Chapter 14. Errors and Traces	38</w:t>
+        <w:t xml:space="preserve">Chapter 14. Errors and Traces	39</w:t>
       </w:r>
     </w:p>
     <w:p>
@@ -2039,7 +2115,7 @@
           <w:sz w:val="18"/>
           <w:szCs w:val="18"/>
         </w:rPr>
-        <w:t xml:space="preserve">Unhandled errors	38</w:t>
+        <w:t xml:space="preserve">Unhandled errors	39</w:t>
       </w:r>
     </w:p>
     <w:p>
@@ -2058,7 +2134,7 @@
           <w:sz w:val="18"/>
           <w:szCs w:val="18"/>
         </w:rPr>
-        <w:t xml:space="preserve">Common messages	38</w:t>
+        <w:t xml:space="preserve">Common messages	39</w:t>
       </w:r>
     </w:p>
     <w:p>
@@ -2077,7 +2153,7 @@
           <w:sz w:val="18"/>
           <w:szCs w:val="18"/>
         </w:rPr>
-        <w:t xml:space="preserve">Parse errors	38</w:t>
+        <w:t xml:space="preserve">Parse errors	39</w:t>
       </w:r>
     </w:p>
     <w:p>
@@ -2096,7 +2172,7 @@
           <w:sz w:val="19"/>
           <w:szCs w:val="19"/>
         </w:rPr>
-        <w:t xml:space="preserve">Chapter 15. How Smalltalk/CREXX Works	39</w:t>
+        <w:t xml:space="preserve">Chapter 15. How Smalltalk/CREXX Works	40</w:t>
       </w:r>
     </w:p>
     <w:p>
@@ -2115,7 +2191,7 @@
           <w:sz w:val="18"/>
           <w:szCs w:val="18"/>
         </w:rPr>
-        <w:t xml:space="preserve">Objects	39</w:t>
+        <w:t xml:space="preserve">Objects	40</w:t>
       </w:r>
     </w:p>
     <w:p>
@@ -2134,7 +2210,7 @@
           <w:sz w:val="18"/>
           <w:szCs w:val="18"/>
         </w:rPr>
-        <w:t xml:space="preserve">Classes and methods	39</w:t>
+        <w:t xml:space="preserve">Classes and methods	40</w:t>
       </w:r>
     </w:p>
     <w:p>
@@ -2153,7 +2229,7 @@
           <w:sz w:val="18"/>
           <w:szCs w:val="18"/>
         </w:rPr>
-        <w:t xml:space="preserve">The resolver	39</w:t>
+        <w:t xml:space="preserve">The resolver	40</w:t>
       </w:r>
     </w:p>
     <w:p>
@@ -2172,7 +2248,7 @@
           <w:sz w:val="18"/>
           <w:szCs w:val="18"/>
         </w:rPr>
-        <w:t xml:space="preserve">The evaluator	39</w:t>
+        <w:t xml:space="preserve">The evaluator	40</w:t>
       </w:r>
     </w:p>
     <w:p>
@@ -2191,7 +2267,7 @@
           <w:sz w:val="18"/>
           <w:szCs w:val="18"/>
         </w:rPr>
-        <w:t xml:space="preserve">Primitives	39</w:t>
+        <w:t xml:space="preserve">Primitives	40</w:t>
       </w:r>
     </w:p>
     <w:p>
@@ -2210,7 +2286,7 @@
           <w:sz w:val="18"/>
           <w:szCs w:val="18"/>
         </w:rPr>
-        <w:t xml:space="preserve">Adding a primitive	39</w:t>
+        <w:t xml:space="preserve">Adding a primitive	40</w:t>
       </w:r>
     </w:p>
     <w:p>
@@ -2229,7 +2305,7 @@
           <w:sz w:val="18"/>
           <w:szCs w:val="18"/>
         </w:rPr>
-        <w:t xml:space="preserve">The build	40</w:t>
+        <w:t xml:space="preserve">The build	41</w:t>
       </w:r>
     </w:p>
     <w:p>
@@ -2248,7 +2324,7 @@
           <w:sz w:val="19"/>
           <w:szCs w:val="19"/>
         </w:rPr>
-        <w:t xml:space="preserve">Chapter 16. Restrictions and Known Problems	41</w:t>
+        <w:t xml:space="preserve">Chapter 16. Restrictions and Known Problems	42</w:t>
       </w:r>
     </w:p>
     <w:p>
@@ -2267,7 +2343,7 @@
           <w:sz w:val="19"/>
           <w:szCs w:val="19"/>
         </w:rPr>
-        <w:t xml:space="preserve">Appendix A. Command Summary	42</w:t>
+        <w:t xml:space="preserve">Appendix A. Command Summary	43</w:t>
       </w:r>
     </w:p>
     <w:p>
@@ -2286,7 +2362,7 @@
           <w:sz w:val="19"/>
           <w:szCs w:val="19"/>
         </w:rPr>
-        <w:t xml:space="preserve">Appendix B. Contents of the Repository	43</w:t>
+        <w:t xml:space="preserve">Appendix B. Contents of the Repository	44</w:t>
       </w:r>
     </w:p>
     <w:p>
@@ -2305,7 +2381,7 @@
           <w:sz w:val="19"/>
           <w:szCs w:val="19"/>
         </w:rPr>
-        <w:t xml:space="preserve">Appendix C. Class Hierarchy	44</w:t>
+        <w:t xml:space="preserve">Appendix C. Class Hierarchy	45</w:t>
       </w:r>
     </w:p>
     <w:p>
@@ -2324,7 +2400,7 @@
           <w:sz w:val="19"/>
           <w:szCs w:val="19"/>
         </w:rPr>
-        <w:t xml:space="preserve">Appendix D. Sample Programs	45</w:t>
+        <w:t xml:space="preserve">Appendix D. Sample Programs	46</w:t>
       </w:r>
     </w:p>
     <w:p>
@@ -5384,7 +5460,7 @@
           <w:sz w:val="20"/>
           <w:szCs w:val="20"/>
         </w:rPr>
-        <w:t xml:space="preserve">When it starts, the interpreter creates the kernel classes, then reads the library files lib/kernel.st, lib/numbers.st, lib/collections.st, lib/streams.st, lib/exceptions.st, lib/extras.st, lib/structures.st, lib/regex.st, lib/system.st, lib/net.st, lib/sunit.st and lib/process.st, and only then reads your program. The library directory is found by the launcher; with the driver you pass it as -L directory.</w:t>
+        <w:t xml:space="preserve">When it starts, the interpreter creates the kernel classes, then reads the library files lib/kernel.st, lib/numbers.st, lib/collections.st, lib/streams.st, lib/exceptions.st, lib/extras.st, lib/structures.st, lib/regex.st, lib/system.st, lib/net.st, lib/sunit.st and lib/process.st and lib/more.st, and only then reads your program. The library directory is found by the launcher; with the driver you pass it as -L directory.</w:t>
       </w:r>
     </w:p>
     <w:p>
@@ -15174,6 +15250,291 @@
     </w:p>
     <w:p>
       <w:pPr>
+        <w:pStyle w:val="Heading2"/>
+        <w:keepNext/>
+      </w:pPr>
+      <w:r>
+        <w:rPr>
+          <w:rFonts w:ascii="Arial" w:cs="Arial" w:eastAsia="Arial" w:hAnsi="Arial"/>
+          <w:b/>
+          <w:bCs/>
+          <w:sz w:val="24"/>
+          <w:szCs w:val="24"/>
+        </w:rPr>
+        <w:t xml:space="preserve">ScaledDecimal</w:t>
+      </w:r>
+    </w:p>
+    <w:p>
+      <w:pPr>
+        <w:spacing w:after="120" w:line="264"/>
+      </w:pPr>
+      <w:r>
+        <w:rPr>
+          <w:rFonts w:ascii="Arial" w:cs="Arial" w:eastAsia="Arial" w:hAnsi="Arial"/>
+          <w:sz w:val="20"/>
+          <w:szCs w:val="20"/>
+        </w:rPr>
+        <w:t xml:space="preserve">A number written with s and a scale, such as 1.5s2, 3s2 or 0.25s, is a ScaledDecimal: an exact value (a Fraction) that prints with a fixed number of decimal places, here 1.50s2. Without a number after the s the scale is the number of digits after the point. Arithmetic with a ScaledDecimal gives a ScaledDecimal with the larger scale, mixed with a Float it gives a Float, and aNumber asScaledDecimal: n converts. Printing truncates to the scale. Because the value is exact, 0.1s1 + 0.2s1 = 0.3s1 is true.</w:t>
+      </w:r>
+    </w:p>
+    <w:p>
+      <w:pPr>
+        <w:keepNext/>
+        <w:keepLines/>
+        <w:pBdr>
+          <w:top w:val="single" w:color="808080" w:sz="4"/>
+          <w:left w:val="single" w:color="808080" w:sz="4"/>
+          <w:right w:val="single" w:color="808080" w:sz="4"/>
+        </w:pBdr>
+        <w:shd w:fill="F2F2F2" w:color="auto" w:val="clear"/>
+        <w:spacing w:after="0" w:line="240"/>
+        <w:ind w:left="100" w:right="100"/>
+      </w:pPr>
+      <w:r>
+        <w:rPr>
+          <w:rFonts w:ascii="Courier New" w:cs="Courier New" w:eastAsia="Courier New" w:hAnsi="Courier New"/>
+          <w:sz w:val="17"/>
+          <w:szCs w:val="17"/>
+        </w:rPr>
+        <w:t xml:space="preserve">(1.5s2 + 1.25s3) printNl.</w:t>
+      </w:r>
+    </w:p>
+    <w:p>
+      <w:pPr>
+        <w:keepNext/>
+        <w:keepLines/>
+        <w:pBdr>
+          <w:left w:val="single" w:color="808080" w:sz="4"/>
+          <w:right w:val="single" w:color="808080" w:sz="4"/>
+        </w:pBdr>
+        <w:shd w:fill="F2F2F2" w:color="auto" w:val="clear"/>
+        <w:spacing w:after="0" w:line="240"/>
+        <w:ind w:left="100" w:right="100"/>
+      </w:pPr>
+      <w:r>
+        <w:rPr>
+          <w:rFonts w:ascii="Courier New" w:cs="Courier New" w:eastAsia="Courier New" w:hAnsi="Courier New"/>
+          <w:sz w:val="17"/>
+          <w:szCs w:val="17"/>
+        </w:rPr>
+        <w:t xml:space="preserve">(100 * 1.15s2) printNl.</w:t>
+      </w:r>
+    </w:p>
+    <w:p>
+      <w:pPr>
+        <w:keepNext/>
+        <w:keepLines/>
+        <w:pBdr>
+          <w:left w:val="single" w:color="808080" w:sz="4"/>
+          <w:right w:val="single" w:color="808080" w:sz="4"/>
+        </w:pBdr>
+        <w:shd w:fill="F2F2F2" w:color="auto" w:val="clear"/>
+        <w:spacing w:after="0" w:line="240"/>
+        <w:ind w:left="100" w:right="100"/>
+      </w:pPr>
+      <w:r>
+        <w:rPr>
+          <w:rFonts w:ascii="Courier New" w:cs="Courier New" w:eastAsia="Courier New" w:hAnsi="Courier New"/>
+          <w:sz w:val="17"/>
+          <w:szCs w:val="17"/>
+        </w:rPr>
+        <w:t xml:space="preserve">((1/3) asScaledDecimal: 4) printNl.</w:t>
+      </w:r>
+    </w:p>
+    <w:p>
+      <w:pPr>
+        <w:keepNext/>
+        <w:keepLines/>
+        <w:pBdr>
+          <w:left w:val="single" w:color="808080" w:sz="4"/>
+          <w:right w:val="single" w:color="808080" w:sz="4"/>
+        </w:pBdr>
+        <w:shd w:fill="F2F2F2" w:color="auto" w:val="clear"/>
+        <w:spacing w:after="0" w:line="240"/>
+        <w:ind w:left="100" w:right="100"/>
+      </w:pPr>
+      <w:r>
+        <w:rPr>
+          <w:rFonts w:ascii="Courier New" w:cs="Courier New" w:eastAsia="Courier New" w:hAnsi="Courier New"/>
+          <w:sz w:val="17"/>
+          <w:szCs w:val="17"/>
+        </w:rPr>
+        <w:t xml:space="preserve">(0.1s1 + 0.2s1 = 0.3s1) printNl.</w:t>
+      </w:r>
+    </w:p>
+    <w:p>
+      <w:pPr>
+        <w:keepNext/>
+        <w:keepLines/>
+        <w:pBdr>
+          <w:left w:val="single" w:color="808080" w:sz="4"/>
+          <w:right w:val="single" w:color="808080" w:sz="4"/>
+        </w:pBdr>
+        <w:shd w:fill="F2F2F2" w:color="auto" w:val="clear"/>
+        <w:spacing w:after="0" w:line="240"/>
+        <w:ind w:left="100" w:right="100"/>
+      </w:pPr>
+      <w:r>
+        <w:rPr>
+          <w:rFonts w:ascii="Courier New" w:cs="Courier New" w:eastAsia="Courier New" w:hAnsi="Courier New"/>
+          <w:sz w:val="17"/>
+          <w:szCs w:val="17"/>
+        </w:rPr>
+        <w:t xml:space="preserve">(1.5s2 + 1.0) printNl.</w:t>
+      </w:r>
+    </w:p>
+    <w:p>
+      <w:pPr>
+        <w:keepNext/>
+        <w:keepLines/>
+        <w:pBdr>
+          <w:left w:val="single" w:color="808080" w:sz="4"/>
+          <w:right w:val="single" w:color="808080" w:sz="4"/>
+        </w:pBdr>
+        <w:shd w:fill="F2F2F2" w:color="auto" w:val="clear"/>
+        <w:spacing w:after="0" w:line="240"/>
+        <w:ind w:left="100" w:right="100"/>
+      </w:pPr>
+      <w:r>
+        <w:rPr>
+          <w:rFonts w:ascii="Courier New" w:cs="Courier New" w:eastAsia="Courier New" w:hAnsi="Courier New"/>
+          <w:sz w:val="17"/>
+          <w:szCs w:val="17"/>
+        </w:rPr>
+        <w:t xml:space="preserve"> </w:t>
+      </w:r>
+    </w:p>
+    <w:p>
+      <w:pPr>
+        <w:keepNext/>
+        <w:keepLines/>
+        <w:pBdr>
+          <w:left w:val="single" w:color="808080" w:sz="4"/>
+          <w:right w:val="single" w:color="808080" w:sz="4"/>
+        </w:pBdr>
+        <w:shd w:fill="F2F2F2" w:color="auto" w:val="clear"/>
+        <w:spacing w:after="0" w:line="240"/>
+        <w:ind w:left="100" w:right="100"/>
+      </w:pPr>
+      <w:r>
+        <w:rPr>
+          <w:rFonts w:ascii="Courier New" w:cs="Courier New" w:eastAsia="Courier New" w:hAnsi="Courier New"/>
+          <w:sz w:val="17"/>
+          <w:szCs w:val="17"/>
+        </w:rPr>
+        <w:t xml:space="preserve">2.750s3</w:t>
+      </w:r>
+    </w:p>
+    <w:p>
+      <w:pPr>
+        <w:keepNext/>
+        <w:keepLines/>
+        <w:pBdr>
+          <w:left w:val="single" w:color="808080" w:sz="4"/>
+          <w:right w:val="single" w:color="808080" w:sz="4"/>
+        </w:pBdr>
+        <w:shd w:fill="F2F2F2" w:color="auto" w:val="clear"/>
+        <w:spacing w:after="0" w:line="240"/>
+        <w:ind w:left="100" w:right="100"/>
+      </w:pPr>
+      <w:r>
+        <w:rPr>
+          <w:rFonts w:ascii="Courier New" w:cs="Courier New" w:eastAsia="Courier New" w:hAnsi="Courier New"/>
+          <w:sz w:val="17"/>
+          <w:szCs w:val="17"/>
+        </w:rPr>
+        <w:t xml:space="preserve">115.00s2</w:t>
+      </w:r>
+    </w:p>
+    <w:p>
+      <w:pPr>
+        <w:keepNext/>
+        <w:keepLines/>
+        <w:pBdr>
+          <w:left w:val="single" w:color="808080" w:sz="4"/>
+          <w:right w:val="single" w:color="808080" w:sz="4"/>
+        </w:pBdr>
+        <w:shd w:fill="F2F2F2" w:color="auto" w:val="clear"/>
+        <w:spacing w:after="0" w:line="240"/>
+        <w:ind w:left="100" w:right="100"/>
+      </w:pPr>
+      <w:r>
+        <w:rPr>
+          <w:rFonts w:ascii="Courier New" w:cs="Courier New" w:eastAsia="Courier New" w:hAnsi="Courier New"/>
+          <w:sz w:val="17"/>
+          <w:szCs w:val="17"/>
+        </w:rPr>
+        <w:t xml:space="preserve">0.3333s4</w:t>
+      </w:r>
+    </w:p>
+    <w:p>
+      <w:pPr>
+        <w:keepNext/>
+        <w:keepLines/>
+        <w:pBdr>
+          <w:left w:val="single" w:color="808080" w:sz="4"/>
+          <w:right w:val="single" w:color="808080" w:sz="4"/>
+        </w:pBdr>
+        <w:shd w:fill="F2F2F2" w:color="auto" w:val="clear"/>
+        <w:spacing w:after="0" w:line="240"/>
+        <w:ind w:left="100" w:right="100"/>
+      </w:pPr>
+      <w:r>
+        <w:rPr>
+          <w:rFonts w:ascii="Courier New" w:cs="Courier New" w:eastAsia="Courier New" w:hAnsi="Courier New"/>
+          <w:sz w:val="17"/>
+          <w:szCs w:val="17"/>
+        </w:rPr>
+        <w:t xml:space="preserve">true</w:t>
+      </w:r>
+    </w:p>
+    <w:p>
+      <w:pPr>
+        <w:keepNext w:val="false"/>
+        <w:keepLines/>
+        <w:pBdr>
+          <w:bottom w:val="single" w:color="808080" w:sz="4"/>
+          <w:left w:val="single" w:color="808080" w:sz="4"/>
+          <w:right w:val="single" w:color="808080" w:sz="4"/>
+        </w:pBdr>
+        <w:shd w:fill="F2F2F2" w:color="auto" w:val="clear"/>
+        <w:spacing w:after="0" w:line="240"/>
+        <w:ind w:left="100" w:right="100"/>
+      </w:pPr>
+      <w:r>
+        <w:rPr>
+          <w:rFonts w:ascii="Courier New" w:cs="Courier New" w:eastAsia="Courier New" w:hAnsi="Courier New"/>
+          <w:sz w:val="17"/>
+          <w:szCs w:val="17"/>
+        </w:rPr>
+        <w:t xml:space="preserve">2.5</w:t>
+      </w:r>
+    </w:p>
+    <w:p>
+      <w:pPr>
+        <w:spacing w:after="200" w:before="60"/>
+      </w:pPr>
+      <w:r>
+        <w:rPr>
+          <w:rFonts w:ascii="Arial" w:cs="Arial" w:eastAsia="Arial" w:hAnsi="Arial"/>
+          <w:b/>
+          <w:bCs/>
+          <w:sz w:val="18"/>
+          <w:szCs w:val="18"/>
+        </w:rPr>
+        <w:t xml:space="preserve">Figure 26. </w:t>
+      </w:r>
+      <w:r>
+        <w:rPr>
+          <w:rFonts w:ascii="Arial" w:cs="Arial" w:eastAsia="Arial" w:hAnsi="Arial"/>
+          <w:sz w:val="18"/>
+          <w:szCs w:val="18"/>
+        </w:rPr>
+        <w:t xml:space="preserve">Exact decimals</w:t>
+      </w:r>
+    </w:p>
+    <w:p>
+      <w:pPr>
         <w:pStyle w:val="Heading1"/>
         <w:pageBreakBefore/>
         <w:pBdr>
@@ -15882,7 +16243,7 @@
           <w:sz w:val="18"/>
           <w:szCs w:val="18"/>
         </w:rPr>
-        <w:t xml:space="preserve">Figure 26. </w:t>
+        <w:t xml:space="preserve">Figure 27. </w:t>
       </w:r>
       <w:r>
         <w:rPr>
@@ -16640,7 +17001,7 @@
           <w:sz w:val="18"/>
           <w:szCs w:val="18"/>
         </w:rPr>
-        <w:t xml:space="preserve">Figure 27. </w:t>
+        <w:t xml:space="preserve">Figure 28. </w:t>
       </w:r>
       <w:r>
         <w:rPr>
@@ -16980,7 +17341,7 @@
           <w:sz w:val="18"/>
           <w:szCs w:val="18"/>
         </w:rPr>
-        <w:t xml:space="preserve">Figure 28. </w:t>
+        <w:t xml:space="preserve">Figure 29. </w:t>
       </w:r>
       <w:r>
         <w:rPr>
@@ -17383,7 +17744,7 @@
           <w:sz w:val="18"/>
           <w:szCs w:val="18"/>
         </w:rPr>
-        <w:t xml:space="preserve">Figure 29. </w:t>
+        <w:t xml:space="preserve">Figure 30. </w:t>
       </w:r>
       <w:r>
         <w:rPr>
@@ -18084,7 +18445,7 @@
           <w:sz w:val="18"/>
           <w:szCs w:val="18"/>
         </w:rPr>
-        <w:t xml:space="preserve">Figure 30. </w:t>
+        <w:t xml:space="preserve">Figure 31. </w:t>
       </w:r>
       <w:r>
         <w:rPr>
@@ -18508,7 +18869,7 @@
           <w:sz w:val="18"/>
           <w:szCs w:val="18"/>
         </w:rPr>
-        <w:t xml:space="preserve">Figure 31. </w:t>
+        <w:t xml:space="preserve">Figure 32. </w:t>
       </w:r>
       <w:r>
         <w:rPr>
@@ -18864,7 +19225,7 @@
           <w:sz w:val="18"/>
           <w:szCs w:val="18"/>
         </w:rPr>
-        <w:t xml:space="preserve">Figure 32. </w:t>
+        <w:t xml:space="preserve">Figure 33. </w:t>
       </w:r>
       <w:r>
         <w:rPr>
@@ -19430,7 +19791,7 @@
           <w:sz w:val="18"/>
           <w:szCs w:val="18"/>
         </w:rPr>
-        <w:t xml:space="preserve">Figure 33. </w:t>
+        <w:t xml:space="preserve">Figure 34. </w:t>
       </w:r>
       <w:r>
         <w:rPr>
@@ -19820,7 +20181,7 @@
           <w:sz w:val="18"/>
           <w:szCs w:val="18"/>
         </w:rPr>
-        <w:t xml:space="preserve">Figure 34. </w:t>
+        <w:t xml:space="preserve">Figure 35. </w:t>
       </w:r>
       <w:r>
         <w:rPr>
@@ -20063,7 +20424,7 @@
           <w:sz w:val="18"/>
           <w:szCs w:val="18"/>
         </w:rPr>
-        <w:t xml:space="preserve">Figure 35. </w:t>
+        <w:t xml:space="preserve">Figure 36. </w:t>
       </w:r>
       <w:r>
         <w:rPr>
@@ -20101,6 +20462,249 @@
           <w:szCs w:val="20"/>
         </w:rPr>
         <w:t xml:space="preserve">A Set, a Bag or a Dictionary has no order of its own, but it prints in sorted order whenever its elements (for a Dictionary, its keys) can be compared with &lt;=, so the same program always prints the same text. do: and the other enumerators still visit the elements in the internal order. Elements that cannot be compared, such as mixed Strings and numbers, print in the internal order.</w:t>
+      </w:r>
+    </w:p>
+    <w:p>
+      <w:pPr>
+        <w:pStyle w:val="Heading2"/>
+        <w:keepNext/>
+      </w:pPr>
+      <w:r>
+        <w:rPr>
+          <w:rFonts w:ascii="Arial" w:cs="Arial" w:eastAsia="Arial" w:hAnsi="Arial"/>
+          <w:b/>
+          <w:bCs/>
+          <w:sz w:val="24"/>
+          <w:szCs w:val="24"/>
+        </w:rPr>
+        <w:t xml:space="preserve">ByteArray</w:t>
+      </w:r>
+    </w:p>
+    <w:p>
+      <w:pPr>
+        <w:spacing w:after="120" w:line="264"/>
+      </w:pPr>
+      <w:r>
+        <w:rPr>
+          <w:rFonts w:ascii="Arial" w:cs="Arial" w:eastAsia="Arial" w:hAnsi="Arial"/>
+          <w:sz w:val="20"/>
+          <w:szCs w:val="20"/>
+        </w:rPr>
+        <w:t xml:space="preserve">A ByteArray is an Array whose elements are Integers from 0 to 255; storing anything else is an error. The literal #[1 2 255] makes one, ByteArray new: n makes one filled with zeros, aString asByteArray converts a String, and asString, hex and collect: (which answers an Array) work on it.</w:t>
+      </w:r>
+    </w:p>
+    <w:p>
+      <w:pPr>
+        <w:keepNext/>
+        <w:keepLines/>
+        <w:pBdr>
+          <w:top w:val="single" w:color="808080" w:sz="4"/>
+          <w:left w:val="single" w:color="808080" w:sz="4"/>
+          <w:right w:val="single" w:color="808080" w:sz="4"/>
+        </w:pBdr>
+        <w:shd w:fill="F2F2F2" w:color="auto" w:val="clear"/>
+        <w:spacing w:after="0" w:line="240"/>
+        <w:ind w:left="100" w:right="100"/>
+      </w:pPr>
+      <w:r>
+        <w:rPr>
+          <w:rFonts w:ascii="Courier New" w:cs="Courier New" w:eastAsia="Courier New" w:hAnsi="Courier New"/>
+          <w:sz w:val="17"/>
+          <w:szCs w:val="17"/>
+        </w:rPr>
+        <w:t xml:space="preserve">#[1 2 255] printNl.</w:t>
+      </w:r>
+    </w:p>
+    <w:p>
+      <w:pPr>
+        <w:keepNext/>
+        <w:keepLines/>
+        <w:pBdr>
+          <w:left w:val="single" w:color="808080" w:sz="4"/>
+          <w:right w:val="single" w:color="808080" w:sz="4"/>
+        </w:pBdr>
+        <w:shd w:fill="F2F2F2" w:color="auto" w:val="clear"/>
+        <w:spacing w:after="0" w:line="240"/>
+        <w:ind w:left="100" w:right="100"/>
+      </w:pPr>
+      <w:r>
+        <w:rPr>
+          <w:rFonts w:ascii="Courier New" w:cs="Courier New" w:eastAsia="Courier New" w:hAnsi="Courier New"/>
+          <w:sz w:val="17"/>
+          <w:szCs w:val="17"/>
+        </w:rPr>
+        <w:t xml:space="preserve">#[1 2 255] hex printNl.</w:t>
+      </w:r>
+    </w:p>
+    <w:p>
+      <w:pPr>
+        <w:keepNext/>
+        <w:keepLines/>
+        <w:pBdr>
+          <w:left w:val="single" w:color="808080" w:sz="4"/>
+          <w:right w:val="single" w:color="808080" w:sz="4"/>
+        </w:pBdr>
+        <w:shd w:fill="F2F2F2" w:color="auto" w:val="clear"/>
+        <w:spacing w:after="0" w:line="240"/>
+        <w:ind w:left="100" w:right="100"/>
+      </w:pPr>
+      <w:r>
+        <w:rPr>
+          <w:rFonts w:ascii="Courier New" w:cs="Courier New" w:eastAsia="Courier New" w:hAnsi="Courier New"/>
+          <w:sz w:val="17"/>
+          <w:szCs w:val="17"/>
+        </w:rPr>
+        <w:t xml:space="preserve">'AB' asByteArray printNl.</w:t>
+      </w:r>
+    </w:p>
+    <w:p>
+      <w:pPr>
+        <w:keepNext/>
+        <w:keepLines/>
+        <w:pBdr>
+          <w:left w:val="single" w:color="808080" w:sz="4"/>
+          <w:right w:val="single" w:color="808080" w:sz="4"/>
+        </w:pBdr>
+        <w:shd w:fill="F2F2F2" w:color="auto" w:val="clear"/>
+        <w:spacing w:after="0" w:line="240"/>
+        <w:ind w:left="100" w:right="100"/>
+      </w:pPr>
+      <w:r>
+        <w:rPr>
+          <w:rFonts w:ascii="Courier New" w:cs="Courier New" w:eastAsia="Courier New" w:hAnsi="Courier New"/>
+          <w:sz w:val="17"/>
+          <w:szCs w:val="17"/>
+        </w:rPr>
+        <w:t xml:space="preserve">#[72 105] asString printNl.</w:t>
+      </w:r>
+    </w:p>
+    <w:p>
+      <w:pPr>
+        <w:keepNext/>
+        <w:keepLines/>
+        <w:pBdr>
+          <w:left w:val="single" w:color="808080" w:sz="4"/>
+          <w:right w:val="single" w:color="808080" w:sz="4"/>
+        </w:pBdr>
+        <w:shd w:fill="F2F2F2" w:color="auto" w:val="clear"/>
+        <w:spacing w:after="0" w:line="240"/>
+        <w:ind w:left="100" w:right="100"/>
+      </w:pPr>
+      <w:r>
+        <w:rPr>
+          <w:rFonts w:ascii="Courier New" w:cs="Courier New" w:eastAsia="Courier New" w:hAnsi="Courier New"/>
+          <w:sz w:val="17"/>
+          <w:szCs w:val="17"/>
+        </w:rPr>
+        <w:t xml:space="preserve"> </w:t>
+      </w:r>
+    </w:p>
+    <w:p>
+      <w:pPr>
+        <w:keepNext/>
+        <w:keepLines/>
+        <w:pBdr>
+          <w:left w:val="single" w:color="808080" w:sz="4"/>
+          <w:right w:val="single" w:color="808080" w:sz="4"/>
+        </w:pBdr>
+        <w:shd w:fill="F2F2F2" w:color="auto" w:val="clear"/>
+        <w:spacing w:after="0" w:line="240"/>
+        <w:ind w:left="100" w:right="100"/>
+      </w:pPr>
+      <w:r>
+        <w:rPr>
+          <w:rFonts w:ascii="Courier New" w:cs="Courier New" w:eastAsia="Courier New" w:hAnsi="Courier New"/>
+          <w:sz w:val="17"/>
+          <w:szCs w:val="17"/>
+        </w:rPr>
+        <w:t xml:space="preserve">(1 2 255 )</w:t>
+      </w:r>
+    </w:p>
+    <w:p>
+      <w:pPr>
+        <w:keepNext/>
+        <w:keepLines/>
+        <w:pBdr>
+          <w:left w:val="single" w:color="808080" w:sz="4"/>
+          <w:right w:val="single" w:color="808080" w:sz="4"/>
+        </w:pBdr>
+        <w:shd w:fill="F2F2F2" w:color="auto" w:val="clear"/>
+        <w:spacing w:after="0" w:line="240"/>
+        <w:ind w:left="100" w:right="100"/>
+      </w:pPr>
+      <w:r>
+        <w:rPr>
+          <w:rFonts w:ascii="Courier New" w:cs="Courier New" w:eastAsia="Courier New" w:hAnsi="Courier New"/>
+          <w:sz w:val="17"/>
+          <w:szCs w:val="17"/>
+        </w:rPr>
+        <w:t xml:space="preserve">'0102ff'</w:t>
+      </w:r>
+    </w:p>
+    <w:p>
+      <w:pPr>
+        <w:keepNext/>
+        <w:keepLines/>
+        <w:pBdr>
+          <w:left w:val="single" w:color="808080" w:sz="4"/>
+          <w:right w:val="single" w:color="808080" w:sz="4"/>
+        </w:pBdr>
+        <w:shd w:fill="F2F2F2" w:color="auto" w:val="clear"/>
+        <w:spacing w:after="0" w:line="240"/>
+        <w:ind w:left="100" w:right="100"/>
+      </w:pPr>
+      <w:r>
+        <w:rPr>
+          <w:rFonts w:ascii="Courier New" w:cs="Courier New" w:eastAsia="Courier New" w:hAnsi="Courier New"/>
+          <w:sz w:val="17"/>
+          <w:szCs w:val="17"/>
+        </w:rPr>
+        <w:t xml:space="preserve">(65 66 )</w:t>
+      </w:r>
+    </w:p>
+    <w:p>
+      <w:pPr>
+        <w:keepNext w:val="false"/>
+        <w:keepLines/>
+        <w:pBdr>
+          <w:bottom w:val="single" w:color="808080" w:sz="4"/>
+          <w:left w:val="single" w:color="808080" w:sz="4"/>
+          <w:right w:val="single" w:color="808080" w:sz="4"/>
+        </w:pBdr>
+        <w:shd w:fill="F2F2F2" w:color="auto" w:val="clear"/>
+        <w:spacing w:after="0" w:line="240"/>
+        <w:ind w:left="100" w:right="100"/>
+      </w:pPr>
+      <w:r>
+        <w:rPr>
+          <w:rFonts w:ascii="Courier New" w:cs="Courier New" w:eastAsia="Courier New" w:hAnsi="Courier New"/>
+          <w:sz w:val="17"/>
+          <w:szCs w:val="17"/>
+        </w:rPr>
+        <w:t xml:space="preserve">'Hi'</w:t>
+      </w:r>
+    </w:p>
+    <w:p>
+      <w:pPr>
+        <w:spacing w:after="200" w:before="60"/>
+      </w:pPr>
+      <w:r>
+        <w:rPr>
+          <w:rFonts w:ascii="Arial" w:cs="Arial" w:eastAsia="Arial" w:hAnsi="Arial"/>
+          <w:b/>
+          <w:bCs/>
+          <w:sz w:val="18"/>
+          <w:szCs w:val="18"/>
+        </w:rPr>
+        <w:t xml:space="preserve">Figure 37. </w:t>
+      </w:r>
+      <w:r>
+        <w:rPr>
+          <w:rFonts w:ascii="Arial" w:cs="Arial" w:eastAsia="Arial" w:hAnsi="Arial"/>
+          <w:sz w:val="18"/>
+          <w:szCs w:val="18"/>
+        </w:rPr>
+        <w:t xml:space="preserve">Bytes</w:t>
       </w:r>
     </w:p>
     <w:p>
@@ -20953,7 +21557,7 @@
           <w:sz w:val="18"/>
           <w:szCs w:val="18"/>
         </w:rPr>
-        <w:t xml:space="preserve">Figure 36. </w:t>
+        <w:t xml:space="preserve">Figure 38. </w:t>
       </w:r>
       <w:r>
         <w:rPr>
@@ -21461,7 +22065,7 @@
           <w:sz w:val="18"/>
           <w:szCs w:val="18"/>
         </w:rPr>
-        <w:t xml:space="preserve">Figure 37. </w:t>
+        <w:t xml:space="preserve">Figure 39. </w:t>
       </w:r>
       <w:r>
         <w:rPr>
@@ -21859,7 +22463,7 @@
           <w:sz w:val="18"/>
           <w:szCs w:val="18"/>
         </w:rPr>
-        <w:t xml:space="preserve">Figure 38. </w:t>
+        <w:t xml:space="preserve">Figure 40. </w:t>
       </w:r>
       <w:r>
         <w:rPr>
@@ -22144,7 +22748,7 @@
           <w:sz w:val="18"/>
           <w:szCs w:val="18"/>
         </w:rPr>
-        <w:t xml:space="preserve">Figure 39. </w:t>
+        <w:t xml:space="preserve">Figure 41. </w:t>
       </w:r>
       <w:r>
         <w:rPr>
@@ -22345,7 +22949,7 @@
           <w:sz w:val="18"/>
           <w:szCs w:val="18"/>
         </w:rPr>
-        <w:t xml:space="preserve">Figure 40. </w:t>
+        <w:t xml:space="preserve">Figure 42. </w:t>
       </w:r>
       <w:r>
         <w:rPr>
@@ -22630,7 +23234,7 @@
           <w:sz w:val="18"/>
           <w:szCs w:val="18"/>
         </w:rPr>
-        <w:t xml:space="preserve">Figure 41. </w:t>
+        <w:t xml:space="preserve">Figure 43. </w:t>
       </w:r>
       <w:r>
         <w:rPr>
@@ -22970,7 +23574,7 @@
           <w:sz w:val="18"/>
           <w:szCs w:val="18"/>
         </w:rPr>
-        <w:t xml:space="preserve">Figure 42. </w:t>
+        <w:t xml:space="preserve">Figure 44. </w:t>
       </w:r>
       <w:r>
         <w:rPr>
@@ -23191,7 +23795,7 @@
           <w:sz w:val="18"/>
           <w:szCs w:val="18"/>
         </w:rPr>
-        <w:t xml:space="preserve">Figure 43. </w:t>
+        <w:t xml:space="preserve">Figure 45. </w:t>
       </w:r>
       <w:r>
         <w:rPr>
@@ -23682,7 +24286,7 @@
           <w:sz w:val="18"/>
           <w:szCs w:val="18"/>
         </w:rPr>
-        <w:t xml:space="preserve">Figure 44. </w:t>
+        <w:t xml:space="preserve">Figure 46. </w:t>
       </w:r>
       <w:r>
         <w:rPr>
@@ -24051,7 +24655,7 @@
           <w:sz w:val="18"/>
           <w:szCs w:val="18"/>
         </w:rPr>
-        <w:t xml:space="preserve">Figure 45. </w:t>
+        <w:t xml:space="preserve">Figure 47. </w:t>
       </w:r>
       <w:r>
         <w:rPr>
@@ -24365,7 +24969,7 @@
           <w:sz w:val="18"/>
           <w:szCs w:val="18"/>
         </w:rPr>
-        <w:t xml:space="preserve">Figure 46. </w:t>
+        <w:t xml:space="preserve">Figure 48. </w:t>
       </w:r>
       <w:r>
         <w:rPr>
@@ -24663,7 +25267,7 @@
           <w:sz w:val="18"/>
           <w:szCs w:val="18"/>
         </w:rPr>
-        <w:t xml:space="preserve">Figure 47. </w:t>
+        <w:t xml:space="preserve">Figure 49. </w:t>
       </w:r>
       <w:r>
         <w:rPr>
@@ -24932,7 +25536,7 @@
           <w:sz w:val="18"/>
           <w:szCs w:val="18"/>
         </w:rPr>
-        <w:t xml:space="preserve">Figure 48. </w:t>
+        <w:t xml:space="preserve">Figure 50. </w:t>
       </w:r>
       <w:r>
         <w:rPr>
@@ -25233,7 +25837,7 @@
           <w:sz w:val="18"/>
           <w:szCs w:val="18"/>
         </w:rPr>
-        <w:t xml:space="preserve">Figure 49. </w:t>
+        <w:t xml:space="preserve">Figure 51. </w:t>
       </w:r>
       <w:r>
         <w:rPr>
@@ -25476,7 +26080,7 @@
           <w:sz w:val="18"/>
           <w:szCs w:val="18"/>
         </w:rPr>
-        <w:t xml:space="preserve">Figure 50. </w:t>
+        <w:t xml:space="preserve">Figure 52. </w:t>
       </w:r>
       <w:r>
         <w:rPr>
@@ -25816,7 +26420,7 @@
           <w:sz w:val="18"/>
           <w:szCs w:val="18"/>
         </w:rPr>
-        <w:t xml:space="preserve">Figure 51. </w:t>
+        <w:t xml:space="preserve">Figure 53. </w:t>
       </w:r>
       <w:r>
         <w:rPr>
@@ -26038,7 +26642,7 @@
           <w:sz w:val="18"/>
           <w:szCs w:val="18"/>
         </w:rPr>
-        <w:t xml:space="preserve">Figure 52. </w:t>
+        <w:t xml:space="preserve">Figure 54. </w:t>
       </w:r>
       <w:r>
         <w:rPr>
@@ -26260,7 +26864,7 @@
           <w:sz w:val="18"/>
           <w:szCs w:val="18"/>
         </w:rPr>
-        <w:t xml:space="preserve">Figure 53. </w:t>
+        <w:t xml:space="preserve">Figure 55. </w:t>
       </w:r>
       <w:r>
         <w:rPr>
@@ -26269,6 +26873,354 @@
           <w:szCs w:val="18"/>
         </w:rPr>
         <w:t xml:space="preserve">Reading and writing CSV</w:t>
+      </w:r>
+    </w:p>
+    <w:p>
+      <w:pPr>
+        <w:pStyle w:val="Heading2"/>
+        <w:keepNext/>
+      </w:pPr>
+      <w:r>
+        <w:rPr>
+          <w:rFonts w:ascii="Arial" w:cs="Arial" w:eastAsia="Arial" w:hAnsi="Arial"/>
+          <w:b/>
+          <w:bCs/>
+          <w:sz w:val="24"/>
+          <w:szCs w:val="24"/>
+        </w:rPr>
+        <w:t xml:space="preserve">Durations</w:t>
+      </w:r>
+    </w:p>
+    <w:p>
+      <w:pPr>
+        <w:spacing w:after="120" w:line="264"/>
+      </w:pPr>
+      <w:r>
+        <w:rPr>
+          <w:rFonts w:ascii="Arial" w:cs="Arial" w:eastAsia="Arial" w:hAnsi="Arial"/>
+          <w:sz w:val="20"/>
+          <w:szCs w:val="20"/>
+        </w:rPr>
+        <w:t xml:space="preserve">A Duration is a length of time. 90 seconds, 5 minutes, 2 hours and 3 days (and milliseconds) make Durations, and Duration days: d hours: h minutes: m seconds: s makes one from parts. It answers days, hours, minutes and seconds (the parts), asSeconds and asMilliseconds, and takes part in + and -, * and / by a number, / by another Duration (a number) and comparisons. A DateTime or Date minus a DateTime or Date is a Duration, and a DateTime plus or minus a Duration is a DateTime. A Duration prints as days:hours:minutes:seconds.</w:t>
+      </w:r>
+    </w:p>
+    <w:p>
+      <w:pPr>
+        <w:keepNext/>
+        <w:keepLines/>
+        <w:pBdr>
+          <w:top w:val="single" w:color="808080" w:sz="4"/>
+          <w:left w:val="single" w:color="808080" w:sz="4"/>
+          <w:right w:val="single" w:color="808080" w:sz="4"/>
+        </w:pBdr>
+        <w:shd w:fill="F2F2F2" w:color="auto" w:val="clear"/>
+        <w:spacing w:after="0" w:line="240"/>
+        <w:ind w:left="100" w:right="100"/>
+      </w:pPr>
+      <w:r>
+        <w:rPr>
+          <w:rFonts w:ascii="Courier New" w:cs="Courier New" w:eastAsia="Courier New" w:hAnsi="Courier New"/>
+          <w:sz w:val="17"/>
+          <w:szCs w:val="17"/>
+        </w:rPr>
+        <w:t xml:space="preserve">| d t |</w:t>
+      </w:r>
+    </w:p>
+    <w:p>
+      <w:pPr>
+        <w:keepNext/>
+        <w:keepLines/>
+        <w:pBdr>
+          <w:left w:val="single" w:color="808080" w:sz="4"/>
+          <w:right w:val="single" w:color="808080" w:sz="4"/>
+        </w:pBdr>
+        <w:shd w:fill="F2F2F2" w:color="auto" w:val="clear"/>
+        <w:spacing w:after="0" w:line="240"/>
+        <w:ind w:left="100" w:right="100"/>
+      </w:pPr>
+      <w:r>
+        <w:rPr>
+          <w:rFonts w:ascii="Courier New" w:cs="Courier New" w:eastAsia="Courier New" w:hAnsi="Courier New"/>
+          <w:sz w:val="17"/>
+          <w:szCs w:val="17"/>
+        </w:rPr>
+        <w:t xml:space="preserve">d := 90061 seconds.</w:t>
+      </w:r>
+    </w:p>
+    <w:p>
+      <w:pPr>
+        <w:keepNext/>
+        <w:keepLines/>
+        <w:pBdr>
+          <w:left w:val="single" w:color="808080" w:sz="4"/>
+          <w:right w:val="single" w:color="808080" w:sz="4"/>
+        </w:pBdr>
+        <w:shd w:fill="F2F2F2" w:color="auto" w:val="clear"/>
+        <w:spacing w:after="0" w:line="240"/>
+        <w:ind w:left="100" w:right="100"/>
+      </w:pPr>
+      <w:r>
+        <w:rPr>
+          <w:rFonts w:ascii="Courier New" w:cs="Courier New" w:eastAsia="Courier New" w:hAnsi="Courier New"/>
+          <w:sz w:val="17"/>
+          <w:szCs w:val="17"/>
+        </w:rPr>
+        <w:t xml:space="preserve">d printNl.</w:t>
+      </w:r>
+    </w:p>
+    <w:p>
+      <w:pPr>
+        <w:keepNext/>
+        <w:keepLines/>
+        <w:pBdr>
+          <w:left w:val="single" w:color="808080" w:sz="4"/>
+          <w:right w:val="single" w:color="808080" w:sz="4"/>
+        </w:pBdr>
+        <w:shd w:fill="F2F2F2" w:color="auto" w:val="clear"/>
+        <w:spacing w:after="0" w:line="240"/>
+        <w:ind w:left="100" w:right="100"/>
+      </w:pPr>
+      <w:r>
+        <w:rPr>
+          <w:rFonts w:ascii="Courier New" w:cs="Courier New" w:eastAsia="Courier New" w:hAnsi="Courier New"/>
+          <w:sz w:val="17"/>
+          <w:szCs w:val="17"/>
+        </w:rPr>
+        <w:t xml:space="preserve">(d + 5 minutes) printNl.</w:t>
+      </w:r>
+    </w:p>
+    <w:p>
+      <w:pPr>
+        <w:keepNext/>
+        <w:keepLines/>
+        <w:pBdr>
+          <w:left w:val="single" w:color="808080" w:sz="4"/>
+          <w:right w:val="single" w:color="808080" w:sz="4"/>
+        </w:pBdr>
+        <w:shd w:fill="F2F2F2" w:color="auto" w:val="clear"/>
+        <w:spacing w:after="0" w:line="240"/>
+        <w:ind w:left="100" w:right="100"/>
+      </w:pPr>
+      <w:r>
+        <w:rPr>
+          <w:rFonts w:ascii="Courier New" w:cs="Courier New" w:eastAsia="Courier New" w:hAnsi="Courier New"/>
+          <w:sz w:val="17"/>
+          <w:szCs w:val="17"/>
+        </w:rPr>
+        <w:t xml:space="preserve">(2 hours / 30 minutes) printNl.</w:t>
+      </w:r>
+    </w:p>
+    <w:p>
+      <w:pPr>
+        <w:keepNext/>
+        <w:keepLines/>
+        <w:pBdr>
+          <w:left w:val="single" w:color="808080" w:sz="4"/>
+          <w:right w:val="single" w:color="808080" w:sz="4"/>
+        </w:pBdr>
+        <w:shd w:fill="F2F2F2" w:color="auto" w:val="clear"/>
+        <w:spacing w:after="0" w:line="240"/>
+        <w:ind w:left="100" w:right="100"/>
+      </w:pPr>
+      <w:r>
+        <w:rPr>
+          <w:rFonts w:ascii="Courier New" w:cs="Courier New" w:eastAsia="Courier New" w:hAnsi="Courier New"/>
+          <w:sz w:val="17"/>
+          <w:szCs w:val="17"/>
+        </w:rPr>
+        <w:t xml:space="preserve">t := DateTime year: 2026 month: 10 day: 10 hour: 8 minute: 30 second: 0.</w:t>
+      </w:r>
+    </w:p>
+    <w:p>
+      <w:pPr>
+        <w:keepNext/>
+        <w:keepLines/>
+        <w:pBdr>
+          <w:left w:val="single" w:color="808080" w:sz="4"/>
+          <w:right w:val="single" w:color="808080" w:sz="4"/>
+        </w:pBdr>
+        <w:shd w:fill="F2F2F2" w:color="auto" w:val="clear"/>
+        <w:spacing w:after="0" w:line="240"/>
+        <w:ind w:left="100" w:right="100"/>
+      </w:pPr>
+      <w:r>
+        <w:rPr>
+          <w:rFonts w:ascii="Courier New" w:cs="Courier New" w:eastAsia="Courier New" w:hAnsi="Courier New"/>
+          <w:sz w:val="17"/>
+          <w:szCs w:val="17"/>
+        </w:rPr>
+        <w:t xml:space="preserve">(t + 36 hours) printNl.</w:t>
+      </w:r>
+    </w:p>
+    <w:p>
+      <w:pPr>
+        <w:keepNext/>
+        <w:keepLines/>
+        <w:pBdr>
+          <w:left w:val="single" w:color="808080" w:sz="4"/>
+          <w:right w:val="single" w:color="808080" w:sz="4"/>
+        </w:pBdr>
+        <w:shd w:fill="F2F2F2" w:color="auto" w:val="clear"/>
+        <w:spacing w:after="0" w:line="240"/>
+        <w:ind w:left="100" w:right="100"/>
+      </w:pPr>
+      <w:r>
+        <w:rPr>
+          <w:rFonts w:ascii="Courier New" w:cs="Courier New" w:eastAsia="Courier New" w:hAnsi="Courier New"/>
+          <w:sz w:val="17"/>
+          <w:szCs w:val="17"/>
+        </w:rPr>
+        <w:t xml:space="preserve">((t + 36 hours) - t) printNl.</w:t>
+      </w:r>
+    </w:p>
+    <w:p>
+      <w:pPr>
+        <w:keepNext/>
+        <w:keepLines/>
+        <w:pBdr>
+          <w:left w:val="single" w:color="808080" w:sz="4"/>
+          <w:right w:val="single" w:color="808080" w:sz="4"/>
+        </w:pBdr>
+        <w:shd w:fill="F2F2F2" w:color="auto" w:val="clear"/>
+        <w:spacing w:after="0" w:line="240"/>
+        <w:ind w:left="100" w:right="100"/>
+      </w:pPr>
+      <w:r>
+        <w:rPr>
+          <w:rFonts w:ascii="Courier New" w:cs="Courier New" w:eastAsia="Courier New" w:hAnsi="Courier New"/>
+          <w:sz w:val="17"/>
+          <w:szCs w:val="17"/>
+        </w:rPr>
+        <w:t xml:space="preserve"> </w:t>
+      </w:r>
+    </w:p>
+    <w:p>
+      <w:pPr>
+        <w:keepNext/>
+        <w:keepLines/>
+        <w:pBdr>
+          <w:left w:val="single" w:color="808080" w:sz="4"/>
+          <w:right w:val="single" w:color="808080" w:sz="4"/>
+        </w:pBdr>
+        <w:shd w:fill="F2F2F2" w:color="auto" w:val="clear"/>
+        <w:spacing w:after="0" w:line="240"/>
+        <w:ind w:left="100" w:right="100"/>
+      </w:pPr>
+      <w:r>
+        <w:rPr>
+          <w:rFonts w:ascii="Courier New" w:cs="Courier New" w:eastAsia="Courier New" w:hAnsi="Courier New"/>
+          <w:sz w:val="17"/>
+          <w:szCs w:val="17"/>
+        </w:rPr>
+        <w:t xml:space="preserve">1:01:01:01</w:t>
+      </w:r>
+    </w:p>
+    <w:p>
+      <w:pPr>
+        <w:keepNext/>
+        <w:keepLines/>
+        <w:pBdr>
+          <w:left w:val="single" w:color="808080" w:sz="4"/>
+          <w:right w:val="single" w:color="808080" w:sz="4"/>
+        </w:pBdr>
+        <w:shd w:fill="F2F2F2" w:color="auto" w:val="clear"/>
+        <w:spacing w:after="0" w:line="240"/>
+        <w:ind w:left="100" w:right="100"/>
+      </w:pPr>
+      <w:r>
+        <w:rPr>
+          <w:rFonts w:ascii="Courier New" w:cs="Courier New" w:eastAsia="Courier New" w:hAnsi="Courier New"/>
+          <w:sz w:val="17"/>
+          <w:szCs w:val="17"/>
+        </w:rPr>
+        <w:t xml:space="preserve">1:01:06:01</w:t>
+      </w:r>
+    </w:p>
+    <w:p>
+      <w:pPr>
+        <w:keepNext/>
+        <w:keepLines/>
+        <w:pBdr>
+          <w:left w:val="single" w:color="808080" w:sz="4"/>
+          <w:right w:val="single" w:color="808080" w:sz="4"/>
+        </w:pBdr>
+        <w:shd w:fill="F2F2F2" w:color="auto" w:val="clear"/>
+        <w:spacing w:after="0" w:line="240"/>
+        <w:ind w:left="100" w:right="100"/>
+      </w:pPr>
+      <w:r>
+        <w:rPr>
+          <w:rFonts w:ascii="Courier New" w:cs="Courier New" w:eastAsia="Courier New" w:hAnsi="Courier New"/>
+          <w:sz w:val="17"/>
+          <w:szCs w:val="17"/>
+        </w:rPr>
+        <w:t xml:space="preserve">4</w:t>
+      </w:r>
+    </w:p>
+    <w:p>
+      <w:pPr>
+        <w:keepNext/>
+        <w:keepLines/>
+        <w:pBdr>
+          <w:left w:val="single" w:color="808080" w:sz="4"/>
+          <w:right w:val="single" w:color="808080" w:sz="4"/>
+        </w:pBdr>
+        <w:shd w:fill="F2F2F2" w:color="auto" w:val="clear"/>
+        <w:spacing w:after="0" w:line="240"/>
+        <w:ind w:left="100" w:right="100"/>
+      </w:pPr>
+      <w:r>
+        <w:rPr>
+          <w:rFonts w:ascii="Courier New" w:cs="Courier New" w:eastAsia="Courier New" w:hAnsi="Courier New"/>
+          <w:sz w:val="17"/>
+          <w:szCs w:val="17"/>
+        </w:rPr>
+        <w:t xml:space="preserve">2026-10-11T20:30:00</w:t>
+      </w:r>
+    </w:p>
+    <w:p>
+      <w:pPr>
+        <w:keepNext w:val="false"/>
+        <w:keepLines/>
+        <w:pBdr>
+          <w:bottom w:val="single" w:color="808080" w:sz="4"/>
+          <w:left w:val="single" w:color="808080" w:sz="4"/>
+          <w:right w:val="single" w:color="808080" w:sz="4"/>
+        </w:pBdr>
+        <w:shd w:fill="F2F2F2" w:color="auto" w:val="clear"/>
+        <w:spacing w:after="0" w:line="240"/>
+        <w:ind w:left="100" w:right="100"/>
+      </w:pPr>
+      <w:r>
+        <w:rPr>
+          <w:rFonts w:ascii="Courier New" w:cs="Courier New" w:eastAsia="Courier New" w:hAnsi="Courier New"/>
+          <w:sz w:val="17"/>
+          <w:szCs w:val="17"/>
+        </w:rPr>
+        <w:t xml:space="preserve">1:12:00:00</w:t>
+      </w:r>
+    </w:p>
+    <w:p>
+      <w:pPr>
+        <w:spacing w:after="200" w:before="60"/>
+      </w:pPr>
+      <w:r>
+        <w:rPr>
+          <w:rFonts w:ascii="Arial" w:cs="Arial" w:eastAsia="Arial" w:hAnsi="Arial"/>
+          <w:b/>
+          <w:bCs/>
+          <w:sz w:val="18"/>
+          <w:szCs w:val="18"/>
+        </w:rPr>
+        <w:t xml:space="preserve">Figure 56. </w:t>
+      </w:r>
+      <w:r>
+        <w:rPr>
+          <w:rFonts w:ascii="Arial" w:cs="Arial" w:eastAsia="Arial" w:hAnsi="Arial"/>
+          <w:sz w:val="18"/>
+          <w:szCs w:val="18"/>
+        </w:rPr>
+        <w:t xml:space="preserve">Time arithmetic</w:t>
       </w:r>
     </w:p>
     <w:p>
@@ -26612,7 +27564,7 @@
           <w:sz w:val="18"/>
           <w:szCs w:val="18"/>
         </w:rPr>
-        <w:t xml:space="preserve">Figure 54. </w:t>
+        <w:t xml:space="preserve">Figure 57. </w:t>
       </w:r>
       <w:r>
         <w:rPr>
@@ -26939,7 +27891,7 @@
           <w:sz w:val="18"/>
           <w:szCs w:val="18"/>
         </w:rPr>
-        <w:t xml:space="preserve">Figure 55. </w:t>
+        <w:t xml:space="preserve">Figure 58. </w:t>
       </w:r>
       <w:r>
         <w:rPr>
@@ -27224,7 +28176,7 @@
           <w:sz w:val="18"/>
           <w:szCs w:val="18"/>
         </w:rPr>
-        <w:t xml:space="preserve">Figure 56. </w:t>
+        <w:t xml:space="preserve">Figure 59. </w:t>
       </w:r>
       <w:r>
         <w:rPr>
@@ -27626,7 +28578,7 @@
           <w:sz w:val="18"/>
           <w:szCs w:val="18"/>
         </w:rPr>
-        <w:t xml:space="preserve">Figure 57. </w:t>
+        <w:t xml:space="preserve">Figure 60. </w:t>
       </w:r>
       <w:r>
         <w:rPr>
@@ -28158,7 +29110,7 @@
           <w:sz w:val="18"/>
           <w:szCs w:val="18"/>
         </w:rPr>
-        <w:t xml:space="preserve">Figure 58. </w:t>
+        <w:t xml:space="preserve">Figure 61. </w:t>
       </w:r>
       <w:r>
         <w:rPr>
@@ -28518,7 +29470,7 @@
           <w:sz w:val="18"/>
           <w:szCs w:val="18"/>
         </w:rPr>
-        <w:t xml:space="preserve">Figure 59. </w:t>
+        <w:t xml:space="preserve">Figure 62. </w:t>
       </w:r>
       <w:r>
         <w:rPr>
@@ -28761,7 +29713,7 @@
           <w:sz w:val="18"/>
           <w:szCs w:val="18"/>
         </w:rPr>
-        <w:t xml:space="preserve">Figure 60. </w:t>
+        <w:t xml:space="preserve">Figure 63. </w:t>
       </w:r>
       <w:r>
         <w:rPr>
@@ -29087,7 +30039,7 @@
           <w:sz w:val="18"/>
           <w:szCs w:val="18"/>
         </w:rPr>
-        <w:t xml:space="preserve">Figure 61. </w:t>
+        <w:t xml:space="preserve">Figure 64. </w:t>
       </w:r>
       <w:r>
         <w:rPr>
@@ -29635,7 +30587,7 @@
           <w:sz w:val="18"/>
           <w:szCs w:val="18"/>
         </w:rPr>
-        <w:t xml:space="preserve">Figure 62. </w:t>
+        <w:t xml:space="preserve">Figure 65. </w:t>
       </w:r>
       <w:r>
         <w:rPr>
@@ -29941,7 +30893,7 @@
           <w:sz w:val="18"/>
           <w:szCs w:val="18"/>
         </w:rPr>
-        <w:t xml:space="preserve">Figure 63. </w:t>
+        <w:t xml:space="preserve">Figure 66. </w:t>
       </w:r>
       <w:r>
         <w:rPr>
@@ -30323,7 +31275,7 @@
           <w:sz w:val="18"/>
           <w:szCs w:val="18"/>
         </w:rPr>
-        <w:t xml:space="preserve">Figure 64. </w:t>
+        <w:t xml:space="preserve">Figure 67. </w:t>
       </w:r>
       <w:r>
         <w:rPr>
@@ -30650,7 +31602,7 @@
           <w:sz w:val="18"/>
           <w:szCs w:val="18"/>
         </w:rPr>
-        <w:t xml:space="preserve">Figure 65. </w:t>
+        <w:t xml:space="preserve">Figure 68. </w:t>
       </w:r>
       <w:r>
         <w:rPr>
@@ -31358,7 +32310,7 @@
           <w:sz w:val="18"/>
           <w:szCs w:val="18"/>
         </w:rPr>
-        <w:t xml:space="preserve">Figure 66. </w:t>
+        <w:t xml:space="preserve">Figure 69. </w:t>
       </w:r>
       <w:r>
         <w:rPr>
@@ -31976,7 +32928,7 @@
           <w:sz w:val="18"/>
           <w:szCs w:val="18"/>
         </w:rPr>
-        <w:t xml:space="preserve">Figure 67. </w:t>
+        <w:t xml:space="preserve">Figure 70. </w:t>
       </w:r>
       <w:r>
         <w:rPr>
@@ -32337,7 +33289,7 @@
           <w:sz w:val="18"/>
           <w:szCs w:val="18"/>
         </w:rPr>
-        <w:t xml:space="preserve">Figure 68. </w:t>
+        <w:t xml:space="preserve">Figure 71. </w:t>
       </w:r>
       <w:r>
         <w:rPr>
@@ -32719,7 +33671,7 @@
           <w:sz w:val="18"/>
           <w:szCs w:val="18"/>
         </w:rPr>
-        <w:t xml:space="preserve">Figure 69. </w:t>
+        <w:t xml:space="preserve">Figure 72. </w:t>
       </w:r>
       <w:r>
         <w:rPr>
@@ -32728,6 +33680,409 @@
           <w:szCs w:val="18"/>
         </w:rPr>
         <w:t xml:space="preserve">Compiling and evaluating</w:t>
+      </w:r>
+    </w:p>
+    <w:p>
+      <w:pPr>
+        <w:pStyle w:val="Heading2"/>
+        <w:keepNext/>
+      </w:pPr>
+      <w:r>
+        <w:rPr>
+          <w:rFonts w:ascii="Arial" w:cs="Arial" w:eastAsia="Arial" w:hAnsi="Arial"/>
+          <w:b/>
+          <w:bCs/>
+          <w:sz w:val="24"/>
+          <w:szCs w:val="24"/>
+        </w:rPr>
+        <w:t xml:space="preserve">More about objects</w:t>
+      </w:r>
+    </w:p>
+    <w:p>
+      <w:pPr>
+        <w:spacing w:after="120" w:line="264"/>
+      </w:pPr>
+      <w:r>
+        <w:rPr>
+          <w:rFonts w:ascii="Arial" w:cs="Arial" w:eastAsia="Arial" w:hAnsi="Arial"/>
+          <w:sz w:val="20"/>
+          <w:szCs w:val="20"/>
+        </w:rPr>
+        <w:t xml:space="preserve">anObject become: another swaps the two objects: every reference to the one now sees the other. Behavior allInstances answers an Array of the instances of a class that exist (the interpreter has no garbage collector, so this includes objects that are no longer used) and instanceCount their number. aClass &gt;&gt; #selector answers a CompiledMethod, which knows methodClass, selector and numArgs and runs with valueWithReceiver:withArguments:; lookupSelector: also looks in the superclasses.</w:t>
+      </w:r>
+    </w:p>
+    <w:p>
+      <w:pPr>
+        <w:spacing w:after="120" w:line="264"/>
+      </w:pPr>
+      <w:r>
+        <w:rPr>
+          <w:rFonts w:ascii="Arial" w:cs="Arial" w:eastAsia="Arial" w:hAnsi="Arial"/>
+          <w:sz w:val="20"/>
+          <w:szCs w:val="20"/>
+        </w:rPr>
+        <w:t xml:space="preserve">The dependents mechanism of Smalltalk-80 is in Object. addDependent: anObject registers an object, removeDependent: removes it and dependents answers them. changed and changed: aParameter send update: aParameter to every dependent; release forgets all of them. A Rectangle has origin and corner (origin: o corner: c, origin: o extent: e, or aPoint corner: aPoint), width, height, area, center, containsPoint:, intersects:, intersect:, merge: and translateBy:.</w:t>
+      </w:r>
+    </w:p>
+    <w:p>
+      <w:pPr>
+        <w:keepNext/>
+        <w:keepLines/>
+        <w:pBdr>
+          <w:top w:val="single" w:color="808080" w:sz="4"/>
+          <w:left w:val="single" w:color="808080" w:sz="4"/>
+          <w:right w:val="single" w:color="808080" w:sz="4"/>
+        </w:pBdr>
+        <w:shd w:fill="F2F2F2" w:color="auto" w:val="clear"/>
+        <w:spacing w:after="0" w:line="240"/>
+        <w:ind w:left="100" w:right="100"/>
+      </w:pPr>
+      <w:r>
+        <w:rPr>
+          <w:rFonts w:ascii="Courier New" w:cs="Courier New" w:eastAsia="Courier New" w:hAnsi="Courier New"/>
+          <w:sz w:val="17"/>
+          <w:szCs w:val="17"/>
+        </w:rPr>
+        <w:t xml:space="preserve">Object subclass: Model [ |v| v: x [ v := x. self changed: #v ] ]</w:t>
+      </w:r>
+    </w:p>
+    <w:p>
+      <w:pPr>
+        <w:keepNext/>
+        <w:keepLines/>
+        <w:pBdr>
+          <w:left w:val="single" w:color="808080" w:sz="4"/>
+          <w:right w:val="single" w:color="808080" w:sz="4"/>
+        </w:pBdr>
+        <w:shd w:fill="F2F2F2" w:color="auto" w:val="clear"/>
+        <w:spacing w:after="0" w:line="240"/>
+        <w:ind w:left="100" w:right="100"/>
+      </w:pPr>
+      <w:r>
+        <w:rPr>
+          <w:rFonts w:ascii="Courier New" w:cs="Courier New" w:eastAsia="Courier New" w:hAnsi="Courier New"/>
+          <w:sz w:val="17"/>
+          <w:szCs w:val="17"/>
+        </w:rPr>
+        <w:t xml:space="preserve">Object subclass: Watcher [ update: a [ Transcript showCr: 'changed ', a printString ] ]</w:t>
+      </w:r>
+    </w:p>
+    <w:p>
+      <w:pPr>
+        <w:keepNext/>
+        <w:keepLines/>
+        <w:pBdr>
+          <w:left w:val="single" w:color="808080" w:sz="4"/>
+          <w:right w:val="single" w:color="808080" w:sz="4"/>
+        </w:pBdr>
+        <w:shd w:fill="F2F2F2" w:color="auto" w:val="clear"/>
+        <w:spacing w:after="0" w:line="240"/>
+        <w:ind w:left="100" w:right="100"/>
+      </w:pPr>
+      <w:r>
+        <w:rPr>
+          <w:rFonts w:ascii="Courier New" w:cs="Courier New" w:eastAsia="Courier New" w:hAnsi="Courier New"/>
+          <w:sz w:val="17"/>
+          <w:szCs w:val="17"/>
+        </w:rPr>
+        <w:t xml:space="preserve">| m a b |</w:t>
+      </w:r>
+    </w:p>
+    <w:p>
+      <w:pPr>
+        <w:keepNext/>
+        <w:keepLines/>
+        <w:pBdr>
+          <w:left w:val="single" w:color="808080" w:sz="4"/>
+          <w:right w:val="single" w:color="808080" w:sz="4"/>
+        </w:pBdr>
+        <w:shd w:fill="F2F2F2" w:color="auto" w:val="clear"/>
+        <w:spacing w:after="0" w:line="240"/>
+        <w:ind w:left="100" w:right="100"/>
+      </w:pPr>
+      <w:r>
+        <w:rPr>
+          <w:rFonts w:ascii="Courier New" w:cs="Courier New" w:eastAsia="Courier New" w:hAnsi="Courier New"/>
+          <w:sz w:val="17"/>
+          <w:szCs w:val="17"/>
+        </w:rPr>
+        <w:t xml:space="preserve">m := Model new.</w:t>
+      </w:r>
+    </w:p>
+    <w:p>
+      <w:pPr>
+        <w:keepNext/>
+        <w:keepLines/>
+        <w:pBdr>
+          <w:left w:val="single" w:color="808080" w:sz="4"/>
+          <w:right w:val="single" w:color="808080" w:sz="4"/>
+        </w:pBdr>
+        <w:shd w:fill="F2F2F2" w:color="auto" w:val="clear"/>
+        <w:spacing w:after="0" w:line="240"/>
+        <w:ind w:left="100" w:right="100"/>
+      </w:pPr>
+      <w:r>
+        <w:rPr>
+          <w:rFonts w:ascii="Courier New" w:cs="Courier New" w:eastAsia="Courier New" w:hAnsi="Courier New"/>
+          <w:sz w:val="17"/>
+          <w:szCs w:val="17"/>
+        </w:rPr>
+        <w:t xml:space="preserve">m addDependent: Watcher new.</w:t>
+      </w:r>
+    </w:p>
+    <w:p>
+      <w:pPr>
+        <w:keepNext/>
+        <w:keepLines/>
+        <w:pBdr>
+          <w:left w:val="single" w:color="808080" w:sz="4"/>
+          <w:right w:val="single" w:color="808080" w:sz="4"/>
+        </w:pBdr>
+        <w:shd w:fill="F2F2F2" w:color="auto" w:val="clear"/>
+        <w:spacing w:after="0" w:line="240"/>
+        <w:ind w:left="100" w:right="100"/>
+      </w:pPr>
+      <w:r>
+        <w:rPr>
+          <w:rFonts w:ascii="Courier New" w:cs="Courier New" w:eastAsia="Courier New" w:hAnsi="Courier New"/>
+          <w:sz w:val="17"/>
+          <w:szCs w:val="17"/>
+        </w:rPr>
+        <w:t xml:space="preserve">m v: 3.</w:t>
+      </w:r>
+    </w:p>
+    <w:p>
+      <w:pPr>
+        <w:keepNext/>
+        <w:keepLines/>
+        <w:pBdr>
+          <w:left w:val="single" w:color="808080" w:sz="4"/>
+          <w:right w:val="single" w:color="808080" w:sz="4"/>
+        </w:pBdr>
+        <w:shd w:fill="F2F2F2" w:color="auto" w:val="clear"/>
+        <w:spacing w:after="0" w:line="240"/>
+        <w:ind w:left="100" w:right="100"/>
+      </w:pPr>
+      <w:r>
+        <w:rPr>
+          <w:rFonts w:ascii="Courier New" w:cs="Courier New" w:eastAsia="Courier New" w:hAnsi="Courier New"/>
+          <w:sz w:val="17"/>
+          <w:szCs w:val="17"/>
+        </w:rPr>
+        <w:t xml:space="preserve">a := 'one'. b := 'two'.</w:t>
+      </w:r>
+    </w:p>
+    <w:p>
+      <w:pPr>
+        <w:keepNext/>
+        <w:keepLines/>
+        <w:pBdr>
+          <w:left w:val="single" w:color="808080" w:sz="4"/>
+          <w:right w:val="single" w:color="808080" w:sz="4"/>
+        </w:pBdr>
+        <w:shd w:fill="F2F2F2" w:color="auto" w:val="clear"/>
+        <w:spacing w:after="0" w:line="240"/>
+        <w:ind w:left="100" w:right="100"/>
+      </w:pPr>
+      <w:r>
+        <w:rPr>
+          <w:rFonts w:ascii="Courier New" w:cs="Courier New" w:eastAsia="Courier New" w:hAnsi="Courier New"/>
+          <w:sz w:val="17"/>
+          <w:szCs w:val="17"/>
+        </w:rPr>
+        <w:t xml:space="preserve">a become: b.</w:t>
+      </w:r>
+    </w:p>
+    <w:p>
+      <w:pPr>
+        <w:keepNext/>
+        <w:keepLines/>
+        <w:pBdr>
+          <w:left w:val="single" w:color="808080" w:sz="4"/>
+          <w:right w:val="single" w:color="808080" w:sz="4"/>
+        </w:pBdr>
+        <w:shd w:fill="F2F2F2" w:color="auto" w:val="clear"/>
+        <w:spacing w:after="0" w:line="240"/>
+        <w:ind w:left="100" w:right="100"/>
+      </w:pPr>
+      <w:r>
+        <w:rPr>
+          <w:rFonts w:ascii="Courier New" w:cs="Courier New" w:eastAsia="Courier New" w:hAnsi="Courier New"/>
+          <w:sz w:val="17"/>
+          <w:szCs w:val="17"/>
+        </w:rPr>
+        <w:t xml:space="preserve">a printNl.</w:t>
+      </w:r>
+    </w:p>
+    <w:p>
+      <w:pPr>
+        <w:keepNext/>
+        <w:keepLines/>
+        <w:pBdr>
+          <w:left w:val="single" w:color="808080" w:sz="4"/>
+          <w:right w:val="single" w:color="808080" w:sz="4"/>
+        </w:pBdr>
+        <w:shd w:fill="F2F2F2" w:color="auto" w:val="clear"/>
+        <w:spacing w:after="0" w:line="240"/>
+        <w:ind w:left="100" w:right="100"/>
+      </w:pPr>
+      <w:r>
+        <w:rPr>
+          <w:rFonts w:ascii="Courier New" w:cs="Courier New" w:eastAsia="Courier New" w:hAnsi="Courier New"/>
+          <w:sz w:val="17"/>
+          <w:szCs w:val="17"/>
+        </w:rPr>
+        <w:t xml:space="preserve">b printNl.</w:t>
+      </w:r>
+    </w:p>
+    <w:p>
+      <w:pPr>
+        <w:keepNext/>
+        <w:keepLines/>
+        <w:pBdr>
+          <w:left w:val="single" w:color="808080" w:sz="4"/>
+          <w:right w:val="single" w:color="808080" w:sz="4"/>
+        </w:pBdr>
+        <w:shd w:fill="F2F2F2" w:color="auto" w:val="clear"/>
+        <w:spacing w:after="0" w:line="240"/>
+        <w:ind w:left="100" w:right="100"/>
+      </w:pPr>
+      <w:r>
+        <w:rPr>
+          <w:rFonts w:ascii="Courier New" w:cs="Courier New" w:eastAsia="Courier New" w:hAnsi="Courier New"/>
+          <w:sz w:val="17"/>
+          <w:szCs w:val="17"/>
+        </w:rPr>
+        <w:t xml:space="preserve">((0@0) corner: (4@4)) area printNl.</w:t>
+      </w:r>
+    </w:p>
+    <w:p>
+      <w:pPr>
+        <w:keepNext/>
+        <w:keepLines/>
+        <w:pBdr>
+          <w:left w:val="single" w:color="808080" w:sz="4"/>
+          <w:right w:val="single" w:color="808080" w:sz="4"/>
+        </w:pBdr>
+        <w:shd w:fill="F2F2F2" w:color="auto" w:val="clear"/>
+        <w:spacing w:after="0" w:line="240"/>
+        <w:ind w:left="100" w:right="100"/>
+      </w:pPr>
+      <w:r>
+        <w:rPr>
+          <w:rFonts w:ascii="Courier New" w:cs="Courier New" w:eastAsia="Courier New" w:hAnsi="Courier New"/>
+          <w:sz w:val="17"/>
+          <w:szCs w:val="17"/>
+        </w:rPr>
+        <w:t xml:space="preserve"> </w:t>
+      </w:r>
+    </w:p>
+    <w:p>
+      <w:pPr>
+        <w:keepNext/>
+        <w:keepLines/>
+        <w:pBdr>
+          <w:left w:val="single" w:color="808080" w:sz="4"/>
+          <w:right w:val="single" w:color="808080" w:sz="4"/>
+        </w:pBdr>
+        <w:shd w:fill="F2F2F2" w:color="auto" w:val="clear"/>
+        <w:spacing w:after="0" w:line="240"/>
+        <w:ind w:left="100" w:right="100"/>
+      </w:pPr>
+      <w:r>
+        <w:rPr>
+          <w:rFonts w:ascii="Courier New" w:cs="Courier New" w:eastAsia="Courier New" w:hAnsi="Courier New"/>
+          <w:sz w:val="17"/>
+          <w:szCs w:val="17"/>
+        </w:rPr>
+        <w:t xml:space="preserve">changed #v</w:t>
+      </w:r>
+    </w:p>
+    <w:p>
+      <w:pPr>
+        <w:keepNext/>
+        <w:keepLines/>
+        <w:pBdr>
+          <w:left w:val="single" w:color="808080" w:sz="4"/>
+          <w:right w:val="single" w:color="808080" w:sz="4"/>
+        </w:pBdr>
+        <w:shd w:fill="F2F2F2" w:color="auto" w:val="clear"/>
+        <w:spacing w:after="0" w:line="240"/>
+        <w:ind w:left="100" w:right="100"/>
+      </w:pPr>
+      <w:r>
+        <w:rPr>
+          <w:rFonts w:ascii="Courier New" w:cs="Courier New" w:eastAsia="Courier New" w:hAnsi="Courier New"/>
+          <w:sz w:val="17"/>
+          <w:szCs w:val="17"/>
+        </w:rPr>
+        <w:t xml:space="preserve">'two'</w:t>
+      </w:r>
+    </w:p>
+    <w:p>
+      <w:pPr>
+        <w:keepNext/>
+        <w:keepLines/>
+        <w:pBdr>
+          <w:left w:val="single" w:color="808080" w:sz="4"/>
+          <w:right w:val="single" w:color="808080" w:sz="4"/>
+        </w:pBdr>
+        <w:shd w:fill="F2F2F2" w:color="auto" w:val="clear"/>
+        <w:spacing w:after="0" w:line="240"/>
+        <w:ind w:left="100" w:right="100"/>
+      </w:pPr>
+      <w:r>
+        <w:rPr>
+          <w:rFonts w:ascii="Courier New" w:cs="Courier New" w:eastAsia="Courier New" w:hAnsi="Courier New"/>
+          <w:sz w:val="17"/>
+          <w:szCs w:val="17"/>
+        </w:rPr>
+        <w:t xml:space="preserve">'one'</w:t>
+      </w:r>
+    </w:p>
+    <w:p>
+      <w:pPr>
+        <w:keepNext w:val="false"/>
+        <w:keepLines/>
+        <w:pBdr>
+          <w:bottom w:val="single" w:color="808080" w:sz="4"/>
+          <w:left w:val="single" w:color="808080" w:sz="4"/>
+          <w:right w:val="single" w:color="808080" w:sz="4"/>
+        </w:pBdr>
+        <w:shd w:fill="F2F2F2" w:color="auto" w:val="clear"/>
+        <w:spacing w:after="0" w:line="240"/>
+        <w:ind w:left="100" w:right="100"/>
+      </w:pPr>
+      <w:r>
+        <w:rPr>
+          <w:rFonts w:ascii="Courier New" w:cs="Courier New" w:eastAsia="Courier New" w:hAnsi="Courier New"/>
+          <w:sz w:val="17"/>
+          <w:szCs w:val="17"/>
+        </w:rPr>
+        <w:t xml:space="preserve">16</w:t>
+      </w:r>
+    </w:p>
+    <w:p>
+      <w:pPr>
+        <w:spacing w:after="200" w:before="60"/>
+      </w:pPr>
+      <w:r>
+        <w:rPr>
+          <w:rFonts w:ascii="Arial" w:cs="Arial" w:eastAsia="Arial" w:hAnsi="Arial"/>
+          <w:b/>
+          <w:bCs/>
+          <w:sz w:val="18"/>
+          <w:szCs w:val="18"/>
+        </w:rPr>
+        <w:t xml:space="preserve">Figure 73. </w:t>
+      </w:r>
+      <w:r>
+        <w:rPr>
+          <w:rFonts w:ascii="Arial" w:cs="Arial" w:eastAsia="Arial" w:hAnsi="Arial"/>
+          <w:sz w:val="18"/>
+          <w:szCs w:val="18"/>
+        </w:rPr>
+        <w:t xml:space="preserve">Dependents and become:</w:t>
       </w:r>
     </w:p>
     <w:p>
@@ -33087,7 +34442,7 @@
           <w:sz w:val="18"/>
           <w:szCs w:val="18"/>
         </w:rPr>
-        <w:t xml:space="preserve">Figure 70. </w:t>
+        <w:t xml:space="preserve">Figure 74. </w:t>
       </w:r>
       <w:r>
         <w:rPr>
@@ -33928,7 +35283,7 @@
           <w:sz w:val="18"/>
           <w:szCs w:val="18"/>
         </w:rPr>
-        <w:t xml:space="preserve">Figure 71. </w:t>
+        <w:t xml:space="preserve">Figure 75. </w:t>
       </w:r>
       <w:r>
         <w:rPr>
@@ -34785,7 +36140,7 @@
           <w:sz w:val="18"/>
           <w:szCs w:val="18"/>
         </w:rPr>
-        <w:t xml:space="preserve">Figure 72. </w:t>
+        <w:t xml:space="preserve">Figure 76. </w:t>
       </w:r>
       <w:r>
         <w:rPr>
@@ -35560,7 +36915,7 @@
           <w:sz w:val="18"/>
           <w:szCs w:val="18"/>
         </w:rPr>
-        <w:t xml:space="preserve">Figure 73. </w:t>
+        <w:t xml:space="preserve">Figure 77. </w:t>
       </w:r>
       <w:r>
         <w:rPr>
@@ -36718,7 +38073,7 @@
           <w:sz w:val="18"/>
           <w:szCs w:val="18"/>
         </w:rPr>
-        <w:t xml:space="preserve">Figure 74. </w:t>
+        <w:t xml:space="preserve">Figure 78. </w:t>
       </w:r>
       <w:r>
         <w:rPr>
@@ -37436,7 +38791,7 @@
           <w:sz w:val="18"/>
           <w:szCs w:val="18"/>
         </w:rPr>
-        <w:t xml:space="preserve">Figure 75. </w:t>
+        <w:t xml:space="preserve">Figure 79. </w:t>
       </w:r>
       <w:r>
         <w:rPr>

</xml_diff>

<commit_message>
Unicode via the CREXX VM: wide characters, normalization, casefold, graphemes, UTF-8 bytes; manual and README
Co-Authored-By: Claude Sonnet 5.5 <noreply@anthropic.com>
Claude-Session: https://claude.ai/code/session_013PfZHD8os4FWhvmVG9Tf7M
</commit_message>
<xml_diff>
--- a/docs/Smalltalk-CREXX-Guide.docx
+++ b/docs/Smalltalk-CREXX-Guide.docx
@@ -1230,6 +1230,25 @@
         <w:tabs>
           <w:tab w:val="right" w:pos="9638" w:leader="dot"/>
         </w:tabs>
+        <w:spacing w:after="0" w:before="0"/>
+        <w:ind w:left="360"/>
+      </w:pPr>
+      <w:r>
+        <w:rPr>
+          <w:rFonts w:ascii="Arial" w:cs="Arial" w:eastAsia="Arial" w:hAnsi="Arial"/>
+          <w:b w:val="false"/>
+          <w:bCs w:val="false"/>
+          <w:sz w:val="18"/>
+          <w:szCs w:val="18"/>
+        </w:rPr>
+        <w:t xml:space="preserve">Heap, LookupTable and WeakSet	21</w:t>
+      </w:r>
+    </w:p>
+    <w:p>
+      <w:pPr>
+        <w:tabs>
+          <w:tab w:val="right" w:pos="9638" w:leader="dot"/>
+        </w:tabs>
         <w:spacing w:after="20" w:before="100"/>
         <w:ind w:left="0"/>
       </w:pPr>
@@ -1382,6 +1401,25 @@
         <w:tabs>
           <w:tab w:val="right" w:pos="9638" w:leader="dot"/>
         </w:tabs>
+        <w:spacing w:after="0" w:before="0"/>
+        <w:ind w:left="360"/>
+      </w:pPr>
+      <w:r>
+        <w:rPr>
+          <w:rFonts w:ascii="Arial" w:cs="Arial" w:eastAsia="Arial" w:hAnsi="Arial"/>
+          <w:b w:val="false"/>
+          <w:bCs w:val="false"/>
+          <w:sz w:val="18"/>
+          <w:szCs w:val="18"/>
+        </w:rPr>
+        <w:t xml:space="preserve">Unicode	24</w:t>
+      </w:r>
+    </w:p>
+    <w:p>
+      <w:pPr>
+        <w:tabs>
+          <w:tab w:val="right" w:pos="9638" w:leader="dot"/>
+        </w:tabs>
         <w:spacing w:after="20" w:before="100"/>
         <w:ind w:left="0"/>
       </w:pPr>
@@ -1393,7 +1431,7 @@
           <w:sz w:val="19"/>
           <w:szCs w:val="19"/>
         </w:rPr>
-        <w:t xml:space="preserve">Chapter 8. Streams and the Transcript	25</w:t>
+        <w:t xml:space="preserve">Chapter 8. Streams and the Transcript	26</w:t>
       </w:r>
     </w:p>
     <w:p>
@@ -1412,7 +1450,7 @@
           <w:sz w:val="18"/>
           <w:szCs w:val="18"/>
         </w:rPr>
-        <w:t xml:space="preserve">The Transcript	25</w:t>
+        <w:t xml:space="preserve">The Transcript	26</w:t>
       </w:r>
     </w:p>
     <w:p>
@@ -1431,7 +1469,7 @@
           <w:sz w:val="18"/>
           <w:szCs w:val="18"/>
         </w:rPr>
-        <w:t xml:space="preserve">Read streams	25</w:t>
+        <w:t xml:space="preserve">Redirecting the Transcript	26</w:t>
       </w:r>
     </w:p>
     <w:p>
@@ -1450,7 +1488,7 @@
           <w:sz w:val="18"/>
           <w:szCs w:val="18"/>
         </w:rPr>
-        <w:t xml:space="preserve">Write streams	25</w:t>
+        <w:t xml:space="preserve">Read streams	26</w:t>
       </w:r>
     </w:p>
     <w:p>
@@ -1469,7 +1507,7 @@
           <w:sz w:val="18"/>
           <w:szCs w:val="18"/>
         </w:rPr>
-        <w:t xml:space="preserve">Standard input	25</w:t>
+        <w:t xml:space="preserve">Write streams	26</w:t>
       </w:r>
     </w:p>
     <w:p>
@@ -1488,7 +1526,7 @@
           <w:sz w:val="18"/>
           <w:szCs w:val="18"/>
         </w:rPr>
-        <w:t xml:space="preserve">Files	26</w:t>
+        <w:t xml:space="preserve">Standard input	27</w:t>
       </w:r>
     </w:p>
     <w:p>
@@ -1507,7 +1545,7 @@
           <w:sz w:val="18"/>
           <w:szCs w:val="18"/>
         </w:rPr>
-        <w:t xml:space="preserve">Date and Time	26</w:t>
+        <w:t xml:space="preserve">Files	27</w:t>
       </w:r>
     </w:p>
     <w:p>
@@ -1526,7 +1564,7 @@
           <w:sz w:val="18"/>
           <w:szCs w:val="18"/>
         </w:rPr>
-        <w:t xml:space="preserve">More stream methods	27</w:t>
+        <w:t xml:space="preserve">Date and Time	27</w:t>
       </w:r>
     </w:p>
     <w:p>
@@ -1545,7 +1583,7 @@
           <w:sz w:val="18"/>
           <w:szCs w:val="18"/>
         </w:rPr>
-        <w:t xml:space="preserve">Stopwatch	27</w:t>
+        <w:t xml:space="preserve">More stream methods	28</w:t>
       </w:r>
     </w:p>
     <w:p>
@@ -1564,7 +1602,7 @@
           <w:sz w:val="18"/>
           <w:szCs w:val="18"/>
         </w:rPr>
-        <w:t xml:space="preserve">Parsing and formatting dates	27</w:t>
+        <w:t xml:space="preserve">Stopwatch	28</w:t>
       </w:r>
     </w:p>
     <w:p>
@@ -1583,7 +1621,7 @@
           <w:sz w:val="18"/>
           <w:szCs w:val="18"/>
         </w:rPr>
-        <w:t xml:space="preserve">ReadWriteStream	27</w:t>
+        <w:t xml:space="preserve">Parsing and formatting dates	28</w:t>
       </w:r>
     </w:p>
     <w:p>
@@ -1602,7 +1640,7 @@
           <w:sz w:val="18"/>
           <w:szCs w:val="18"/>
         </w:rPr>
-        <w:t xml:space="preserve">Managing files and directories	28</w:t>
+        <w:t xml:space="preserve">ReadWriteStream	29</w:t>
       </w:r>
     </w:p>
     <w:p>
@@ -1621,7 +1659,7 @@
           <w:sz w:val="18"/>
           <w:szCs w:val="18"/>
         </w:rPr>
-        <w:t xml:space="preserve">Running programs	28</w:t>
+        <w:t xml:space="preserve">Managing files and directories	29</w:t>
       </w:r>
     </w:p>
     <w:p>
@@ -1640,7 +1678,7 @@
           <w:sz w:val="18"/>
           <w:szCs w:val="18"/>
         </w:rPr>
-        <w:t xml:space="preserve">CSV	28</w:t>
+        <w:t xml:space="preserve">Running programs	29</w:t>
       </w:r>
     </w:p>
     <w:p>
@@ -1659,7 +1697,26 @@
           <w:sz w:val="18"/>
           <w:szCs w:val="18"/>
         </w:rPr>
-        <w:t xml:space="preserve">Durations	29</w:t>
+        <w:t xml:space="preserve">CSV	30</w:t>
+      </w:r>
+    </w:p>
+    <w:p>
+      <w:pPr>
+        <w:tabs>
+          <w:tab w:val="right" w:pos="9638" w:leader="dot"/>
+        </w:tabs>
+        <w:spacing w:after="0" w:before="0"/>
+        <w:ind w:left="360"/>
+      </w:pPr>
+      <w:r>
+        <w:rPr>
+          <w:rFonts w:ascii="Arial" w:cs="Arial" w:eastAsia="Arial" w:hAnsi="Arial"/>
+          <w:b w:val="false"/>
+          <w:bCs w:val="false"/>
+          <w:sz w:val="18"/>
+          <w:szCs w:val="18"/>
+        </w:rPr>
+        <w:t xml:space="preserve">Durations	30</w:t>
       </w:r>
     </w:p>
     <w:p>
@@ -1678,7 +1735,7 @@
           <w:sz w:val="19"/>
           <w:szCs w:val="19"/>
         </w:rPr>
-        <w:t xml:space="preserve">Chapter 9. Networking	30</w:t>
+        <w:t xml:space="preserve">Chapter 9. Networking	31</w:t>
       </w:r>
     </w:p>
     <w:p>
@@ -1697,7 +1754,7 @@
           <w:sz w:val="18"/>
           <w:szCs w:val="18"/>
         </w:rPr>
-        <w:t xml:space="preserve">Sockets	30</w:t>
+        <w:t xml:space="preserve">Sockets	31</w:t>
       </w:r>
     </w:p>
     <w:p>
@@ -1716,7 +1773,7 @@
           <w:sz w:val="18"/>
           <w:szCs w:val="18"/>
         </w:rPr>
-        <w:t xml:space="preserve">URLs	30</w:t>
+        <w:t xml:space="preserve">URLs	31</w:t>
       </w:r>
     </w:p>
     <w:p>
@@ -1735,7 +1792,7 @@
           <w:sz w:val="18"/>
           <w:szCs w:val="18"/>
         </w:rPr>
-        <w:t xml:space="preserve">HTTP	30</w:t>
+        <w:t xml:space="preserve">HTTP	31</w:t>
       </w:r>
     </w:p>
     <w:p>
@@ -1754,7 +1811,7 @@
           <w:sz w:val="19"/>
           <w:szCs w:val="19"/>
         </w:rPr>
-        <w:t xml:space="preserve">Chapter 10. Testing with SUnit	32</w:t>
+        <w:t xml:space="preserve">Chapter 10. Testing with SUnit	33</w:t>
       </w:r>
     </w:p>
     <w:p>
@@ -1773,7 +1830,7 @@
           <w:sz w:val="18"/>
           <w:szCs w:val="18"/>
         </w:rPr>
-        <w:t xml:space="preserve">Writing tests	32</w:t>
+        <w:t xml:space="preserve">Writing tests	33</w:t>
       </w:r>
     </w:p>
     <w:p>
@@ -1792,7 +1849,7 @@
           <w:sz w:val="18"/>
           <w:szCs w:val="18"/>
         </w:rPr>
-        <w:t xml:space="preserve">Running tests	32</w:t>
+        <w:t xml:space="preserve">Running tests	33</w:t>
       </w:r>
     </w:p>
     <w:p>
@@ -1811,7 +1868,7 @@
           <w:sz w:val="19"/>
           <w:szCs w:val="19"/>
         </w:rPr>
-        <w:t xml:space="preserve">Chapter 11. Processes	33</w:t>
+        <w:t xml:space="preserve">Chapter 11. Processes	34</w:t>
       </w:r>
     </w:p>
     <w:p>
@@ -1830,7 +1887,7 @@
           <w:sz w:val="18"/>
           <w:szCs w:val="18"/>
         </w:rPr>
-        <w:t xml:space="preserve">Starting processes	33</w:t>
+        <w:t xml:space="preserve">Starting processes	34</w:t>
       </w:r>
     </w:p>
     <w:p>
@@ -1849,7 +1906,7 @@
           <w:sz w:val="18"/>
           <w:szCs w:val="18"/>
         </w:rPr>
-        <w:t xml:space="preserve">Semaphores, queues and delays	33</w:t>
+        <w:t xml:space="preserve">Semaphores, queues and delays	34</w:t>
       </w:r>
     </w:p>
     <w:p>
@@ -1868,7 +1925,7 @@
           <w:sz w:val="19"/>
           <w:szCs w:val="19"/>
         </w:rPr>
-        <w:t xml:space="preserve">Chapter 12. Exceptions	34</w:t>
+        <w:t xml:space="preserve">Chapter 12. Exceptions	35</w:t>
       </w:r>
     </w:p>
     <w:p>
@@ -1887,7 +1944,7 @@
           <w:sz w:val="18"/>
           <w:szCs w:val="18"/>
         </w:rPr>
-        <w:t xml:space="preserve">Handling	34</w:t>
+        <w:t xml:space="preserve">Handling	35</w:t>
       </w:r>
     </w:p>
     <w:p>
@@ -1906,7 +1963,7 @@
           <w:sz w:val="18"/>
           <w:szCs w:val="18"/>
         </w:rPr>
-        <w:t xml:space="preserve">Messages understood by an exception	34</w:t>
+        <w:t xml:space="preserve">Messages understood by an exception	35</w:t>
       </w:r>
     </w:p>
     <w:p>
@@ -1925,7 +1982,7 @@
           <w:sz w:val="18"/>
           <w:szCs w:val="18"/>
         </w:rPr>
-        <w:t xml:space="preserve">Signaling	34</w:t>
+        <w:t xml:space="preserve">Signaling	35</w:t>
       </w:r>
     </w:p>
     <w:p>
@@ -1944,7 +2001,7 @@
           <w:sz w:val="18"/>
           <w:szCs w:val="18"/>
         </w:rPr>
-        <w:t xml:space="preserve">Cleaning up	35</w:t>
+        <w:t xml:space="preserve">Cleaning up	36</w:t>
       </w:r>
     </w:p>
     <w:p>
@@ -1963,7 +2020,7 @@
           <w:sz w:val="18"/>
           <w:szCs w:val="18"/>
         </w:rPr>
-        <w:t xml:space="preserve">Your own exceptions	35</w:t>
+        <w:t xml:space="preserve">Your own exceptions	36</w:t>
       </w:r>
     </w:p>
     <w:p>
@@ -1982,7 +2039,7 @@
           <w:sz w:val="19"/>
           <w:szCs w:val="19"/>
         </w:rPr>
-        <w:t xml:space="preserve">Chapter 13. Reflection and the System	36</w:t>
+        <w:t xml:space="preserve">Chapter 13. Reflection and the System	37</w:t>
       </w:r>
     </w:p>
     <w:p>
@@ -2001,7 +2058,7 @@
           <w:sz w:val="18"/>
           <w:szCs w:val="18"/>
         </w:rPr>
-        <w:t xml:space="preserve">Asking about objects	36</w:t>
+        <w:t xml:space="preserve">Asking about objects	37</w:t>
       </w:r>
     </w:p>
     <w:p>
@@ -2020,7 +2077,7 @@
           <w:sz w:val="18"/>
           <w:szCs w:val="18"/>
         </w:rPr>
-        <w:t xml:space="preserve">Asking about classes	36</w:t>
+        <w:t xml:space="preserve">Asking about classes	37</w:t>
       </w:r>
     </w:p>
     <w:p>
@@ -2039,7 +2096,7 @@
           <w:sz w:val="18"/>
           <w:szCs w:val="18"/>
         </w:rPr>
-        <w:t xml:space="preserve">The Smalltalk dictionary	36</w:t>
+        <w:t xml:space="preserve">The Smalltalk dictionary	37</w:t>
       </w:r>
     </w:p>
     <w:p>
@@ -2058,7 +2115,7 @@
           <w:sz w:val="18"/>
           <w:szCs w:val="18"/>
         </w:rPr>
-        <w:t xml:space="preserve">Contexts and compiling at run time	37</w:t>
+        <w:t xml:space="preserve">Contexts and compiling at run time	38</w:t>
       </w:r>
     </w:p>
     <w:p>
@@ -2077,7 +2134,7 @@
           <w:sz w:val="18"/>
           <w:szCs w:val="18"/>
         </w:rPr>
-        <w:t xml:space="preserve">More about objects	37</w:t>
+        <w:t xml:space="preserve">More about objects	38</w:t>
       </w:r>
     </w:p>
     <w:p>
@@ -2096,7 +2153,7 @@
           <w:sz w:val="19"/>
           <w:szCs w:val="19"/>
         </w:rPr>
-        <w:t xml:space="preserve">Chapter 14. Errors and Traces	39</w:t>
+        <w:t xml:space="preserve">Chapter 14. Errors and Traces	40</w:t>
       </w:r>
     </w:p>
     <w:p>
@@ -2115,7 +2172,7 @@
           <w:sz w:val="18"/>
           <w:szCs w:val="18"/>
         </w:rPr>
-        <w:t xml:space="preserve">Unhandled errors	39</w:t>
+        <w:t xml:space="preserve">Unhandled errors	40</w:t>
       </w:r>
     </w:p>
     <w:p>
@@ -2134,7 +2191,7 @@
           <w:sz w:val="18"/>
           <w:szCs w:val="18"/>
         </w:rPr>
-        <w:t xml:space="preserve">Common messages	39</w:t>
+        <w:t xml:space="preserve">Common messages	40</w:t>
       </w:r>
     </w:p>
     <w:p>
@@ -2153,7 +2210,7 @@
           <w:sz w:val="18"/>
           <w:szCs w:val="18"/>
         </w:rPr>
-        <w:t xml:space="preserve">Parse errors	39</w:t>
+        <w:t xml:space="preserve">Parse errors	40</w:t>
       </w:r>
     </w:p>
     <w:p>
@@ -2172,7 +2229,7 @@
           <w:sz w:val="19"/>
           <w:szCs w:val="19"/>
         </w:rPr>
-        <w:t xml:space="preserve">Chapter 15. How Smalltalk/CREXX Works	40</w:t>
+        <w:t xml:space="preserve">Chapter 15. How Smalltalk/CREXX Works	41</w:t>
       </w:r>
     </w:p>
     <w:p>
@@ -2191,7 +2248,7 @@
           <w:sz w:val="18"/>
           <w:szCs w:val="18"/>
         </w:rPr>
-        <w:t xml:space="preserve">Objects	40</w:t>
+        <w:t xml:space="preserve">Objects	41</w:t>
       </w:r>
     </w:p>
     <w:p>
@@ -2210,7 +2267,7 @@
           <w:sz w:val="18"/>
           <w:szCs w:val="18"/>
         </w:rPr>
-        <w:t xml:space="preserve">Classes and methods	40</w:t>
+        <w:t xml:space="preserve">Classes and methods	41</w:t>
       </w:r>
     </w:p>
     <w:p>
@@ -2229,7 +2286,7 @@
           <w:sz w:val="18"/>
           <w:szCs w:val="18"/>
         </w:rPr>
-        <w:t xml:space="preserve">The resolver	40</w:t>
+        <w:t xml:space="preserve">The resolver	41</w:t>
       </w:r>
     </w:p>
     <w:p>
@@ -2248,7 +2305,7 @@
           <w:sz w:val="18"/>
           <w:szCs w:val="18"/>
         </w:rPr>
-        <w:t xml:space="preserve">The evaluator	40</w:t>
+        <w:t xml:space="preserve">The evaluator	41</w:t>
       </w:r>
     </w:p>
     <w:p>
@@ -2267,7 +2324,7 @@
           <w:sz w:val="18"/>
           <w:szCs w:val="18"/>
         </w:rPr>
-        <w:t xml:space="preserve">Primitives	40</w:t>
+        <w:t xml:space="preserve">Primitives	41</w:t>
       </w:r>
     </w:p>
     <w:p>
@@ -2286,7 +2343,7 @@
           <w:sz w:val="18"/>
           <w:szCs w:val="18"/>
         </w:rPr>
-        <w:t xml:space="preserve">Adding a primitive	40</w:t>
+        <w:t xml:space="preserve">Adding a primitive	41</w:t>
       </w:r>
     </w:p>
     <w:p>
@@ -2305,7 +2362,7 @@
           <w:sz w:val="18"/>
           <w:szCs w:val="18"/>
         </w:rPr>
-        <w:t xml:space="preserve">The build	41</w:t>
+        <w:t xml:space="preserve">The build	42</w:t>
       </w:r>
     </w:p>
     <w:p>
@@ -2324,7 +2381,7 @@
           <w:sz w:val="19"/>
           <w:szCs w:val="19"/>
         </w:rPr>
-        <w:t xml:space="preserve">Chapter 16. Restrictions and Known Problems	42</w:t>
+        <w:t xml:space="preserve">Chapter 16. Restrictions and Known Problems	43</w:t>
       </w:r>
     </w:p>
     <w:p>
@@ -2343,7 +2400,7 @@
           <w:sz w:val="19"/>
           <w:szCs w:val="19"/>
         </w:rPr>
-        <w:t xml:space="preserve">Appendix A. Command Summary	43</w:t>
+        <w:t xml:space="preserve">Appendix A. Command Summary	44</w:t>
       </w:r>
     </w:p>
     <w:p>
@@ -2362,7 +2419,7 @@
           <w:sz w:val="19"/>
           <w:szCs w:val="19"/>
         </w:rPr>
-        <w:t xml:space="preserve">Appendix B. Contents of the Repository	44</w:t>
+        <w:t xml:space="preserve">Appendix B. Contents of the Repository	45</w:t>
       </w:r>
     </w:p>
     <w:p>
@@ -2381,7 +2438,7 @@
           <w:sz w:val="19"/>
           <w:szCs w:val="19"/>
         </w:rPr>
-        <w:t xml:space="preserve">Appendix C. Class Hierarchy	45</w:t>
+        <w:t xml:space="preserve">Appendix C. Class Hierarchy	46</w:t>
       </w:r>
     </w:p>
     <w:p>
@@ -2400,7 +2457,7 @@
           <w:sz w:val="19"/>
           <w:szCs w:val="19"/>
         </w:rPr>
-        <w:t xml:space="preserve">Appendix D. Sample Programs	46</w:t>
+        <w:t xml:space="preserve">Appendix D. Sample Programs	47</w:t>
       </w:r>
     </w:p>
     <w:p>
@@ -20709,6 +20766,270 @@
     </w:p>
     <w:p>
       <w:pPr>
+        <w:pStyle w:val="Heading2"/>
+        <w:keepNext/>
+      </w:pPr>
+      <w:r>
+        <w:rPr>
+          <w:rFonts w:ascii="Arial" w:cs="Arial" w:eastAsia="Arial" w:hAnsi="Arial"/>
+          <w:b/>
+          <w:bCs/>
+          <w:sz w:val="24"/>
+          <w:szCs w:val="24"/>
+        </w:rPr>
+        <w:t xml:space="preserve">Heap, LookupTable and WeakSet</w:t>
+      </w:r>
+    </w:p>
+    <w:p>
+      <w:pPr>
+        <w:spacing w:after="120" w:line="264"/>
+      </w:pPr>
+      <w:r>
+        <w:rPr>
+          <w:rFonts w:ascii="Arial" w:cs="Arial" w:eastAsia="Arial" w:hAnsi="Arial"/>
+          <w:sz w:val="20"/>
+          <w:szCs w:val="20"/>
+        </w:rPr>
+        <w:t xml:space="preserve">Heap is a priority queue: add: inserts, first looks at and removeFirst takes the smallest element (or the first in the order of sortBlock:), and asSortedArray answers all elements in order. LookupTable and IdentityLookupTable are Dictionaries that compare keys with = and ==. WeakSet and WeakIdentitySet are Sets; the elements are held normally, because the interpreter has no garbage collection that could drop them. Timespan has a start (a DateTime) and a Duration, and answers end, includes:, overlaps: and duration.</w:t>
+      </w:r>
+    </w:p>
+    <w:p>
+      <w:pPr>
+        <w:keepNext/>
+        <w:keepLines/>
+        <w:pBdr>
+          <w:top w:val="single" w:color="808080" w:sz="4"/>
+          <w:left w:val="single" w:color="808080" w:sz="4"/>
+          <w:right w:val="single" w:color="808080" w:sz="4"/>
+        </w:pBdr>
+        <w:shd w:fill="F2F2F2" w:color="auto" w:val="clear"/>
+        <w:spacing w:after="0" w:line="240"/>
+        <w:ind w:left="100" w:right="100"/>
+      </w:pPr>
+      <w:r>
+        <w:rPr>
+          <w:rFonts w:ascii="Courier New" w:cs="Courier New" w:eastAsia="Courier New" w:hAnsi="Courier New"/>
+          <w:sz w:val="17"/>
+          <w:szCs w:val="17"/>
+        </w:rPr>
+        <w:t xml:space="preserve">| h |</w:t>
+      </w:r>
+    </w:p>
+    <w:p>
+      <w:pPr>
+        <w:keepNext/>
+        <w:keepLines/>
+        <w:pBdr>
+          <w:left w:val="single" w:color="808080" w:sz="4"/>
+          <w:right w:val="single" w:color="808080" w:sz="4"/>
+        </w:pBdr>
+        <w:shd w:fill="F2F2F2" w:color="auto" w:val="clear"/>
+        <w:spacing w:after="0" w:line="240"/>
+        <w:ind w:left="100" w:right="100"/>
+      </w:pPr>
+      <w:r>
+        <w:rPr>
+          <w:rFonts w:ascii="Courier New" w:cs="Courier New" w:eastAsia="Courier New" w:hAnsi="Courier New"/>
+          <w:sz w:val="17"/>
+          <w:szCs w:val="17"/>
+        </w:rPr>
+        <w:t xml:space="preserve">h := Heap new.</w:t>
+      </w:r>
+    </w:p>
+    <w:p>
+      <w:pPr>
+        <w:keepNext/>
+        <w:keepLines/>
+        <w:pBdr>
+          <w:left w:val="single" w:color="808080" w:sz="4"/>
+          <w:right w:val="single" w:color="808080" w:sz="4"/>
+        </w:pBdr>
+        <w:shd w:fill="F2F2F2" w:color="auto" w:val="clear"/>
+        <w:spacing w:after="0" w:line="240"/>
+        <w:ind w:left="100" w:right="100"/>
+      </w:pPr>
+      <w:r>
+        <w:rPr>
+          <w:rFonts w:ascii="Courier New" w:cs="Courier New" w:eastAsia="Courier New" w:hAnsi="Courier New"/>
+          <w:sz w:val="17"/>
+          <w:szCs w:val="17"/>
+        </w:rPr>
+        <w:t xml:space="preserve">#(5 1 4 2) do: [:e | h add: e].</w:t>
+      </w:r>
+    </w:p>
+    <w:p>
+      <w:pPr>
+        <w:keepNext/>
+        <w:keepLines/>
+        <w:pBdr>
+          <w:left w:val="single" w:color="808080" w:sz="4"/>
+          <w:right w:val="single" w:color="808080" w:sz="4"/>
+        </w:pBdr>
+        <w:shd w:fill="F2F2F2" w:color="auto" w:val="clear"/>
+        <w:spacing w:after="0" w:line="240"/>
+        <w:ind w:left="100" w:right="100"/>
+      </w:pPr>
+      <w:r>
+        <w:rPr>
+          <w:rFonts w:ascii="Courier New" w:cs="Courier New" w:eastAsia="Courier New" w:hAnsi="Courier New"/>
+          <w:sz w:val="17"/>
+          <w:szCs w:val="17"/>
+        </w:rPr>
+        <w:t xml:space="preserve">h removeFirst printNl.</w:t>
+      </w:r>
+    </w:p>
+    <w:p>
+      <w:pPr>
+        <w:keepNext/>
+        <w:keepLines/>
+        <w:pBdr>
+          <w:left w:val="single" w:color="808080" w:sz="4"/>
+          <w:right w:val="single" w:color="808080" w:sz="4"/>
+        </w:pBdr>
+        <w:shd w:fill="F2F2F2" w:color="auto" w:val="clear"/>
+        <w:spacing w:after="0" w:line="240"/>
+        <w:ind w:left="100" w:right="100"/>
+      </w:pPr>
+      <w:r>
+        <w:rPr>
+          <w:rFonts w:ascii="Courier New" w:cs="Courier New" w:eastAsia="Courier New" w:hAnsi="Courier New"/>
+          <w:sz w:val="17"/>
+          <w:szCs w:val="17"/>
+        </w:rPr>
+        <w:t xml:space="preserve">h first printNl.</w:t>
+      </w:r>
+    </w:p>
+    <w:p>
+      <w:pPr>
+        <w:keepNext/>
+        <w:keepLines/>
+        <w:pBdr>
+          <w:left w:val="single" w:color="808080" w:sz="4"/>
+          <w:right w:val="single" w:color="808080" w:sz="4"/>
+        </w:pBdr>
+        <w:shd w:fill="F2F2F2" w:color="auto" w:val="clear"/>
+        <w:spacing w:after="0" w:line="240"/>
+        <w:ind w:left="100" w:right="100"/>
+      </w:pPr>
+      <w:r>
+        <w:rPr>
+          <w:rFonts w:ascii="Courier New" w:cs="Courier New" w:eastAsia="Courier New" w:hAnsi="Courier New"/>
+          <w:sz w:val="17"/>
+          <w:szCs w:val="17"/>
+        </w:rPr>
+        <w:t xml:space="preserve">h asSortedArray printNl.</w:t>
+      </w:r>
+    </w:p>
+    <w:p>
+      <w:pPr>
+        <w:keepNext/>
+        <w:keepLines/>
+        <w:pBdr>
+          <w:left w:val="single" w:color="808080" w:sz="4"/>
+          <w:right w:val="single" w:color="808080" w:sz="4"/>
+        </w:pBdr>
+        <w:shd w:fill="F2F2F2" w:color="auto" w:val="clear"/>
+        <w:spacing w:after="0" w:line="240"/>
+        <w:ind w:left="100" w:right="100"/>
+      </w:pPr>
+      <w:r>
+        <w:rPr>
+          <w:rFonts w:ascii="Courier New" w:cs="Courier New" w:eastAsia="Courier New" w:hAnsi="Courier New"/>
+          <w:sz w:val="17"/>
+          <w:szCs w:val="17"/>
+        </w:rPr>
+        <w:t xml:space="preserve"> </w:t>
+      </w:r>
+    </w:p>
+    <w:p>
+      <w:pPr>
+        <w:keepNext/>
+        <w:keepLines/>
+        <w:pBdr>
+          <w:left w:val="single" w:color="808080" w:sz="4"/>
+          <w:right w:val="single" w:color="808080" w:sz="4"/>
+        </w:pBdr>
+        <w:shd w:fill="F2F2F2" w:color="auto" w:val="clear"/>
+        <w:spacing w:after="0" w:line="240"/>
+        <w:ind w:left="100" w:right="100"/>
+      </w:pPr>
+      <w:r>
+        <w:rPr>
+          <w:rFonts w:ascii="Courier New" w:cs="Courier New" w:eastAsia="Courier New" w:hAnsi="Courier New"/>
+          <w:sz w:val="17"/>
+          <w:szCs w:val="17"/>
+        </w:rPr>
+        <w:t xml:space="preserve">1</w:t>
+      </w:r>
+    </w:p>
+    <w:p>
+      <w:pPr>
+        <w:keepNext/>
+        <w:keepLines/>
+        <w:pBdr>
+          <w:left w:val="single" w:color="808080" w:sz="4"/>
+          <w:right w:val="single" w:color="808080" w:sz="4"/>
+        </w:pBdr>
+        <w:shd w:fill="F2F2F2" w:color="auto" w:val="clear"/>
+        <w:spacing w:after="0" w:line="240"/>
+        <w:ind w:left="100" w:right="100"/>
+      </w:pPr>
+      <w:r>
+        <w:rPr>
+          <w:rFonts w:ascii="Courier New" w:cs="Courier New" w:eastAsia="Courier New" w:hAnsi="Courier New"/>
+          <w:sz w:val="17"/>
+          <w:szCs w:val="17"/>
+        </w:rPr>
+        <w:t xml:space="preserve">2</w:t>
+      </w:r>
+    </w:p>
+    <w:p>
+      <w:pPr>
+        <w:keepNext w:val="false"/>
+        <w:keepLines/>
+        <w:pBdr>
+          <w:bottom w:val="single" w:color="808080" w:sz="4"/>
+          <w:left w:val="single" w:color="808080" w:sz="4"/>
+          <w:right w:val="single" w:color="808080" w:sz="4"/>
+        </w:pBdr>
+        <w:shd w:fill="F2F2F2" w:color="auto" w:val="clear"/>
+        <w:spacing w:after="0" w:line="240"/>
+        <w:ind w:left="100" w:right="100"/>
+      </w:pPr>
+      <w:r>
+        <w:rPr>
+          <w:rFonts w:ascii="Courier New" w:cs="Courier New" w:eastAsia="Courier New" w:hAnsi="Courier New"/>
+          <w:sz w:val="17"/>
+          <w:szCs w:val="17"/>
+        </w:rPr>
+        <w:t xml:space="preserve">(2 4 5 )</w:t>
+      </w:r>
+    </w:p>
+    <w:p>
+      <w:pPr>
+        <w:spacing w:after="200" w:before="60"/>
+      </w:pPr>
+      <w:r>
+        <w:rPr>
+          <w:rFonts w:ascii="Arial" w:cs="Arial" w:eastAsia="Arial" w:hAnsi="Arial"/>
+          <w:b/>
+          <w:bCs/>
+          <w:sz w:val="18"/>
+          <w:szCs w:val="18"/>
+        </w:rPr>
+        <w:t xml:space="preserve">Figure 38. </w:t>
+      </w:r>
+      <w:r>
+        <w:rPr>
+          <w:rFonts w:ascii="Arial" w:cs="Arial" w:eastAsia="Arial" w:hAnsi="Arial"/>
+          <w:sz w:val="18"/>
+          <w:szCs w:val="18"/>
+        </w:rPr>
+        <w:t xml:space="preserve">A Heap</w:t>
+      </w:r>
+    </w:p>
+    <w:p>
+      <w:pPr>
         <w:pStyle w:val="Heading1"/>
         <w:pageBreakBefore/>
         <w:pBdr>
@@ -21557,7 +21878,7 @@
           <w:sz w:val="18"/>
           <w:szCs w:val="18"/>
         </w:rPr>
-        <w:t xml:space="preserve">Figure 38. </w:t>
+        <w:t xml:space="preserve">Figure 39. </w:t>
       </w:r>
       <w:r>
         <w:rPr>
@@ -22065,7 +22386,7 @@
           <w:sz w:val="18"/>
           <w:szCs w:val="18"/>
         </w:rPr>
-        <w:t xml:space="preserve">Figure 39. </w:t>
+        <w:t xml:space="preserve">Figure 40. </w:t>
       </w:r>
       <w:r>
         <w:rPr>
@@ -22463,7 +22784,7 @@
           <w:sz w:val="18"/>
           <w:szCs w:val="18"/>
         </w:rPr>
-        <w:t xml:space="preserve">Figure 40. </w:t>
+        <w:t xml:space="preserve">Figure 41. </w:t>
       </w:r>
       <w:r>
         <w:rPr>
@@ -22748,7 +23069,7 @@
           <w:sz w:val="18"/>
           <w:szCs w:val="18"/>
         </w:rPr>
-        <w:t xml:space="preserve">Figure 41. </w:t>
+        <w:t xml:space="preserve">Figure 42. </w:t>
       </w:r>
       <w:r>
         <w:rPr>
@@ -22949,7 +23270,7 @@
           <w:sz w:val="18"/>
           <w:szCs w:val="18"/>
         </w:rPr>
-        <w:t xml:space="preserve">Figure 42. </w:t>
+        <w:t xml:space="preserve">Figure 43. </w:t>
       </w:r>
       <w:r>
         <w:rPr>
@@ -23234,7 +23555,7 @@
           <w:sz w:val="18"/>
           <w:szCs w:val="18"/>
         </w:rPr>
-        <w:t xml:space="preserve">Figure 43. </w:t>
+        <w:t xml:space="preserve">Figure 44. </w:t>
       </w:r>
       <w:r>
         <w:rPr>
@@ -23574,7 +23895,7 @@
           <w:sz w:val="18"/>
           <w:szCs w:val="18"/>
         </w:rPr>
-        <w:t xml:space="preserve">Figure 44. </w:t>
+        <w:t xml:space="preserve">Figure 45. </w:t>
       </w:r>
       <w:r>
         <w:rPr>
@@ -23583,6 +23904,928 @@
           <w:szCs w:val="18"/>
         </w:rPr>
         <w:t xml:space="preserve">Regular expressions</w:t>
+      </w:r>
+    </w:p>
+    <w:p>
+      <w:pPr>
+        <w:pStyle w:val="Heading2"/>
+        <w:keepNext/>
+      </w:pPr>
+      <w:r>
+        <w:rPr>
+          <w:rFonts w:ascii="Arial" w:cs="Arial" w:eastAsia="Arial" w:hAnsi="Arial"/>
+          <w:b/>
+          <w:bCs/>
+          <w:sz w:val="24"/>
+          <w:szCs w:val="24"/>
+        </w:rPr>
+        <w:t xml:space="preserve">Unicode</w:t>
+      </w:r>
+    </w:p>
+    <w:p>
+      <w:pPr>
+        <w:spacing w:after="120" w:line="264"/>
+      </w:pPr>
+      <w:r>
+        <w:rPr>
+          <w:rFonts w:ascii="Arial" w:cs="Arial" w:eastAsia="Arial" w:hAnsi="Arial"/>
+          <w:sz w:val="20"/>
+          <w:szCs w:val="20"/>
+        </w:rPr>
+        <w:t xml:space="preserve">Strings hold Unicode characters. size, at:, reverse and copyFrom:to: count code points, not bytes, and Character value: n answers any character from 0 to 16r10FFFF except the surrogates 16rD800 to 16rDFFF. isLetter, isUppercase, isLowercase, asUppercase and asLowercase work for letters outside ASCII. Source files and files read through FileStream are UTF-8. The Unicode services come from the CREXX library rxunicode, which is part of the virtual machine.</w:t>
+      </w:r>
+    </w:p>
+    <w:tbl>
+      <w:tblPr>
+        <w:tblW w:type="dxa" w:w="9638"/>
+        <w:tblBorders>
+          <w:top w:val="single" w:color="auto" w:sz="4"/>
+          <w:left w:val="single" w:color="auto" w:sz="4"/>
+          <w:bottom w:val="single" w:color="auto" w:sz="4"/>
+          <w:right w:val="single" w:color="auto" w:sz="4"/>
+          <w:insideH w:val="single" w:color="auto" w:sz="4"/>
+          <w:insideV w:val="single" w:color="auto" w:sz="4"/>
+        </w:tblBorders>
+      </w:tblPr>
+      <w:tblGrid>
+        <w:gridCol w:w="3600"/>
+        <w:gridCol w:w="6038"/>
+      </w:tblGrid>
+      <w:tr>
+        <w:trPr>
+          <w:cantSplit/>
+          <w:tblHeader/>
+        </w:trPr>
+        <w:tc>
+          <w:tcPr>
+            <w:tcW w:type="dxa" w:w="3600"/>
+            <w:tcBorders>
+              <w:top w:val="single" w:color="808080" w:sz="4"/>
+              <w:left w:val="single" w:color="808080" w:sz="4"/>
+              <w:bottom w:val="single" w:color="808080" w:sz="4"/>
+              <w:right w:val="single" w:color="808080" w:sz="4"/>
+            </w:tcBorders>
+            <w:shd w:fill="D9D9D9" w:color="auto" w:val="clear"/>
+            <w:tcMar>
+              <w:top w:type="dxa" w:w="50"/>
+              <w:left w:type="dxa" w:w="90"/>
+              <w:bottom w:type="dxa" w:w="50"/>
+              <w:right w:type="dxa" w:w="90"/>
+            </w:tcMar>
+          </w:tcPr>
+          <w:p>
+            <w:pPr>
+              <w:spacing w:after="0"/>
+            </w:pPr>
+            <w:r>
+              <w:rPr>
+                <w:rFonts w:ascii="Arial" w:cs="Arial" w:eastAsia="Arial" w:hAnsi="Arial"/>
+                <w:b/>
+                <w:bCs/>
+                <w:sz w:val="17"/>
+                <w:szCs w:val="17"/>
+              </w:rPr>
+              <w:t xml:space="preserve">Selector</w:t>
+            </w:r>
+          </w:p>
+        </w:tc>
+        <w:tc>
+          <w:tcPr>
+            <w:tcW w:type="dxa" w:w="6038"/>
+            <w:tcBorders>
+              <w:top w:val="single" w:color="808080" w:sz="4"/>
+              <w:left w:val="single" w:color="808080" w:sz="4"/>
+              <w:bottom w:val="single" w:color="808080" w:sz="4"/>
+              <w:right w:val="single" w:color="808080" w:sz="4"/>
+            </w:tcBorders>
+            <w:shd w:fill="D9D9D9" w:color="auto" w:val="clear"/>
+            <w:tcMar>
+              <w:top w:type="dxa" w:w="50"/>
+              <w:left w:type="dxa" w:w="90"/>
+              <w:bottom w:type="dxa" w:w="50"/>
+              <w:right w:type="dxa" w:w="90"/>
+            </w:tcMar>
+          </w:tcPr>
+          <w:p>
+            <w:pPr>
+              <w:spacing w:after="0"/>
+            </w:pPr>
+            <w:r>
+              <w:rPr>
+                <w:rFonts w:ascii="Arial" w:cs="Arial" w:eastAsia="Arial" w:hAnsi="Arial"/>
+                <w:b/>
+                <w:bCs/>
+                <w:sz w:val="17"/>
+                <w:szCs w:val="17"/>
+              </w:rPr>
+              <w:t xml:space="preserve">Meaning</w:t>
+            </w:r>
+          </w:p>
+        </w:tc>
+      </w:tr>
+      <w:tr>
+        <w:trPr>
+          <w:cantSplit/>
+          <w:tblHeader w:val="false"/>
+        </w:trPr>
+        <w:tc>
+          <w:tcPr>
+            <w:tcW w:type="dxa" w:w="3600"/>
+            <w:tcBorders>
+              <w:top w:val="single" w:color="808080" w:sz="4"/>
+              <w:left w:val="single" w:color="808080" w:sz="4"/>
+              <w:bottom w:val="single" w:color="808080" w:sz="4"/>
+              <w:right w:val="single" w:color="808080" w:sz="4"/>
+            </w:tcBorders>
+            <w:tcMar>
+              <w:top w:type="dxa" w:w="50"/>
+              <w:left w:type="dxa" w:w="90"/>
+              <w:bottom w:type="dxa" w:w="50"/>
+              <w:right w:type="dxa" w:w="90"/>
+            </w:tcMar>
+          </w:tcPr>
+          <w:p>
+            <w:pPr>
+              <w:spacing w:after="0"/>
+            </w:pPr>
+            <w:r>
+              <w:rPr>
+                <w:rFonts w:ascii="Arial" w:cs="Arial" w:eastAsia="Arial" w:hAnsi="Arial"/>
+                <w:b w:val="false"/>
+                <w:bCs w:val="false"/>
+                <w:sz w:val="17"/>
+                <w:szCs w:val="17"/>
+              </w:rPr>
+              <w:t xml:space="preserve">asUppercase  asLowercase</w:t>
+            </w:r>
+          </w:p>
+        </w:tc>
+        <w:tc>
+          <w:tcPr>
+            <w:tcW w:type="dxa" w:w="6038"/>
+            <w:tcBorders>
+              <w:top w:val="single" w:color="808080" w:sz="4"/>
+              <w:left w:val="single" w:color="808080" w:sz="4"/>
+              <w:bottom w:val="single" w:color="808080" w:sz="4"/>
+              <w:right w:val="single" w:color="808080" w:sz="4"/>
+            </w:tcBorders>
+            <w:tcMar>
+              <w:top w:type="dxa" w:w="50"/>
+              <w:left w:type="dxa" w:w="90"/>
+              <w:bottom w:type="dxa" w:w="50"/>
+              <w:right w:type="dxa" w:w="90"/>
+            </w:tcMar>
+          </w:tcPr>
+          <w:p>
+            <w:pPr>
+              <w:spacing w:after="0"/>
+            </w:pPr>
+            <w:r>
+              <w:rPr>
+                <w:rFonts w:ascii="Arial" w:cs="Arial" w:eastAsia="Arial" w:hAnsi="Arial"/>
+                <w:b w:val="false"/>
+                <w:bCs w:val="false"/>
+                <w:sz w:val="17"/>
+                <w:szCs w:val="17"/>
+              </w:rPr>
+              <w:t xml:space="preserve">Full case mapping: 'Straße' asUppercase is 'STRASSE'</w:t>
+            </w:r>
+          </w:p>
+        </w:tc>
+      </w:tr>
+      <w:tr>
+        <w:trPr>
+          <w:cantSplit/>
+          <w:tblHeader w:val="false"/>
+        </w:trPr>
+        <w:tc>
+          <w:tcPr>
+            <w:tcW w:type="dxa" w:w="3600"/>
+            <w:tcBorders>
+              <w:top w:val="single" w:color="808080" w:sz="4"/>
+              <w:left w:val="single" w:color="808080" w:sz="4"/>
+              <w:bottom w:val="single" w:color="808080" w:sz="4"/>
+              <w:right w:val="single" w:color="808080" w:sz="4"/>
+            </w:tcBorders>
+            <w:tcMar>
+              <w:top w:type="dxa" w:w="50"/>
+              <w:left w:type="dxa" w:w="90"/>
+              <w:bottom w:type="dxa" w:w="50"/>
+              <w:right w:type="dxa" w:w="90"/>
+            </w:tcMar>
+          </w:tcPr>
+          <w:p>
+            <w:pPr>
+              <w:spacing w:after="0"/>
+            </w:pPr>
+            <w:r>
+              <w:rPr>
+                <w:rFonts w:ascii="Arial" w:cs="Arial" w:eastAsia="Arial" w:hAnsi="Arial"/>
+                <w:b w:val="false"/>
+                <w:bCs w:val="false"/>
+                <w:sz w:val="17"/>
+                <w:szCs w:val="17"/>
+              </w:rPr>
+              <w:t xml:space="preserve">asCasefold  sameAs:</w:t>
+            </w:r>
+          </w:p>
+        </w:tc>
+        <w:tc>
+          <w:tcPr>
+            <w:tcW w:type="dxa" w:w="6038"/>
+            <w:tcBorders>
+              <w:top w:val="single" w:color="808080" w:sz="4"/>
+              <w:left w:val="single" w:color="808080" w:sz="4"/>
+              <w:bottom w:val="single" w:color="808080" w:sz="4"/>
+              <w:right w:val="single" w:color="808080" w:sz="4"/>
+            </w:tcBorders>
+            <w:tcMar>
+              <w:top w:type="dxa" w:w="50"/>
+              <w:left w:type="dxa" w:w="90"/>
+              <w:bottom w:type="dxa" w:w="50"/>
+              <w:right w:type="dxa" w:w="90"/>
+            </w:tcMar>
+          </w:tcPr>
+          <w:p>
+            <w:pPr>
+              <w:spacing w:after="0"/>
+            </w:pPr>
+            <w:r>
+              <w:rPr>
+                <w:rFonts w:ascii="Arial" w:cs="Arial" w:eastAsia="Arial" w:hAnsi="Arial"/>
+                <w:b w:val="false"/>
+                <w:bCs w:val="false"/>
+                <w:sz w:val="17"/>
+                <w:szCs w:val="17"/>
+              </w:rPr>
+              <w:t xml:space="preserve">Case folding, and comparison that ignores case and normalization form</w:t>
+            </w:r>
+          </w:p>
+        </w:tc>
+      </w:tr>
+      <w:tr>
+        <w:trPr>
+          <w:cantSplit/>
+          <w:tblHeader w:val="false"/>
+        </w:trPr>
+        <w:tc>
+          <w:tcPr>
+            <w:tcW w:type="dxa" w:w="3600"/>
+            <w:tcBorders>
+              <w:top w:val="single" w:color="808080" w:sz="4"/>
+              <w:left w:val="single" w:color="808080" w:sz="4"/>
+              <w:bottom w:val="single" w:color="808080" w:sz="4"/>
+              <w:right w:val="single" w:color="808080" w:sz="4"/>
+            </w:tcBorders>
+            <w:tcMar>
+              <w:top w:type="dxa" w:w="50"/>
+              <w:left w:type="dxa" w:w="90"/>
+              <w:bottom w:type="dxa" w:w="50"/>
+              <w:right w:type="dxa" w:w="90"/>
+            </w:tcMar>
+          </w:tcPr>
+          <w:p>
+            <w:pPr>
+              <w:spacing w:after="0"/>
+            </w:pPr>
+            <w:r>
+              <w:rPr>
+                <w:rFonts w:ascii="Arial" w:cs="Arial" w:eastAsia="Arial" w:hAnsi="Arial"/>
+                <w:b w:val="false"/>
+                <w:bCs w:val="false"/>
+                <w:sz w:val="17"/>
+                <w:szCs w:val="17"/>
+              </w:rPr>
+              <w:t xml:space="preserve">asNFC  asNFD  asNFKC  asNFKD  isNormalized</w:t>
+            </w:r>
+          </w:p>
+        </w:tc>
+        <w:tc>
+          <w:tcPr>
+            <w:tcW w:type="dxa" w:w="6038"/>
+            <w:tcBorders>
+              <w:top w:val="single" w:color="808080" w:sz="4"/>
+              <w:left w:val="single" w:color="808080" w:sz="4"/>
+              <w:bottom w:val="single" w:color="808080" w:sz="4"/>
+              <w:right w:val="single" w:color="808080" w:sz="4"/>
+            </w:tcBorders>
+            <w:tcMar>
+              <w:top w:type="dxa" w:w="50"/>
+              <w:left w:type="dxa" w:w="90"/>
+              <w:bottom w:type="dxa" w:w="50"/>
+              <w:right w:type="dxa" w:w="90"/>
+            </w:tcMar>
+          </w:tcPr>
+          <w:p>
+            <w:pPr>
+              <w:spacing w:after="0"/>
+            </w:pPr>
+            <w:r>
+              <w:rPr>
+                <w:rFonts w:ascii="Arial" w:cs="Arial" w:eastAsia="Arial" w:hAnsi="Arial"/>
+                <w:b w:val="false"/>
+                <w:bCs w:val="false"/>
+                <w:sz w:val="17"/>
+                <w:szCs w:val="17"/>
+              </w:rPr>
+              <w:t xml:space="preserve">Normalization forms (composed, decomposed, and the compatibility forms)</w:t>
+            </w:r>
+          </w:p>
+        </w:tc>
+      </w:tr>
+      <w:tr>
+        <w:trPr>
+          <w:cantSplit/>
+          <w:tblHeader w:val="false"/>
+        </w:trPr>
+        <w:tc>
+          <w:tcPr>
+            <w:tcW w:type="dxa" w:w="3600"/>
+            <w:tcBorders>
+              <w:top w:val="single" w:color="808080" w:sz="4"/>
+              <w:left w:val="single" w:color="808080" w:sz="4"/>
+              <w:bottom w:val="single" w:color="808080" w:sz="4"/>
+              <w:right w:val="single" w:color="808080" w:sz="4"/>
+            </w:tcBorders>
+            <w:tcMar>
+              <w:top w:type="dxa" w:w="50"/>
+              <w:left w:type="dxa" w:w="90"/>
+              <w:bottom w:type="dxa" w:w="50"/>
+              <w:right w:type="dxa" w:w="90"/>
+            </w:tcMar>
+          </w:tcPr>
+          <w:p>
+            <w:pPr>
+              <w:spacing w:after="0"/>
+            </w:pPr>
+            <w:r>
+              <w:rPr>
+                <w:rFonts w:ascii="Arial" w:cs="Arial" w:eastAsia="Arial" w:hAnsi="Arial"/>
+                <w:b w:val="false"/>
+                <w:bCs w:val="false"/>
+                <w:sz w:val="17"/>
+                <w:szCs w:val="17"/>
+              </w:rPr>
+              <w:t xml:space="preserve">graphemeSize</w:t>
+            </w:r>
+          </w:p>
+        </w:tc>
+        <w:tc>
+          <w:tcPr>
+            <w:tcW w:type="dxa" w:w="6038"/>
+            <w:tcBorders>
+              <w:top w:val="single" w:color="808080" w:sz="4"/>
+              <w:left w:val="single" w:color="808080" w:sz="4"/>
+              <w:bottom w:val="single" w:color="808080" w:sz="4"/>
+              <w:right w:val="single" w:color="808080" w:sz="4"/>
+            </w:tcBorders>
+            <w:tcMar>
+              <w:top w:type="dxa" w:w="50"/>
+              <w:left w:type="dxa" w:w="90"/>
+              <w:bottom w:type="dxa" w:w="50"/>
+              <w:right w:type="dxa" w:w="90"/>
+            </w:tcMar>
+          </w:tcPr>
+          <w:p>
+            <w:pPr>
+              <w:spacing w:after="0"/>
+            </w:pPr>
+            <w:r>
+              <w:rPr>
+                <w:rFonts w:ascii="Arial" w:cs="Arial" w:eastAsia="Arial" w:hAnsi="Arial"/>
+                <w:b w:val="false"/>
+                <w:bCs w:val="false"/>
+                <w:sz w:val="17"/>
+                <w:szCs w:val="17"/>
+              </w:rPr>
+              <w:t xml:space="preserve">Number of user-perceived characters (a letter with a combining accent counts once)</w:t>
+            </w:r>
+          </w:p>
+        </w:tc>
+      </w:tr>
+      <w:tr>
+        <w:trPr>
+          <w:cantSplit/>
+          <w:tblHeader w:val="false"/>
+        </w:trPr>
+        <w:tc>
+          <w:tcPr>
+            <w:tcW w:type="dxa" w:w="3600"/>
+            <w:tcBorders>
+              <w:top w:val="single" w:color="808080" w:sz="4"/>
+              <w:left w:val="single" w:color="808080" w:sz="4"/>
+              <w:bottom w:val="single" w:color="808080" w:sz="4"/>
+              <w:right w:val="single" w:color="808080" w:sz="4"/>
+            </w:tcBorders>
+            <w:tcMar>
+              <w:top w:type="dxa" w:w="50"/>
+              <w:left w:type="dxa" w:w="90"/>
+              <w:bottom w:type="dxa" w:w="50"/>
+              <w:right w:type="dxa" w:w="90"/>
+            </w:tcMar>
+          </w:tcPr>
+          <w:p>
+            <w:pPr>
+              <w:spacing w:after="0"/>
+            </w:pPr>
+            <w:r>
+              <w:rPr>
+                <w:rFonts w:ascii="Arial" w:cs="Arial" w:eastAsia="Arial" w:hAnsi="Arial"/>
+                <w:b w:val="false"/>
+                <w:bCs w:val="false"/>
+                <w:sz w:val="17"/>
+                <w:szCs w:val="17"/>
+              </w:rPr>
+              <w:t xml:space="preserve">utf8Bytes  asByteArray  utf8Size</w:t>
+            </w:r>
+          </w:p>
+        </w:tc>
+        <w:tc>
+          <w:tcPr>
+            <w:tcW w:type="dxa" w:w="6038"/>
+            <w:tcBorders>
+              <w:top w:val="single" w:color="808080" w:sz="4"/>
+              <w:left w:val="single" w:color="808080" w:sz="4"/>
+              <w:bottom w:val="single" w:color="808080" w:sz="4"/>
+              <w:right w:val="single" w:color="808080" w:sz="4"/>
+            </w:tcBorders>
+            <w:tcMar>
+              <w:top w:type="dxa" w:w="50"/>
+              <w:left w:type="dxa" w:w="90"/>
+              <w:bottom w:type="dxa" w:w="50"/>
+              <w:right w:type="dxa" w:w="90"/>
+            </w:tcMar>
+          </w:tcPr>
+          <w:p>
+            <w:pPr>
+              <w:spacing w:after="0"/>
+            </w:pPr>
+            <w:r>
+              <w:rPr>
+                <w:rFonts w:ascii="Arial" w:cs="Arial" w:eastAsia="Arial" w:hAnsi="Arial"/>
+                <w:b w:val="false"/>
+                <w:bCs w:val="false"/>
+                <w:sz w:val="17"/>
+                <w:szCs w:val="17"/>
+              </w:rPr>
+              <w:t xml:space="preserve">The UTF-8 encoding as a ByteArray, and its length</w:t>
+            </w:r>
+          </w:p>
+        </w:tc>
+      </w:tr>
+      <w:tr>
+        <w:trPr>
+          <w:cantSplit/>
+          <w:tblHeader w:val="false"/>
+        </w:trPr>
+        <w:tc>
+          <w:tcPr>
+            <w:tcW w:type="dxa" w:w="3600"/>
+            <w:tcBorders>
+              <w:top w:val="single" w:color="808080" w:sz="4"/>
+              <w:left w:val="single" w:color="808080" w:sz="4"/>
+              <w:bottom w:val="single" w:color="808080" w:sz="4"/>
+              <w:right w:val="single" w:color="808080" w:sz="4"/>
+            </w:tcBorders>
+            <w:tcMar>
+              <w:top w:type="dxa" w:w="50"/>
+              <w:left w:type="dxa" w:w="90"/>
+              <w:bottom w:type="dxa" w:w="50"/>
+              <w:right w:type="dxa" w:w="90"/>
+            </w:tcMar>
+          </w:tcPr>
+          <w:p>
+            <w:pPr>
+              <w:spacing w:after="0"/>
+            </w:pPr>
+            <w:r>
+              <w:rPr>
+                <w:rFonts w:ascii="Arial" w:cs="Arial" w:eastAsia="Arial" w:hAnsi="Arial"/>
+                <w:b w:val="false"/>
+                <w:bCs w:val="false"/>
+                <w:sz w:val="17"/>
+                <w:szCs w:val="17"/>
+              </w:rPr>
+              <w:t xml:space="preserve">String fromUtf8Bytes:  ByteArray utf8String</w:t>
+            </w:r>
+          </w:p>
+        </w:tc>
+        <w:tc>
+          <w:tcPr>
+            <w:tcW w:type="dxa" w:w="6038"/>
+            <w:tcBorders>
+              <w:top w:val="single" w:color="808080" w:sz="4"/>
+              <w:left w:val="single" w:color="808080" w:sz="4"/>
+              <w:bottom w:val="single" w:color="808080" w:sz="4"/>
+              <w:right w:val="single" w:color="808080" w:sz="4"/>
+            </w:tcBorders>
+            <w:tcMar>
+              <w:top w:type="dxa" w:w="50"/>
+              <w:left w:type="dxa" w:w="90"/>
+              <w:bottom w:type="dxa" w:w="50"/>
+              <w:right w:type="dxa" w:w="90"/>
+            </w:tcMar>
+          </w:tcPr>
+          <w:p>
+            <w:pPr>
+              <w:spacing w:after="0"/>
+            </w:pPr>
+            <w:r>
+              <w:rPr>
+                <w:rFonts w:ascii="Arial" w:cs="Arial" w:eastAsia="Arial" w:hAnsi="Arial"/>
+                <w:b w:val="false"/>
+                <w:bCs w:val="false"/>
+                <w:sz w:val="17"/>
+                <w:szCs w:val="17"/>
+              </w:rPr>
+              <w:t xml:space="preserve">Decode UTF-8 bytes; invalid input is an error</w:t>
+            </w:r>
+          </w:p>
+        </w:tc>
+      </w:tr>
+    </w:tbl>
+    <w:p>
+      <w:pPr>
+        <w:spacing w:after="200" w:before="60"/>
+      </w:pPr>
+      <w:r>
+        <w:rPr>
+          <w:rFonts w:ascii="Arial" w:cs="Arial" w:eastAsia="Arial" w:hAnsi="Arial"/>
+          <w:b/>
+          <w:bCs/>
+          <w:sz w:val="18"/>
+          <w:szCs w:val="18"/>
+        </w:rPr>
+        <w:t xml:space="preserve">Figure 46. </w:t>
+      </w:r>
+      <w:r>
+        <w:rPr>
+          <w:rFonts w:ascii="Arial" w:cs="Arial" w:eastAsia="Arial" w:hAnsi="Arial"/>
+          <w:sz w:val="18"/>
+          <w:szCs w:val="18"/>
+        </w:rPr>
+        <w:t xml:space="preserve">Unicode methods of String</w:t>
+      </w:r>
+    </w:p>
+    <w:p>
+      <w:pPr>
+        <w:keepNext/>
+        <w:keepLines/>
+        <w:pBdr>
+          <w:top w:val="single" w:color="808080" w:sz="4"/>
+          <w:left w:val="single" w:color="808080" w:sz="4"/>
+          <w:right w:val="single" w:color="808080" w:sz="4"/>
+        </w:pBdr>
+        <w:shd w:fill="F2F2F2" w:color="auto" w:val="clear"/>
+        <w:spacing w:after="0" w:line="240"/>
+        <w:ind w:left="100" w:right="100"/>
+      </w:pPr>
+      <w:r>
+        <w:rPr>
+          <w:rFonts w:ascii="Courier New" w:cs="Courier New" w:eastAsia="Courier New" w:hAnsi="Courier New"/>
+          <w:sz w:val="17"/>
+          <w:szCs w:val="17"/>
+        </w:rPr>
+        <w:t xml:space="preserve">| s |</w:t>
+      </w:r>
+    </w:p>
+    <w:p>
+      <w:pPr>
+        <w:keepNext/>
+        <w:keepLines/>
+        <w:pBdr>
+          <w:left w:val="single" w:color="808080" w:sz="4"/>
+          <w:right w:val="single" w:color="808080" w:sz="4"/>
+        </w:pBdr>
+        <w:shd w:fill="F2F2F2" w:color="auto" w:val="clear"/>
+        <w:spacing w:after="0" w:line="240"/>
+        <w:ind w:left="100" w:right="100"/>
+      </w:pPr>
+      <w:r>
+        <w:rPr>
+          <w:rFonts w:ascii="Courier New" w:cs="Courier New" w:eastAsia="Courier New" w:hAnsi="Courier New"/>
+          <w:sz w:val="17"/>
+          <w:szCs w:val="17"/>
+        </w:rPr>
+        <w:t xml:space="preserve">s := 'Gràdh 中 ☺'.</w:t>
+      </w:r>
+    </w:p>
+    <w:p>
+      <w:pPr>
+        <w:keepNext/>
+        <w:keepLines/>
+        <w:pBdr>
+          <w:left w:val="single" w:color="808080" w:sz="4"/>
+          <w:right w:val="single" w:color="808080" w:sz="4"/>
+        </w:pBdr>
+        <w:shd w:fill="F2F2F2" w:color="auto" w:val="clear"/>
+        <w:spacing w:after="0" w:line="240"/>
+        <w:ind w:left="100" w:right="100"/>
+      </w:pPr>
+      <w:r>
+        <w:rPr>
+          <w:rFonts w:ascii="Courier New" w:cs="Courier New" w:eastAsia="Courier New" w:hAnsi="Courier New"/>
+          <w:sz w:val="17"/>
+          <w:szCs w:val="17"/>
+        </w:rPr>
+        <w:t xml:space="preserve">s size printNl.</w:t>
+      </w:r>
+    </w:p>
+    <w:p>
+      <w:pPr>
+        <w:keepNext/>
+        <w:keepLines/>
+        <w:pBdr>
+          <w:left w:val="single" w:color="808080" w:sz="4"/>
+          <w:right w:val="single" w:color="808080" w:sz="4"/>
+        </w:pBdr>
+        <w:shd w:fill="F2F2F2" w:color="auto" w:val="clear"/>
+        <w:spacing w:after="0" w:line="240"/>
+        <w:ind w:left="100" w:right="100"/>
+      </w:pPr>
+      <w:r>
+        <w:rPr>
+          <w:rFonts w:ascii="Courier New" w:cs="Courier New" w:eastAsia="Courier New" w:hAnsi="Courier New"/>
+          <w:sz w:val="17"/>
+          <w:szCs w:val="17"/>
+        </w:rPr>
+        <w:t xml:space="preserve">s utf8Bytes size printNl.</w:t>
+      </w:r>
+    </w:p>
+    <w:p>
+      <w:pPr>
+        <w:keepNext/>
+        <w:keepLines/>
+        <w:pBdr>
+          <w:left w:val="single" w:color="808080" w:sz="4"/>
+          <w:right w:val="single" w:color="808080" w:sz="4"/>
+        </w:pBdr>
+        <w:shd w:fill="F2F2F2" w:color="auto" w:val="clear"/>
+        <w:spacing w:after="0" w:line="240"/>
+        <w:ind w:left="100" w:right="100"/>
+      </w:pPr>
+      <w:r>
+        <w:rPr>
+          <w:rFonts w:ascii="Courier New" w:cs="Courier New" w:eastAsia="Courier New" w:hAnsi="Courier New"/>
+          <w:sz w:val="17"/>
+          <w:szCs w:val="17"/>
+        </w:rPr>
+        <w:t xml:space="preserve">(String fromUtf8Bytes: s utf8Bytes) = s.</w:t>
+      </w:r>
+    </w:p>
+    <w:p>
+      <w:pPr>
+        <w:keepNext/>
+        <w:keepLines/>
+        <w:pBdr>
+          <w:left w:val="single" w:color="808080" w:sz="4"/>
+          <w:right w:val="single" w:color="808080" w:sz="4"/>
+        </w:pBdr>
+        <w:shd w:fill="F2F2F2" w:color="auto" w:val="clear"/>
+        <w:spacing w:after="0" w:line="240"/>
+        <w:ind w:left="100" w:right="100"/>
+      </w:pPr>
+      <w:r>
+        <w:rPr>
+          <w:rFonts w:ascii="Courier New" w:cs="Courier New" w:eastAsia="Courier New" w:hAnsi="Courier New"/>
+          <w:sz w:val="17"/>
+          <w:szCs w:val="17"/>
+        </w:rPr>
+        <w:t xml:space="preserve">'Straße' asUppercase printNl.</w:t>
+      </w:r>
+    </w:p>
+    <w:p>
+      <w:pPr>
+        <w:keepNext/>
+        <w:keepLines/>
+        <w:pBdr>
+          <w:left w:val="single" w:color="808080" w:sz="4"/>
+          <w:right w:val="single" w:color="808080" w:sz="4"/>
+        </w:pBdr>
+        <w:shd w:fill="F2F2F2" w:color="auto" w:val="clear"/>
+        <w:spacing w:after="0" w:line="240"/>
+        <w:ind w:left="100" w:right="100"/>
+      </w:pPr>
+      <w:r>
+        <w:rPr>
+          <w:rFonts w:ascii="Courier New" w:cs="Courier New" w:eastAsia="Courier New" w:hAnsi="Courier New"/>
+          <w:sz w:val="17"/>
+          <w:szCs w:val="17"/>
+        </w:rPr>
+        <w:t xml:space="preserve">('Straße' sameAs: 'STRASSE') printNl.</w:t>
+      </w:r>
+    </w:p>
+    <w:p>
+      <w:pPr>
+        <w:keepNext/>
+        <w:keepLines/>
+        <w:pBdr>
+          <w:left w:val="single" w:color="808080" w:sz="4"/>
+          <w:right w:val="single" w:color="808080" w:sz="4"/>
+        </w:pBdr>
+        <w:shd w:fill="F2F2F2" w:color="auto" w:val="clear"/>
+        <w:spacing w:after="0" w:line="240"/>
+        <w:ind w:left="100" w:right="100"/>
+      </w:pPr>
+      <w:r>
+        <w:rPr>
+          <w:rFonts w:ascii="Courier New" w:cs="Courier New" w:eastAsia="Courier New" w:hAnsi="Courier New"/>
+          <w:sz w:val="17"/>
+          <w:szCs w:val="17"/>
+        </w:rPr>
+        <w:t xml:space="preserve">('e', (Character value: 769) asString) asNFC size printNl.</w:t>
+      </w:r>
+    </w:p>
+    <w:p>
+      <w:pPr>
+        <w:keepNext/>
+        <w:keepLines/>
+        <w:pBdr>
+          <w:left w:val="single" w:color="808080" w:sz="4"/>
+          <w:right w:val="single" w:color="808080" w:sz="4"/>
+        </w:pBdr>
+        <w:shd w:fill="F2F2F2" w:color="auto" w:val="clear"/>
+        <w:spacing w:after="0" w:line="240"/>
+        <w:ind w:left="100" w:right="100"/>
+      </w:pPr>
+      <w:r>
+        <w:rPr>
+          <w:rFonts w:ascii="Courier New" w:cs="Courier New" w:eastAsia="Courier New" w:hAnsi="Courier New"/>
+          <w:sz w:val="17"/>
+          <w:szCs w:val="17"/>
+        </w:rPr>
+        <w:t xml:space="preserve">(Character value: 20013) isLetter printNl.</w:t>
+      </w:r>
+    </w:p>
+    <w:p>
+      <w:pPr>
+        <w:keepNext/>
+        <w:keepLines/>
+        <w:pBdr>
+          <w:left w:val="single" w:color="808080" w:sz="4"/>
+          <w:right w:val="single" w:color="808080" w:sz="4"/>
+        </w:pBdr>
+        <w:shd w:fill="F2F2F2" w:color="auto" w:val="clear"/>
+        <w:spacing w:after="0" w:line="240"/>
+        <w:ind w:left="100" w:right="100"/>
+      </w:pPr>
+      <w:r>
+        <w:rPr>
+          <w:rFonts w:ascii="Courier New" w:cs="Courier New" w:eastAsia="Courier New" w:hAnsi="Courier New"/>
+          <w:sz w:val="17"/>
+          <w:szCs w:val="17"/>
+        </w:rPr>
+        <w:t xml:space="preserve"> </w:t>
+      </w:r>
+    </w:p>
+    <w:p>
+      <w:pPr>
+        <w:keepNext/>
+        <w:keepLines/>
+        <w:pBdr>
+          <w:left w:val="single" w:color="808080" w:sz="4"/>
+          <w:right w:val="single" w:color="808080" w:sz="4"/>
+        </w:pBdr>
+        <w:shd w:fill="F2F2F2" w:color="auto" w:val="clear"/>
+        <w:spacing w:after="0" w:line="240"/>
+        <w:ind w:left="100" w:right="100"/>
+      </w:pPr>
+      <w:r>
+        <w:rPr>
+          <w:rFonts w:ascii="Courier New" w:cs="Courier New" w:eastAsia="Courier New" w:hAnsi="Courier New"/>
+          <w:sz w:val="17"/>
+          <w:szCs w:val="17"/>
+        </w:rPr>
+        <w:t xml:space="preserve">9</w:t>
+      </w:r>
+    </w:p>
+    <w:p>
+      <w:pPr>
+        <w:keepNext/>
+        <w:keepLines/>
+        <w:pBdr>
+          <w:left w:val="single" w:color="808080" w:sz="4"/>
+          <w:right w:val="single" w:color="808080" w:sz="4"/>
+        </w:pBdr>
+        <w:shd w:fill="F2F2F2" w:color="auto" w:val="clear"/>
+        <w:spacing w:after="0" w:line="240"/>
+        <w:ind w:left="100" w:right="100"/>
+      </w:pPr>
+      <w:r>
+        <w:rPr>
+          <w:rFonts w:ascii="Courier New" w:cs="Courier New" w:eastAsia="Courier New" w:hAnsi="Courier New"/>
+          <w:sz w:val="17"/>
+          <w:szCs w:val="17"/>
+        </w:rPr>
+        <w:t xml:space="preserve">14</w:t>
+      </w:r>
+    </w:p>
+    <w:p>
+      <w:pPr>
+        <w:keepNext/>
+        <w:keepLines/>
+        <w:pBdr>
+          <w:left w:val="single" w:color="808080" w:sz="4"/>
+          <w:right w:val="single" w:color="808080" w:sz="4"/>
+        </w:pBdr>
+        <w:shd w:fill="F2F2F2" w:color="auto" w:val="clear"/>
+        <w:spacing w:after="0" w:line="240"/>
+        <w:ind w:left="100" w:right="100"/>
+      </w:pPr>
+      <w:r>
+        <w:rPr>
+          <w:rFonts w:ascii="Courier New" w:cs="Courier New" w:eastAsia="Courier New" w:hAnsi="Courier New"/>
+          <w:sz w:val="17"/>
+          <w:szCs w:val="17"/>
+        </w:rPr>
+        <w:t xml:space="preserve">'STRASSE'</w:t>
+      </w:r>
+    </w:p>
+    <w:p>
+      <w:pPr>
+        <w:keepNext/>
+        <w:keepLines/>
+        <w:pBdr>
+          <w:left w:val="single" w:color="808080" w:sz="4"/>
+          <w:right w:val="single" w:color="808080" w:sz="4"/>
+        </w:pBdr>
+        <w:shd w:fill="F2F2F2" w:color="auto" w:val="clear"/>
+        <w:spacing w:after="0" w:line="240"/>
+        <w:ind w:left="100" w:right="100"/>
+      </w:pPr>
+      <w:r>
+        <w:rPr>
+          <w:rFonts w:ascii="Courier New" w:cs="Courier New" w:eastAsia="Courier New" w:hAnsi="Courier New"/>
+          <w:sz w:val="17"/>
+          <w:szCs w:val="17"/>
+        </w:rPr>
+        <w:t xml:space="preserve">true</w:t>
+      </w:r>
+    </w:p>
+    <w:p>
+      <w:pPr>
+        <w:keepNext/>
+        <w:keepLines/>
+        <w:pBdr>
+          <w:left w:val="single" w:color="808080" w:sz="4"/>
+          <w:right w:val="single" w:color="808080" w:sz="4"/>
+        </w:pBdr>
+        <w:shd w:fill="F2F2F2" w:color="auto" w:val="clear"/>
+        <w:spacing w:after="0" w:line="240"/>
+        <w:ind w:left="100" w:right="100"/>
+      </w:pPr>
+      <w:r>
+        <w:rPr>
+          <w:rFonts w:ascii="Courier New" w:cs="Courier New" w:eastAsia="Courier New" w:hAnsi="Courier New"/>
+          <w:sz w:val="17"/>
+          <w:szCs w:val="17"/>
+        </w:rPr>
+        <w:t xml:space="preserve">1</w:t>
+      </w:r>
+    </w:p>
+    <w:p>
+      <w:pPr>
+        <w:keepNext w:val="false"/>
+        <w:keepLines/>
+        <w:pBdr>
+          <w:bottom w:val="single" w:color="808080" w:sz="4"/>
+          <w:left w:val="single" w:color="808080" w:sz="4"/>
+          <w:right w:val="single" w:color="808080" w:sz="4"/>
+        </w:pBdr>
+        <w:shd w:fill="F2F2F2" w:color="auto" w:val="clear"/>
+        <w:spacing w:after="0" w:line="240"/>
+        <w:ind w:left="100" w:right="100"/>
+      </w:pPr>
+      <w:r>
+        <w:rPr>
+          <w:rFonts w:ascii="Courier New" w:cs="Courier New" w:eastAsia="Courier New" w:hAnsi="Courier New"/>
+          <w:sz w:val="17"/>
+          <w:szCs w:val="17"/>
+        </w:rPr>
+        <w:t xml:space="preserve">true</w:t>
+      </w:r>
+    </w:p>
+    <w:p>
+      <w:pPr>
+        <w:spacing w:after="200" w:before="60"/>
+      </w:pPr>
+      <w:r>
+        <w:rPr>
+          <w:rFonts w:ascii="Arial" w:cs="Arial" w:eastAsia="Arial" w:hAnsi="Arial"/>
+          <w:b/>
+          <w:bCs/>
+          <w:sz w:val="18"/>
+          <w:szCs w:val="18"/>
+        </w:rPr>
+        <w:t xml:space="preserve">Figure 47. </w:t>
+      </w:r>
+      <w:r>
+        <w:rPr>
+          <w:rFonts w:ascii="Arial" w:cs="Arial" w:eastAsia="Arial" w:hAnsi="Arial"/>
+          <w:sz w:val="18"/>
+          <w:szCs w:val="18"/>
+        </w:rPr>
+        <w:t xml:space="preserve">Unicode</w:t>
       </w:r>
     </w:p>
     <w:p>
@@ -23795,7 +25038,7 @@
           <w:sz w:val="18"/>
           <w:szCs w:val="18"/>
         </w:rPr>
-        <w:t xml:space="preserve">Figure 45. </w:t>
+        <w:t xml:space="preserve">Figure 48. </w:t>
       </w:r>
       <w:r>
         <w:rPr>
@@ -23804,6 +25047,165 @@
           <w:szCs w:val="18"/>
         </w:rPr>
         <w:t xml:space="preserve">Writing to the Transcript</w:t>
+      </w:r>
+    </w:p>
+    <w:p>
+      <w:pPr>
+        <w:pStyle w:val="Heading2"/>
+        <w:keepNext/>
+      </w:pPr>
+      <w:r>
+        <w:rPr>
+          <w:rFonts w:ascii="Arial" w:cs="Arial" w:eastAsia="Arial" w:hAnsi="Arial"/>
+          <w:b/>
+          <w:bCs/>
+          <w:sz w:val="24"/>
+          <w:szCs w:val="24"/>
+        </w:rPr>
+        <w:t xml:space="preserve">Redirecting the Transcript</w:t>
+      </w:r>
+    </w:p>
+    <w:p>
+      <w:pPr>
+        <w:spacing w:after="120" w:line="264"/>
+      </w:pPr>
+      <w:r>
+        <w:rPr>
+          <w:rFonts w:ascii="Arial" w:cs="Arial" w:eastAsia="Arial" w:hAnsi="Arial"/>
+          <w:sz w:val="20"/>
+          <w:szCs w:val="20"/>
+        </w:rPr>
+        <w:t xml:space="preserve">Transcript redirectTo: aStream sends everything written to the Transcript to a WriteStream instead of the screen; Transcript redirectToStdout puts it back. Transcript capture: aBlock runs the block and answers the text that it wrote to the Transcript, leaving the screen untouched.</w:t>
+      </w:r>
+    </w:p>
+    <w:p>
+      <w:pPr>
+        <w:keepNext/>
+        <w:keepLines/>
+        <w:pBdr>
+          <w:top w:val="single" w:color="808080" w:sz="4"/>
+          <w:left w:val="single" w:color="808080" w:sz="4"/>
+          <w:right w:val="single" w:color="808080" w:sz="4"/>
+        </w:pBdr>
+        <w:shd w:fill="F2F2F2" w:color="auto" w:val="clear"/>
+        <w:spacing w:after="0" w:line="240"/>
+        <w:ind w:left="100" w:right="100"/>
+      </w:pPr>
+      <w:r>
+        <w:rPr>
+          <w:rFonts w:ascii="Courier New" w:cs="Courier New" w:eastAsia="Courier New" w:hAnsi="Courier New"/>
+          <w:sz w:val="17"/>
+          <w:szCs w:val="17"/>
+        </w:rPr>
+        <w:t xml:space="preserve">| t |</w:t>
+      </w:r>
+    </w:p>
+    <w:p>
+      <w:pPr>
+        <w:keepNext/>
+        <w:keepLines/>
+        <w:pBdr>
+          <w:left w:val="single" w:color="808080" w:sz="4"/>
+          <w:right w:val="single" w:color="808080" w:sz="4"/>
+        </w:pBdr>
+        <w:shd w:fill="F2F2F2" w:color="auto" w:val="clear"/>
+        <w:spacing w:after="0" w:line="240"/>
+        <w:ind w:left="100" w:right="100"/>
+      </w:pPr>
+      <w:r>
+        <w:rPr>
+          <w:rFonts w:ascii="Courier New" w:cs="Courier New" w:eastAsia="Courier New" w:hAnsi="Courier New"/>
+          <w:sz w:val="17"/>
+          <w:szCs w:val="17"/>
+        </w:rPr>
+        <w:t xml:space="preserve">t := Transcript capture: [Transcript show: 'hidden'; cr].</w:t>
+      </w:r>
+    </w:p>
+    <w:p>
+      <w:pPr>
+        <w:keepNext/>
+        <w:keepLines/>
+        <w:pBdr>
+          <w:left w:val="single" w:color="808080" w:sz="4"/>
+          <w:right w:val="single" w:color="808080" w:sz="4"/>
+        </w:pBdr>
+        <w:shd w:fill="F2F2F2" w:color="auto" w:val="clear"/>
+        <w:spacing w:after="0" w:line="240"/>
+        <w:ind w:left="100" w:right="100"/>
+      </w:pPr>
+      <w:r>
+        <w:rPr>
+          <w:rFonts w:ascii="Courier New" w:cs="Courier New" w:eastAsia="Courier New" w:hAnsi="Courier New"/>
+          <w:sz w:val="17"/>
+          <w:szCs w:val="17"/>
+        </w:rPr>
+        <w:t xml:space="preserve">t size printNl.</w:t>
+      </w:r>
+    </w:p>
+    <w:p>
+      <w:pPr>
+        <w:keepNext/>
+        <w:keepLines/>
+        <w:pBdr>
+          <w:left w:val="single" w:color="808080" w:sz="4"/>
+          <w:right w:val="single" w:color="808080" w:sz="4"/>
+        </w:pBdr>
+        <w:shd w:fill="F2F2F2" w:color="auto" w:val="clear"/>
+        <w:spacing w:after="0" w:line="240"/>
+        <w:ind w:left="100" w:right="100"/>
+      </w:pPr>
+      <w:r>
+        <w:rPr>
+          <w:rFonts w:ascii="Courier New" w:cs="Courier New" w:eastAsia="Courier New" w:hAnsi="Courier New"/>
+          <w:sz w:val="17"/>
+          <w:szCs w:val="17"/>
+        </w:rPr>
+        <w:t xml:space="preserve"> </w:t>
+      </w:r>
+    </w:p>
+    <w:p>
+      <w:pPr>
+        <w:keepNext w:val="false"/>
+        <w:keepLines/>
+        <w:pBdr>
+          <w:bottom w:val="single" w:color="808080" w:sz="4"/>
+          <w:left w:val="single" w:color="808080" w:sz="4"/>
+          <w:right w:val="single" w:color="808080" w:sz="4"/>
+        </w:pBdr>
+        <w:shd w:fill="F2F2F2" w:color="auto" w:val="clear"/>
+        <w:spacing w:after="0" w:line="240"/>
+        <w:ind w:left="100" w:right="100"/>
+      </w:pPr>
+      <w:r>
+        <w:rPr>
+          <w:rFonts w:ascii="Courier New" w:cs="Courier New" w:eastAsia="Courier New" w:hAnsi="Courier New"/>
+          <w:sz w:val="17"/>
+          <w:szCs w:val="17"/>
+        </w:rPr>
+        <w:t xml:space="preserve">7</w:t>
+      </w:r>
+    </w:p>
+    <w:p>
+      <w:pPr>
+        <w:spacing w:after="200" w:before="60"/>
+      </w:pPr>
+      <w:r>
+        <w:rPr>
+          <w:rFonts w:ascii="Arial" w:cs="Arial" w:eastAsia="Arial" w:hAnsi="Arial"/>
+          <w:b/>
+          <w:bCs/>
+          <w:sz w:val="18"/>
+          <w:szCs w:val="18"/>
+        </w:rPr>
+        <w:t xml:space="preserve">Figure 49. </w:t>
+      </w:r>
+      <w:r>
+        <w:rPr>
+          <w:rFonts w:ascii="Arial" w:cs="Arial" w:eastAsia="Arial" w:hAnsi="Arial"/>
+          <w:sz w:val="18"/>
+          <w:szCs w:val="18"/>
+        </w:rPr>
+        <w:t xml:space="preserve">Capturing output</w:t>
       </w:r>
     </w:p>
     <w:p>
@@ -24286,7 +25688,7 @@
           <w:sz w:val="18"/>
           <w:szCs w:val="18"/>
         </w:rPr>
-        <w:t xml:space="preserve">Figure 46. </w:t>
+        <w:t xml:space="preserve">Figure 50. </w:t>
       </w:r>
       <w:r>
         <w:rPr>
@@ -24655,7 +26057,7 @@
           <w:sz w:val="18"/>
           <w:szCs w:val="18"/>
         </w:rPr>
-        <w:t xml:space="preserve">Figure 47. </w:t>
+        <w:t xml:space="preserve">Figure 51. </w:t>
       </w:r>
       <w:r>
         <w:rPr>
@@ -24969,7 +26371,7 @@
           <w:sz w:val="18"/>
           <w:szCs w:val="18"/>
         </w:rPr>
-        <w:t xml:space="preserve">Figure 48. </w:t>
+        <w:t xml:space="preserve">Figure 52. </w:t>
       </w:r>
       <w:r>
         <w:rPr>
@@ -25267,7 +26669,7 @@
           <w:sz w:val="18"/>
           <w:szCs w:val="18"/>
         </w:rPr>
-        <w:t xml:space="preserve">Figure 49. </w:t>
+        <w:t xml:space="preserve">Figure 53. </w:t>
       </w:r>
       <w:r>
         <w:rPr>
@@ -25536,7 +26938,7 @@
           <w:sz w:val="18"/>
           <w:szCs w:val="18"/>
         </w:rPr>
-        <w:t xml:space="preserve">Figure 50. </w:t>
+        <w:t xml:space="preserve">Figure 54. </w:t>
       </w:r>
       <w:r>
         <w:rPr>
@@ -25837,7 +27239,7 @@
           <w:sz w:val="18"/>
           <w:szCs w:val="18"/>
         </w:rPr>
-        <w:t xml:space="preserve">Figure 51. </w:t>
+        <w:t xml:space="preserve">Figure 55. </w:t>
       </w:r>
       <w:r>
         <w:rPr>
@@ -26080,7 +27482,7 @@
           <w:sz w:val="18"/>
           <w:szCs w:val="18"/>
         </w:rPr>
-        <w:t xml:space="preserve">Figure 52. </w:t>
+        <w:t xml:space="preserve">Figure 56. </w:t>
       </w:r>
       <w:r>
         <w:rPr>
@@ -26420,7 +27822,7 @@
           <w:sz w:val="18"/>
           <w:szCs w:val="18"/>
         </w:rPr>
-        <w:t xml:space="preserve">Figure 53. </w:t>
+        <w:t xml:space="preserve">Figure 57. </w:t>
       </w:r>
       <w:r>
         <w:rPr>
@@ -26642,7 +28044,7 @@
           <w:sz w:val="18"/>
           <w:szCs w:val="18"/>
         </w:rPr>
-        <w:t xml:space="preserve">Figure 54. </w:t>
+        <w:t xml:space="preserve">Figure 58. </w:t>
       </w:r>
       <w:r>
         <w:rPr>
@@ -26864,7 +28266,7 @@
           <w:sz w:val="18"/>
           <w:szCs w:val="18"/>
         </w:rPr>
-        <w:t xml:space="preserve">Figure 55. </w:t>
+        <w:t xml:space="preserve">Figure 59. </w:t>
       </w:r>
       <w:r>
         <w:rPr>
@@ -27212,7 +28614,7 @@
           <w:sz w:val="18"/>
           <w:szCs w:val="18"/>
         </w:rPr>
-        <w:t xml:space="preserve">Figure 56. </w:t>
+        <w:t xml:space="preserve">Figure 60. </w:t>
       </w:r>
       <w:r>
         <w:rPr>
@@ -27564,7 +28966,7 @@
           <w:sz w:val="18"/>
           <w:szCs w:val="18"/>
         </w:rPr>
-        <w:t xml:space="preserve">Figure 57. </w:t>
+        <w:t xml:space="preserve">Figure 61. </w:t>
       </w:r>
       <w:r>
         <w:rPr>
@@ -27891,7 +29293,7 @@
           <w:sz w:val="18"/>
           <w:szCs w:val="18"/>
         </w:rPr>
-        <w:t xml:space="preserve">Figure 58. </w:t>
+        <w:t xml:space="preserve">Figure 62. </w:t>
       </w:r>
       <w:r>
         <w:rPr>
@@ -28176,7 +29578,7 @@
           <w:sz w:val="18"/>
           <w:szCs w:val="18"/>
         </w:rPr>
-        <w:t xml:space="preserve">Figure 59. </w:t>
+        <w:t xml:space="preserve">Figure 63. </w:t>
       </w:r>
       <w:r>
         <w:rPr>
@@ -28578,7 +29980,7 @@
           <w:sz w:val="18"/>
           <w:szCs w:val="18"/>
         </w:rPr>
-        <w:t xml:space="preserve">Figure 60. </w:t>
+        <w:t xml:space="preserve">Figure 64. </w:t>
       </w:r>
       <w:r>
         <w:rPr>
@@ -29110,7 +30512,7 @@
           <w:sz w:val="18"/>
           <w:szCs w:val="18"/>
         </w:rPr>
-        <w:t xml:space="preserve">Figure 61. </w:t>
+        <w:t xml:space="preserve">Figure 65. </w:t>
       </w:r>
       <w:r>
         <w:rPr>
@@ -29470,7 +30872,7 @@
           <w:sz w:val="18"/>
           <w:szCs w:val="18"/>
         </w:rPr>
-        <w:t xml:space="preserve">Figure 62. </w:t>
+        <w:t xml:space="preserve">Figure 66. </w:t>
       </w:r>
       <w:r>
         <w:rPr>
@@ -29713,7 +31115,7 @@
           <w:sz w:val="18"/>
           <w:szCs w:val="18"/>
         </w:rPr>
-        <w:t xml:space="preserve">Figure 63. </w:t>
+        <w:t xml:space="preserve">Figure 67. </w:t>
       </w:r>
       <w:r>
         <w:rPr>
@@ -30039,7 +31441,7 @@
           <w:sz w:val="18"/>
           <w:szCs w:val="18"/>
         </w:rPr>
-        <w:t xml:space="preserve">Figure 64. </w:t>
+        <w:t xml:space="preserve">Figure 68. </w:t>
       </w:r>
       <w:r>
         <w:rPr>
@@ -30587,7 +31989,7 @@
           <w:sz w:val="18"/>
           <w:szCs w:val="18"/>
         </w:rPr>
-        <w:t xml:space="preserve">Figure 65. </w:t>
+        <w:t xml:space="preserve">Figure 69. </w:t>
       </w:r>
       <w:r>
         <w:rPr>
@@ -30893,7 +32295,7 @@
           <w:sz w:val="18"/>
           <w:szCs w:val="18"/>
         </w:rPr>
-        <w:t xml:space="preserve">Figure 66. </w:t>
+        <w:t xml:space="preserve">Figure 70. </w:t>
       </w:r>
       <w:r>
         <w:rPr>
@@ -31275,7 +32677,7 @@
           <w:sz w:val="18"/>
           <w:szCs w:val="18"/>
         </w:rPr>
-        <w:t xml:space="preserve">Figure 67. </w:t>
+        <w:t xml:space="preserve">Figure 71. </w:t>
       </w:r>
       <w:r>
         <w:rPr>
@@ -31602,7 +33004,7 @@
           <w:sz w:val="18"/>
           <w:szCs w:val="18"/>
         </w:rPr>
-        <w:t xml:space="preserve">Figure 68. </w:t>
+        <w:t xml:space="preserve">Figure 72. </w:t>
       </w:r>
       <w:r>
         <w:rPr>
@@ -32310,7 +33712,7 @@
           <w:sz w:val="18"/>
           <w:szCs w:val="18"/>
         </w:rPr>
-        <w:t xml:space="preserve">Figure 69. </w:t>
+        <w:t xml:space="preserve">Figure 73. </w:t>
       </w:r>
       <w:r>
         <w:rPr>
@@ -32928,7 +34330,7 @@
           <w:sz w:val="18"/>
           <w:szCs w:val="18"/>
         </w:rPr>
-        <w:t xml:space="preserve">Figure 70. </w:t>
+        <w:t xml:space="preserve">Figure 74. </w:t>
       </w:r>
       <w:r>
         <w:rPr>
@@ -33289,7 +34691,7 @@
           <w:sz w:val="18"/>
           <w:szCs w:val="18"/>
         </w:rPr>
-        <w:t xml:space="preserve">Figure 71. </w:t>
+        <w:t xml:space="preserve">Figure 75. </w:t>
       </w:r>
       <w:r>
         <w:rPr>
@@ -33671,7 +35073,7 @@
           <w:sz w:val="18"/>
           <w:szCs w:val="18"/>
         </w:rPr>
-        <w:t xml:space="preserve">Figure 72. </w:t>
+        <w:t xml:space="preserve">Figure 76. </w:t>
       </w:r>
       <w:r>
         <w:rPr>
@@ -34074,7 +35476,7 @@
           <w:sz w:val="18"/>
           <w:szCs w:val="18"/>
         </w:rPr>
-        <w:t xml:space="preserve">Figure 73. </w:t>
+        <w:t xml:space="preserve">Figure 77. </w:t>
       </w:r>
       <w:r>
         <w:rPr>
@@ -34442,7 +35844,7 @@
           <w:sz w:val="18"/>
           <w:szCs w:val="18"/>
         </w:rPr>
-        <w:t xml:space="preserve">Figure 74. </w:t>
+        <w:t xml:space="preserve">Figure 78. </w:t>
       </w:r>
       <w:r>
         <w:rPr>
@@ -35283,7 +36685,7 @@
           <w:sz w:val="18"/>
           <w:szCs w:val="18"/>
         </w:rPr>
-        <w:t xml:space="preserve">Figure 75. </w:t>
+        <w:t xml:space="preserve">Figure 79. </w:t>
       </w:r>
       <w:r>
         <w:rPr>
@@ -36140,7 +37542,7 @@
           <w:sz w:val="18"/>
           <w:szCs w:val="18"/>
         </w:rPr>
-        <w:t xml:space="preserve">Figure 76. </w:t>
+        <w:t xml:space="preserve">Figure 80. </w:t>
       </w:r>
       <w:r>
         <w:rPr>
@@ -36915,7 +38317,7 @@
           <w:sz w:val="18"/>
           <w:szCs w:val="18"/>
         </w:rPr>
-        <w:t xml:space="preserve">Figure 77. </w:t>
+        <w:t xml:space="preserve">Figure 81. </w:t>
       </w:r>
       <w:r>
         <w:rPr>
@@ -38073,7 +39475,7 @@
           <w:sz w:val="18"/>
           <w:szCs w:val="18"/>
         </w:rPr>
-        <w:t xml:space="preserve">Figure 78. </w:t>
+        <w:t xml:space="preserve">Figure 82. </w:t>
       </w:r>
       <w:r>
         <w:rPr>
@@ -38791,7 +40193,7 @@
           <w:sz w:val="18"/>
           <w:szCs w:val="18"/>
         </w:rPr>
-        <w:t xml:space="preserve">Figure 79. </w:t>
+        <w:t xml:space="preserve">Figure 83. </w:t>
       </w:r>
       <w:r>
         <w:rPr>

</xml_diff>